<commit_message>
ABM Producto + Doc de A
</commit_message>
<xml_diff>
--- a/Documentación/ProyectoIS 2026 CAJAL-FERNANDEZ_2daEntrega.docx
+++ b/Documentación/ProyectoIS 2026 CAJAL-FERNANDEZ_2daEntrega.docx
@@ -8429,6 +8429,12 @@
               </w:rPr>
               <w:t>Usuario</w:t>
             </w:r>
+            <w:r>
+              <w:rPr>
+                <w:rFonts w:ascii="Times New Roman" w:hAnsi="Times New Roman" w:cs="Times New Roman"/>
+              </w:rPr>
+              <w:t xml:space="preserve"> “Vendedor”</w:t>
+            </w:r>
           </w:p>
         </w:tc>
         <w:tc>
@@ -8447,6 +8453,12 @@
                 <w:rFonts w:ascii="Times New Roman" w:hAnsi="Times New Roman" w:cs="Times New Roman"/>
               </w:rPr>
               <w:t>Login</w:t>
+            </w:r>
+            <w:r>
+              <w:rPr>
+                <w:rFonts w:ascii="Times New Roman" w:hAnsi="Times New Roman" w:cs="Times New Roman"/>
+              </w:rPr>
+              <w:t xml:space="preserve"> </w:t>
             </w:r>
           </w:p>
         </w:tc>
@@ -8511,6 +8523,12 @@
               <w:rPr>
                 <w:rFonts w:ascii="Times New Roman" w:hAnsi="Times New Roman" w:cs="Times New Roman"/>
               </w:rPr>
+              <w:t>(ABM)</w:t>
+            </w:r>
+            <w:r>
+              <w:rPr>
+                <w:rFonts w:ascii="Times New Roman" w:hAnsi="Times New Roman" w:cs="Times New Roman"/>
+              </w:rPr>
               <w:br/>
               <w:t>Gestión Producto</w:t>
             </w:r>
@@ -8518,8 +8536,20 @@
               <w:rPr>
                 <w:rFonts w:ascii="Times New Roman" w:hAnsi="Times New Roman" w:cs="Times New Roman"/>
               </w:rPr>
+              <w:t xml:space="preserve"> (ABM)</w:t>
+            </w:r>
+            <w:r>
+              <w:rPr>
+                <w:rFonts w:ascii="Times New Roman" w:hAnsi="Times New Roman" w:cs="Times New Roman"/>
+              </w:rPr>
               <w:br/>
               <w:t>Gestión Bitácora</w:t>
+            </w:r>
+            <w:r>
+              <w:rPr>
+                <w:rFonts w:ascii="Times New Roman" w:hAnsi="Times New Roman" w:cs="Times New Roman"/>
+              </w:rPr>
+              <w:t xml:space="preserve"> (Buscar-Limpiar)</w:t>
             </w:r>
           </w:p>
         </w:tc>
@@ -11548,7 +11578,23 @@
                 <w:rFonts w:ascii="Times New Roman" w:eastAsia="Times New Roman" w:hAnsi="Times New Roman" w:cs="Times New Roman"/>
                 <w:color w:val="000000"/>
               </w:rPr>
-              <w:t>El usuario queda autenticado en el sistema e inicia su sesión, se registran los permisos del mismo.</w:t>
+              <w:t xml:space="preserve">El usuario queda autenticado en el sistema e inicia su sesión, se registran los permisos </w:t>
+            </w:r>
+            <w:proofErr w:type="gramStart"/>
+            <w:r>
+              <w:rPr>
+                <w:rFonts w:ascii="Times New Roman" w:eastAsia="Times New Roman" w:hAnsi="Times New Roman" w:cs="Times New Roman"/>
+                <w:color w:val="000000"/>
+              </w:rPr>
+              <w:t>del mismo</w:t>
+            </w:r>
+            <w:proofErr w:type="gramEnd"/>
+            <w:r>
+              <w:rPr>
+                <w:rFonts w:ascii="Times New Roman" w:eastAsia="Times New Roman" w:hAnsi="Times New Roman" w:cs="Times New Roman"/>
+                <w:color w:val="000000"/>
+              </w:rPr>
+              <w:t>.</w:t>
             </w:r>
           </w:p>
         </w:tc>
@@ -14164,7 +14210,7 @@
                 <w:sz w:val="22"/>
                 <w:szCs w:val="22"/>
               </w:rPr>
-              <w:t>” en el menú principal del sistema y selecciona registrar usuario</w:t>
+              <w:t>” en el menú principal del sistema</w:t>
             </w:r>
             <w:r>
               <w:rPr>
@@ -14197,7 +14243,7 @@
                 <w:sz w:val="22"/>
                 <w:szCs w:val="22"/>
               </w:rPr>
-              <w:t>El sistema muestra en pantalla formulario de alta</w:t>
+              <w:t xml:space="preserve">El sistema muestra en pantalla </w:t>
             </w:r>
             <w:r>
               <w:rPr>
@@ -14206,7 +14252,7 @@
                 <w:sz w:val="22"/>
                 <w:szCs w:val="22"/>
               </w:rPr>
-              <w:t xml:space="preserve"> de usuario</w:t>
+              <w:t>una lista con los usuarios dados de alta</w:t>
             </w:r>
             <w:r>
               <w:rPr>
@@ -14276,6 +14322,15 @@
                 <w:szCs w:val="22"/>
               </w:rPr>
               <w:t>)</w:t>
+            </w:r>
+            <w:r>
+              <w:rPr>
+                <w:rFonts w:ascii="Times New Roman" w:eastAsia="Times New Roman" w:hAnsi="Times New Roman" w:cs="Times New Roman"/>
+                <w:color w:val="000000"/>
+                <w:sz w:val="22"/>
+                <w:szCs w:val="22"/>
+              </w:rPr>
+              <w:t xml:space="preserve"> y presiona el botón registrar.</w:t>
             </w:r>
           </w:p>
           <w:p>
@@ -14430,6 +14485,90 @@
               <w:t xml:space="preserve"> Vuelve al punto 3 del Escenario Principal.</w:t>
             </w:r>
           </w:p>
+          <w:p>
+            <w:pPr>
+              <w:spacing w:after="0" w:line="240" w:lineRule="auto"/>
+              <w:rPr>
+                <w:rFonts w:ascii="Times New Roman" w:eastAsia="Times New Roman" w:hAnsi="Times New Roman" w:cs="Times New Roman"/>
+                <w:b/>
+                <w:bCs/>
+                <w:color w:val="000000"/>
+              </w:rPr>
+            </w:pPr>
+            <w:r>
+              <w:rPr>
+                <w:rFonts w:ascii="Times New Roman" w:eastAsia="Times New Roman" w:hAnsi="Times New Roman" w:cs="Times New Roman"/>
+                <w:b/>
+                <w:bCs/>
+                <w:color w:val="000000"/>
+              </w:rPr>
+              <w:t>FA2 – Ya existe un usuario con ese Correo Electrónico – DNI</w:t>
+            </w:r>
+          </w:p>
+          <w:p>
+            <w:pPr>
+              <w:spacing w:after="0" w:line="240" w:lineRule="auto"/>
+              <w:rPr>
+                <w:rFonts w:ascii="Times New Roman" w:eastAsia="Times New Roman" w:hAnsi="Times New Roman" w:cs="Times New Roman"/>
+                <w:color w:val="000000"/>
+              </w:rPr>
+            </w:pPr>
+            <w:r>
+              <w:rPr>
+                <w:rFonts w:ascii="Times New Roman" w:eastAsia="Times New Roman" w:hAnsi="Times New Roman" w:cs="Times New Roman"/>
+                <w:b/>
+                <w:bCs/>
+                <w:color w:val="000000"/>
+              </w:rPr>
+              <w:t>4.1.1</w:t>
+            </w:r>
+            <w:r>
+              <w:rPr>
+                <w:rFonts w:ascii="Times New Roman" w:eastAsia="Times New Roman" w:hAnsi="Times New Roman" w:cs="Times New Roman"/>
+                <w:color w:val="000000"/>
+              </w:rPr>
+              <w:t xml:space="preserve"> </w:t>
+            </w:r>
+            <w:r>
+              <w:rPr>
+                <w:rFonts w:ascii="Times New Roman" w:eastAsia="Times New Roman" w:hAnsi="Times New Roman" w:cs="Times New Roman"/>
+                <w:color w:val="000000"/>
+              </w:rPr>
+              <w:t>El sistema solicita al administrador que vuelva a ingresar los datos requeridos.</w:t>
+            </w:r>
+          </w:p>
+          <w:p>
+            <w:pPr>
+              <w:spacing w:after="0" w:line="240" w:lineRule="auto"/>
+              <w:rPr>
+                <w:rFonts w:ascii="Times New Roman" w:eastAsia="Times New Roman" w:hAnsi="Times New Roman" w:cs="Times New Roman"/>
+                <w:color w:val="000000"/>
+              </w:rPr>
+            </w:pPr>
+            <w:r>
+              <w:rPr>
+                <w:rFonts w:ascii="Times New Roman" w:eastAsia="Times New Roman" w:hAnsi="Times New Roman" w:cs="Times New Roman"/>
+                <w:b/>
+                <w:bCs/>
+                <w:color w:val="000000"/>
+              </w:rPr>
+              <w:t>4.1.2</w:t>
+            </w:r>
+            <w:r>
+              <w:rPr>
+                <w:rFonts w:ascii="Times New Roman" w:eastAsia="Times New Roman" w:hAnsi="Times New Roman" w:cs="Times New Roman"/>
+                <w:color w:val="000000"/>
+              </w:rPr>
+              <w:t xml:space="preserve"> </w:t>
+            </w:r>
+            <w:r>
+              <w:rPr>
+                <w:rFonts w:ascii="Times New Roman" w:eastAsia="Times New Roman" w:hAnsi="Times New Roman" w:cs="Times New Roman"/>
+                <w:color w:val="000000"/>
+              </w:rPr>
+              <w:t>Vuelve al punto 3 del Escenario Principal.</w:t>
+            </w:r>
+          </w:p>
         </w:tc>
       </w:tr>
       <w:tr>
@@ -14540,10 +14679,10 @@
           <w:noProof/>
         </w:rPr>
         <w:drawing>
-          <wp:inline distT="0" distB="0" distL="0" distR="0" wp14:anchorId="13660E2F" wp14:editId="5A68F94D">
-            <wp:extent cx="5400040" cy="3719830"/>
+          <wp:inline distT="0" distB="0" distL="0" distR="0" wp14:anchorId="057C8194" wp14:editId="768156D9">
+            <wp:extent cx="5400040" cy="4669790"/>
             <wp:effectExtent l="0" t="0" r="0" b="0"/>
-            <wp:docPr id="1992154255" name="Imagen 5"/>
+            <wp:docPr id="208995094" name="Imagen 11"/>
             <wp:cNvGraphicFramePr>
               <a:graphicFrameLocks xmlns:a="http://schemas.openxmlformats.org/drawingml/2006/main" noChangeAspect="1"/>
             </wp:cNvGraphicFramePr>
@@ -14551,7 +14690,7 @@
               <a:graphicData uri="http://schemas.openxmlformats.org/drawingml/2006/picture">
                 <pic:pic xmlns:pic="http://schemas.openxmlformats.org/drawingml/2006/picture">
                   <pic:nvPicPr>
-                    <pic:cNvPr id="0" name="Picture 5"/>
+                    <pic:cNvPr id="0" name="Picture 11"/>
                     <pic:cNvPicPr>
                       <a:picLocks noChangeAspect="1" noChangeArrowheads="1"/>
                     </pic:cNvPicPr>
@@ -14572,7 +14711,7 @@
                   <pic:spPr bwMode="auto">
                     <a:xfrm>
                       <a:off x="0" y="0"/>
-                      <a:ext cx="5400040" cy="3719830"/>
+                      <a:ext cx="5400040" cy="4669790"/>
                     </a:xfrm>
                     <a:prstGeom prst="rect">
                       <a:avLst/>
@@ -14605,6 +14744,7 @@
           <w:sz w:val="30"/>
           <w:szCs w:val="30"/>
         </w:rPr>
+        <w:lastRenderedPageBreak/>
         <w:t>3.</w:t>
       </w:r>
       <w:r>
@@ -14984,7 +15124,6 @@
                 <w:bCs/>
                 <w:color w:val="000000"/>
               </w:rPr>
-              <w:lastRenderedPageBreak/>
               <w:t xml:space="preserve">PRECONDICIONES: </w:t>
             </w:r>
             <w:r>
@@ -15191,25 +15330,7 @@
                 <w:sz w:val="22"/>
                 <w:szCs w:val="22"/>
               </w:rPr>
-              <w:t xml:space="preserve">” en el menú principal del sistema y selecciona </w:t>
-            </w:r>
-            <w:r>
-              <w:rPr>
-                <w:rFonts w:ascii="Times New Roman" w:eastAsia="Times New Roman" w:hAnsi="Times New Roman" w:cs="Times New Roman"/>
-                <w:color w:val="000000"/>
-                <w:sz w:val="22"/>
-                <w:szCs w:val="22"/>
-              </w:rPr>
-              <w:t>borrar</w:t>
-            </w:r>
-            <w:r>
-              <w:rPr>
-                <w:rFonts w:ascii="Times New Roman" w:eastAsia="Times New Roman" w:hAnsi="Times New Roman" w:cs="Times New Roman"/>
-                <w:color w:val="000000"/>
-                <w:sz w:val="22"/>
-                <w:szCs w:val="22"/>
-              </w:rPr>
-              <w:t xml:space="preserve"> usuario.</w:t>
+              <w:t>” en el menú principal del sistema.</w:t>
             </w:r>
           </w:p>
           <w:p>
@@ -15257,7 +15378,61 @@
                 <w:sz w:val="22"/>
                 <w:szCs w:val="22"/>
               </w:rPr>
-              <w:t>El administrador selecciona el usuario que quiere dar de baja.</w:t>
+              <w:t>El administrador selecciona el usuario que quiere dar de baja</w:t>
+            </w:r>
+            <w:r>
+              <w:rPr>
+                <w:rFonts w:ascii="Times New Roman" w:eastAsia="Times New Roman" w:hAnsi="Times New Roman" w:cs="Times New Roman"/>
+                <w:color w:val="000000"/>
+                <w:sz w:val="22"/>
+                <w:szCs w:val="22"/>
+              </w:rPr>
+              <w:t xml:space="preserve"> de la lista y</w:t>
+            </w:r>
+            <w:r>
+              <w:rPr>
+                <w:rFonts w:ascii="Times New Roman" w:eastAsia="Times New Roman" w:hAnsi="Times New Roman" w:cs="Times New Roman"/>
+                <w:color w:val="000000"/>
+                <w:sz w:val="22"/>
+                <w:szCs w:val="22"/>
+              </w:rPr>
+              <w:t xml:space="preserve"> </w:t>
+            </w:r>
+            <w:r>
+              <w:rPr>
+                <w:rFonts w:ascii="Times New Roman" w:eastAsia="Times New Roman" w:hAnsi="Times New Roman" w:cs="Times New Roman"/>
+                <w:color w:val="000000"/>
+                <w:sz w:val="22"/>
+                <w:szCs w:val="22"/>
+              </w:rPr>
+              <w:t>presiona</w:t>
+            </w:r>
+            <w:r>
+              <w:rPr>
+                <w:rFonts w:ascii="Times New Roman" w:eastAsia="Times New Roman" w:hAnsi="Times New Roman" w:cs="Times New Roman"/>
+                <w:color w:val="000000"/>
+                <w:sz w:val="22"/>
+                <w:szCs w:val="22"/>
+              </w:rPr>
+              <w:t xml:space="preserve"> </w:t>
+            </w:r>
+            <w:r>
+              <w:rPr>
+                <w:rFonts w:ascii="Times New Roman" w:eastAsia="Times New Roman" w:hAnsi="Times New Roman" w:cs="Times New Roman"/>
+                <w:color w:val="000000"/>
+                <w:sz w:val="22"/>
+                <w:szCs w:val="22"/>
+              </w:rPr>
+              <w:t>el botón borrar</w:t>
+            </w:r>
+            <w:r>
+              <w:rPr>
+                <w:rFonts w:ascii="Times New Roman" w:eastAsia="Times New Roman" w:hAnsi="Times New Roman" w:cs="Times New Roman"/>
+                <w:color w:val="000000"/>
+                <w:sz w:val="22"/>
+                <w:szCs w:val="22"/>
+              </w:rPr>
+              <w:t>.</w:t>
             </w:r>
           </w:p>
           <w:p>
@@ -15523,6 +15698,7 @@
         <w:rPr>
           <w:rFonts w:ascii="Times New Roman" w:eastAsia="Times New Roman" w:hAnsi="Times New Roman" w:cs="Times New Roman"/>
         </w:rPr>
+        <w:lastRenderedPageBreak/>
         <w:t>3.</w:t>
       </w:r>
       <w:r>
@@ -15563,6 +15739,60 @@
           <w:rFonts w:ascii="Times New Roman" w:eastAsia="Times New Roman" w:hAnsi="Times New Roman" w:cs="Times New Roman"/>
         </w:rPr>
       </w:pPr>
+      <w:r>
+        <w:rPr>
+          <w:rFonts w:ascii="Times New Roman" w:eastAsia="Times New Roman" w:hAnsi="Times New Roman" w:cs="Times New Roman"/>
+          <w:noProof/>
+        </w:rPr>
+        <w:drawing>
+          <wp:inline distT="0" distB="0" distL="0" distR="0" wp14:anchorId="3BA0624F" wp14:editId="6E742C46">
+            <wp:extent cx="5400040" cy="4197350"/>
+            <wp:effectExtent l="0" t="0" r="0" b="0"/>
+            <wp:docPr id="307395089" name="Imagen 8"/>
+            <wp:cNvGraphicFramePr>
+              <a:graphicFrameLocks xmlns:a="http://schemas.openxmlformats.org/drawingml/2006/main" noChangeAspect="1"/>
+            </wp:cNvGraphicFramePr>
+            <a:graphic xmlns:a="http://schemas.openxmlformats.org/drawingml/2006/main">
+              <a:graphicData uri="http://schemas.openxmlformats.org/drawingml/2006/picture">
+                <pic:pic xmlns:pic="http://schemas.openxmlformats.org/drawingml/2006/picture">
+                  <pic:nvPicPr>
+                    <pic:cNvPr id="0" name="Picture 8"/>
+                    <pic:cNvPicPr>
+                      <a:picLocks noChangeAspect="1" noChangeArrowheads="1"/>
+                    </pic:cNvPicPr>
+                  </pic:nvPicPr>
+                  <pic:blipFill>
+                    <a:blip r:embed="rId31">
+                      <a:extLst>
+                        <a:ext uri="{28A0092B-C50C-407E-A947-70E740481C1C}">
+                          <a14:useLocalDpi xmlns:a14="http://schemas.microsoft.com/office/drawing/2010/main" val="0"/>
+                        </a:ext>
+                      </a:extLst>
+                    </a:blip>
+                    <a:srcRect/>
+                    <a:stretch>
+                      <a:fillRect/>
+                    </a:stretch>
+                  </pic:blipFill>
+                  <pic:spPr bwMode="auto">
+                    <a:xfrm>
+                      <a:off x="0" y="0"/>
+                      <a:ext cx="5400040" cy="4197350"/>
+                    </a:xfrm>
+                    <a:prstGeom prst="rect">
+                      <a:avLst/>
+                    </a:prstGeom>
+                    <a:noFill/>
+                    <a:ln>
+                      <a:noFill/>
+                    </a:ln>
+                  </pic:spPr>
+                </pic:pic>
+              </a:graphicData>
+            </a:graphic>
+          </wp:inline>
+        </w:drawing>
+      </w:r>
     </w:p>
     <w:p>
       <w:pPr>
@@ -16016,6 +16246,7 @@
                 <w:bCs/>
                 <w:color w:val="000000"/>
               </w:rPr>
+              <w:lastRenderedPageBreak/>
               <w:t xml:space="preserve">PUNTOS DE EXTENSIÓN: </w:t>
             </w:r>
             <w:r>
@@ -16101,7 +16332,6 @@
                 <w:bCs/>
                 <w:color w:val="000000"/>
               </w:rPr>
-              <w:lastRenderedPageBreak/>
               <w:t>ESCENARIO PRINCIPAL: </w:t>
             </w:r>
           </w:p>
@@ -16144,25 +16374,7 @@
                 <w:sz w:val="22"/>
                 <w:szCs w:val="22"/>
               </w:rPr>
-              <w:t xml:space="preserve">” en el menú principal del sistema y selecciona </w:t>
-            </w:r>
-            <w:r>
-              <w:rPr>
-                <w:rFonts w:ascii="Times New Roman" w:eastAsia="Times New Roman" w:hAnsi="Times New Roman" w:cs="Times New Roman"/>
-                <w:color w:val="000000"/>
-                <w:sz w:val="22"/>
-                <w:szCs w:val="22"/>
-              </w:rPr>
-              <w:t>modificar</w:t>
-            </w:r>
-            <w:r>
-              <w:rPr>
-                <w:rFonts w:ascii="Times New Roman" w:eastAsia="Times New Roman" w:hAnsi="Times New Roman" w:cs="Times New Roman"/>
-                <w:color w:val="000000"/>
-                <w:sz w:val="22"/>
-                <w:szCs w:val="22"/>
-              </w:rPr>
-              <w:t xml:space="preserve"> usuario.</w:t>
+              <w:t>” en el menú principal del sistema.</w:t>
             </w:r>
           </w:p>
           <w:p>
@@ -16210,23 +16422,17 @@
                 <w:sz w:val="22"/>
                 <w:szCs w:val="22"/>
               </w:rPr>
-              <w:t>El administrador selecciona el usuario que quiere modificar.</w:t>
-            </w:r>
-          </w:p>
-          <w:p>
-            <w:pPr>
-              <w:numPr>
-                <w:ilvl w:val="0"/>
-                <w:numId w:val="9"/>
-              </w:numPr>
-              <w:spacing w:after="0" w:line="240" w:lineRule="auto"/>
+              <w:t>El administrador selecciona el usuario que quiere modificar</w:t>
+            </w:r>
+            <w:r>
               <w:rPr>
                 <w:rFonts w:ascii="Times New Roman" w:eastAsia="Times New Roman" w:hAnsi="Times New Roman" w:cs="Times New Roman"/>
                 <w:color w:val="000000"/>
                 <w:sz w:val="22"/>
                 <w:szCs w:val="22"/>
               </w:rPr>
-            </w:pPr>
+              <w:t xml:space="preserve">, </w:t>
+            </w:r>
             <w:r>
               <w:rPr>
                 <w:rFonts w:ascii="Times New Roman" w:eastAsia="Times New Roman" w:hAnsi="Times New Roman" w:cs="Times New Roman"/>
@@ -16234,23 +16440,17 @@
                 <w:sz w:val="22"/>
                 <w:szCs w:val="22"/>
               </w:rPr>
-              <w:t>El sistema presenta ese usuario con sus respectivos datos y solicita ingresar los datos que quiera modificar.</w:t>
-            </w:r>
-          </w:p>
-          <w:p>
-            <w:pPr>
-              <w:numPr>
-                <w:ilvl w:val="0"/>
-                <w:numId w:val="9"/>
-              </w:numPr>
-              <w:spacing w:after="0" w:line="240" w:lineRule="auto"/>
+              <w:t>completa los campos que desea modificar</w:t>
+            </w:r>
+            <w:r>
               <w:rPr>
                 <w:rFonts w:ascii="Times New Roman" w:eastAsia="Times New Roman" w:hAnsi="Times New Roman" w:cs="Times New Roman"/>
                 <w:color w:val="000000"/>
                 <w:sz w:val="22"/>
                 <w:szCs w:val="22"/>
               </w:rPr>
-            </w:pPr>
+              <w:t xml:space="preserve"> y presiona botón modificar</w:t>
+            </w:r>
             <w:r>
               <w:rPr>
                 <w:rFonts w:ascii="Times New Roman" w:eastAsia="Times New Roman" w:hAnsi="Times New Roman" w:cs="Times New Roman"/>
@@ -16258,7 +16458,7 @@
                 <w:sz w:val="22"/>
                 <w:szCs w:val="22"/>
               </w:rPr>
-              <w:t>El administrador ingresa los datos requeridos.</w:t>
+              <w:t>.</w:t>
             </w:r>
           </w:p>
           <w:p>
@@ -16392,7 +16592,25 @@
                 <w:bCs/>
                 <w:color w:val="000000"/>
               </w:rPr>
-              <w:t>FA1- Datos Incorrectos</w:t>
+              <w:t>FA</w:t>
+            </w:r>
+            <w:r>
+              <w:rPr>
+                <w:rFonts w:ascii="Times New Roman" w:eastAsia="Times New Roman" w:hAnsi="Times New Roman" w:cs="Times New Roman"/>
+                <w:b/>
+                <w:bCs/>
+                <w:color w:val="000000"/>
+              </w:rPr>
+              <w:t>1</w:t>
+            </w:r>
+            <w:r>
+              <w:rPr>
+                <w:rFonts w:ascii="Times New Roman" w:eastAsia="Times New Roman" w:hAnsi="Times New Roman" w:cs="Times New Roman"/>
+                <w:b/>
+                <w:bCs/>
+                <w:color w:val="000000"/>
+              </w:rPr>
+              <w:t>- Arrepentimiento de modificación</w:t>
             </w:r>
           </w:p>
           <w:p>
@@ -16410,7 +16628,7 @@
                 <w:bCs/>
                 <w:color w:val="000000"/>
               </w:rPr>
-              <w:t>6</w:t>
+              <w:t>5</w:t>
             </w:r>
             <w:r>
               <w:rPr>
@@ -16426,7 +16644,7 @@
                 <w:rFonts w:ascii="Times New Roman" w:eastAsia="Times New Roman" w:hAnsi="Times New Roman" w:cs="Times New Roman"/>
                 <w:color w:val="000000"/>
               </w:rPr>
-              <w:t>El sistema solicita al administrador que vuelva a ingresar los datos requeridos.</w:t>
+              <w:t>El administrador rechaza la acción.</w:t>
             </w:r>
           </w:p>
           <w:p>
@@ -16434,40 +16652,9 @@
               <w:spacing w:after="0" w:line="240" w:lineRule="auto"/>
               <w:rPr>
                 <w:rFonts w:ascii="Times New Roman" w:eastAsia="Times New Roman" w:hAnsi="Times New Roman" w:cs="Times New Roman"/>
-                <w:color w:val="000000"/>
-              </w:rPr>
-            </w:pPr>
-            <w:r>
-              <w:rPr>
-                <w:rFonts w:ascii="Times New Roman" w:eastAsia="Times New Roman" w:hAnsi="Times New Roman" w:cs="Times New Roman"/>
                 <w:b/>
                 <w:bCs/>
                 <w:color w:val="000000"/>
-              </w:rPr>
-              <w:t>6</w:t>
-            </w:r>
-            <w:r>
-              <w:rPr>
-                <w:rFonts w:ascii="Times New Roman" w:eastAsia="Times New Roman" w:hAnsi="Times New Roman" w:cs="Times New Roman"/>
-                <w:b/>
-                <w:bCs/>
-                <w:color w:val="000000"/>
-              </w:rPr>
-              <w:t>.2</w:t>
-            </w:r>
-            <w:r>
-              <w:rPr>
-                <w:rFonts w:ascii="Times New Roman" w:eastAsia="Times New Roman" w:hAnsi="Times New Roman" w:cs="Times New Roman"/>
-                <w:color w:val="000000"/>
-              </w:rPr>
-              <w:t xml:space="preserve"> Vuelve al punto 4 del Escenario Principal.</w:t>
-            </w:r>
-          </w:p>
-          <w:p>
-            <w:pPr>
-              <w:spacing w:after="0" w:line="240" w:lineRule="auto"/>
-              <w:rPr>
-                <w:rFonts w:ascii="Times New Roman" w:eastAsia="Times New Roman" w:hAnsi="Times New Roman" w:cs="Times New Roman"/>
               </w:rPr>
             </w:pPr>
           </w:p>
@@ -16488,7 +16675,25 @@
                 <w:bCs/>
                 <w:color w:val="000000"/>
               </w:rPr>
-              <w:t>FA2- Arrepentimiento de modificación</w:t>
+              <w:t>FA</w:t>
+            </w:r>
+            <w:r>
+              <w:rPr>
+                <w:rFonts w:ascii="Times New Roman" w:eastAsia="Times New Roman" w:hAnsi="Times New Roman" w:cs="Times New Roman"/>
+                <w:b/>
+                <w:bCs/>
+                <w:color w:val="000000"/>
+              </w:rPr>
+              <w:t>2</w:t>
+            </w:r>
+            <w:r>
+              <w:rPr>
+                <w:rFonts w:ascii="Times New Roman" w:eastAsia="Times New Roman" w:hAnsi="Times New Roman" w:cs="Times New Roman"/>
+                <w:b/>
+                <w:bCs/>
+                <w:color w:val="000000"/>
+              </w:rPr>
+              <w:t>- Datos Incorrectos</w:t>
             </w:r>
           </w:p>
           <w:p>
@@ -16496,11 +16701,18 @@
               <w:spacing w:after="0" w:line="240" w:lineRule="auto"/>
               <w:rPr>
                 <w:rFonts w:ascii="Times New Roman" w:eastAsia="Times New Roman" w:hAnsi="Times New Roman" w:cs="Times New Roman"/>
+                <w:color w:val="000000"/>
+              </w:rPr>
+            </w:pPr>
+            <w:r>
+              <w:rPr>
+                <w:rFonts w:ascii="Times New Roman" w:eastAsia="Times New Roman" w:hAnsi="Times New Roman" w:cs="Times New Roman"/>
                 <w:b/>
                 <w:bCs/>
                 <w:color w:val="000000"/>
               </w:rPr>
-            </w:pPr>
+              <w:t>6</w:t>
+            </w:r>
             <w:r>
               <w:rPr>
                 <w:rFonts w:ascii="Times New Roman" w:eastAsia="Times New Roman" w:hAnsi="Times New Roman" w:cs="Times New Roman"/>
@@ -16508,14 +16720,48 @@
                 <w:bCs/>
                 <w:color w:val="000000"/>
               </w:rPr>
-              <w:t xml:space="preserve">8.1 </w:t>
-            </w:r>
-            <w:r>
-              <w:rPr>
-                <w:rFonts w:ascii="Times New Roman" w:eastAsia="Times New Roman" w:hAnsi="Times New Roman" w:cs="Times New Roman"/>
-                <w:color w:val="000000"/>
-              </w:rPr>
-              <w:t>El administrador rechaza la acción.</w:t>
+              <w:t xml:space="preserve">.1 </w:t>
+            </w:r>
+            <w:r>
+              <w:rPr>
+                <w:rFonts w:ascii="Times New Roman" w:eastAsia="Times New Roman" w:hAnsi="Times New Roman" w:cs="Times New Roman"/>
+                <w:color w:val="000000"/>
+              </w:rPr>
+              <w:t>El sistema solicita al administrador que vuelva a ingresar los datos requeridos.</w:t>
+            </w:r>
+          </w:p>
+          <w:p>
+            <w:pPr>
+              <w:spacing w:after="0" w:line="240" w:lineRule="auto"/>
+              <w:rPr>
+                <w:rFonts w:ascii="Times New Roman" w:eastAsia="Times New Roman" w:hAnsi="Times New Roman" w:cs="Times New Roman"/>
+                <w:color w:val="000000"/>
+              </w:rPr>
+            </w:pPr>
+            <w:r>
+              <w:rPr>
+                <w:rFonts w:ascii="Times New Roman" w:eastAsia="Times New Roman" w:hAnsi="Times New Roman" w:cs="Times New Roman"/>
+                <w:b/>
+                <w:bCs/>
+                <w:color w:val="000000"/>
+              </w:rPr>
+              <w:t>6</w:t>
+            </w:r>
+            <w:r>
+              <w:rPr>
+                <w:rFonts w:ascii="Times New Roman" w:eastAsia="Times New Roman" w:hAnsi="Times New Roman" w:cs="Times New Roman"/>
+                <w:b/>
+                <w:bCs/>
+                <w:color w:val="000000"/>
+              </w:rPr>
+              <w:t>.2</w:t>
+            </w:r>
+            <w:r>
+              <w:rPr>
+                <w:rFonts w:ascii="Times New Roman" w:eastAsia="Times New Roman" w:hAnsi="Times New Roman" w:cs="Times New Roman"/>
+                <w:color w:val="000000"/>
+              </w:rPr>
+              <w:t xml:space="preserve"> Vuelve al punto 4 del Escenario Principal.</w:t>
             </w:r>
           </w:p>
         </w:tc>
@@ -16569,58 +16815,106 @@
     </w:tbl>
     <w:p>
       <w:pPr>
-        <w:rPr>
-          <w:rFonts w:ascii="Times New Roman" w:hAnsi="Times New Roman" w:cs="Times New Roman"/>
-        </w:rPr>
-      </w:pPr>
+        <w:pStyle w:val="Ttulo3"/>
+        <w:rPr>
+          <w:rFonts w:ascii="Times New Roman" w:eastAsia="Times New Roman" w:hAnsi="Times New Roman" w:cs="Times New Roman"/>
+        </w:rPr>
+      </w:pPr>
+      <w:bookmarkStart w:id="52" w:name="_Toc229047061"/>
+      <w:r>
+        <w:rPr>
+          <w:rFonts w:ascii="Times New Roman" w:eastAsia="Times New Roman" w:hAnsi="Times New Roman" w:cs="Times New Roman"/>
+        </w:rPr>
+        <w:lastRenderedPageBreak/>
+        <w:t>3.</w:t>
+      </w:r>
+      <w:r>
+        <w:rPr>
+          <w:rFonts w:ascii="Times New Roman" w:eastAsia="Times New Roman" w:hAnsi="Times New Roman" w:cs="Times New Roman"/>
+        </w:rPr>
+        <w:t>8</w:t>
+      </w:r>
+      <w:r>
+        <w:rPr>
+          <w:rFonts w:ascii="Times New Roman" w:eastAsia="Times New Roman" w:hAnsi="Times New Roman" w:cs="Times New Roman"/>
+        </w:rPr>
+        <w:t>.</w:t>
+      </w:r>
+      <w:r>
+        <w:rPr>
+          <w:rFonts w:ascii="Times New Roman" w:eastAsia="Times New Roman" w:hAnsi="Times New Roman" w:cs="Times New Roman"/>
+        </w:rPr>
+        <w:t>2</w:t>
+      </w:r>
+      <w:r>
+        <w:rPr>
+          <w:rFonts w:ascii="Times New Roman" w:eastAsia="Times New Roman" w:hAnsi="Times New Roman" w:cs="Times New Roman"/>
+        </w:rPr>
+        <w:t xml:space="preserve"> Diagrama Secuencia Sistema</w:t>
+      </w:r>
+      <w:bookmarkEnd w:id="52"/>
+      <w:r>
+        <w:rPr>
+          <w:rFonts w:ascii="Times New Roman" w:eastAsia="Times New Roman" w:hAnsi="Times New Roman" w:cs="Times New Roman"/>
+        </w:rPr>
+        <w:t xml:space="preserve"> </w:t>
+      </w:r>
     </w:p>
     <w:p>
-      <w:pPr>
-        <w:pStyle w:val="Ttulo3"/>
-        <w:rPr>
-          <w:rFonts w:ascii="Times New Roman" w:eastAsia="Times New Roman" w:hAnsi="Times New Roman" w:cs="Times New Roman"/>
-        </w:rPr>
-      </w:pPr>
-      <w:bookmarkStart w:id="52" w:name="_Toc229047061"/>
-      <w:r>
-        <w:rPr>
-          <w:rFonts w:ascii="Times New Roman" w:eastAsia="Times New Roman" w:hAnsi="Times New Roman" w:cs="Times New Roman"/>
-        </w:rPr>
-        <w:t>3.</w:t>
-      </w:r>
-      <w:r>
-        <w:rPr>
-          <w:rFonts w:ascii="Times New Roman" w:eastAsia="Times New Roman" w:hAnsi="Times New Roman" w:cs="Times New Roman"/>
-        </w:rPr>
-        <w:t>8</w:t>
-      </w:r>
-      <w:r>
-        <w:rPr>
-          <w:rFonts w:ascii="Times New Roman" w:eastAsia="Times New Roman" w:hAnsi="Times New Roman" w:cs="Times New Roman"/>
-        </w:rPr>
-        <w:t>.</w:t>
-      </w:r>
-      <w:r>
-        <w:rPr>
-          <w:rFonts w:ascii="Times New Roman" w:eastAsia="Times New Roman" w:hAnsi="Times New Roman" w:cs="Times New Roman"/>
-        </w:rPr>
-        <w:t>2</w:t>
-      </w:r>
-      <w:r>
-        <w:rPr>
-          <w:rFonts w:ascii="Times New Roman" w:eastAsia="Times New Roman" w:hAnsi="Times New Roman" w:cs="Times New Roman"/>
-        </w:rPr>
-        <w:t xml:space="preserve"> Diagrama Secuencia Sistema</w:t>
-      </w:r>
-      <w:bookmarkEnd w:id="52"/>
-      <w:r>
-        <w:rPr>
-          <w:rFonts w:ascii="Times New Roman" w:eastAsia="Times New Roman" w:hAnsi="Times New Roman" w:cs="Times New Roman"/>
-        </w:rPr>
-        <w:t xml:space="preserve"> </w:t>
+      <w:r>
+        <w:rPr>
+          <w:noProof/>
+        </w:rPr>
+        <w:drawing>
+          <wp:inline distT="0" distB="0" distL="0" distR="0" wp14:anchorId="6DB8EDA8" wp14:editId="123D6372">
+            <wp:extent cx="5400040" cy="5154295"/>
+            <wp:effectExtent l="0" t="0" r="0" b="8255"/>
+            <wp:docPr id="2026212749" name="Imagen 12"/>
+            <wp:cNvGraphicFramePr>
+              <a:graphicFrameLocks xmlns:a="http://schemas.openxmlformats.org/drawingml/2006/main" noChangeAspect="1"/>
+            </wp:cNvGraphicFramePr>
+            <a:graphic xmlns:a="http://schemas.openxmlformats.org/drawingml/2006/main">
+              <a:graphicData uri="http://schemas.openxmlformats.org/drawingml/2006/picture">
+                <pic:pic xmlns:pic="http://schemas.openxmlformats.org/drawingml/2006/picture">
+                  <pic:nvPicPr>
+                    <pic:cNvPr id="0" name="Picture 12"/>
+                    <pic:cNvPicPr>
+                      <a:picLocks noChangeAspect="1" noChangeArrowheads="1"/>
+                    </pic:cNvPicPr>
+                  </pic:nvPicPr>
+                  <pic:blipFill>
+                    <a:blip r:embed="rId32">
+                      <a:extLst>
+                        <a:ext uri="{28A0092B-C50C-407E-A947-70E740481C1C}">
+                          <a14:useLocalDpi xmlns:a14="http://schemas.microsoft.com/office/drawing/2010/main" val="0"/>
+                        </a:ext>
+                      </a:extLst>
+                    </a:blip>
+                    <a:srcRect/>
+                    <a:stretch>
+                      <a:fillRect/>
+                    </a:stretch>
+                  </pic:blipFill>
+                  <pic:spPr bwMode="auto">
+                    <a:xfrm>
+                      <a:off x="0" y="0"/>
+                      <a:ext cx="5400040" cy="5154295"/>
+                    </a:xfrm>
+                    <a:prstGeom prst="rect">
+                      <a:avLst/>
+                    </a:prstGeom>
+                    <a:noFill/>
+                    <a:ln>
+                      <a:noFill/>
+                    </a:ln>
+                  </pic:spPr>
+                </pic:pic>
+              </a:graphicData>
+            </a:graphic>
+          </wp:inline>
+        </w:drawing>
       </w:r>
     </w:p>
-    <w:p/>
     <w:p>
       <w:pPr>
         <w:pStyle w:val="Ttulo1"/>
@@ -16747,7 +17041,28 @@
         <w:rPr>
           <w:rFonts w:ascii="Times New Roman" w:hAnsi="Times New Roman" w:cs="Times New Roman"/>
         </w:rPr>
-        <w:t>La utilización de la bitácora nos permite llevar un registro de las acciones realizadas dentro del sistema por parte de un usuario del mismo. Cada evento registrado en la bitácora va a tener la fecha y hora en la que se realizó, el correo electrónico del usuario de quien la llevo a cabo, la actividad y la información asociada.</w:t>
+        <w:t xml:space="preserve">La utilización de la bitácora nos permite llevar un registro de las acciones realizadas dentro del sistema por parte de un usuario </w:t>
+      </w:r>
+      <w:proofErr w:type="gramStart"/>
+      <w:r>
+        <w:rPr>
+          <w:rFonts w:ascii="Times New Roman" w:hAnsi="Times New Roman" w:cs="Times New Roman"/>
+        </w:rPr>
+        <w:t>del mismo</w:t>
+      </w:r>
+      <w:proofErr w:type="gramEnd"/>
+      <w:r>
+        <w:rPr>
+          <w:rFonts w:ascii="Times New Roman" w:hAnsi="Times New Roman" w:cs="Times New Roman"/>
+        </w:rPr>
+        <w:t xml:space="preserve">. Cada evento registrado en la </w:t>
+      </w:r>
+      <w:r>
+        <w:rPr>
+          <w:rFonts w:ascii="Times New Roman" w:hAnsi="Times New Roman" w:cs="Times New Roman"/>
+        </w:rPr>
+        <w:lastRenderedPageBreak/>
+        <w:t>bitácora va a tener la fecha y hora en la que se realizó, el correo electrónico del usuario de quien la llevo a cabo, la actividad y la información asociada.</w:t>
       </w:r>
     </w:p>
     <w:p>
@@ -16819,8 +17134,21 @@
         <w:rPr>
           <w:rFonts w:ascii="Times New Roman" w:hAnsi="Times New Roman" w:cs="Times New Roman"/>
         </w:rPr>
-        <w:lastRenderedPageBreak/>
-        <w:t>Información asociada: Leyenda del hecho (Ej: El usuario “x”….. tal actividad)</w:t>
+        <w:t>Información asociada: Leyenda del hecho (Ej: El usuario “x</w:t>
+      </w:r>
+      <w:proofErr w:type="gramStart"/>
+      <w:r>
+        <w:rPr>
+          <w:rFonts w:ascii="Times New Roman" w:hAnsi="Times New Roman" w:cs="Times New Roman"/>
+        </w:rPr>
+        <w:t>”….</w:t>
+      </w:r>
+      <w:proofErr w:type="gramEnd"/>
+      <w:r>
+        <w:rPr>
+          <w:rFonts w:ascii="Times New Roman" w:hAnsi="Times New Roman" w:cs="Times New Roman"/>
+        </w:rPr>
+        <w:t>. tal actividad)</w:t>
       </w:r>
     </w:p>
     <w:p>
@@ -16868,7 +17196,7 @@
                     </pic:cNvPicPr>
                   </pic:nvPicPr>
                   <pic:blipFill>
-                    <a:blip r:embed="rId31">
+                    <a:blip r:embed="rId33">
                       <a:extLst>
                         <a:ext uri="{28A0092B-C50C-407E-A947-70E740481C1C}">
                           <a14:useLocalDpi xmlns:a14="http://schemas.microsoft.com/office/drawing/2010/main" val="0"/>
@@ -16945,7 +17273,7 @@
                     </pic:cNvPicPr>
                   </pic:nvPicPr>
                   <pic:blipFill>
-                    <a:blip r:embed="rId32">
+                    <a:blip r:embed="rId34">
                       <a:extLst>
                         <a:ext uri="{28A0092B-C50C-407E-A947-70E740481C1C}">
                           <a14:useLocalDpi xmlns:a14="http://schemas.microsoft.com/office/drawing/2010/main" val="0"/>
@@ -17049,10 +17377,10 @@
         </w:rPr>
         <w:lastRenderedPageBreak/>
         <w:drawing>
-          <wp:inline distT="0" distB="0" distL="0" distR="0" wp14:anchorId="2F29AF94" wp14:editId="6D41980E">
-            <wp:extent cx="5400040" cy="3038475"/>
-            <wp:effectExtent l="0" t="0" r="0" b="9525"/>
-            <wp:docPr id="1187074565" name="Imagen 5"/>
+          <wp:inline distT="0" distB="0" distL="0" distR="0" wp14:anchorId="309BB058" wp14:editId="17412BE0">
+            <wp:extent cx="5400040" cy="2917825"/>
+            <wp:effectExtent l="0" t="0" r="0" b="0"/>
+            <wp:docPr id="760302292" name="Imagen 13"/>
             <wp:cNvGraphicFramePr>
               <a:graphicFrameLocks xmlns:a="http://schemas.openxmlformats.org/drawingml/2006/main" noChangeAspect="1"/>
             </wp:cNvGraphicFramePr>
@@ -17060,13 +17388,13 @@
               <a:graphicData uri="http://schemas.openxmlformats.org/drawingml/2006/picture">
                 <pic:pic xmlns:pic="http://schemas.openxmlformats.org/drawingml/2006/picture">
                   <pic:nvPicPr>
-                    <pic:cNvPr id="0" name="Picture 5"/>
+                    <pic:cNvPr id="0" name="Picture 13"/>
                     <pic:cNvPicPr>
                       <a:picLocks noChangeAspect="1" noChangeArrowheads="1"/>
                     </pic:cNvPicPr>
                   </pic:nvPicPr>
                   <pic:blipFill>
-                    <a:blip r:embed="rId33">
+                    <a:blip r:embed="rId35">
                       <a:extLst>
                         <a:ext uri="{28A0092B-C50C-407E-A947-70E740481C1C}">
                           <a14:useLocalDpi xmlns:a14="http://schemas.microsoft.com/office/drawing/2010/main" val="0"/>
@@ -17081,7 +17409,7 @@
                   <pic:spPr bwMode="auto">
                     <a:xfrm>
                       <a:off x="0" y="0"/>
-                      <a:ext cx="5400040" cy="3038475"/>
+                      <a:ext cx="5400040" cy="2917825"/>
                     </a:xfrm>
                     <a:prstGeom prst="rect">
                       <a:avLst/>
@@ -17171,7 +17499,7 @@
                     <pic:cNvPicPr/>
                   </pic:nvPicPr>
                   <pic:blipFill>
-                    <a:blip r:embed="rId34"/>
+                    <a:blip r:embed="rId36"/>
                     <a:stretch>
                       <a:fillRect/>
                     </a:stretch>
@@ -17456,7 +17784,7 @@
                     <pic:cNvPicPr/>
                   </pic:nvPicPr>
                   <pic:blipFill rotWithShape="1">
-                    <a:blip r:embed="rId35"/>
+                    <a:blip r:embed="rId37"/>
                     <a:srcRect r="10537" b="-2954"/>
                     <a:stretch>
                       <a:fillRect/>
@@ -17527,7 +17855,7 @@
                     </pic:cNvPicPr>
                   </pic:nvPicPr>
                   <pic:blipFill rotWithShape="1">
-                    <a:blip r:embed="rId36">
+                    <a:blip r:embed="rId38">
                       <a:extLst>
                         <a:ext uri="{28A0092B-C50C-407E-A947-70E740481C1C}">
                           <a14:useLocalDpi xmlns:a14="http://schemas.microsoft.com/office/drawing/2010/main" val="0"/>
@@ -17685,7 +18013,7 @@
                     </pic:cNvPicPr>
                   </pic:nvPicPr>
                   <pic:blipFill>
-                    <a:blip r:embed="rId37">
+                    <a:blip r:embed="rId39">
                       <a:extLst>
                         <a:ext uri="{28A0092B-C50C-407E-A947-70E740481C1C}">
                           <a14:useLocalDpi xmlns:a14="http://schemas.microsoft.com/office/drawing/2010/main" val="0"/>
@@ -17738,7 +18066,7 @@
                     </pic:cNvPicPr>
                   </pic:nvPicPr>
                   <pic:blipFill>
-                    <a:blip r:embed="rId38">
+                    <a:blip r:embed="rId40">
                       <a:extLst>
                         <a:ext uri="{28A0092B-C50C-407E-A947-70E740481C1C}">
                           <a14:useLocalDpi xmlns:a14="http://schemas.microsoft.com/office/drawing/2010/main" val="0"/>
@@ -17828,7 +18156,7 @@
                     </pic:cNvPicPr>
                   </pic:nvPicPr>
                   <pic:blipFill>
-                    <a:blip r:embed="rId39">
+                    <a:blip r:embed="rId41">
                       <a:extLst>
                         <a:ext uri="{28A0092B-C50C-407E-A947-70E740481C1C}">
                           <a14:useLocalDpi xmlns:a14="http://schemas.microsoft.com/office/drawing/2010/main" val="0"/>
@@ -17915,7 +18243,7 @@
                     <pic:cNvPicPr/>
                   </pic:nvPicPr>
                   <pic:blipFill>
-                    <a:blip r:embed="rId40"/>
+                    <a:blip r:embed="rId42"/>
                     <a:stretch>
                       <a:fillRect/>
                     </a:stretch>
@@ -18268,14 +18596,23 @@
                 <w:bCs/>
                 <w:color w:val="000000"/>
               </w:rPr>
-              <w:t xml:space="preserve">ACTOR PRINCIPAL: </w:t>
-            </w:r>
-            <w:r>
-              <w:rPr>
-                <w:rFonts w:ascii="Times New Roman" w:eastAsia="Times New Roman" w:hAnsi="Times New Roman" w:cs="Times New Roman"/>
-                <w:color w:val="000000"/>
-              </w:rPr>
-              <w:t>Usuario</w:t>
+              <w:t>ACTOR PRINCIPAL:</w:t>
+            </w:r>
+            <w:r>
+              <w:rPr>
+                <w:rFonts w:ascii="Times New Roman" w:eastAsia="Times New Roman" w:hAnsi="Times New Roman" w:cs="Times New Roman"/>
+                <w:b/>
+                <w:bCs/>
+                <w:color w:val="000000"/>
+              </w:rPr>
+              <w:t xml:space="preserve"> </w:t>
+            </w:r>
+            <w:r>
+              <w:rPr>
+                <w:rFonts w:ascii="Times New Roman" w:eastAsia="Times New Roman" w:hAnsi="Times New Roman" w:cs="Times New Roman"/>
+                <w:color w:val="000000"/>
+              </w:rPr>
+              <w:t>Administrador</w:t>
             </w:r>
           </w:p>
         </w:tc>
@@ -18395,7 +18732,21 @@
                 <w:rFonts w:ascii="Times New Roman" w:eastAsia="Times New Roman" w:hAnsi="Times New Roman" w:cs="Times New Roman"/>
                 <w:color w:val="000000"/>
               </w:rPr>
-              <w:t>El usuario debió haberse logueado con éxito previamente en el sistema.</w:t>
+              <w:t xml:space="preserve">El </w:t>
+            </w:r>
+            <w:r>
+              <w:rPr>
+                <w:rFonts w:ascii="Times New Roman" w:eastAsia="Times New Roman" w:hAnsi="Times New Roman" w:cs="Times New Roman"/>
+                <w:color w:val="000000"/>
+              </w:rPr>
+              <w:t>Administrador</w:t>
+            </w:r>
+            <w:r>
+              <w:rPr>
+                <w:rFonts w:ascii="Times New Roman" w:eastAsia="Times New Roman" w:hAnsi="Times New Roman" w:cs="Times New Roman"/>
+                <w:color w:val="000000"/>
+              </w:rPr>
+              <w:t xml:space="preserve"> debió haberse logueado con éxito previamente en el sistema.</w:t>
             </w:r>
             <w:r>
               <w:rPr>
@@ -18403,7 +18754,21 @@
                 <w:color w:val="000000"/>
               </w:rPr>
               <w:br/>
-              <w:t>. El usuario debe tener permisos para hacer un control de los productos.</w:t>
+              <w:t xml:space="preserve">. El </w:t>
+            </w:r>
+            <w:r>
+              <w:rPr>
+                <w:rFonts w:ascii="Times New Roman" w:eastAsia="Times New Roman" w:hAnsi="Times New Roman" w:cs="Times New Roman"/>
+                <w:color w:val="000000"/>
+              </w:rPr>
+              <w:t>Administrador</w:t>
+            </w:r>
+            <w:r>
+              <w:rPr>
+                <w:rFonts w:ascii="Times New Roman" w:eastAsia="Times New Roman" w:hAnsi="Times New Roman" w:cs="Times New Roman"/>
+                <w:color w:val="000000"/>
+              </w:rPr>
+              <w:t xml:space="preserve"> debe tener permisos para hacer un control de los productos.</w:t>
             </w:r>
           </w:p>
         </w:tc>
@@ -18561,7 +18926,7 @@
                 <w:sz w:val="22"/>
                 <w:szCs w:val="22"/>
               </w:rPr>
-              <w:t>usuario</w:t>
+              <w:t>administrador</w:t>
             </w:r>
             <w:r>
               <w:rPr>
@@ -18579,7 +18944,7 @@
                 <w:sz w:val="22"/>
                 <w:szCs w:val="22"/>
               </w:rPr>
-              <w:t xml:space="preserve">Formulario </w:t>
+              <w:t>Formulario Productos</w:t>
             </w:r>
             <w:r>
               <w:rPr>
@@ -18588,61 +18953,7 @@
                 <w:sz w:val="22"/>
                 <w:szCs w:val="22"/>
               </w:rPr>
-              <w:t>Producto</w:t>
-            </w:r>
-            <w:r>
-              <w:rPr>
-                <w:rFonts w:ascii="Times New Roman" w:eastAsia="Times New Roman" w:hAnsi="Times New Roman" w:cs="Times New Roman"/>
-                <w:color w:val="000000"/>
-                <w:sz w:val="22"/>
-                <w:szCs w:val="22"/>
-              </w:rPr>
-              <w:t>s</w:t>
-            </w:r>
-            <w:r>
-              <w:rPr>
-                <w:rFonts w:ascii="Times New Roman" w:eastAsia="Times New Roman" w:hAnsi="Times New Roman" w:cs="Times New Roman"/>
-                <w:color w:val="000000"/>
-                <w:sz w:val="22"/>
-                <w:szCs w:val="22"/>
-              </w:rPr>
-              <w:t xml:space="preserve">” en el menú principal del sistema y selecciona </w:t>
-            </w:r>
-            <w:r>
-              <w:rPr>
-                <w:rFonts w:ascii="Times New Roman" w:eastAsia="Times New Roman" w:hAnsi="Times New Roman" w:cs="Times New Roman"/>
-                <w:color w:val="000000"/>
-                <w:sz w:val="22"/>
-                <w:szCs w:val="22"/>
-              </w:rPr>
-              <w:t>agregar</w:t>
-            </w:r>
-            <w:r>
-              <w:rPr>
-                <w:rFonts w:ascii="Times New Roman" w:eastAsia="Times New Roman" w:hAnsi="Times New Roman" w:cs="Times New Roman"/>
-                <w:color w:val="000000"/>
-                <w:sz w:val="22"/>
-                <w:szCs w:val="22"/>
-              </w:rPr>
-              <w:t xml:space="preserve"> </w:t>
-            </w:r>
-            <w:r>
-              <w:rPr>
-                <w:rFonts w:ascii="Times New Roman" w:eastAsia="Times New Roman" w:hAnsi="Times New Roman" w:cs="Times New Roman"/>
-                <w:color w:val="000000"/>
-                <w:sz w:val="22"/>
-                <w:szCs w:val="22"/>
-              </w:rPr>
-              <w:t>producto</w:t>
-            </w:r>
-            <w:r>
-              <w:rPr>
-                <w:rFonts w:ascii="Times New Roman" w:eastAsia="Times New Roman" w:hAnsi="Times New Roman" w:cs="Times New Roman"/>
-                <w:color w:val="000000"/>
-                <w:sz w:val="22"/>
-                <w:szCs w:val="22"/>
-              </w:rPr>
-              <w:t>.</w:t>
+              <w:t>” en el menú principal del sistema.</w:t>
             </w:r>
           </w:p>
           <w:p>
@@ -18666,25 +18977,7 @@
                 <w:sz w:val="22"/>
                 <w:szCs w:val="22"/>
               </w:rPr>
-              <w:t>El sistema solicita el ingreso de los datos (Nombre, Precio, Tipo, Descripción, Cantidad</w:t>
-            </w:r>
-            <w:r>
-              <w:rPr>
-                <w:rFonts w:ascii="Times New Roman" w:eastAsia="Times New Roman" w:hAnsi="Times New Roman" w:cs="Times New Roman"/>
-                <w:color w:val="000000"/>
-                <w:sz w:val="22"/>
-                <w:szCs w:val="22"/>
-              </w:rPr>
-              <w:t>, Código</w:t>
-            </w:r>
-            <w:r>
-              <w:rPr>
-                <w:rFonts w:ascii="Times New Roman" w:eastAsia="Times New Roman" w:hAnsi="Times New Roman" w:cs="Times New Roman"/>
-                <w:color w:val="000000"/>
-                <w:sz w:val="22"/>
-                <w:szCs w:val="22"/>
-              </w:rPr>
-              <w:t>).</w:t>
+              <w:t xml:space="preserve">El sistema solicita el ingreso de los datos </w:t>
             </w:r>
           </w:p>
           <w:p>
@@ -18708,7 +19001,79 @@
                 <w:sz w:val="22"/>
                 <w:szCs w:val="22"/>
               </w:rPr>
-              <w:t>El usuario ingresa los datos requeridos.</w:t>
+              <w:t xml:space="preserve">El </w:t>
+            </w:r>
+            <w:r>
+              <w:rPr>
+                <w:rFonts w:ascii="Times New Roman" w:eastAsia="Times New Roman" w:hAnsi="Times New Roman" w:cs="Times New Roman"/>
+                <w:color w:val="000000"/>
+                <w:sz w:val="22"/>
+                <w:szCs w:val="22"/>
+              </w:rPr>
+              <w:t>administrador</w:t>
+            </w:r>
+            <w:r>
+              <w:rPr>
+                <w:rFonts w:ascii="Times New Roman" w:eastAsia="Times New Roman" w:hAnsi="Times New Roman" w:cs="Times New Roman"/>
+                <w:color w:val="000000"/>
+                <w:sz w:val="22"/>
+                <w:szCs w:val="22"/>
+              </w:rPr>
+              <w:t xml:space="preserve"> ingresa los datos requeridos</w:t>
+            </w:r>
+            <w:r>
+              <w:rPr>
+                <w:rFonts w:ascii="Times New Roman" w:eastAsia="Times New Roman" w:hAnsi="Times New Roman" w:cs="Times New Roman"/>
+                <w:color w:val="000000"/>
+                <w:sz w:val="22"/>
+                <w:szCs w:val="22"/>
+              </w:rPr>
+              <w:t xml:space="preserve"> </w:t>
+            </w:r>
+            <w:r>
+              <w:rPr>
+                <w:rFonts w:ascii="Times New Roman" w:eastAsia="Times New Roman" w:hAnsi="Times New Roman" w:cs="Times New Roman"/>
+                <w:color w:val="000000"/>
+                <w:sz w:val="22"/>
+                <w:szCs w:val="22"/>
+              </w:rPr>
+              <w:t>(Nombre, Precio, Tipo, Descripción, Cantidad</w:t>
+            </w:r>
+            <w:r>
+              <w:rPr>
+                <w:rFonts w:ascii="Times New Roman" w:eastAsia="Times New Roman" w:hAnsi="Times New Roman" w:cs="Times New Roman"/>
+                <w:color w:val="000000"/>
+                <w:sz w:val="22"/>
+                <w:szCs w:val="22"/>
+              </w:rPr>
+              <w:t>, Código</w:t>
+            </w:r>
+            <w:r>
+              <w:rPr>
+                <w:rFonts w:ascii="Times New Roman" w:eastAsia="Times New Roman" w:hAnsi="Times New Roman" w:cs="Times New Roman"/>
+                <w:color w:val="000000"/>
+                <w:sz w:val="22"/>
+                <w:szCs w:val="22"/>
+              </w:rPr>
+              <w:t>)</w:t>
+            </w:r>
+            <w:r>
+              <w:rPr>
+                <w:rFonts w:ascii="Times New Roman" w:eastAsia="Times New Roman" w:hAnsi="Times New Roman" w:cs="Times New Roman"/>
+                <w:color w:val="000000"/>
+                <w:sz w:val="22"/>
+                <w:szCs w:val="22"/>
+              </w:rPr>
+              <w:t xml:space="preserve"> y presiona el botón agregar</w:t>
+            </w:r>
+            <w:r>
+              <w:rPr>
+                <w:rFonts w:ascii="Times New Roman" w:eastAsia="Times New Roman" w:hAnsi="Times New Roman" w:cs="Times New Roman"/>
+                <w:color w:val="000000"/>
+                <w:sz w:val="22"/>
+                <w:szCs w:val="22"/>
+              </w:rPr>
+              <w:t>.</w:t>
             </w:r>
           </w:p>
           <w:p>
@@ -18741,7 +19106,25 @@
                 <w:sz w:val="22"/>
                 <w:szCs w:val="22"/>
               </w:rPr>
-              <w:t xml:space="preserve"> e informa al usuario </w:t>
+              <w:t xml:space="preserve"> e informa al </w:t>
+            </w:r>
+            <w:r>
+              <w:rPr>
+                <w:rFonts w:ascii="Times New Roman" w:eastAsia="Times New Roman" w:hAnsi="Times New Roman" w:cs="Times New Roman"/>
+                <w:color w:val="000000"/>
+                <w:sz w:val="22"/>
+                <w:szCs w:val="22"/>
+              </w:rPr>
+              <w:t>administrador</w:t>
+            </w:r>
+            <w:r>
+              <w:rPr>
+                <w:rFonts w:ascii="Times New Roman" w:eastAsia="Times New Roman" w:hAnsi="Times New Roman" w:cs="Times New Roman"/>
+                <w:color w:val="000000"/>
+                <w:sz w:val="22"/>
+                <w:szCs w:val="22"/>
+              </w:rPr>
+              <w:t xml:space="preserve"> </w:t>
             </w:r>
             <w:r>
               <w:rPr>
@@ -18845,7 +19228,21 @@
                 <w:rFonts w:ascii="Times New Roman" w:eastAsia="Times New Roman" w:hAnsi="Times New Roman" w:cs="Times New Roman"/>
                 <w:color w:val="000000"/>
               </w:rPr>
-              <w:t>El sistema solicita al usuario que vuelva a ingresar los datos requeridos.</w:t>
+              <w:t xml:space="preserve">El sistema solicita al </w:t>
+            </w:r>
+            <w:r>
+              <w:rPr>
+                <w:rFonts w:ascii="Times New Roman" w:eastAsia="Times New Roman" w:hAnsi="Times New Roman" w:cs="Times New Roman"/>
+                <w:color w:val="000000"/>
+              </w:rPr>
+              <w:t>administrador</w:t>
+            </w:r>
+            <w:r>
+              <w:rPr>
+                <w:rFonts w:ascii="Times New Roman" w:eastAsia="Times New Roman" w:hAnsi="Times New Roman" w:cs="Times New Roman"/>
+                <w:color w:val="000000"/>
+              </w:rPr>
+              <w:t xml:space="preserve"> que vuelva a ingresar los datos requeridos.</w:t>
             </w:r>
           </w:p>
           <w:p>
@@ -18853,11 +19250,18 @@
               <w:spacing w:after="0" w:line="240" w:lineRule="auto"/>
               <w:rPr>
                 <w:rFonts w:ascii="Times New Roman" w:eastAsia="Times New Roman" w:hAnsi="Times New Roman" w:cs="Times New Roman"/>
+                <w:color w:val="000000"/>
+              </w:rPr>
+            </w:pPr>
+            <w:r>
+              <w:rPr>
+                <w:rFonts w:ascii="Times New Roman" w:eastAsia="Times New Roman" w:hAnsi="Times New Roman" w:cs="Times New Roman"/>
                 <w:b/>
                 <w:bCs/>
                 <w:color w:val="000000"/>
               </w:rPr>
-            </w:pPr>
+              <w:t>4</w:t>
+            </w:r>
             <w:r>
               <w:rPr>
                 <w:rFonts w:ascii="Times New Roman" w:eastAsia="Times New Roman" w:hAnsi="Times New Roman" w:cs="Times New Roman"/>
@@ -18865,16 +19269,156 @@
                 <w:bCs/>
                 <w:color w:val="000000"/>
               </w:rPr>
-              <w:t>4</w:t>
-            </w:r>
-            <w:r>
+              <w:t xml:space="preserve">.2 </w:t>
+            </w:r>
+            <w:r>
+              <w:rPr>
+                <w:rFonts w:ascii="Times New Roman" w:eastAsia="Times New Roman" w:hAnsi="Times New Roman" w:cs="Times New Roman"/>
+                <w:color w:val="000000"/>
+              </w:rPr>
+              <w:t>Vuelve al punto 3 del Escenario Principal.</w:t>
+            </w:r>
+          </w:p>
+          <w:p>
+            <w:pPr>
+              <w:spacing w:after="0" w:line="240" w:lineRule="auto"/>
+              <w:rPr>
+                <w:rFonts w:ascii="Times New Roman" w:eastAsia="Times New Roman" w:hAnsi="Times New Roman" w:cs="Times New Roman"/>
+                <w:color w:val="000000"/>
+              </w:rPr>
+            </w:pPr>
+          </w:p>
+          <w:p>
+            <w:pPr>
+              <w:spacing w:after="0" w:line="240" w:lineRule="auto"/>
               <w:rPr>
                 <w:rFonts w:ascii="Times New Roman" w:eastAsia="Times New Roman" w:hAnsi="Times New Roman" w:cs="Times New Roman"/>
                 <w:b/>
                 <w:bCs/>
                 <w:color w:val="000000"/>
               </w:rPr>
-              <w:t xml:space="preserve">.2 </w:t>
+            </w:pPr>
+            <w:r>
+              <w:rPr>
+                <w:rFonts w:ascii="Times New Roman" w:eastAsia="Times New Roman" w:hAnsi="Times New Roman" w:cs="Times New Roman"/>
+                <w:b/>
+                <w:bCs/>
+                <w:color w:val="000000"/>
+              </w:rPr>
+              <w:t>FA</w:t>
+            </w:r>
+            <w:r>
+              <w:rPr>
+                <w:rFonts w:ascii="Times New Roman" w:eastAsia="Times New Roman" w:hAnsi="Times New Roman" w:cs="Times New Roman"/>
+                <w:b/>
+                <w:bCs/>
+                <w:color w:val="000000"/>
+              </w:rPr>
+              <w:t>2</w:t>
+            </w:r>
+            <w:r>
+              <w:rPr>
+                <w:rFonts w:ascii="Times New Roman" w:eastAsia="Times New Roman" w:hAnsi="Times New Roman" w:cs="Times New Roman"/>
+                <w:b/>
+                <w:bCs/>
+                <w:color w:val="000000"/>
+              </w:rPr>
+              <w:t xml:space="preserve">- </w:t>
+            </w:r>
+            <w:r>
+              <w:rPr>
+                <w:rFonts w:ascii="Times New Roman" w:eastAsia="Times New Roman" w:hAnsi="Times New Roman" w:cs="Times New Roman"/>
+                <w:b/>
+                <w:bCs/>
+                <w:color w:val="000000"/>
+              </w:rPr>
+              <w:t>Ya existe un producto con ese código</w:t>
+            </w:r>
+          </w:p>
+          <w:p>
+            <w:pPr>
+              <w:spacing w:after="0" w:line="240" w:lineRule="auto"/>
+              <w:rPr>
+                <w:rFonts w:ascii="Times New Roman" w:eastAsia="Times New Roman" w:hAnsi="Times New Roman" w:cs="Times New Roman"/>
+                <w:b/>
+                <w:bCs/>
+                <w:color w:val="000000"/>
+              </w:rPr>
+            </w:pPr>
+            <w:r>
+              <w:rPr>
+                <w:rFonts w:ascii="Times New Roman" w:eastAsia="Times New Roman" w:hAnsi="Times New Roman" w:cs="Times New Roman"/>
+                <w:b/>
+                <w:bCs/>
+                <w:color w:val="000000"/>
+              </w:rPr>
+              <w:t xml:space="preserve">4.1.1 </w:t>
+            </w:r>
+            <w:r>
+              <w:rPr>
+                <w:rFonts w:ascii="Times New Roman" w:eastAsia="Times New Roman" w:hAnsi="Times New Roman" w:cs="Times New Roman"/>
+                <w:color w:val="000000"/>
+              </w:rPr>
+              <w:t xml:space="preserve">El sistema solicita al </w:t>
+            </w:r>
+            <w:r>
+              <w:rPr>
+                <w:rFonts w:ascii="Times New Roman" w:eastAsia="Times New Roman" w:hAnsi="Times New Roman" w:cs="Times New Roman"/>
+                <w:color w:val="000000"/>
+              </w:rPr>
+              <w:t>administrador</w:t>
+            </w:r>
+            <w:r>
+              <w:rPr>
+                <w:rFonts w:ascii="Times New Roman" w:eastAsia="Times New Roman" w:hAnsi="Times New Roman" w:cs="Times New Roman"/>
+                <w:color w:val="000000"/>
+              </w:rPr>
+              <w:t xml:space="preserve"> que vuelva a ingresar los datos requeridos.</w:t>
+            </w:r>
+          </w:p>
+          <w:p>
+            <w:pPr>
+              <w:spacing w:after="0" w:line="240" w:lineRule="auto"/>
+              <w:rPr>
+                <w:rFonts w:ascii="Times New Roman" w:eastAsia="Times New Roman" w:hAnsi="Times New Roman" w:cs="Times New Roman"/>
+                <w:color w:val="000000"/>
+              </w:rPr>
+            </w:pPr>
+            <w:r>
+              <w:rPr>
+                <w:rFonts w:ascii="Times New Roman" w:eastAsia="Times New Roman" w:hAnsi="Times New Roman" w:cs="Times New Roman"/>
+                <w:b/>
+                <w:bCs/>
+                <w:color w:val="000000"/>
+              </w:rPr>
+              <w:t>4</w:t>
+            </w:r>
+            <w:r>
+              <w:rPr>
+                <w:rFonts w:ascii="Times New Roman" w:eastAsia="Times New Roman" w:hAnsi="Times New Roman" w:cs="Times New Roman"/>
+                <w:b/>
+                <w:bCs/>
+                <w:color w:val="000000"/>
+              </w:rPr>
+              <w:t>.</w:t>
+            </w:r>
+            <w:r>
+              <w:rPr>
+                <w:rFonts w:ascii="Times New Roman" w:eastAsia="Times New Roman" w:hAnsi="Times New Roman" w:cs="Times New Roman"/>
+                <w:b/>
+                <w:bCs/>
+                <w:color w:val="000000"/>
+              </w:rPr>
+              <w:t>1.</w:t>
+            </w:r>
+            <w:r>
+              <w:rPr>
+                <w:rFonts w:ascii="Times New Roman" w:eastAsia="Times New Roman" w:hAnsi="Times New Roman" w:cs="Times New Roman"/>
+                <w:b/>
+                <w:bCs/>
+                <w:color w:val="000000"/>
+              </w:rPr>
+              <w:t xml:space="preserve">2 </w:t>
             </w:r>
             <w:r>
               <w:rPr>
@@ -18945,6 +19489,7 @@
         <w:rPr>
           <w:rFonts w:ascii="Times New Roman" w:eastAsia="Times New Roman" w:hAnsi="Times New Roman" w:cs="Times New Roman"/>
         </w:rPr>
+        <w:lastRenderedPageBreak/>
         <w:t>6</w:t>
       </w:r>
       <w:r>
@@ -18991,6 +19536,60 @@
           <w:rFonts w:ascii="Times New Roman" w:hAnsi="Times New Roman" w:cs="Times New Roman"/>
         </w:rPr>
       </w:pPr>
+      <w:r>
+        <w:rPr>
+          <w:rFonts w:ascii="Times New Roman" w:hAnsi="Times New Roman" w:cs="Times New Roman"/>
+          <w:noProof/>
+        </w:rPr>
+        <w:drawing>
+          <wp:inline distT="0" distB="0" distL="0" distR="0" wp14:anchorId="091C9D8E" wp14:editId="707F5AC8">
+            <wp:extent cx="5400040" cy="5364480"/>
+            <wp:effectExtent l="0" t="0" r="0" b="7620"/>
+            <wp:docPr id="1720397315" name="Imagen 14"/>
+            <wp:cNvGraphicFramePr>
+              <a:graphicFrameLocks xmlns:a="http://schemas.openxmlformats.org/drawingml/2006/main" noChangeAspect="1"/>
+            </wp:cNvGraphicFramePr>
+            <a:graphic xmlns:a="http://schemas.openxmlformats.org/drawingml/2006/main">
+              <a:graphicData uri="http://schemas.openxmlformats.org/drawingml/2006/picture">
+                <pic:pic xmlns:pic="http://schemas.openxmlformats.org/drawingml/2006/picture">
+                  <pic:nvPicPr>
+                    <pic:cNvPr id="0" name="Picture 14"/>
+                    <pic:cNvPicPr>
+                      <a:picLocks noChangeAspect="1" noChangeArrowheads="1"/>
+                    </pic:cNvPicPr>
+                  </pic:nvPicPr>
+                  <pic:blipFill>
+                    <a:blip r:embed="rId43">
+                      <a:extLst>
+                        <a:ext uri="{28A0092B-C50C-407E-A947-70E740481C1C}">
+                          <a14:useLocalDpi xmlns:a14="http://schemas.microsoft.com/office/drawing/2010/main" val="0"/>
+                        </a:ext>
+                      </a:extLst>
+                    </a:blip>
+                    <a:srcRect/>
+                    <a:stretch>
+                      <a:fillRect/>
+                    </a:stretch>
+                  </pic:blipFill>
+                  <pic:spPr bwMode="auto">
+                    <a:xfrm>
+                      <a:off x="0" y="0"/>
+                      <a:ext cx="5400040" cy="5364480"/>
+                    </a:xfrm>
+                    <a:prstGeom prst="rect">
+                      <a:avLst/>
+                    </a:prstGeom>
+                    <a:noFill/>
+                    <a:ln>
+                      <a:noFill/>
+                    </a:ln>
+                  </pic:spPr>
+                </pic:pic>
+              </a:graphicData>
+            </a:graphic>
+          </wp:inline>
+        </w:drawing>
+      </w:r>
     </w:p>
     <w:p>
       <w:pPr>
@@ -19250,7 +19849,21 @@
                 <w:rFonts w:ascii="Times New Roman" w:eastAsia="Times New Roman" w:hAnsi="Times New Roman" w:cs="Times New Roman"/>
                 <w:color w:val="000000"/>
               </w:rPr>
-              <w:t>El caso de uso permitirá al usuario dar de baja un producto existente en el sistema.</w:t>
+              <w:t xml:space="preserve">El caso de uso permitirá al </w:t>
+            </w:r>
+            <w:r>
+              <w:rPr>
+                <w:rFonts w:ascii="Times New Roman" w:eastAsia="Times New Roman" w:hAnsi="Times New Roman" w:cs="Times New Roman"/>
+                <w:color w:val="000000"/>
+              </w:rPr>
+              <w:t>administrador</w:t>
+            </w:r>
+            <w:r>
+              <w:rPr>
+                <w:rFonts w:ascii="Times New Roman" w:eastAsia="Times New Roman" w:hAnsi="Times New Roman" w:cs="Times New Roman"/>
+                <w:color w:val="000000"/>
+              </w:rPr>
+              <w:t xml:space="preserve"> dar de baja un producto existente en el sistema.</w:t>
             </w:r>
           </w:p>
         </w:tc>
@@ -19289,6 +19902,7 @@
                 <w:bCs/>
                 <w:color w:val="000000"/>
               </w:rPr>
+              <w:lastRenderedPageBreak/>
               <w:t xml:space="preserve">ACTOR PRINCIPAL: </w:t>
             </w:r>
             <w:r>
@@ -19296,7 +19910,7 @@
                 <w:rFonts w:ascii="Times New Roman" w:eastAsia="Times New Roman" w:hAnsi="Times New Roman" w:cs="Times New Roman"/>
                 <w:color w:val="000000"/>
               </w:rPr>
-              <w:t>Usuario</w:t>
+              <w:t>Administrador</w:t>
             </w:r>
           </w:p>
         </w:tc>
@@ -19416,7 +20030,21 @@
                 <w:rFonts w:ascii="Times New Roman" w:eastAsia="Times New Roman" w:hAnsi="Times New Roman" w:cs="Times New Roman"/>
                 <w:color w:val="000000"/>
               </w:rPr>
-              <w:t>El usuario debió haberse logueado con éxito previamente en el sistema.</w:t>
+              <w:t xml:space="preserve">El </w:t>
+            </w:r>
+            <w:r>
+              <w:rPr>
+                <w:rFonts w:ascii="Times New Roman" w:eastAsia="Times New Roman" w:hAnsi="Times New Roman" w:cs="Times New Roman"/>
+                <w:color w:val="000000"/>
+              </w:rPr>
+              <w:t>administrador</w:t>
+            </w:r>
+            <w:r>
+              <w:rPr>
+                <w:rFonts w:ascii="Times New Roman" w:eastAsia="Times New Roman" w:hAnsi="Times New Roman" w:cs="Times New Roman"/>
+                <w:color w:val="000000"/>
+              </w:rPr>
+              <w:t xml:space="preserve"> debió haberse logueado con éxito previamente en el sistema.</w:t>
             </w:r>
             <w:r>
               <w:rPr>
@@ -19424,7 +20052,21 @@
                 <w:color w:val="000000"/>
               </w:rPr>
               <w:br/>
-              <w:t>. El usuario debe tener permisos para hacer un control de los productos.</w:t>
+              <w:t xml:space="preserve">. El </w:t>
+            </w:r>
+            <w:r>
+              <w:rPr>
+                <w:rFonts w:ascii="Times New Roman" w:eastAsia="Times New Roman" w:hAnsi="Times New Roman" w:cs="Times New Roman"/>
+                <w:color w:val="000000"/>
+              </w:rPr>
+              <w:t>administrador</w:t>
+            </w:r>
+            <w:r>
+              <w:rPr>
+                <w:rFonts w:ascii="Times New Roman" w:eastAsia="Times New Roman" w:hAnsi="Times New Roman" w:cs="Times New Roman"/>
+                <w:color w:val="000000"/>
+              </w:rPr>
+              <w:t xml:space="preserve"> debe tener permisos para hacer un control de los productos.</w:t>
             </w:r>
           </w:p>
           <w:p>
@@ -19563,7 +20205,6 @@
                 <w:bCs/>
                 <w:color w:val="000000"/>
               </w:rPr>
-              <w:lastRenderedPageBreak/>
               <w:t>ESCENARIO PRINCIPAL: </w:t>
             </w:r>
           </w:p>
@@ -19597,7 +20238,7 @@
                 <w:sz w:val="22"/>
                 <w:szCs w:val="22"/>
               </w:rPr>
-              <w:t>usuario</w:t>
+              <w:t>administrador</w:t>
             </w:r>
             <w:r>
               <w:rPr>
@@ -19615,16 +20256,7 @@
                 <w:sz w:val="22"/>
                 <w:szCs w:val="22"/>
               </w:rPr>
-              <w:t xml:space="preserve">Formulario </w:t>
-            </w:r>
-            <w:r>
-              <w:rPr>
-                <w:rFonts w:ascii="Times New Roman" w:eastAsia="Times New Roman" w:hAnsi="Times New Roman" w:cs="Times New Roman"/>
-                <w:color w:val="000000"/>
-                <w:sz w:val="22"/>
-                <w:szCs w:val="22"/>
-              </w:rPr>
-              <w:t>Productos</w:t>
+              <w:t>Formulario Productos</w:t>
             </w:r>
             <w:r>
               <w:rPr>
@@ -19735,7 +20367,25 @@
                 <w:sz w:val="22"/>
                 <w:szCs w:val="22"/>
               </w:rPr>
-              <w:t>El usuario selecciona el producto que quiere dar de baja.</w:t>
+              <w:t xml:space="preserve">El </w:t>
+            </w:r>
+            <w:r>
+              <w:rPr>
+                <w:rFonts w:ascii="Times New Roman" w:eastAsia="Times New Roman" w:hAnsi="Times New Roman" w:cs="Times New Roman"/>
+                <w:color w:val="000000"/>
+                <w:sz w:val="22"/>
+                <w:szCs w:val="22"/>
+              </w:rPr>
+              <w:t>administrador</w:t>
+            </w:r>
+            <w:r>
+              <w:rPr>
+                <w:rFonts w:ascii="Times New Roman" w:eastAsia="Times New Roman" w:hAnsi="Times New Roman" w:cs="Times New Roman"/>
+                <w:color w:val="000000"/>
+                <w:sz w:val="22"/>
+                <w:szCs w:val="22"/>
+              </w:rPr>
+              <w:t xml:space="preserve"> selecciona el producto que quiere dar de baja.</w:t>
             </w:r>
           </w:p>
           <w:p>
@@ -19783,7 +20433,25 @@
                 <w:sz w:val="22"/>
                 <w:szCs w:val="22"/>
               </w:rPr>
-              <w:t>El usuario confirma baja.</w:t>
+              <w:t xml:space="preserve">El </w:t>
+            </w:r>
+            <w:r>
+              <w:rPr>
+                <w:rFonts w:ascii="Times New Roman" w:eastAsia="Times New Roman" w:hAnsi="Times New Roman" w:cs="Times New Roman"/>
+                <w:color w:val="000000"/>
+                <w:sz w:val="22"/>
+                <w:szCs w:val="22"/>
+              </w:rPr>
+              <w:t>administrador</w:t>
+            </w:r>
+            <w:r>
+              <w:rPr>
+                <w:rFonts w:ascii="Times New Roman" w:eastAsia="Times New Roman" w:hAnsi="Times New Roman" w:cs="Times New Roman"/>
+                <w:color w:val="000000"/>
+                <w:sz w:val="22"/>
+                <w:szCs w:val="22"/>
+              </w:rPr>
+              <w:t xml:space="preserve"> confirma baja.</w:t>
             </w:r>
           </w:p>
           <w:p>
@@ -19814,7 +20482,25 @@
                 <w:sz w:val="22"/>
                 <w:szCs w:val="22"/>
               </w:rPr>
-              <w:t>El sistema informa al usuario con un mensaje en pantalla “Baja exitosa”.</w:t>
+              <w:t xml:space="preserve">El sistema informa al </w:t>
+            </w:r>
+            <w:r>
+              <w:rPr>
+                <w:rFonts w:ascii="Times New Roman" w:eastAsia="Times New Roman" w:hAnsi="Times New Roman" w:cs="Times New Roman"/>
+                <w:color w:val="000000"/>
+                <w:sz w:val="22"/>
+                <w:szCs w:val="22"/>
+              </w:rPr>
+              <w:t>administrador</w:t>
+            </w:r>
+            <w:r>
+              <w:rPr>
+                <w:rFonts w:ascii="Times New Roman" w:eastAsia="Times New Roman" w:hAnsi="Times New Roman" w:cs="Times New Roman"/>
+                <w:color w:val="000000"/>
+                <w:sz w:val="22"/>
+                <w:szCs w:val="22"/>
+              </w:rPr>
+              <w:t xml:space="preserve"> con un mensaje en pantalla “Baja exitosa”.</w:t>
             </w:r>
           </w:p>
         </w:tc>
@@ -19873,7 +20559,16 @@
                 <w:bCs/>
                 <w:color w:val="000000"/>
               </w:rPr>
-              <w:t>FA1- Arrepentimiento de baja</w:t>
+              <w:t xml:space="preserve">FA1- </w:t>
+            </w:r>
+            <w:r>
+              <w:rPr>
+                <w:rFonts w:ascii="Times New Roman" w:eastAsia="Times New Roman" w:hAnsi="Times New Roman" w:cs="Times New Roman"/>
+                <w:b/>
+                <w:bCs/>
+                <w:color w:val="000000"/>
+              </w:rPr>
+              <w:t>Arrepentimiento de baja</w:t>
             </w:r>
           </w:p>
           <w:p>
@@ -19900,7 +20595,21 @@
                 <w:rFonts w:ascii="Times New Roman" w:eastAsia="Times New Roman" w:hAnsi="Times New Roman" w:cs="Times New Roman"/>
                 <w:color w:val="000000"/>
               </w:rPr>
-              <w:t>El usuario rechaza la acción.</w:t>
+              <w:t xml:space="preserve">El </w:t>
+            </w:r>
+            <w:r>
+              <w:rPr>
+                <w:rFonts w:ascii="Times New Roman" w:eastAsia="Times New Roman" w:hAnsi="Times New Roman" w:cs="Times New Roman"/>
+                <w:color w:val="000000"/>
+              </w:rPr>
+              <w:t>administrador</w:t>
+            </w:r>
+            <w:r>
+              <w:rPr>
+                <w:rFonts w:ascii="Times New Roman" w:eastAsia="Times New Roman" w:hAnsi="Times New Roman" w:cs="Times New Roman"/>
+                <w:color w:val="000000"/>
+              </w:rPr>
+              <w:t xml:space="preserve"> rechaza la acción.</w:t>
             </w:r>
           </w:p>
         </w:tc>
@@ -19946,7 +20655,35 @@
                 <w:rFonts w:ascii="Times New Roman" w:eastAsia="Times New Roman" w:hAnsi="Times New Roman" w:cs="Times New Roman"/>
                 <w:color w:val="000000"/>
               </w:rPr>
-              <w:t>El usuario da de baja con éxito un usuario del sistema.</w:t>
+              <w:t xml:space="preserve">El </w:t>
+            </w:r>
+            <w:r>
+              <w:rPr>
+                <w:rFonts w:ascii="Times New Roman" w:eastAsia="Times New Roman" w:hAnsi="Times New Roman" w:cs="Times New Roman"/>
+                <w:color w:val="000000"/>
+              </w:rPr>
+              <w:t>administrador</w:t>
+            </w:r>
+            <w:r>
+              <w:rPr>
+                <w:rFonts w:ascii="Times New Roman" w:eastAsia="Times New Roman" w:hAnsi="Times New Roman" w:cs="Times New Roman"/>
+                <w:color w:val="000000"/>
+              </w:rPr>
+              <w:t xml:space="preserve"> da de baja con éxito un </w:t>
+            </w:r>
+            <w:r>
+              <w:rPr>
+                <w:rFonts w:ascii="Times New Roman" w:eastAsia="Times New Roman" w:hAnsi="Times New Roman" w:cs="Times New Roman"/>
+                <w:color w:val="000000"/>
+              </w:rPr>
+              <w:t>producto</w:t>
+            </w:r>
+            <w:r>
+              <w:rPr>
+                <w:rFonts w:ascii="Times New Roman" w:eastAsia="Times New Roman" w:hAnsi="Times New Roman" w:cs="Times New Roman"/>
+                <w:color w:val="000000"/>
+              </w:rPr>
+              <w:t xml:space="preserve"> del sistema.</w:t>
             </w:r>
           </w:p>
         </w:tc>
@@ -20257,7 +20994,21 @@
                 <w:rFonts w:ascii="Times New Roman" w:eastAsia="Times New Roman" w:hAnsi="Times New Roman" w:cs="Times New Roman"/>
                 <w:color w:val="000000"/>
               </w:rPr>
-              <w:t>El caso de uso permitirá al usuario modificar los datos de un producto existente en el sistema.</w:t>
+              <w:t xml:space="preserve">El caso de uso permitirá al </w:t>
+            </w:r>
+            <w:r>
+              <w:rPr>
+                <w:rFonts w:ascii="Times New Roman" w:eastAsia="Times New Roman" w:hAnsi="Times New Roman" w:cs="Times New Roman"/>
+                <w:color w:val="000000"/>
+              </w:rPr>
+              <w:t>administrador</w:t>
+            </w:r>
+            <w:r>
+              <w:rPr>
+                <w:rFonts w:ascii="Times New Roman" w:eastAsia="Times New Roman" w:hAnsi="Times New Roman" w:cs="Times New Roman"/>
+                <w:color w:val="000000"/>
+              </w:rPr>
+              <w:t xml:space="preserve"> modificar los datos de un producto existente en el sistema.</w:t>
             </w:r>
           </w:p>
         </w:tc>
@@ -20303,7 +21054,7 @@
                 <w:rFonts w:ascii="Times New Roman" w:eastAsia="Times New Roman" w:hAnsi="Times New Roman" w:cs="Times New Roman"/>
                 <w:color w:val="000000"/>
               </w:rPr>
-              <w:t>Usuario</w:t>
+              <w:t>Administrador</w:t>
             </w:r>
           </w:p>
         </w:tc>
@@ -20423,7 +21174,21 @@
                 <w:rFonts w:ascii="Times New Roman" w:eastAsia="Times New Roman" w:hAnsi="Times New Roman" w:cs="Times New Roman"/>
                 <w:color w:val="000000"/>
               </w:rPr>
-              <w:t>El usuario debió haberse logueado con éxito previamente en el sistema.</w:t>
+              <w:t xml:space="preserve">El </w:t>
+            </w:r>
+            <w:r>
+              <w:rPr>
+                <w:rFonts w:ascii="Times New Roman" w:eastAsia="Times New Roman" w:hAnsi="Times New Roman" w:cs="Times New Roman"/>
+                <w:color w:val="000000"/>
+              </w:rPr>
+              <w:t>administrador</w:t>
+            </w:r>
+            <w:r>
+              <w:rPr>
+                <w:rFonts w:ascii="Times New Roman" w:eastAsia="Times New Roman" w:hAnsi="Times New Roman" w:cs="Times New Roman"/>
+                <w:color w:val="000000"/>
+              </w:rPr>
+              <w:t xml:space="preserve"> debió haberse logueado con éxito previamente en el sistema.</w:t>
             </w:r>
             <w:r>
               <w:rPr>
@@ -20431,7 +21196,21 @@
                 <w:color w:val="000000"/>
               </w:rPr>
               <w:br/>
-              <w:t>. El usuario debe tener permisos para hacer un control de los productos.</w:t>
+              <w:t xml:space="preserve">. El </w:t>
+            </w:r>
+            <w:r>
+              <w:rPr>
+                <w:rFonts w:ascii="Times New Roman" w:eastAsia="Times New Roman" w:hAnsi="Times New Roman" w:cs="Times New Roman"/>
+                <w:color w:val="000000"/>
+              </w:rPr>
+              <w:t>administrador</w:t>
+            </w:r>
+            <w:r>
+              <w:rPr>
+                <w:rFonts w:ascii="Times New Roman" w:eastAsia="Times New Roman" w:hAnsi="Times New Roman" w:cs="Times New Roman"/>
+                <w:color w:val="000000"/>
+              </w:rPr>
+              <w:t xml:space="preserve"> debe tener permisos para hacer un control de los productos.</w:t>
             </w:r>
           </w:p>
           <w:p>
@@ -20446,6 +21225,7 @@
                 <w:rFonts w:ascii="Times New Roman" w:eastAsia="Times New Roman" w:hAnsi="Times New Roman" w:cs="Times New Roman"/>
                 <w:color w:val="000000"/>
               </w:rPr>
+              <w:lastRenderedPageBreak/>
               <w:t>. Debe de haber por lo menos un producto registrado en el sistema.</w:t>
             </w:r>
           </w:p>
@@ -20485,6 +21265,7 @@
                 <w:bCs/>
                 <w:color w:val="000000"/>
               </w:rPr>
+              <w:lastRenderedPageBreak/>
               <w:t xml:space="preserve">PUNTOS DE EXTENSIÓN: </w:t>
             </w:r>
             <w:r>
@@ -20603,7 +21384,7 @@
                 <w:sz w:val="22"/>
                 <w:szCs w:val="22"/>
               </w:rPr>
-              <w:t>usuario</w:t>
+              <w:t>administrador</w:t>
             </w:r>
             <w:r>
               <w:rPr>
@@ -20621,16 +21402,7 @@
                 <w:sz w:val="22"/>
                 <w:szCs w:val="22"/>
               </w:rPr>
-              <w:t xml:space="preserve">Formulario </w:t>
-            </w:r>
-            <w:r>
-              <w:rPr>
-                <w:rFonts w:ascii="Times New Roman" w:eastAsia="Times New Roman" w:hAnsi="Times New Roman" w:cs="Times New Roman"/>
-                <w:color w:val="000000"/>
-                <w:sz w:val="22"/>
-                <w:szCs w:val="22"/>
-              </w:rPr>
-              <w:t>Productos</w:t>
+              <w:t>Formulario Productos</w:t>
             </w:r>
             <w:r>
               <w:rPr>
@@ -20741,7 +21513,25 @@
                 <w:sz w:val="22"/>
                 <w:szCs w:val="22"/>
               </w:rPr>
-              <w:t>El usuario selecciona el producto que quiere modificar.</w:t>
+              <w:t xml:space="preserve">El </w:t>
+            </w:r>
+            <w:r>
+              <w:rPr>
+                <w:rFonts w:ascii="Times New Roman" w:eastAsia="Times New Roman" w:hAnsi="Times New Roman" w:cs="Times New Roman"/>
+                <w:color w:val="000000"/>
+                <w:sz w:val="22"/>
+                <w:szCs w:val="22"/>
+              </w:rPr>
+              <w:t>administrador</w:t>
+            </w:r>
+            <w:r>
+              <w:rPr>
+                <w:rFonts w:ascii="Times New Roman" w:eastAsia="Times New Roman" w:hAnsi="Times New Roman" w:cs="Times New Roman"/>
+                <w:color w:val="000000"/>
+                <w:sz w:val="22"/>
+                <w:szCs w:val="22"/>
+              </w:rPr>
+              <w:t xml:space="preserve"> selecciona el producto que quiere modificar.</w:t>
             </w:r>
           </w:p>
           <w:p>
@@ -20765,7 +21555,6 @@
                 <w:sz w:val="22"/>
                 <w:szCs w:val="22"/>
               </w:rPr>
-              <w:lastRenderedPageBreak/>
               <w:t xml:space="preserve">El sistema presenta </w:t>
             </w:r>
             <w:r>
@@ -20808,7 +21597,25 @@
                 <w:sz w:val="22"/>
                 <w:szCs w:val="22"/>
               </w:rPr>
-              <w:t>El usuario ingresa los datos requeridos.</w:t>
+              <w:t xml:space="preserve">El </w:t>
+            </w:r>
+            <w:r>
+              <w:rPr>
+                <w:rFonts w:ascii="Times New Roman" w:eastAsia="Times New Roman" w:hAnsi="Times New Roman" w:cs="Times New Roman"/>
+                <w:color w:val="000000"/>
+                <w:sz w:val="22"/>
+                <w:szCs w:val="22"/>
+              </w:rPr>
+              <w:t>administrador</w:t>
+            </w:r>
+            <w:r>
+              <w:rPr>
+                <w:rFonts w:ascii="Times New Roman" w:eastAsia="Times New Roman" w:hAnsi="Times New Roman" w:cs="Times New Roman"/>
+                <w:color w:val="000000"/>
+                <w:sz w:val="22"/>
+                <w:szCs w:val="22"/>
+              </w:rPr>
+              <w:t xml:space="preserve"> ingresa los datos requeridos.</w:t>
             </w:r>
           </w:p>
           <w:p>
@@ -20856,7 +21663,25 @@
                 <w:sz w:val="22"/>
                 <w:szCs w:val="22"/>
               </w:rPr>
-              <w:t>El usuario confirma modificación.</w:t>
+              <w:t xml:space="preserve">El </w:t>
+            </w:r>
+            <w:r>
+              <w:rPr>
+                <w:rFonts w:ascii="Times New Roman" w:eastAsia="Times New Roman" w:hAnsi="Times New Roman" w:cs="Times New Roman"/>
+                <w:color w:val="000000"/>
+                <w:sz w:val="22"/>
+                <w:szCs w:val="22"/>
+              </w:rPr>
+              <w:t>administrador</w:t>
+            </w:r>
+            <w:r>
+              <w:rPr>
+                <w:rFonts w:ascii="Times New Roman" w:eastAsia="Times New Roman" w:hAnsi="Times New Roman" w:cs="Times New Roman"/>
+                <w:color w:val="000000"/>
+                <w:sz w:val="22"/>
+                <w:szCs w:val="22"/>
+              </w:rPr>
+              <w:t xml:space="preserve"> confirma modificación.</w:t>
             </w:r>
           </w:p>
           <w:p>
@@ -20931,7 +21756,6 @@
                 <w:bCs/>
                 <w:color w:val="000000"/>
               </w:rPr>
-              <w:lastRenderedPageBreak/>
               <w:t>FLUJOS ALTERNATIVO: </w:t>
             </w:r>
           </w:p>
@@ -21241,7 +22065,11 @@
         <w:t xml:space="preserve">Si </w:t>
       </w:r>
       <w:r>
-        <w:t xml:space="preserve">se han intercambiado datos de posición. Para esto último es importante, al momento de determinar el algoritmo de cálculo a emplear, que en el cálculo no sólo participe el contenido del atributo sino también la posición del carácter y la posición del atributo dentro de la entidad.  </w:t>
+        <w:t xml:space="preserve">se han intercambiado datos de posición. Para esto último es importante, al momento de determinar el algoritmo de cálculo a </w:t>
+      </w:r>
+      <w:r>
+        <w:lastRenderedPageBreak/>
+        <w:t xml:space="preserve">emplear, que en el cálculo no sólo participe el contenido del atributo sino también la posición del carácter y la posición del atributo dentro de la entidad.  </w:t>
       </w:r>
     </w:p>
     <w:p>
@@ -21256,7 +22084,6 @@
         <w:rPr>
           <w:rFonts w:ascii="Times New Roman" w:eastAsia="Times New Roman" w:hAnsi="Times New Roman" w:cs="Times New Roman"/>
         </w:rPr>
-        <w:lastRenderedPageBreak/>
         <w:t>8. GESTIÓN DE PERFILES DE USUARIO</w:t>
       </w:r>
       <w:bookmarkEnd w:id="83"/>
@@ -21496,6 +22323,7 @@
           <w:sz w:val="30"/>
           <w:szCs w:val="30"/>
         </w:rPr>
+        <w:lastRenderedPageBreak/>
         <w:t>8.7 Asignar Permiso a Usuario</w:t>
       </w:r>
       <w:bookmarkEnd w:id="92"/>
@@ -21580,7 +22408,6 @@
           <w:sz w:val="28"/>
           <w:szCs w:val="28"/>
         </w:rPr>
-        <w:lastRenderedPageBreak/>
         <w:t>8.8.2 Diagrama Secuencia Sistema</w:t>
       </w:r>
     </w:p>
@@ -21716,7 +22543,6 @@
       </w:r>
       <w:bookmarkEnd w:id="101"/>
     </w:p>
-    <w:p/>
     <w:p>
       <w:pPr>
         <w:pStyle w:val="Ttulo2"/>
@@ -21803,6 +22629,935 @@
       </w:r>
       <w:bookmarkEnd w:id="103"/>
     </w:p>
+    <w:tbl>
+      <w:tblPr>
+        <w:tblW w:w="8500" w:type="dxa"/>
+        <w:tblLayout w:type="fixed"/>
+        <w:tblLook w:val="0400" w:firstRow="0" w:lastRow="0" w:firstColumn="0" w:lastColumn="0" w:noHBand="0" w:noVBand="1"/>
+      </w:tblPr>
+      <w:tblGrid>
+        <w:gridCol w:w="8500"/>
+      </w:tblGrid>
+      <w:tr>
+        <w:trPr>
+          <w:trHeight w:val="371"/>
+        </w:trPr>
+        <w:tc>
+          <w:tcPr>
+            <w:tcW w:w="8500" w:type="dxa"/>
+            <w:tcBorders>
+              <w:top w:val="single" w:sz="8" w:space="0" w:color="000000"/>
+              <w:left w:val="single" w:sz="4" w:space="0" w:color="000000"/>
+              <w:bottom w:val="single" w:sz="4" w:space="0" w:color="000000"/>
+              <w:right w:val="single" w:sz="4" w:space="0" w:color="000000"/>
+            </w:tcBorders>
+            <w:tcMar>
+              <w:top w:w="14" w:type="dxa"/>
+              <w:left w:w="115" w:type="dxa"/>
+              <w:bottom w:w="0" w:type="dxa"/>
+              <w:right w:w="115" w:type="dxa"/>
+            </w:tcMar>
+          </w:tcPr>
+          <w:p>
+            <w:pPr>
+              <w:spacing w:after="0" w:line="240" w:lineRule="auto"/>
+              <w:rPr>
+                <w:rFonts w:ascii="Times New Roman" w:eastAsia="Times New Roman" w:hAnsi="Times New Roman" w:cs="Times New Roman"/>
+              </w:rPr>
+            </w:pPr>
+            <w:r>
+              <w:rPr>
+                <w:rFonts w:ascii="Times New Roman" w:eastAsia="Times New Roman" w:hAnsi="Times New Roman" w:cs="Times New Roman"/>
+                <w:b/>
+                <w:bCs/>
+                <w:color w:val="000000"/>
+              </w:rPr>
+              <w:t xml:space="preserve">ID Y NOMBRE: </w:t>
+            </w:r>
+            <w:r>
+              <w:rPr>
+                <w:rFonts w:ascii="Times New Roman" w:eastAsia="Times New Roman" w:hAnsi="Times New Roman" w:cs="Times New Roman"/>
+                <w:color w:val="000000"/>
+              </w:rPr>
+              <w:t xml:space="preserve">CU 00 – </w:t>
+            </w:r>
+            <w:r>
+              <w:rPr>
+                <w:rFonts w:ascii="Times New Roman" w:eastAsia="Times New Roman" w:hAnsi="Times New Roman" w:cs="Times New Roman"/>
+                <w:color w:val="000000"/>
+              </w:rPr>
+              <w:t>Revertir Cambios</w:t>
+            </w:r>
+          </w:p>
+        </w:tc>
+      </w:tr>
+      <w:tr>
+        <w:trPr>
+          <w:trHeight w:val="371"/>
+        </w:trPr>
+        <w:tc>
+          <w:tcPr>
+            <w:tcW w:w="8500" w:type="dxa"/>
+            <w:tcBorders>
+              <w:top w:val="single" w:sz="4" w:space="0" w:color="000000"/>
+              <w:left w:val="single" w:sz="4" w:space="0" w:color="000000"/>
+              <w:bottom w:val="single" w:sz="8" w:space="0" w:color="000000"/>
+              <w:right w:val="single" w:sz="4" w:space="0" w:color="000000"/>
+            </w:tcBorders>
+            <w:tcMar>
+              <w:top w:w="14" w:type="dxa"/>
+              <w:left w:w="115" w:type="dxa"/>
+              <w:bottom w:w="0" w:type="dxa"/>
+              <w:right w:w="115" w:type="dxa"/>
+            </w:tcMar>
+          </w:tcPr>
+          <w:p>
+            <w:pPr>
+              <w:spacing w:after="0" w:line="240" w:lineRule="auto"/>
+              <w:rPr>
+                <w:rFonts w:ascii="Times New Roman" w:eastAsia="Times New Roman" w:hAnsi="Times New Roman" w:cs="Times New Roman"/>
+              </w:rPr>
+            </w:pPr>
+            <w:r>
+              <w:rPr>
+                <w:rFonts w:ascii="Times New Roman" w:eastAsia="Times New Roman" w:hAnsi="Times New Roman" w:cs="Times New Roman"/>
+                <w:b/>
+                <w:bCs/>
+                <w:color w:val="000000"/>
+              </w:rPr>
+              <w:t>ESTADO:</w:t>
+            </w:r>
+            <w:r>
+              <w:rPr>
+                <w:rFonts w:ascii="Times New Roman" w:eastAsia="Times New Roman" w:hAnsi="Times New Roman" w:cs="Times New Roman"/>
+                <w:color w:val="000000"/>
+              </w:rPr>
+              <w:t> </w:t>
+            </w:r>
+          </w:p>
+        </w:tc>
+      </w:tr>
+      <w:tr>
+        <w:trPr>
+          <w:trHeight w:val="373"/>
+        </w:trPr>
+        <w:tc>
+          <w:tcPr>
+            <w:tcW w:w="8500" w:type="dxa"/>
+            <w:tcBorders>
+              <w:top w:val="single" w:sz="8" w:space="0" w:color="000000"/>
+              <w:left w:val="single" w:sz="4" w:space="0" w:color="000000"/>
+              <w:bottom w:val="single" w:sz="8" w:space="0" w:color="000000"/>
+              <w:right w:val="single" w:sz="4" w:space="0" w:color="000000"/>
+            </w:tcBorders>
+            <w:tcMar>
+              <w:top w:w="14" w:type="dxa"/>
+              <w:left w:w="115" w:type="dxa"/>
+              <w:bottom w:w="0" w:type="dxa"/>
+              <w:right w:w="115" w:type="dxa"/>
+            </w:tcMar>
+          </w:tcPr>
+          <w:p>
+            <w:pPr>
+              <w:spacing w:after="0" w:line="240" w:lineRule="auto"/>
+              <w:rPr>
+                <w:rFonts w:ascii="Times New Roman" w:eastAsia="Times New Roman" w:hAnsi="Times New Roman" w:cs="Times New Roman"/>
+              </w:rPr>
+            </w:pPr>
+            <w:r>
+              <w:rPr>
+                <w:rFonts w:ascii="Times New Roman" w:eastAsia="Times New Roman" w:hAnsi="Times New Roman" w:cs="Times New Roman"/>
+                <w:b/>
+                <w:bCs/>
+                <w:color w:val="000000"/>
+              </w:rPr>
+              <w:t xml:space="preserve">DESCRIPCIÓN: </w:t>
+            </w:r>
+            <w:r>
+              <w:rPr>
+                <w:rFonts w:ascii="Times New Roman" w:eastAsia="Times New Roman" w:hAnsi="Times New Roman" w:cs="Times New Roman"/>
+                <w:color w:val="000000"/>
+              </w:rPr>
+              <w:t xml:space="preserve">El caso de uso </w:t>
+            </w:r>
+            <w:r>
+              <w:rPr>
+                <w:rFonts w:ascii="Times New Roman" w:eastAsia="Times New Roman" w:hAnsi="Times New Roman" w:cs="Times New Roman"/>
+                <w:color w:val="000000"/>
+              </w:rPr>
+              <w:t>permitirá</w:t>
+            </w:r>
+            <w:r>
+              <w:rPr>
+                <w:rFonts w:ascii="Times New Roman" w:eastAsia="Times New Roman" w:hAnsi="Times New Roman" w:cs="Times New Roman"/>
+                <w:color w:val="000000"/>
+              </w:rPr>
+              <w:t xml:space="preserve"> al usuario visualizar la lista de productos existentes y, posteriormente, registrar la acción de reversión de cambios de un producto específico, asegurando la trazabilidad de la operación en el sistema. Implica la consulta inicial de productos y el posterior registro del control de cambios.</w:t>
+            </w:r>
+          </w:p>
+        </w:tc>
+      </w:tr>
+      <w:tr>
+        <w:trPr>
+          <w:trHeight w:val="370"/>
+        </w:trPr>
+        <w:tc>
+          <w:tcPr>
+            <w:tcW w:w="8500" w:type="dxa"/>
+            <w:tcBorders>
+              <w:top w:val="single" w:sz="8" w:space="0" w:color="000000"/>
+              <w:left w:val="single" w:sz="4" w:space="0" w:color="000000"/>
+              <w:bottom w:val="single" w:sz="8" w:space="0" w:color="000000"/>
+              <w:right w:val="single" w:sz="4" w:space="0" w:color="000000"/>
+            </w:tcBorders>
+            <w:tcMar>
+              <w:top w:w="14" w:type="dxa"/>
+              <w:left w:w="115" w:type="dxa"/>
+              <w:bottom w:w="0" w:type="dxa"/>
+              <w:right w:w="115" w:type="dxa"/>
+            </w:tcMar>
+          </w:tcPr>
+          <w:p>
+            <w:pPr>
+              <w:spacing w:after="0" w:line="240" w:lineRule="auto"/>
+              <w:rPr>
+                <w:rFonts w:ascii="Times New Roman" w:eastAsia="Times New Roman" w:hAnsi="Times New Roman" w:cs="Times New Roman"/>
+              </w:rPr>
+            </w:pPr>
+            <w:r>
+              <w:rPr>
+                <w:rFonts w:ascii="Times New Roman" w:eastAsia="Times New Roman" w:hAnsi="Times New Roman" w:cs="Times New Roman"/>
+                <w:b/>
+                <w:bCs/>
+                <w:color w:val="000000"/>
+              </w:rPr>
+              <w:t xml:space="preserve">ACTOR PRINCIPAL: </w:t>
+            </w:r>
+            <w:r>
+              <w:rPr>
+                <w:rFonts w:ascii="Times New Roman" w:eastAsia="Times New Roman" w:hAnsi="Times New Roman" w:cs="Times New Roman"/>
+                <w:color w:val="000000"/>
+              </w:rPr>
+              <w:t>Usuario</w:t>
+            </w:r>
+          </w:p>
+        </w:tc>
+      </w:tr>
+      <w:tr>
+        <w:trPr>
+          <w:trHeight w:val="367"/>
+        </w:trPr>
+        <w:tc>
+          <w:tcPr>
+            <w:tcW w:w="8500" w:type="dxa"/>
+            <w:tcBorders>
+              <w:top w:val="single" w:sz="8" w:space="0" w:color="000000"/>
+              <w:left w:val="single" w:sz="4" w:space="0" w:color="000000"/>
+              <w:bottom w:val="single" w:sz="4" w:space="0" w:color="000000"/>
+              <w:right w:val="single" w:sz="4" w:space="0" w:color="000000"/>
+            </w:tcBorders>
+            <w:tcMar>
+              <w:top w:w="14" w:type="dxa"/>
+              <w:left w:w="115" w:type="dxa"/>
+              <w:bottom w:w="0" w:type="dxa"/>
+              <w:right w:w="115" w:type="dxa"/>
+            </w:tcMar>
+          </w:tcPr>
+          <w:p>
+            <w:pPr>
+              <w:spacing w:after="0" w:line="240" w:lineRule="auto"/>
+              <w:rPr>
+                <w:rFonts w:ascii="Times New Roman" w:eastAsia="Times New Roman" w:hAnsi="Times New Roman" w:cs="Times New Roman"/>
+              </w:rPr>
+            </w:pPr>
+            <w:r>
+              <w:rPr>
+                <w:rFonts w:ascii="Times New Roman" w:eastAsia="Times New Roman" w:hAnsi="Times New Roman" w:cs="Times New Roman"/>
+                <w:b/>
+                <w:bCs/>
+                <w:color w:val="000000"/>
+              </w:rPr>
+              <w:t xml:space="preserve">ACTORES SECUNDARIOS: </w:t>
+            </w:r>
+            <w:r>
+              <w:rPr>
+                <w:rFonts w:ascii="Times New Roman" w:eastAsia="Times New Roman" w:hAnsi="Times New Roman" w:cs="Times New Roman"/>
+                <w:color w:val="000000"/>
+              </w:rPr>
+              <w:t> </w:t>
+            </w:r>
+          </w:p>
+        </w:tc>
+      </w:tr>
+      <w:tr>
+        <w:trPr>
+          <w:trHeight w:val="338"/>
+        </w:trPr>
+        <w:tc>
+          <w:tcPr>
+            <w:tcW w:w="8500" w:type="dxa"/>
+            <w:tcBorders>
+              <w:top w:val="single" w:sz="4" w:space="0" w:color="000000"/>
+              <w:left w:val="single" w:sz="4" w:space="0" w:color="000000"/>
+              <w:bottom w:val="single" w:sz="8" w:space="0" w:color="000000"/>
+              <w:right w:val="single" w:sz="4" w:space="0" w:color="000000"/>
+            </w:tcBorders>
+            <w:tcMar>
+              <w:top w:w="14" w:type="dxa"/>
+              <w:left w:w="115" w:type="dxa"/>
+              <w:bottom w:w="0" w:type="dxa"/>
+              <w:right w:w="115" w:type="dxa"/>
+            </w:tcMar>
+          </w:tcPr>
+          <w:p>
+            <w:pPr>
+              <w:spacing w:after="0" w:line="240" w:lineRule="auto"/>
+              <w:rPr>
+                <w:rFonts w:ascii="Times New Roman" w:eastAsia="Times New Roman" w:hAnsi="Times New Roman" w:cs="Times New Roman"/>
+                <w:b/>
+                <w:bCs/>
+                <w:color w:val="000000"/>
+              </w:rPr>
+            </w:pPr>
+            <w:r>
+              <w:rPr>
+                <w:rFonts w:ascii="Times New Roman" w:eastAsia="Times New Roman" w:hAnsi="Times New Roman" w:cs="Times New Roman"/>
+                <w:b/>
+                <w:bCs/>
+                <w:color w:val="000000"/>
+              </w:rPr>
+              <w:t xml:space="preserve">PRECONDICIONES: </w:t>
+            </w:r>
+          </w:p>
+          <w:p>
+            <w:pPr>
+              <w:rPr>
+                <w:rFonts w:ascii="Times New Roman" w:eastAsia="Times New Roman" w:hAnsi="Times New Roman" w:cs="Times New Roman"/>
+                <w:color w:val="000000"/>
+              </w:rPr>
+            </w:pPr>
+            <w:r>
+              <w:rPr>
+                <w:rFonts w:ascii="Times New Roman" w:eastAsia="Times New Roman" w:hAnsi="Times New Roman" w:cs="Times New Roman"/>
+                <w:color w:val="000000"/>
+              </w:rPr>
+              <w:lastRenderedPageBreak/>
+              <w:t>. El sistema debe estar operativo y con conexión a la base de datos.</w:t>
+            </w:r>
+          </w:p>
+          <w:p>
+            <w:pPr>
+              <w:rPr>
+                <w:rFonts w:ascii="Times New Roman" w:eastAsia="Times New Roman" w:hAnsi="Times New Roman" w:cs="Times New Roman"/>
+                <w:color w:val="000000"/>
+              </w:rPr>
+            </w:pPr>
+            <w:r>
+              <w:rPr>
+                <w:rFonts w:ascii="Times New Roman" w:eastAsia="Times New Roman" w:hAnsi="Times New Roman" w:cs="Times New Roman"/>
+                <w:color w:val="000000"/>
+              </w:rPr>
+              <w:t>. El usuario debe contar con permisos para acceder a la funcionalidad de reversión de cambios.</w:t>
+            </w:r>
+          </w:p>
+          <w:p>
+            <w:pPr>
+              <w:rPr>
+                <w:rFonts w:ascii="Times New Roman" w:eastAsia="Times New Roman" w:hAnsi="Times New Roman" w:cs="Times New Roman"/>
+                <w:color w:val="000000"/>
+              </w:rPr>
+            </w:pPr>
+            <w:r>
+              <w:rPr>
+                <w:rFonts w:ascii="Times New Roman" w:eastAsia="Times New Roman" w:hAnsi="Times New Roman" w:cs="Times New Roman"/>
+                <w:color w:val="000000"/>
+              </w:rPr>
+              <w:t>. Debe existir al menos un producto registrado en la base de datos para la consulta.</w:t>
+            </w:r>
+          </w:p>
+        </w:tc>
+      </w:tr>
+      <w:tr>
+        <w:trPr>
+          <w:trHeight w:val="482"/>
+        </w:trPr>
+        <w:tc>
+          <w:tcPr>
+            <w:tcW w:w="8500" w:type="dxa"/>
+            <w:tcBorders>
+              <w:top w:val="single" w:sz="8" w:space="0" w:color="000000"/>
+              <w:left w:val="single" w:sz="4" w:space="0" w:color="000000"/>
+              <w:bottom w:val="single" w:sz="8" w:space="0" w:color="000000"/>
+              <w:right w:val="single" w:sz="4" w:space="0" w:color="000000"/>
+            </w:tcBorders>
+            <w:tcMar>
+              <w:top w:w="14" w:type="dxa"/>
+              <w:left w:w="115" w:type="dxa"/>
+              <w:bottom w:w="0" w:type="dxa"/>
+              <w:right w:w="115" w:type="dxa"/>
+            </w:tcMar>
+          </w:tcPr>
+          <w:p>
+            <w:pPr>
+              <w:spacing w:after="0" w:line="240" w:lineRule="auto"/>
+              <w:rPr>
+                <w:rFonts w:ascii="Times New Roman" w:eastAsia="Times New Roman" w:hAnsi="Times New Roman" w:cs="Times New Roman"/>
+              </w:rPr>
+            </w:pPr>
+            <w:r>
+              <w:rPr>
+                <w:rFonts w:ascii="Times New Roman" w:eastAsia="Times New Roman" w:hAnsi="Times New Roman" w:cs="Times New Roman"/>
+                <w:b/>
+                <w:bCs/>
+                <w:color w:val="000000"/>
+              </w:rPr>
+              <w:lastRenderedPageBreak/>
+              <w:t xml:space="preserve">PUNTOS DE EXTENSIÓN: </w:t>
+            </w:r>
+            <w:r>
+              <w:rPr>
+                <w:rFonts w:ascii="Times New Roman" w:eastAsia="Times New Roman" w:hAnsi="Times New Roman" w:cs="Times New Roman"/>
+                <w:color w:val="000000"/>
+              </w:rPr>
+              <w:t> </w:t>
+            </w:r>
+          </w:p>
+        </w:tc>
+      </w:tr>
+      <w:tr>
+        <w:trPr>
+          <w:trHeight w:val="317"/>
+        </w:trPr>
+        <w:tc>
+          <w:tcPr>
+            <w:tcW w:w="8500" w:type="dxa"/>
+            <w:tcBorders>
+              <w:top w:val="single" w:sz="8" w:space="0" w:color="000000"/>
+              <w:left w:val="single" w:sz="4" w:space="0" w:color="000000"/>
+              <w:bottom w:val="single" w:sz="8" w:space="0" w:color="000000"/>
+              <w:right w:val="single" w:sz="4" w:space="0" w:color="000000"/>
+            </w:tcBorders>
+            <w:tcMar>
+              <w:top w:w="14" w:type="dxa"/>
+              <w:left w:w="115" w:type="dxa"/>
+              <w:bottom w:w="0" w:type="dxa"/>
+              <w:right w:w="115" w:type="dxa"/>
+            </w:tcMar>
+          </w:tcPr>
+          <w:p>
+            <w:pPr>
+              <w:spacing w:after="0" w:line="240" w:lineRule="auto"/>
+              <w:rPr>
+                <w:rFonts w:ascii="Times New Roman" w:eastAsia="Times New Roman" w:hAnsi="Times New Roman" w:cs="Times New Roman"/>
+              </w:rPr>
+            </w:pPr>
+            <w:r>
+              <w:rPr>
+                <w:rFonts w:ascii="Times New Roman" w:eastAsia="Times New Roman" w:hAnsi="Times New Roman" w:cs="Times New Roman"/>
+                <w:b/>
+                <w:bCs/>
+                <w:color w:val="000000"/>
+              </w:rPr>
+              <w:t>CONDICIÓN:</w:t>
+            </w:r>
+            <w:r>
+              <w:rPr>
+                <w:rFonts w:ascii="Times New Roman" w:eastAsia="Times New Roman" w:hAnsi="Times New Roman" w:cs="Times New Roman"/>
+                <w:b/>
+                <w:bCs/>
+                <w:color w:val="000000"/>
+              </w:rPr>
+              <w:t xml:space="preserve"> </w:t>
+            </w:r>
+            <w:r>
+              <w:rPr>
+                <w:rFonts w:ascii="Times New Roman" w:eastAsia="Times New Roman" w:hAnsi="Times New Roman" w:cs="Times New Roman"/>
+                <w:color w:val="000000"/>
+              </w:rPr>
+              <w:t>El usuario ha seleccionado la opción de Revertir Cambios.</w:t>
+            </w:r>
+          </w:p>
+        </w:tc>
+      </w:tr>
+      <w:tr>
+        <w:trPr>
+          <w:trHeight w:val="1905"/>
+        </w:trPr>
+        <w:tc>
+          <w:tcPr>
+            <w:tcW w:w="8500" w:type="dxa"/>
+            <w:tcBorders>
+              <w:top w:val="single" w:sz="8" w:space="0" w:color="000000"/>
+              <w:left w:val="single" w:sz="4" w:space="0" w:color="000000"/>
+              <w:bottom w:val="single" w:sz="8" w:space="0" w:color="000000"/>
+              <w:right w:val="single" w:sz="4" w:space="0" w:color="000000"/>
+            </w:tcBorders>
+            <w:tcMar>
+              <w:top w:w="14" w:type="dxa"/>
+              <w:left w:w="115" w:type="dxa"/>
+              <w:bottom w:w="0" w:type="dxa"/>
+              <w:right w:w="115" w:type="dxa"/>
+            </w:tcMar>
+          </w:tcPr>
+          <w:p>
+            <w:pPr>
+              <w:spacing w:after="0" w:line="240" w:lineRule="auto"/>
+              <w:rPr>
+                <w:rFonts w:ascii="Times New Roman" w:eastAsia="Times New Roman" w:hAnsi="Times New Roman" w:cs="Times New Roman"/>
+              </w:rPr>
+            </w:pPr>
+            <w:r>
+              <w:rPr>
+                <w:rFonts w:ascii="Times New Roman" w:eastAsia="Times New Roman" w:hAnsi="Times New Roman" w:cs="Times New Roman"/>
+                <w:b/>
+                <w:bCs/>
+                <w:color w:val="000000"/>
+              </w:rPr>
+              <w:t>ESCENARIO PRINCIPAL: </w:t>
+            </w:r>
+          </w:p>
+          <w:p>
+            <w:pPr>
+              <w:numPr>
+                <w:ilvl w:val="0"/>
+                <w:numId w:val="24"/>
+              </w:numPr>
+              <w:spacing w:after="0" w:line="240" w:lineRule="auto"/>
+              <w:rPr>
+                <w:rFonts w:ascii="Times New Roman" w:eastAsia="Times New Roman" w:hAnsi="Times New Roman" w:cs="Times New Roman"/>
+                <w:color w:val="000000"/>
+                <w:sz w:val="22"/>
+                <w:szCs w:val="22"/>
+              </w:rPr>
+            </w:pPr>
+            <w:r>
+              <w:rPr>
+                <w:rFonts w:ascii="Times New Roman" w:eastAsia="Times New Roman" w:hAnsi="Times New Roman" w:cs="Times New Roman"/>
+                <w:color w:val="000000"/>
+                <w:sz w:val="22"/>
+                <w:szCs w:val="22"/>
+              </w:rPr>
+              <w:t>El usuario selecciona la opción "Revertir</w:t>
+            </w:r>
+            <w:r>
+              <w:rPr>
+                <w:rFonts w:ascii="Times New Roman" w:eastAsia="Times New Roman" w:hAnsi="Times New Roman" w:cs="Times New Roman"/>
+                <w:color w:val="000000"/>
+                <w:sz w:val="22"/>
+                <w:szCs w:val="22"/>
+              </w:rPr>
+              <w:t xml:space="preserve"> </w:t>
+            </w:r>
+            <w:r>
+              <w:rPr>
+                <w:rFonts w:ascii="Times New Roman" w:eastAsia="Times New Roman" w:hAnsi="Times New Roman" w:cs="Times New Roman"/>
+                <w:color w:val="000000"/>
+                <w:sz w:val="22"/>
+                <w:szCs w:val="22"/>
+              </w:rPr>
+              <w:t>Cambios" desde la interfaz del sistema.</w:t>
+            </w:r>
+          </w:p>
+          <w:p>
+            <w:pPr>
+              <w:numPr>
+                <w:ilvl w:val="0"/>
+                <w:numId w:val="24"/>
+              </w:numPr>
+              <w:spacing w:after="0" w:line="240" w:lineRule="auto"/>
+              <w:rPr>
+                <w:rFonts w:ascii="Times New Roman" w:eastAsia="Times New Roman" w:hAnsi="Times New Roman" w:cs="Times New Roman"/>
+                <w:color w:val="000000"/>
+                <w:sz w:val="22"/>
+                <w:szCs w:val="22"/>
+              </w:rPr>
+            </w:pPr>
+            <w:r>
+              <w:rPr>
+                <w:rFonts w:ascii="Times New Roman" w:eastAsia="Times New Roman" w:hAnsi="Times New Roman" w:cs="Times New Roman"/>
+                <w:color w:val="000000"/>
+                <w:sz w:val="22"/>
+                <w:szCs w:val="22"/>
+              </w:rPr>
+              <w:t>El sistema presenta la lista de los productos para su visualización.</w:t>
+            </w:r>
+          </w:p>
+          <w:p>
+            <w:pPr>
+              <w:numPr>
+                <w:ilvl w:val="0"/>
+                <w:numId w:val="24"/>
+              </w:numPr>
+              <w:spacing w:after="0" w:line="240" w:lineRule="auto"/>
+              <w:rPr>
+                <w:rFonts w:ascii="Times New Roman" w:eastAsia="Times New Roman" w:hAnsi="Times New Roman" w:cs="Times New Roman"/>
+                <w:color w:val="000000"/>
+                <w:sz w:val="22"/>
+                <w:szCs w:val="22"/>
+              </w:rPr>
+            </w:pPr>
+            <w:r>
+              <w:rPr>
+                <w:rFonts w:ascii="Times New Roman" w:eastAsia="Times New Roman" w:hAnsi="Times New Roman" w:cs="Times New Roman"/>
+                <w:color w:val="000000"/>
+                <w:sz w:val="22"/>
+                <w:szCs w:val="22"/>
+              </w:rPr>
+              <w:t>El usuario selecciona el producto y confirma la acción de reversión.</w:t>
+            </w:r>
+          </w:p>
+          <w:p>
+            <w:pPr>
+              <w:numPr>
+                <w:ilvl w:val="0"/>
+                <w:numId w:val="24"/>
+              </w:numPr>
+              <w:spacing w:after="0" w:line="240" w:lineRule="auto"/>
+              <w:rPr>
+                <w:rFonts w:ascii="Times New Roman" w:eastAsia="Times New Roman" w:hAnsi="Times New Roman" w:cs="Times New Roman"/>
+                <w:color w:val="000000"/>
+                <w:sz w:val="22"/>
+                <w:szCs w:val="22"/>
+              </w:rPr>
+            </w:pPr>
+            <w:r>
+              <w:rPr>
+                <w:rFonts w:ascii="Times New Roman" w:eastAsia="Times New Roman" w:hAnsi="Times New Roman" w:cs="Times New Roman"/>
+                <w:color w:val="000000"/>
+                <w:sz w:val="22"/>
+                <w:szCs w:val="22"/>
+              </w:rPr>
+              <w:t>El sistema registra la solicitud de grabar el control de cambios (el evento de reversión).</w:t>
+            </w:r>
+          </w:p>
+          <w:p>
+            <w:pPr>
+              <w:numPr>
+                <w:ilvl w:val="0"/>
+                <w:numId w:val="24"/>
+              </w:numPr>
+              <w:spacing w:after="0" w:line="240" w:lineRule="auto"/>
+              <w:rPr>
+                <w:rFonts w:ascii="Times New Roman" w:eastAsia="Times New Roman" w:hAnsi="Times New Roman" w:cs="Times New Roman"/>
+                <w:color w:val="000000"/>
+                <w:sz w:val="22"/>
+                <w:szCs w:val="22"/>
+              </w:rPr>
+            </w:pPr>
+            <w:r>
+              <w:rPr>
+                <w:rFonts w:ascii="Times New Roman" w:eastAsia="Times New Roman" w:hAnsi="Times New Roman" w:cs="Times New Roman"/>
+                <w:color w:val="000000"/>
+                <w:sz w:val="22"/>
+                <w:szCs w:val="22"/>
+              </w:rPr>
+              <w:t>El sistema confirma que la operación de registro se ejecutó correctamente.</w:t>
+            </w:r>
+          </w:p>
+        </w:tc>
+      </w:tr>
+      <w:tr>
+        <w:trPr>
+          <w:trHeight w:val="1102"/>
+        </w:trPr>
+        <w:tc>
+          <w:tcPr>
+            <w:tcW w:w="8500" w:type="dxa"/>
+            <w:tcBorders>
+              <w:top w:val="single" w:sz="8" w:space="0" w:color="000000"/>
+              <w:left w:val="single" w:sz="4" w:space="0" w:color="000000"/>
+              <w:bottom w:val="single" w:sz="8" w:space="0" w:color="000000"/>
+              <w:right w:val="single" w:sz="4" w:space="0" w:color="000000"/>
+            </w:tcBorders>
+            <w:tcMar>
+              <w:top w:w="14" w:type="dxa"/>
+              <w:left w:w="115" w:type="dxa"/>
+              <w:bottom w:w="0" w:type="dxa"/>
+              <w:right w:w="115" w:type="dxa"/>
+            </w:tcMar>
+          </w:tcPr>
+          <w:p>
+            <w:pPr>
+              <w:spacing w:after="0" w:line="240" w:lineRule="auto"/>
+              <w:rPr>
+                <w:rFonts w:ascii="Times New Roman" w:eastAsia="Times New Roman" w:hAnsi="Times New Roman" w:cs="Times New Roman"/>
+              </w:rPr>
+            </w:pPr>
+            <w:r>
+              <w:rPr>
+                <w:rFonts w:ascii="Times New Roman" w:eastAsia="Times New Roman" w:hAnsi="Times New Roman" w:cs="Times New Roman"/>
+                <w:b/>
+                <w:bCs/>
+                <w:color w:val="000000"/>
+              </w:rPr>
+              <w:t>FLUJOS ALTERNATIVO: </w:t>
+            </w:r>
+          </w:p>
+          <w:p>
+            <w:pPr>
+              <w:spacing w:after="0" w:line="240" w:lineRule="auto"/>
+              <w:rPr>
+                <w:rFonts w:ascii="Times New Roman" w:eastAsia="Times New Roman" w:hAnsi="Times New Roman" w:cs="Times New Roman"/>
+                <w:b/>
+                <w:bCs/>
+                <w:color w:val="000000"/>
+              </w:rPr>
+            </w:pPr>
+            <w:r>
+              <w:rPr>
+                <w:rFonts w:ascii="Times New Roman" w:eastAsia="Times New Roman" w:hAnsi="Times New Roman" w:cs="Times New Roman"/>
+                <w:b/>
+                <w:bCs/>
+                <w:color w:val="000000"/>
+              </w:rPr>
+              <w:t xml:space="preserve">FA1- </w:t>
+            </w:r>
+            <w:r>
+              <w:rPr>
+                <w:rFonts w:ascii="Times New Roman" w:eastAsia="Times New Roman" w:hAnsi="Times New Roman" w:cs="Times New Roman"/>
+                <w:b/>
+                <w:bCs/>
+                <w:color w:val="000000"/>
+              </w:rPr>
+              <w:t>Fallo en la obtención de la lista de productos:</w:t>
+            </w:r>
+            <w:r>
+              <w:rPr>
+                <w:rFonts w:ascii="Times New Roman" w:eastAsia="Times New Roman" w:hAnsi="Times New Roman" w:cs="Times New Roman"/>
+                <w:color w:val="000000"/>
+              </w:rPr>
+              <w:t xml:space="preserve"> Si la lista de productos no puede ser recuperada (por error de conexión, consulta, o no hay productos):</w:t>
+            </w:r>
+          </w:p>
+          <w:p>
+            <w:pPr>
+              <w:spacing w:after="0" w:line="240" w:lineRule="auto"/>
+              <w:rPr>
+                <w:rFonts w:ascii="Times New Roman" w:eastAsia="Times New Roman" w:hAnsi="Times New Roman" w:cs="Times New Roman"/>
+                <w:b/>
+                <w:bCs/>
+                <w:color w:val="000000"/>
+              </w:rPr>
+            </w:pPr>
+            <w:r>
+              <w:rPr>
+                <w:rFonts w:ascii="Times New Roman" w:eastAsia="Times New Roman" w:hAnsi="Times New Roman" w:cs="Times New Roman"/>
+                <w:b/>
+                <w:bCs/>
+                <w:color w:val="000000"/>
+              </w:rPr>
+              <w:t xml:space="preserve">2.1 </w:t>
+            </w:r>
+            <w:r>
+              <w:rPr>
+                <w:rFonts w:ascii="Times New Roman" w:eastAsia="Times New Roman" w:hAnsi="Times New Roman" w:cs="Times New Roman"/>
+                <w:color w:val="000000"/>
+              </w:rPr>
+              <w:t>La operación de listado se detiene.</w:t>
+            </w:r>
+          </w:p>
+          <w:p>
+            <w:pPr>
+              <w:spacing w:after="0" w:line="240" w:lineRule="auto"/>
+              <w:rPr>
+                <w:rFonts w:ascii="Times New Roman" w:eastAsia="Times New Roman" w:hAnsi="Times New Roman" w:cs="Times New Roman"/>
+                <w:color w:val="000000"/>
+              </w:rPr>
+            </w:pPr>
+            <w:r>
+              <w:rPr>
+                <w:rFonts w:ascii="Times New Roman" w:eastAsia="Times New Roman" w:hAnsi="Times New Roman" w:cs="Times New Roman"/>
+                <w:b/>
+                <w:bCs/>
+                <w:color w:val="000000"/>
+              </w:rPr>
+              <w:t xml:space="preserve">2.2 </w:t>
+            </w:r>
+            <w:r>
+              <w:rPr>
+                <w:rFonts w:ascii="Times New Roman" w:eastAsia="Times New Roman" w:hAnsi="Times New Roman" w:cs="Times New Roman"/>
+                <w:color w:val="000000"/>
+              </w:rPr>
+              <w:t>El sistema muestra un mensaje de error como "No se pudo obtener la lista de productos" o "Base de datos no disponible".</w:t>
+            </w:r>
+          </w:p>
+          <w:p>
+            <w:pPr>
+              <w:spacing w:after="0" w:line="240" w:lineRule="auto"/>
+              <w:rPr>
+                <w:rFonts w:ascii="Times New Roman" w:eastAsia="Times New Roman" w:hAnsi="Times New Roman" w:cs="Times New Roman"/>
+                <w:color w:val="000000"/>
+              </w:rPr>
+            </w:pPr>
+          </w:p>
+          <w:p>
+            <w:pPr>
+              <w:spacing w:after="0" w:line="240" w:lineRule="auto"/>
+              <w:rPr>
+                <w:rFonts w:ascii="Times New Roman" w:eastAsia="Times New Roman" w:hAnsi="Times New Roman" w:cs="Times New Roman"/>
+                <w:color w:val="000000"/>
+              </w:rPr>
+            </w:pPr>
+            <w:r>
+              <w:rPr>
+                <w:rFonts w:ascii="Times New Roman" w:eastAsia="Times New Roman" w:hAnsi="Times New Roman" w:cs="Times New Roman"/>
+                <w:b/>
+                <w:bCs/>
+                <w:color w:val="000000"/>
+              </w:rPr>
+              <w:t>FA2 – Fallo en la grabación de Control de Cambios:</w:t>
+            </w:r>
+            <w:r>
+              <w:rPr>
+                <w:rFonts w:ascii="Times New Roman" w:eastAsia="Times New Roman" w:hAnsi="Times New Roman" w:cs="Times New Roman"/>
+                <w:color w:val="000000"/>
+              </w:rPr>
+              <w:t xml:space="preserve"> </w:t>
+            </w:r>
+            <w:r>
+              <w:rPr>
+                <w:rFonts w:ascii="Times New Roman" w:eastAsia="Times New Roman" w:hAnsi="Times New Roman" w:cs="Times New Roman"/>
+                <w:color w:val="000000"/>
+              </w:rPr>
+              <w:t>Si ocurre un error durante la inserción del registro de control de cambios (problema de conexión, datos inválidos, permisos insuficientes)</w:t>
+            </w:r>
+          </w:p>
+          <w:p>
+            <w:pPr>
+              <w:spacing w:after="0" w:line="240" w:lineRule="auto"/>
+              <w:rPr>
+                <w:rFonts w:ascii="Times New Roman" w:eastAsia="Times New Roman" w:hAnsi="Times New Roman" w:cs="Times New Roman"/>
+                <w:color w:val="000000"/>
+              </w:rPr>
+            </w:pPr>
+            <w:r>
+              <w:rPr>
+                <w:rFonts w:ascii="Times New Roman" w:eastAsia="Times New Roman" w:hAnsi="Times New Roman" w:cs="Times New Roman"/>
+                <w:b/>
+                <w:bCs/>
+                <w:color w:val="000000"/>
+              </w:rPr>
+              <w:t>4.1</w:t>
+            </w:r>
+            <w:r>
+              <w:rPr>
+                <w:rFonts w:ascii="Times New Roman" w:eastAsia="Times New Roman" w:hAnsi="Times New Roman" w:cs="Times New Roman"/>
+                <w:color w:val="000000"/>
+              </w:rPr>
+              <w:t xml:space="preserve"> La operación de inserción se detiene.</w:t>
+            </w:r>
+          </w:p>
+          <w:p>
+            <w:pPr>
+              <w:spacing w:after="0" w:line="240" w:lineRule="auto"/>
+              <w:rPr>
+                <w:rFonts w:ascii="Times New Roman" w:eastAsia="Times New Roman" w:hAnsi="Times New Roman" w:cs="Times New Roman"/>
+                <w:color w:val="000000"/>
+              </w:rPr>
+            </w:pPr>
+            <w:r>
+              <w:rPr>
+                <w:rFonts w:ascii="Times New Roman" w:eastAsia="Times New Roman" w:hAnsi="Times New Roman" w:cs="Times New Roman"/>
+                <w:b/>
+                <w:bCs/>
+                <w:color w:val="000000"/>
+              </w:rPr>
+              <w:t>4.2</w:t>
+            </w:r>
+            <w:r>
+              <w:rPr>
+                <w:rFonts w:ascii="Times New Roman" w:eastAsia="Times New Roman" w:hAnsi="Times New Roman" w:cs="Times New Roman"/>
+                <w:color w:val="000000"/>
+              </w:rPr>
+              <w:t xml:space="preserve"> Si la conexión está abierta, el sistema la cierra.</w:t>
+            </w:r>
+          </w:p>
+          <w:p>
+            <w:pPr>
+              <w:spacing w:after="0" w:line="240" w:lineRule="auto"/>
+              <w:rPr>
+                <w:rFonts w:ascii="Times New Roman" w:eastAsia="Times New Roman" w:hAnsi="Times New Roman" w:cs="Times New Roman"/>
+                <w:color w:val="000000"/>
+              </w:rPr>
+            </w:pPr>
+            <w:r>
+              <w:rPr>
+                <w:rFonts w:ascii="Times New Roman" w:eastAsia="Times New Roman" w:hAnsi="Times New Roman" w:cs="Times New Roman"/>
+                <w:b/>
+                <w:bCs/>
+                <w:color w:val="000000"/>
+              </w:rPr>
+              <w:t>4.3</w:t>
+            </w:r>
+            <w:r>
+              <w:rPr>
+                <w:rFonts w:ascii="Times New Roman" w:eastAsia="Times New Roman" w:hAnsi="Times New Roman" w:cs="Times New Roman"/>
+                <w:color w:val="000000"/>
+              </w:rPr>
+              <w:t xml:space="preserve"> El sistema muestra un mensaje de error como "El registro de reversión no pudo completarse exitosamente".</w:t>
+            </w:r>
+          </w:p>
+          <w:p>
+            <w:pPr>
+              <w:spacing w:after="0" w:line="240" w:lineRule="auto"/>
+              <w:rPr>
+                <w:rFonts w:ascii="Times New Roman" w:eastAsia="Times New Roman" w:hAnsi="Times New Roman" w:cs="Times New Roman"/>
+                <w:b/>
+                <w:bCs/>
+                <w:color w:val="000000"/>
+              </w:rPr>
+            </w:pPr>
+          </w:p>
+        </w:tc>
+      </w:tr>
+      <w:tr>
+        <w:trPr>
+          <w:trHeight w:val="365"/>
+        </w:trPr>
+        <w:tc>
+          <w:tcPr>
+            <w:tcW w:w="8500" w:type="dxa"/>
+            <w:tcBorders>
+              <w:top w:val="single" w:sz="8" w:space="0" w:color="000000"/>
+              <w:left w:val="single" w:sz="4" w:space="0" w:color="000000"/>
+              <w:bottom w:val="single" w:sz="4" w:space="0" w:color="000000"/>
+              <w:right w:val="single" w:sz="4" w:space="0" w:color="000000"/>
+            </w:tcBorders>
+            <w:tcMar>
+              <w:top w:w="14" w:type="dxa"/>
+              <w:left w:w="115" w:type="dxa"/>
+              <w:bottom w:w="0" w:type="dxa"/>
+              <w:right w:w="115" w:type="dxa"/>
+            </w:tcMar>
+          </w:tcPr>
+          <w:p>
+            <w:pPr>
+              <w:spacing w:after="0" w:line="240" w:lineRule="auto"/>
+              <w:rPr>
+                <w:rFonts w:ascii="Times New Roman" w:eastAsia="Times New Roman" w:hAnsi="Times New Roman" w:cs="Times New Roman"/>
+              </w:rPr>
+            </w:pPr>
+            <w:r>
+              <w:rPr>
+                <w:rFonts w:ascii="Times New Roman" w:eastAsia="Times New Roman" w:hAnsi="Times New Roman" w:cs="Times New Roman"/>
+                <w:b/>
+                <w:bCs/>
+                <w:color w:val="000000"/>
+              </w:rPr>
+              <w:t>POSTCONDICIONES:</w:t>
+            </w:r>
+            <w:r>
+              <w:rPr>
+                <w:rFonts w:ascii="Times New Roman" w:eastAsia="Times New Roman" w:hAnsi="Times New Roman" w:cs="Times New Roman"/>
+                <w:color w:val="000000"/>
+              </w:rPr>
+              <w:t xml:space="preserve"> El cambio es revertido con éxito.</w:t>
+            </w:r>
+          </w:p>
+        </w:tc>
+      </w:tr>
+    </w:tbl>
+    <w:p/>
     <w:p>
       <w:pPr>
         <w:pStyle w:val="Ttulo3"/>
@@ -21851,6 +23606,7 @@
         <w:rPr>
           <w:rFonts w:ascii="Times New Roman" w:eastAsia="Times New Roman" w:hAnsi="Times New Roman" w:cs="Times New Roman"/>
         </w:rPr>
+        <w:lastRenderedPageBreak/>
         <w:t>10. GESTIÓN DE MÚLTIPLES IDIOMAS</w:t>
       </w:r>
       <w:bookmarkEnd w:id="105"/>
@@ -21917,7 +23673,6 @@
           <w:sz w:val="30"/>
           <w:szCs w:val="30"/>
         </w:rPr>
-        <w:lastRenderedPageBreak/>
         <w:t>10.2 Diagrama de Clases</w:t>
       </w:r>
       <w:bookmarkEnd w:id="107"/>
@@ -22230,8 +23985,8 @@
     </w:p>
     <w:p/>
     <w:sectPr>
-      <w:headerReference w:type="default" r:id="rId41"/>
-      <w:footerReference w:type="default" r:id="rId42"/>
+      <w:headerReference w:type="default" r:id="rId44"/>
+      <w:footerReference w:type="default" r:id="rId45"/>
       <w:pgSz w:w="11906" w:h="16838"/>
       <w:pgMar w:top="1417" w:right="1701" w:bottom="1417" w:left="1701" w:header="708" w:footer="708" w:gutter="0"/>
       <w:pgNumType w:start="1"/>
@@ -23328,6 +25083,119 @@
 <file path=word/numbering.xml><?xml version="1.0" encoding="utf-8"?>
 <w:numbering xmlns:wpc="http://schemas.microsoft.com/office/word/2010/wordprocessingCanvas" xmlns:cx="http://schemas.microsoft.com/office/drawing/2014/chartex" xmlns:cx1="http://schemas.microsoft.com/office/drawing/2015/9/8/chartex" xmlns:cx2="http://schemas.microsoft.com/office/drawing/2015/10/21/chartex" xmlns:cx3="http://schemas.microsoft.com/office/drawing/2016/5/9/chartex" xmlns:cx4="http://schemas.microsoft.com/office/drawing/2016/5/10/chartex" xmlns:cx5="http://schemas.microsoft.com/office/drawing/2016/5/11/chartex" xmlns:cx6="http://schemas.microsoft.com/office/drawing/2016/5/12/chartex" xmlns:cx7="http://schemas.microsoft.com/office/drawing/2016/5/13/chartex" xmlns:cx8="http://schemas.microsoft.com/office/drawing/2016/5/14/chartex" xmlns:mc="http://schemas.openxmlformats.org/markup-compatibility/2006" xmlns:aink="http://schemas.microsoft.com/office/drawing/2016/ink" xmlns:am3d="http://schemas.microsoft.com/office/drawing/2017/model3d" xmlns:o="urn:schemas-microsoft-com:office:office" xmlns:oel="http://schemas.microsoft.com/office/2019/extlst" xmlns:r="http://schemas.openxmlformats.org/officeDocument/2006/relationships" xmlns:m="http://schemas.openxmlformats.org/officeDocument/2006/math" xmlns:v="urn:schemas-microsoft-com:vml" xmlns:wp14="http://schemas.microsoft.com/office/word/2010/wordprocessingDrawing" xmlns:wp="http://schemas.openxmlformats.org/drawingml/2006/wordprocessingDrawing" xmlns:w10="urn:schemas-microsoft-com:office:word" xmlns:w="http://schemas.openxmlformats.org/wordprocessingml/2006/main" xmlns:w14="http://schemas.microsoft.com/office/word/2010/wordml" xmlns:w15="http://schemas.microsoft.com/office/word/2012/wordml" xmlns:w16cex="http://schemas.microsoft.com/office/word/2018/wordml/cex" xmlns:w16cid="http://schemas.microsoft.com/office/word/2016/wordml/cid" xmlns:w16="http://schemas.microsoft.com/office/word/2018/wordml" xmlns:w16du="http://schemas.microsoft.com/office/word/2023/wordml/word16du" xmlns:w16sdtdh="http://schemas.microsoft.com/office/word/2020/wordml/sdtdatahash" xmlns:w16sdtfl="http://schemas.microsoft.com/office/word/2024/wordml/sdtformatlock" xmlns:w16se="http://schemas.microsoft.com/office/word/2015/wordml/symex" xmlns:wpg="http://schemas.microsoft.com/office/word/2010/wordprocessingGroup" xmlns:wpi="http://schemas.microsoft.com/office/word/2010/wordprocessingInk" xmlns:wne="http://schemas.microsoft.com/office/word/2006/wordml" xmlns:wps="http://schemas.microsoft.com/office/word/2010/wordprocessingShape" mc:Ignorable="w14 w15 w16se w16cid w16 w16cex w16sdtdh w16sdtfl w16du wp14">
   <w:abstractNum w:abstractNumId="0" w15:restartNumberingAfterBreak="0">
+    <w:nsid w:val="159D5AAE"/>
+    <w:multiLevelType w:val="multilevel"/>
+    <w:tmpl w:val="41360DB8"/>
+    <w:lvl w:ilvl="0">
+      <w:start w:val="1"/>
+      <w:numFmt w:val="bullet"/>
+      <w:lvlText w:val="●"/>
+      <w:lvlJc w:val="left"/>
+      <w:pPr>
+        <w:ind w:left="720" w:hanging="360"/>
+      </w:pPr>
+      <w:rPr>
+        <w:u w:val="none"/>
+      </w:rPr>
+    </w:lvl>
+    <w:lvl w:ilvl="1">
+      <w:start w:val="1"/>
+      <w:numFmt w:val="bullet"/>
+      <w:lvlText w:val="○"/>
+      <w:lvlJc w:val="left"/>
+      <w:pPr>
+        <w:ind w:left="1440" w:hanging="360"/>
+      </w:pPr>
+      <w:rPr>
+        <w:u w:val="none"/>
+      </w:rPr>
+    </w:lvl>
+    <w:lvl w:ilvl="2">
+      <w:start w:val="1"/>
+      <w:numFmt w:val="bullet"/>
+      <w:lvlText w:val="■"/>
+      <w:lvlJc w:val="left"/>
+      <w:pPr>
+        <w:ind w:left="2160" w:hanging="360"/>
+      </w:pPr>
+      <w:rPr>
+        <w:u w:val="none"/>
+      </w:rPr>
+    </w:lvl>
+    <w:lvl w:ilvl="3">
+      <w:start w:val="1"/>
+      <w:numFmt w:val="bullet"/>
+      <w:lvlText w:val="●"/>
+      <w:lvlJc w:val="left"/>
+      <w:pPr>
+        <w:ind w:left="2880" w:hanging="360"/>
+      </w:pPr>
+      <w:rPr>
+        <w:u w:val="none"/>
+      </w:rPr>
+    </w:lvl>
+    <w:lvl w:ilvl="4">
+      <w:start w:val="1"/>
+      <w:numFmt w:val="bullet"/>
+      <w:lvlText w:val="○"/>
+      <w:lvlJc w:val="left"/>
+      <w:pPr>
+        <w:ind w:left="3600" w:hanging="360"/>
+      </w:pPr>
+      <w:rPr>
+        <w:u w:val="none"/>
+      </w:rPr>
+    </w:lvl>
+    <w:lvl w:ilvl="5">
+      <w:start w:val="1"/>
+      <w:numFmt w:val="bullet"/>
+      <w:lvlText w:val="■"/>
+      <w:lvlJc w:val="left"/>
+      <w:pPr>
+        <w:ind w:left="4320" w:hanging="360"/>
+      </w:pPr>
+      <w:rPr>
+        <w:u w:val="none"/>
+      </w:rPr>
+    </w:lvl>
+    <w:lvl w:ilvl="6">
+      <w:start w:val="1"/>
+      <w:numFmt w:val="bullet"/>
+      <w:lvlText w:val="●"/>
+      <w:lvlJc w:val="left"/>
+      <w:pPr>
+        <w:ind w:left="5040" w:hanging="360"/>
+      </w:pPr>
+      <w:rPr>
+        <w:u w:val="none"/>
+      </w:rPr>
+    </w:lvl>
+    <w:lvl w:ilvl="7">
+      <w:start w:val="1"/>
+      <w:numFmt w:val="bullet"/>
+      <w:lvlText w:val="○"/>
+      <w:lvlJc w:val="left"/>
+      <w:pPr>
+        <w:ind w:left="5760" w:hanging="360"/>
+      </w:pPr>
+      <w:rPr>
+        <w:u w:val="none"/>
+      </w:rPr>
+    </w:lvl>
+    <w:lvl w:ilvl="8">
+      <w:start w:val="1"/>
+      <w:numFmt w:val="bullet"/>
+      <w:lvlText w:val="■"/>
+      <w:lvlJc w:val="left"/>
+      <w:pPr>
+        <w:ind w:left="6480" w:hanging="360"/>
+      </w:pPr>
+      <w:rPr>
+        <w:u w:val="none"/>
+      </w:rPr>
+    </w:lvl>
+  </w:abstractNum>
+  <w:abstractNum w:abstractNumId="1" w15:restartNumberingAfterBreak="0">
     <w:nsid w:val="1C150E4C"/>
     <w:multiLevelType w:val="multilevel"/>
     <w:tmpl w:val="3B601E4C"/>
@@ -23440,7 +25308,7 @@
       </w:rPr>
     </w:lvl>
   </w:abstractNum>
-  <w:abstractNum w:abstractNumId="1" w15:restartNumberingAfterBreak="0">
+  <w:abstractNum w:abstractNumId="2" w15:restartNumberingAfterBreak="0">
     <w:nsid w:val="1C23217E"/>
     <w:multiLevelType w:val="multilevel"/>
     <w:tmpl w:val="17BE2B94"/>
@@ -23530,7 +25398,7 @@
       </w:pPr>
     </w:lvl>
   </w:abstractNum>
-  <w:abstractNum w:abstractNumId="2" w15:restartNumberingAfterBreak="0">
+  <w:abstractNum w:abstractNumId="3" w15:restartNumberingAfterBreak="0">
     <w:nsid w:val="1CB8057D"/>
     <w:multiLevelType w:val="multilevel"/>
     <w:tmpl w:val="00CA9450"/>
@@ -23624,7 +25492,7 @@
       </w:pPr>
     </w:lvl>
   </w:abstractNum>
-  <w:abstractNum w:abstractNumId="3" w15:restartNumberingAfterBreak="0">
+  <w:abstractNum w:abstractNumId="4" w15:restartNumberingAfterBreak="0">
     <w:nsid w:val="1F397EDD"/>
     <w:multiLevelType w:val="multilevel"/>
     <w:tmpl w:val="1FB017B2"/>
@@ -23737,7 +25605,7 @@
       </w:rPr>
     </w:lvl>
   </w:abstractNum>
-  <w:abstractNum w:abstractNumId="4" w15:restartNumberingAfterBreak="0">
+  <w:abstractNum w:abstractNumId="5" w15:restartNumberingAfterBreak="0">
     <w:nsid w:val="1F471004"/>
     <w:multiLevelType w:val="multilevel"/>
     <w:tmpl w:val="12DAA352"/>
@@ -23850,7 +25718,7 @@
       </w:rPr>
     </w:lvl>
   </w:abstractNum>
-  <w:abstractNum w:abstractNumId="5" w15:restartNumberingAfterBreak="0">
+  <w:abstractNum w:abstractNumId="6" w15:restartNumberingAfterBreak="0">
     <w:nsid w:val="20EB7E4C"/>
     <w:multiLevelType w:val="hybridMultilevel"/>
     <w:tmpl w:val="D52E027E"/>
@@ -23963,7 +25831,7 @@
       </w:rPr>
     </w:lvl>
   </w:abstractNum>
-  <w:abstractNum w:abstractNumId="6" w15:restartNumberingAfterBreak="0">
+  <w:abstractNum w:abstractNumId="7" w15:restartNumberingAfterBreak="0">
     <w:nsid w:val="24C84FF2"/>
     <w:multiLevelType w:val="multilevel"/>
     <w:tmpl w:val="72E41FFE"/>
@@ -24076,7 +25944,7 @@
       </w:rPr>
     </w:lvl>
   </w:abstractNum>
-  <w:abstractNum w:abstractNumId="7" w15:restartNumberingAfterBreak="0">
+  <w:abstractNum w:abstractNumId="8" w15:restartNumberingAfterBreak="0">
     <w:nsid w:val="273F489B"/>
     <w:multiLevelType w:val="multilevel"/>
     <w:tmpl w:val="44FCE85C"/>
@@ -24189,7 +26057,7 @@
       </w:rPr>
     </w:lvl>
   </w:abstractNum>
-  <w:abstractNum w:abstractNumId="8" w15:restartNumberingAfterBreak="0">
+  <w:abstractNum w:abstractNumId="9" w15:restartNumberingAfterBreak="0">
     <w:nsid w:val="292B085E"/>
     <w:multiLevelType w:val="multilevel"/>
     <w:tmpl w:val="72A22ADA"/>
@@ -24279,7 +26147,235 @@
       </w:pPr>
     </w:lvl>
   </w:abstractNum>
-  <w:abstractNum w:abstractNumId="9" w15:restartNumberingAfterBreak="0">
+  <w:abstractNum w:abstractNumId="10" w15:restartNumberingAfterBreak="0">
+    <w:nsid w:val="29E44E31"/>
+    <w:multiLevelType w:val="multilevel"/>
+    <w:tmpl w:val="C32E3EB2"/>
+    <w:lvl w:ilvl="0">
+      <w:start w:val="1"/>
+      <w:numFmt w:val="bullet"/>
+      <w:lvlText w:val="●"/>
+      <w:lvlJc w:val="left"/>
+      <w:pPr>
+        <w:ind w:left="720" w:hanging="360"/>
+      </w:pPr>
+      <w:rPr>
+        <w:u w:val="none"/>
+      </w:rPr>
+    </w:lvl>
+    <w:lvl w:ilvl="1">
+      <w:start w:val="1"/>
+      <w:numFmt w:val="bullet"/>
+      <w:lvlText w:val="○"/>
+      <w:lvlJc w:val="left"/>
+      <w:pPr>
+        <w:ind w:left="1440" w:hanging="360"/>
+      </w:pPr>
+      <w:rPr>
+        <w:u w:val="none"/>
+      </w:rPr>
+    </w:lvl>
+    <w:lvl w:ilvl="2">
+      <w:start w:val="1"/>
+      <w:numFmt w:val="bullet"/>
+      <w:lvlText w:val="■"/>
+      <w:lvlJc w:val="left"/>
+      <w:pPr>
+        <w:ind w:left="2160" w:hanging="360"/>
+      </w:pPr>
+      <w:rPr>
+        <w:u w:val="none"/>
+      </w:rPr>
+    </w:lvl>
+    <w:lvl w:ilvl="3">
+      <w:start w:val="1"/>
+      <w:numFmt w:val="bullet"/>
+      <w:lvlText w:val="●"/>
+      <w:lvlJc w:val="left"/>
+      <w:pPr>
+        <w:ind w:left="2880" w:hanging="360"/>
+      </w:pPr>
+      <w:rPr>
+        <w:u w:val="none"/>
+      </w:rPr>
+    </w:lvl>
+    <w:lvl w:ilvl="4">
+      <w:start w:val="1"/>
+      <w:numFmt w:val="bullet"/>
+      <w:lvlText w:val="○"/>
+      <w:lvlJc w:val="left"/>
+      <w:pPr>
+        <w:ind w:left="3600" w:hanging="360"/>
+      </w:pPr>
+      <w:rPr>
+        <w:u w:val="none"/>
+      </w:rPr>
+    </w:lvl>
+    <w:lvl w:ilvl="5">
+      <w:start w:val="1"/>
+      <w:numFmt w:val="bullet"/>
+      <w:lvlText w:val="■"/>
+      <w:lvlJc w:val="left"/>
+      <w:pPr>
+        <w:ind w:left="4320" w:hanging="360"/>
+      </w:pPr>
+      <w:rPr>
+        <w:u w:val="none"/>
+      </w:rPr>
+    </w:lvl>
+    <w:lvl w:ilvl="6">
+      <w:start w:val="1"/>
+      <w:numFmt w:val="bullet"/>
+      <w:lvlText w:val="●"/>
+      <w:lvlJc w:val="left"/>
+      <w:pPr>
+        <w:ind w:left="5040" w:hanging="360"/>
+      </w:pPr>
+      <w:rPr>
+        <w:u w:val="none"/>
+      </w:rPr>
+    </w:lvl>
+    <w:lvl w:ilvl="7">
+      <w:start w:val="1"/>
+      <w:numFmt w:val="bullet"/>
+      <w:lvlText w:val="○"/>
+      <w:lvlJc w:val="left"/>
+      <w:pPr>
+        <w:ind w:left="5760" w:hanging="360"/>
+      </w:pPr>
+      <w:rPr>
+        <w:u w:val="none"/>
+      </w:rPr>
+    </w:lvl>
+    <w:lvl w:ilvl="8">
+      <w:start w:val="1"/>
+      <w:numFmt w:val="bullet"/>
+      <w:lvlText w:val="■"/>
+      <w:lvlJc w:val="left"/>
+      <w:pPr>
+        <w:ind w:left="6480" w:hanging="360"/>
+      </w:pPr>
+      <w:rPr>
+        <w:u w:val="none"/>
+      </w:rPr>
+    </w:lvl>
+  </w:abstractNum>
+  <w:abstractNum w:abstractNumId="11" w15:restartNumberingAfterBreak="0">
+    <w:nsid w:val="2A025459"/>
+    <w:multiLevelType w:val="multilevel"/>
+    <w:tmpl w:val="B178B5FE"/>
+    <w:lvl w:ilvl="0">
+      <w:start w:val="1"/>
+      <w:numFmt w:val="decimal"/>
+      <w:lvlText w:val="%1."/>
+      <w:lvlJc w:val="left"/>
+      <w:pPr>
+        <w:ind w:left="720" w:hanging="360"/>
+      </w:pPr>
+      <w:rPr>
+        <w:rFonts w:hint="default"/>
+        <w:b/>
+        <w:bCs/>
+      </w:rPr>
+    </w:lvl>
+    <w:lvl w:ilvl="1">
+      <w:start w:val="1"/>
+      <w:numFmt w:val="decimal"/>
+      <w:lvlText w:val="%2."/>
+      <w:lvlJc w:val="left"/>
+      <w:pPr>
+        <w:ind w:left="1440" w:hanging="360"/>
+      </w:pPr>
+      <w:rPr>
+        <w:rFonts w:hint="default"/>
+      </w:rPr>
+    </w:lvl>
+    <w:lvl w:ilvl="2">
+      <w:start w:val="1"/>
+      <w:numFmt w:val="decimal"/>
+      <w:lvlText w:val="%3."/>
+      <w:lvlJc w:val="left"/>
+      <w:pPr>
+        <w:ind w:left="2160" w:hanging="360"/>
+      </w:pPr>
+      <w:rPr>
+        <w:rFonts w:hint="default"/>
+      </w:rPr>
+    </w:lvl>
+    <w:lvl w:ilvl="3">
+      <w:start w:val="1"/>
+      <w:numFmt w:val="decimal"/>
+      <w:lvlText w:val="%4."/>
+      <w:lvlJc w:val="left"/>
+      <w:pPr>
+        <w:ind w:left="2880" w:hanging="360"/>
+      </w:pPr>
+      <w:rPr>
+        <w:rFonts w:hint="default"/>
+      </w:rPr>
+    </w:lvl>
+    <w:lvl w:ilvl="4">
+      <w:start w:val="1"/>
+      <w:numFmt w:val="decimal"/>
+      <w:lvlText w:val="%5."/>
+      <w:lvlJc w:val="left"/>
+      <w:pPr>
+        <w:ind w:left="3600" w:hanging="360"/>
+      </w:pPr>
+      <w:rPr>
+        <w:rFonts w:hint="default"/>
+      </w:rPr>
+    </w:lvl>
+    <w:lvl w:ilvl="5">
+      <w:start w:val="1"/>
+      <w:numFmt w:val="decimal"/>
+      <w:lvlText w:val="%6."/>
+      <w:lvlJc w:val="left"/>
+      <w:pPr>
+        <w:ind w:left="4320" w:hanging="360"/>
+      </w:pPr>
+      <w:rPr>
+        <w:rFonts w:hint="default"/>
+      </w:rPr>
+    </w:lvl>
+    <w:lvl w:ilvl="6">
+      <w:start w:val="1"/>
+      <w:numFmt w:val="decimal"/>
+      <w:lvlText w:val="%7."/>
+      <w:lvlJc w:val="left"/>
+      <w:pPr>
+        <w:ind w:left="5040" w:hanging="360"/>
+      </w:pPr>
+      <w:rPr>
+        <w:rFonts w:hint="default"/>
+      </w:rPr>
+    </w:lvl>
+    <w:lvl w:ilvl="7">
+      <w:start w:val="1"/>
+      <w:numFmt w:val="decimal"/>
+      <w:lvlText w:val="%8."/>
+      <w:lvlJc w:val="left"/>
+      <w:pPr>
+        <w:ind w:left="5760" w:hanging="360"/>
+      </w:pPr>
+      <w:rPr>
+        <w:rFonts w:hint="default"/>
+      </w:rPr>
+    </w:lvl>
+    <w:lvl w:ilvl="8">
+      <w:start w:val="1"/>
+      <w:numFmt w:val="decimal"/>
+      <w:lvlText w:val="%9."/>
+      <w:lvlJc w:val="left"/>
+      <w:pPr>
+        <w:ind w:left="6480" w:hanging="360"/>
+      </w:pPr>
+      <w:rPr>
+        <w:rFonts w:hint="default"/>
+      </w:rPr>
+    </w:lvl>
+  </w:abstractNum>
+  <w:abstractNum w:abstractNumId="12" w15:restartNumberingAfterBreak="0">
     <w:nsid w:val="39C509A6"/>
     <w:multiLevelType w:val="multilevel"/>
     <w:tmpl w:val="8BCC9C0A"/>
@@ -24369,7 +26465,7 @@
       </w:pPr>
     </w:lvl>
   </w:abstractNum>
-  <w:abstractNum w:abstractNumId="10" w15:restartNumberingAfterBreak="0">
+  <w:abstractNum w:abstractNumId="13" w15:restartNumberingAfterBreak="0">
     <w:nsid w:val="39F35BF8"/>
     <w:multiLevelType w:val="multilevel"/>
     <w:tmpl w:val="2190F670"/>
@@ -24459,7 +26555,7 @@
       </w:pPr>
     </w:lvl>
   </w:abstractNum>
-  <w:abstractNum w:abstractNumId="11" w15:restartNumberingAfterBreak="0">
+  <w:abstractNum w:abstractNumId="14" w15:restartNumberingAfterBreak="0">
     <w:nsid w:val="3EA04283"/>
     <w:multiLevelType w:val="multilevel"/>
     <w:tmpl w:val="C840C568"/>
@@ -24549,7 +26645,7 @@
       </w:pPr>
     </w:lvl>
   </w:abstractNum>
-  <w:abstractNum w:abstractNumId="12" w15:restartNumberingAfterBreak="0">
+  <w:abstractNum w:abstractNumId="15" w15:restartNumberingAfterBreak="0">
     <w:nsid w:val="44972425"/>
     <w:multiLevelType w:val="multilevel"/>
     <w:tmpl w:val="A69C4584"/>
@@ -24662,7 +26758,7 @@
       </w:rPr>
     </w:lvl>
   </w:abstractNum>
-  <w:abstractNum w:abstractNumId="13" w15:restartNumberingAfterBreak="0">
+  <w:abstractNum w:abstractNumId="16" w15:restartNumberingAfterBreak="0">
     <w:nsid w:val="465A2690"/>
     <w:multiLevelType w:val="multilevel"/>
     <w:tmpl w:val="2CE4AB62"/>
@@ -24752,7 +26848,7 @@
       </w:pPr>
     </w:lvl>
   </w:abstractNum>
-  <w:abstractNum w:abstractNumId="14" w15:restartNumberingAfterBreak="0">
+  <w:abstractNum w:abstractNumId="17" w15:restartNumberingAfterBreak="0">
     <w:nsid w:val="471667BB"/>
     <w:multiLevelType w:val="multilevel"/>
     <w:tmpl w:val="944A6AA8"/>
@@ -24865,7 +26961,7 @@
       </w:rPr>
     </w:lvl>
   </w:abstractNum>
-  <w:abstractNum w:abstractNumId="15" w15:restartNumberingAfterBreak="0">
+  <w:abstractNum w:abstractNumId="18" w15:restartNumberingAfterBreak="0">
     <w:nsid w:val="4C201EA1"/>
     <w:multiLevelType w:val="hybridMultilevel"/>
     <w:tmpl w:val="8AA2DAD6"/>
@@ -24978,10 +27074,10 @@
       </w:rPr>
     </w:lvl>
   </w:abstractNum>
-  <w:abstractNum w:abstractNumId="16" w15:restartNumberingAfterBreak="0">
-    <w:nsid w:val="5B28511A"/>
+  <w:abstractNum w:abstractNumId="19" w15:restartNumberingAfterBreak="0">
+    <w:nsid w:val="4F81444D"/>
     <w:multiLevelType w:val="multilevel"/>
-    <w:tmpl w:val="3B440B54"/>
+    <w:tmpl w:val="2CE4AB62"/>
     <w:lvl w:ilvl="0">
       <w:start w:val="1"/>
       <w:numFmt w:val="decimal"/>
@@ -25068,236 +27164,10 @@
       </w:pPr>
     </w:lvl>
   </w:abstractNum>
-  <w:abstractNum w:abstractNumId="17" w15:restartNumberingAfterBreak="0">
-    <w:nsid w:val="62C615B1"/>
-    <w:multiLevelType w:val="hybridMultilevel"/>
-    <w:tmpl w:val="69AC4796"/>
-    <w:lvl w:ilvl="0" w:tplc="2C0A0001">
-      <w:start w:val="1"/>
-      <w:numFmt w:val="bullet"/>
-      <w:lvlText w:val=""/>
-      <w:lvlJc w:val="left"/>
-      <w:pPr>
-        <w:ind w:left="720" w:hanging="360"/>
-      </w:pPr>
-      <w:rPr>
-        <w:rFonts w:ascii="Symbol" w:hAnsi="Symbol" w:hint="default"/>
-      </w:rPr>
-    </w:lvl>
-    <w:lvl w:ilvl="1" w:tplc="2C0A0003" w:tentative="1">
-      <w:start w:val="1"/>
-      <w:numFmt w:val="bullet"/>
-      <w:lvlText w:val="o"/>
-      <w:lvlJc w:val="left"/>
-      <w:pPr>
-        <w:ind w:left="1440" w:hanging="360"/>
-      </w:pPr>
-      <w:rPr>
-        <w:rFonts w:ascii="Courier New" w:hAnsi="Courier New" w:cs="Courier New" w:hint="default"/>
-      </w:rPr>
-    </w:lvl>
-    <w:lvl w:ilvl="2" w:tplc="2C0A0005" w:tentative="1">
-      <w:start w:val="1"/>
-      <w:numFmt w:val="bullet"/>
-      <w:lvlText w:val=""/>
-      <w:lvlJc w:val="left"/>
-      <w:pPr>
-        <w:ind w:left="2160" w:hanging="360"/>
-      </w:pPr>
-      <w:rPr>
-        <w:rFonts w:ascii="Wingdings" w:hAnsi="Wingdings" w:hint="default"/>
-      </w:rPr>
-    </w:lvl>
-    <w:lvl w:ilvl="3" w:tplc="2C0A0001" w:tentative="1">
-      <w:start w:val="1"/>
-      <w:numFmt w:val="bullet"/>
-      <w:lvlText w:val=""/>
-      <w:lvlJc w:val="left"/>
-      <w:pPr>
-        <w:ind w:left="2880" w:hanging="360"/>
-      </w:pPr>
-      <w:rPr>
-        <w:rFonts w:ascii="Symbol" w:hAnsi="Symbol" w:hint="default"/>
-      </w:rPr>
-    </w:lvl>
-    <w:lvl w:ilvl="4" w:tplc="2C0A0003" w:tentative="1">
-      <w:start w:val="1"/>
-      <w:numFmt w:val="bullet"/>
-      <w:lvlText w:val="o"/>
-      <w:lvlJc w:val="left"/>
-      <w:pPr>
-        <w:ind w:left="3600" w:hanging="360"/>
-      </w:pPr>
-      <w:rPr>
-        <w:rFonts w:ascii="Courier New" w:hAnsi="Courier New" w:cs="Courier New" w:hint="default"/>
-      </w:rPr>
-    </w:lvl>
-    <w:lvl w:ilvl="5" w:tplc="2C0A0005" w:tentative="1">
-      <w:start w:val="1"/>
-      <w:numFmt w:val="bullet"/>
-      <w:lvlText w:val=""/>
-      <w:lvlJc w:val="left"/>
-      <w:pPr>
-        <w:ind w:left="4320" w:hanging="360"/>
-      </w:pPr>
-      <w:rPr>
-        <w:rFonts w:ascii="Wingdings" w:hAnsi="Wingdings" w:hint="default"/>
-      </w:rPr>
-    </w:lvl>
-    <w:lvl w:ilvl="6" w:tplc="2C0A0001" w:tentative="1">
-      <w:start w:val="1"/>
-      <w:numFmt w:val="bullet"/>
-      <w:lvlText w:val=""/>
-      <w:lvlJc w:val="left"/>
-      <w:pPr>
-        <w:ind w:left="5040" w:hanging="360"/>
-      </w:pPr>
-      <w:rPr>
-        <w:rFonts w:ascii="Symbol" w:hAnsi="Symbol" w:hint="default"/>
-      </w:rPr>
-    </w:lvl>
-    <w:lvl w:ilvl="7" w:tplc="2C0A0003" w:tentative="1">
-      <w:start w:val="1"/>
-      <w:numFmt w:val="bullet"/>
-      <w:lvlText w:val="o"/>
-      <w:lvlJc w:val="left"/>
-      <w:pPr>
-        <w:ind w:left="5760" w:hanging="360"/>
-      </w:pPr>
-      <w:rPr>
-        <w:rFonts w:ascii="Courier New" w:hAnsi="Courier New" w:cs="Courier New" w:hint="default"/>
-      </w:rPr>
-    </w:lvl>
-    <w:lvl w:ilvl="8" w:tplc="2C0A0005" w:tentative="1">
-      <w:start w:val="1"/>
-      <w:numFmt w:val="bullet"/>
-      <w:lvlText w:val=""/>
-      <w:lvlJc w:val="left"/>
-      <w:pPr>
-        <w:ind w:left="6480" w:hanging="360"/>
-      </w:pPr>
-      <w:rPr>
-        <w:rFonts w:ascii="Wingdings" w:hAnsi="Wingdings" w:hint="default"/>
-      </w:rPr>
-    </w:lvl>
-  </w:abstractNum>
-  <w:abstractNum w:abstractNumId="18" w15:restartNumberingAfterBreak="0">
-    <w:nsid w:val="721D01EF"/>
+  <w:abstractNum w:abstractNumId="20" w15:restartNumberingAfterBreak="0">
+    <w:nsid w:val="5B28511A"/>
     <w:multiLevelType w:val="multilevel"/>
-    <w:tmpl w:val="AADC35FA"/>
-    <w:lvl w:ilvl="0">
-      <w:start w:val="1"/>
-      <w:numFmt w:val="bullet"/>
-      <w:lvlText w:val="-"/>
-      <w:lvlJc w:val="left"/>
-      <w:pPr>
-        <w:ind w:left="720" w:hanging="360"/>
-      </w:pPr>
-      <w:rPr>
-        <w:rFonts w:ascii="Aptos" w:eastAsia="Aptos" w:hAnsi="Aptos" w:cs="Aptos"/>
-      </w:rPr>
-    </w:lvl>
-    <w:lvl w:ilvl="1">
-      <w:start w:val="1"/>
-      <w:numFmt w:val="bullet"/>
-      <w:lvlText w:val="●"/>
-      <w:lvlJc w:val="left"/>
-      <w:pPr>
-        <w:ind w:left="1440" w:hanging="360"/>
-      </w:pPr>
-      <w:rPr>
-        <w:rFonts w:ascii="Noto Sans Symbols" w:eastAsia="Noto Sans Symbols" w:hAnsi="Noto Sans Symbols" w:cs="Noto Sans Symbols"/>
-      </w:rPr>
-    </w:lvl>
-    <w:lvl w:ilvl="2">
-      <w:start w:val="1"/>
-      <w:numFmt w:val="bullet"/>
-      <w:lvlText w:val="▪"/>
-      <w:lvlJc w:val="left"/>
-      <w:pPr>
-        <w:ind w:left="2160" w:hanging="360"/>
-      </w:pPr>
-      <w:rPr>
-        <w:rFonts w:ascii="Noto Sans Symbols" w:eastAsia="Noto Sans Symbols" w:hAnsi="Noto Sans Symbols" w:cs="Noto Sans Symbols"/>
-      </w:rPr>
-    </w:lvl>
-    <w:lvl w:ilvl="3">
-      <w:start w:val="1"/>
-      <w:numFmt w:val="bullet"/>
-      <w:lvlText w:val="●"/>
-      <w:lvlJc w:val="left"/>
-      <w:pPr>
-        <w:ind w:left="2880" w:hanging="360"/>
-      </w:pPr>
-      <w:rPr>
-        <w:rFonts w:ascii="Noto Sans Symbols" w:eastAsia="Noto Sans Symbols" w:hAnsi="Noto Sans Symbols" w:cs="Noto Sans Symbols"/>
-      </w:rPr>
-    </w:lvl>
-    <w:lvl w:ilvl="4">
-      <w:start w:val="1"/>
-      <w:numFmt w:val="bullet"/>
-      <w:lvlText w:val="o"/>
-      <w:lvlJc w:val="left"/>
-      <w:pPr>
-        <w:ind w:left="3600" w:hanging="360"/>
-      </w:pPr>
-      <w:rPr>
-        <w:rFonts w:ascii="Courier New" w:eastAsia="Courier New" w:hAnsi="Courier New" w:cs="Courier New"/>
-      </w:rPr>
-    </w:lvl>
-    <w:lvl w:ilvl="5">
-      <w:start w:val="1"/>
-      <w:numFmt w:val="bullet"/>
-      <w:lvlText w:val="▪"/>
-      <w:lvlJc w:val="left"/>
-      <w:pPr>
-        <w:ind w:left="4320" w:hanging="360"/>
-      </w:pPr>
-      <w:rPr>
-        <w:rFonts w:ascii="Noto Sans Symbols" w:eastAsia="Noto Sans Symbols" w:hAnsi="Noto Sans Symbols" w:cs="Noto Sans Symbols"/>
-      </w:rPr>
-    </w:lvl>
-    <w:lvl w:ilvl="6">
-      <w:start w:val="1"/>
-      <w:numFmt w:val="bullet"/>
-      <w:lvlText w:val="●"/>
-      <w:lvlJc w:val="left"/>
-      <w:pPr>
-        <w:ind w:left="5040" w:hanging="360"/>
-      </w:pPr>
-      <w:rPr>
-        <w:rFonts w:ascii="Noto Sans Symbols" w:eastAsia="Noto Sans Symbols" w:hAnsi="Noto Sans Symbols" w:cs="Noto Sans Symbols"/>
-      </w:rPr>
-    </w:lvl>
-    <w:lvl w:ilvl="7">
-      <w:start w:val="1"/>
-      <w:numFmt w:val="bullet"/>
-      <w:lvlText w:val="o"/>
-      <w:lvlJc w:val="left"/>
-      <w:pPr>
-        <w:ind w:left="5760" w:hanging="360"/>
-      </w:pPr>
-      <w:rPr>
-        <w:rFonts w:ascii="Courier New" w:eastAsia="Courier New" w:hAnsi="Courier New" w:cs="Courier New"/>
-      </w:rPr>
-    </w:lvl>
-    <w:lvl w:ilvl="8">
-      <w:start w:val="1"/>
-      <w:numFmt w:val="bullet"/>
-      <w:lvlText w:val="▪"/>
-      <w:lvlJc w:val="left"/>
-      <w:pPr>
-        <w:ind w:left="6480" w:hanging="360"/>
-      </w:pPr>
-      <w:rPr>
-        <w:rFonts w:ascii="Noto Sans Symbols" w:eastAsia="Noto Sans Symbols" w:hAnsi="Noto Sans Symbols" w:cs="Noto Sans Symbols"/>
-      </w:rPr>
-    </w:lvl>
-  </w:abstractNum>
-  <w:abstractNum w:abstractNumId="19" w15:restartNumberingAfterBreak="0">
-    <w:nsid w:val="73776D94"/>
-    <w:multiLevelType w:val="multilevel"/>
-    <w:tmpl w:val="3940D936"/>
+    <w:tmpl w:val="3B440B54"/>
     <w:lvl w:ilvl="0">
       <w:start w:val="1"/>
       <w:numFmt w:val="decimal"/>
@@ -25384,65 +27254,509 @@
       </w:pPr>
     </w:lvl>
   </w:abstractNum>
+  <w:abstractNum w:abstractNumId="21" w15:restartNumberingAfterBreak="0">
+    <w:nsid w:val="62C615B1"/>
+    <w:multiLevelType w:val="hybridMultilevel"/>
+    <w:tmpl w:val="69AC4796"/>
+    <w:lvl w:ilvl="0" w:tplc="2C0A0001">
+      <w:start w:val="1"/>
+      <w:numFmt w:val="bullet"/>
+      <w:lvlText w:val=""/>
+      <w:lvlJc w:val="left"/>
+      <w:pPr>
+        <w:ind w:left="720" w:hanging="360"/>
+      </w:pPr>
+      <w:rPr>
+        <w:rFonts w:ascii="Symbol" w:hAnsi="Symbol" w:hint="default"/>
+      </w:rPr>
+    </w:lvl>
+    <w:lvl w:ilvl="1" w:tplc="2C0A0003" w:tentative="1">
+      <w:start w:val="1"/>
+      <w:numFmt w:val="bullet"/>
+      <w:lvlText w:val="o"/>
+      <w:lvlJc w:val="left"/>
+      <w:pPr>
+        <w:ind w:left="1440" w:hanging="360"/>
+      </w:pPr>
+      <w:rPr>
+        <w:rFonts w:ascii="Courier New" w:hAnsi="Courier New" w:cs="Courier New" w:hint="default"/>
+      </w:rPr>
+    </w:lvl>
+    <w:lvl w:ilvl="2" w:tplc="2C0A0005" w:tentative="1">
+      <w:start w:val="1"/>
+      <w:numFmt w:val="bullet"/>
+      <w:lvlText w:val=""/>
+      <w:lvlJc w:val="left"/>
+      <w:pPr>
+        <w:ind w:left="2160" w:hanging="360"/>
+      </w:pPr>
+      <w:rPr>
+        <w:rFonts w:ascii="Wingdings" w:hAnsi="Wingdings" w:hint="default"/>
+      </w:rPr>
+    </w:lvl>
+    <w:lvl w:ilvl="3" w:tplc="2C0A0001" w:tentative="1">
+      <w:start w:val="1"/>
+      <w:numFmt w:val="bullet"/>
+      <w:lvlText w:val=""/>
+      <w:lvlJc w:val="left"/>
+      <w:pPr>
+        <w:ind w:left="2880" w:hanging="360"/>
+      </w:pPr>
+      <w:rPr>
+        <w:rFonts w:ascii="Symbol" w:hAnsi="Symbol" w:hint="default"/>
+      </w:rPr>
+    </w:lvl>
+    <w:lvl w:ilvl="4" w:tplc="2C0A0003" w:tentative="1">
+      <w:start w:val="1"/>
+      <w:numFmt w:val="bullet"/>
+      <w:lvlText w:val="o"/>
+      <w:lvlJc w:val="left"/>
+      <w:pPr>
+        <w:ind w:left="3600" w:hanging="360"/>
+      </w:pPr>
+      <w:rPr>
+        <w:rFonts w:ascii="Courier New" w:hAnsi="Courier New" w:cs="Courier New" w:hint="default"/>
+      </w:rPr>
+    </w:lvl>
+    <w:lvl w:ilvl="5" w:tplc="2C0A0005" w:tentative="1">
+      <w:start w:val="1"/>
+      <w:numFmt w:val="bullet"/>
+      <w:lvlText w:val=""/>
+      <w:lvlJc w:val="left"/>
+      <w:pPr>
+        <w:ind w:left="4320" w:hanging="360"/>
+      </w:pPr>
+      <w:rPr>
+        <w:rFonts w:ascii="Wingdings" w:hAnsi="Wingdings" w:hint="default"/>
+      </w:rPr>
+    </w:lvl>
+    <w:lvl w:ilvl="6" w:tplc="2C0A0001" w:tentative="1">
+      <w:start w:val="1"/>
+      <w:numFmt w:val="bullet"/>
+      <w:lvlText w:val=""/>
+      <w:lvlJc w:val="left"/>
+      <w:pPr>
+        <w:ind w:left="5040" w:hanging="360"/>
+      </w:pPr>
+      <w:rPr>
+        <w:rFonts w:ascii="Symbol" w:hAnsi="Symbol" w:hint="default"/>
+      </w:rPr>
+    </w:lvl>
+    <w:lvl w:ilvl="7" w:tplc="2C0A0003" w:tentative="1">
+      <w:start w:val="1"/>
+      <w:numFmt w:val="bullet"/>
+      <w:lvlText w:val="o"/>
+      <w:lvlJc w:val="left"/>
+      <w:pPr>
+        <w:ind w:left="5760" w:hanging="360"/>
+      </w:pPr>
+      <w:rPr>
+        <w:rFonts w:ascii="Courier New" w:hAnsi="Courier New" w:cs="Courier New" w:hint="default"/>
+      </w:rPr>
+    </w:lvl>
+    <w:lvl w:ilvl="8" w:tplc="2C0A0005" w:tentative="1">
+      <w:start w:val="1"/>
+      <w:numFmt w:val="bullet"/>
+      <w:lvlText w:val=""/>
+      <w:lvlJc w:val="left"/>
+      <w:pPr>
+        <w:ind w:left="6480" w:hanging="360"/>
+      </w:pPr>
+      <w:rPr>
+        <w:rFonts w:ascii="Wingdings" w:hAnsi="Wingdings" w:hint="default"/>
+      </w:rPr>
+    </w:lvl>
+  </w:abstractNum>
+  <w:abstractNum w:abstractNumId="22" w15:restartNumberingAfterBreak="0">
+    <w:nsid w:val="721D01EF"/>
+    <w:multiLevelType w:val="multilevel"/>
+    <w:tmpl w:val="AADC35FA"/>
+    <w:lvl w:ilvl="0">
+      <w:start w:val="1"/>
+      <w:numFmt w:val="bullet"/>
+      <w:lvlText w:val="-"/>
+      <w:lvlJc w:val="left"/>
+      <w:pPr>
+        <w:ind w:left="720" w:hanging="360"/>
+      </w:pPr>
+      <w:rPr>
+        <w:rFonts w:ascii="Aptos" w:eastAsia="Aptos" w:hAnsi="Aptos" w:cs="Aptos"/>
+      </w:rPr>
+    </w:lvl>
+    <w:lvl w:ilvl="1">
+      <w:start w:val="1"/>
+      <w:numFmt w:val="bullet"/>
+      <w:lvlText w:val="●"/>
+      <w:lvlJc w:val="left"/>
+      <w:pPr>
+        <w:ind w:left="1440" w:hanging="360"/>
+      </w:pPr>
+      <w:rPr>
+        <w:rFonts w:ascii="Noto Sans Symbols" w:eastAsia="Noto Sans Symbols" w:hAnsi="Noto Sans Symbols" w:cs="Noto Sans Symbols"/>
+      </w:rPr>
+    </w:lvl>
+    <w:lvl w:ilvl="2">
+      <w:start w:val="1"/>
+      <w:numFmt w:val="bullet"/>
+      <w:lvlText w:val="▪"/>
+      <w:lvlJc w:val="left"/>
+      <w:pPr>
+        <w:ind w:left="2160" w:hanging="360"/>
+      </w:pPr>
+      <w:rPr>
+        <w:rFonts w:ascii="Noto Sans Symbols" w:eastAsia="Noto Sans Symbols" w:hAnsi="Noto Sans Symbols" w:cs="Noto Sans Symbols"/>
+      </w:rPr>
+    </w:lvl>
+    <w:lvl w:ilvl="3">
+      <w:start w:val="1"/>
+      <w:numFmt w:val="bullet"/>
+      <w:lvlText w:val="●"/>
+      <w:lvlJc w:val="left"/>
+      <w:pPr>
+        <w:ind w:left="2880" w:hanging="360"/>
+      </w:pPr>
+      <w:rPr>
+        <w:rFonts w:ascii="Noto Sans Symbols" w:eastAsia="Noto Sans Symbols" w:hAnsi="Noto Sans Symbols" w:cs="Noto Sans Symbols"/>
+      </w:rPr>
+    </w:lvl>
+    <w:lvl w:ilvl="4">
+      <w:start w:val="1"/>
+      <w:numFmt w:val="bullet"/>
+      <w:lvlText w:val="o"/>
+      <w:lvlJc w:val="left"/>
+      <w:pPr>
+        <w:ind w:left="3600" w:hanging="360"/>
+      </w:pPr>
+      <w:rPr>
+        <w:rFonts w:ascii="Courier New" w:eastAsia="Courier New" w:hAnsi="Courier New" w:cs="Courier New"/>
+      </w:rPr>
+    </w:lvl>
+    <w:lvl w:ilvl="5">
+      <w:start w:val="1"/>
+      <w:numFmt w:val="bullet"/>
+      <w:lvlText w:val="▪"/>
+      <w:lvlJc w:val="left"/>
+      <w:pPr>
+        <w:ind w:left="4320" w:hanging="360"/>
+      </w:pPr>
+      <w:rPr>
+        <w:rFonts w:ascii="Noto Sans Symbols" w:eastAsia="Noto Sans Symbols" w:hAnsi="Noto Sans Symbols" w:cs="Noto Sans Symbols"/>
+      </w:rPr>
+    </w:lvl>
+    <w:lvl w:ilvl="6">
+      <w:start w:val="1"/>
+      <w:numFmt w:val="bullet"/>
+      <w:lvlText w:val="●"/>
+      <w:lvlJc w:val="left"/>
+      <w:pPr>
+        <w:ind w:left="5040" w:hanging="360"/>
+      </w:pPr>
+      <w:rPr>
+        <w:rFonts w:ascii="Noto Sans Symbols" w:eastAsia="Noto Sans Symbols" w:hAnsi="Noto Sans Symbols" w:cs="Noto Sans Symbols"/>
+      </w:rPr>
+    </w:lvl>
+    <w:lvl w:ilvl="7">
+      <w:start w:val="1"/>
+      <w:numFmt w:val="bullet"/>
+      <w:lvlText w:val="o"/>
+      <w:lvlJc w:val="left"/>
+      <w:pPr>
+        <w:ind w:left="5760" w:hanging="360"/>
+      </w:pPr>
+      <w:rPr>
+        <w:rFonts w:ascii="Courier New" w:eastAsia="Courier New" w:hAnsi="Courier New" w:cs="Courier New"/>
+      </w:rPr>
+    </w:lvl>
+    <w:lvl w:ilvl="8">
+      <w:start w:val="1"/>
+      <w:numFmt w:val="bullet"/>
+      <w:lvlText w:val="▪"/>
+      <w:lvlJc w:val="left"/>
+      <w:pPr>
+        <w:ind w:left="6480" w:hanging="360"/>
+      </w:pPr>
+      <w:rPr>
+        <w:rFonts w:ascii="Noto Sans Symbols" w:eastAsia="Noto Sans Symbols" w:hAnsi="Noto Sans Symbols" w:cs="Noto Sans Symbols"/>
+      </w:rPr>
+    </w:lvl>
+  </w:abstractNum>
+  <w:abstractNum w:abstractNumId="23" w15:restartNumberingAfterBreak="0">
+    <w:nsid w:val="73776D94"/>
+    <w:multiLevelType w:val="multilevel"/>
+    <w:tmpl w:val="3940D936"/>
+    <w:lvl w:ilvl="0">
+      <w:start w:val="1"/>
+      <w:numFmt w:val="decimal"/>
+      <w:lvlText w:val="%1."/>
+      <w:lvlJc w:val="left"/>
+      <w:pPr>
+        <w:ind w:left="720" w:hanging="360"/>
+      </w:pPr>
+      <w:rPr>
+        <w:b/>
+        <w:bCs/>
+      </w:rPr>
+    </w:lvl>
+    <w:lvl w:ilvl="1">
+      <w:start w:val="1"/>
+      <w:numFmt w:val="decimal"/>
+      <w:lvlText w:val="%2."/>
+      <w:lvlJc w:val="left"/>
+      <w:pPr>
+        <w:ind w:left="1440" w:hanging="360"/>
+      </w:pPr>
+    </w:lvl>
+    <w:lvl w:ilvl="2">
+      <w:start w:val="1"/>
+      <w:numFmt w:val="decimal"/>
+      <w:lvlText w:val="%3."/>
+      <w:lvlJc w:val="left"/>
+      <w:pPr>
+        <w:ind w:left="2160" w:hanging="360"/>
+      </w:pPr>
+    </w:lvl>
+    <w:lvl w:ilvl="3">
+      <w:start w:val="1"/>
+      <w:numFmt w:val="decimal"/>
+      <w:lvlText w:val="%4."/>
+      <w:lvlJc w:val="left"/>
+      <w:pPr>
+        <w:ind w:left="2880" w:hanging="360"/>
+      </w:pPr>
+    </w:lvl>
+    <w:lvl w:ilvl="4">
+      <w:start w:val="1"/>
+      <w:numFmt w:val="decimal"/>
+      <w:lvlText w:val="%5."/>
+      <w:lvlJc w:val="left"/>
+      <w:pPr>
+        <w:ind w:left="3600" w:hanging="360"/>
+      </w:pPr>
+    </w:lvl>
+    <w:lvl w:ilvl="5">
+      <w:start w:val="1"/>
+      <w:numFmt w:val="decimal"/>
+      <w:lvlText w:val="%6."/>
+      <w:lvlJc w:val="left"/>
+      <w:pPr>
+        <w:ind w:left="4320" w:hanging="360"/>
+      </w:pPr>
+    </w:lvl>
+    <w:lvl w:ilvl="6">
+      <w:start w:val="1"/>
+      <w:numFmt w:val="decimal"/>
+      <w:lvlText w:val="%7."/>
+      <w:lvlJc w:val="left"/>
+      <w:pPr>
+        <w:ind w:left="5040" w:hanging="360"/>
+      </w:pPr>
+    </w:lvl>
+    <w:lvl w:ilvl="7">
+      <w:start w:val="1"/>
+      <w:numFmt w:val="decimal"/>
+      <w:lvlText w:val="%8."/>
+      <w:lvlJc w:val="left"/>
+      <w:pPr>
+        <w:ind w:left="5760" w:hanging="360"/>
+      </w:pPr>
+    </w:lvl>
+    <w:lvl w:ilvl="8">
+      <w:start w:val="1"/>
+      <w:numFmt w:val="decimal"/>
+      <w:lvlText w:val="%9."/>
+      <w:lvlJc w:val="left"/>
+      <w:pPr>
+        <w:ind w:left="6480" w:hanging="360"/>
+      </w:pPr>
+    </w:lvl>
+  </w:abstractNum>
+  <w:abstractNum w:abstractNumId="24" w15:restartNumberingAfterBreak="0">
+    <w:nsid w:val="7B0825C5"/>
+    <w:multiLevelType w:val="multilevel"/>
+    <w:tmpl w:val="E62824EC"/>
+    <w:lvl w:ilvl="0">
+      <w:start w:val="1"/>
+      <w:numFmt w:val="decimal"/>
+      <w:lvlText w:val="%1."/>
+      <w:lvlJc w:val="left"/>
+      <w:pPr>
+        <w:ind w:left="720" w:hanging="360"/>
+      </w:pPr>
+      <w:rPr>
+        <w:u w:val="none"/>
+      </w:rPr>
+    </w:lvl>
+    <w:lvl w:ilvl="1">
+      <w:start w:val="1"/>
+      <w:numFmt w:val="lowerLetter"/>
+      <w:lvlText w:val="%2."/>
+      <w:lvlJc w:val="left"/>
+      <w:pPr>
+        <w:ind w:left="1440" w:hanging="360"/>
+      </w:pPr>
+      <w:rPr>
+        <w:u w:val="none"/>
+      </w:rPr>
+    </w:lvl>
+    <w:lvl w:ilvl="2">
+      <w:start w:val="1"/>
+      <w:numFmt w:val="lowerRoman"/>
+      <w:lvlText w:val="%3."/>
+      <w:lvlJc w:val="right"/>
+      <w:pPr>
+        <w:ind w:left="2160" w:hanging="360"/>
+      </w:pPr>
+      <w:rPr>
+        <w:u w:val="none"/>
+      </w:rPr>
+    </w:lvl>
+    <w:lvl w:ilvl="3">
+      <w:start w:val="1"/>
+      <w:numFmt w:val="decimal"/>
+      <w:lvlText w:val="%4."/>
+      <w:lvlJc w:val="left"/>
+      <w:pPr>
+        <w:ind w:left="2880" w:hanging="360"/>
+      </w:pPr>
+      <w:rPr>
+        <w:u w:val="none"/>
+      </w:rPr>
+    </w:lvl>
+    <w:lvl w:ilvl="4">
+      <w:start w:val="1"/>
+      <w:numFmt w:val="lowerLetter"/>
+      <w:lvlText w:val="%5."/>
+      <w:lvlJc w:val="left"/>
+      <w:pPr>
+        <w:ind w:left="3600" w:hanging="360"/>
+      </w:pPr>
+      <w:rPr>
+        <w:u w:val="none"/>
+      </w:rPr>
+    </w:lvl>
+    <w:lvl w:ilvl="5">
+      <w:start w:val="1"/>
+      <w:numFmt w:val="lowerRoman"/>
+      <w:lvlText w:val="%6."/>
+      <w:lvlJc w:val="right"/>
+      <w:pPr>
+        <w:ind w:left="4320" w:hanging="360"/>
+      </w:pPr>
+      <w:rPr>
+        <w:u w:val="none"/>
+      </w:rPr>
+    </w:lvl>
+    <w:lvl w:ilvl="6">
+      <w:start w:val="1"/>
+      <w:numFmt w:val="decimal"/>
+      <w:lvlText w:val="%7."/>
+      <w:lvlJc w:val="left"/>
+      <w:pPr>
+        <w:ind w:left="5040" w:hanging="360"/>
+      </w:pPr>
+      <w:rPr>
+        <w:u w:val="none"/>
+      </w:rPr>
+    </w:lvl>
+    <w:lvl w:ilvl="7">
+      <w:start w:val="1"/>
+      <w:numFmt w:val="lowerLetter"/>
+      <w:lvlText w:val="%8."/>
+      <w:lvlJc w:val="left"/>
+      <w:pPr>
+        <w:ind w:left="5760" w:hanging="360"/>
+      </w:pPr>
+      <w:rPr>
+        <w:u w:val="none"/>
+      </w:rPr>
+    </w:lvl>
+    <w:lvl w:ilvl="8">
+      <w:start w:val="1"/>
+      <w:numFmt w:val="lowerRoman"/>
+      <w:lvlText w:val="%9."/>
+      <w:lvlJc w:val="right"/>
+      <w:pPr>
+        <w:ind w:left="6480" w:hanging="360"/>
+      </w:pPr>
+      <w:rPr>
+        <w:u w:val="none"/>
+      </w:rPr>
+    </w:lvl>
+  </w:abstractNum>
   <w:num w:numId="1" w16cid:durableId="1003820479">
+    <w:abstractNumId w:val="17"/>
+  </w:num>
+  <w:num w:numId="2" w16cid:durableId="959841925">
+    <w:abstractNumId w:val="2"/>
+  </w:num>
+  <w:num w:numId="3" w16cid:durableId="1279489412">
+    <w:abstractNumId w:val="13"/>
+  </w:num>
+  <w:num w:numId="4" w16cid:durableId="73673050">
+    <w:abstractNumId w:val="22"/>
+  </w:num>
+  <w:num w:numId="5" w16cid:durableId="335158926">
+    <w:abstractNumId w:val="1"/>
+  </w:num>
+  <w:num w:numId="6" w16cid:durableId="22680917">
     <w:abstractNumId w:val="14"/>
   </w:num>
-  <w:num w:numId="2" w16cid:durableId="959841925">
-    <w:abstractNumId w:val="1"/>
+  <w:num w:numId="7" w16cid:durableId="356194859">
+    <w:abstractNumId w:val="23"/>
   </w:num>
-  <w:num w:numId="3" w16cid:durableId="1279489412">
+  <w:num w:numId="8" w16cid:durableId="1683049771">
+    <w:abstractNumId w:val="9"/>
+  </w:num>
+  <w:num w:numId="9" w16cid:durableId="533082093">
+    <w:abstractNumId w:val="20"/>
+  </w:num>
+  <w:num w:numId="10" w16cid:durableId="338847162">
+    <w:abstractNumId w:val="16"/>
+  </w:num>
+  <w:num w:numId="11" w16cid:durableId="735468304">
+    <w:abstractNumId w:val="3"/>
+  </w:num>
+  <w:num w:numId="12" w16cid:durableId="1651904012">
+    <w:abstractNumId w:val="12"/>
+  </w:num>
+  <w:num w:numId="13" w16cid:durableId="1435318471">
+    <w:abstractNumId w:val="7"/>
+  </w:num>
+  <w:num w:numId="14" w16cid:durableId="538128944">
+    <w:abstractNumId w:val="4"/>
+  </w:num>
+  <w:num w:numId="15" w16cid:durableId="334890023">
+    <w:abstractNumId w:val="5"/>
+  </w:num>
+  <w:num w:numId="16" w16cid:durableId="1311444191">
+    <w:abstractNumId w:val="8"/>
+  </w:num>
+  <w:num w:numId="17" w16cid:durableId="428624901">
+    <w:abstractNumId w:val="6"/>
+  </w:num>
+  <w:num w:numId="18" w16cid:durableId="44764715">
+    <w:abstractNumId w:val="18"/>
+  </w:num>
+  <w:num w:numId="19" w16cid:durableId="1035933899">
+    <w:abstractNumId w:val="21"/>
+  </w:num>
+  <w:num w:numId="20" w16cid:durableId="795104101">
+    <w:abstractNumId w:val="15"/>
+  </w:num>
+  <w:num w:numId="21" w16cid:durableId="1902398725">
+    <w:abstractNumId w:val="19"/>
+  </w:num>
+  <w:num w:numId="22" w16cid:durableId="2137947010">
+    <w:abstractNumId w:val="24"/>
+  </w:num>
+  <w:num w:numId="23" w16cid:durableId="1079642873">
     <w:abstractNumId w:val="10"/>
   </w:num>
-  <w:num w:numId="4" w16cid:durableId="73673050">
-    <w:abstractNumId w:val="18"/>
-  </w:num>
-  <w:num w:numId="5" w16cid:durableId="335158926">
-    <w:abstractNumId w:val="0"/>
-  </w:num>
-  <w:num w:numId="6" w16cid:durableId="22680917">
+  <w:num w:numId="24" w16cid:durableId="895315625">
     <w:abstractNumId w:val="11"/>
   </w:num>
-  <w:num w:numId="7" w16cid:durableId="356194859">
-    <w:abstractNumId w:val="19"/>
-  </w:num>
-  <w:num w:numId="8" w16cid:durableId="1683049771">
-    <w:abstractNumId w:val="8"/>
-  </w:num>
-  <w:num w:numId="9" w16cid:durableId="533082093">
-    <w:abstractNumId w:val="16"/>
-  </w:num>
-  <w:num w:numId="10" w16cid:durableId="338847162">
-    <w:abstractNumId w:val="13"/>
-  </w:num>
-  <w:num w:numId="11" w16cid:durableId="735468304">
-    <w:abstractNumId w:val="2"/>
-  </w:num>
-  <w:num w:numId="12" w16cid:durableId="1651904012">
-    <w:abstractNumId w:val="9"/>
-  </w:num>
-  <w:num w:numId="13" w16cid:durableId="1435318471">
-    <w:abstractNumId w:val="6"/>
-  </w:num>
-  <w:num w:numId="14" w16cid:durableId="538128944">
-    <w:abstractNumId w:val="3"/>
-  </w:num>
-  <w:num w:numId="15" w16cid:durableId="334890023">
-    <w:abstractNumId w:val="4"/>
-  </w:num>
-  <w:num w:numId="16" w16cid:durableId="1311444191">
-    <w:abstractNumId w:val="7"/>
-  </w:num>
-  <w:num w:numId="17" w16cid:durableId="428624901">
-    <w:abstractNumId w:val="5"/>
-  </w:num>
-  <w:num w:numId="18" w16cid:durableId="44764715">
-    <w:abstractNumId w:val="15"/>
-  </w:num>
-  <w:num w:numId="19" w16cid:durableId="1035933899">
-    <w:abstractNumId w:val="17"/>
-  </w:num>
-  <w:num w:numId="20" w16cid:durableId="795104101">
-    <w:abstractNumId w:val="12"/>
+  <w:num w:numId="25" w16cid:durableId="549073225">
+    <w:abstractNumId w:val="0"/>
   </w:num>
 </w:numbering>
 </file>
@@ -25845,7 +28159,7 @@
   <w:style w:type="paragraph" w:default="1" w:styleId="Normal">
     <w:name w:val="Normal"/>
     <w:qFormat/>
-    <w:rsid w:val="00260630"/>
+    <w:rsid w:val="000A02F8"/>
   </w:style>
   <w:style w:type="paragraph" w:styleId="Ttulo1">
     <w:name w:val="heading 1"/>
@@ -26758,28 +29072,28 @@
 </file>
 
 <file path=customXml/item1.xml><?xml version="1.0" encoding="utf-8"?>
+<b:Sources xmlns:b="http://schemas.openxmlformats.org/officeDocument/2006/bibliography" xmlns="http://schemas.openxmlformats.org/officeDocument/2006/bibliography" SelectedStyle="\APASixthEditionOfficeOnline.xsl" StyleName="APA" Version="6"/>
+</file>
+
+<file path=customXml/item2.xml><?xml version="1.0" encoding="utf-8"?>
 <go:gDocsCustomXmlDataStorage xmlns:go="http://customooxmlschemas.google.com/" xmlns:r="http://schemas.openxmlformats.org/officeDocument/2006/relationships" uri="GoogleDocsCustomDataVersion2">
   <go:docsCustomData xmlns:go="http://customooxmlschemas.google.com/" roundtripDataSignature="AMtx7mg9ViIy0TFX1PbiokUHW0+gEHD0DQ==">CgMxLjAyDmgueXB0b3ptdnN5YWhpMg5oLjMwMTZ1a3NyeWs5OTIOaC41dHdvajgxajFna2EyDmguajh3ZGR4ZWVnZ3R3Mg5oLmJneml2aG00bzdoYzIOaC5qOTJ5aWxicjl6dDcyDmgubjRpdXVhbG9heDc2Mg5oLjFpNzZ2NHk0NXc5OTIOaC5oaHFvaTRybTJzYjEyDmgubGF1ZXZ5aGhzMG5uMg5oLjI5Nmd4eXhiYnYwbTgAciExNlVkVkNiWlZIdUNvcHFuMnNIenVkMWZoTjV5TjIzLW4=</go:docsCustomData>
 </go:gDocsCustomXmlDataStorage>
 </file>
 
-<file path=customXml/item2.xml><?xml version="1.0" encoding="utf-8"?>
-<b:Sources xmlns:b="http://schemas.openxmlformats.org/officeDocument/2006/bibliography" xmlns="http://schemas.openxmlformats.org/officeDocument/2006/bibliography" SelectedStyle="\APASixthEditionOfficeOnline.xsl" StyleName="APA" Version="6"/>
+<file path=customXml/itemProps1.xml><?xml version="1.0" encoding="utf-8"?>
+<ds:datastoreItem xmlns:ds="http://schemas.openxmlformats.org/officeDocument/2006/customXml" ds:itemID="{98C402C2-0B0B-45E1-8B8A-FD895BAD112E}">
+  <ds:schemaRefs>
+    <ds:schemaRef ds:uri="http://schemas.openxmlformats.org/officeDocument/2006/bibliography"/>
+  </ds:schemaRefs>
+</ds:datastoreItem>
 </file>
 
-<file path=customXml/itemProps1.xml><?xml version="1.0" encoding="utf-8"?>
+<file path=customXml/itemProps2.xml><?xml version="1.0" encoding="utf-8"?>
 <ds:datastoreItem xmlns:ds="http://schemas.openxmlformats.org/officeDocument/2006/customXml" ds:itemID="{11111111-1234-1234-1234-123412341234}">
   <ds:schemaRefs>
     <ds:schemaRef ds:uri="http://customooxmlschemas.google.com/"/>
     <ds:schemaRef ds:uri="http://schemas.openxmlformats.org/officeDocument/2006/relationships"/>
   </ds:schemaRefs>
 </ds:datastoreItem>
-</file>
-
-<file path=customXml/itemProps2.xml><?xml version="1.0" encoding="utf-8"?>
-<ds:datastoreItem xmlns:ds="http://schemas.openxmlformats.org/officeDocument/2006/customXml" ds:itemID="{98C402C2-0B0B-45E1-8B8A-FD895BAD112E}">
-  <ds:schemaRefs>
-    <ds:schemaRef ds:uri="http://schemas.openxmlformats.org/officeDocument/2006/bibliography"/>
-  </ds:schemaRefs>
-</ds:datastoreItem>
 </file>
</xml_diff>

<commit_message>
Documentacion del Modificacion y Baja de producto
Creacion del DSS de ModdificacionProducto y BajaProducto.
</commit_message>
<xml_diff>
--- a/Documentación/ProyectoIS 2026 CAJAL-FERNANDEZ_2daEntrega.docx
+++ b/Documentación/ProyectoIS 2026 CAJAL-FERNANDEZ_2daEntrega.docx
@@ -11578,23 +11578,7 @@
                 <w:rFonts w:ascii="Times New Roman" w:eastAsia="Times New Roman" w:hAnsi="Times New Roman" w:cs="Times New Roman"/>
                 <w:color w:val="000000"/>
               </w:rPr>
-              <w:t xml:space="preserve">El usuario queda autenticado en el sistema e inicia su sesión, se registran los permisos </w:t>
-            </w:r>
-            <w:proofErr w:type="gramStart"/>
-            <w:r>
-              <w:rPr>
-                <w:rFonts w:ascii="Times New Roman" w:eastAsia="Times New Roman" w:hAnsi="Times New Roman" w:cs="Times New Roman"/>
-                <w:color w:val="000000"/>
-              </w:rPr>
-              <w:t>del mismo</w:t>
-            </w:r>
-            <w:proofErr w:type="gramEnd"/>
-            <w:r>
-              <w:rPr>
-                <w:rFonts w:ascii="Times New Roman" w:eastAsia="Times New Roman" w:hAnsi="Times New Roman" w:cs="Times New Roman"/>
-                <w:color w:val="000000"/>
-              </w:rPr>
-              <w:t>.</w:t>
+              <w:t>El usuario queda autenticado en el sistema e inicia su sesión, se registran los permisos del mismo.</w:t>
             </w:r>
           </w:p>
         </w:tc>
@@ -17041,21 +17025,7 @@
         <w:rPr>
           <w:rFonts w:ascii="Times New Roman" w:hAnsi="Times New Roman" w:cs="Times New Roman"/>
         </w:rPr>
-        <w:t xml:space="preserve">La utilización de la bitácora nos permite llevar un registro de las acciones realizadas dentro del sistema por parte de un usuario </w:t>
-      </w:r>
-      <w:proofErr w:type="gramStart"/>
-      <w:r>
-        <w:rPr>
-          <w:rFonts w:ascii="Times New Roman" w:hAnsi="Times New Roman" w:cs="Times New Roman"/>
-        </w:rPr>
-        <w:t>del mismo</w:t>
-      </w:r>
-      <w:proofErr w:type="gramEnd"/>
-      <w:r>
-        <w:rPr>
-          <w:rFonts w:ascii="Times New Roman" w:hAnsi="Times New Roman" w:cs="Times New Roman"/>
-        </w:rPr>
-        <w:t xml:space="preserve">. Cada evento registrado en la </w:t>
+        <w:t xml:space="preserve">La utilización de la bitácora nos permite llevar un registro de las acciones realizadas dentro del sistema por parte de un usuario del mismo. Cada evento registrado en la </w:t>
       </w:r>
       <w:r>
         <w:rPr>
@@ -17134,21 +17104,7 @@
         <w:rPr>
           <w:rFonts w:ascii="Times New Roman" w:hAnsi="Times New Roman" w:cs="Times New Roman"/>
         </w:rPr>
-        <w:t>Información asociada: Leyenda del hecho (Ej: El usuario “x</w:t>
-      </w:r>
-      <w:proofErr w:type="gramStart"/>
-      <w:r>
-        <w:rPr>
-          <w:rFonts w:ascii="Times New Roman" w:hAnsi="Times New Roman" w:cs="Times New Roman"/>
-        </w:rPr>
-        <w:t>”….</w:t>
-      </w:r>
-      <w:proofErr w:type="gramEnd"/>
-      <w:r>
-        <w:rPr>
-          <w:rFonts w:ascii="Times New Roman" w:hAnsi="Times New Roman" w:cs="Times New Roman"/>
-        </w:rPr>
-        <w:t>. tal actividad)</w:t>
+        <w:t>Información asociada: Leyenda del hecho (Ej: El usuario “x”….. tal actividad)</w:t>
       </w:r>
     </w:p>
     <w:p>
@@ -20530,6 +20486,9 @@
               <w:spacing w:after="0" w:line="240" w:lineRule="auto"/>
               <w:rPr>
                 <w:rFonts w:ascii="Times New Roman" w:eastAsia="Times New Roman" w:hAnsi="Times New Roman" w:cs="Times New Roman"/>
+                <w:b/>
+                <w:bCs/>
+                <w:color w:val="000000"/>
               </w:rPr>
             </w:pPr>
             <w:r>
@@ -20559,7 +20518,25 @@
                 <w:bCs/>
                 <w:color w:val="000000"/>
               </w:rPr>
-              <w:t xml:space="preserve">FA1- </w:t>
+              <w:t>FA</w:t>
+            </w:r>
+            <w:r>
+              <w:rPr>
+                <w:rFonts w:ascii="Times New Roman" w:eastAsia="Times New Roman" w:hAnsi="Times New Roman" w:cs="Times New Roman"/>
+                <w:b/>
+                <w:bCs/>
+                <w:color w:val="000000"/>
+              </w:rPr>
+              <w:t>1</w:t>
+            </w:r>
+            <w:r>
+              <w:rPr>
+                <w:rFonts w:ascii="Times New Roman" w:eastAsia="Times New Roman" w:hAnsi="Times New Roman" w:cs="Times New Roman"/>
+                <w:b/>
+                <w:bCs/>
+                <w:color w:val="000000"/>
+              </w:rPr>
+              <w:t xml:space="preserve">- </w:t>
             </w:r>
             <w:r>
               <w:rPr>
@@ -20701,6 +20678,7 @@
         <w:rPr>
           <w:rFonts w:ascii="Times New Roman" w:eastAsia="Times New Roman" w:hAnsi="Times New Roman" w:cs="Times New Roman"/>
         </w:rPr>
+        <w:lastRenderedPageBreak/>
         <w:t>6</w:t>
       </w:r>
       <w:r>
@@ -20735,6 +20713,60 @@
           <w:rFonts w:ascii="Times New Roman" w:hAnsi="Times New Roman" w:cs="Times New Roman"/>
         </w:rPr>
       </w:pPr>
+      <w:r>
+        <w:rPr>
+          <w:rFonts w:ascii="Times New Roman" w:hAnsi="Times New Roman" w:cs="Times New Roman"/>
+          <w:noProof/>
+        </w:rPr>
+        <w:drawing>
+          <wp:inline distT="0" distB="0" distL="0" distR="0" wp14:anchorId="7A49A31D" wp14:editId="14B52C43">
+            <wp:extent cx="5400040" cy="5669280"/>
+            <wp:effectExtent l="0" t="0" r="0" b="7620"/>
+            <wp:docPr id="2028827685" name="Imagen 3"/>
+            <wp:cNvGraphicFramePr>
+              <a:graphicFrameLocks xmlns:a="http://schemas.openxmlformats.org/drawingml/2006/main" noChangeAspect="1"/>
+            </wp:cNvGraphicFramePr>
+            <a:graphic xmlns:a="http://schemas.openxmlformats.org/drawingml/2006/main">
+              <a:graphicData uri="http://schemas.openxmlformats.org/drawingml/2006/picture">
+                <pic:pic xmlns:pic="http://schemas.openxmlformats.org/drawingml/2006/picture">
+                  <pic:nvPicPr>
+                    <pic:cNvPr id="0" name="Picture 3"/>
+                    <pic:cNvPicPr>
+                      <a:picLocks noChangeAspect="1" noChangeArrowheads="1"/>
+                    </pic:cNvPicPr>
+                  </pic:nvPicPr>
+                  <pic:blipFill>
+                    <a:blip r:embed="rId44">
+                      <a:extLst>
+                        <a:ext uri="{28A0092B-C50C-407E-A947-70E740481C1C}">
+                          <a14:useLocalDpi xmlns:a14="http://schemas.microsoft.com/office/drawing/2010/main" val="0"/>
+                        </a:ext>
+                      </a:extLst>
+                    </a:blip>
+                    <a:srcRect/>
+                    <a:stretch>
+                      <a:fillRect/>
+                    </a:stretch>
+                  </pic:blipFill>
+                  <pic:spPr bwMode="auto">
+                    <a:xfrm>
+                      <a:off x="0" y="0"/>
+                      <a:ext cx="5400040" cy="5669280"/>
+                    </a:xfrm>
+                    <a:prstGeom prst="rect">
+                      <a:avLst/>
+                    </a:prstGeom>
+                    <a:noFill/>
+                    <a:ln>
+                      <a:noFill/>
+                    </a:ln>
+                  </pic:spPr>
+                </pic:pic>
+              </a:graphicData>
+            </a:graphic>
+          </wp:inline>
+        </w:drawing>
+      </w:r>
     </w:p>
     <w:p>
       <w:pPr>
@@ -20987,6 +21019,7 @@
                 <w:bCs/>
                 <w:color w:val="000000"/>
               </w:rPr>
+              <w:lastRenderedPageBreak/>
               <w:t xml:space="preserve">DESCRIPCIÓN: </w:t>
             </w:r>
             <w:r>
@@ -21225,7 +21258,6 @@
                 <w:rFonts w:ascii="Times New Roman" w:eastAsia="Times New Roman" w:hAnsi="Times New Roman" w:cs="Times New Roman"/>
                 <w:color w:val="000000"/>
               </w:rPr>
-              <w:lastRenderedPageBreak/>
               <w:t>. Debe de haber por lo menos un producto registrado en el sistema.</w:t>
             </w:r>
           </w:p>
@@ -21265,7 +21297,6 @@
                 <w:bCs/>
                 <w:color w:val="000000"/>
               </w:rPr>
-              <w:lastRenderedPageBreak/>
               <w:t xml:space="preserve">PUNTOS DE EXTENSIÓN: </w:t>
             </w:r>
             <w:r>
@@ -21532,48 +21563,6 @@
                 <w:szCs w:val="22"/>
               </w:rPr>
               <w:t xml:space="preserve"> selecciona el producto que quiere modificar.</w:t>
-            </w:r>
-          </w:p>
-          <w:p>
-            <w:pPr>
-              <w:numPr>
-                <w:ilvl w:val="0"/>
-                <w:numId w:val="11"/>
-              </w:numPr>
-              <w:spacing w:after="0" w:line="240" w:lineRule="auto"/>
-              <w:rPr>
-                <w:rFonts w:ascii="Times New Roman" w:eastAsia="Times New Roman" w:hAnsi="Times New Roman" w:cs="Times New Roman"/>
-                <w:color w:val="000000"/>
-                <w:sz w:val="22"/>
-                <w:szCs w:val="22"/>
-              </w:rPr>
-            </w:pPr>
-            <w:r>
-              <w:rPr>
-                <w:rFonts w:ascii="Times New Roman" w:eastAsia="Times New Roman" w:hAnsi="Times New Roman" w:cs="Times New Roman"/>
-                <w:color w:val="000000"/>
-                <w:sz w:val="22"/>
-                <w:szCs w:val="22"/>
-              </w:rPr>
-              <w:t xml:space="preserve">El sistema presenta </w:t>
-            </w:r>
-            <w:r>
-              <w:rPr>
-                <w:rFonts w:ascii="Times New Roman" w:eastAsia="Times New Roman" w:hAnsi="Times New Roman" w:cs="Times New Roman"/>
-                <w:color w:val="000000"/>
-                <w:sz w:val="22"/>
-                <w:szCs w:val="22"/>
-              </w:rPr>
-              <w:t>el</w:t>
-            </w:r>
-            <w:r>
-              <w:rPr>
-                <w:rFonts w:ascii="Times New Roman" w:eastAsia="Times New Roman" w:hAnsi="Times New Roman" w:cs="Times New Roman"/>
-                <w:color w:val="000000"/>
-                <w:sz w:val="22"/>
-                <w:szCs w:val="22"/>
-              </w:rPr>
-              <w:t xml:space="preserve"> producto con sus respectivos datos y solicita ingresar los datos que quiera modificar.</w:t>
             </w:r>
           </w:p>
           <w:p>
@@ -21794,7 +21783,16 @@
                 <w:bCs/>
                 <w:color w:val="000000"/>
               </w:rPr>
-              <w:t xml:space="preserve">6.1 </w:t>
+              <w:t>5</w:t>
+            </w:r>
+            <w:r>
+              <w:rPr>
+                <w:rFonts w:ascii="Times New Roman" w:eastAsia="Times New Roman" w:hAnsi="Times New Roman" w:cs="Times New Roman"/>
+                <w:b/>
+                <w:bCs/>
+                <w:color w:val="000000"/>
+              </w:rPr>
+              <w:t xml:space="preserve">.1 </w:t>
             </w:r>
             <w:r>
               <w:rPr>
@@ -21819,7 +21817,16 @@
                 <w:bCs/>
                 <w:color w:val="000000"/>
               </w:rPr>
-              <w:t>6.2</w:t>
+              <w:t>5</w:t>
+            </w:r>
+            <w:r>
+              <w:rPr>
+                <w:rFonts w:ascii="Times New Roman" w:eastAsia="Times New Roman" w:hAnsi="Times New Roman" w:cs="Times New Roman"/>
+                <w:b/>
+                <w:bCs/>
+                <w:color w:val="000000"/>
+              </w:rPr>
+              <w:t>.2</w:t>
             </w:r>
             <w:r>
               <w:rPr>
@@ -21875,7 +21882,16 @@
                 <w:bCs/>
                 <w:color w:val="000000"/>
               </w:rPr>
-              <w:t xml:space="preserve">7.1 </w:t>
+              <w:t>6</w:t>
+            </w:r>
+            <w:r>
+              <w:rPr>
+                <w:rFonts w:ascii="Times New Roman" w:eastAsia="Times New Roman" w:hAnsi="Times New Roman" w:cs="Times New Roman"/>
+                <w:b/>
+                <w:bCs/>
+                <w:color w:val="000000"/>
+              </w:rPr>
+              <w:t xml:space="preserve">.1 </w:t>
             </w:r>
             <w:r>
               <w:rPr>
@@ -21946,6 +21962,7 @@
         <w:rPr>
           <w:rFonts w:ascii="Times New Roman" w:eastAsia="Times New Roman" w:hAnsi="Times New Roman" w:cs="Times New Roman"/>
         </w:rPr>
+        <w:lastRenderedPageBreak/>
         <w:t>6</w:t>
       </w:r>
       <w:r>
@@ -21980,6 +21997,60 @@
           <w:rFonts w:ascii="Times New Roman" w:eastAsia="Times New Roman" w:hAnsi="Times New Roman" w:cs="Times New Roman"/>
         </w:rPr>
       </w:pPr>
+      <w:r>
+        <w:rPr>
+          <w:rFonts w:ascii="Times New Roman" w:eastAsia="Times New Roman" w:hAnsi="Times New Roman" w:cs="Times New Roman"/>
+          <w:noProof/>
+        </w:rPr>
+        <w:drawing>
+          <wp:inline distT="0" distB="0" distL="0" distR="0" wp14:anchorId="17BC827E" wp14:editId="404A69F7">
+            <wp:extent cx="5400040" cy="5723255"/>
+            <wp:effectExtent l="0" t="0" r="0" b="0"/>
+            <wp:docPr id="163750502" name="Imagen 4"/>
+            <wp:cNvGraphicFramePr>
+              <a:graphicFrameLocks xmlns:a="http://schemas.openxmlformats.org/drawingml/2006/main" noChangeAspect="1"/>
+            </wp:cNvGraphicFramePr>
+            <a:graphic xmlns:a="http://schemas.openxmlformats.org/drawingml/2006/main">
+              <a:graphicData uri="http://schemas.openxmlformats.org/drawingml/2006/picture">
+                <pic:pic xmlns:pic="http://schemas.openxmlformats.org/drawingml/2006/picture">
+                  <pic:nvPicPr>
+                    <pic:cNvPr id="0" name="Picture 4"/>
+                    <pic:cNvPicPr>
+                      <a:picLocks noChangeAspect="1" noChangeArrowheads="1"/>
+                    </pic:cNvPicPr>
+                  </pic:nvPicPr>
+                  <pic:blipFill>
+                    <a:blip r:embed="rId45">
+                      <a:extLst>
+                        <a:ext uri="{28A0092B-C50C-407E-A947-70E740481C1C}">
+                          <a14:useLocalDpi xmlns:a14="http://schemas.microsoft.com/office/drawing/2010/main" val="0"/>
+                        </a:ext>
+                      </a:extLst>
+                    </a:blip>
+                    <a:srcRect/>
+                    <a:stretch>
+                      <a:fillRect/>
+                    </a:stretch>
+                  </pic:blipFill>
+                  <pic:spPr bwMode="auto">
+                    <a:xfrm>
+                      <a:off x="0" y="0"/>
+                      <a:ext cx="5400040" cy="5723255"/>
+                    </a:xfrm>
+                    <a:prstGeom prst="rect">
+                      <a:avLst/>
+                    </a:prstGeom>
+                    <a:noFill/>
+                    <a:ln>
+                      <a:noFill/>
+                    </a:ln>
+                  </pic:spPr>
+                </pic:pic>
+              </a:graphicData>
+            </a:graphic>
+          </wp:inline>
+        </w:drawing>
+      </w:r>
     </w:p>
     <w:p>
       <w:pPr>
@@ -22044,6 +22115,7 @@
         </w:numPr>
       </w:pPr>
       <w:r>
+        <w:lastRenderedPageBreak/>
         <w:t>S</w:t>
       </w:r>
       <w:r>
@@ -22065,11 +22137,7 @@
         <w:t xml:space="preserve">Si </w:t>
       </w:r>
       <w:r>
-        <w:t xml:space="preserve">se han intercambiado datos de posición. Para esto último es importante, al momento de determinar el algoritmo de cálculo a </w:t>
-      </w:r>
-      <w:r>
-        <w:lastRenderedPageBreak/>
-        <w:t xml:space="preserve">emplear, que en el cálculo no sólo participe el contenido del atributo sino también la posición del carácter y la posición del atributo dentro de la entidad.  </w:t>
+        <w:t xml:space="preserve">se han intercambiado datos de posición. Para esto último es importante, al momento de determinar el algoritmo de cálculo a emplear, que en el cálculo no sólo participe el contenido del atributo sino también la posición del carácter y la posición del atributo dentro de la entidad.  </w:t>
       </w:r>
     </w:p>
     <w:p>
@@ -23985,8 +24053,8 @@
     </w:p>
     <w:p/>
     <w:sectPr>
-      <w:headerReference w:type="default" r:id="rId44"/>
-      <w:footerReference w:type="default" r:id="rId45"/>
+      <w:headerReference w:type="default" r:id="rId46"/>
+      <w:footerReference w:type="default" r:id="rId47"/>
       <w:pgSz w:w="11906" w:h="16838"/>
       <w:pgMar w:top="1417" w:right="1701" w:bottom="1417" w:left="1701" w:header="708" w:footer="708" w:gutter="0"/>
       <w:pgNumType w:start="1"/>
@@ -29072,28 +29140,28 @@
 </file>
 
 <file path=customXml/item1.xml><?xml version="1.0" encoding="utf-8"?>
-<b:Sources xmlns:b="http://schemas.openxmlformats.org/officeDocument/2006/bibliography" xmlns="http://schemas.openxmlformats.org/officeDocument/2006/bibliography" SelectedStyle="\APASixthEditionOfficeOnline.xsl" StyleName="APA" Version="6"/>
-</file>
-
-<file path=customXml/item2.xml><?xml version="1.0" encoding="utf-8"?>
 <go:gDocsCustomXmlDataStorage xmlns:go="http://customooxmlschemas.google.com/" xmlns:r="http://schemas.openxmlformats.org/officeDocument/2006/relationships" uri="GoogleDocsCustomDataVersion2">
   <go:docsCustomData xmlns:go="http://customooxmlschemas.google.com/" roundtripDataSignature="AMtx7mg9ViIy0TFX1PbiokUHW0+gEHD0DQ==">CgMxLjAyDmgueXB0b3ptdnN5YWhpMg5oLjMwMTZ1a3NyeWs5OTIOaC41dHdvajgxajFna2EyDmguajh3ZGR4ZWVnZ3R3Mg5oLmJneml2aG00bzdoYzIOaC5qOTJ5aWxicjl6dDcyDmgubjRpdXVhbG9heDc2Mg5oLjFpNzZ2NHk0NXc5OTIOaC5oaHFvaTRybTJzYjEyDmgubGF1ZXZ5aGhzMG5uMg5oLjI5Nmd4eXhiYnYwbTgAciExNlVkVkNiWlZIdUNvcHFuMnNIenVkMWZoTjV5TjIzLW4=</go:docsCustomData>
 </go:gDocsCustomXmlDataStorage>
 </file>
 
-<file path=customXml/itemProps1.xml><?xml version="1.0" encoding="utf-8"?>
-<ds:datastoreItem xmlns:ds="http://schemas.openxmlformats.org/officeDocument/2006/customXml" ds:itemID="{98C402C2-0B0B-45E1-8B8A-FD895BAD112E}">
-  <ds:schemaRefs>
-    <ds:schemaRef ds:uri="http://schemas.openxmlformats.org/officeDocument/2006/bibliography"/>
-  </ds:schemaRefs>
-</ds:datastoreItem>
+<file path=customXml/item2.xml><?xml version="1.0" encoding="utf-8"?>
+<b:Sources xmlns:b="http://schemas.openxmlformats.org/officeDocument/2006/bibliography" xmlns="http://schemas.openxmlformats.org/officeDocument/2006/bibliography" SelectedStyle="\APASixthEditionOfficeOnline.xsl" StyleName="APA" Version="6"/>
 </file>
 
-<file path=customXml/itemProps2.xml><?xml version="1.0" encoding="utf-8"?>
+<file path=customXml/itemProps1.xml><?xml version="1.0" encoding="utf-8"?>
 <ds:datastoreItem xmlns:ds="http://schemas.openxmlformats.org/officeDocument/2006/customXml" ds:itemID="{11111111-1234-1234-1234-123412341234}">
   <ds:schemaRefs>
     <ds:schemaRef ds:uri="http://customooxmlschemas.google.com/"/>
     <ds:schemaRef ds:uri="http://schemas.openxmlformats.org/officeDocument/2006/relationships"/>
   </ds:schemaRefs>
 </ds:datastoreItem>
+</file>
+
+<file path=customXml/itemProps2.xml><?xml version="1.0" encoding="utf-8"?>
+<ds:datastoreItem xmlns:ds="http://schemas.openxmlformats.org/officeDocument/2006/customXml" ds:itemID="{98C402C2-0B0B-45E1-8B8A-FD895BAD112E}">
+  <ds:schemaRefs>
+    <ds:schemaRef ds:uri="http://schemas.openxmlformats.org/officeDocument/2006/bibliography"/>
+  </ds:schemaRefs>
+</ds:datastoreItem>
 </file>
</xml_diff>

<commit_message>
Digito Verificador (Sin restore)
Implementación de DV, que al cambiar algo de un campo de un fila de Producto al cliente ingresar, previo al login en pantalla mostrara un cartel de "aviso"
</commit_message>
<xml_diff>
--- a/Documentación/ProyectoIS 2026 CAJAL-FERNANDEZ_2daEntrega.docx
+++ b/Documentación/ProyectoIS 2026 CAJAL-FERNANDEZ_2daEntrega.docx
@@ -8303,17 +8303,8 @@
           <w:rFonts w:ascii="Times New Roman" w:eastAsia="Times New Roman" w:hAnsi="Times New Roman" w:cs="Times New Roman"/>
           <w:color w:val="000000"/>
         </w:rPr>
-        <w:t>Registro/</w:t>
-      </w:r>
-      <w:proofErr w:type="spellStart"/>
-      <w:r>
-        <w:rPr>
-          <w:rFonts w:ascii="Times New Roman" w:eastAsia="Times New Roman" w:hAnsi="Times New Roman" w:cs="Times New Roman"/>
-          <w:color w:val="000000"/>
-        </w:rPr>
-        <w:t>LogIn-Out</w:t>
-      </w:r>
-      <w:proofErr w:type="spellEnd"/>
+        <w:t>Registro/LogIn-Out</w:t>
+      </w:r>
       <w:r>
         <w:rPr>
           <w:rFonts w:ascii="Times New Roman" w:eastAsia="Times New Roman" w:hAnsi="Times New Roman" w:cs="Times New Roman"/>
@@ -8772,14 +8763,12 @@
                 <w:rFonts w:ascii="Times New Roman" w:hAnsi="Times New Roman" w:cs="Times New Roman"/>
               </w:rPr>
             </w:pPr>
-            <w:proofErr w:type="spellStart"/>
             <w:r>
               <w:rPr>
                 <w:rFonts w:ascii="Times New Roman" w:hAnsi="Times New Roman" w:cs="Times New Roman"/>
               </w:rPr>
               <w:t>BackUp</w:t>
             </w:r>
-            <w:proofErr w:type="spellEnd"/>
           </w:p>
         </w:tc>
       </w:tr>
@@ -9522,10 +9511,10 @@
           <w:noProof/>
         </w:rPr>
         <w:drawing>
-          <wp:inline distT="0" distB="0" distL="0" distR="0" wp14:anchorId="1391F0C4" wp14:editId="414C13FF">
-            <wp:extent cx="6096000" cy="3017176"/>
-            <wp:effectExtent l="0" t="0" r="0" b="0"/>
-            <wp:docPr id="937830118" name="Imagen 2"/>
+          <wp:inline distT="0" distB="0" distL="0" distR="0" wp14:anchorId="0EF06E63" wp14:editId="7462C8A8">
+            <wp:extent cx="6412276" cy="2811780"/>
+            <wp:effectExtent l="0" t="0" r="7620" b="7620"/>
+            <wp:docPr id="1613823052" name="Imagen 1"/>
             <wp:cNvGraphicFramePr>
               <a:graphicFrameLocks xmlns:a="http://schemas.openxmlformats.org/drawingml/2006/main" noChangeAspect="1"/>
             </wp:cNvGraphicFramePr>
@@ -9533,7 +9522,7 @@
               <a:graphicData uri="http://schemas.openxmlformats.org/drawingml/2006/picture">
                 <pic:pic xmlns:pic="http://schemas.openxmlformats.org/drawingml/2006/picture">
                   <pic:nvPicPr>
-                    <pic:cNvPr id="0" name="Picture 2"/>
+                    <pic:cNvPr id="0" name="Picture 1"/>
                     <pic:cNvPicPr>
                       <a:picLocks noChangeAspect="1" noChangeArrowheads="1"/>
                     </pic:cNvPicPr>
@@ -9554,7 +9543,7 @@
                   <pic:spPr bwMode="auto">
                     <a:xfrm>
                       <a:off x="0" y="0"/>
-                      <a:ext cx="6098613" cy="3018469"/>
+                      <a:ext cx="6418311" cy="2814426"/>
                     </a:xfrm>
                     <a:prstGeom prst="rect">
                       <a:avLst/>
@@ -10262,23 +10251,7 @@
           <w:rFonts w:ascii="Times New Roman" w:eastAsia="Times New Roman" w:hAnsi="Times New Roman" w:cs="Times New Roman"/>
           <w:color w:val="000000"/>
         </w:rPr>
-        <w:t xml:space="preserve"> Al iniciar el sistema, se carga la interfaz de </w:t>
-      </w:r>
-      <w:proofErr w:type="spellStart"/>
-      <w:r>
-        <w:rPr>
-          <w:rFonts w:ascii="Times New Roman" w:eastAsia="Times New Roman" w:hAnsi="Times New Roman" w:cs="Times New Roman"/>
-          <w:color w:val="000000"/>
-        </w:rPr>
-        <w:t>LogIn</w:t>
-      </w:r>
-      <w:proofErr w:type="spellEnd"/>
-      <w:r>
-        <w:rPr>
-          <w:rFonts w:ascii="Times New Roman" w:eastAsia="Times New Roman" w:hAnsi="Times New Roman" w:cs="Times New Roman"/>
-          <w:color w:val="000000"/>
-        </w:rPr>
-        <w:t xml:space="preserve"> y se presenta al usuario como pantalla principal. En esta etapa no hay ninguna sesión activa ni conexión abierta con la base de datos. Por el momento no se realiza ninguna validación de permisos hasta que el usuario intenta autenticarse. Este enfoque busca minimizar el uso de recursos y mantener la seguridad hasta que se confirme la identidad del usuario. </w:t>
+        <w:t xml:space="preserve"> Al iniciar el sistema, se carga la interfaz de LogIn y se presenta al usuario como pantalla principal. En esta etapa no hay ninguna sesión activa ni conexión abierta con la base de datos. Por el momento no se realiza ninguna validación de permisos hasta que el usuario intenta autenticarse. Este enfoque busca minimizar el uso de recursos y mantener la seguridad hasta que se confirme la identidad del usuario. </w:t>
       </w:r>
     </w:p>
     <w:p>
@@ -10526,55 +10499,7 @@
           <w:rFonts w:ascii="Times New Roman" w:eastAsia="Times New Roman" w:hAnsi="Times New Roman" w:cs="Times New Roman"/>
           <w:color w:val="000000"/>
         </w:rPr>
-        <w:t xml:space="preserve">A su vez en la pantalla del </w:t>
-      </w:r>
-      <w:proofErr w:type="spellStart"/>
-      <w:r>
-        <w:rPr>
-          <w:rFonts w:ascii="Times New Roman" w:eastAsia="Times New Roman" w:hAnsi="Times New Roman" w:cs="Times New Roman"/>
-          <w:color w:val="000000"/>
-        </w:rPr>
-        <w:t>LogIn</w:t>
-      </w:r>
-      <w:proofErr w:type="spellEnd"/>
-      <w:r>
-        <w:rPr>
-          <w:rFonts w:ascii="Times New Roman" w:eastAsia="Times New Roman" w:hAnsi="Times New Roman" w:cs="Times New Roman"/>
-          <w:color w:val="000000"/>
-        </w:rPr>
-        <w:t xml:space="preserve"> presentamos un botón “mostrar” para que si el usuario quiere revisar la contraseña ingresada antes de presionar el botón </w:t>
-      </w:r>
-      <w:proofErr w:type="spellStart"/>
-      <w:r>
-        <w:rPr>
-          <w:rFonts w:ascii="Times New Roman" w:eastAsia="Times New Roman" w:hAnsi="Times New Roman" w:cs="Times New Roman"/>
-          <w:color w:val="000000"/>
-        </w:rPr>
-        <w:t>LogIn</w:t>
-      </w:r>
-      <w:proofErr w:type="spellEnd"/>
-      <w:r>
-        <w:rPr>
-          <w:rFonts w:ascii="Times New Roman" w:eastAsia="Times New Roman" w:hAnsi="Times New Roman" w:cs="Times New Roman"/>
-          <w:color w:val="000000"/>
-        </w:rPr>
-        <w:t xml:space="preserve"> pueda hacerlo. Para ello debemos setear la propiedad </w:t>
-      </w:r>
-      <w:proofErr w:type="spellStart"/>
-      <w:r>
-        <w:rPr>
-          <w:rFonts w:ascii="Times New Roman" w:eastAsia="Times New Roman" w:hAnsi="Times New Roman" w:cs="Times New Roman"/>
-          <w:color w:val="000000"/>
-        </w:rPr>
-        <w:t>PasswordChar</w:t>
-      </w:r>
-      <w:proofErr w:type="spellEnd"/>
-      <w:r>
-        <w:rPr>
-          <w:rFonts w:ascii="Times New Roman" w:eastAsia="Times New Roman" w:hAnsi="Times New Roman" w:cs="Times New Roman"/>
-          <w:color w:val="000000"/>
-        </w:rPr>
-        <w:t xml:space="preserve"> del TextBox en donde el usuario ingresa la contraseña como “*” por default.</w:t>
+        <w:t>A su vez en la pantalla del LogIn presentamos un botón “mostrar” para que si el usuario quiere revisar la contraseña ingresada antes de presionar el botón LogIn pueda hacerlo. Para ello debemos setear la propiedad PasswordChar del TextBox en donde el usuario ingresa la contraseña como “*” por default.</w:t>
       </w:r>
     </w:p>
     <w:p>
@@ -10645,27 +10570,7 @@
           <w:bCs/>
           <w:color w:val="000000"/>
         </w:rPr>
-        <w:t>Proceso de Log-</w:t>
-      </w:r>
-      <w:proofErr w:type="spellStart"/>
-      <w:r>
-        <w:rPr>
-          <w:rFonts w:ascii="Times New Roman" w:eastAsia="Times New Roman" w:hAnsi="Times New Roman" w:cs="Times New Roman"/>
-          <w:b/>
-          <w:bCs/>
-          <w:color w:val="000000"/>
-        </w:rPr>
-        <w:t>Out</w:t>
-      </w:r>
-      <w:proofErr w:type="spellEnd"/>
-      <w:r>
-        <w:rPr>
-          <w:rFonts w:ascii="Times New Roman" w:eastAsia="Times New Roman" w:hAnsi="Times New Roman" w:cs="Times New Roman"/>
-          <w:b/>
-          <w:bCs/>
-          <w:color w:val="000000"/>
-        </w:rPr>
-        <w:t>:</w:t>
+        <w:t>Proceso de Log-Out:</w:t>
       </w:r>
       <w:r>
         <w:rPr>
@@ -10693,37 +10598,9 @@
           <w:szCs w:val="30"/>
         </w:rPr>
         <w:lastRenderedPageBreak/>
-        <w:t xml:space="preserve">2.3 </w:t>
-      </w:r>
-      <w:proofErr w:type="spellStart"/>
-      <w:r>
-        <w:rPr>
-          <w:rFonts w:ascii="Times New Roman" w:eastAsia="Times New Roman" w:hAnsi="Times New Roman" w:cs="Times New Roman"/>
-          <w:sz w:val="30"/>
-          <w:szCs w:val="30"/>
-        </w:rPr>
-        <w:t>LogIn</w:t>
-      </w:r>
-      <w:proofErr w:type="spellEnd"/>
-      <w:r>
-        <w:rPr>
-          <w:rFonts w:ascii="Times New Roman" w:eastAsia="Times New Roman" w:hAnsi="Times New Roman" w:cs="Times New Roman"/>
-          <w:sz w:val="30"/>
-          <w:szCs w:val="30"/>
-        </w:rPr>
-        <w:t xml:space="preserve"> – CU001 </w:t>
-      </w:r>
-      <w:proofErr w:type="spellStart"/>
-      <w:r>
-        <w:rPr>
-          <w:rFonts w:ascii="Times New Roman" w:eastAsia="Times New Roman" w:hAnsi="Times New Roman" w:cs="Times New Roman"/>
-          <w:sz w:val="30"/>
-          <w:szCs w:val="30"/>
-        </w:rPr>
-        <w:t>LogIn</w:t>
+        <w:t>2.3 LogIn – CU001 LogIn</w:t>
       </w:r>
       <w:bookmarkEnd w:id="23"/>
-      <w:proofErr w:type="spellEnd"/>
     </w:p>
     <w:p>
       <w:pPr>
@@ -10749,14 +10626,7 @@
         <w:rPr>
           <w:rFonts w:ascii="Times New Roman" w:eastAsia="Times New Roman" w:hAnsi="Times New Roman" w:cs="Times New Roman"/>
         </w:rPr>
-        <w:t xml:space="preserve"> Diagrama </w:t>
-      </w:r>
-      <w:proofErr w:type="spellStart"/>
-      <w:r>
-        <w:rPr>
-          <w:rFonts w:ascii="Times New Roman" w:eastAsia="Times New Roman" w:hAnsi="Times New Roman" w:cs="Times New Roman"/>
-        </w:rPr>
-        <w:t>LogI</w:t>
+        <w:t xml:space="preserve"> Diagrama LogI</w:t>
       </w:r>
       <w:r>
         <w:rPr>
@@ -10765,7 +10635,6 @@
         <w:t>n</w:t>
       </w:r>
       <w:bookmarkEnd w:id="24"/>
-      <w:proofErr w:type="spellEnd"/>
     </w:p>
     <w:p>
       <w:pPr>
@@ -10908,17 +10777,8 @@
                 <w:rFonts w:ascii="Times New Roman" w:eastAsia="Times New Roman" w:hAnsi="Times New Roman" w:cs="Times New Roman"/>
                 <w:color w:val="000000"/>
               </w:rPr>
-              <w:t xml:space="preserve">CU 001 – </w:t>
-            </w:r>
-            <w:proofErr w:type="spellStart"/>
-            <w:r>
-              <w:rPr>
-                <w:rFonts w:ascii="Times New Roman" w:eastAsia="Times New Roman" w:hAnsi="Times New Roman" w:cs="Times New Roman"/>
-                <w:color w:val="000000"/>
-              </w:rPr>
-              <w:t>LogIn</w:t>
-            </w:r>
-            <w:proofErr w:type="spellEnd"/>
+              <w:t>CU 001 – LogIn</w:t>
+            </w:r>
             <w:r>
               <w:rPr>
                 <w:rFonts w:ascii="Times New Roman" w:eastAsia="Times New Roman" w:hAnsi="Times New Roman" w:cs="Times New Roman"/>
@@ -11333,27 +11193,7 @@
                 <w:sz w:val="22"/>
                 <w:szCs w:val="22"/>
               </w:rPr>
-              <w:t>El usuario ingresa al sistema y se le presenta la pantalla principal del mismo “</w:t>
-            </w:r>
-            <w:proofErr w:type="spellStart"/>
-            <w:r>
-              <w:rPr>
-                <w:rFonts w:ascii="Times New Roman" w:eastAsia="Times New Roman" w:hAnsi="Times New Roman" w:cs="Times New Roman"/>
-                <w:color w:val="000000"/>
-                <w:sz w:val="22"/>
-                <w:szCs w:val="22"/>
-              </w:rPr>
-              <w:t>LogIn</w:t>
-            </w:r>
-            <w:proofErr w:type="spellEnd"/>
-            <w:r>
-              <w:rPr>
-                <w:rFonts w:ascii="Times New Roman" w:eastAsia="Times New Roman" w:hAnsi="Times New Roman" w:cs="Times New Roman"/>
-                <w:color w:val="000000"/>
-                <w:sz w:val="22"/>
-                <w:szCs w:val="22"/>
-              </w:rPr>
-              <w:t>”.</w:t>
+              <w:t>El usuario ingresa al sistema y se le presenta la pantalla principal del mismo “LogIn”.</w:t>
             </w:r>
           </w:p>
           <w:p>
@@ -11949,23 +11789,7 @@
                 <w:rFonts w:ascii="Times New Roman" w:eastAsia="Times New Roman" w:hAnsi="Times New Roman" w:cs="Times New Roman"/>
                 <w:color w:val="000000"/>
               </w:rPr>
-              <w:t xml:space="preserve">El usuario queda autenticado en el sistema e inicia su sesión, se registran los permisos </w:t>
-            </w:r>
-            <w:proofErr w:type="gramStart"/>
-            <w:r>
-              <w:rPr>
-                <w:rFonts w:ascii="Times New Roman" w:eastAsia="Times New Roman" w:hAnsi="Times New Roman" w:cs="Times New Roman"/>
-                <w:color w:val="000000"/>
-              </w:rPr>
-              <w:t>del mismo</w:t>
-            </w:r>
-            <w:proofErr w:type="gramEnd"/>
-            <w:r>
-              <w:rPr>
-                <w:rFonts w:ascii="Times New Roman" w:eastAsia="Times New Roman" w:hAnsi="Times New Roman" w:cs="Times New Roman"/>
-                <w:color w:val="000000"/>
-              </w:rPr>
-              <w:t>.</w:t>
+              <w:t>El usuario queda autenticado en el sistema e inicia su sesión, se registran los permisos del mismo.</w:t>
             </w:r>
           </w:p>
         </w:tc>
@@ -13535,10 +13359,10 @@
           <w:color w:val="000000"/>
         </w:rPr>
         <w:drawing>
-          <wp:inline distT="0" distB="0" distL="0" distR="0" wp14:anchorId="08DE1210" wp14:editId="4E58B335">
-            <wp:extent cx="5400040" cy="3225800"/>
-            <wp:effectExtent l="0" t="0" r="0" b="0"/>
-            <wp:docPr id="239392437" name="Imagen 1"/>
+          <wp:inline distT="0" distB="0" distL="0" distR="0" wp14:anchorId="467D919B" wp14:editId="2FDB578B">
+            <wp:extent cx="5981700" cy="3618985"/>
+            <wp:effectExtent l="0" t="0" r="0" b="635"/>
+            <wp:docPr id="2057473190" name="Imagen 1"/>
             <wp:cNvGraphicFramePr>
               <a:graphicFrameLocks xmlns:a="http://schemas.openxmlformats.org/drawingml/2006/main" noChangeAspect="1"/>
             </wp:cNvGraphicFramePr>
@@ -13546,7 +13370,7 @@
               <a:graphicData uri="http://schemas.openxmlformats.org/drawingml/2006/picture">
                 <pic:pic xmlns:pic="http://schemas.openxmlformats.org/drawingml/2006/picture">
                   <pic:nvPicPr>
-                    <pic:cNvPr id="239392437" name=""/>
+                    <pic:cNvPr id="2057473190" name=""/>
                     <pic:cNvPicPr/>
                   </pic:nvPicPr>
                   <pic:blipFill>
@@ -13558,7 +13382,7 @@
                   <pic:spPr>
                     <a:xfrm>
                       <a:off x="0" y="0"/>
-                      <a:ext cx="5400040" cy="3225800"/>
+                      <a:ext cx="5986216" cy="3621717"/>
                     </a:xfrm>
                     <a:prstGeom prst="rect">
                       <a:avLst/>
@@ -17411,21 +17235,7 @@
         <w:rPr>
           <w:rFonts w:ascii="Times New Roman" w:hAnsi="Times New Roman" w:cs="Times New Roman"/>
         </w:rPr>
-        <w:t xml:space="preserve">La utilización de la bitácora nos permite llevar un registro de las acciones realizadas dentro del sistema por parte de un usuario </w:t>
-      </w:r>
-      <w:proofErr w:type="gramStart"/>
-      <w:r>
-        <w:rPr>
-          <w:rFonts w:ascii="Times New Roman" w:hAnsi="Times New Roman" w:cs="Times New Roman"/>
-        </w:rPr>
-        <w:t>del mismo</w:t>
-      </w:r>
-      <w:proofErr w:type="gramEnd"/>
-      <w:r>
-        <w:rPr>
-          <w:rFonts w:ascii="Times New Roman" w:hAnsi="Times New Roman" w:cs="Times New Roman"/>
-        </w:rPr>
-        <w:t xml:space="preserve">. Cada evento registrado en la </w:t>
+        <w:t xml:space="preserve">La utilización de la bitácora nos permite llevar un registro de las acciones realizadas dentro del sistema por parte de un usuario del mismo. Cada evento registrado en la </w:t>
       </w:r>
       <w:r>
         <w:rPr>
@@ -17504,21 +17314,7 @@
         <w:rPr>
           <w:rFonts w:ascii="Times New Roman" w:hAnsi="Times New Roman" w:cs="Times New Roman"/>
         </w:rPr>
-        <w:t>Información asociada: Leyenda del hecho (Ej: El usuario “x</w:t>
-      </w:r>
-      <w:proofErr w:type="gramStart"/>
-      <w:r>
-        <w:rPr>
-          <w:rFonts w:ascii="Times New Roman" w:hAnsi="Times New Roman" w:cs="Times New Roman"/>
-        </w:rPr>
-        <w:t>”….</w:t>
-      </w:r>
-      <w:proofErr w:type="gramEnd"/>
-      <w:r>
-        <w:rPr>
-          <w:rFonts w:ascii="Times New Roman" w:hAnsi="Times New Roman" w:cs="Times New Roman"/>
-        </w:rPr>
-        <w:t>. tal actividad)</w:t>
+        <w:t>Información asociada: Leyenda del hecho (Ej: El usuario “x”….. tal actividad)</w:t>
       </w:r>
     </w:p>
     <w:p>
@@ -18016,21 +17812,7 @@
         <w:rPr>
           <w:rFonts w:ascii="Times New Roman" w:hAnsi="Times New Roman" w:cs="Times New Roman"/>
         </w:rPr>
-        <w:t xml:space="preserve">Con el objetivo de garantizar la seguridad de las contraseñas de los usuarios, en este proyecto se aplica el algoritmo SHA-256, encargado de transformar una cadena de texto en un valor de longitud determinado, denominado "hash". Este es un algoritmo de </w:t>
-      </w:r>
-      <w:proofErr w:type="spellStart"/>
-      <w:r>
-        <w:rPr>
-          <w:rFonts w:ascii="Times New Roman" w:hAnsi="Times New Roman" w:cs="Times New Roman"/>
-        </w:rPr>
-        <w:t>hashing</w:t>
-      </w:r>
-      <w:proofErr w:type="spellEnd"/>
-      <w:r>
-        <w:rPr>
-          <w:rFonts w:ascii="Times New Roman" w:hAnsi="Times New Roman" w:cs="Times New Roman"/>
-        </w:rPr>
-        <w:t xml:space="preserve"> unidireccional, lo que significa que no es posible desencriptar el hash para obtener la contraseña original. </w:t>
+        <w:t xml:space="preserve">Con el objetivo de garantizar la seguridad de las contraseñas de los usuarios, en este proyecto se aplica el algoritmo SHA-256, encargado de transformar una cadena de texto en un valor de longitud determinado, denominado "hash". Este es un algoritmo de hashing unidireccional, lo que significa que no es posible desencriptar el hash para obtener la contraseña original. </w:t>
       </w:r>
     </w:p>
     <w:p>
@@ -18043,35 +17825,7 @@
         <w:rPr>
           <w:rFonts w:ascii="Times New Roman" w:hAnsi="Times New Roman" w:cs="Times New Roman"/>
         </w:rPr>
-        <w:t xml:space="preserve">Tanto para la creación de usuarios como para el logueo en el sistema de estos mismos, se deberá ingresar una clave. Esta clave será </w:t>
-      </w:r>
-      <w:proofErr w:type="spellStart"/>
-      <w:r>
-        <w:rPr>
-          <w:rFonts w:ascii="Times New Roman" w:hAnsi="Times New Roman" w:cs="Times New Roman"/>
-        </w:rPr>
-        <w:t>hasheada</w:t>
-      </w:r>
-      <w:proofErr w:type="spellEnd"/>
-      <w:r>
-        <w:rPr>
-          <w:rFonts w:ascii="Times New Roman" w:hAnsi="Times New Roman" w:cs="Times New Roman"/>
-        </w:rPr>
-        <w:t xml:space="preserve"> por el algoritmo SHA-256 y será guardada en la base de datos. Un usuario que requiera iniciar sesión deberá ingresar su clave, en la interfaz de Inicio de sesión, el valor que coloque como clave, al seleccionar “Iniciar Sesión” será </w:t>
-      </w:r>
-      <w:proofErr w:type="spellStart"/>
-      <w:r>
-        <w:rPr>
-          <w:rFonts w:ascii="Times New Roman" w:hAnsi="Times New Roman" w:cs="Times New Roman"/>
-        </w:rPr>
-        <w:t>hasheado</w:t>
-      </w:r>
-      <w:proofErr w:type="spellEnd"/>
-      <w:r>
-        <w:rPr>
-          <w:rFonts w:ascii="Times New Roman" w:hAnsi="Times New Roman" w:cs="Times New Roman"/>
-        </w:rPr>
-        <w:t xml:space="preserve"> y comparado con el valor que se encuentre en la base de datos. Si estos valores coinciden, la sesión es iniciada, en el caso contrario donde no coincidan, se mostrará al usuario un error de contraseña incorrecta. </w:t>
+        <w:t xml:space="preserve">Tanto para la creación de usuarios como para el logueo en el sistema de estos mismos, se deberá ingresar una clave. Esta clave será hasheada por el algoritmo SHA-256 y será guardada en la base de datos. Un usuario que requiera iniciar sesión deberá ingresar su clave, en la interfaz de Inicio de sesión, el valor que coloque como clave, al seleccionar “Iniciar Sesión” será hasheado y comparado con el valor que se encuentre en la base de datos. Si estos valores coinciden, la sesión es iniciada, en el caso contrario donde no coincidan, se mostrará al usuario un error de contraseña incorrecta. </w:t>
       </w:r>
     </w:p>
     <w:p>
@@ -18093,25 +17847,7 @@
           <w:b/>
           <w:bCs/>
         </w:rPr>
-        <w:t xml:space="preserve">Método de la clase </w:t>
-      </w:r>
-      <w:proofErr w:type="spellStart"/>
-      <w:r>
-        <w:rPr>
-          <w:rFonts w:ascii="Times New Roman" w:hAnsi="Times New Roman" w:cs="Times New Roman"/>
-          <w:b/>
-          <w:bCs/>
-        </w:rPr>
-        <w:t>Encriptador</w:t>
-      </w:r>
-      <w:proofErr w:type="spellEnd"/>
-      <w:r>
-        <w:rPr>
-          <w:rFonts w:ascii="Times New Roman" w:hAnsi="Times New Roman" w:cs="Times New Roman"/>
-          <w:b/>
-          <w:bCs/>
-        </w:rPr>
-        <w:t xml:space="preserve">: </w:t>
+        <w:t xml:space="preserve">Método de la clase Encriptador: </w:t>
       </w:r>
     </w:p>
     <w:p>
@@ -18124,21 +17860,7 @@
         <w:rPr>
           <w:rFonts w:ascii="Times New Roman" w:hAnsi="Times New Roman" w:cs="Times New Roman"/>
         </w:rPr>
-        <w:t>Hash (</w:t>
-      </w:r>
-      <w:proofErr w:type="spellStart"/>
-      <w:r>
-        <w:rPr>
-          <w:rFonts w:ascii="Times New Roman" w:hAnsi="Times New Roman" w:cs="Times New Roman"/>
-        </w:rPr>
-        <w:t>string</w:t>
-      </w:r>
-      <w:proofErr w:type="spellEnd"/>
-      <w:r>
-        <w:rPr>
-          <w:rFonts w:ascii="Times New Roman" w:hAnsi="Times New Roman" w:cs="Times New Roman"/>
-        </w:rPr>
-        <w:t xml:space="preserve"> input): Este método toma una cadena de texto (como una contraseña en texto plano) y la convierte en un hash de 256 bits utilizando el algoritmo SHA-256. </w:t>
+        <w:t xml:space="preserve">Hash (string input): Este método toma una cadena de texto (como una contraseña en texto plano) y la convierte en un hash de 256 bits utilizando el algoritmo SHA-256. </w:t>
       </w:r>
     </w:p>
     <w:p>
@@ -19238,6 +18960,7 @@
                 <w:bCs/>
                 <w:color w:val="000000"/>
               </w:rPr>
+              <w:lastRenderedPageBreak/>
               <w:t xml:space="preserve">PUNTOS DE EXTENSIÓN: </w:t>
             </w:r>
             <w:r>
@@ -22574,173 +22297,140 @@
     </w:p>
     <w:p>
       <w:r>
-        <w:t>La función de los dígitos verificadores es la de permitir comprobar la integridad de los datos almacenados en la base de datos. Se desea poder detectar dos cosas</w:t>
-      </w:r>
-      <w:r>
-        <w:t>:</w:t>
+        <w:t>Se implementó un mecanismo de dígitos verificadores (DVH y DVV) sobre la tabla PRODUCTO utilizando el algoritmo SHA-256.</w:t>
       </w:r>
     </w:p>
     <w:p>
-      <w:pPr>
-        <w:pStyle w:val="Prrafodelista"/>
-        <w:numPr>
-          <w:ilvl w:val="1"/>
-          <w:numId w:val="11"/>
-        </w:numPr>
-      </w:pPr>
       <w:r>
         <w:lastRenderedPageBreak/>
-        <w:t>S</w:t>
-      </w:r>
-      <w:r>
-        <w:t>i se han agregado o quitado datos de la base de datos por fuera del sistema</w:t>
-      </w:r>
-      <w:r>
-        <w:t>.</w:t>
+        <w:t xml:space="preserve">El </w:t>
+      </w:r>
+      <w:r>
+        <w:rPr>
+          <w:b/>
+          <w:bCs/>
+        </w:rPr>
+        <w:t>DVH</w:t>
+      </w:r>
+      <w:r>
+        <w:t xml:space="preserve"> (Dígito Verificador Horizontal) se calcula por fila. El algoritmo realiza una suma ponderada donde cada carácter de cada</w:t>
+      </w:r>
+      <w:r>
+        <w:t xml:space="preserve"> </w:t>
+      </w:r>
+      <w:r>
+        <w:t>atributo se multiplica por su posición dentro del valor y por la posición del atributo dentro de la entidad. Esto permite detectar no solo modificaciones en el contenido sino también intercambios de posición entre caracteres o atributos. Los atributos que participan en el cálculo son: NombreProducto, PrecioProducto, TipoProducto, Descripcion, Cantidad y CodigoProducto. El resultado de la suma se hashea con SHA-256 y se almacena en la columna DVH de la tabla PRODUCTO.</w:t>
       </w:r>
     </w:p>
     <w:p>
-      <w:pPr>
-        <w:pStyle w:val="Prrafodelista"/>
-        <w:numPr>
-          <w:ilvl w:val="1"/>
-          <w:numId w:val="11"/>
-        </w:numPr>
-      </w:pPr>
-      <w:r>
-        <w:t xml:space="preserve">Si </w:t>
-      </w:r>
-      <w:r>
-        <w:t xml:space="preserve">se han intercambiado datos de posición. Para esto último es importante, al momento de determinar el algoritmo de cálculo a emplear, que en el cálculo no sólo participe el contenido del atributo sino también la posición del carácter y la posición del atributo dentro de la entidad.  </w:t>
+      <w:r>
+        <w:t xml:space="preserve">El </w:t>
+      </w:r>
+      <w:r>
+        <w:rPr>
+          <w:b/>
+          <w:bCs/>
+        </w:rPr>
+        <w:t>DVV</w:t>
+      </w:r>
+      <w:r>
+        <w:t xml:space="preserve"> (Dígito Verificador Vertical) se calcula a partir de todos los DVH de la tabla, también mediante una suma ponderada que incluye la posición de cada fila. Esto permite detectar si se agregaron, eliminaron o reordenaron filas fuera del sistema. El DVV se almacena en la tabla DIGITO_VERIFICADOR.</w:t>
       </w:r>
     </w:p>
     <w:p>
-      <w:pPr>
-        <w:spacing w:after="3" w:line="257" w:lineRule="auto"/>
-        <w:ind w:right="76" w:hanging="10"/>
-        <w:jc w:val="both"/>
-      </w:pPr>
-      <w:r>
-        <w:t xml:space="preserve">Se implementó un </w:t>
-      </w:r>
-      <w:r>
-        <w:rPr>
-          <w:b/>
-          <w:bCs/>
-        </w:rPr>
-        <w:t>mecanismo de verificación de dígito</w:t>
-      </w:r>
-      <w:r>
-        <w:t xml:space="preserve"> (DVH y DVV) en la tabla </w:t>
-      </w:r>
-      <w:r>
-        <w:rPr>
-          <w:b/>
-          <w:bCs/>
-        </w:rPr>
-        <w:t>Producto</w:t>
-      </w:r>
-      <w:r>
-        <w:t xml:space="preserve">, utilizando el algoritmo de </w:t>
-      </w:r>
-      <w:r>
-        <w:rPr>
-          <w:b/>
-          <w:bCs/>
-        </w:rPr>
-        <w:t>hash SHA-256</w:t>
-      </w:r>
-      <w:r>
-        <w:t xml:space="preserve">. </w:t>
+      <w:r>
+        <w:t>Al iniciar la aplicación, antes de mostrar el login, se verifican ambos dígitos. En caso de error se informa al administrador y se ofrecen dos opciones: restaurar desde el último backup o recalcular los dígitos aceptando los datos actuales.</w:t>
       </w:r>
     </w:p>
     <w:p>
       <w:pPr>
-        <w:spacing w:after="239" w:line="257" w:lineRule="auto"/>
-        <w:ind w:right="76" w:hanging="10"/>
-        <w:jc w:val="both"/>
-      </w:pPr>
-      <w:r>
-        <w:t xml:space="preserve"> El propósito de esta técnica es </w:t>
-      </w:r>
-      <w:r>
-        <w:rPr>
-          <w:b/>
-          <w:bCs/>
-        </w:rPr>
-        <w:t>garantizar la integridad de los datos almacenados</w:t>
-      </w:r>
-      <w:r>
-        <w:t xml:space="preserve">, asegurando que los registros no hayan sido alterados de manera intencional o accidental. </w:t>
+        <w:pStyle w:val="Ttulo2"/>
+        <w:rPr>
+          <w:rFonts w:ascii="Times New Roman" w:eastAsia="Times New Roman" w:hAnsi="Times New Roman" w:cs="Times New Roman"/>
+          <w:sz w:val="30"/>
+          <w:szCs w:val="30"/>
+        </w:rPr>
+      </w:pPr>
+      <w:r>
+        <w:rPr>
+          <w:rFonts w:ascii="Times New Roman" w:eastAsia="Times New Roman" w:hAnsi="Times New Roman" w:cs="Times New Roman"/>
+          <w:sz w:val="30"/>
+          <w:szCs w:val="30"/>
+        </w:rPr>
+        <w:t>7.2 Diagrama de Clases</w:t>
       </w:r>
     </w:p>
     <w:p>
-      <w:pPr>
-        <w:spacing w:after="239" w:line="257" w:lineRule="auto"/>
-        <w:ind w:right="76" w:hanging="10"/>
-        <w:jc w:val="both"/>
-      </w:pPr>
-      <w:r>
-        <w:t xml:space="preserve">Cada registro de Producto posee un </w:t>
-      </w:r>
-      <w:r>
-        <w:rPr>
-          <w:b/>
-          <w:bCs/>
-        </w:rPr>
-        <w:t>DVH (Dígito Verificador Horizontal)</w:t>
-      </w:r>
-      <w:r>
-        <w:t xml:space="preserve"> calculado a partir de la concatenación de sus campos relevantes (</w:t>
-      </w:r>
-      <w:proofErr w:type="spellStart"/>
-      <w:r>
-        <w:t>IDProducto</w:t>
-      </w:r>
-      <w:proofErr w:type="spellEnd"/>
-      <w:r>
-        <w:t>, Nombre, Precio, Tipo, Descripción, Cantidad, Código)</w:t>
-      </w:r>
-      <w:r>
-        <w:rPr>
-          <w:rFonts w:ascii="Times New Roman" w:eastAsia="Times New Roman" w:hAnsi="Times New Roman" w:cs="Times New Roman"/>
-          <w:color w:val="000000"/>
-          <w:sz w:val="22"/>
-          <w:szCs w:val="22"/>
-        </w:rPr>
-        <w:t>.</w:t>
-      </w:r>
-      <w:r>
-        <w:t xml:space="preserve"> </w:t>
+      <w:r>
+        <w:rPr>
+          <w:noProof/>
+        </w:rPr>
+        <w:drawing>
+          <wp:inline distT="0" distB="0" distL="0" distR="0" wp14:anchorId="0B86411E" wp14:editId="230AF2CB">
+            <wp:extent cx="1744980" cy="1386840"/>
+            <wp:effectExtent l="0" t="0" r="7620" b="3810"/>
+            <wp:docPr id="1363515666" name="Imagen 2"/>
+            <wp:cNvGraphicFramePr>
+              <a:graphicFrameLocks xmlns:a="http://schemas.openxmlformats.org/drawingml/2006/main" noChangeAspect="1"/>
+            </wp:cNvGraphicFramePr>
+            <a:graphic xmlns:a="http://schemas.openxmlformats.org/drawingml/2006/main">
+              <a:graphicData uri="http://schemas.openxmlformats.org/drawingml/2006/picture">
+                <pic:pic xmlns:pic="http://schemas.openxmlformats.org/drawingml/2006/picture">
+                  <pic:nvPicPr>
+                    <pic:cNvPr id="0" name="Picture 2"/>
+                    <pic:cNvPicPr>
+                      <a:picLocks noChangeAspect="1" noChangeArrowheads="1"/>
+                    </pic:cNvPicPr>
+                  </pic:nvPicPr>
+                  <pic:blipFill>
+                    <a:blip r:embed="rId46">
+                      <a:extLst>
+                        <a:ext uri="{28A0092B-C50C-407E-A947-70E740481C1C}">
+                          <a14:useLocalDpi xmlns:a14="http://schemas.microsoft.com/office/drawing/2010/main" val="0"/>
+                        </a:ext>
+                      </a:extLst>
+                    </a:blip>
+                    <a:srcRect/>
+                    <a:stretch>
+                      <a:fillRect/>
+                    </a:stretch>
+                  </pic:blipFill>
+                  <pic:spPr bwMode="auto">
+                    <a:xfrm>
+                      <a:off x="0" y="0"/>
+                      <a:ext cx="1744980" cy="1386840"/>
+                    </a:xfrm>
+                    <a:prstGeom prst="rect">
+                      <a:avLst/>
+                    </a:prstGeom>
+                    <a:noFill/>
+                    <a:ln>
+                      <a:noFill/>
+                    </a:ln>
+                  </pic:spPr>
+                </pic:pic>
+              </a:graphicData>
+            </a:graphic>
+          </wp:inline>
+        </w:drawing>
       </w:r>
     </w:p>
     <w:p>
       <w:pPr>
-        <w:spacing w:after="298"/>
-        <w:ind w:hanging="10"/>
-      </w:pPr>
-      <w:r>
-        <w:t xml:space="preserve">El algoritmo </w:t>
-      </w:r>
-      <w:r>
-        <w:rPr>
-          <w:b/>
-          <w:bCs/>
-        </w:rPr>
-        <w:t>SHA-256</w:t>
-      </w:r>
-      <w:r>
-        <w:t xml:space="preserve"> fue seleccionado por su </w:t>
-      </w:r>
-      <w:r>
-        <w:rPr>
-          <w:b/>
-          <w:bCs/>
-        </w:rPr>
-        <w:t>mayor nivel de seguridad y resistencia a colisiones</w:t>
-      </w:r>
-      <w:r>
-        <w:t xml:space="preserve"> respecto a otros métodos como MD5, garantizando una protección más robusta ante manipulaciones no autorizadas de los datos. </w:t>
+        <w:pStyle w:val="Ttulo2"/>
+        <w:rPr>
+          <w:rFonts w:ascii="Times New Roman" w:eastAsia="Times New Roman" w:hAnsi="Times New Roman" w:cs="Times New Roman"/>
+          <w:sz w:val="30"/>
+          <w:szCs w:val="30"/>
+        </w:rPr>
+      </w:pPr>
+      <w:r>
+        <w:rPr>
+          <w:rFonts w:ascii="Times New Roman" w:eastAsia="Times New Roman" w:hAnsi="Times New Roman" w:cs="Times New Roman"/>
+          <w:sz w:val="30"/>
+          <w:szCs w:val="30"/>
+        </w:rPr>
+        <w:t>7.3 Der</w:t>
       </w:r>
     </w:p>
     <w:p>
@@ -22802,6 +22492,7 @@
         <w:rPr>
           <w:rFonts w:ascii="Times New Roman" w:hAnsi="Times New Roman" w:cs="Times New Roman"/>
         </w:rPr>
+        <w:lastRenderedPageBreak/>
         <w:t>Esto implica la capacidad de definir permisos atómicos (funcionalidades específicas) y de poder agrupar estos permisos en estructuras compuestas (roles o perfiles de usuario), los cuales pueden ser asignados a usuarios o anidados dentro de otros grupos de permisos. Se busca facilitar la gestión de acceso desde el propio sistema, garantizando que el acceso a las funcionalidades pueda adaptarse dinámicamente a las necesidades del negocio y a la jerarquía organizacional.</w:t>
       </w:r>
     </w:p>
@@ -22837,7 +22528,6 @@
           <w:b/>
           <w:bCs/>
         </w:rPr>
-        <w:lastRenderedPageBreak/>
         <w:t xml:space="preserve">Usuarios cargados en sistema </w:t>
       </w:r>
     </w:p>
@@ -22859,37 +22549,9 @@
         <w:rPr>
           <w:rFonts w:ascii="Times New Roman" w:hAnsi="Times New Roman" w:cs="Times New Roman"/>
         </w:rPr>
-        <w:t xml:space="preserve"> = Gerente (</w:t>
-      </w:r>
-      <w:proofErr w:type="spellStart"/>
-      <w:r>
-        <w:rPr>
-          <w:rFonts w:ascii="Times New Roman" w:hAnsi="Times New Roman" w:cs="Times New Roman"/>
-        </w:rPr>
-        <w:t>IdUsuario</w:t>
-      </w:r>
-      <w:proofErr w:type="spellEnd"/>
-      <w:r>
-        <w:rPr>
-          <w:rFonts w:ascii="Times New Roman" w:hAnsi="Times New Roman" w:cs="Times New Roman"/>
-        </w:rPr>
-        <w:t xml:space="preserve">, </w:t>
-      </w:r>
-      <w:proofErr w:type="spellStart"/>
-      <w:r>
-        <w:rPr>
-          <w:rFonts w:ascii="Times New Roman" w:hAnsi="Times New Roman" w:cs="Times New Roman"/>
-        </w:rPr>
-        <w:t>IdPermiso</w:t>
-      </w:r>
-      <w:proofErr w:type="spellEnd"/>
-      <w:r>
-        <w:rPr>
-          <w:rFonts w:ascii="Times New Roman" w:hAnsi="Times New Roman" w:cs="Times New Roman"/>
-        </w:rPr>
-        <w:t xml:space="preserve">) &gt;&gt; </w:t>
-      </w:r>
-      <w:hyperlink r:id="rId46" w:history="1">
+        <w:t xml:space="preserve"> = Gerente (IdUsuario, IdPermiso) &gt;&gt; </w:t>
+      </w:r>
+      <w:hyperlink r:id="rId47" w:history="1">
         <w:r>
           <w:rPr>
             <w:rStyle w:val="Hipervnculo"/>
@@ -22934,43 +22596,15 @@
         <w:rPr>
           <w:rFonts w:ascii="Times New Roman" w:hAnsi="Times New Roman" w:cs="Times New Roman"/>
         </w:rPr>
-        <w:t xml:space="preserve"> = Cliente (</w:t>
-      </w:r>
-      <w:proofErr w:type="spellStart"/>
+        <w:t xml:space="preserve"> = Cliente (IdUsuario, IdPermiso) &gt;&gt;</w:t>
+      </w:r>
       <w:r>
         <w:rPr>
           <w:rFonts w:ascii="Times New Roman" w:hAnsi="Times New Roman" w:cs="Times New Roman"/>
         </w:rPr>
-        <w:t>IdUsuario</w:t>
-      </w:r>
-      <w:proofErr w:type="spellEnd"/>
-      <w:r>
-        <w:rPr>
-          <w:rFonts w:ascii="Times New Roman" w:hAnsi="Times New Roman" w:cs="Times New Roman"/>
-        </w:rPr>
-        <w:t xml:space="preserve">, </w:t>
-      </w:r>
-      <w:proofErr w:type="spellStart"/>
-      <w:r>
-        <w:rPr>
-          <w:rFonts w:ascii="Times New Roman" w:hAnsi="Times New Roman" w:cs="Times New Roman"/>
-        </w:rPr>
-        <w:t>IdPermiso</w:t>
-      </w:r>
-      <w:proofErr w:type="spellEnd"/>
-      <w:r>
-        <w:rPr>
-          <w:rFonts w:ascii="Times New Roman" w:hAnsi="Times New Roman" w:cs="Times New Roman"/>
-        </w:rPr>
-        <w:t>) &gt;&gt;</w:t>
-      </w:r>
-      <w:r>
-        <w:rPr>
-          <w:rFonts w:ascii="Times New Roman" w:hAnsi="Times New Roman" w:cs="Times New Roman"/>
-        </w:rPr>
         <w:t xml:space="preserve"> </w:t>
       </w:r>
-      <w:hyperlink r:id="rId47" w:history="1">
+      <w:hyperlink r:id="rId48" w:history="1">
         <w:r>
           <w:rPr>
             <w:rStyle w:val="Hipervnculo"/>
@@ -22991,14 +22625,12 @@
         </w:rPr>
         <w:t xml:space="preserve">------- </w:t>
       </w:r>
-      <w:proofErr w:type="spellStart"/>
       <w:r>
         <w:rPr>
           <w:rFonts w:ascii="Times New Roman" w:hAnsi="Times New Roman" w:cs="Times New Roman"/>
         </w:rPr>
         <w:t>river</w:t>
       </w:r>
-      <w:proofErr w:type="spellEnd"/>
     </w:p>
     <w:p>
       <w:pPr>
@@ -23043,7 +22675,7 @@
                     </pic:cNvPicPr>
                   </pic:nvPicPr>
                   <pic:blipFill>
-                    <a:blip r:embed="rId48">
+                    <a:blip r:embed="rId49">
                       <a:extLst>
                         <a:ext uri="{28A0092B-C50C-407E-A947-70E740481C1C}">
                           <a14:useLocalDpi xmlns:a14="http://schemas.microsoft.com/office/drawing/2010/main" val="0"/>
@@ -23091,6 +22723,7 @@
           <w:sz w:val="30"/>
           <w:szCs w:val="30"/>
         </w:rPr>
+        <w:lastRenderedPageBreak/>
         <w:t>8.3 Der</w:t>
       </w:r>
       <w:bookmarkEnd w:id="86"/>
@@ -23101,9 +22734,9 @@
           <w:noProof/>
         </w:rPr>
         <w:drawing>
-          <wp:inline distT="0" distB="0" distL="0" distR="0" wp14:anchorId="66E358DC" wp14:editId="22B45F46">
-            <wp:extent cx="6271260" cy="3073684"/>
-            <wp:effectExtent l="0" t="0" r="0" b="0"/>
+          <wp:inline distT="0" distB="0" distL="0" distR="0" wp14:anchorId="66E358DC" wp14:editId="73311E97">
+            <wp:extent cx="6436518" cy="3154680"/>
+            <wp:effectExtent l="0" t="0" r="2540" b="7620"/>
             <wp:docPr id="1975951018" name="Imagen 2"/>
             <wp:cNvGraphicFramePr>
               <a:graphicFrameLocks xmlns:a="http://schemas.openxmlformats.org/drawingml/2006/main" noChangeAspect="1"/>
@@ -23118,7 +22751,7 @@
                     </pic:cNvPicPr>
                   </pic:nvPicPr>
                   <pic:blipFill>
-                    <a:blip r:embed="rId49">
+                    <a:blip r:embed="rId50">
                       <a:extLst>
                         <a:ext uri="{28A0092B-C50C-407E-A947-70E740481C1C}">
                           <a14:useLocalDpi xmlns:a14="http://schemas.microsoft.com/office/drawing/2010/main" val="0"/>
@@ -23133,7 +22766,7 @@
                   <pic:spPr bwMode="auto">
                     <a:xfrm>
                       <a:off x="0" y="0"/>
-                      <a:ext cx="6278594" cy="3077278"/>
+                      <a:ext cx="6447858" cy="3160238"/>
                     </a:xfrm>
                     <a:prstGeom prst="rect">
                       <a:avLst/>
@@ -23166,7 +22799,6 @@
           <w:sz w:val="30"/>
           <w:szCs w:val="30"/>
         </w:rPr>
-        <w:lastRenderedPageBreak/>
         <w:t>8.</w:t>
       </w:r>
       <w:r>
@@ -23216,7 +22848,7 @@
                     <pic:cNvPicPr/>
                   </pic:nvPicPr>
                   <pic:blipFill>
-                    <a:blip r:embed="rId50"/>
+                    <a:blip r:embed="rId51"/>
                     <a:stretch>
                       <a:fillRect/>
                     </a:stretch>
@@ -23253,6 +22885,7 @@
           <w:sz w:val="30"/>
           <w:szCs w:val="30"/>
         </w:rPr>
+        <w:lastRenderedPageBreak/>
         <w:t>8.</w:t>
       </w:r>
       <w:r>
@@ -23269,7 +22902,23 @@
           <w:sz w:val="30"/>
           <w:szCs w:val="30"/>
         </w:rPr>
-        <w:t xml:space="preserve"> Alta de Permiso</w:t>
+        <w:t xml:space="preserve"> A</w:t>
+      </w:r>
+      <w:r>
+        <w:rPr>
+          <w:rFonts w:ascii="Times New Roman" w:eastAsia="Times New Roman" w:hAnsi="Times New Roman" w:cs="Times New Roman"/>
+          <w:sz w:val="30"/>
+          <w:szCs w:val="30"/>
+        </w:rPr>
+        <w:t>gregar</w:t>
+      </w:r>
+      <w:r>
+        <w:rPr>
+          <w:rFonts w:ascii="Times New Roman" w:eastAsia="Times New Roman" w:hAnsi="Times New Roman" w:cs="Times New Roman"/>
+          <w:sz w:val="30"/>
+          <w:szCs w:val="30"/>
+        </w:rPr>
+        <w:t xml:space="preserve"> Permiso</w:t>
       </w:r>
       <w:bookmarkEnd w:id="88"/>
     </w:p>
@@ -23607,7 +23256,6 @@
           <w:sz w:val="30"/>
           <w:szCs w:val="30"/>
         </w:rPr>
-        <w:lastRenderedPageBreak/>
         <w:t>8.</w:t>
       </w:r>
       <w:r>
@@ -23635,6 +23283,14 @@
         <w:t>Administrar Jerarquía de Permisos</w:t>
       </w:r>
       <w:bookmarkEnd w:id="95"/>
+      <w:r>
+        <w:rPr>
+          <w:rFonts w:ascii="Times New Roman" w:eastAsia="Times New Roman" w:hAnsi="Times New Roman" w:cs="Times New Roman"/>
+          <w:sz w:val="30"/>
+          <w:szCs w:val="30"/>
+        </w:rPr>
+        <w:t xml:space="preserve"> (AgregarHijo-QuitarHijo)</w:t>
+      </w:r>
     </w:p>
     <w:p>
       <w:pPr>
@@ -23834,6 +23490,7 @@
         <w:rPr>
           <w:rFonts w:ascii="Times New Roman" w:eastAsia="Times New Roman" w:hAnsi="Times New Roman" w:cs="Times New Roman"/>
         </w:rPr>
+        <w:lastRenderedPageBreak/>
         <w:t>9. GESTIÓN DE CAMBIOS</w:t>
       </w:r>
       <w:bookmarkEnd w:id="97"/>
@@ -24337,7 +23994,6 @@
                 <w:bCs/>
                 <w:color w:val="000000"/>
               </w:rPr>
-              <w:lastRenderedPageBreak/>
               <w:t xml:space="preserve">PRECONDICIONES: </w:t>
             </w:r>
           </w:p>
@@ -24523,6 +24179,7 @@
                 <w:bCs/>
                 <w:color w:val="000000"/>
               </w:rPr>
+              <w:lastRenderedPageBreak/>
               <w:t>ESCENARIO PRINCIPAL: </w:t>
             </w:r>
           </w:p>
@@ -25016,7 +24673,6 @@
         <w:rPr>
           <w:rFonts w:ascii="Times New Roman" w:eastAsia="Times New Roman" w:hAnsi="Times New Roman" w:cs="Times New Roman"/>
         </w:rPr>
-        <w:lastRenderedPageBreak/>
         <w:t>10. GESTIÓN DE MÚLTIPLES IDIOMAS</w:t>
       </w:r>
       <w:bookmarkEnd w:id="106"/>
@@ -25064,7 +24720,14 @@
         <w:rPr>
           <w:rFonts w:ascii="Times New Roman" w:eastAsia="Times New Roman" w:hAnsi="Times New Roman" w:cs="Times New Roman"/>
         </w:rPr>
-        <w:t>Utilizando el patrón Observer, cada componente visual que contenga leyendas o títulos se suscribirá a los cambios de idioma garantizando que, al realizar una modificación, todas las interfaces se actualicen automáticamente sin necesidad de reiniciar la aplicación o recargar formularios. Esto mejora significativamente la usabilidad y accesibilidad del sistema, especialmente en entornos donde interactúan usuarios con diferentes lenguas.</w:t>
+        <w:t xml:space="preserve">Utilizando el patrón Observer, cada componente visual que contenga leyendas o títulos se suscribirá a los cambios de idioma garantizando que, al realizar una modificación, </w:t>
+      </w:r>
+      <w:r>
+        <w:rPr>
+          <w:rFonts w:ascii="Times New Roman" w:eastAsia="Times New Roman" w:hAnsi="Times New Roman" w:cs="Times New Roman"/>
+        </w:rPr>
+        <w:lastRenderedPageBreak/>
+        <w:t>todas las interfaces se actualicen automáticamente sin necesidad de reiniciar la aplicación o recargar formularios. Esto mejora significativamente la usabilidad y accesibilidad del sistema, especialmente en entornos donde interactúan usuarios con diferentes lenguas.</w:t>
       </w:r>
     </w:p>
     <w:p>
@@ -25395,8 +25058,8 @@
     </w:p>
     <w:p/>
     <w:sectPr>
-      <w:headerReference w:type="default" r:id="rId51"/>
-      <w:footerReference w:type="default" r:id="rId52"/>
+      <w:headerReference w:type="default" r:id="rId52"/>
+      <w:footerReference w:type="default" r:id="rId53"/>
       <w:pgSz w:w="11906" w:h="16838"/>
       <w:pgMar w:top="1417" w:right="1701" w:bottom="1417" w:left="1701" w:header="708" w:footer="708" w:gutter="0"/>
       <w:pgNumType w:start="1"/>

</xml_diff>

<commit_message>
Carga de frm ControlCambios y BackUp-Restore
</commit_message>
<xml_diff>
--- a/Documentación/ProyectoIS 2026 CAJAL-FERNANDEZ_2daEntrega.docx
+++ b/Documentación/ProyectoIS 2026 CAJAL-FERNANDEZ_2daEntrega.docx
@@ -8303,8 +8303,17 @@
           <w:rFonts w:ascii="Times New Roman" w:eastAsia="Times New Roman" w:hAnsi="Times New Roman" w:cs="Times New Roman"/>
           <w:color w:val="000000"/>
         </w:rPr>
-        <w:t>Registro/LogIn-Out</w:t>
-      </w:r>
+        <w:t>Registro/</w:t>
+      </w:r>
+      <w:proofErr w:type="spellStart"/>
+      <w:r>
+        <w:rPr>
+          <w:rFonts w:ascii="Times New Roman" w:eastAsia="Times New Roman" w:hAnsi="Times New Roman" w:cs="Times New Roman"/>
+          <w:color w:val="000000"/>
+        </w:rPr>
+        <w:t>LogIn-Out</w:t>
+      </w:r>
+      <w:proofErr w:type="spellEnd"/>
       <w:r>
         <w:rPr>
           <w:rFonts w:ascii="Times New Roman" w:eastAsia="Times New Roman" w:hAnsi="Times New Roman" w:cs="Times New Roman"/>
@@ -8763,12 +8772,14 @@
                 <w:rFonts w:ascii="Times New Roman" w:hAnsi="Times New Roman" w:cs="Times New Roman"/>
               </w:rPr>
             </w:pPr>
+            <w:proofErr w:type="spellStart"/>
             <w:r>
               <w:rPr>
                 <w:rFonts w:ascii="Times New Roman" w:hAnsi="Times New Roman" w:cs="Times New Roman"/>
               </w:rPr>
               <w:t>BackUp</w:t>
             </w:r>
+            <w:proofErr w:type="spellEnd"/>
           </w:p>
         </w:tc>
       </w:tr>
@@ -10251,7 +10262,23 @@
           <w:rFonts w:ascii="Times New Roman" w:eastAsia="Times New Roman" w:hAnsi="Times New Roman" w:cs="Times New Roman"/>
           <w:color w:val="000000"/>
         </w:rPr>
-        <w:t xml:space="preserve"> Al iniciar el sistema, se carga la interfaz de LogIn y se presenta al usuario como pantalla principal. En esta etapa no hay ninguna sesión activa ni conexión abierta con la base de datos. Por el momento no se realiza ninguna validación de permisos hasta que el usuario intenta autenticarse. Este enfoque busca minimizar el uso de recursos y mantener la seguridad hasta que se confirme la identidad del usuario. </w:t>
+        <w:t xml:space="preserve"> Al iniciar el sistema, se carga la interfaz de </w:t>
+      </w:r>
+      <w:proofErr w:type="spellStart"/>
+      <w:r>
+        <w:rPr>
+          <w:rFonts w:ascii="Times New Roman" w:eastAsia="Times New Roman" w:hAnsi="Times New Roman" w:cs="Times New Roman"/>
+          <w:color w:val="000000"/>
+        </w:rPr>
+        <w:t>LogIn</w:t>
+      </w:r>
+      <w:proofErr w:type="spellEnd"/>
+      <w:r>
+        <w:rPr>
+          <w:rFonts w:ascii="Times New Roman" w:eastAsia="Times New Roman" w:hAnsi="Times New Roman" w:cs="Times New Roman"/>
+          <w:color w:val="000000"/>
+        </w:rPr>
+        <w:t xml:space="preserve"> y se presenta al usuario como pantalla principal. En esta etapa no hay ninguna sesión activa ni conexión abierta con la base de datos. Por el momento no se realiza ninguna validación de permisos hasta que el usuario intenta autenticarse. Este enfoque busca minimizar el uso de recursos y mantener la seguridad hasta que se confirme la identidad del usuario. </w:t>
       </w:r>
     </w:p>
     <w:p>
@@ -10499,7 +10526,55 @@
           <w:rFonts w:ascii="Times New Roman" w:eastAsia="Times New Roman" w:hAnsi="Times New Roman" w:cs="Times New Roman"/>
           <w:color w:val="000000"/>
         </w:rPr>
-        <w:t>A su vez en la pantalla del LogIn presentamos un botón “mostrar” para que si el usuario quiere revisar la contraseña ingresada antes de presionar el botón LogIn pueda hacerlo. Para ello debemos setear la propiedad PasswordChar del TextBox en donde el usuario ingresa la contraseña como “*” por default.</w:t>
+        <w:t xml:space="preserve">A su vez en la pantalla del </w:t>
+      </w:r>
+      <w:proofErr w:type="spellStart"/>
+      <w:r>
+        <w:rPr>
+          <w:rFonts w:ascii="Times New Roman" w:eastAsia="Times New Roman" w:hAnsi="Times New Roman" w:cs="Times New Roman"/>
+          <w:color w:val="000000"/>
+        </w:rPr>
+        <w:t>LogIn</w:t>
+      </w:r>
+      <w:proofErr w:type="spellEnd"/>
+      <w:r>
+        <w:rPr>
+          <w:rFonts w:ascii="Times New Roman" w:eastAsia="Times New Roman" w:hAnsi="Times New Roman" w:cs="Times New Roman"/>
+          <w:color w:val="000000"/>
+        </w:rPr>
+        <w:t xml:space="preserve"> presentamos un botón “mostrar” para que si el usuario quiere revisar la contraseña ingresada antes de presionar el botón </w:t>
+      </w:r>
+      <w:proofErr w:type="spellStart"/>
+      <w:r>
+        <w:rPr>
+          <w:rFonts w:ascii="Times New Roman" w:eastAsia="Times New Roman" w:hAnsi="Times New Roman" w:cs="Times New Roman"/>
+          <w:color w:val="000000"/>
+        </w:rPr>
+        <w:t>LogIn</w:t>
+      </w:r>
+      <w:proofErr w:type="spellEnd"/>
+      <w:r>
+        <w:rPr>
+          <w:rFonts w:ascii="Times New Roman" w:eastAsia="Times New Roman" w:hAnsi="Times New Roman" w:cs="Times New Roman"/>
+          <w:color w:val="000000"/>
+        </w:rPr>
+        <w:t xml:space="preserve"> pueda hacerlo. Para ello debemos setear la propiedad </w:t>
+      </w:r>
+      <w:proofErr w:type="spellStart"/>
+      <w:r>
+        <w:rPr>
+          <w:rFonts w:ascii="Times New Roman" w:eastAsia="Times New Roman" w:hAnsi="Times New Roman" w:cs="Times New Roman"/>
+          <w:color w:val="000000"/>
+        </w:rPr>
+        <w:t>PasswordChar</w:t>
+      </w:r>
+      <w:proofErr w:type="spellEnd"/>
+      <w:r>
+        <w:rPr>
+          <w:rFonts w:ascii="Times New Roman" w:eastAsia="Times New Roman" w:hAnsi="Times New Roman" w:cs="Times New Roman"/>
+          <w:color w:val="000000"/>
+        </w:rPr>
+        <w:t xml:space="preserve"> del TextBox en donde el usuario ingresa la contraseña como “*” por default.</w:t>
       </w:r>
     </w:p>
     <w:p>
@@ -10570,7 +10645,27 @@
           <w:bCs/>
           <w:color w:val="000000"/>
         </w:rPr>
-        <w:t>Proceso de Log-Out:</w:t>
+        <w:t>Proceso de Log-</w:t>
+      </w:r>
+      <w:proofErr w:type="spellStart"/>
+      <w:r>
+        <w:rPr>
+          <w:rFonts w:ascii="Times New Roman" w:eastAsia="Times New Roman" w:hAnsi="Times New Roman" w:cs="Times New Roman"/>
+          <w:b/>
+          <w:bCs/>
+          <w:color w:val="000000"/>
+        </w:rPr>
+        <w:t>Out</w:t>
+      </w:r>
+      <w:proofErr w:type="spellEnd"/>
+      <w:r>
+        <w:rPr>
+          <w:rFonts w:ascii="Times New Roman" w:eastAsia="Times New Roman" w:hAnsi="Times New Roman" w:cs="Times New Roman"/>
+          <w:b/>
+          <w:bCs/>
+          <w:color w:val="000000"/>
+        </w:rPr>
+        <w:t>:</w:t>
       </w:r>
       <w:r>
         <w:rPr>
@@ -10598,9 +10693,37 @@
           <w:szCs w:val="30"/>
         </w:rPr>
         <w:lastRenderedPageBreak/>
-        <w:t>2.3 LogIn – CU001 LogIn</w:t>
+        <w:t xml:space="preserve">2.3 </w:t>
+      </w:r>
+      <w:proofErr w:type="spellStart"/>
+      <w:r>
+        <w:rPr>
+          <w:rFonts w:ascii="Times New Roman" w:eastAsia="Times New Roman" w:hAnsi="Times New Roman" w:cs="Times New Roman"/>
+          <w:sz w:val="30"/>
+          <w:szCs w:val="30"/>
+        </w:rPr>
+        <w:t>LogIn</w:t>
+      </w:r>
+      <w:proofErr w:type="spellEnd"/>
+      <w:r>
+        <w:rPr>
+          <w:rFonts w:ascii="Times New Roman" w:eastAsia="Times New Roman" w:hAnsi="Times New Roman" w:cs="Times New Roman"/>
+          <w:sz w:val="30"/>
+          <w:szCs w:val="30"/>
+        </w:rPr>
+        <w:t xml:space="preserve"> – CU001 </w:t>
+      </w:r>
+      <w:proofErr w:type="spellStart"/>
+      <w:r>
+        <w:rPr>
+          <w:rFonts w:ascii="Times New Roman" w:eastAsia="Times New Roman" w:hAnsi="Times New Roman" w:cs="Times New Roman"/>
+          <w:sz w:val="30"/>
+          <w:szCs w:val="30"/>
+        </w:rPr>
+        <w:t>LogIn</w:t>
       </w:r>
       <w:bookmarkEnd w:id="23"/>
+      <w:proofErr w:type="spellEnd"/>
     </w:p>
     <w:p>
       <w:pPr>
@@ -10626,7 +10749,14 @@
         <w:rPr>
           <w:rFonts w:ascii="Times New Roman" w:eastAsia="Times New Roman" w:hAnsi="Times New Roman" w:cs="Times New Roman"/>
         </w:rPr>
-        <w:t xml:space="preserve"> Diagrama LogI</w:t>
+        <w:t xml:space="preserve"> Diagrama </w:t>
+      </w:r>
+      <w:proofErr w:type="spellStart"/>
+      <w:r>
+        <w:rPr>
+          <w:rFonts w:ascii="Times New Roman" w:eastAsia="Times New Roman" w:hAnsi="Times New Roman" w:cs="Times New Roman"/>
+        </w:rPr>
+        <w:t>LogI</w:t>
       </w:r>
       <w:r>
         <w:rPr>
@@ -10635,6 +10765,7 @@
         <w:t>n</w:t>
       </w:r>
       <w:bookmarkEnd w:id="24"/>
+      <w:proofErr w:type="spellEnd"/>
     </w:p>
     <w:p>
       <w:pPr>
@@ -10777,8 +10908,17 @@
                 <w:rFonts w:ascii="Times New Roman" w:eastAsia="Times New Roman" w:hAnsi="Times New Roman" w:cs="Times New Roman"/>
                 <w:color w:val="000000"/>
               </w:rPr>
-              <w:t>CU 001 – LogIn</w:t>
-            </w:r>
+              <w:t xml:space="preserve">CU 001 – </w:t>
+            </w:r>
+            <w:proofErr w:type="spellStart"/>
+            <w:r>
+              <w:rPr>
+                <w:rFonts w:ascii="Times New Roman" w:eastAsia="Times New Roman" w:hAnsi="Times New Roman" w:cs="Times New Roman"/>
+                <w:color w:val="000000"/>
+              </w:rPr>
+              <w:t>LogIn</w:t>
+            </w:r>
+            <w:proofErr w:type="spellEnd"/>
             <w:r>
               <w:rPr>
                 <w:rFonts w:ascii="Times New Roman" w:eastAsia="Times New Roman" w:hAnsi="Times New Roman" w:cs="Times New Roman"/>
@@ -11193,7 +11333,27 @@
                 <w:sz w:val="22"/>
                 <w:szCs w:val="22"/>
               </w:rPr>
-              <w:t>El usuario ingresa al sistema y se le presenta la pantalla principal del mismo “LogIn”.</w:t>
+              <w:t>El usuario ingresa al sistema y se le presenta la pantalla principal del mismo “</w:t>
+            </w:r>
+            <w:proofErr w:type="spellStart"/>
+            <w:r>
+              <w:rPr>
+                <w:rFonts w:ascii="Times New Roman" w:eastAsia="Times New Roman" w:hAnsi="Times New Roman" w:cs="Times New Roman"/>
+                <w:color w:val="000000"/>
+                <w:sz w:val="22"/>
+                <w:szCs w:val="22"/>
+              </w:rPr>
+              <w:t>LogIn</w:t>
+            </w:r>
+            <w:proofErr w:type="spellEnd"/>
+            <w:r>
+              <w:rPr>
+                <w:rFonts w:ascii="Times New Roman" w:eastAsia="Times New Roman" w:hAnsi="Times New Roman" w:cs="Times New Roman"/>
+                <w:color w:val="000000"/>
+                <w:sz w:val="22"/>
+                <w:szCs w:val="22"/>
+              </w:rPr>
+              <w:t>”.</w:t>
             </w:r>
           </w:p>
           <w:p>
@@ -13355,14 +13515,13 @@
           <w:rFonts w:ascii="Times New Roman" w:eastAsia="Times New Roman" w:hAnsi="Times New Roman" w:cs="Times New Roman"/>
           <w:b/>
           <w:bCs/>
-          <w:noProof/>
           <w:color w:val="000000"/>
         </w:rPr>
         <w:drawing>
-          <wp:inline distT="0" distB="0" distL="0" distR="0" wp14:anchorId="467D919B" wp14:editId="2FDB578B">
-            <wp:extent cx="5981700" cy="3618985"/>
-            <wp:effectExtent l="0" t="0" r="0" b="635"/>
-            <wp:docPr id="2057473190" name="Imagen 1"/>
+          <wp:inline distT="0" distB="0" distL="0" distR="0" wp14:anchorId="52F68485" wp14:editId="6CEAFFAD">
+            <wp:extent cx="5890260" cy="3541498"/>
+            <wp:effectExtent l="0" t="0" r="0" b="1905"/>
+            <wp:docPr id="1225953194" name="Imagen 1"/>
             <wp:cNvGraphicFramePr>
               <a:graphicFrameLocks xmlns:a="http://schemas.openxmlformats.org/drawingml/2006/main" noChangeAspect="1"/>
             </wp:cNvGraphicFramePr>
@@ -13370,7 +13529,7 @@
               <a:graphicData uri="http://schemas.openxmlformats.org/drawingml/2006/picture">
                 <pic:pic xmlns:pic="http://schemas.openxmlformats.org/drawingml/2006/picture">
                   <pic:nvPicPr>
-                    <pic:cNvPr id="2057473190" name=""/>
+                    <pic:cNvPr id="1225953194" name=""/>
                     <pic:cNvPicPr/>
                   </pic:nvPicPr>
                   <pic:blipFill>
@@ -13382,7 +13541,7 @@
                   <pic:spPr>
                     <a:xfrm>
                       <a:off x="0" y="0"/>
-                      <a:ext cx="5986216" cy="3621717"/>
+                      <a:ext cx="5892532" cy="3542864"/>
                     </a:xfrm>
                     <a:prstGeom prst="rect">
                       <a:avLst/>
@@ -17812,7 +17971,21 @@
         <w:rPr>
           <w:rFonts w:ascii="Times New Roman" w:hAnsi="Times New Roman" w:cs="Times New Roman"/>
         </w:rPr>
-        <w:t xml:space="preserve">Con el objetivo de garantizar la seguridad de las contraseñas de los usuarios, en este proyecto se aplica el algoritmo SHA-256, encargado de transformar una cadena de texto en un valor de longitud determinado, denominado "hash". Este es un algoritmo de hashing unidireccional, lo que significa que no es posible desencriptar el hash para obtener la contraseña original. </w:t>
+        <w:t xml:space="preserve">Con el objetivo de garantizar la seguridad de las contraseñas de los usuarios, en este proyecto se aplica el algoritmo SHA-256, encargado de transformar una cadena de texto en un valor de longitud determinado, denominado "hash". Este es un algoritmo de </w:t>
+      </w:r>
+      <w:proofErr w:type="spellStart"/>
+      <w:r>
+        <w:rPr>
+          <w:rFonts w:ascii="Times New Roman" w:hAnsi="Times New Roman" w:cs="Times New Roman"/>
+        </w:rPr>
+        <w:t>hashing</w:t>
+      </w:r>
+      <w:proofErr w:type="spellEnd"/>
+      <w:r>
+        <w:rPr>
+          <w:rFonts w:ascii="Times New Roman" w:hAnsi="Times New Roman" w:cs="Times New Roman"/>
+        </w:rPr>
+        <w:t xml:space="preserve"> unidireccional, lo que significa que no es posible desencriptar el hash para obtener la contraseña original. </w:t>
       </w:r>
     </w:p>
     <w:p>
@@ -17825,7 +17998,35 @@
         <w:rPr>
           <w:rFonts w:ascii="Times New Roman" w:hAnsi="Times New Roman" w:cs="Times New Roman"/>
         </w:rPr>
-        <w:t xml:space="preserve">Tanto para la creación de usuarios como para el logueo en el sistema de estos mismos, se deberá ingresar una clave. Esta clave será hasheada por el algoritmo SHA-256 y será guardada en la base de datos. Un usuario que requiera iniciar sesión deberá ingresar su clave, en la interfaz de Inicio de sesión, el valor que coloque como clave, al seleccionar “Iniciar Sesión” será hasheado y comparado con el valor que se encuentre en la base de datos. Si estos valores coinciden, la sesión es iniciada, en el caso contrario donde no coincidan, se mostrará al usuario un error de contraseña incorrecta. </w:t>
+        <w:t xml:space="preserve">Tanto para la creación de usuarios como para el logueo en el sistema de estos mismos, se deberá ingresar una clave. Esta clave será </w:t>
+      </w:r>
+      <w:proofErr w:type="spellStart"/>
+      <w:r>
+        <w:rPr>
+          <w:rFonts w:ascii="Times New Roman" w:hAnsi="Times New Roman" w:cs="Times New Roman"/>
+        </w:rPr>
+        <w:t>hasheada</w:t>
+      </w:r>
+      <w:proofErr w:type="spellEnd"/>
+      <w:r>
+        <w:rPr>
+          <w:rFonts w:ascii="Times New Roman" w:hAnsi="Times New Roman" w:cs="Times New Roman"/>
+        </w:rPr>
+        <w:t xml:space="preserve"> por el algoritmo SHA-256 y será guardada en la base de datos. Un usuario que requiera iniciar sesión deberá ingresar su clave, en la interfaz de Inicio de sesión, el valor que coloque como clave, al seleccionar “Iniciar Sesión” será </w:t>
+      </w:r>
+      <w:proofErr w:type="spellStart"/>
+      <w:r>
+        <w:rPr>
+          <w:rFonts w:ascii="Times New Roman" w:hAnsi="Times New Roman" w:cs="Times New Roman"/>
+        </w:rPr>
+        <w:t>hasheado</w:t>
+      </w:r>
+      <w:proofErr w:type="spellEnd"/>
+      <w:r>
+        <w:rPr>
+          <w:rFonts w:ascii="Times New Roman" w:hAnsi="Times New Roman" w:cs="Times New Roman"/>
+        </w:rPr>
+        <w:t xml:space="preserve"> y comparado con el valor que se encuentre en la base de datos. Si estos valores coinciden, la sesión es iniciada, en el caso contrario donde no coincidan, se mostrará al usuario un error de contraseña incorrecta. </w:t>
       </w:r>
     </w:p>
     <w:p>
@@ -17847,7 +18048,25 @@
           <w:b/>
           <w:bCs/>
         </w:rPr>
-        <w:t xml:space="preserve">Método de la clase Encriptador: </w:t>
+        <w:t xml:space="preserve">Método de la clase </w:t>
+      </w:r>
+      <w:proofErr w:type="spellStart"/>
+      <w:r>
+        <w:rPr>
+          <w:rFonts w:ascii="Times New Roman" w:hAnsi="Times New Roman" w:cs="Times New Roman"/>
+          <w:b/>
+          <w:bCs/>
+        </w:rPr>
+        <w:t>Encriptador</w:t>
+      </w:r>
+      <w:proofErr w:type="spellEnd"/>
+      <w:r>
+        <w:rPr>
+          <w:rFonts w:ascii="Times New Roman" w:hAnsi="Times New Roman" w:cs="Times New Roman"/>
+          <w:b/>
+          <w:bCs/>
+        </w:rPr>
+        <w:t xml:space="preserve">: </w:t>
       </w:r>
     </w:p>
     <w:p>
@@ -17860,7 +18079,21 @@
         <w:rPr>
           <w:rFonts w:ascii="Times New Roman" w:hAnsi="Times New Roman" w:cs="Times New Roman"/>
         </w:rPr>
-        <w:t xml:space="preserve">Hash (string input): Este método toma una cadena de texto (como una contraseña en texto plano) y la convierte en un hash de 256 bits utilizando el algoritmo SHA-256. </w:t>
+        <w:t>Hash (</w:t>
+      </w:r>
+      <w:proofErr w:type="spellStart"/>
+      <w:r>
+        <w:rPr>
+          <w:rFonts w:ascii="Times New Roman" w:hAnsi="Times New Roman" w:cs="Times New Roman"/>
+        </w:rPr>
+        <w:t>string</w:t>
+      </w:r>
+      <w:proofErr w:type="spellEnd"/>
+      <w:r>
+        <w:rPr>
+          <w:rFonts w:ascii="Times New Roman" w:hAnsi="Times New Roman" w:cs="Times New Roman"/>
+        </w:rPr>
+        <w:t xml:space="preserve"> input): Este método toma una cadena de texto (como una contraseña en texto plano) y la convierte en un hash de 256 bits utilizando el algoritmo SHA-256. </w:t>
       </w:r>
     </w:p>
     <w:p>
@@ -17920,7 +18153,21 @@
         <w:rPr>
           <w:rFonts w:ascii="Times New Roman" w:hAnsi="Times New Roman" w:cs="Times New Roman"/>
         </w:rPr>
-        <w:t>Al momento de registrar un usuario en el sistema y completar la contraseña de este mismo, en la base de datos el campo que contiene la contraseña no será visible para la persona. Ej: Si la contraseña es Hola123, en la base de datos se vera de la siguiente manera: (Imagen ilustrativa de ejemplo)</w:t>
+        <w:t xml:space="preserve">Al momento de registrar un usuario en el sistema y completar la contraseña de este mismo, en la base de datos el campo que contiene la contraseña no será visible para la persona. Ej: Si la contraseña es Hola123, en la base de datos se </w:t>
+      </w:r>
+      <w:proofErr w:type="spellStart"/>
+      <w:r>
+        <w:rPr>
+          <w:rFonts w:ascii="Times New Roman" w:hAnsi="Times New Roman" w:cs="Times New Roman"/>
+        </w:rPr>
+        <w:t>vera</w:t>
+      </w:r>
+      <w:proofErr w:type="spellEnd"/>
+      <w:r>
+        <w:rPr>
+          <w:rFonts w:ascii="Times New Roman" w:hAnsi="Times New Roman" w:cs="Times New Roman"/>
+        </w:rPr>
+        <w:t xml:space="preserve"> de la siguiente manera: (Imagen ilustrativa de ejemplo)</w:t>
       </w:r>
     </w:p>
     <w:p>
@@ -22319,7 +22566,53 @@
         <w:t xml:space="preserve"> </w:t>
       </w:r>
       <w:r>
-        <w:t>atributo se multiplica por su posición dentro del valor y por la posición del atributo dentro de la entidad. Esto permite detectar no solo modificaciones en el contenido sino también intercambios de posición entre caracteres o atributos. Los atributos que participan en el cálculo son: NombreProducto, PrecioProducto, TipoProducto, Descripcion, Cantidad y CodigoProducto. El resultado de la suma se hashea con SHA-256 y se almacena en la columna DVH de la tabla PRODUCTO.</w:t>
+        <w:t xml:space="preserve">atributo se multiplica por su posición dentro del valor y por la posición del atributo dentro de la entidad. Esto permite detectar no solo modificaciones en el contenido sino también intercambios de posición entre caracteres o atributos. Los atributos que participan en el cálculo son: </w:t>
+      </w:r>
+      <w:proofErr w:type="spellStart"/>
+      <w:r>
+        <w:t>NombreProducto</w:t>
+      </w:r>
+      <w:proofErr w:type="spellEnd"/>
+      <w:r>
+        <w:t xml:space="preserve">, </w:t>
+      </w:r>
+      <w:proofErr w:type="spellStart"/>
+      <w:r>
+        <w:t>PrecioProducto</w:t>
+      </w:r>
+      <w:proofErr w:type="spellEnd"/>
+      <w:r>
+        <w:t xml:space="preserve">, </w:t>
+      </w:r>
+      <w:proofErr w:type="spellStart"/>
+      <w:r>
+        <w:t>TipoProducto</w:t>
+      </w:r>
+      <w:proofErr w:type="spellEnd"/>
+      <w:r>
+        <w:t xml:space="preserve">, </w:t>
+      </w:r>
+      <w:r>
+        <w:t>Descripción</w:t>
+      </w:r>
+      <w:r>
+        <w:t xml:space="preserve">, Cantidad y </w:t>
+      </w:r>
+      <w:proofErr w:type="spellStart"/>
+      <w:r>
+        <w:t>CodigoProducto</w:t>
+      </w:r>
+      <w:proofErr w:type="spellEnd"/>
+      <w:r>
+        <w:t xml:space="preserve">. El resultado de la suma se </w:t>
+      </w:r>
+      <w:proofErr w:type="spellStart"/>
+      <w:r>
+        <w:t>hashea</w:t>
+      </w:r>
+      <w:proofErr w:type="spellEnd"/>
+      <w:r>
+        <w:t xml:space="preserve"> con SHA-256 y se almacena en la columna DVH de la tabla PRODUCTO.</w:t>
       </w:r>
     </w:p>
     <w:p>
@@ -22339,7 +22632,15 @@
     </w:p>
     <w:p>
       <w:r>
-        <w:t>Al iniciar la aplicación, antes de mostrar el login, se verifican ambos dígitos. En caso de error se informa al administrador y se ofrecen dos opciones: restaurar desde el último backup o recalcular los dígitos aceptando los datos actuales.</w:t>
+        <w:t xml:space="preserve">Al iniciar la aplicación, antes de mostrar el </w:t>
+      </w:r>
+      <w:proofErr w:type="spellStart"/>
+      <w:r>
+        <w:t>login</w:t>
+      </w:r>
+      <w:proofErr w:type="spellEnd"/>
+      <w:r>
+        <w:t>, se verifican ambos dígitos. En caso de error se informa al administrador y se ofrecen dos opciones: restaurar desde el último backup o recalcular los dígitos aceptando los datos actuales.</w:t>
       </w:r>
     </w:p>
     <w:p>
@@ -22549,7 +22850,35 @@
         <w:rPr>
           <w:rFonts w:ascii="Times New Roman" w:hAnsi="Times New Roman" w:cs="Times New Roman"/>
         </w:rPr>
-        <w:t xml:space="preserve"> = Gerente (IdUsuario, IdPermiso) &gt;&gt; </w:t>
+        <w:t xml:space="preserve"> = Gerente (</w:t>
+      </w:r>
+      <w:proofErr w:type="spellStart"/>
+      <w:r>
+        <w:rPr>
+          <w:rFonts w:ascii="Times New Roman" w:hAnsi="Times New Roman" w:cs="Times New Roman"/>
+        </w:rPr>
+        <w:t>IdUsuario</w:t>
+      </w:r>
+      <w:proofErr w:type="spellEnd"/>
+      <w:r>
+        <w:rPr>
+          <w:rFonts w:ascii="Times New Roman" w:hAnsi="Times New Roman" w:cs="Times New Roman"/>
+        </w:rPr>
+        <w:t xml:space="preserve">, </w:t>
+      </w:r>
+      <w:proofErr w:type="spellStart"/>
+      <w:r>
+        <w:rPr>
+          <w:rFonts w:ascii="Times New Roman" w:hAnsi="Times New Roman" w:cs="Times New Roman"/>
+        </w:rPr>
+        <w:t>IdPermiso</w:t>
+      </w:r>
+      <w:proofErr w:type="spellEnd"/>
+      <w:r>
+        <w:rPr>
+          <w:rFonts w:ascii="Times New Roman" w:hAnsi="Times New Roman" w:cs="Times New Roman"/>
+        </w:rPr>
+        <w:t xml:space="preserve">) &gt;&gt; </w:t>
       </w:r>
       <w:hyperlink r:id="rId47" w:history="1">
         <w:r>
@@ -22596,7 +22925,35 @@
         <w:rPr>
           <w:rFonts w:ascii="Times New Roman" w:hAnsi="Times New Roman" w:cs="Times New Roman"/>
         </w:rPr>
-        <w:t xml:space="preserve"> = Cliente (IdUsuario, IdPermiso) &gt;&gt;</w:t>
+        <w:t xml:space="preserve"> = Cliente (</w:t>
+      </w:r>
+      <w:proofErr w:type="spellStart"/>
+      <w:r>
+        <w:rPr>
+          <w:rFonts w:ascii="Times New Roman" w:hAnsi="Times New Roman" w:cs="Times New Roman"/>
+        </w:rPr>
+        <w:t>IdUsuario</w:t>
+      </w:r>
+      <w:proofErr w:type="spellEnd"/>
+      <w:r>
+        <w:rPr>
+          <w:rFonts w:ascii="Times New Roman" w:hAnsi="Times New Roman" w:cs="Times New Roman"/>
+        </w:rPr>
+        <w:t xml:space="preserve">, </w:t>
+      </w:r>
+      <w:proofErr w:type="spellStart"/>
+      <w:r>
+        <w:rPr>
+          <w:rFonts w:ascii="Times New Roman" w:hAnsi="Times New Roman" w:cs="Times New Roman"/>
+        </w:rPr>
+        <w:t>IdPermiso</w:t>
+      </w:r>
+      <w:proofErr w:type="spellEnd"/>
+      <w:r>
+        <w:rPr>
+          <w:rFonts w:ascii="Times New Roman" w:hAnsi="Times New Roman" w:cs="Times New Roman"/>
+        </w:rPr>
+        <w:t>) &gt;&gt;</w:t>
       </w:r>
       <w:r>
         <w:rPr>
@@ -22625,12 +22982,14 @@
         </w:rPr>
         <w:t xml:space="preserve">------- </w:t>
       </w:r>
+      <w:proofErr w:type="spellStart"/>
       <w:r>
         <w:rPr>
           <w:rFonts w:ascii="Times New Roman" w:hAnsi="Times New Roman" w:cs="Times New Roman"/>
         </w:rPr>
         <w:t>river</w:t>
       </w:r>
+      <w:proofErr w:type="spellEnd"/>
     </w:p>
     <w:p>
       <w:pPr>
@@ -23289,7 +23648,25 @@
           <w:sz w:val="30"/>
           <w:szCs w:val="30"/>
         </w:rPr>
-        <w:t xml:space="preserve"> (AgregarHijo-QuitarHijo)</w:t>
+        <w:t xml:space="preserve"> (</w:t>
+      </w:r>
+      <w:proofErr w:type="spellStart"/>
+      <w:r>
+        <w:rPr>
+          <w:rFonts w:ascii="Times New Roman" w:eastAsia="Times New Roman" w:hAnsi="Times New Roman" w:cs="Times New Roman"/>
+          <w:sz w:val="30"/>
+          <w:szCs w:val="30"/>
+        </w:rPr>
+        <w:t>AgregarHijo-QuitarHijo</w:t>
+      </w:r>
+      <w:proofErr w:type="spellEnd"/>
+      <w:r>
+        <w:rPr>
+          <w:rFonts w:ascii="Times New Roman" w:eastAsia="Times New Roman" w:hAnsi="Times New Roman" w:cs="Times New Roman"/>
+          <w:sz w:val="30"/>
+          <w:szCs w:val="30"/>
+        </w:rPr>
+        <w:t>)</w:t>
       </w:r>
     </w:p>
     <w:p>
@@ -30145,28 +30522,28 @@
 </file>
 
 <file path=customXml/item1.xml><?xml version="1.0" encoding="utf-8"?>
+<b:Sources xmlns:b="http://schemas.openxmlformats.org/officeDocument/2006/bibliography" xmlns="http://schemas.openxmlformats.org/officeDocument/2006/bibliography" SelectedStyle="\APASixthEditionOfficeOnline.xsl" StyleName="APA" Version="6"/>
+</file>
+
+<file path=customXml/item2.xml><?xml version="1.0" encoding="utf-8"?>
 <go:gDocsCustomXmlDataStorage xmlns:go="http://customooxmlschemas.google.com/" xmlns:r="http://schemas.openxmlformats.org/officeDocument/2006/relationships" uri="GoogleDocsCustomDataVersion2">
   <go:docsCustomData xmlns:go="http://customooxmlschemas.google.com/" roundtripDataSignature="AMtx7mg9ViIy0TFX1PbiokUHW0+gEHD0DQ==">CgMxLjAyDmgueXB0b3ptdnN5YWhpMg5oLjMwMTZ1a3NyeWs5OTIOaC41dHdvajgxajFna2EyDmguajh3ZGR4ZWVnZ3R3Mg5oLmJneml2aG00bzdoYzIOaC5qOTJ5aWxicjl6dDcyDmgubjRpdXVhbG9heDc2Mg5oLjFpNzZ2NHk0NXc5OTIOaC5oaHFvaTRybTJzYjEyDmgubGF1ZXZ5aGhzMG5uMg5oLjI5Nmd4eXhiYnYwbTgAciExNlVkVkNiWlZIdUNvcHFuMnNIenVkMWZoTjV5TjIzLW4=</go:docsCustomData>
 </go:gDocsCustomXmlDataStorage>
 </file>
 
-<file path=customXml/item2.xml><?xml version="1.0" encoding="utf-8"?>
-<b:Sources xmlns:b="http://schemas.openxmlformats.org/officeDocument/2006/bibliography" xmlns="http://schemas.openxmlformats.org/officeDocument/2006/bibliography" SelectedStyle="\APASixthEditionOfficeOnline.xsl" StyleName="APA" Version="6"/>
+<file path=customXml/itemProps1.xml><?xml version="1.0" encoding="utf-8"?>
+<ds:datastoreItem xmlns:ds="http://schemas.openxmlformats.org/officeDocument/2006/customXml" ds:itemID="{98C402C2-0B0B-45E1-8B8A-FD895BAD112E}">
+  <ds:schemaRefs>
+    <ds:schemaRef ds:uri="http://schemas.openxmlformats.org/officeDocument/2006/bibliography"/>
+  </ds:schemaRefs>
+</ds:datastoreItem>
 </file>
 
-<file path=customXml/itemProps1.xml><?xml version="1.0" encoding="utf-8"?>
+<file path=customXml/itemProps2.xml><?xml version="1.0" encoding="utf-8"?>
 <ds:datastoreItem xmlns:ds="http://schemas.openxmlformats.org/officeDocument/2006/customXml" ds:itemID="{11111111-1234-1234-1234-123412341234}">
   <ds:schemaRefs>
     <ds:schemaRef ds:uri="http://customooxmlschemas.google.com/"/>
     <ds:schemaRef ds:uri="http://schemas.openxmlformats.org/officeDocument/2006/relationships"/>
   </ds:schemaRefs>
 </ds:datastoreItem>
-</file>
-
-<file path=customXml/itemProps2.xml><?xml version="1.0" encoding="utf-8"?>
-<ds:datastoreItem xmlns:ds="http://schemas.openxmlformats.org/officeDocument/2006/customXml" ds:itemID="{98C402C2-0B0B-45E1-8B8A-FD895BAD112E}">
-  <ds:schemaRefs>
-    <ds:schemaRef ds:uri="http://schemas.openxmlformats.org/officeDocument/2006/bibliography"/>
-  </ds:schemaRefs>
-</ds:datastoreItem>
 </file>
</xml_diff>

<commit_message>
Doc + Cambios de nombres
</commit_message>
<xml_diff>
--- a/Documentación/ProyectoIS 2026 CAJAL-FERNANDEZ_2daEntrega.docx
+++ b/Documentación/ProyectoIS 2026 CAJAL-FERNANDEZ_2daEntrega.docx
@@ -2117,7 +2117,15 @@
                 <w:rFonts w:ascii="Times New Roman" w:eastAsia="Times New Roman" w:hAnsi="Times New Roman" w:cs="Times New Roman"/>
                 <w:noProof/>
               </w:rPr>
-              <w:t>2.3.6 Pantalla GIU</w:t>
+              <w:t xml:space="preserve">2.3.6 Pantalla </w:t>
+            </w:r>
+            <w:r>
+              <w:rPr>
+                <w:rStyle w:val="Hipervnculo"/>
+                <w:rFonts w:ascii="Times New Roman" w:eastAsia="Times New Roman" w:hAnsi="Times New Roman" w:cs="Times New Roman"/>
+                <w:noProof/>
+              </w:rPr>
+              <w:t>UI</w:t>
             </w:r>
             <w:r>
               <w:rPr>
@@ -2621,7 +2629,15 @@
                 <w:rFonts w:ascii="Times New Roman" w:eastAsia="Times New Roman" w:hAnsi="Times New Roman" w:cs="Times New Roman"/>
                 <w:noProof/>
               </w:rPr>
-              <w:t>2.4.6 Pantalla GIU</w:t>
+              <w:t xml:space="preserve">2.4.6 Pantalla </w:t>
+            </w:r>
+            <w:r>
+              <w:rPr>
+                <w:rStyle w:val="Hipervnculo"/>
+                <w:rFonts w:ascii="Times New Roman" w:eastAsia="Times New Roman" w:hAnsi="Times New Roman" w:cs="Times New Roman"/>
+                <w:noProof/>
+              </w:rPr>
+              <w:t>UI</w:t>
             </w:r>
             <w:r>
               <w:rPr>
@@ -3053,7 +3069,15 @@
                 <w:rFonts w:ascii="Times New Roman" w:eastAsia="Times New Roman" w:hAnsi="Times New Roman" w:cs="Times New Roman"/>
                 <w:noProof/>
               </w:rPr>
-              <w:t>3.5 Pantalla GIU</w:t>
+              <w:t xml:space="preserve">3.5 Pantalla </w:t>
+            </w:r>
+            <w:r>
+              <w:rPr>
+                <w:rStyle w:val="Hipervnculo"/>
+                <w:rFonts w:ascii="Times New Roman" w:eastAsia="Times New Roman" w:hAnsi="Times New Roman" w:cs="Times New Roman"/>
+                <w:noProof/>
+              </w:rPr>
+              <w:t>UI</w:t>
             </w:r>
             <w:r>
               <w:rPr>
@@ -4925,7 +4949,15 @@
                 <w:rFonts w:ascii="Times New Roman" w:eastAsia="Times New Roman" w:hAnsi="Times New Roman" w:cs="Times New Roman"/>
                 <w:noProof/>
               </w:rPr>
-              <w:t>6.4 Pantalla GIU</w:t>
+              <w:t xml:space="preserve">6.4 Pantalla </w:t>
+            </w:r>
+            <w:r>
+              <w:rPr>
+                <w:rStyle w:val="Hipervnculo"/>
+                <w:rFonts w:ascii="Times New Roman" w:eastAsia="Times New Roman" w:hAnsi="Times New Roman" w:cs="Times New Roman"/>
+                <w:noProof/>
+              </w:rPr>
+              <w:t>UI</w:t>
             </w:r>
             <w:r>
               <w:rPr>
@@ -8303,17 +8335,8 @@
           <w:rFonts w:ascii="Times New Roman" w:eastAsia="Times New Roman" w:hAnsi="Times New Roman" w:cs="Times New Roman"/>
           <w:color w:val="000000"/>
         </w:rPr>
-        <w:t>Registro/</w:t>
-      </w:r>
-      <w:proofErr w:type="spellStart"/>
-      <w:r>
-        <w:rPr>
-          <w:rFonts w:ascii="Times New Roman" w:eastAsia="Times New Roman" w:hAnsi="Times New Roman" w:cs="Times New Roman"/>
-          <w:color w:val="000000"/>
-        </w:rPr>
-        <w:t>LogIn-Out</w:t>
-      </w:r>
-      <w:proofErr w:type="spellEnd"/>
+        <w:t>Registro/LogIn-Out</w:t>
+      </w:r>
       <w:r>
         <w:rPr>
           <w:rFonts w:ascii="Times New Roman" w:eastAsia="Times New Roman" w:hAnsi="Times New Roman" w:cs="Times New Roman"/>
@@ -8772,14 +8795,12 @@
                 <w:rFonts w:ascii="Times New Roman" w:hAnsi="Times New Roman" w:cs="Times New Roman"/>
               </w:rPr>
             </w:pPr>
-            <w:proofErr w:type="spellStart"/>
             <w:r>
               <w:rPr>
                 <w:rFonts w:ascii="Times New Roman" w:hAnsi="Times New Roman" w:cs="Times New Roman"/>
               </w:rPr>
               <w:t>BackUp</w:t>
             </w:r>
-            <w:proofErr w:type="spellEnd"/>
           </w:p>
         </w:tc>
       </w:tr>
@@ -9522,10 +9543,10 @@
           <w:noProof/>
         </w:rPr>
         <w:drawing>
-          <wp:inline distT="0" distB="0" distL="0" distR="0" wp14:anchorId="0EF06E63" wp14:editId="7462C8A8">
-            <wp:extent cx="6412276" cy="2811780"/>
-            <wp:effectExtent l="0" t="0" r="7620" b="7620"/>
-            <wp:docPr id="1613823052" name="Imagen 1"/>
+          <wp:inline distT="0" distB="0" distL="0" distR="0" wp14:anchorId="012E8D53" wp14:editId="5D4CD7DB">
+            <wp:extent cx="6195060" cy="2909580"/>
+            <wp:effectExtent l="0" t="0" r="0" b="5080"/>
+            <wp:docPr id="1880192732" name="Imagen 3"/>
             <wp:cNvGraphicFramePr>
               <a:graphicFrameLocks xmlns:a="http://schemas.openxmlformats.org/drawingml/2006/main" noChangeAspect="1"/>
             </wp:cNvGraphicFramePr>
@@ -9533,7 +9554,7 @@
               <a:graphicData uri="http://schemas.openxmlformats.org/drawingml/2006/picture">
                 <pic:pic xmlns:pic="http://schemas.openxmlformats.org/drawingml/2006/picture">
                   <pic:nvPicPr>
-                    <pic:cNvPr id="0" name="Picture 1"/>
+                    <pic:cNvPr id="0" name="Picture 3"/>
                     <pic:cNvPicPr>
                       <a:picLocks noChangeAspect="1" noChangeArrowheads="1"/>
                     </pic:cNvPicPr>
@@ -9554,7 +9575,7 @@
                   <pic:spPr bwMode="auto">
                     <a:xfrm>
                       <a:off x="0" y="0"/>
-                      <a:ext cx="6418311" cy="2814426"/>
+                      <a:ext cx="6197581" cy="2910764"/>
                     </a:xfrm>
                     <a:prstGeom prst="rect">
                       <a:avLst/>
@@ -10262,23 +10283,7 @@
           <w:rFonts w:ascii="Times New Roman" w:eastAsia="Times New Roman" w:hAnsi="Times New Roman" w:cs="Times New Roman"/>
           <w:color w:val="000000"/>
         </w:rPr>
-        <w:t xml:space="preserve"> Al iniciar el sistema, se carga la interfaz de </w:t>
-      </w:r>
-      <w:proofErr w:type="spellStart"/>
-      <w:r>
-        <w:rPr>
-          <w:rFonts w:ascii="Times New Roman" w:eastAsia="Times New Roman" w:hAnsi="Times New Roman" w:cs="Times New Roman"/>
-          <w:color w:val="000000"/>
-        </w:rPr>
-        <w:t>LogIn</w:t>
-      </w:r>
-      <w:proofErr w:type="spellEnd"/>
-      <w:r>
-        <w:rPr>
-          <w:rFonts w:ascii="Times New Roman" w:eastAsia="Times New Roman" w:hAnsi="Times New Roman" w:cs="Times New Roman"/>
-          <w:color w:val="000000"/>
-        </w:rPr>
-        <w:t xml:space="preserve"> y se presenta al usuario como pantalla principal. En esta etapa no hay ninguna sesión activa ni conexión abierta con la base de datos. Por el momento no se realiza ninguna validación de permisos hasta que el usuario intenta autenticarse. Este enfoque busca minimizar el uso de recursos y mantener la seguridad hasta que se confirme la identidad del usuario. </w:t>
+        <w:t xml:space="preserve"> Al iniciar el sistema, se carga la interfaz de LogIn y se presenta al usuario como pantalla principal. En esta etapa no hay ninguna sesión activa ni conexión abierta con la base de datos. Por el momento no se realiza ninguna validación de permisos hasta que el usuario intenta autenticarse. Este enfoque busca minimizar el uso de recursos y mantener la seguridad hasta que se confirme la identidad del usuario. </w:t>
       </w:r>
     </w:p>
     <w:p>
@@ -10526,55 +10531,7 @@
           <w:rFonts w:ascii="Times New Roman" w:eastAsia="Times New Roman" w:hAnsi="Times New Roman" w:cs="Times New Roman"/>
           <w:color w:val="000000"/>
         </w:rPr>
-        <w:t xml:space="preserve">A su vez en la pantalla del </w:t>
-      </w:r>
-      <w:proofErr w:type="spellStart"/>
-      <w:r>
-        <w:rPr>
-          <w:rFonts w:ascii="Times New Roman" w:eastAsia="Times New Roman" w:hAnsi="Times New Roman" w:cs="Times New Roman"/>
-          <w:color w:val="000000"/>
-        </w:rPr>
-        <w:t>LogIn</w:t>
-      </w:r>
-      <w:proofErr w:type="spellEnd"/>
-      <w:r>
-        <w:rPr>
-          <w:rFonts w:ascii="Times New Roman" w:eastAsia="Times New Roman" w:hAnsi="Times New Roman" w:cs="Times New Roman"/>
-          <w:color w:val="000000"/>
-        </w:rPr>
-        <w:t xml:space="preserve"> presentamos un botón “mostrar” para que si el usuario quiere revisar la contraseña ingresada antes de presionar el botón </w:t>
-      </w:r>
-      <w:proofErr w:type="spellStart"/>
-      <w:r>
-        <w:rPr>
-          <w:rFonts w:ascii="Times New Roman" w:eastAsia="Times New Roman" w:hAnsi="Times New Roman" w:cs="Times New Roman"/>
-          <w:color w:val="000000"/>
-        </w:rPr>
-        <w:t>LogIn</w:t>
-      </w:r>
-      <w:proofErr w:type="spellEnd"/>
-      <w:r>
-        <w:rPr>
-          <w:rFonts w:ascii="Times New Roman" w:eastAsia="Times New Roman" w:hAnsi="Times New Roman" w:cs="Times New Roman"/>
-          <w:color w:val="000000"/>
-        </w:rPr>
-        <w:t xml:space="preserve"> pueda hacerlo. Para ello debemos setear la propiedad </w:t>
-      </w:r>
-      <w:proofErr w:type="spellStart"/>
-      <w:r>
-        <w:rPr>
-          <w:rFonts w:ascii="Times New Roman" w:eastAsia="Times New Roman" w:hAnsi="Times New Roman" w:cs="Times New Roman"/>
-          <w:color w:val="000000"/>
-        </w:rPr>
-        <w:t>PasswordChar</w:t>
-      </w:r>
-      <w:proofErr w:type="spellEnd"/>
-      <w:r>
-        <w:rPr>
-          <w:rFonts w:ascii="Times New Roman" w:eastAsia="Times New Roman" w:hAnsi="Times New Roman" w:cs="Times New Roman"/>
-          <w:color w:val="000000"/>
-        </w:rPr>
-        <w:t xml:space="preserve"> del TextBox en donde el usuario ingresa la contraseña como “*” por default.</w:t>
+        <w:t>A su vez en la pantalla del LogIn presentamos un botón “mostrar” para que si el usuario quiere revisar la contraseña ingresada antes de presionar el botón LogIn pueda hacerlo. Para ello debemos setear la propiedad PasswordChar del TextBox en donde el usuario ingresa la contraseña como “*” por default.</w:t>
       </w:r>
     </w:p>
     <w:p>
@@ -10645,27 +10602,7 @@
           <w:bCs/>
           <w:color w:val="000000"/>
         </w:rPr>
-        <w:t>Proceso de Log-</w:t>
-      </w:r>
-      <w:proofErr w:type="spellStart"/>
-      <w:r>
-        <w:rPr>
-          <w:rFonts w:ascii="Times New Roman" w:eastAsia="Times New Roman" w:hAnsi="Times New Roman" w:cs="Times New Roman"/>
-          <w:b/>
-          <w:bCs/>
-          <w:color w:val="000000"/>
-        </w:rPr>
-        <w:t>Out</w:t>
-      </w:r>
-      <w:proofErr w:type="spellEnd"/>
-      <w:r>
-        <w:rPr>
-          <w:rFonts w:ascii="Times New Roman" w:eastAsia="Times New Roman" w:hAnsi="Times New Roman" w:cs="Times New Roman"/>
-          <w:b/>
-          <w:bCs/>
-          <w:color w:val="000000"/>
-        </w:rPr>
-        <w:t>:</w:t>
+        <w:t>Proceso de Log-Out:</w:t>
       </w:r>
       <w:r>
         <w:rPr>
@@ -10693,37 +10630,9 @@
           <w:szCs w:val="30"/>
         </w:rPr>
         <w:lastRenderedPageBreak/>
-        <w:t xml:space="preserve">2.3 </w:t>
-      </w:r>
-      <w:proofErr w:type="spellStart"/>
-      <w:r>
-        <w:rPr>
-          <w:rFonts w:ascii="Times New Roman" w:eastAsia="Times New Roman" w:hAnsi="Times New Roman" w:cs="Times New Roman"/>
-          <w:sz w:val="30"/>
-          <w:szCs w:val="30"/>
-        </w:rPr>
-        <w:t>LogIn</w:t>
-      </w:r>
-      <w:proofErr w:type="spellEnd"/>
-      <w:r>
-        <w:rPr>
-          <w:rFonts w:ascii="Times New Roman" w:eastAsia="Times New Roman" w:hAnsi="Times New Roman" w:cs="Times New Roman"/>
-          <w:sz w:val="30"/>
-          <w:szCs w:val="30"/>
-        </w:rPr>
-        <w:t xml:space="preserve"> – CU001 </w:t>
-      </w:r>
-      <w:proofErr w:type="spellStart"/>
-      <w:r>
-        <w:rPr>
-          <w:rFonts w:ascii="Times New Roman" w:eastAsia="Times New Roman" w:hAnsi="Times New Roman" w:cs="Times New Roman"/>
-          <w:sz w:val="30"/>
-          <w:szCs w:val="30"/>
-        </w:rPr>
-        <w:t>LogIn</w:t>
+        <w:t>2.3 LogIn – CU001 LogIn</w:t>
       </w:r>
       <w:bookmarkEnd w:id="23"/>
-      <w:proofErr w:type="spellEnd"/>
     </w:p>
     <w:p>
       <w:pPr>
@@ -10749,14 +10658,7 @@
         <w:rPr>
           <w:rFonts w:ascii="Times New Roman" w:eastAsia="Times New Roman" w:hAnsi="Times New Roman" w:cs="Times New Roman"/>
         </w:rPr>
-        <w:t xml:space="preserve"> Diagrama </w:t>
-      </w:r>
-      <w:proofErr w:type="spellStart"/>
-      <w:r>
-        <w:rPr>
-          <w:rFonts w:ascii="Times New Roman" w:eastAsia="Times New Roman" w:hAnsi="Times New Roman" w:cs="Times New Roman"/>
-        </w:rPr>
-        <w:t>LogI</w:t>
+        <w:t xml:space="preserve"> Diagrama LogI</w:t>
       </w:r>
       <w:r>
         <w:rPr>
@@ -10765,7 +10667,6 @@
         <w:t>n</w:t>
       </w:r>
       <w:bookmarkEnd w:id="24"/>
-      <w:proofErr w:type="spellEnd"/>
     </w:p>
     <w:p>
       <w:pPr>
@@ -10908,17 +10809,8 @@
                 <w:rFonts w:ascii="Times New Roman" w:eastAsia="Times New Roman" w:hAnsi="Times New Roman" w:cs="Times New Roman"/>
                 <w:color w:val="000000"/>
               </w:rPr>
-              <w:t xml:space="preserve">CU 001 – </w:t>
-            </w:r>
-            <w:proofErr w:type="spellStart"/>
-            <w:r>
-              <w:rPr>
-                <w:rFonts w:ascii="Times New Roman" w:eastAsia="Times New Roman" w:hAnsi="Times New Roman" w:cs="Times New Roman"/>
-                <w:color w:val="000000"/>
-              </w:rPr>
-              <w:t>LogIn</w:t>
-            </w:r>
-            <w:proofErr w:type="spellEnd"/>
+              <w:t>CU 001 – LogIn</w:t>
+            </w:r>
             <w:r>
               <w:rPr>
                 <w:rFonts w:ascii="Times New Roman" w:eastAsia="Times New Roman" w:hAnsi="Times New Roman" w:cs="Times New Roman"/>
@@ -11333,27 +11225,7 @@
                 <w:sz w:val="22"/>
                 <w:szCs w:val="22"/>
               </w:rPr>
-              <w:t>El usuario ingresa al sistema y se le presenta la pantalla principal del mismo “</w:t>
-            </w:r>
-            <w:proofErr w:type="spellStart"/>
-            <w:r>
-              <w:rPr>
-                <w:rFonts w:ascii="Times New Roman" w:eastAsia="Times New Roman" w:hAnsi="Times New Roman" w:cs="Times New Roman"/>
-                <w:color w:val="000000"/>
-                <w:sz w:val="22"/>
-                <w:szCs w:val="22"/>
-              </w:rPr>
-              <w:t>LogIn</w:t>
-            </w:r>
-            <w:proofErr w:type="spellEnd"/>
-            <w:r>
-              <w:rPr>
-                <w:rFonts w:ascii="Times New Roman" w:eastAsia="Times New Roman" w:hAnsi="Times New Roman" w:cs="Times New Roman"/>
-                <w:color w:val="000000"/>
-                <w:sz w:val="22"/>
-                <w:szCs w:val="22"/>
-              </w:rPr>
-              <w:t>”.</w:t>
+              <w:t>El usuario ingresa al sistema y se le presenta la pantalla principal del mismo “LogIn”.</w:t>
             </w:r>
           </w:p>
           <w:p>
@@ -12249,7 +12121,13 @@
         <w:rPr>
           <w:rFonts w:ascii="Times New Roman" w:eastAsia="Times New Roman" w:hAnsi="Times New Roman" w:cs="Times New Roman"/>
         </w:rPr>
-        <w:t xml:space="preserve"> Pantalla GIU</w:t>
+        <w:t xml:space="preserve"> Pantalla </w:t>
+      </w:r>
+      <w:r>
+        <w:rPr>
+          <w:rFonts w:ascii="Times New Roman" w:eastAsia="Times New Roman" w:hAnsi="Times New Roman" w:cs="Times New Roman"/>
+        </w:rPr>
+        <w:t>UI</w:t>
       </w:r>
       <w:bookmarkEnd w:id="29"/>
     </w:p>
@@ -13487,7 +13365,13 @@
         <w:rPr>
           <w:rFonts w:ascii="Times New Roman" w:eastAsia="Times New Roman" w:hAnsi="Times New Roman" w:cs="Times New Roman"/>
         </w:rPr>
-        <w:t xml:space="preserve"> Pantalla GIU</w:t>
+        <w:t xml:space="preserve"> Pantalla </w:t>
+      </w:r>
+      <w:r>
+        <w:rPr>
+          <w:rFonts w:ascii="Times New Roman" w:eastAsia="Times New Roman" w:hAnsi="Times New Roman" w:cs="Times New Roman"/>
+        </w:rPr>
+        <w:t>UI</w:t>
       </w:r>
       <w:bookmarkEnd w:id="36"/>
     </w:p>
@@ -13515,13 +13399,14 @@
           <w:rFonts w:ascii="Times New Roman" w:eastAsia="Times New Roman" w:hAnsi="Times New Roman" w:cs="Times New Roman"/>
           <w:b/>
           <w:bCs/>
+          <w:noProof/>
           <w:color w:val="000000"/>
         </w:rPr>
         <w:drawing>
-          <wp:inline distT="0" distB="0" distL="0" distR="0" wp14:anchorId="52F68485" wp14:editId="6CEAFFAD">
-            <wp:extent cx="5890260" cy="3541498"/>
-            <wp:effectExtent l="0" t="0" r="0" b="1905"/>
-            <wp:docPr id="1225953194" name="Imagen 1"/>
+          <wp:inline distT="0" distB="0" distL="0" distR="0" wp14:anchorId="13F6B01F" wp14:editId="3298892F">
+            <wp:extent cx="6418501" cy="3893820"/>
+            <wp:effectExtent l="0" t="0" r="1905" b="0"/>
+            <wp:docPr id="1476166984" name="Imagen 1"/>
             <wp:cNvGraphicFramePr>
               <a:graphicFrameLocks xmlns:a="http://schemas.openxmlformats.org/drawingml/2006/main" noChangeAspect="1"/>
             </wp:cNvGraphicFramePr>
@@ -13529,7 +13414,7 @@
               <a:graphicData uri="http://schemas.openxmlformats.org/drawingml/2006/picture">
                 <pic:pic xmlns:pic="http://schemas.openxmlformats.org/drawingml/2006/picture">
                   <pic:nvPicPr>
-                    <pic:cNvPr id="1225953194" name=""/>
+                    <pic:cNvPr id="1476166984" name=""/>
                     <pic:cNvPicPr/>
                   </pic:nvPicPr>
                   <pic:blipFill>
@@ -13541,7 +13426,7 @@
                   <pic:spPr>
                     <a:xfrm>
                       <a:off x="0" y="0"/>
-                      <a:ext cx="5892532" cy="3542864"/>
+                      <a:ext cx="6422404" cy="3896188"/>
                     </a:xfrm>
                     <a:prstGeom prst="rect">
                       <a:avLst/>
@@ -13893,6 +13778,13 @@
     </w:p>
     <w:p>
       <w:pPr>
+        <w:rPr>
+          <w:rFonts w:ascii="Times New Roman" w:hAnsi="Times New Roman" w:cs="Times New Roman"/>
+        </w:rPr>
+      </w:pPr>
+    </w:p>
+    <w:p>
+      <w:pPr>
         <w:pStyle w:val="Ttulo2"/>
         <w:rPr>
           <w:rFonts w:ascii="Times New Roman" w:eastAsia="Times New Roman" w:hAnsi="Times New Roman" w:cs="Times New Roman"/>
@@ -13900,7 +13792,7 @@
           <w:szCs w:val="30"/>
         </w:rPr>
       </w:pPr>
-      <w:bookmarkStart w:id="43" w:name="_Toc230806286"/>
+      <w:bookmarkStart w:id="43" w:name="_Toc230806287"/>
       <w:r>
         <w:rPr>
           <w:rFonts w:ascii="Times New Roman" w:eastAsia="Times New Roman" w:hAnsi="Times New Roman" w:cs="Times New Roman"/>
@@ -13924,149 +13816,65 @@
           <w:sz w:val="30"/>
           <w:szCs w:val="30"/>
         </w:rPr>
-        <w:t xml:space="preserve"> Pantalla GIU</w:t>
+        <w:t xml:space="preserve"> CU003 </w:t>
+      </w:r>
+      <w:r>
+        <w:rPr>
+          <w:rFonts w:ascii="Times New Roman" w:eastAsia="Times New Roman" w:hAnsi="Times New Roman" w:cs="Times New Roman"/>
+          <w:sz w:val="30"/>
+          <w:szCs w:val="30"/>
+        </w:rPr>
+        <w:t>Registrar</w:t>
+      </w:r>
+      <w:r>
+        <w:rPr>
+          <w:rFonts w:ascii="Times New Roman" w:eastAsia="Times New Roman" w:hAnsi="Times New Roman" w:cs="Times New Roman"/>
+          <w:sz w:val="30"/>
+          <w:szCs w:val="30"/>
+        </w:rPr>
+        <w:t xml:space="preserve"> Usuario</w:t>
       </w:r>
       <w:bookmarkEnd w:id="43"/>
     </w:p>
     <w:p>
       <w:pPr>
-        <w:rPr>
-          <w:rFonts w:ascii="Times New Roman" w:hAnsi="Times New Roman" w:cs="Times New Roman"/>
-        </w:rPr>
-      </w:pPr>
-      <w:r>
-        <w:rPr>
-          <w:rFonts w:ascii="Times New Roman" w:hAnsi="Times New Roman" w:cs="Times New Roman"/>
-          <w:noProof/>
-        </w:rPr>
-        <w:drawing>
-          <wp:inline distT="0" distB="0" distL="0" distR="0" wp14:anchorId="1901A65F" wp14:editId="78E4BDCB">
-            <wp:extent cx="6372180" cy="2430780"/>
-            <wp:effectExtent l="0" t="0" r="0" b="7620"/>
-            <wp:docPr id="1676185359" name="Imagen 1"/>
-            <wp:cNvGraphicFramePr>
-              <a:graphicFrameLocks xmlns:a="http://schemas.openxmlformats.org/drawingml/2006/main" noChangeAspect="1"/>
-            </wp:cNvGraphicFramePr>
-            <a:graphic xmlns:a="http://schemas.openxmlformats.org/drawingml/2006/main">
-              <a:graphicData uri="http://schemas.openxmlformats.org/drawingml/2006/picture">
-                <pic:pic xmlns:pic="http://schemas.openxmlformats.org/drawingml/2006/picture">
-                  <pic:nvPicPr>
-                    <pic:cNvPr id="1676185359" name=""/>
-                    <pic:cNvPicPr/>
-                  </pic:nvPicPr>
-                  <pic:blipFill>
-                    <a:blip r:embed="rId29"/>
-                    <a:stretch>
-                      <a:fillRect/>
-                    </a:stretch>
-                  </pic:blipFill>
-                  <pic:spPr>
-                    <a:xfrm>
-                      <a:off x="0" y="0"/>
-                      <a:ext cx="6377941" cy="2432977"/>
-                    </a:xfrm>
-                    <a:prstGeom prst="rect">
-                      <a:avLst/>
-                    </a:prstGeom>
-                  </pic:spPr>
-                </pic:pic>
-              </a:graphicData>
-            </a:graphic>
-          </wp:inline>
-        </w:drawing>
-      </w:r>
-    </w:p>
-    <w:p>
-      <w:pPr>
-        <w:pStyle w:val="Ttulo2"/>
-        <w:rPr>
-          <w:rFonts w:ascii="Times New Roman" w:eastAsia="Times New Roman" w:hAnsi="Times New Roman" w:cs="Times New Roman"/>
-          <w:sz w:val="30"/>
-          <w:szCs w:val="30"/>
-        </w:rPr>
-      </w:pPr>
-      <w:bookmarkStart w:id="44" w:name="_Toc230806287"/>
-      <w:r>
-        <w:rPr>
-          <w:rFonts w:ascii="Times New Roman" w:eastAsia="Times New Roman" w:hAnsi="Times New Roman" w:cs="Times New Roman"/>
-          <w:sz w:val="30"/>
-          <w:szCs w:val="30"/>
+        <w:pStyle w:val="Ttulo3"/>
+        <w:rPr>
+          <w:rFonts w:ascii="Times New Roman" w:eastAsia="Times New Roman" w:hAnsi="Times New Roman" w:cs="Times New Roman"/>
+        </w:rPr>
+      </w:pPr>
+      <w:bookmarkStart w:id="44" w:name="_Toc230806288"/>
+      <w:r>
+        <w:rPr>
+          <w:rFonts w:ascii="Times New Roman" w:eastAsia="Times New Roman" w:hAnsi="Times New Roman" w:cs="Times New Roman"/>
         </w:rPr>
         <w:t>3.</w:t>
       </w:r>
       <w:r>
         <w:rPr>
           <w:rFonts w:ascii="Times New Roman" w:eastAsia="Times New Roman" w:hAnsi="Times New Roman" w:cs="Times New Roman"/>
-          <w:sz w:val="30"/>
-          <w:szCs w:val="30"/>
-        </w:rPr>
-        <w:t>6</w:t>
-      </w:r>
-      <w:r>
-        <w:rPr>
-          <w:rFonts w:ascii="Times New Roman" w:eastAsia="Times New Roman" w:hAnsi="Times New Roman" w:cs="Times New Roman"/>
-          <w:sz w:val="30"/>
-          <w:szCs w:val="30"/>
-        </w:rPr>
-        <w:t xml:space="preserve"> CU003 </w:t>
-      </w:r>
-      <w:r>
-        <w:rPr>
-          <w:rFonts w:ascii="Times New Roman" w:eastAsia="Times New Roman" w:hAnsi="Times New Roman" w:cs="Times New Roman"/>
-          <w:sz w:val="30"/>
-          <w:szCs w:val="30"/>
-        </w:rPr>
-        <w:t>Registrar</w:t>
-      </w:r>
-      <w:r>
-        <w:rPr>
-          <w:rFonts w:ascii="Times New Roman" w:eastAsia="Times New Roman" w:hAnsi="Times New Roman" w:cs="Times New Roman"/>
-          <w:sz w:val="30"/>
-          <w:szCs w:val="30"/>
-        </w:rPr>
-        <w:t xml:space="preserve"> Usuario</w:t>
+        </w:rPr>
+        <w:t>5</w:t>
+      </w:r>
+      <w:r>
+        <w:rPr>
+          <w:rFonts w:ascii="Times New Roman" w:eastAsia="Times New Roman" w:hAnsi="Times New Roman" w:cs="Times New Roman"/>
+        </w:rPr>
+        <w:t>.</w:t>
+      </w:r>
+      <w:r>
+        <w:rPr>
+          <w:rFonts w:ascii="Times New Roman" w:eastAsia="Times New Roman" w:hAnsi="Times New Roman" w:cs="Times New Roman"/>
+        </w:rPr>
+        <w:t>1</w:t>
+      </w:r>
+      <w:r>
+        <w:rPr>
+          <w:rFonts w:ascii="Times New Roman" w:eastAsia="Times New Roman" w:hAnsi="Times New Roman" w:cs="Times New Roman"/>
+        </w:rPr>
+        <w:t xml:space="preserve"> Especificación CU</w:t>
       </w:r>
       <w:bookmarkEnd w:id="44"/>
-    </w:p>
-    <w:p>
-      <w:pPr>
-        <w:pStyle w:val="Ttulo3"/>
-        <w:rPr>
-          <w:rFonts w:ascii="Times New Roman" w:eastAsia="Times New Roman" w:hAnsi="Times New Roman" w:cs="Times New Roman"/>
-        </w:rPr>
-      </w:pPr>
-      <w:bookmarkStart w:id="45" w:name="_Toc230806288"/>
-      <w:r>
-        <w:rPr>
-          <w:rFonts w:ascii="Times New Roman" w:eastAsia="Times New Roman" w:hAnsi="Times New Roman" w:cs="Times New Roman"/>
-        </w:rPr>
-        <w:t>3.</w:t>
-      </w:r>
-      <w:r>
-        <w:rPr>
-          <w:rFonts w:ascii="Times New Roman" w:eastAsia="Times New Roman" w:hAnsi="Times New Roman" w:cs="Times New Roman"/>
-        </w:rPr>
-        <w:t>6</w:t>
-      </w:r>
-      <w:r>
-        <w:rPr>
-          <w:rFonts w:ascii="Times New Roman" w:eastAsia="Times New Roman" w:hAnsi="Times New Roman" w:cs="Times New Roman"/>
-        </w:rPr>
-        <w:t>.</w:t>
-      </w:r>
-      <w:r>
-        <w:rPr>
-          <w:rFonts w:ascii="Times New Roman" w:eastAsia="Times New Roman" w:hAnsi="Times New Roman" w:cs="Times New Roman"/>
-        </w:rPr>
-        <w:t>1</w:t>
-      </w:r>
-      <w:r>
-        <w:rPr>
-          <w:rFonts w:ascii="Times New Roman" w:eastAsia="Times New Roman" w:hAnsi="Times New Roman" w:cs="Times New Roman"/>
-        </w:rPr>
-        <w:t xml:space="preserve"> Especificación CU</w:t>
-      </w:r>
-      <w:bookmarkEnd w:id="45"/>
       <w:r>
         <w:rPr>
           <w:rFonts w:ascii="Times New Roman" w:eastAsia="Times New Roman" w:hAnsi="Times New Roman" w:cs="Times New Roman"/>
@@ -14764,7 +14572,6 @@
                 <w:bCs/>
                 <w:color w:val="000000"/>
               </w:rPr>
-              <w:lastRenderedPageBreak/>
               <w:t>FLUJOS ALTERNATIVO: </w:t>
             </w:r>
           </w:p>
@@ -14978,18 +14785,19 @@
           <w:rFonts w:ascii="Times New Roman" w:eastAsia="Times New Roman" w:hAnsi="Times New Roman" w:cs="Times New Roman"/>
         </w:rPr>
       </w:pPr>
-      <w:bookmarkStart w:id="46" w:name="_Toc230806289"/>
-      <w:r>
-        <w:rPr>
-          <w:rFonts w:ascii="Times New Roman" w:eastAsia="Times New Roman" w:hAnsi="Times New Roman" w:cs="Times New Roman"/>
-        </w:rPr>
+      <w:bookmarkStart w:id="45" w:name="_Toc230806289"/>
+      <w:r>
+        <w:rPr>
+          <w:rFonts w:ascii="Times New Roman" w:eastAsia="Times New Roman" w:hAnsi="Times New Roman" w:cs="Times New Roman"/>
+        </w:rPr>
+        <w:lastRenderedPageBreak/>
         <w:t>3.</w:t>
       </w:r>
       <w:r>
         <w:rPr>
           <w:rFonts w:ascii="Times New Roman" w:eastAsia="Times New Roman" w:hAnsi="Times New Roman" w:cs="Times New Roman"/>
         </w:rPr>
-        <w:t>6</w:t>
+        <w:t>5</w:t>
       </w:r>
       <w:r>
         <w:rPr>
@@ -15009,7 +14817,7 @@
         </w:rPr>
         <w:t xml:space="preserve"> Diagrama Secuencia Sistema</w:t>
       </w:r>
-      <w:bookmarkEnd w:id="46"/>
+      <w:bookmarkEnd w:id="45"/>
       <w:r>
         <w:rPr>
           <w:rFonts w:ascii="Times New Roman" w:eastAsia="Times New Roman" w:hAnsi="Times New Roman" w:cs="Times New Roman"/>
@@ -15049,7 +14857,7 @@
                     </pic:cNvPicPr>
                   </pic:nvPicPr>
                   <pic:blipFill>
-                    <a:blip r:embed="rId30">
+                    <a:blip r:embed="rId29">
                       <a:extLst>
                         <a:ext uri="{28A0092B-C50C-407E-A947-70E740481C1C}">
                           <a14:useLocalDpi xmlns:a14="http://schemas.microsoft.com/office/drawing/2010/main" val="0"/>
@@ -15090,14 +14898,13 @@
           <w:szCs w:val="30"/>
         </w:rPr>
       </w:pPr>
-      <w:bookmarkStart w:id="47" w:name="_Toc230806290"/>
+      <w:bookmarkStart w:id="46" w:name="_Toc230806290"/>
       <w:r>
         <w:rPr>
           <w:rFonts w:ascii="Times New Roman" w:eastAsia="Times New Roman" w:hAnsi="Times New Roman" w:cs="Times New Roman"/>
           <w:sz w:val="30"/>
           <w:szCs w:val="30"/>
         </w:rPr>
-        <w:lastRenderedPageBreak/>
         <w:t>3.</w:t>
       </w:r>
       <w:r>
@@ -15106,7 +14913,7 @@
           <w:sz w:val="30"/>
           <w:szCs w:val="30"/>
         </w:rPr>
-        <w:t>7</w:t>
+        <w:t>6</w:t>
       </w:r>
       <w:r>
         <w:rPr>
@@ -15140,7 +14947,7 @@
         </w:rPr>
         <w:t xml:space="preserve"> Usuario</w:t>
       </w:r>
-      <w:bookmarkEnd w:id="47"/>
+      <w:bookmarkEnd w:id="46"/>
     </w:p>
     <w:p>
       <w:pPr>
@@ -15149,7 +14956,7 @@
           <w:rFonts w:ascii="Times New Roman" w:eastAsia="Times New Roman" w:hAnsi="Times New Roman" w:cs="Times New Roman"/>
         </w:rPr>
       </w:pPr>
-      <w:bookmarkStart w:id="48" w:name="_Toc230806291"/>
+      <w:bookmarkStart w:id="47" w:name="_Toc230806291"/>
       <w:r>
         <w:rPr>
           <w:rFonts w:ascii="Times New Roman" w:eastAsia="Times New Roman" w:hAnsi="Times New Roman" w:cs="Times New Roman"/>
@@ -15160,7 +14967,7 @@
         <w:rPr>
           <w:rFonts w:ascii="Times New Roman" w:eastAsia="Times New Roman" w:hAnsi="Times New Roman" w:cs="Times New Roman"/>
         </w:rPr>
-        <w:t>7</w:t>
+        <w:t>6</w:t>
       </w:r>
       <w:r>
         <w:rPr>
@@ -15180,7 +14987,7 @@
         </w:rPr>
         <w:t xml:space="preserve"> Especificación CU</w:t>
       </w:r>
-      <w:bookmarkEnd w:id="48"/>
+      <w:bookmarkEnd w:id="47"/>
       <w:r>
         <w:rPr>
           <w:rFonts w:ascii="Times New Roman" w:eastAsia="Times New Roman" w:hAnsi="Times New Roman" w:cs="Times New Roman"/>
@@ -15477,6 +15284,7 @@
                 <w:bCs/>
                 <w:color w:val="000000"/>
               </w:rPr>
+              <w:lastRenderedPageBreak/>
               <w:t xml:space="preserve">PRECONDICIONES: </w:t>
             </w:r>
             <w:r>
@@ -16046,7 +15854,7 @@
           <w:rFonts w:ascii="Times New Roman" w:eastAsia="Times New Roman" w:hAnsi="Times New Roman" w:cs="Times New Roman"/>
         </w:rPr>
       </w:pPr>
-      <w:bookmarkStart w:id="49" w:name="_Toc230806292"/>
+      <w:bookmarkStart w:id="48" w:name="_Toc230806292"/>
       <w:r>
         <w:rPr>
           <w:rFonts w:ascii="Times New Roman" w:eastAsia="Times New Roman" w:hAnsi="Times New Roman" w:cs="Times New Roman"/>
@@ -16058,7 +15866,7 @@
         <w:rPr>
           <w:rFonts w:ascii="Times New Roman" w:eastAsia="Times New Roman" w:hAnsi="Times New Roman" w:cs="Times New Roman"/>
         </w:rPr>
-        <w:t>7</w:t>
+        <w:t>6</w:t>
       </w:r>
       <w:r>
         <w:rPr>
@@ -16078,7 +15886,7 @@
         </w:rPr>
         <w:t xml:space="preserve"> Diagrama Secuencia Sistema</w:t>
       </w:r>
-      <w:bookmarkEnd w:id="49"/>
+      <w:bookmarkEnd w:id="48"/>
       <w:r>
         <w:rPr>
           <w:rFonts w:ascii="Times New Roman" w:eastAsia="Times New Roman" w:hAnsi="Times New Roman" w:cs="Times New Roman"/>
@@ -16115,7 +15923,7 @@
                     </pic:cNvPicPr>
                   </pic:nvPicPr>
                   <pic:blipFill>
-                    <a:blip r:embed="rId31">
+                    <a:blip r:embed="rId30">
                       <a:extLst>
                         <a:ext uri="{28A0092B-C50C-407E-A947-70E740481C1C}">
                           <a14:useLocalDpi xmlns:a14="http://schemas.microsoft.com/office/drawing/2010/main" val="0"/>
@@ -16156,7 +15964,7 @@
           <w:szCs w:val="30"/>
         </w:rPr>
       </w:pPr>
-      <w:bookmarkStart w:id="50" w:name="_Toc230806293"/>
+      <w:bookmarkStart w:id="49" w:name="_Toc230806293"/>
       <w:r>
         <w:rPr>
           <w:rFonts w:ascii="Times New Roman" w:eastAsia="Times New Roman" w:hAnsi="Times New Roman" w:cs="Times New Roman"/>
@@ -16171,7 +15979,7 @@
           <w:sz w:val="30"/>
           <w:szCs w:val="30"/>
         </w:rPr>
-        <w:t>8</w:t>
+        <w:t>7</w:t>
       </w:r>
       <w:r>
         <w:rPr>
@@ -16197,7 +16005,7 @@
         </w:rPr>
         <w:t xml:space="preserve"> Usuario</w:t>
       </w:r>
-      <w:bookmarkEnd w:id="50"/>
+      <w:bookmarkEnd w:id="49"/>
     </w:p>
     <w:p>
       <w:pPr>
@@ -16206,7 +16014,7 @@
           <w:rFonts w:ascii="Times New Roman" w:eastAsia="Times New Roman" w:hAnsi="Times New Roman" w:cs="Times New Roman"/>
         </w:rPr>
       </w:pPr>
-      <w:bookmarkStart w:id="51" w:name="_Toc230806294"/>
+      <w:bookmarkStart w:id="50" w:name="_Toc230806294"/>
       <w:r>
         <w:rPr>
           <w:rFonts w:ascii="Times New Roman" w:eastAsia="Times New Roman" w:hAnsi="Times New Roman" w:cs="Times New Roman"/>
@@ -16217,7 +16025,7 @@
         <w:rPr>
           <w:rFonts w:ascii="Times New Roman" w:eastAsia="Times New Roman" w:hAnsi="Times New Roman" w:cs="Times New Roman"/>
         </w:rPr>
-        <w:t>8</w:t>
+        <w:t>7</w:t>
       </w:r>
       <w:r>
         <w:rPr>
@@ -16237,7 +16045,7 @@
         </w:rPr>
         <w:t xml:space="preserve"> Especificación CU</w:t>
       </w:r>
-      <w:bookmarkEnd w:id="51"/>
+      <w:bookmarkEnd w:id="50"/>
       <w:r>
         <w:rPr>
           <w:rFonts w:ascii="Times New Roman" w:eastAsia="Times New Roman" w:hAnsi="Times New Roman" w:cs="Times New Roman"/>
@@ -17173,7 +16981,7 @@
           <w:rFonts w:ascii="Times New Roman" w:eastAsia="Times New Roman" w:hAnsi="Times New Roman" w:cs="Times New Roman"/>
         </w:rPr>
       </w:pPr>
-      <w:bookmarkStart w:id="52" w:name="_Toc230806295"/>
+      <w:bookmarkStart w:id="51" w:name="_Toc230806295"/>
       <w:r>
         <w:rPr>
           <w:rFonts w:ascii="Times New Roman" w:eastAsia="Times New Roman" w:hAnsi="Times New Roman" w:cs="Times New Roman"/>
@@ -17185,7 +16993,7 @@
         <w:rPr>
           <w:rFonts w:ascii="Times New Roman" w:eastAsia="Times New Roman" w:hAnsi="Times New Roman" w:cs="Times New Roman"/>
         </w:rPr>
-        <w:t>8</w:t>
+        <w:t>7</w:t>
       </w:r>
       <w:r>
         <w:rPr>
@@ -17205,7 +17013,7 @@
         </w:rPr>
         <w:t xml:space="preserve"> Diagrama Secuencia Sistema</w:t>
       </w:r>
-      <w:bookmarkEnd w:id="52"/>
+      <w:bookmarkEnd w:id="51"/>
       <w:r>
         <w:rPr>
           <w:rFonts w:ascii="Times New Roman" w:eastAsia="Times New Roman" w:hAnsi="Times New Roman" w:cs="Times New Roman"/>
@@ -17236,7 +17044,7 @@
                     </pic:cNvPicPr>
                   </pic:nvPicPr>
                   <pic:blipFill>
-                    <a:blip r:embed="rId32">
+                    <a:blip r:embed="rId31">
                       <a:extLst>
                         <a:ext uri="{28A0092B-C50C-407E-A947-70E740481C1C}">
                           <a14:useLocalDpi xmlns:a14="http://schemas.microsoft.com/office/drawing/2010/main" val="0"/>
@@ -17270,6 +17078,94 @@
     </w:p>
     <w:p>
       <w:pPr>
+        <w:pStyle w:val="Ttulo2"/>
+        <w:rPr>
+          <w:rFonts w:ascii="Times New Roman" w:eastAsia="Times New Roman" w:hAnsi="Times New Roman" w:cs="Times New Roman"/>
+          <w:sz w:val="30"/>
+          <w:szCs w:val="30"/>
+        </w:rPr>
+      </w:pPr>
+      <w:bookmarkStart w:id="52" w:name="_Toc230806286"/>
+      <w:r>
+        <w:rPr>
+          <w:rFonts w:ascii="Times New Roman" w:eastAsia="Times New Roman" w:hAnsi="Times New Roman" w:cs="Times New Roman"/>
+          <w:sz w:val="30"/>
+          <w:szCs w:val="30"/>
+        </w:rPr>
+        <w:lastRenderedPageBreak/>
+        <w:t>3.</w:t>
+      </w:r>
+      <w:r>
+        <w:rPr>
+          <w:rFonts w:ascii="Times New Roman" w:eastAsia="Times New Roman" w:hAnsi="Times New Roman" w:cs="Times New Roman"/>
+          <w:sz w:val="30"/>
+          <w:szCs w:val="30"/>
+        </w:rPr>
+        <w:t>8</w:t>
+      </w:r>
+      <w:r>
+        <w:rPr>
+          <w:rFonts w:ascii="Times New Roman" w:eastAsia="Times New Roman" w:hAnsi="Times New Roman" w:cs="Times New Roman"/>
+          <w:sz w:val="30"/>
+          <w:szCs w:val="30"/>
+        </w:rPr>
+        <w:t xml:space="preserve"> Pantalla </w:t>
+      </w:r>
+      <w:r>
+        <w:rPr>
+          <w:rFonts w:ascii="Times New Roman" w:eastAsia="Times New Roman" w:hAnsi="Times New Roman" w:cs="Times New Roman"/>
+          <w:sz w:val="30"/>
+          <w:szCs w:val="30"/>
+        </w:rPr>
+        <w:t>UI</w:t>
+      </w:r>
+      <w:bookmarkEnd w:id="52"/>
+    </w:p>
+    <w:p>
+      <w:r>
+        <w:rPr>
+          <w:rFonts w:ascii="Times New Roman" w:hAnsi="Times New Roman" w:cs="Times New Roman"/>
+          <w:noProof/>
+        </w:rPr>
+        <w:drawing>
+          <wp:inline distT="0" distB="0" distL="0" distR="0" wp14:anchorId="736D98C5" wp14:editId="7647EF29">
+            <wp:extent cx="5400040" cy="2060131"/>
+            <wp:effectExtent l="0" t="0" r="0" b="0"/>
+            <wp:docPr id="1676185359" name="Imagen 1"/>
+            <wp:cNvGraphicFramePr>
+              <a:graphicFrameLocks xmlns:a="http://schemas.openxmlformats.org/drawingml/2006/main" noChangeAspect="1"/>
+            </wp:cNvGraphicFramePr>
+            <a:graphic xmlns:a="http://schemas.openxmlformats.org/drawingml/2006/main">
+              <a:graphicData uri="http://schemas.openxmlformats.org/drawingml/2006/picture">
+                <pic:pic xmlns:pic="http://schemas.openxmlformats.org/drawingml/2006/picture">
+                  <pic:nvPicPr>
+                    <pic:cNvPr id="1676185359" name=""/>
+                    <pic:cNvPicPr/>
+                  </pic:nvPicPr>
+                  <pic:blipFill>
+                    <a:blip r:embed="rId32"/>
+                    <a:stretch>
+                      <a:fillRect/>
+                    </a:stretch>
+                  </pic:blipFill>
+                  <pic:spPr>
+                    <a:xfrm>
+                      <a:off x="0" y="0"/>
+                      <a:ext cx="5400040" cy="2060131"/>
+                    </a:xfrm>
+                    <a:prstGeom prst="rect">
+                      <a:avLst/>
+                    </a:prstGeom>
+                  </pic:spPr>
+                </pic:pic>
+              </a:graphicData>
+            </a:graphic>
+          </wp:inline>
+        </w:drawing>
+      </w:r>
+    </w:p>
+    <w:p>
+      <w:pPr>
         <w:pStyle w:val="Ttulo1"/>
         <w:rPr>
           <w:rFonts w:ascii="Times New Roman" w:eastAsia="Times New Roman" w:hAnsi="Times New Roman" w:cs="Times New Roman"/>
@@ -17394,14 +17290,7 @@
         <w:rPr>
           <w:rFonts w:ascii="Times New Roman" w:hAnsi="Times New Roman" w:cs="Times New Roman"/>
         </w:rPr>
-        <w:t xml:space="preserve">La utilización de la bitácora nos permite llevar un registro de las acciones realizadas dentro del sistema por parte de un usuario del mismo. Cada evento registrado en la </w:t>
-      </w:r>
-      <w:r>
-        <w:rPr>
-          <w:rFonts w:ascii="Times New Roman" w:hAnsi="Times New Roman" w:cs="Times New Roman"/>
-        </w:rPr>
-        <w:lastRenderedPageBreak/>
-        <w:t>bitácora va a tener la fecha y hora en la que se realizó, el correo electrónico del usuario de quien la llevo a cabo, la actividad y la información asociada.</w:t>
+        <w:t>La utilización de la bitácora nos permite llevar un registro de las acciones realizadas dentro del sistema por parte de un usuario del mismo. Cada evento registrado en la bitácora va a tener la fecha y hora en la que se realizó, el correo electrónico del usuario de quien la llevo a cabo, la actividad y la información asociada.</w:t>
       </w:r>
     </w:p>
     <w:p>
@@ -17488,6 +17377,7 @@
         <w:rPr>
           <w:rFonts w:ascii="Times New Roman" w:eastAsia="Times New Roman" w:hAnsi="Times New Roman" w:cs="Times New Roman"/>
         </w:rPr>
+        <w:lastRenderedPageBreak/>
         <w:t>4.1.2 Diagrama de Clases</w:t>
       </w:r>
       <w:bookmarkEnd w:id="57"/>
@@ -17971,21 +17861,7 @@
         <w:rPr>
           <w:rFonts w:ascii="Times New Roman" w:hAnsi="Times New Roman" w:cs="Times New Roman"/>
         </w:rPr>
-        <w:t xml:space="preserve">Con el objetivo de garantizar la seguridad de las contraseñas de los usuarios, en este proyecto se aplica el algoritmo SHA-256, encargado de transformar una cadena de texto en un valor de longitud determinado, denominado "hash". Este es un algoritmo de </w:t>
-      </w:r>
-      <w:proofErr w:type="spellStart"/>
-      <w:r>
-        <w:rPr>
-          <w:rFonts w:ascii="Times New Roman" w:hAnsi="Times New Roman" w:cs="Times New Roman"/>
-        </w:rPr>
-        <w:t>hashing</w:t>
-      </w:r>
-      <w:proofErr w:type="spellEnd"/>
-      <w:r>
-        <w:rPr>
-          <w:rFonts w:ascii="Times New Roman" w:hAnsi="Times New Roman" w:cs="Times New Roman"/>
-        </w:rPr>
-        <w:t xml:space="preserve"> unidireccional, lo que significa que no es posible desencriptar el hash para obtener la contraseña original. </w:t>
+        <w:t xml:space="preserve">Con el objetivo de garantizar la seguridad de las contraseñas de los usuarios, en este proyecto se aplica el algoritmo SHA-256, encargado de transformar una cadena de texto en un valor de longitud determinado, denominado "hash". Este es un algoritmo de hashing unidireccional, lo que significa que no es posible desencriptar el hash para obtener la contraseña original. </w:t>
       </w:r>
     </w:p>
     <w:p>
@@ -17998,35 +17874,7 @@
         <w:rPr>
           <w:rFonts w:ascii="Times New Roman" w:hAnsi="Times New Roman" w:cs="Times New Roman"/>
         </w:rPr>
-        <w:t xml:space="preserve">Tanto para la creación de usuarios como para el logueo en el sistema de estos mismos, se deberá ingresar una clave. Esta clave será </w:t>
-      </w:r>
-      <w:proofErr w:type="spellStart"/>
-      <w:r>
-        <w:rPr>
-          <w:rFonts w:ascii="Times New Roman" w:hAnsi="Times New Roman" w:cs="Times New Roman"/>
-        </w:rPr>
-        <w:t>hasheada</w:t>
-      </w:r>
-      <w:proofErr w:type="spellEnd"/>
-      <w:r>
-        <w:rPr>
-          <w:rFonts w:ascii="Times New Roman" w:hAnsi="Times New Roman" w:cs="Times New Roman"/>
-        </w:rPr>
-        <w:t xml:space="preserve"> por el algoritmo SHA-256 y será guardada en la base de datos. Un usuario que requiera iniciar sesión deberá ingresar su clave, en la interfaz de Inicio de sesión, el valor que coloque como clave, al seleccionar “Iniciar Sesión” será </w:t>
-      </w:r>
-      <w:proofErr w:type="spellStart"/>
-      <w:r>
-        <w:rPr>
-          <w:rFonts w:ascii="Times New Roman" w:hAnsi="Times New Roman" w:cs="Times New Roman"/>
-        </w:rPr>
-        <w:t>hasheado</w:t>
-      </w:r>
-      <w:proofErr w:type="spellEnd"/>
-      <w:r>
-        <w:rPr>
-          <w:rFonts w:ascii="Times New Roman" w:hAnsi="Times New Roman" w:cs="Times New Roman"/>
-        </w:rPr>
-        <w:t xml:space="preserve"> y comparado con el valor que se encuentre en la base de datos. Si estos valores coinciden, la sesión es iniciada, en el caso contrario donde no coincidan, se mostrará al usuario un error de contraseña incorrecta. </w:t>
+        <w:t xml:space="preserve">Tanto para la creación de usuarios como para el logueo en el sistema de estos mismos, se deberá ingresar una clave. Esta clave será hasheada por el algoritmo SHA-256 y será guardada en la base de datos. Un usuario que requiera iniciar sesión deberá ingresar su clave, en la interfaz de Inicio de sesión, el valor que coloque como clave, al seleccionar “Iniciar Sesión” será hasheado y comparado con el valor que se encuentre en la base de datos. Si estos valores coinciden, la sesión es iniciada, en el caso contrario donde no coincidan, se mostrará al usuario un error de contraseña incorrecta. </w:t>
       </w:r>
     </w:p>
     <w:p>
@@ -18048,25 +17896,7 @@
           <w:b/>
           <w:bCs/>
         </w:rPr>
-        <w:t xml:space="preserve">Método de la clase </w:t>
-      </w:r>
-      <w:proofErr w:type="spellStart"/>
-      <w:r>
-        <w:rPr>
-          <w:rFonts w:ascii="Times New Roman" w:hAnsi="Times New Roman" w:cs="Times New Roman"/>
-          <w:b/>
-          <w:bCs/>
-        </w:rPr>
-        <w:t>Encriptador</w:t>
-      </w:r>
-      <w:proofErr w:type="spellEnd"/>
-      <w:r>
-        <w:rPr>
-          <w:rFonts w:ascii="Times New Roman" w:hAnsi="Times New Roman" w:cs="Times New Roman"/>
-          <w:b/>
-          <w:bCs/>
-        </w:rPr>
-        <w:t xml:space="preserve">: </w:t>
+        <w:t xml:space="preserve">Método de la clase Encriptador: </w:t>
       </w:r>
     </w:p>
     <w:p>
@@ -18079,21 +17909,7 @@
         <w:rPr>
           <w:rFonts w:ascii="Times New Roman" w:hAnsi="Times New Roman" w:cs="Times New Roman"/>
         </w:rPr>
-        <w:t>Hash (</w:t>
-      </w:r>
-      <w:proofErr w:type="spellStart"/>
-      <w:r>
-        <w:rPr>
-          <w:rFonts w:ascii="Times New Roman" w:hAnsi="Times New Roman" w:cs="Times New Roman"/>
-        </w:rPr>
-        <w:t>string</w:t>
-      </w:r>
-      <w:proofErr w:type="spellEnd"/>
-      <w:r>
-        <w:rPr>
-          <w:rFonts w:ascii="Times New Roman" w:hAnsi="Times New Roman" w:cs="Times New Roman"/>
-        </w:rPr>
-        <w:t xml:space="preserve"> input): Este método toma una cadena de texto (como una contraseña en texto plano) y la convierte en un hash de 256 bits utilizando el algoritmo SHA-256. </w:t>
+        <w:t xml:space="preserve">Hash (string input): Este método toma una cadena de texto (como una contraseña en texto plano) y la convierte en un hash de 256 bits utilizando el algoritmo SHA-256. </w:t>
       </w:r>
     </w:p>
     <w:p>
@@ -18153,21 +17969,7 @@
         <w:rPr>
           <w:rFonts w:ascii="Times New Roman" w:hAnsi="Times New Roman" w:cs="Times New Roman"/>
         </w:rPr>
-        <w:t xml:space="preserve">Al momento de registrar un usuario en el sistema y completar la contraseña de este mismo, en la base de datos el campo que contiene la contraseña no será visible para la persona. Ej: Si la contraseña es Hola123, en la base de datos se </w:t>
-      </w:r>
-      <w:proofErr w:type="spellStart"/>
-      <w:r>
-        <w:rPr>
-          <w:rFonts w:ascii="Times New Roman" w:hAnsi="Times New Roman" w:cs="Times New Roman"/>
-        </w:rPr>
-        <w:t>vera</w:t>
-      </w:r>
-      <w:proofErr w:type="spellEnd"/>
-      <w:r>
-        <w:rPr>
-          <w:rFonts w:ascii="Times New Roman" w:hAnsi="Times New Roman" w:cs="Times New Roman"/>
-        </w:rPr>
-        <w:t xml:space="preserve"> de la siguiente manera: (Imagen ilustrativa de ejemplo)</w:t>
+        <w:t>Al momento de registrar un usuario en el sistema y completar la contraseña de este mismo, en la base de datos el campo que contiene la contraseña no será visible para la persona. Ej: Si la contraseña es Hola123, en la base de datos se vera de la siguiente manera: (Imagen ilustrativa de ejemplo)</w:t>
       </w:r>
     </w:p>
     <w:p>
@@ -18597,7 +18399,7 @@
           <w:szCs w:val="30"/>
         </w:rPr>
       </w:pPr>
-      <w:bookmarkStart w:id="70" w:name="_Toc230806312"/>
+      <w:bookmarkStart w:id="70" w:name="_Toc230806313"/>
       <w:r>
         <w:rPr>
           <w:rFonts w:ascii="Times New Roman" w:eastAsia="Times New Roman" w:hAnsi="Times New Roman" w:cs="Times New Roman"/>
@@ -18612,163 +18414,103 @@
           <w:sz w:val="30"/>
           <w:szCs w:val="30"/>
         </w:rPr>
-        <w:t>.4 Pantalla GIU</w:t>
+        <w:t>.</w:t>
+      </w:r>
+      <w:r>
+        <w:rPr>
+          <w:rFonts w:ascii="Times New Roman" w:eastAsia="Times New Roman" w:hAnsi="Times New Roman" w:cs="Times New Roman"/>
+          <w:sz w:val="30"/>
+          <w:szCs w:val="30"/>
+        </w:rPr>
+        <w:t>4</w:t>
+      </w:r>
+      <w:r>
+        <w:rPr>
+          <w:rFonts w:ascii="Times New Roman" w:eastAsia="Times New Roman" w:hAnsi="Times New Roman" w:cs="Times New Roman"/>
+          <w:sz w:val="30"/>
+          <w:szCs w:val="30"/>
+        </w:rPr>
+        <w:t xml:space="preserve"> CU00</w:t>
+      </w:r>
+      <w:r>
+        <w:rPr>
+          <w:rFonts w:ascii="Times New Roman" w:eastAsia="Times New Roman" w:hAnsi="Times New Roman" w:cs="Times New Roman"/>
+          <w:sz w:val="30"/>
+          <w:szCs w:val="30"/>
+        </w:rPr>
+        <w:t>6</w:t>
+      </w:r>
+      <w:r>
+        <w:rPr>
+          <w:rFonts w:ascii="Times New Roman" w:eastAsia="Times New Roman" w:hAnsi="Times New Roman" w:cs="Times New Roman"/>
+          <w:sz w:val="30"/>
+          <w:szCs w:val="30"/>
+        </w:rPr>
+        <w:t xml:space="preserve"> </w:t>
+      </w:r>
+      <w:r>
+        <w:rPr>
+          <w:rFonts w:ascii="Times New Roman" w:eastAsia="Times New Roman" w:hAnsi="Times New Roman" w:cs="Times New Roman"/>
+          <w:sz w:val="30"/>
+          <w:szCs w:val="30"/>
+        </w:rPr>
+        <w:t>Insertar</w:t>
+      </w:r>
+      <w:r>
+        <w:rPr>
+          <w:rFonts w:ascii="Times New Roman" w:eastAsia="Times New Roman" w:hAnsi="Times New Roman" w:cs="Times New Roman"/>
+          <w:sz w:val="30"/>
+          <w:szCs w:val="30"/>
+        </w:rPr>
+        <w:t xml:space="preserve"> Producto</w:t>
       </w:r>
       <w:bookmarkEnd w:id="70"/>
     </w:p>
     <w:p>
       <w:pPr>
-        <w:rPr>
-          <w:rFonts w:ascii="Times New Roman" w:hAnsi="Times New Roman" w:cs="Times New Roman"/>
-        </w:rPr>
-      </w:pPr>
-      <w:r>
-        <w:rPr>
-          <w:rFonts w:ascii="Times New Roman" w:hAnsi="Times New Roman" w:cs="Times New Roman"/>
-          <w:noProof/>
-        </w:rPr>
-        <w:drawing>
-          <wp:inline distT="0" distB="0" distL="0" distR="0" wp14:anchorId="14DD7699" wp14:editId="5349FFFC">
-            <wp:extent cx="5400040" cy="2106930"/>
-            <wp:effectExtent l="0" t="0" r="0" b="7620"/>
-            <wp:docPr id="1062332032" name="Imagen 1"/>
-            <wp:cNvGraphicFramePr>
-              <a:graphicFrameLocks xmlns:a="http://schemas.openxmlformats.org/drawingml/2006/main" noChangeAspect="1"/>
-            </wp:cNvGraphicFramePr>
-            <a:graphic xmlns:a="http://schemas.openxmlformats.org/drawingml/2006/main">
-              <a:graphicData uri="http://schemas.openxmlformats.org/drawingml/2006/picture">
-                <pic:pic xmlns:pic="http://schemas.openxmlformats.org/drawingml/2006/picture">
-                  <pic:nvPicPr>
-                    <pic:cNvPr id="1062332032" name=""/>
-                    <pic:cNvPicPr/>
-                  </pic:nvPicPr>
-                  <pic:blipFill>
-                    <a:blip r:embed="rId42"/>
-                    <a:stretch>
-                      <a:fillRect/>
-                    </a:stretch>
-                  </pic:blipFill>
-                  <pic:spPr>
-                    <a:xfrm>
-                      <a:off x="0" y="0"/>
-                      <a:ext cx="5400040" cy="2106930"/>
-                    </a:xfrm>
-                    <a:prstGeom prst="rect">
-                      <a:avLst/>
-                    </a:prstGeom>
-                  </pic:spPr>
-                </pic:pic>
-              </a:graphicData>
-            </a:graphic>
-          </wp:inline>
-        </w:drawing>
-      </w:r>
-    </w:p>
-    <w:p>
-      <w:pPr>
-        <w:pStyle w:val="Ttulo2"/>
-        <w:rPr>
-          <w:rFonts w:ascii="Times New Roman" w:eastAsia="Times New Roman" w:hAnsi="Times New Roman" w:cs="Times New Roman"/>
-          <w:sz w:val="30"/>
-          <w:szCs w:val="30"/>
-        </w:rPr>
-      </w:pPr>
-      <w:bookmarkStart w:id="71" w:name="_Toc230806313"/>
-      <w:r>
-        <w:rPr>
-          <w:rFonts w:ascii="Times New Roman" w:eastAsia="Times New Roman" w:hAnsi="Times New Roman" w:cs="Times New Roman"/>
-          <w:sz w:val="30"/>
-          <w:szCs w:val="30"/>
+        <w:pStyle w:val="Ttulo3"/>
+        <w:rPr>
+          <w:rFonts w:ascii="Times New Roman" w:eastAsia="Times New Roman" w:hAnsi="Times New Roman" w:cs="Times New Roman"/>
+        </w:rPr>
+      </w:pPr>
+      <w:bookmarkStart w:id="71" w:name="_Toc230806314"/>
+      <w:r>
+        <w:rPr>
+          <w:rFonts w:ascii="Times New Roman" w:eastAsia="Times New Roman" w:hAnsi="Times New Roman" w:cs="Times New Roman"/>
         </w:rPr>
         <w:t>6</w:t>
       </w:r>
       <w:r>
         <w:rPr>
           <w:rFonts w:ascii="Times New Roman" w:eastAsia="Times New Roman" w:hAnsi="Times New Roman" w:cs="Times New Roman"/>
-          <w:sz w:val="30"/>
-          <w:szCs w:val="30"/>
-        </w:rPr>
-        <w:t>.5 CU00</w:t>
-      </w:r>
-      <w:r>
-        <w:rPr>
-          <w:rFonts w:ascii="Times New Roman" w:eastAsia="Times New Roman" w:hAnsi="Times New Roman" w:cs="Times New Roman"/>
-          <w:sz w:val="30"/>
-          <w:szCs w:val="30"/>
-        </w:rPr>
-        <w:t>6</w:t>
-      </w:r>
-      <w:r>
-        <w:rPr>
-          <w:rFonts w:ascii="Times New Roman" w:eastAsia="Times New Roman" w:hAnsi="Times New Roman" w:cs="Times New Roman"/>
-          <w:sz w:val="30"/>
-          <w:szCs w:val="30"/>
-        </w:rPr>
-        <w:t xml:space="preserve"> </w:t>
-      </w:r>
-      <w:r>
-        <w:rPr>
-          <w:rFonts w:ascii="Times New Roman" w:eastAsia="Times New Roman" w:hAnsi="Times New Roman" w:cs="Times New Roman"/>
-          <w:sz w:val="30"/>
-          <w:szCs w:val="30"/>
-        </w:rPr>
-        <w:t>Insertar</w:t>
-      </w:r>
-      <w:r>
-        <w:rPr>
-          <w:rFonts w:ascii="Times New Roman" w:eastAsia="Times New Roman" w:hAnsi="Times New Roman" w:cs="Times New Roman"/>
-          <w:sz w:val="30"/>
-          <w:szCs w:val="30"/>
-        </w:rPr>
-        <w:t xml:space="preserve"> Producto</w:t>
+        </w:rPr>
+        <w:t>.</w:t>
+      </w:r>
+      <w:r>
+        <w:rPr>
+          <w:rFonts w:ascii="Times New Roman" w:eastAsia="Times New Roman" w:hAnsi="Times New Roman" w:cs="Times New Roman"/>
+        </w:rPr>
+        <w:t>4</w:t>
+      </w:r>
+      <w:r>
+        <w:rPr>
+          <w:rFonts w:ascii="Times New Roman" w:eastAsia="Times New Roman" w:hAnsi="Times New Roman" w:cs="Times New Roman"/>
+        </w:rPr>
+        <w:t>.</w:t>
+      </w:r>
+      <w:r>
+        <w:rPr>
+          <w:rFonts w:ascii="Times New Roman" w:eastAsia="Times New Roman" w:hAnsi="Times New Roman" w:cs="Times New Roman"/>
+        </w:rPr>
+        <w:t>1</w:t>
+      </w:r>
+      <w:r>
+        <w:rPr>
+          <w:rFonts w:ascii="Times New Roman" w:eastAsia="Times New Roman" w:hAnsi="Times New Roman" w:cs="Times New Roman"/>
+        </w:rPr>
+        <w:t xml:space="preserve"> Especificación CU</w:t>
       </w:r>
       <w:bookmarkEnd w:id="71"/>
-    </w:p>
-    <w:p>
-      <w:pPr>
-        <w:pStyle w:val="Ttulo3"/>
-        <w:rPr>
-          <w:rFonts w:ascii="Times New Roman" w:eastAsia="Times New Roman" w:hAnsi="Times New Roman" w:cs="Times New Roman"/>
-        </w:rPr>
-      </w:pPr>
-      <w:bookmarkStart w:id="72" w:name="_Toc230806314"/>
-      <w:r>
-        <w:rPr>
-          <w:rFonts w:ascii="Times New Roman" w:eastAsia="Times New Roman" w:hAnsi="Times New Roman" w:cs="Times New Roman"/>
-        </w:rPr>
-        <w:t>6</w:t>
-      </w:r>
-      <w:r>
-        <w:rPr>
-          <w:rFonts w:ascii="Times New Roman" w:eastAsia="Times New Roman" w:hAnsi="Times New Roman" w:cs="Times New Roman"/>
-        </w:rPr>
-        <w:t>.</w:t>
-      </w:r>
-      <w:r>
-        <w:rPr>
-          <w:rFonts w:ascii="Times New Roman" w:eastAsia="Times New Roman" w:hAnsi="Times New Roman" w:cs="Times New Roman"/>
-        </w:rPr>
-        <w:t>5</w:t>
-      </w:r>
-      <w:r>
-        <w:rPr>
-          <w:rFonts w:ascii="Times New Roman" w:eastAsia="Times New Roman" w:hAnsi="Times New Roman" w:cs="Times New Roman"/>
-        </w:rPr>
-        <w:t>.</w:t>
-      </w:r>
-      <w:r>
-        <w:rPr>
-          <w:rFonts w:ascii="Times New Roman" w:eastAsia="Times New Roman" w:hAnsi="Times New Roman" w:cs="Times New Roman"/>
-        </w:rPr>
-        <w:t>1</w:t>
-      </w:r>
-      <w:r>
-        <w:rPr>
-          <w:rFonts w:ascii="Times New Roman" w:eastAsia="Times New Roman" w:hAnsi="Times New Roman" w:cs="Times New Roman"/>
-        </w:rPr>
-        <w:t xml:space="preserve"> Especificación CU</w:t>
-      </w:r>
-      <w:bookmarkEnd w:id="72"/>
       <w:r>
         <w:rPr>
           <w:rFonts w:ascii="Times New Roman" w:eastAsia="Times New Roman" w:hAnsi="Times New Roman" w:cs="Times New Roman"/>
@@ -19115,7 +18857,6 @@
                 <w:rFonts w:ascii="Times New Roman" w:eastAsia="Times New Roman" w:hAnsi="Times New Roman" w:cs="Times New Roman"/>
                 <w:color w:val="000000"/>
               </w:rPr>
-              <w:lastRenderedPageBreak/>
               <w:t>.</w:t>
             </w:r>
             <w:r>
@@ -19207,7 +18948,6 @@
                 <w:bCs/>
                 <w:color w:val="000000"/>
               </w:rPr>
-              <w:lastRenderedPageBreak/>
               <w:t xml:space="preserve">PUNTOS DE EXTENSIÓN: </w:t>
             </w:r>
             <w:r>
@@ -19572,6 +19312,7 @@
                 <w:bCs/>
                 <w:color w:val="000000"/>
               </w:rPr>
+              <w:lastRenderedPageBreak/>
               <w:t>FLUJOS ALTERNATIVO: </w:t>
             </w:r>
           </w:p>
@@ -19884,12 +19625,11 @@
           <w:rFonts w:ascii="Times New Roman" w:eastAsia="Times New Roman" w:hAnsi="Times New Roman" w:cs="Times New Roman"/>
         </w:rPr>
       </w:pPr>
-      <w:bookmarkStart w:id="73" w:name="_Toc230806315"/>
-      <w:r>
-        <w:rPr>
-          <w:rFonts w:ascii="Times New Roman" w:eastAsia="Times New Roman" w:hAnsi="Times New Roman" w:cs="Times New Roman"/>
-        </w:rPr>
-        <w:lastRenderedPageBreak/>
+      <w:bookmarkStart w:id="72" w:name="_Toc230806315"/>
+      <w:r>
+        <w:rPr>
+          <w:rFonts w:ascii="Times New Roman" w:eastAsia="Times New Roman" w:hAnsi="Times New Roman" w:cs="Times New Roman"/>
+        </w:rPr>
         <w:t>6</w:t>
       </w:r>
       <w:r>
@@ -19902,7 +19642,7 @@
         <w:rPr>
           <w:rFonts w:ascii="Times New Roman" w:eastAsia="Times New Roman" w:hAnsi="Times New Roman" w:cs="Times New Roman"/>
         </w:rPr>
-        <w:t>5</w:t>
+        <w:t>4</w:t>
       </w:r>
       <w:r>
         <w:rPr>
@@ -19922,7 +19662,7 @@
         </w:rPr>
         <w:t xml:space="preserve"> Diagrama Secuencia Sistema</w:t>
       </w:r>
-      <w:bookmarkEnd w:id="73"/>
+      <w:bookmarkEnd w:id="72"/>
       <w:r>
         <w:rPr>
           <w:rFonts w:ascii="Times New Roman" w:eastAsia="Times New Roman" w:hAnsi="Times New Roman" w:cs="Times New Roman"/>
@@ -19959,7 +19699,7 @@
                     </pic:cNvPicPr>
                   </pic:nvPicPr>
                   <pic:blipFill>
-                    <a:blip r:embed="rId43">
+                    <a:blip r:embed="rId42">
                       <a:extLst>
                         <a:ext uri="{28A0092B-C50C-407E-A947-70E740481C1C}">
                           <a14:useLocalDpi xmlns:a14="http://schemas.microsoft.com/office/drawing/2010/main" val="0"/>
@@ -20000,13 +19740,14 @@
           <w:szCs w:val="30"/>
         </w:rPr>
       </w:pPr>
-      <w:bookmarkStart w:id="74" w:name="_Toc230806316"/>
+      <w:bookmarkStart w:id="73" w:name="_Toc230806316"/>
       <w:r>
         <w:rPr>
           <w:rFonts w:ascii="Times New Roman" w:eastAsia="Times New Roman" w:hAnsi="Times New Roman" w:cs="Times New Roman"/>
           <w:sz w:val="30"/>
           <w:szCs w:val="30"/>
         </w:rPr>
+        <w:lastRenderedPageBreak/>
         <w:t>6</w:t>
       </w:r>
       <w:r>
@@ -20015,7 +19756,7 @@
           <w:sz w:val="30"/>
           <w:szCs w:val="30"/>
         </w:rPr>
-        <w:t>.6 CU00</w:t>
+        <w:t>.</w:t>
       </w:r>
       <w:r>
         <w:rPr>
@@ -20023,7 +19764,7 @@
           <w:sz w:val="30"/>
           <w:szCs w:val="30"/>
         </w:rPr>
-        <w:t>7</w:t>
+        <w:t>5</w:t>
       </w:r>
       <w:r>
         <w:rPr>
@@ -20031,7 +19772,7 @@
           <w:sz w:val="30"/>
           <w:szCs w:val="30"/>
         </w:rPr>
-        <w:t xml:space="preserve"> </w:t>
+        <w:t xml:space="preserve"> CU00</w:t>
       </w:r>
       <w:r>
         <w:rPr>
@@ -20039,7 +19780,7 @@
           <w:sz w:val="30"/>
           <w:szCs w:val="30"/>
         </w:rPr>
-        <w:t>Eliminar</w:t>
+        <w:t>7</w:t>
       </w:r>
       <w:r>
         <w:rPr>
@@ -20047,9 +19788,25 @@
           <w:sz w:val="30"/>
           <w:szCs w:val="30"/>
         </w:rPr>
+        <w:t xml:space="preserve"> </w:t>
+      </w:r>
+      <w:r>
+        <w:rPr>
+          <w:rFonts w:ascii="Times New Roman" w:eastAsia="Times New Roman" w:hAnsi="Times New Roman" w:cs="Times New Roman"/>
+          <w:sz w:val="30"/>
+          <w:szCs w:val="30"/>
+        </w:rPr>
+        <w:t>Eliminar</w:t>
+      </w:r>
+      <w:r>
+        <w:rPr>
+          <w:rFonts w:ascii="Times New Roman" w:eastAsia="Times New Roman" w:hAnsi="Times New Roman" w:cs="Times New Roman"/>
+          <w:sz w:val="30"/>
+          <w:szCs w:val="30"/>
+        </w:rPr>
         <w:t xml:space="preserve"> Producto</w:t>
       </w:r>
-      <w:bookmarkEnd w:id="74"/>
+      <w:bookmarkEnd w:id="73"/>
     </w:p>
     <w:p>
       <w:pPr>
@@ -20058,7 +19815,7 @@
           <w:rFonts w:ascii="Times New Roman" w:eastAsia="Times New Roman" w:hAnsi="Times New Roman" w:cs="Times New Roman"/>
         </w:rPr>
       </w:pPr>
-      <w:bookmarkStart w:id="75" w:name="_Toc230806317"/>
+      <w:bookmarkStart w:id="74" w:name="_Toc230806317"/>
       <w:r>
         <w:rPr>
           <w:rFonts w:ascii="Times New Roman" w:eastAsia="Times New Roman" w:hAnsi="Times New Roman" w:cs="Times New Roman"/>
@@ -20069,7 +19826,19 @@
         <w:rPr>
           <w:rFonts w:ascii="Times New Roman" w:eastAsia="Times New Roman" w:hAnsi="Times New Roman" w:cs="Times New Roman"/>
         </w:rPr>
-        <w:t>.6.</w:t>
+        <w:t>.</w:t>
+      </w:r>
+      <w:r>
+        <w:rPr>
+          <w:rFonts w:ascii="Times New Roman" w:eastAsia="Times New Roman" w:hAnsi="Times New Roman" w:cs="Times New Roman"/>
+        </w:rPr>
+        <w:t>5</w:t>
+      </w:r>
+      <w:r>
+        <w:rPr>
+          <w:rFonts w:ascii="Times New Roman" w:eastAsia="Times New Roman" w:hAnsi="Times New Roman" w:cs="Times New Roman"/>
+        </w:rPr>
+        <w:t>.</w:t>
       </w:r>
       <w:r>
         <w:rPr>
@@ -20083,7 +19852,7 @@
         </w:rPr>
         <w:t xml:space="preserve"> Especificación CU</w:t>
       </w:r>
-      <w:bookmarkEnd w:id="75"/>
+      <w:bookmarkEnd w:id="74"/>
       <w:r>
         <w:rPr>
           <w:rFonts w:ascii="Times New Roman" w:eastAsia="Times New Roman" w:hAnsi="Times New Roman" w:cs="Times New Roman"/>
@@ -20302,7 +20071,6 @@
                 <w:bCs/>
                 <w:color w:val="000000"/>
               </w:rPr>
-              <w:lastRenderedPageBreak/>
               <w:t xml:space="preserve">ACTOR PRINCIPAL: </w:t>
             </w:r>
             <w:r>
@@ -21117,7 +20885,7 @@
           <w:rFonts w:ascii="Times New Roman" w:eastAsia="Times New Roman" w:hAnsi="Times New Roman" w:cs="Times New Roman"/>
         </w:rPr>
       </w:pPr>
-      <w:bookmarkStart w:id="76" w:name="_Toc230806318"/>
+      <w:bookmarkStart w:id="75" w:name="_Toc230806318"/>
       <w:r>
         <w:rPr>
           <w:rFonts w:ascii="Times New Roman" w:eastAsia="Times New Roman" w:hAnsi="Times New Roman" w:cs="Times New Roman"/>
@@ -21129,7 +20897,19 @@
         <w:rPr>
           <w:rFonts w:ascii="Times New Roman" w:eastAsia="Times New Roman" w:hAnsi="Times New Roman" w:cs="Times New Roman"/>
         </w:rPr>
-        <w:t>.6.</w:t>
+        <w:t>.</w:t>
+      </w:r>
+      <w:r>
+        <w:rPr>
+          <w:rFonts w:ascii="Times New Roman" w:eastAsia="Times New Roman" w:hAnsi="Times New Roman" w:cs="Times New Roman"/>
+        </w:rPr>
+        <w:t>5</w:t>
+      </w:r>
+      <w:r>
+        <w:rPr>
+          <w:rFonts w:ascii="Times New Roman" w:eastAsia="Times New Roman" w:hAnsi="Times New Roman" w:cs="Times New Roman"/>
+        </w:rPr>
+        <w:t>.</w:t>
       </w:r>
       <w:r>
         <w:rPr>
@@ -21143,7 +20923,7 @@
         </w:rPr>
         <w:t xml:space="preserve"> Diagrama Secuencia Sistema</w:t>
       </w:r>
-      <w:bookmarkEnd w:id="76"/>
+      <w:bookmarkEnd w:id="75"/>
       <w:r>
         <w:rPr>
           <w:rFonts w:ascii="Times New Roman" w:eastAsia="Times New Roman" w:hAnsi="Times New Roman" w:cs="Times New Roman"/>
@@ -21180,7 +20960,7 @@
                     </pic:cNvPicPr>
                   </pic:nvPicPr>
                   <pic:blipFill>
-                    <a:blip r:embed="rId44">
+                    <a:blip r:embed="rId43">
                       <a:extLst>
                         <a:ext uri="{28A0092B-C50C-407E-A947-70E740481C1C}">
                           <a14:useLocalDpi xmlns:a14="http://schemas.microsoft.com/office/drawing/2010/main" val="0"/>
@@ -21221,7 +21001,7 @@
           <w:szCs w:val="30"/>
         </w:rPr>
       </w:pPr>
-      <w:bookmarkStart w:id="77" w:name="_Toc230806319"/>
+      <w:bookmarkStart w:id="76" w:name="_Toc230806319"/>
       <w:r>
         <w:rPr>
           <w:rFonts w:ascii="Times New Roman" w:eastAsia="Times New Roman" w:hAnsi="Times New Roman" w:cs="Times New Roman"/>
@@ -21236,7 +21016,7 @@
           <w:sz w:val="30"/>
           <w:szCs w:val="30"/>
         </w:rPr>
-        <w:t>.7 CU00</w:t>
+        <w:t>.</w:t>
       </w:r>
       <w:r>
         <w:rPr>
@@ -21244,7 +21024,7 @@
           <w:sz w:val="30"/>
           <w:szCs w:val="30"/>
         </w:rPr>
-        <w:t>8</w:t>
+        <w:t>6</w:t>
       </w:r>
       <w:r>
         <w:rPr>
@@ -21252,7 +21032,7 @@
           <w:sz w:val="30"/>
           <w:szCs w:val="30"/>
         </w:rPr>
-        <w:t xml:space="preserve"> Modifica</w:t>
+        <w:t xml:space="preserve"> CU00</w:t>
       </w:r>
       <w:r>
         <w:rPr>
@@ -21260,7 +21040,7 @@
           <w:sz w:val="30"/>
           <w:szCs w:val="30"/>
         </w:rPr>
-        <w:t>r</w:t>
+        <w:t>8</w:t>
       </w:r>
       <w:r>
         <w:rPr>
@@ -21268,9 +21048,25 @@
           <w:sz w:val="30"/>
           <w:szCs w:val="30"/>
         </w:rPr>
+        <w:t xml:space="preserve"> Modifica</w:t>
+      </w:r>
+      <w:r>
+        <w:rPr>
+          <w:rFonts w:ascii="Times New Roman" w:eastAsia="Times New Roman" w:hAnsi="Times New Roman" w:cs="Times New Roman"/>
+          <w:sz w:val="30"/>
+          <w:szCs w:val="30"/>
+        </w:rPr>
+        <w:t>r</w:t>
+      </w:r>
+      <w:r>
+        <w:rPr>
+          <w:rFonts w:ascii="Times New Roman" w:eastAsia="Times New Roman" w:hAnsi="Times New Roman" w:cs="Times New Roman"/>
+          <w:sz w:val="30"/>
+          <w:szCs w:val="30"/>
+        </w:rPr>
         <w:t xml:space="preserve"> Producto</w:t>
       </w:r>
-      <w:bookmarkEnd w:id="77"/>
+      <w:bookmarkEnd w:id="76"/>
     </w:p>
     <w:p>
       <w:pPr>
@@ -21279,7 +21075,7 @@
           <w:rFonts w:ascii="Times New Roman" w:eastAsia="Times New Roman" w:hAnsi="Times New Roman" w:cs="Times New Roman"/>
         </w:rPr>
       </w:pPr>
-      <w:bookmarkStart w:id="78" w:name="_Toc230806320"/>
+      <w:bookmarkStart w:id="77" w:name="_Toc230806320"/>
       <w:r>
         <w:rPr>
           <w:rFonts w:ascii="Times New Roman" w:eastAsia="Times New Roman" w:hAnsi="Times New Roman" w:cs="Times New Roman"/>
@@ -21290,7 +21086,19 @@
         <w:rPr>
           <w:rFonts w:ascii="Times New Roman" w:eastAsia="Times New Roman" w:hAnsi="Times New Roman" w:cs="Times New Roman"/>
         </w:rPr>
-        <w:t>.7.</w:t>
+        <w:t>.</w:t>
+      </w:r>
+      <w:r>
+        <w:rPr>
+          <w:rFonts w:ascii="Times New Roman" w:eastAsia="Times New Roman" w:hAnsi="Times New Roman" w:cs="Times New Roman"/>
+        </w:rPr>
+        <w:t>6</w:t>
+      </w:r>
+      <w:r>
+        <w:rPr>
+          <w:rFonts w:ascii="Times New Roman" w:eastAsia="Times New Roman" w:hAnsi="Times New Roman" w:cs="Times New Roman"/>
+        </w:rPr>
+        <w:t>.</w:t>
       </w:r>
       <w:r>
         <w:rPr>
@@ -21304,7 +21112,7 @@
         </w:rPr>
         <w:t xml:space="preserve"> Especificación CU</w:t>
       </w:r>
-      <w:bookmarkEnd w:id="78"/>
+      <w:bookmarkEnd w:id="77"/>
       <w:r>
         <w:rPr>
           <w:rFonts w:ascii="Times New Roman" w:eastAsia="Times New Roman" w:hAnsi="Times New Roman" w:cs="Times New Roman"/>
@@ -22401,7 +22209,7 @@
           <w:rFonts w:ascii="Times New Roman" w:eastAsia="Times New Roman" w:hAnsi="Times New Roman" w:cs="Times New Roman"/>
         </w:rPr>
       </w:pPr>
-      <w:bookmarkStart w:id="79" w:name="_Toc230806321"/>
+      <w:bookmarkStart w:id="78" w:name="_Toc230806321"/>
       <w:r>
         <w:rPr>
           <w:rFonts w:ascii="Times New Roman" w:eastAsia="Times New Roman" w:hAnsi="Times New Roman" w:cs="Times New Roman"/>
@@ -22413,7 +22221,19 @@
         <w:rPr>
           <w:rFonts w:ascii="Times New Roman" w:eastAsia="Times New Roman" w:hAnsi="Times New Roman" w:cs="Times New Roman"/>
         </w:rPr>
-        <w:t>.7.</w:t>
+        <w:t>.</w:t>
+      </w:r>
+      <w:r>
+        <w:rPr>
+          <w:rFonts w:ascii="Times New Roman" w:eastAsia="Times New Roman" w:hAnsi="Times New Roman" w:cs="Times New Roman"/>
+        </w:rPr>
+        <w:t>6</w:t>
+      </w:r>
+      <w:r>
+        <w:rPr>
+          <w:rFonts w:ascii="Times New Roman" w:eastAsia="Times New Roman" w:hAnsi="Times New Roman" w:cs="Times New Roman"/>
+        </w:rPr>
+        <w:t>.</w:t>
       </w:r>
       <w:r>
         <w:rPr>
@@ -22427,7 +22247,7 @@
         </w:rPr>
         <w:t xml:space="preserve"> Diagrama Secuencia Sistema</w:t>
       </w:r>
-      <w:bookmarkEnd w:id="79"/>
+      <w:bookmarkEnd w:id="78"/>
       <w:r>
         <w:rPr>
           <w:rFonts w:ascii="Times New Roman" w:eastAsia="Times New Roman" w:hAnsi="Times New Roman" w:cs="Times New Roman"/>
@@ -22464,7 +22284,7 @@
                     </pic:cNvPicPr>
                   </pic:nvPicPr>
                   <pic:blipFill>
-                    <a:blip r:embed="rId45">
+                    <a:blip r:embed="rId44">
                       <a:extLst>
                         <a:ext uri="{28A0092B-C50C-407E-A947-70E740481C1C}">
                           <a14:useLocalDpi xmlns:a14="http://schemas.microsoft.com/office/drawing/2010/main" val="0"/>
@@ -22498,6 +22318,109 @@
     </w:p>
     <w:p>
       <w:pPr>
+        <w:pStyle w:val="Ttulo2"/>
+        <w:rPr>
+          <w:rFonts w:ascii="Times New Roman" w:eastAsia="Times New Roman" w:hAnsi="Times New Roman" w:cs="Times New Roman"/>
+          <w:sz w:val="30"/>
+          <w:szCs w:val="30"/>
+        </w:rPr>
+      </w:pPr>
+      <w:bookmarkStart w:id="79" w:name="_Toc230806312"/>
+      <w:r>
+        <w:rPr>
+          <w:rFonts w:ascii="Times New Roman" w:eastAsia="Times New Roman" w:hAnsi="Times New Roman" w:cs="Times New Roman"/>
+          <w:sz w:val="30"/>
+          <w:szCs w:val="30"/>
+        </w:rPr>
+        <w:lastRenderedPageBreak/>
+        <w:t>6</w:t>
+      </w:r>
+      <w:r>
+        <w:rPr>
+          <w:rFonts w:ascii="Times New Roman" w:eastAsia="Times New Roman" w:hAnsi="Times New Roman" w:cs="Times New Roman"/>
+          <w:sz w:val="30"/>
+          <w:szCs w:val="30"/>
+        </w:rPr>
+        <w:t>.</w:t>
+      </w:r>
+      <w:r>
+        <w:rPr>
+          <w:rFonts w:ascii="Times New Roman" w:eastAsia="Times New Roman" w:hAnsi="Times New Roman" w:cs="Times New Roman"/>
+          <w:sz w:val="30"/>
+          <w:szCs w:val="30"/>
+        </w:rPr>
+        <w:t>7</w:t>
+      </w:r>
+      <w:r>
+        <w:rPr>
+          <w:rFonts w:ascii="Times New Roman" w:eastAsia="Times New Roman" w:hAnsi="Times New Roman" w:cs="Times New Roman"/>
+          <w:sz w:val="30"/>
+          <w:szCs w:val="30"/>
+        </w:rPr>
+        <w:t xml:space="preserve"> Pantalla </w:t>
+      </w:r>
+      <w:r>
+        <w:rPr>
+          <w:rFonts w:ascii="Times New Roman" w:eastAsia="Times New Roman" w:hAnsi="Times New Roman" w:cs="Times New Roman"/>
+          <w:sz w:val="30"/>
+          <w:szCs w:val="30"/>
+        </w:rPr>
+        <w:t>UI</w:t>
+      </w:r>
+      <w:bookmarkEnd w:id="79"/>
+    </w:p>
+    <w:p>
+      <w:r>
+        <w:rPr>
+          <w:rFonts w:ascii="Times New Roman" w:hAnsi="Times New Roman" w:cs="Times New Roman"/>
+          <w:noProof/>
+        </w:rPr>
+        <w:drawing>
+          <wp:inline distT="0" distB="0" distL="0" distR="0" wp14:anchorId="6A92F59E" wp14:editId="4FF022E4">
+            <wp:extent cx="5400040" cy="2106930"/>
+            <wp:effectExtent l="0" t="0" r="0" b="7620"/>
+            <wp:docPr id="1062332032" name="Imagen 1"/>
+            <wp:cNvGraphicFramePr>
+              <a:graphicFrameLocks xmlns:a="http://schemas.openxmlformats.org/drawingml/2006/main" noChangeAspect="1"/>
+            </wp:cNvGraphicFramePr>
+            <a:graphic xmlns:a="http://schemas.openxmlformats.org/drawingml/2006/main">
+              <a:graphicData uri="http://schemas.openxmlformats.org/drawingml/2006/picture">
+                <pic:pic xmlns:pic="http://schemas.openxmlformats.org/drawingml/2006/picture">
+                  <pic:nvPicPr>
+                    <pic:cNvPr id="1062332032" name=""/>
+                    <pic:cNvPicPr/>
+                  </pic:nvPicPr>
+                  <pic:blipFill>
+                    <a:blip r:embed="rId45"/>
+                    <a:stretch>
+                      <a:fillRect/>
+                    </a:stretch>
+                  </pic:blipFill>
+                  <pic:spPr>
+                    <a:xfrm>
+                      <a:off x="0" y="0"/>
+                      <a:ext cx="5400040" cy="2106930"/>
+                    </a:xfrm>
+                    <a:prstGeom prst="rect">
+                      <a:avLst/>
+                    </a:prstGeom>
+                  </pic:spPr>
+                </pic:pic>
+              </a:graphicData>
+            </a:graphic>
+          </wp:inline>
+        </w:drawing>
+      </w:r>
+    </w:p>
+    <w:p>
+      <w:pPr>
+        <w:rPr>
+          <w:rFonts w:ascii="Times New Roman" w:eastAsia="Times New Roman" w:hAnsi="Times New Roman" w:cs="Times New Roman"/>
+        </w:rPr>
+      </w:pPr>
+    </w:p>
+    <w:p>
+      <w:pPr>
         <w:pStyle w:val="Ttulo1"/>
         <w:rPr>
           <w:rFonts w:ascii="Times New Roman" w:eastAsia="Times New Roman" w:hAnsi="Times New Roman" w:cs="Times New Roman"/>
@@ -22549,7 +22472,6 @@
     </w:p>
     <w:p>
       <w:r>
-        <w:lastRenderedPageBreak/>
         <w:t xml:space="preserve">El </w:t>
       </w:r>
       <w:r>
@@ -22568,51 +22490,17 @@
       <w:r>
         <w:t xml:space="preserve">atributo se multiplica por su posición dentro del valor y por la posición del atributo dentro de la entidad. Esto permite detectar no solo modificaciones en el contenido sino también intercambios de posición entre caracteres o atributos. Los atributos que participan en el cálculo son: </w:t>
       </w:r>
-      <w:proofErr w:type="spellStart"/>
-      <w:r>
-        <w:t>NombreProducto</w:t>
-      </w:r>
-      <w:proofErr w:type="spellEnd"/>
-      <w:r>
-        <w:t xml:space="preserve">, </w:t>
-      </w:r>
-      <w:proofErr w:type="spellStart"/>
-      <w:r>
-        <w:t>PrecioProducto</w:t>
-      </w:r>
-      <w:proofErr w:type="spellEnd"/>
-      <w:r>
-        <w:t xml:space="preserve">, </w:t>
-      </w:r>
-      <w:proofErr w:type="spellStart"/>
-      <w:r>
-        <w:t>TipoProducto</w:t>
-      </w:r>
-      <w:proofErr w:type="spellEnd"/>
-      <w:r>
-        <w:t xml:space="preserve">, </w:t>
+      <w:r>
+        <w:t xml:space="preserve">IdProducto, </w:t>
+      </w:r>
+      <w:r>
+        <w:t xml:space="preserve">NombreProducto, PrecioProducto, TipoProducto, </w:t>
       </w:r>
       <w:r>
         <w:t>Descripción</w:t>
       </w:r>
       <w:r>
-        <w:t xml:space="preserve">, Cantidad y </w:t>
-      </w:r>
-      <w:proofErr w:type="spellStart"/>
-      <w:r>
-        <w:t>CodigoProducto</w:t>
-      </w:r>
-      <w:proofErr w:type="spellEnd"/>
-      <w:r>
-        <w:t xml:space="preserve">. El resultado de la suma se </w:t>
-      </w:r>
-      <w:proofErr w:type="spellStart"/>
-      <w:r>
-        <w:t>hashea</w:t>
-      </w:r>
-      <w:proofErr w:type="spellEnd"/>
-      <w:r>
-        <w:t xml:space="preserve"> con SHA-256 y se almacena en la columna DVH de la tabla PRODUCTO.</w:t>
+        <w:t>, Cantidad y CodigoProducto. El resultado de la suma se hashea con SHA-256 y se almacena en la columna DVH de la tabla PRODUCTO.</w:t>
       </w:r>
     </w:p>
     <w:p>
@@ -22632,15 +22520,53 @@
     </w:p>
     <w:p>
       <w:r>
-        <w:t xml:space="preserve">Al iniciar la aplicación, antes de mostrar el </w:t>
-      </w:r>
-      <w:proofErr w:type="spellStart"/>
-      <w:r>
-        <w:t>login</w:t>
-      </w:r>
-      <w:proofErr w:type="spellEnd"/>
-      <w:r>
-        <w:t>, se verifican ambos dígitos. En caso de error se informa al administrador y se ofrecen dos opciones: restaurar desde el último backup o recalcular los dígitos aceptando los datos actuales.</w:t>
+        <w:lastRenderedPageBreak/>
+        <w:t xml:space="preserve">Al iniciar la aplicación, antes de mostrar el login, se verifican ambos dígitos. En caso de error se informa al </w:t>
+      </w:r>
+      <w:r>
+        <w:t>Gerente/Administrador</w:t>
+      </w:r>
+      <w:r>
+        <w:t xml:space="preserve"> y se ofrecen dos opciones</w:t>
+      </w:r>
+      <w:r>
+        <w:t xml:space="preserve"> a realizar una vez ingresado al sistema</w:t>
+      </w:r>
+      <w:r>
+        <w:t xml:space="preserve">: </w:t>
+      </w:r>
+    </w:p>
+    <w:p>
+      <w:pPr>
+        <w:pStyle w:val="Prrafodelista"/>
+        <w:numPr>
+          <w:ilvl w:val="1"/>
+          <w:numId w:val="11"/>
+        </w:numPr>
+      </w:pPr>
+      <w:r>
+        <w:t>R</w:t>
+      </w:r>
+      <w:r>
+        <w:t>estaurar desde el último backup</w:t>
+      </w:r>
+      <w:r>
+        <w:t>.</w:t>
+      </w:r>
+    </w:p>
+    <w:p>
+      <w:pPr>
+        <w:pStyle w:val="Prrafodelista"/>
+        <w:numPr>
+          <w:ilvl w:val="1"/>
+          <w:numId w:val="11"/>
+        </w:numPr>
+      </w:pPr>
+      <w:r>
+        <w:t>R</w:t>
+      </w:r>
+      <w:r>
+        <w:t>ecalcular los dígitos aceptando los datos actuales.</w:t>
       </w:r>
     </w:p>
     <w:p>
@@ -22731,7 +22657,151 @@
           <w:sz w:val="30"/>
           <w:szCs w:val="30"/>
         </w:rPr>
+        <w:lastRenderedPageBreak/>
         <w:t>7.3 Der</w:t>
+      </w:r>
+    </w:p>
+    <w:p>
+      <w:pPr>
+        <w:pStyle w:val="Ttulo2"/>
+        <w:rPr>
+          <w:rFonts w:ascii="Times New Roman" w:eastAsia="Times New Roman" w:hAnsi="Times New Roman" w:cs="Times New Roman"/>
+          <w:sz w:val="30"/>
+          <w:szCs w:val="30"/>
+        </w:rPr>
+      </w:pPr>
+      <w:r>
+        <w:rPr>
+          <w:rFonts w:ascii="Times New Roman" w:eastAsia="Times New Roman" w:hAnsi="Times New Roman" w:cs="Times New Roman"/>
+          <w:sz w:val="30"/>
+          <w:szCs w:val="30"/>
+        </w:rPr>
+        <w:t>7.4 Pantalla IU</w:t>
+      </w:r>
+    </w:p>
+    <w:p>
+      <w:r>
+        <w:rPr>
+          <w:noProof/>
+        </w:rPr>
+        <w:drawing>
+          <wp:inline distT="0" distB="0" distL="0" distR="0" wp14:anchorId="3E7D6EB0" wp14:editId="4DB4508F">
+            <wp:extent cx="1264920" cy="868196"/>
+            <wp:effectExtent l="0" t="0" r="0" b="8255"/>
+            <wp:docPr id="625961735" name="Imagen 1"/>
+            <wp:cNvGraphicFramePr>
+              <a:graphicFrameLocks xmlns:a="http://schemas.openxmlformats.org/drawingml/2006/main" noChangeAspect="1"/>
+            </wp:cNvGraphicFramePr>
+            <a:graphic xmlns:a="http://schemas.openxmlformats.org/drawingml/2006/main">
+              <a:graphicData uri="http://schemas.openxmlformats.org/drawingml/2006/picture">
+                <pic:pic xmlns:pic="http://schemas.openxmlformats.org/drawingml/2006/picture">
+                  <pic:nvPicPr>
+                    <pic:cNvPr id="625961735" name=""/>
+                    <pic:cNvPicPr/>
+                  </pic:nvPicPr>
+                  <pic:blipFill>
+                    <a:blip r:embed="rId47"/>
+                    <a:stretch>
+                      <a:fillRect/>
+                    </a:stretch>
+                  </pic:blipFill>
+                  <pic:spPr>
+                    <a:xfrm>
+                      <a:off x="0" y="0"/>
+                      <a:ext cx="1267310" cy="869836"/>
+                    </a:xfrm>
+                    <a:prstGeom prst="rect">
+                      <a:avLst/>
+                    </a:prstGeom>
+                  </pic:spPr>
+                </pic:pic>
+              </a:graphicData>
+            </a:graphic>
+          </wp:inline>
+        </w:drawing>
+      </w:r>
+      <w:r>
+        <w:rPr>
+          <w:noProof/>
+        </w:rPr>
+        <w:drawing>
+          <wp:inline distT="0" distB="0" distL="0" distR="0" wp14:anchorId="668519A5" wp14:editId="11BC12A6">
+            <wp:extent cx="4389120" cy="2910424"/>
+            <wp:effectExtent l="0" t="0" r="0" b="4445"/>
+            <wp:docPr id="1588483777" name="Imagen 1"/>
+            <wp:cNvGraphicFramePr>
+              <a:graphicFrameLocks xmlns:a="http://schemas.openxmlformats.org/drawingml/2006/main" noChangeAspect="1"/>
+            </wp:cNvGraphicFramePr>
+            <a:graphic xmlns:a="http://schemas.openxmlformats.org/drawingml/2006/main">
+              <a:graphicData uri="http://schemas.openxmlformats.org/drawingml/2006/picture">
+                <pic:pic xmlns:pic="http://schemas.openxmlformats.org/drawingml/2006/picture">
+                  <pic:nvPicPr>
+                    <pic:cNvPr id="1588483777" name=""/>
+                    <pic:cNvPicPr/>
+                  </pic:nvPicPr>
+                  <pic:blipFill>
+                    <a:blip r:embed="rId48"/>
+                    <a:stretch>
+                      <a:fillRect/>
+                    </a:stretch>
+                  </pic:blipFill>
+                  <pic:spPr>
+                    <a:xfrm>
+                      <a:off x="0" y="0"/>
+                      <a:ext cx="4390563" cy="2911381"/>
+                    </a:xfrm>
+                    <a:prstGeom prst="rect">
+                      <a:avLst/>
+                    </a:prstGeom>
+                  </pic:spPr>
+                </pic:pic>
+              </a:graphicData>
+            </a:graphic>
+          </wp:inline>
+        </w:drawing>
+      </w:r>
+    </w:p>
+    <w:p>
+      <w:r>
+        <w:rPr>
+          <w:noProof/>
+        </w:rPr>
+        <w:lastRenderedPageBreak/>
+        <w:drawing>
+          <wp:inline distT="0" distB="0" distL="0" distR="0" wp14:anchorId="738E5428" wp14:editId="7057F1FE">
+            <wp:extent cx="5400040" cy="3173095"/>
+            <wp:effectExtent l="0" t="0" r="0" b="8255"/>
+            <wp:docPr id="1822008064" name="Imagen 1"/>
+            <wp:cNvGraphicFramePr>
+              <a:graphicFrameLocks xmlns:a="http://schemas.openxmlformats.org/drawingml/2006/main" noChangeAspect="1"/>
+            </wp:cNvGraphicFramePr>
+            <a:graphic xmlns:a="http://schemas.openxmlformats.org/drawingml/2006/main">
+              <a:graphicData uri="http://schemas.openxmlformats.org/drawingml/2006/picture">
+                <pic:pic xmlns:pic="http://schemas.openxmlformats.org/drawingml/2006/picture">
+                  <pic:nvPicPr>
+                    <pic:cNvPr id="1822008064" name=""/>
+                    <pic:cNvPicPr/>
+                  </pic:nvPicPr>
+                  <pic:blipFill>
+                    <a:blip r:embed="rId49"/>
+                    <a:stretch>
+                      <a:fillRect/>
+                    </a:stretch>
+                  </pic:blipFill>
+                  <pic:spPr>
+                    <a:xfrm>
+                      <a:off x="0" y="0"/>
+                      <a:ext cx="5400040" cy="3173095"/>
+                    </a:xfrm>
+                    <a:prstGeom prst="rect">
+                      <a:avLst/>
+                    </a:prstGeom>
+                  </pic:spPr>
+                </pic:pic>
+              </a:graphicData>
+            </a:graphic>
+          </wp:inline>
+        </w:drawing>
       </w:r>
     </w:p>
     <w:p>
@@ -22793,7 +22863,6 @@
         <w:rPr>
           <w:rFonts w:ascii="Times New Roman" w:hAnsi="Times New Roman" w:cs="Times New Roman"/>
         </w:rPr>
-        <w:lastRenderedPageBreak/>
         <w:t>Esto implica la capacidad de definir permisos atómicos (funcionalidades específicas) y de poder agrupar estos permisos en estructuras compuestas (roles o perfiles de usuario), los cuales pueden ser asignados a usuarios o anidados dentro de otros grupos de permisos. Se busca facilitar la gestión de acceso desde el propio sistema, garantizando que el acceso a las funcionalidades pueda adaptarse dinámicamente a las necesidades del negocio y a la jerarquía organizacional.</w:t>
       </w:r>
     </w:p>
@@ -22850,37 +22919,9 @@
         <w:rPr>
           <w:rFonts w:ascii="Times New Roman" w:hAnsi="Times New Roman" w:cs="Times New Roman"/>
         </w:rPr>
-        <w:t xml:space="preserve"> = Gerente (</w:t>
-      </w:r>
-      <w:proofErr w:type="spellStart"/>
-      <w:r>
-        <w:rPr>
-          <w:rFonts w:ascii="Times New Roman" w:hAnsi="Times New Roman" w:cs="Times New Roman"/>
-        </w:rPr>
-        <w:t>IdUsuario</w:t>
-      </w:r>
-      <w:proofErr w:type="spellEnd"/>
-      <w:r>
-        <w:rPr>
-          <w:rFonts w:ascii="Times New Roman" w:hAnsi="Times New Roman" w:cs="Times New Roman"/>
-        </w:rPr>
-        <w:t xml:space="preserve">, </w:t>
-      </w:r>
-      <w:proofErr w:type="spellStart"/>
-      <w:r>
-        <w:rPr>
-          <w:rFonts w:ascii="Times New Roman" w:hAnsi="Times New Roman" w:cs="Times New Roman"/>
-        </w:rPr>
-        <w:t>IdPermiso</w:t>
-      </w:r>
-      <w:proofErr w:type="spellEnd"/>
-      <w:r>
-        <w:rPr>
-          <w:rFonts w:ascii="Times New Roman" w:hAnsi="Times New Roman" w:cs="Times New Roman"/>
-        </w:rPr>
-        <w:t xml:space="preserve">) &gt;&gt; </w:t>
-      </w:r>
-      <w:hyperlink r:id="rId47" w:history="1">
+        <w:t xml:space="preserve"> = Gerente (IdUsuario, IdPermiso) &gt;&gt; </w:t>
+      </w:r>
+      <w:hyperlink r:id="rId50" w:history="1">
         <w:r>
           <w:rPr>
             <w:rStyle w:val="Hipervnculo"/>
@@ -22925,43 +22966,15 @@
         <w:rPr>
           <w:rFonts w:ascii="Times New Roman" w:hAnsi="Times New Roman" w:cs="Times New Roman"/>
         </w:rPr>
-        <w:t xml:space="preserve"> = Cliente (</w:t>
-      </w:r>
-      <w:proofErr w:type="spellStart"/>
+        <w:t xml:space="preserve"> = Cliente (IdUsuario, IdPermiso) &gt;&gt;</w:t>
+      </w:r>
       <w:r>
         <w:rPr>
           <w:rFonts w:ascii="Times New Roman" w:hAnsi="Times New Roman" w:cs="Times New Roman"/>
         </w:rPr>
-        <w:t>IdUsuario</w:t>
-      </w:r>
-      <w:proofErr w:type="spellEnd"/>
-      <w:r>
-        <w:rPr>
-          <w:rFonts w:ascii="Times New Roman" w:hAnsi="Times New Roman" w:cs="Times New Roman"/>
-        </w:rPr>
-        <w:t xml:space="preserve">, </w:t>
-      </w:r>
-      <w:proofErr w:type="spellStart"/>
-      <w:r>
-        <w:rPr>
-          <w:rFonts w:ascii="Times New Roman" w:hAnsi="Times New Roman" w:cs="Times New Roman"/>
-        </w:rPr>
-        <w:t>IdPermiso</w:t>
-      </w:r>
-      <w:proofErr w:type="spellEnd"/>
-      <w:r>
-        <w:rPr>
-          <w:rFonts w:ascii="Times New Roman" w:hAnsi="Times New Roman" w:cs="Times New Roman"/>
-        </w:rPr>
-        <w:t>) &gt;&gt;</w:t>
-      </w:r>
-      <w:r>
-        <w:rPr>
-          <w:rFonts w:ascii="Times New Roman" w:hAnsi="Times New Roman" w:cs="Times New Roman"/>
-        </w:rPr>
         <w:t xml:space="preserve"> </w:t>
       </w:r>
-      <w:hyperlink r:id="rId48" w:history="1">
+      <w:hyperlink r:id="rId51" w:history="1">
         <w:r>
           <w:rPr>
             <w:rStyle w:val="Hipervnculo"/>
@@ -22982,14 +22995,12 @@
         </w:rPr>
         <w:t xml:space="preserve">------- </w:t>
       </w:r>
-      <w:proofErr w:type="spellStart"/>
       <w:r>
         <w:rPr>
           <w:rFonts w:ascii="Times New Roman" w:hAnsi="Times New Roman" w:cs="Times New Roman"/>
         </w:rPr>
         <w:t>river</w:t>
       </w:r>
-      <w:proofErr w:type="spellEnd"/>
     </w:p>
     <w:p>
       <w:pPr>
@@ -23007,6 +23018,7 @@
           <w:sz w:val="30"/>
           <w:szCs w:val="30"/>
         </w:rPr>
+        <w:lastRenderedPageBreak/>
         <w:t>8.2 Diagrama de Clases</w:t>
       </w:r>
       <w:bookmarkEnd w:id="85"/>
@@ -23034,7 +23046,7 @@
                     </pic:cNvPicPr>
                   </pic:nvPicPr>
                   <pic:blipFill>
-                    <a:blip r:embed="rId49">
+                    <a:blip r:embed="rId52">
                       <a:extLst>
                         <a:ext uri="{28A0092B-C50C-407E-A947-70E740481C1C}">
                           <a14:useLocalDpi xmlns:a14="http://schemas.microsoft.com/office/drawing/2010/main" val="0"/>
@@ -23082,7 +23094,6 @@
           <w:sz w:val="30"/>
           <w:szCs w:val="30"/>
         </w:rPr>
-        <w:lastRenderedPageBreak/>
         <w:t>8.3 Der</w:t>
       </w:r>
       <w:bookmarkEnd w:id="86"/>
@@ -23110,7 +23121,7 @@
                     </pic:cNvPicPr>
                   </pic:nvPicPr>
                   <pic:blipFill>
-                    <a:blip r:embed="rId50">
+                    <a:blip r:embed="rId53">
                       <a:extLst>
                         <a:ext uri="{28A0092B-C50C-407E-A947-70E740481C1C}">
                           <a14:useLocalDpi xmlns:a14="http://schemas.microsoft.com/office/drawing/2010/main" val="0"/>
@@ -23158,6 +23169,7 @@
           <w:sz w:val="30"/>
           <w:szCs w:val="30"/>
         </w:rPr>
+        <w:lastRenderedPageBreak/>
         <w:t>8.</w:t>
       </w:r>
       <w:r>
@@ -23176,15 +23188,15 @@
         </w:rPr>
         <w:t xml:space="preserve"> Pantalla </w:t>
       </w:r>
+      <w:bookmarkEnd w:id="87"/>
       <w:r>
         <w:rPr>
           <w:rFonts w:ascii="Times New Roman" w:eastAsia="Times New Roman" w:hAnsi="Times New Roman" w:cs="Times New Roman"/>
           <w:sz w:val="30"/>
           <w:szCs w:val="30"/>
         </w:rPr>
-        <w:t>Gestión de Perfiles de Usuario</w:t>
-      </w:r>
-      <w:bookmarkEnd w:id="87"/>
+        <w:t>UI</w:t>
+      </w:r>
     </w:p>
     <w:p>
       <w:r>
@@ -23192,10 +23204,10 @@
           <w:noProof/>
         </w:rPr>
         <w:drawing>
-          <wp:inline distT="0" distB="0" distL="0" distR="0" wp14:anchorId="35E61C01" wp14:editId="3309C29A">
-            <wp:extent cx="5400040" cy="2981960"/>
-            <wp:effectExtent l="0" t="0" r="0" b="8890"/>
-            <wp:docPr id="352708035" name="Imagen 1"/>
+          <wp:inline distT="0" distB="0" distL="0" distR="0" wp14:anchorId="53771325" wp14:editId="499BABBC">
+            <wp:extent cx="6103620" cy="3337469"/>
+            <wp:effectExtent l="0" t="0" r="0" b="0"/>
+            <wp:docPr id="843789187" name="Imagen 1"/>
             <wp:cNvGraphicFramePr>
               <a:graphicFrameLocks xmlns:a="http://schemas.openxmlformats.org/drawingml/2006/main" noChangeAspect="1"/>
             </wp:cNvGraphicFramePr>
@@ -23203,11 +23215,11 @@
               <a:graphicData uri="http://schemas.openxmlformats.org/drawingml/2006/picture">
                 <pic:pic xmlns:pic="http://schemas.openxmlformats.org/drawingml/2006/picture">
                   <pic:nvPicPr>
-                    <pic:cNvPr id="352708035" name=""/>
+                    <pic:cNvPr id="843789187" name=""/>
                     <pic:cNvPicPr/>
                   </pic:nvPicPr>
                   <pic:blipFill>
-                    <a:blip r:embed="rId51"/>
+                    <a:blip r:embed="rId54"/>
                     <a:stretch>
                       <a:fillRect/>
                     </a:stretch>
@@ -23215,7 +23227,7 @@
                   <pic:spPr>
                     <a:xfrm>
                       <a:off x="0" y="0"/>
-                      <a:ext cx="5400040" cy="2981960"/>
+                      <a:ext cx="6107562" cy="3339624"/>
                     </a:xfrm>
                     <a:prstGeom prst="rect">
                       <a:avLst/>
@@ -23244,7 +23256,6 @@
           <w:sz w:val="30"/>
           <w:szCs w:val="30"/>
         </w:rPr>
-        <w:lastRenderedPageBreak/>
         <w:t>8.</w:t>
       </w:r>
       <w:r>
@@ -23340,6 +23351,23 @@
     <w:p/>
     <w:p>
       <w:pPr>
+        <w:pStyle w:val="Ttulo1"/>
+        <w:rPr>
+          <w:rFonts w:ascii="Times New Roman" w:eastAsia="Times New Roman" w:hAnsi="Times New Roman" w:cs="Times New Roman"/>
+        </w:rPr>
+      </w:pPr>
+      <w:bookmarkStart w:id="91" w:name="_Toc230806338"/>
+      <w:r>
+        <w:rPr>
+          <w:rFonts w:ascii="Times New Roman" w:eastAsia="Times New Roman" w:hAnsi="Times New Roman" w:cs="Times New Roman"/>
+        </w:rPr>
+        <w:lastRenderedPageBreak/>
+        <w:t>9. GESTIÓN DE CAMBIOS</w:t>
+      </w:r>
+      <w:bookmarkEnd w:id="91"/>
+    </w:p>
+    <w:p>
+      <w:pPr>
         <w:pStyle w:val="Ttulo2"/>
         <w:rPr>
           <w:rFonts w:ascii="Times New Roman" w:eastAsia="Times New Roman" w:hAnsi="Times New Roman" w:cs="Times New Roman"/>
@@ -23347,114 +23375,37 @@
           <w:szCs w:val="30"/>
         </w:rPr>
       </w:pPr>
-      <w:bookmarkStart w:id="91" w:name="_Toc230806332"/>
+      <w:bookmarkStart w:id="92" w:name="_Toc230806339"/>
       <w:r>
         <w:rPr>
           <w:rFonts w:ascii="Times New Roman" w:eastAsia="Times New Roman" w:hAnsi="Times New Roman" w:cs="Times New Roman"/>
           <w:sz w:val="30"/>
           <w:szCs w:val="30"/>
         </w:rPr>
-        <w:t>8.</w:t>
-      </w:r>
-      <w:r>
-        <w:rPr>
-          <w:rFonts w:ascii="Times New Roman" w:eastAsia="Times New Roman" w:hAnsi="Times New Roman" w:cs="Times New Roman"/>
-          <w:sz w:val="30"/>
-          <w:szCs w:val="30"/>
-        </w:rPr>
-        <w:t>6</w:t>
-      </w:r>
-      <w:r>
-        <w:rPr>
-          <w:rFonts w:ascii="Times New Roman" w:eastAsia="Times New Roman" w:hAnsi="Times New Roman" w:cs="Times New Roman"/>
-          <w:sz w:val="30"/>
-          <w:szCs w:val="30"/>
-        </w:rPr>
-        <w:t xml:space="preserve"> </w:t>
-      </w:r>
-      <w:r>
-        <w:rPr>
-          <w:rFonts w:ascii="Times New Roman" w:eastAsia="Times New Roman" w:hAnsi="Times New Roman" w:cs="Times New Roman"/>
-          <w:sz w:val="30"/>
-          <w:szCs w:val="30"/>
-        </w:rPr>
-        <w:t>Modificar</w:t>
-      </w:r>
-      <w:r>
-        <w:rPr>
-          <w:rFonts w:ascii="Times New Roman" w:eastAsia="Times New Roman" w:hAnsi="Times New Roman" w:cs="Times New Roman"/>
-          <w:sz w:val="30"/>
-          <w:szCs w:val="30"/>
-        </w:rPr>
-        <w:t xml:space="preserve"> Permiso</w:t>
-      </w:r>
-      <w:bookmarkEnd w:id="91"/>
-      <w:r>
-        <w:rPr>
-          <w:rFonts w:ascii="Times New Roman" w:eastAsia="Times New Roman" w:hAnsi="Times New Roman" w:cs="Times New Roman"/>
-          <w:sz w:val="30"/>
-          <w:szCs w:val="30"/>
-        </w:rPr>
-        <w:t xml:space="preserve"> </w:t>
-      </w:r>
-    </w:p>
-    <w:p>
-      <w:pPr>
-        <w:pStyle w:val="Ttulo3"/>
-        <w:rPr>
-          <w:rFonts w:ascii="Times New Roman" w:eastAsia="Times New Roman" w:hAnsi="Times New Roman" w:cs="Times New Roman"/>
-        </w:rPr>
-      </w:pPr>
-      <w:bookmarkStart w:id="92" w:name="_Toc230806333"/>
-      <w:r>
-        <w:rPr>
-          <w:rFonts w:ascii="Times New Roman" w:eastAsia="Times New Roman" w:hAnsi="Times New Roman" w:cs="Times New Roman"/>
-        </w:rPr>
-        <w:t>8.</w:t>
-      </w:r>
-      <w:r>
-        <w:rPr>
-          <w:rFonts w:ascii="Times New Roman" w:eastAsia="Times New Roman" w:hAnsi="Times New Roman" w:cs="Times New Roman"/>
-        </w:rPr>
-        <w:t>6</w:t>
-      </w:r>
-      <w:r>
-        <w:rPr>
-          <w:rFonts w:ascii="Times New Roman" w:eastAsia="Times New Roman" w:hAnsi="Times New Roman" w:cs="Times New Roman"/>
-        </w:rPr>
-        <w:t>.1 Especificación CU</w:t>
+        <w:t>9.1 Objetivo General</w:t>
       </w:r>
       <w:bookmarkEnd w:id="92"/>
     </w:p>
     <w:p>
       <w:pPr>
-        <w:pStyle w:val="Ttulo3"/>
-        <w:rPr>
-          <w:rFonts w:ascii="Times New Roman" w:eastAsia="Times New Roman" w:hAnsi="Times New Roman" w:cs="Times New Roman"/>
-        </w:rPr>
-      </w:pPr>
-      <w:bookmarkStart w:id="93" w:name="_Toc230806334"/>
-      <w:r>
-        <w:rPr>
-          <w:rFonts w:ascii="Times New Roman" w:eastAsia="Times New Roman" w:hAnsi="Times New Roman" w:cs="Times New Roman"/>
-        </w:rPr>
-        <w:t>8.</w:t>
-      </w:r>
-      <w:r>
-        <w:rPr>
-          <w:rFonts w:ascii="Times New Roman" w:eastAsia="Times New Roman" w:hAnsi="Times New Roman" w:cs="Times New Roman"/>
-        </w:rPr>
-        <w:t>6</w:t>
-      </w:r>
-      <w:r>
-        <w:rPr>
-          <w:rFonts w:ascii="Times New Roman" w:eastAsia="Times New Roman" w:hAnsi="Times New Roman" w:cs="Times New Roman"/>
-        </w:rPr>
-        <w:t>.2 Diagrama Secuencia Sistema</w:t>
+        <w:pStyle w:val="Ttulo2"/>
+        <w:rPr>
+          <w:rFonts w:ascii="Times New Roman" w:eastAsia="Times New Roman" w:hAnsi="Times New Roman" w:cs="Times New Roman"/>
+          <w:sz w:val="30"/>
+          <w:szCs w:val="30"/>
+        </w:rPr>
+      </w:pPr>
+      <w:bookmarkStart w:id="93" w:name="_Toc230806340"/>
+      <w:r>
+        <w:rPr>
+          <w:rFonts w:ascii="Times New Roman" w:eastAsia="Times New Roman" w:hAnsi="Times New Roman" w:cs="Times New Roman"/>
+          <w:sz w:val="30"/>
+          <w:szCs w:val="30"/>
+        </w:rPr>
+        <w:t>9.2 Diagrama de Clases</w:t>
       </w:r>
       <w:bookmarkEnd w:id="93"/>
     </w:p>
-    <w:p/>
     <w:p>
       <w:pPr>
         <w:pStyle w:val="Ttulo2"/>
@@ -23464,143 +23415,39 @@
           <w:szCs w:val="30"/>
         </w:rPr>
       </w:pPr>
-      <w:bookmarkStart w:id="94" w:name="_Toc230806335"/>
+      <w:bookmarkStart w:id="94" w:name="_Toc230806341"/>
       <w:r>
         <w:rPr>
           <w:rFonts w:ascii="Times New Roman" w:eastAsia="Times New Roman" w:hAnsi="Times New Roman" w:cs="Times New Roman"/>
           <w:sz w:val="30"/>
           <w:szCs w:val="30"/>
         </w:rPr>
-        <w:t>8.</w:t>
-      </w:r>
-      <w:r>
-        <w:rPr>
-          <w:rFonts w:ascii="Times New Roman" w:eastAsia="Times New Roman" w:hAnsi="Times New Roman" w:cs="Times New Roman"/>
-          <w:sz w:val="30"/>
-          <w:szCs w:val="30"/>
-        </w:rPr>
-        <w:t>7</w:t>
-      </w:r>
-      <w:r>
-        <w:rPr>
-          <w:rFonts w:ascii="Times New Roman" w:eastAsia="Times New Roman" w:hAnsi="Times New Roman" w:cs="Times New Roman"/>
-          <w:sz w:val="30"/>
-          <w:szCs w:val="30"/>
-        </w:rPr>
-        <w:t xml:space="preserve"> </w:t>
-      </w:r>
-      <w:r>
-        <w:rPr>
-          <w:rFonts w:ascii="Times New Roman" w:eastAsia="Times New Roman" w:hAnsi="Times New Roman" w:cs="Times New Roman"/>
-          <w:sz w:val="30"/>
-          <w:szCs w:val="30"/>
-        </w:rPr>
-        <w:t>Eliminar</w:t>
-      </w:r>
-      <w:r>
-        <w:rPr>
-          <w:rFonts w:ascii="Times New Roman" w:eastAsia="Times New Roman" w:hAnsi="Times New Roman" w:cs="Times New Roman"/>
-          <w:sz w:val="30"/>
-          <w:szCs w:val="30"/>
-        </w:rPr>
-        <w:t xml:space="preserve"> </w:t>
-      </w:r>
-      <w:r>
-        <w:rPr>
-          <w:rFonts w:ascii="Times New Roman" w:eastAsia="Times New Roman" w:hAnsi="Times New Roman" w:cs="Times New Roman"/>
-          <w:sz w:val="30"/>
-          <w:szCs w:val="30"/>
-        </w:rPr>
-        <w:t>Permiso</w:t>
+        <w:t>9.3 Der</w:t>
       </w:r>
       <w:bookmarkEnd w:id="94"/>
     </w:p>
     <w:p>
       <w:pPr>
-        <w:rPr>
-          <w:rFonts w:ascii="Times New Roman" w:eastAsia="Times New Roman" w:hAnsi="Times New Roman" w:cs="Times New Roman"/>
-          <w:color w:val="0F4761"/>
-          <w:sz w:val="28"/>
-          <w:szCs w:val="28"/>
-        </w:rPr>
-      </w:pPr>
-      <w:r>
-        <w:rPr>
-          <w:rFonts w:ascii="Times New Roman" w:eastAsia="Times New Roman" w:hAnsi="Times New Roman" w:cs="Times New Roman"/>
-          <w:color w:val="0F4761"/>
-          <w:sz w:val="28"/>
-          <w:szCs w:val="28"/>
-        </w:rPr>
-        <w:t>8.</w:t>
-      </w:r>
-      <w:r>
-        <w:rPr>
-          <w:rFonts w:ascii="Times New Roman" w:eastAsia="Times New Roman" w:hAnsi="Times New Roman" w:cs="Times New Roman"/>
-          <w:color w:val="0F4761"/>
-          <w:sz w:val="28"/>
-          <w:szCs w:val="28"/>
-        </w:rPr>
-        <w:t>7</w:t>
-      </w:r>
-      <w:r>
-        <w:rPr>
-          <w:rFonts w:ascii="Times New Roman" w:eastAsia="Times New Roman" w:hAnsi="Times New Roman" w:cs="Times New Roman"/>
-          <w:color w:val="0F4761"/>
-          <w:sz w:val="28"/>
-          <w:szCs w:val="28"/>
-        </w:rPr>
-        <w:t xml:space="preserve">.1 Especificación CU </w:t>
-      </w:r>
+        <w:pStyle w:val="Ttulo2"/>
+        <w:rPr>
+          <w:rFonts w:ascii="Times New Roman" w:eastAsia="Times New Roman" w:hAnsi="Times New Roman" w:cs="Times New Roman"/>
+          <w:sz w:val="30"/>
+          <w:szCs w:val="30"/>
+        </w:rPr>
+      </w:pPr>
+      <w:bookmarkStart w:id="95" w:name="_Toc230806342"/>
+      <w:r>
+        <w:rPr>
+          <w:rFonts w:ascii="Times New Roman" w:eastAsia="Times New Roman" w:hAnsi="Times New Roman" w:cs="Times New Roman"/>
+          <w:sz w:val="30"/>
+          <w:szCs w:val="30"/>
+        </w:rPr>
+        <w:t>9.4 Diagrama Gestión de Cambios</w:t>
+      </w:r>
+      <w:bookmarkEnd w:id="95"/>
     </w:p>
     <w:p>
       <w:pPr>
-        <w:rPr>
-          <w:rFonts w:ascii="Times New Roman" w:eastAsia="Times New Roman" w:hAnsi="Times New Roman" w:cs="Times New Roman"/>
-          <w:color w:val="0F4761"/>
-          <w:sz w:val="28"/>
-          <w:szCs w:val="28"/>
-        </w:rPr>
-      </w:pPr>
-      <w:r>
-        <w:rPr>
-          <w:rFonts w:ascii="Times New Roman" w:eastAsia="Times New Roman" w:hAnsi="Times New Roman" w:cs="Times New Roman"/>
-          <w:color w:val="0F4761"/>
-          <w:sz w:val="28"/>
-          <w:szCs w:val="28"/>
-        </w:rPr>
-        <w:t>8.</w:t>
-      </w:r>
-      <w:r>
-        <w:rPr>
-          <w:rFonts w:ascii="Times New Roman" w:eastAsia="Times New Roman" w:hAnsi="Times New Roman" w:cs="Times New Roman"/>
-          <w:color w:val="0F4761"/>
-          <w:sz w:val="28"/>
-          <w:szCs w:val="28"/>
-        </w:rPr>
-        <w:t>7</w:t>
-      </w:r>
-      <w:r>
-        <w:rPr>
-          <w:rFonts w:ascii="Times New Roman" w:eastAsia="Times New Roman" w:hAnsi="Times New Roman" w:cs="Times New Roman"/>
-          <w:color w:val="0F4761"/>
-          <w:sz w:val="28"/>
-          <w:szCs w:val="28"/>
-        </w:rPr>
-        <w:t>.2 Diagrama Secuencia Sistema</w:t>
-      </w:r>
-    </w:p>
-    <w:p>
-      <w:pPr>
-        <w:rPr>
-          <w:rFonts w:ascii="Times New Roman" w:eastAsia="Times New Roman" w:hAnsi="Times New Roman" w:cs="Times New Roman"/>
-          <w:color w:val="0F4761"/>
-          <w:sz w:val="28"/>
-          <w:szCs w:val="28"/>
-        </w:rPr>
-      </w:pPr>
-    </w:p>
-    <w:p>
-      <w:pPr>
         <w:pStyle w:val="Ttulo2"/>
         <w:rPr>
           <w:rFonts w:ascii="Times New Roman" w:eastAsia="Times New Roman" w:hAnsi="Times New Roman" w:cs="Times New Roman"/>
@@ -23608,14 +23455,14 @@
           <w:szCs w:val="30"/>
         </w:rPr>
       </w:pPr>
-      <w:bookmarkStart w:id="95" w:name="_Toc230806336"/>
+      <w:bookmarkStart w:id="96" w:name="_Toc230806344"/>
       <w:r>
         <w:rPr>
           <w:rFonts w:ascii="Times New Roman" w:eastAsia="Times New Roman" w:hAnsi="Times New Roman" w:cs="Times New Roman"/>
           <w:sz w:val="30"/>
           <w:szCs w:val="30"/>
         </w:rPr>
-        <w:t>8.</w:t>
+        <w:t>9</w:t>
       </w:r>
       <w:r>
         <w:rPr>
@@ -23623,7 +23470,7 @@
           <w:sz w:val="30"/>
           <w:szCs w:val="30"/>
         </w:rPr>
-        <w:t>8</w:t>
+        <w:t>.</w:t>
       </w:r>
       <w:r>
         <w:rPr>
@@ -23631,7 +23478,7 @@
           <w:sz w:val="30"/>
           <w:szCs w:val="30"/>
         </w:rPr>
-        <w:t xml:space="preserve"> </w:t>
+        <w:t>5</w:t>
       </w:r>
       <w:r>
         <w:rPr>
@@ -23639,440 +23486,51 @@
           <w:sz w:val="30"/>
           <w:szCs w:val="30"/>
         </w:rPr>
-        <w:t>Administrar Jerarquía de Permisos</w:t>
-      </w:r>
-      <w:bookmarkEnd w:id="95"/>
+        <w:t xml:space="preserve"> </w:t>
+      </w:r>
       <w:r>
         <w:rPr>
           <w:rFonts w:ascii="Times New Roman" w:eastAsia="Times New Roman" w:hAnsi="Times New Roman" w:cs="Times New Roman"/>
           <w:sz w:val="30"/>
           <w:szCs w:val="30"/>
         </w:rPr>
-        <w:t xml:space="preserve"> (</w:t>
-      </w:r>
-      <w:proofErr w:type="spellStart"/>
-      <w:r>
-        <w:rPr>
-          <w:rFonts w:ascii="Times New Roman" w:eastAsia="Times New Roman" w:hAnsi="Times New Roman" w:cs="Times New Roman"/>
-          <w:sz w:val="30"/>
-          <w:szCs w:val="30"/>
-        </w:rPr>
-        <w:t>AgregarHijo-QuitarHijo</w:t>
-      </w:r>
-      <w:proofErr w:type="spellEnd"/>
-      <w:r>
-        <w:rPr>
-          <w:rFonts w:ascii="Times New Roman" w:eastAsia="Times New Roman" w:hAnsi="Times New Roman" w:cs="Times New Roman"/>
-          <w:sz w:val="30"/>
-          <w:szCs w:val="30"/>
-        </w:rPr>
-        <w:t>)</w:t>
-      </w:r>
-    </w:p>
-    <w:p>
-      <w:pPr>
-        <w:rPr>
-          <w:rFonts w:ascii="Times New Roman" w:eastAsia="Times New Roman" w:hAnsi="Times New Roman" w:cs="Times New Roman"/>
-          <w:color w:val="0F4761"/>
-          <w:sz w:val="28"/>
-          <w:szCs w:val="28"/>
-        </w:rPr>
-      </w:pPr>
-      <w:r>
-        <w:rPr>
-          <w:rFonts w:ascii="Times New Roman" w:eastAsia="Times New Roman" w:hAnsi="Times New Roman" w:cs="Times New Roman"/>
-          <w:color w:val="0F4761"/>
-          <w:sz w:val="28"/>
-          <w:szCs w:val="28"/>
-        </w:rPr>
-        <w:t>8.</w:t>
-      </w:r>
-      <w:r>
-        <w:rPr>
-          <w:rFonts w:ascii="Times New Roman" w:eastAsia="Times New Roman" w:hAnsi="Times New Roman" w:cs="Times New Roman"/>
-          <w:color w:val="0F4761"/>
-          <w:sz w:val="28"/>
-          <w:szCs w:val="28"/>
-        </w:rPr>
-        <w:t>8</w:t>
-      </w:r>
-      <w:r>
-        <w:rPr>
-          <w:rFonts w:ascii="Times New Roman" w:eastAsia="Times New Roman" w:hAnsi="Times New Roman" w:cs="Times New Roman"/>
-          <w:color w:val="0F4761"/>
-          <w:sz w:val="28"/>
-          <w:szCs w:val="28"/>
-        </w:rPr>
-        <w:t xml:space="preserve">.1 Especificación CU </w:t>
-      </w:r>
-    </w:p>
-    <w:p>
-      <w:pPr>
-        <w:rPr>
-          <w:rFonts w:ascii="Times New Roman" w:eastAsia="Times New Roman" w:hAnsi="Times New Roman" w:cs="Times New Roman"/>
-          <w:color w:val="0F4761"/>
-          <w:sz w:val="28"/>
-          <w:szCs w:val="28"/>
-        </w:rPr>
-      </w:pPr>
-      <w:r>
-        <w:rPr>
-          <w:rFonts w:ascii="Times New Roman" w:eastAsia="Times New Roman" w:hAnsi="Times New Roman" w:cs="Times New Roman"/>
-          <w:color w:val="0F4761"/>
-          <w:sz w:val="28"/>
-          <w:szCs w:val="28"/>
-        </w:rPr>
-        <w:t>8.</w:t>
-      </w:r>
-      <w:r>
-        <w:rPr>
-          <w:rFonts w:ascii="Times New Roman" w:eastAsia="Times New Roman" w:hAnsi="Times New Roman" w:cs="Times New Roman"/>
-          <w:color w:val="0F4761"/>
-          <w:sz w:val="28"/>
-          <w:szCs w:val="28"/>
-        </w:rPr>
-        <w:t>8</w:t>
-      </w:r>
-      <w:r>
-        <w:rPr>
-          <w:rFonts w:ascii="Times New Roman" w:eastAsia="Times New Roman" w:hAnsi="Times New Roman" w:cs="Times New Roman"/>
-          <w:color w:val="0F4761"/>
-          <w:sz w:val="28"/>
-          <w:szCs w:val="28"/>
-        </w:rPr>
-        <w:t>.2 Diagrama Secuencia Sistema</w:t>
-      </w:r>
-    </w:p>
-    <w:p/>
-    <w:p>
-      <w:pPr>
-        <w:pStyle w:val="Ttulo2"/>
-        <w:rPr>
-          <w:rFonts w:ascii="Times New Roman" w:eastAsia="Times New Roman" w:hAnsi="Times New Roman" w:cs="Times New Roman"/>
-          <w:sz w:val="30"/>
-          <w:szCs w:val="30"/>
-        </w:rPr>
-      </w:pPr>
-      <w:bookmarkStart w:id="96" w:name="_Toc230806337"/>
-      <w:r>
-        <w:rPr>
-          <w:rFonts w:ascii="Times New Roman" w:eastAsia="Times New Roman" w:hAnsi="Times New Roman" w:cs="Times New Roman"/>
-          <w:sz w:val="30"/>
-          <w:szCs w:val="30"/>
-        </w:rPr>
-        <w:t>8.</w:t>
-      </w:r>
-      <w:r>
-        <w:rPr>
-          <w:rFonts w:ascii="Times New Roman" w:eastAsia="Times New Roman" w:hAnsi="Times New Roman" w:cs="Times New Roman"/>
-          <w:sz w:val="30"/>
-          <w:szCs w:val="30"/>
-        </w:rPr>
-        <w:t>9</w:t>
-      </w:r>
-      <w:r>
-        <w:rPr>
-          <w:rFonts w:ascii="Times New Roman" w:eastAsia="Times New Roman" w:hAnsi="Times New Roman" w:cs="Times New Roman"/>
-          <w:sz w:val="30"/>
-          <w:szCs w:val="30"/>
-        </w:rPr>
-        <w:t xml:space="preserve"> </w:t>
-      </w:r>
-      <w:r>
-        <w:rPr>
-          <w:rFonts w:ascii="Times New Roman" w:eastAsia="Times New Roman" w:hAnsi="Times New Roman" w:cs="Times New Roman"/>
-          <w:sz w:val="30"/>
-          <w:szCs w:val="30"/>
-        </w:rPr>
-        <w:t>Asignar Rol a Usuario</w:t>
+        <w:t>Revertir Cambios</w:t>
       </w:r>
       <w:bookmarkEnd w:id="96"/>
     </w:p>
     <w:p>
       <w:pPr>
-        <w:rPr>
-          <w:rFonts w:ascii="Times New Roman" w:eastAsia="Times New Roman" w:hAnsi="Times New Roman" w:cs="Times New Roman"/>
-          <w:color w:val="0F4761"/>
-          <w:sz w:val="28"/>
-          <w:szCs w:val="28"/>
-        </w:rPr>
-      </w:pPr>
-      <w:r>
-        <w:rPr>
-          <w:rFonts w:ascii="Times New Roman" w:eastAsia="Times New Roman" w:hAnsi="Times New Roman" w:cs="Times New Roman"/>
-          <w:color w:val="0F4761"/>
-          <w:sz w:val="28"/>
-          <w:szCs w:val="28"/>
-        </w:rPr>
-        <w:t>8.</w:t>
-      </w:r>
-      <w:r>
-        <w:rPr>
-          <w:rFonts w:ascii="Times New Roman" w:eastAsia="Times New Roman" w:hAnsi="Times New Roman" w:cs="Times New Roman"/>
-          <w:color w:val="0F4761"/>
-          <w:sz w:val="28"/>
-          <w:szCs w:val="28"/>
+        <w:pStyle w:val="Ttulo3"/>
+        <w:rPr>
+          <w:rFonts w:ascii="Times New Roman" w:eastAsia="Times New Roman" w:hAnsi="Times New Roman" w:cs="Times New Roman"/>
+        </w:rPr>
+      </w:pPr>
+      <w:bookmarkStart w:id="97" w:name="_Toc230806345"/>
+      <w:r>
+        <w:rPr>
+          <w:rFonts w:ascii="Times New Roman" w:eastAsia="Times New Roman" w:hAnsi="Times New Roman" w:cs="Times New Roman"/>
         </w:rPr>
         <w:t>9</w:t>
       </w:r>
       <w:r>
         <w:rPr>
           <w:rFonts w:ascii="Times New Roman" w:eastAsia="Times New Roman" w:hAnsi="Times New Roman" w:cs="Times New Roman"/>
-          <w:color w:val="0F4761"/>
-          <w:sz w:val="28"/>
-          <w:szCs w:val="28"/>
-        </w:rPr>
-        <w:t xml:space="preserve">.1 Especificación CU </w:t>
-      </w:r>
-    </w:p>
-    <w:p>
-      <w:r>
-        <w:rPr>
-          <w:rFonts w:ascii="Times New Roman" w:eastAsia="Times New Roman" w:hAnsi="Times New Roman" w:cs="Times New Roman"/>
-          <w:color w:val="0F4761"/>
-          <w:sz w:val="28"/>
-          <w:szCs w:val="28"/>
-        </w:rPr>
-        <w:t>8.</w:t>
-      </w:r>
-      <w:r>
-        <w:rPr>
-          <w:rFonts w:ascii="Times New Roman" w:eastAsia="Times New Roman" w:hAnsi="Times New Roman" w:cs="Times New Roman"/>
-          <w:color w:val="0F4761"/>
-          <w:sz w:val="28"/>
-          <w:szCs w:val="28"/>
-        </w:rPr>
-        <w:t>9</w:t>
-      </w:r>
-      <w:r>
-        <w:rPr>
-          <w:rFonts w:ascii="Times New Roman" w:eastAsia="Times New Roman" w:hAnsi="Times New Roman" w:cs="Times New Roman"/>
-          <w:color w:val="0F4761"/>
-          <w:sz w:val="28"/>
-          <w:szCs w:val="28"/>
-        </w:rPr>
-        <w:t>.2 Diagrama Secuencia Sistema</w:t>
-      </w:r>
-    </w:p>
-    <w:p/>
-    <w:p>
-      <w:pPr>
-        <w:pStyle w:val="Ttulo1"/>
-        <w:rPr>
-          <w:rFonts w:ascii="Times New Roman" w:eastAsia="Times New Roman" w:hAnsi="Times New Roman" w:cs="Times New Roman"/>
-        </w:rPr>
-      </w:pPr>
-      <w:bookmarkStart w:id="97" w:name="_Toc230806338"/>
-      <w:r>
-        <w:rPr>
-          <w:rFonts w:ascii="Times New Roman" w:eastAsia="Times New Roman" w:hAnsi="Times New Roman" w:cs="Times New Roman"/>
-        </w:rPr>
-        <w:lastRenderedPageBreak/>
-        <w:t>9. GESTIÓN DE CAMBIOS</w:t>
+        </w:rPr>
+        <w:t>.</w:t>
+      </w:r>
+      <w:r>
+        <w:rPr>
+          <w:rFonts w:ascii="Times New Roman" w:eastAsia="Times New Roman" w:hAnsi="Times New Roman" w:cs="Times New Roman"/>
+        </w:rPr>
+        <w:t>5</w:t>
+      </w:r>
+      <w:r>
+        <w:rPr>
+          <w:rFonts w:ascii="Times New Roman" w:eastAsia="Times New Roman" w:hAnsi="Times New Roman" w:cs="Times New Roman"/>
+        </w:rPr>
+        <w:t>.1 Especificación CU</w:t>
       </w:r>
       <w:bookmarkEnd w:id="97"/>
-    </w:p>
-    <w:p>
-      <w:pPr>
-        <w:pStyle w:val="Ttulo2"/>
-        <w:rPr>
-          <w:rFonts w:ascii="Times New Roman" w:eastAsia="Times New Roman" w:hAnsi="Times New Roman" w:cs="Times New Roman"/>
-          <w:sz w:val="30"/>
-          <w:szCs w:val="30"/>
-        </w:rPr>
-      </w:pPr>
-      <w:bookmarkStart w:id="98" w:name="_Toc230806339"/>
-      <w:r>
-        <w:rPr>
-          <w:rFonts w:ascii="Times New Roman" w:eastAsia="Times New Roman" w:hAnsi="Times New Roman" w:cs="Times New Roman"/>
-          <w:sz w:val="30"/>
-          <w:szCs w:val="30"/>
-        </w:rPr>
-        <w:t>9.1 Objetivo General</w:t>
-      </w:r>
-      <w:bookmarkEnd w:id="98"/>
-    </w:p>
-    <w:p>
-      <w:pPr>
-        <w:pStyle w:val="Ttulo2"/>
-        <w:rPr>
-          <w:rFonts w:ascii="Times New Roman" w:eastAsia="Times New Roman" w:hAnsi="Times New Roman" w:cs="Times New Roman"/>
-          <w:sz w:val="30"/>
-          <w:szCs w:val="30"/>
-        </w:rPr>
-      </w:pPr>
-      <w:bookmarkStart w:id="99" w:name="_Toc230806340"/>
-      <w:r>
-        <w:rPr>
-          <w:rFonts w:ascii="Times New Roman" w:eastAsia="Times New Roman" w:hAnsi="Times New Roman" w:cs="Times New Roman"/>
-          <w:sz w:val="30"/>
-          <w:szCs w:val="30"/>
-        </w:rPr>
-        <w:t>9.2 Diagrama de Clases</w:t>
-      </w:r>
-      <w:bookmarkEnd w:id="99"/>
-    </w:p>
-    <w:p>
-      <w:pPr>
-        <w:pStyle w:val="Ttulo2"/>
-        <w:rPr>
-          <w:rFonts w:ascii="Times New Roman" w:eastAsia="Times New Roman" w:hAnsi="Times New Roman" w:cs="Times New Roman"/>
-          <w:sz w:val="30"/>
-          <w:szCs w:val="30"/>
-        </w:rPr>
-      </w:pPr>
-      <w:bookmarkStart w:id="100" w:name="_Toc230806341"/>
-      <w:r>
-        <w:rPr>
-          <w:rFonts w:ascii="Times New Roman" w:eastAsia="Times New Roman" w:hAnsi="Times New Roman" w:cs="Times New Roman"/>
-          <w:sz w:val="30"/>
-          <w:szCs w:val="30"/>
-        </w:rPr>
-        <w:t>9.3 Der</w:t>
-      </w:r>
-      <w:bookmarkEnd w:id="100"/>
-    </w:p>
-    <w:p>
-      <w:pPr>
-        <w:pStyle w:val="Ttulo2"/>
-        <w:rPr>
-          <w:rFonts w:ascii="Times New Roman" w:eastAsia="Times New Roman" w:hAnsi="Times New Roman" w:cs="Times New Roman"/>
-          <w:sz w:val="30"/>
-          <w:szCs w:val="30"/>
-        </w:rPr>
-      </w:pPr>
-      <w:bookmarkStart w:id="101" w:name="_Toc230806342"/>
-      <w:r>
-        <w:rPr>
-          <w:rFonts w:ascii="Times New Roman" w:eastAsia="Times New Roman" w:hAnsi="Times New Roman" w:cs="Times New Roman"/>
-          <w:sz w:val="30"/>
-          <w:szCs w:val="30"/>
-        </w:rPr>
-        <w:t>9.4 Diagrama Gestión de Cambios</w:t>
-      </w:r>
-      <w:bookmarkEnd w:id="101"/>
-    </w:p>
-    <w:p>
-      <w:pPr>
-        <w:pStyle w:val="Ttulo2"/>
-        <w:rPr>
-          <w:rFonts w:ascii="Times New Roman" w:eastAsia="Times New Roman" w:hAnsi="Times New Roman" w:cs="Times New Roman"/>
-          <w:sz w:val="30"/>
-          <w:szCs w:val="30"/>
-        </w:rPr>
-      </w:pPr>
-      <w:bookmarkStart w:id="102" w:name="_Toc230806343"/>
-      <w:r>
-        <w:rPr>
-          <w:rFonts w:ascii="Times New Roman" w:eastAsia="Times New Roman" w:hAnsi="Times New Roman" w:cs="Times New Roman"/>
-          <w:sz w:val="30"/>
-          <w:szCs w:val="30"/>
-        </w:rPr>
-        <w:t>9.</w:t>
-      </w:r>
-      <w:r>
-        <w:rPr>
-          <w:rFonts w:ascii="Times New Roman" w:eastAsia="Times New Roman" w:hAnsi="Times New Roman" w:cs="Times New Roman"/>
-          <w:sz w:val="30"/>
-          <w:szCs w:val="30"/>
-        </w:rPr>
-        <w:t>5</w:t>
-      </w:r>
-      <w:r>
-        <w:rPr>
-          <w:rFonts w:ascii="Times New Roman" w:eastAsia="Times New Roman" w:hAnsi="Times New Roman" w:cs="Times New Roman"/>
-          <w:sz w:val="30"/>
-          <w:szCs w:val="30"/>
-        </w:rPr>
-        <w:t xml:space="preserve"> Pantalla Gestión de Cambios</w:t>
-      </w:r>
-      <w:bookmarkEnd w:id="102"/>
-    </w:p>
-    <w:p>
-      <w:pPr>
-        <w:pStyle w:val="Ttulo2"/>
-        <w:rPr>
-          <w:rFonts w:ascii="Times New Roman" w:eastAsia="Times New Roman" w:hAnsi="Times New Roman" w:cs="Times New Roman"/>
-          <w:sz w:val="30"/>
-          <w:szCs w:val="30"/>
-        </w:rPr>
-      </w:pPr>
-      <w:bookmarkStart w:id="103" w:name="_Toc230806344"/>
-      <w:r>
-        <w:rPr>
-          <w:rFonts w:ascii="Times New Roman" w:eastAsia="Times New Roman" w:hAnsi="Times New Roman" w:cs="Times New Roman"/>
-          <w:sz w:val="30"/>
-          <w:szCs w:val="30"/>
-        </w:rPr>
-        <w:t>9</w:t>
-      </w:r>
-      <w:r>
-        <w:rPr>
-          <w:rFonts w:ascii="Times New Roman" w:eastAsia="Times New Roman" w:hAnsi="Times New Roman" w:cs="Times New Roman"/>
-          <w:sz w:val="30"/>
-          <w:szCs w:val="30"/>
-        </w:rPr>
-        <w:t>.</w:t>
-      </w:r>
-      <w:r>
-        <w:rPr>
-          <w:rFonts w:ascii="Times New Roman" w:eastAsia="Times New Roman" w:hAnsi="Times New Roman" w:cs="Times New Roman"/>
-          <w:sz w:val="30"/>
-          <w:szCs w:val="30"/>
-        </w:rPr>
-        <w:t>6</w:t>
-      </w:r>
-      <w:r>
-        <w:rPr>
-          <w:rFonts w:ascii="Times New Roman" w:eastAsia="Times New Roman" w:hAnsi="Times New Roman" w:cs="Times New Roman"/>
-          <w:sz w:val="30"/>
-          <w:szCs w:val="30"/>
-        </w:rPr>
-        <w:t xml:space="preserve"> </w:t>
-      </w:r>
-      <w:r>
-        <w:rPr>
-          <w:rFonts w:ascii="Times New Roman" w:eastAsia="Times New Roman" w:hAnsi="Times New Roman" w:cs="Times New Roman"/>
-          <w:sz w:val="30"/>
-          <w:szCs w:val="30"/>
-        </w:rPr>
-        <w:t>Revertir Cambios</w:t>
-      </w:r>
-      <w:bookmarkEnd w:id="103"/>
-    </w:p>
-    <w:p>
-      <w:pPr>
-        <w:pStyle w:val="Ttulo3"/>
-        <w:rPr>
-          <w:rFonts w:ascii="Times New Roman" w:eastAsia="Times New Roman" w:hAnsi="Times New Roman" w:cs="Times New Roman"/>
-        </w:rPr>
-      </w:pPr>
-      <w:bookmarkStart w:id="104" w:name="_Toc230806345"/>
-      <w:r>
-        <w:rPr>
-          <w:rFonts w:ascii="Times New Roman" w:eastAsia="Times New Roman" w:hAnsi="Times New Roman" w:cs="Times New Roman"/>
-        </w:rPr>
-        <w:t>9</w:t>
-      </w:r>
-      <w:r>
-        <w:rPr>
-          <w:rFonts w:ascii="Times New Roman" w:eastAsia="Times New Roman" w:hAnsi="Times New Roman" w:cs="Times New Roman"/>
-        </w:rPr>
-        <w:t>.</w:t>
-      </w:r>
-      <w:r>
-        <w:rPr>
-          <w:rFonts w:ascii="Times New Roman" w:eastAsia="Times New Roman" w:hAnsi="Times New Roman" w:cs="Times New Roman"/>
-        </w:rPr>
-        <w:t>6</w:t>
-      </w:r>
-      <w:r>
-        <w:rPr>
-          <w:rFonts w:ascii="Times New Roman" w:eastAsia="Times New Roman" w:hAnsi="Times New Roman" w:cs="Times New Roman"/>
-        </w:rPr>
-        <w:t>.1 Especificación CU</w:t>
-      </w:r>
-      <w:bookmarkEnd w:id="104"/>
     </w:p>
     <w:tbl>
       <w:tblPr>
@@ -24556,7 +24014,6 @@
                 <w:bCs/>
                 <w:color w:val="000000"/>
               </w:rPr>
-              <w:lastRenderedPageBreak/>
               <w:t>ESCENARIO PRINCIPAL: </w:t>
             </w:r>
           </w:p>
@@ -24734,6 +24191,7 @@
                 <w:bCs/>
                 <w:color w:val="000000"/>
               </w:rPr>
+              <w:lastRenderedPageBreak/>
               <w:t>FLUJOS ALTERNATIVO: </w:t>
             </w:r>
           </w:p>
@@ -25009,7 +24467,7 @@
           <w:rFonts w:ascii="Times New Roman" w:eastAsia="Times New Roman" w:hAnsi="Times New Roman" w:cs="Times New Roman"/>
         </w:rPr>
       </w:pPr>
-      <w:bookmarkStart w:id="105" w:name="_Toc230806346"/>
+      <w:bookmarkStart w:id="98" w:name="_Toc230806346"/>
       <w:r>
         <w:rPr>
           <w:rFonts w:ascii="Times New Roman" w:eastAsia="Times New Roman" w:hAnsi="Times New Roman" w:cs="Times New Roman"/>
@@ -25026,18 +24484,111 @@
         <w:rPr>
           <w:rFonts w:ascii="Times New Roman" w:eastAsia="Times New Roman" w:hAnsi="Times New Roman" w:cs="Times New Roman"/>
         </w:rPr>
+        <w:t>5</w:t>
+      </w:r>
+      <w:r>
+        <w:rPr>
+          <w:rFonts w:ascii="Times New Roman" w:eastAsia="Times New Roman" w:hAnsi="Times New Roman" w:cs="Times New Roman"/>
+        </w:rPr>
+        <w:t>.2 Diagrama Secuencia Sistema</w:t>
+      </w:r>
+      <w:bookmarkEnd w:id="98"/>
+    </w:p>
+    <w:p>
+      <w:pPr>
+        <w:pStyle w:val="Ttulo2"/>
+        <w:rPr>
+          <w:rFonts w:ascii="Times New Roman" w:eastAsia="Times New Roman" w:hAnsi="Times New Roman" w:cs="Times New Roman"/>
+          <w:sz w:val="30"/>
+          <w:szCs w:val="30"/>
+        </w:rPr>
+      </w:pPr>
+      <w:bookmarkStart w:id="99" w:name="_Toc230806343"/>
+      <w:r>
+        <w:rPr>
+          <w:rFonts w:ascii="Times New Roman" w:eastAsia="Times New Roman" w:hAnsi="Times New Roman" w:cs="Times New Roman"/>
+          <w:sz w:val="30"/>
+          <w:szCs w:val="30"/>
+        </w:rPr>
+        <w:t>9.</w:t>
+      </w:r>
+      <w:r>
+        <w:rPr>
+          <w:rFonts w:ascii="Times New Roman" w:eastAsia="Times New Roman" w:hAnsi="Times New Roman" w:cs="Times New Roman"/>
+          <w:sz w:val="30"/>
+          <w:szCs w:val="30"/>
+        </w:rPr>
         <w:t>6</w:t>
       </w:r>
       <w:r>
         <w:rPr>
           <w:rFonts w:ascii="Times New Roman" w:eastAsia="Times New Roman" w:hAnsi="Times New Roman" w:cs="Times New Roman"/>
-        </w:rPr>
-        <w:t>.2 Diagrama Secuencia Sistema</w:t>
-      </w:r>
-      <w:bookmarkEnd w:id="105"/>
+          <w:sz w:val="30"/>
+          <w:szCs w:val="30"/>
+        </w:rPr>
+        <w:t xml:space="preserve"> Pantalla </w:t>
+      </w:r>
+      <w:bookmarkEnd w:id="99"/>
+      <w:r>
+        <w:rPr>
+          <w:rFonts w:ascii="Times New Roman" w:eastAsia="Times New Roman" w:hAnsi="Times New Roman" w:cs="Times New Roman"/>
+          <w:sz w:val="30"/>
+          <w:szCs w:val="30"/>
+        </w:rPr>
+        <w:t>U</w:t>
+      </w:r>
+      <w:r>
+        <w:rPr>
+          <w:rFonts w:ascii="Times New Roman" w:eastAsia="Times New Roman" w:hAnsi="Times New Roman" w:cs="Times New Roman"/>
+          <w:sz w:val="30"/>
+          <w:szCs w:val="30"/>
+        </w:rPr>
+        <w:t>I</w:t>
+      </w:r>
+    </w:p>
+    <w:p>
+      <w:r>
+        <w:rPr>
+          <w:noProof/>
+        </w:rPr>
+        <w:drawing>
+          <wp:inline distT="0" distB="0" distL="0" distR="0" wp14:anchorId="2D100788" wp14:editId="62B468EF">
+            <wp:extent cx="6263640" cy="2947682"/>
+            <wp:effectExtent l="0" t="0" r="3810" b="5080"/>
+            <wp:docPr id="1002584079" name="Imagen 1"/>
+            <wp:cNvGraphicFramePr>
+              <a:graphicFrameLocks xmlns:a="http://schemas.openxmlformats.org/drawingml/2006/main" noChangeAspect="1"/>
+            </wp:cNvGraphicFramePr>
+            <a:graphic xmlns:a="http://schemas.openxmlformats.org/drawingml/2006/main">
+              <a:graphicData uri="http://schemas.openxmlformats.org/drawingml/2006/picture">
+                <pic:pic xmlns:pic="http://schemas.openxmlformats.org/drawingml/2006/picture">
+                  <pic:nvPicPr>
+                    <pic:cNvPr id="1002584079" name=""/>
+                    <pic:cNvPicPr/>
+                  </pic:nvPicPr>
+                  <pic:blipFill>
+                    <a:blip r:embed="rId55"/>
+                    <a:stretch>
+                      <a:fillRect/>
+                    </a:stretch>
+                  </pic:blipFill>
+                  <pic:spPr>
+                    <a:xfrm>
+                      <a:off x="0" y="0"/>
+                      <a:ext cx="6265385" cy="2948503"/>
+                    </a:xfrm>
+                    <a:prstGeom prst="rect">
+                      <a:avLst/>
+                    </a:prstGeom>
+                  </pic:spPr>
+                </pic:pic>
+              </a:graphicData>
+            </a:graphic>
+          </wp:inline>
+        </w:drawing>
+      </w:r>
     </w:p>
     <w:p/>
-    <w:p/>
     <w:p>
       <w:pPr>
         <w:pStyle w:val="Ttulo1"/>
@@ -25045,14 +24596,15 @@
           <w:rFonts w:ascii="Times New Roman" w:eastAsia="Times New Roman" w:hAnsi="Times New Roman" w:cs="Times New Roman"/>
         </w:rPr>
       </w:pPr>
-      <w:bookmarkStart w:id="106" w:name="_Toc230806347"/>
-      <w:r>
-        <w:rPr>
-          <w:rFonts w:ascii="Times New Roman" w:eastAsia="Times New Roman" w:hAnsi="Times New Roman" w:cs="Times New Roman"/>
-        </w:rPr>
+      <w:bookmarkStart w:id="100" w:name="_Toc230806347"/>
+      <w:r>
+        <w:rPr>
+          <w:rFonts w:ascii="Times New Roman" w:eastAsia="Times New Roman" w:hAnsi="Times New Roman" w:cs="Times New Roman"/>
+        </w:rPr>
+        <w:lastRenderedPageBreak/>
         <w:t>10. GESTIÓN DE MÚLTIPLES IDIOMAS</w:t>
       </w:r>
-      <w:bookmarkEnd w:id="106"/>
+      <w:bookmarkEnd w:id="100"/>
     </w:p>
     <w:p>
       <w:pPr>
@@ -25063,7 +24615,7 @@
           <w:szCs w:val="30"/>
         </w:rPr>
       </w:pPr>
-      <w:bookmarkStart w:id="107" w:name="_Toc230806348"/>
+      <w:bookmarkStart w:id="101" w:name="_Toc230806348"/>
       <w:r>
         <w:rPr>
           <w:rFonts w:ascii="Times New Roman" w:eastAsia="Times New Roman" w:hAnsi="Times New Roman" w:cs="Times New Roman"/>
@@ -25072,7 +24624,7 @@
         </w:rPr>
         <w:t>10.1 Objetivo General</w:t>
       </w:r>
-      <w:bookmarkEnd w:id="107"/>
+      <w:bookmarkEnd w:id="101"/>
     </w:p>
     <w:p>
       <w:pPr>
@@ -25097,18 +24649,24 @@
         <w:rPr>
           <w:rFonts w:ascii="Times New Roman" w:eastAsia="Times New Roman" w:hAnsi="Times New Roman" w:cs="Times New Roman"/>
         </w:rPr>
-        <w:t xml:space="preserve">Utilizando el patrón Observer, cada componente visual que contenga leyendas o títulos se suscribirá a los cambios de idioma garantizando que, al realizar una modificación, </w:t>
-      </w:r>
-      <w:r>
-        <w:rPr>
-          <w:rFonts w:ascii="Times New Roman" w:eastAsia="Times New Roman" w:hAnsi="Times New Roman" w:cs="Times New Roman"/>
-        </w:rPr>
-        <w:lastRenderedPageBreak/>
-        <w:t>todas las interfaces se actualicen automáticamente sin necesidad de reiniciar la aplicación o recargar formularios. Esto mejora significativamente la usabilidad y accesibilidad del sistema, especialmente en entornos donde interactúan usuarios con diferentes lenguas.</w:t>
+        <w:t>Utilizando el patrón Observer, cada componente visual que contenga leyendas o títulos se suscribirá a los cambios de idioma garantizando que, al realizar una modificación, todas las interfaces se actualicen automáticamente sin necesidad de reiniciar la aplicación o recargar formularios. Esto mejora significativamente la usabilidad y accesibilidad del sistema, especialmente en entornos donde interactúan usuarios con diferentes lenguas.</w:t>
       </w:r>
     </w:p>
     <w:p>
       <w:pPr>
+        <w:rPr>
+          <w:rFonts w:ascii="Times New Roman" w:hAnsi="Times New Roman" w:cs="Times New Roman"/>
+        </w:rPr>
+      </w:pPr>
+      <w:r>
+        <w:rPr>
+          <w:rFonts w:ascii="Times New Roman" w:hAnsi="Times New Roman" w:cs="Times New Roman"/>
+        </w:rPr>
+        <w:t>Para lo mencionado anteriormente hacemos uso del Patrón Observer.</w:t>
+      </w:r>
+    </w:p>
+    <w:p>
+      <w:pPr>
         <w:pStyle w:val="Ttulo2"/>
         <w:rPr>
           <w:rFonts w:ascii="Times New Roman" w:eastAsia="Times New Roman" w:hAnsi="Times New Roman" w:cs="Times New Roman"/>
@@ -25116,7 +24674,7 @@
           <w:szCs w:val="30"/>
         </w:rPr>
       </w:pPr>
-      <w:bookmarkStart w:id="108" w:name="_Toc230806349"/>
+      <w:bookmarkStart w:id="102" w:name="_Toc230806349"/>
       <w:r>
         <w:rPr>
           <w:rFonts w:ascii="Times New Roman" w:eastAsia="Times New Roman" w:hAnsi="Times New Roman" w:cs="Times New Roman"/>
@@ -25125,7 +24683,7 @@
         </w:rPr>
         <w:t>10.2 Diagrama de Clases</w:t>
       </w:r>
-      <w:bookmarkEnd w:id="108"/>
+      <w:bookmarkEnd w:id="102"/>
     </w:p>
     <w:p>
       <w:pPr>
@@ -25136,7 +24694,7 @@
           <w:szCs w:val="30"/>
         </w:rPr>
       </w:pPr>
-      <w:bookmarkStart w:id="109" w:name="_Toc230806350"/>
+      <w:bookmarkStart w:id="103" w:name="_Toc230806350"/>
       <w:r>
         <w:rPr>
           <w:rFonts w:ascii="Times New Roman" w:eastAsia="Times New Roman" w:hAnsi="Times New Roman" w:cs="Times New Roman"/>
@@ -25145,7 +24703,7 @@
         </w:rPr>
         <w:t>10.3 Der</w:t>
       </w:r>
-      <w:bookmarkEnd w:id="109"/>
+      <w:bookmarkEnd w:id="103"/>
     </w:p>
     <w:p>
       <w:pPr>
@@ -25192,7 +24750,16 @@
           <w:sz w:val="30"/>
           <w:szCs w:val="30"/>
         </w:rPr>
-        <w:t xml:space="preserve"> Pantallas Múltiples Idiomas</w:t>
+        <w:t xml:space="preserve"> Pantallas </w:t>
+      </w:r>
+      <w:r>
+        <w:rPr>
+          <w:rFonts w:ascii="Times New Roman" w:eastAsia="Times New Roman" w:hAnsi="Times New Roman" w:cs="Times New Roman"/>
+          <w:color w:val="0F4761"/>
+          <w:sz w:val="30"/>
+          <w:szCs w:val="30"/>
+        </w:rPr>
+        <w:t>UI</w:t>
       </w:r>
       <w:r>
         <w:rPr>
@@ -25212,231 +24779,18 @@
     </w:p>
     <w:p>
       <w:r>
-        <w:t>10.</w:t>
-      </w:r>
-      <w:r>
-        <w:t>5</w:t>
-      </w:r>
-      <w:r>
-        <w:t xml:space="preserve">.2 </w:t>
+        <w:t xml:space="preserve">10.5.2 </w:t>
       </w:r>
     </w:p>
     <w:p>
       <w:r>
-        <w:t>10.</w:t>
-      </w:r>
-      <w:r>
-        <w:t>5</w:t>
-      </w:r>
-      <w:r>
-        <w:t xml:space="preserve">.3 </w:t>
-      </w:r>
-    </w:p>
-    <w:p>
-      <w:pPr>
-        <w:pStyle w:val="Ttulo2"/>
-        <w:rPr>
-          <w:rFonts w:ascii="Times New Roman" w:eastAsia="Times New Roman" w:hAnsi="Times New Roman" w:cs="Times New Roman"/>
-          <w:sz w:val="30"/>
-          <w:szCs w:val="30"/>
-        </w:rPr>
-      </w:pPr>
-      <w:bookmarkStart w:id="110" w:name="_Toc230806351"/>
-      <w:r>
-        <w:rPr>
-          <w:rFonts w:ascii="Times New Roman" w:eastAsia="Times New Roman" w:hAnsi="Times New Roman" w:cs="Times New Roman"/>
-          <w:sz w:val="30"/>
-          <w:szCs w:val="30"/>
-        </w:rPr>
-        <w:t>10</w:t>
-      </w:r>
-      <w:r>
-        <w:rPr>
-          <w:rFonts w:ascii="Times New Roman" w:eastAsia="Times New Roman" w:hAnsi="Times New Roman" w:cs="Times New Roman"/>
-          <w:sz w:val="30"/>
-          <w:szCs w:val="30"/>
-        </w:rPr>
-        <w:t xml:space="preserve">.6 </w:t>
-      </w:r>
-      <w:r>
-        <w:rPr>
-          <w:rFonts w:ascii="Times New Roman" w:eastAsia="Times New Roman" w:hAnsi="Times New Roman" w:cs="Times New Roman"/>
-          <w:sz w:val="30"/>
-          <w:szCs w:val="30"/>
-        </w:rPr>
-        <w:t>Cambiar Idioma</w:t>
-      </w:r>
-      <w:bookmarkEnd w:id="110"/>
-    </w:p>
-    <w:p>
-      <w:pPr>
-        <w:pStyle w:val="Ttulo3"/>
-        <w:rPr>
-          <w:rFonts w:ascii="Times New Roman" w:eastAsia="Times New Roman" w:hAnsi="Times New Roman" w:cs="Times New Roman"/>
-        </w:rPr>
-      </w:pPr>
-      <w:bookmarkStart w:id="111" w:name="_Toc230806352"/>
-      <w:r>
-        <w:rPr>
-          <w:rFonts w:ascii="Times New Roman" w:eastAsia="Times New Roman" w:hAnsi="Times New Roman" w:cs="Times New Roman"/>
-        </w:rPr>
-        <w:t>10</w:t>
-      </w:r>
-      <w:r>
-        <w:rPr>
-          <w:rFonts w:ascii="Times New Roman" w:eastAsia="Times New Roman" w:hAnsi="Times New Roman" w:cs="Times New Roman"/>
-        </w:rPr>
-        <w:t>.6.1 Especificación CU</w:t>
-      </w:r>
-      <w:bookmarkEnd w:id="111"/>
-    </w:p>
-    <w:p>
-      <w:pPr>
-        <w:pStyle w:val="Ttulo3"/>
-        <w:rPr>
-          <w:rFonts w:ascii="Times New Roman" w:eastAsia="Times New Roman" w:hAnsi="Times New Roman" w:cs="Times New Roman"/>
-        </w:rPr>
-      </w:pPr>
-      <w:bookmarkStart w:id="112" w:name="_Toc230806353"/>
-      <w:r>
-        <w:rPr>
-          <w:rFonts w:ascii="Times New Roman" w:eastAsia="Times New Roman" w:hAnsi="Times New Roman" w:cs="Times New Roman"/>
-        </w:rPr>
-        <w:t>10</w:t>
-      </w:r>
-      <w:r>
-        <w:rPr>
-          <w:rFonts w:ascii="Times New Roman" w:eastAsia="Times New Roman" w:hAnsi="Times New Roman" w:cs="Times New Roman"/>
-        </w:rPr>
-        <w:t>.6.2 Diagrama Secuencia Sistema</w:t>
-      </w:r>
-      <w:bookmarkEnd w:id="112"/>
-    </w:p>
-    <w:p/>
-    <w:p>
-      <w:pPr>
-        <w:pStyle w:val="Ttulo2"/>
-        <w:rPr>
-          <w:rFonts w:ascii="Times New Roman" w:eastAsia="Times New Roman" w:hAnsi="Times New Roman" w:cs="Times New Roman"/>
-          <w:sz w:val="30"/>
-          <w:szCs w:val="30"/>
-        </w:rPr>
-      </w:pPr>
-      <w:bookmarkStart w:id="113" w:name="_Toc230806354"/>
-      <w:r>
-        <w:rPr>
-          <w:rFonts w:ascii="Times New Roman" w:eastAsia="Times New Roman" w:hAnsi="Times New Roman" w:cs="Times New Roman"/>
-          <w:sz w:val="30"/>
-          <w:szCs w:val="30"/>
-        </w:rPr>
-        <w:t>10</w:t>
-      </w:r>
-      <w:r>
-        <w:rPr>
-          <w:rFonts w:ascii="Times New Roman" w:eastAsia="Times New Roman" w:hAnsi="Times New Roman" w:cs="Times New Roman"/>
-          <w:sz w:val="30"/>
-          <w:szCs w:val="30"/>
-        </w:rPr>
-        <w:t>.</w:t>
-      </w:r>
-      <w:r>
-        <w:rPr>
-          <w:rFonts w:ascii="Times New Roman" w:eastAsia="Times New Roman" w:hAnsi="Times New Roman" w:cs="Times New Roman"/>
-          <w:sz w:val="30"/>
-          <w:szCs w:val="30"/>
-        </w:rPr>
-        <w:t>7</w:t>
-      </w:r>
-      <w:r>
-        <w:rPr>
-          <w:rFonts w:ascii="Times New Roman" w:eastAsia="Times New Roman" w:hAnsi="Times New Roman" w:cs="Times New Roman"/>
-          <w:sz w:val="30"/>
-          <w:szCs w:val="30"/>
-        </w:rPr>
-        <w:t xml:space="preserve"> </w:t>
-      </w:r>
-      <w:r>
-        <w:rPr>
-          <w:rFonts w:ascii="Times New Roman" w:eastAsia="Times New Roman" w:hAnsi="Times New Roman" w:cs="Times New Roman"/>
-          <w:sz w:val="30"/>
-          <w:szCs w:val="30"/>
-        </w:rPr>
-        <w:t>Registrar Idioma</w:t>
-      </w:r>
-      <w:bookmarkEnd w:id="113"/>
-    </w:p>
-    <w:p>
-      <w:pPr>
-        <w:pStyle w:val="Ttulo3"/>
-        <w:rPr>
-          <w:rFonts w:ascii="Times New Roman" w:eastAsia="Times New Roman" w:hAnsi="Times New Roman" w:cs="Times New Roman"/>
-        </w:rPr>
-      </w:pPr>
-      <w:bookmarkStart w:id="114" w:name="_Toc230806355"/>
-      <w:r>
-        <w:rPr>
-          <w:rFonts w:ascii="Times New Roman" w:eastAsia="Times New Roman" w:hAnsi="Times New Roman" w:cs="Times New Roman"/>
-        </w:rPr>
-        <w:t>10</w:t>
-      </w:r>
-      <w:r>
-        <w:rPr>
-          <w:rFonts w:ascii="Times New Roman" w:eastAsia="Times New Roman" w:hAnsi="Times New Roman" w:cs="Times New Roman"/>
-        </w:rPr>
-        <w:t>.</w:t>
-      </w:r>
-      <w:r>
-        <w:rPr>
-          <w:rFonts w:ascii="Times New Roman" w:eastAsia="Times New Roman" w:hAnsi="Times New Roman" w:cs="Times New Roman"/>
-        </w:rPr>
-        <w:t>7</w:t>
-      </w:r>
-      <w:r>
-        <w:rPr>
-          <w:rFonts w:ascii="Times New Roman" w:eastAsia="Times New Roman" w:hAnsi="Times New Roman" w:cs="Times New Roman"/>
-        </w:rPr>
-        <w:t>.1 Especificación CU</w:t>
-      </w:r>
-      <w:bookmarkEnd w:id="114"/>
-    </w:p>
-    <w:p>
-      <w:pPr>
-        <w:pStyle w:val="Ttulo3"/>
-        <w:rPr>
-          <w:rFonts w:ascii="Times New Roman" w:eastAsia="Times New Roman" w:hAnsi="Times New Roman" w:cs="Times New Roman"/>
-        </w:rPr>
-      </w:pPr>
-      <w:bookmarkStart w:id="115" w:name="_Toc230806356"/>
-      <w:r>
-        <w:rPr>
-          <w:rFonts w:ascii="Times New Roman" w:eastAsia="Times New Roman" w:hAnsi="Times New Roman" w:cs="Times New Roman"/>
-        </w:rPr>
-        <w:t>10</w:t>
-      </w:r>
-      <w:r>
-        <w:rPr>
-          <w:rFonts w:ascii="Times New Roman" w:eastAsia="Times New Roman" w:hAnsi="Times New Roman" w:cs="Times New Roman"/>
-        </w:rPr>
-        <w:t>.</w:t>
-      </w:r>
-      <w:r>
-        <w:rPr>
-          <w:rFonts w:ascii="Times New Roman" w:eastAsia="Times New Roman" w:hAnsi="Times New Roman" w:cs="Times New Roman"/>
-        </w:rPr>
-        <w:t>7</w:t>
-      </w:r>
-      <w:r>
-        <w:rPr>
-          <w:rFonts w:ascii="Times New Roman" w:eastAsia="Times New Roman" w:hAnsi="Times New Roman" w:cs="Times New Roman"/>
-        </w:rPr>
-        <w:t>.2 Diagrama Secuencia Sistema</w:t>
-      </w:r>
-      <w:bookmarkEnd w:id="115"/>
+        <w:t xml:space="preserve">10.5.3 </w:t>
+      </w:r>
     </w:p>
     <w:p/>
     <w:sectPr>
-      <w:headerReference w:type="default" r:id="rId52"/>
-      <w:footerReference w:type="default" r:id="rId53"/>
+      <w:headerReference w:type="default" r:id="rId56"/>
+      <w:footerReference w:type="default" r:id="rId57"/>
       <w:pgSz w:w="11906" w:h="16838"/>
       <w:pgMar w:top="1417" w:right="1701" w:bottom="1417" w:left="1701" w:header="708" w:footer="708" w:gutter="0"/>
       <w:pgNumType w:start="1"/>
@@ -29609,7 +28963,7 @@
   <w:style w:type="paragraph" w:default="1" w:styleId="Normal">
     <w:name w:val="Normal"/>
     <w:qFormat/>
-    <w:rsid w:val="000A02F8"/>
+    <w:rsid w:val="007047D8"/>
   </w:style>
   <w:style w:type="paragraph" w:styleId="Ttulo1">
     <w:name w:val="heading 1"/>
@@ -30522,28 +29876,28 @@
 </file>
 
 <file path=customXml/item1.xml><?xml version="1.0" encoding="utf-8"?>
-<b:Sources xmlns:b="http://schemas.openxmlformats.org/officeDocument/2006/bibliography" xmlns="http://schemas.openxmlformats.org/officeDocument/2006/bibliography" SelectedStyle="\APASixthEditionOfficeOnline.xsl" StyleName="APA" Version="6"/>
-</file>
-
-<file path=customXml/item2.xml><?xml version="1.0" encoding="utf-8"?>
 <go:gDocsCustomXmlDataStorage xmlns:go="http://customooxmlschemas.google.com/" xmlns:r="http://schemas.openxmlformats.org/officeDocument/2006/relationships" uri="GoogleDocsCustomDataVersion2">
   <go:docsCustomData xmlns:go="http://customooxmlschemas.google.com/" roundtripDataSignature="AMtx7mg9ViIy0TFX1PbiokUHW0+gEHD0DQ==">CgMxLjAyDmgueXB0b3ptdnN5YWhpMg5oLjMwMTZ1a3NyeWs5OTIOaC41dHdvajgxajFna2EyDmguajh3ZGR4ZWVnZ3R3Mg5oLmJneml2aG00bzdoYzIOaC5qOTJ5aWxicjl6dDcyDmgubjRpdXVhbG9heDc2Mg5oLjFpNzZ2NHk0NXc5OTIOaC5oaHFvaTRybTJzYjEyDmgubGF1ZXZ5aGhzMG5uMg5oLjI5Nmd4eXhiYnYwbTgAciExNlVkVkNiWlZIdUNvcHFuMnNIenVkMWZoTjV5TjIzLW4=</go:docsCustomData>
 </go:gDocsCustomXmlDataStorage>
 </file>
 
-<file path=customXml/itemProps1.xml><?xml version="1.0" encoding="utf-8"?>
-<ds:datastoreItem xmlns:ds="http://schemas.openxmlformats.org/officeDocument/2006/customXml" ds:itemID="{98C402C2-0B0B-45E1-8B8A-FD895BAD112E}">
-  <ds:schemaRefs>
-    <ds:schemaRef ds:uri="http://schemas.openxmlformats.org/officeDocument/2006/bibliography"/>
-  </ds:schemaRefs>
-</ds:datastoreItem>
+<file path=customXml/item2.xml><?xml version="1.0" encoding="utf-8"?>
+<b:Sources xmlns:b="http://schemas.openxmlformats.org/officeDocument/2006/bibliography" xmlns="http://schemas.openxmlformats.org/officeDocument/2006/bibliography" SelectedStyle="\APASixthEditionOfficeOnline.xsl" StyleName="APA" Version="6"/>
 </file>
 
-<file path=customXml/itemProps2.xml><?xml version="1.0" encoding="utf-8"?>
+<file path=customXml/itemProps1.xml><?xml version="1.0" encoding="utf-8"?>
 <ds:datastoreItem xmlns:ds="http://schemas.openxmlformats.org/officeDocument/2006/customXml" ds:itemID="{11111111-1234-1234-1234-123412341234}">
   <ds:schemaRefs>
     <ds:schemaRef ds:uri="http://customooxmlschemas.google.com/"/>
     <ds:schemaRef ds:uri="http://schemas.openxmlformats.org/officeDocument/2006/relationships"/>
   </ds:schemaRefs>
 </ds:datastoreItem>
+</file>
+
+<file path=customXml/itemProps2.xml><?xml version="1.0" encoding="utf-8"?>
+<ds:datastoreItem xmlns:ds="http://schemas.openxmlformats.org/officeDocument/2006/customXml" ds:itemID="{98C402C2-0B0B-45E1-8B8A-FD895BAD112E}">
+  <ds:schemaRefs>
+    <ds:schemaRef ds:uri="http://schemas.openxmlformats.org/officeDocument/2006/bibliography"/>
+  </ds:schemaRefs>
+</ds:datastoreItem>
 </file>
</xml_diff>

<commit_message>
correcciones módulo MultiIdioma + documentación diagramas
Correcciones y mejoras al módulo MultiIdioma tras pruebas iniciales.

Fixes de código:
- CargarComboIdiomas: nullear DataSource antes de reasignar para forzar  refresco visual en WinForms
- frmABMIdioma: recargar combo al volver desde el ABM (ShowDialog)
- frmABMIdioma: forzar selección del primer item del grid al cargar  (WinForms no dispara SelectionChanged si ya está seleccionado)
- frmABMIdioma: agregar combo de cambio de idioma igual al de frmMenú
- Program.cs: inicializar idioma por defecto (Español) antes de frmLogin

Fixes SQL:
- SP ObtenerTraduccionesPorIdioma: COALESCE trata strings vacíos ""
  igual que NULL (LTRIM/RTRIM/ISNULL)
- INSERT controles lblfrmBrInfoGenBk y lblfrmBRInfoR en frmBackUp_Restore
  con traducciones Español e Inglés
- INSERT filas faltantes en Traduccion para Portugués (IdIdioma = 3)

Documentación:
- Diagrama de clases general con módulo MultiIdioma integrado
- DSS CU009 CambiarIdioma
</commit_message>
<xml_diff>
--- a/Documentación/ProyectoIS 2026 CAJAL-FERNANDEZ_2daEntrega.docx
+++ b/Documentación/ProyectoIS 2026 CAJAL-FERNANDEZ_2daEntrega.docx
@@ -7583,7 +7583,7 @@
           <w:rFonts w:ascii="Times New Roman" w:eastAsia="Times New Roman" w:hAnsi="Times New Roman" w:cs="Times New Roman"/>
           <w:color w:val="000000"/>
         </w:rPr>
-        <w:t>Registro/</w:t>
+        <w:t>Registro/LogIn-</w:t>
       </w:r>
       <w:proofErr w:type="spellStart"/>
       <w:r>
@@ -7591,7 +7591,7 @@
           <w:rFonts w:ascii="Times New Roman" w:eastAsia="Times New Roman" w:hAnsi="Times New Roman" w:cs="Times New Roman"/>
           <w:color w:val="000000"/>
         </w:rPr>
-        <w:t>LogIn-Out</w:t>
+        <w:t>Out</w:t>
       </w:r>
       <w:proofErr w:type="spellEnd"/>
       <w:r>
@@ -8624,7 +8624,6 @@
           <w:bCs/>
           <w:color w:val="000000"/>
         </w:rPr>
-        <w:lastRenderedPageBreak/>
         <w:t>SERVICIO:</w:t>
       </w:r>
       <w:r>
@@ -8660,6 +8659,7 @@
         <w:rPr>
           <w:rFonts w:ascii="Times New Roman" w:eastAsia="Times New Roman" w:hAnsi="Times New Roman" w:cs="Times New Roman"/>
         </w:rPr>
+        <w:lastRenderedPageBreak/>
         <w:t>1.</w:t>
       </w:r>
       <w:r>
@@ -8953,14 +8953,13 @@
       </w:pPr>
       <w:r>
         <w:rPr>
-          <w:rFonts w:ascii="Times New Roman" w:hAnsi="Times New Roman" w:cs="Times New Roman"/>
           <w:noProof/>
         </w:rPr>
         <w:drawing>
-          <wp:inline distT="0" distB="0" distL="0" distR="0" wp14:anchorId="365BAD16" wp14:editId="05059F4E">
-            <wp:extent cx="5400040" cy="2440940"/>
+          <wp:inline distT="0" distB="0" distL="0" distR="0" wp14:anchorId="0AFE3D45" wp14:editId="087F7308">
+            <wp:extent cx="5700338" cy="5448300"/>
             <wp:effectExtent l="0" t="0" r="0" b="0"/>
-            <wp:docPr id="1430806995" name="Imagen 3"/>
+            <wp:docPr id="224839580" name="Imagen 1"/>
             <wp:cNvGraphicFramePr>
               <a:graphicFrameLocks xmlns:a="http://schemas.openxmlformats.org/drawingml/2006/main" noChangeAspect="1"/>
             </wp:cNvGraphicFramePr>
@@ -8968,36 +8967,23 @@
               <a:graphicData uri="http://schemas.openxmlformats.org/drawingml/2006/picture">
                 <pic:pic xmlns:pic="http://schemas.openxmlformats.org/drawingml/2006/picture">
                   <pic:nvPicPr>
-                    <pic:cNvPr id="0" name="Picture 3"/>
-                    <pic:cNvPicPr>
-                      <a:picLocks noChangeAspect="1" noChangeArrowheads="1"/>
-                    </pic:cNvPicPr>
+                    <pic:cNvPr id="224839580" name=""/>
+                    <pic:cNvPicPr/>
                   </pic:nvPicPr>
                   <pic:blipFill>
-                    <a:blip r:embed="rId14">
-                      <a:extLst>
-                        <a:ext uri="{28A0092B-C50C-407E-A947-70E740481C1C}">
-                          <a14:useLocalDpi xmlns:a14="http://schemas.microsoft.com/office/drawing/2010/main" val="0"/>
-                        </a:ext>
-                      </a:extLst>
-                    </a:blip>
-                    <a:srcRect/>
+                    <a:blip r:embed="rId14"/>
                     <a:stretch>
                       <a:fillRect/>
                     </a:stretch>
                   </pic:blipFill>
-                  <pic:spPr bwMode="auto">
+                  <pic:spPr>
                     <a:xfrm>
                       <a:off x="0" y="0"/>
-                      <a:ext cx="5400040" cy="2440940"/>
+                      <a:ext cx="5701276" cy="5449197"/>
                     </a:xfrm>
                     <a:prstGeom prst="rect">
                       <a:avLst/>
                     </a:prstGeom>
-                    <a:noFill/>
-                    <a:ln>
-                      <a:noFill/>
-                    </a:ln>
                   </pic:spPr>
                 </pic:pic>
               </a:graphicData>
@@ -9022,6 +9008,7 @@
           <w:sz w:val="30"/>
           <w:szCs w:val="30"/>
         </w:rPr>
+        <w:lastRenderedPageBreak/>
         <w:t>1.</w:t>
       </w:r>
       <w:r>
@@ -9159,7 +9146,6 @@
         <w:rPr>
           <w:rFonts w:ascii="Times New Roman" w:eastAsia="Times New Roman" w:hAnsi="Times New Roman" w:cs="Times New Roman"/>
         </w:rPr>
-        <w:lastRenderedPageBreak/>
         <w:t>1.</w:t>
       </w:r>
       <w:r>
@@ -9249,6 +9235,7 @@
         <w:rPr>
           <w:rFonts w:ascii="Times New Roman" w:eastAsia="Times New Roman" w:hAnsi="Times New Roman" w:cs="Times New Roman"/>
         </w:rPr>
+        <w:lastRenderedPageBreak/>
         <w:t>1.</w:t>
       </w:r>
       <w:r>
@@ -9338,7 +9325,6 @@
         <w:rPr>
           <w:rFonts w:ascii="Times New Roman" w:eastAsia="Times New Roman" w:hAnsi="Times New Roman" w:cs="Times New Roman"/>
         </w:rPr>
-        <w:lastRenderedPageBreak/>
         <w:t>1.</w:t>
       </w:r>
       <w:r>
@@ -9432,6 +9418,7 @@
           <w:sz w:val="30"/>
           <w:szCs w:val="30"/>
         </w:rPr>
+        <w:lastRenderedPageBreak/>
         <w:t>1.</w:t>
       </w:r>
       <w:r>
@@ -9535,7 +9522,6 @@
         <w:rPr>
           <w:rFonts w:ascii="Times New Roman" w:eastAsia="Times New Roman" w:hAnsi="Times New Roman" w:cs="Times New Roman"/>
         </w:rPr>
-        <w:lastRenderedPageBreak/>
         <w:t>2. GESTIÓN DE LOG IN / LOG OUT DEL SISTEMA</w:t>
       </w:r>
       <w:bookmarkEnd w:id="20"/>
@@ -9783,7 +9769,15 @@
           <w:rFonts w:ascii="Times New Roman" w:eastAsia="Times New Roman" w:hAnsi="Times New Roman" w:cs="Times New Roman"/>
           <w:color w:val="000000"/>
         </w:rPr>
-        <w:t xml:space="preserve"> y a su vez que el formato del Correo electrónico sea correcto</w:t>
+        <w:t xml:space="preserve"> y a su vez que el </w:t>
+      </w:r>
+      <w:r>
+        <w:rPr>
+          <w:rFonts w:ascii="Times New Roman" w:eastAsia="Times New Roman" w:hAnsi="Times New Roman" w:cs="Times New Roman"/>
+          <w:color w:val="000000"/>
+        </w:rPr>
+        <w:lastRenderedPageBreak/>
+        <w:t>formato del Correo electrónico sea correcto</w:t>
       </w:r>
       <w:r>
         <w:rPr>
@@ -9987,7 +9981,7 @@
           <w:rFonts w:ascii="Times New Roman" w:eastAsia="Times New Roman" w:hAnsi="Times New Roman" w:cs="Times New Roman"/>
           <w:color w:val="000000"/>
         </w:rPr>
-        <w:t xml:space="preserve">A su vez en la pantalla del </w:t>
+        <w:t xml:space="preserve">A su vez en la pantalla del LogIn presentamos un botón “mostrar” para que si el usuario quiere revisar la contraseña ingresada antes de presionar el botón LogIn pueda hacerlo. Para ello debemos </w:t>
       </w:r>
       <w:proofErr w:type="spellStart"/>
       <w:r>
@@ -9995,7 +9989,7 @@
           <w:rFonts w:ascii="Times New Roman" w:eastAsia="Times New Roman" w:hAnsi="Times New Roman" w:cs="Times New Roman"/>
           <w:color w:val="000000"/>
         </w:rPr>
-        <w:t>LogIn</w:t>
+        <w:t>setear</w:t>
       </w:r>
       <w:proofErr w:type="spellEnd"/>
       <w:r>
@@ -10003,7 +9997,7 @@
           <w:rFonts w:ascii="Times New Roman" w:eastAsia="Times New Roman" w:hAnsi="Times New Roman" w:cs="Times New Roman"/>
           <w:color w:val="000000"/>
         </w:rPr>
-        <w:t xml:space="preserve"> presentamos un botón “mostrar” para que si el usuario quiere revisar la contraseña ingresada antes de presionar el botón </w:t>
+        <w:t xml:space="preserve"> la propiedad </w:t>
       </w:r>
       <w:proofErr w:type="spellStart"/>
       <w:r>
@@ -10011,7 +10005,7 @@
           <w:rFonts w:ascii="Times New Roman" w:eastAsia="Times New Roman" w:hAnsi="Times New Roman" w:cs="Times New Roman"/>
           <w:color w:val="000000"/>
         </w:rPr>
-        <w:t>LogIn</w:t>
+        <w:t>PasswordChar</w:t>
       </w:r>
       <w:proofErr w:type="spellEnd"/>
       <w:r>
@@ -10019,7 +10013,7 @@
           <w:rFonts w:ascii="Times New Roman" w:eastAsia="Times New Roman" w:hAnsi="Times New Roman" w:cs="Times New Roman"/>
           <w:color w:val="000000"/>
         </w:rPr>
-        <w:t xml:space="preserve"> pueda hacerlo. Para ello debemos setear la propiedad </w:t>
+        <w:t xml:space="preserve"> del </w:t>
       </w:r>
       <w:proofErr w:type="spellStart"/>
       <w:r>
@@ -10027,7 +10021,7 @@
           <w:rFonts w:ascii="Times New Roman" w:eastAsia="Times New Roman" w:hAnsi="Times New Roman" w:cs="Times New Roman"/>
           <w:color w:val="000000"/>
         </w:rPr>
-        <w:t>PasswordChar</w:t>
+        <w:t>TextBox</w:t>
       </w:r>
       <w:proofErr w:type="spellEnd"/>
       <w:r>
@@ -10035,7 +10029,7 @@
           <w:rFonts w:ascii="Times New Roman" w:eastAsia="Times New Roman" w:hAnsi="Times New Roman" w:cs="Times New Roman"/>
           <w:color w:val="000000"/>
         </w:rPr>
-        <w:t xml:space="preserve"> del TextBox en donde el usuario ingresa la contraseña como “*” por default.</w:t>
+        <w:t xml:space="preserve"> en donde el usuario ingresa la contraseña como “*” por default.</w:t>
       </w:r>
     </w:p>
     <w:p>
@@ -10058,7 +10052,6 @@
           <w:rFonts w:ascii="Times New Roman" w:eastAsia="Times New Roman" w:hAnsi="Times New Roman" w:cs="Times New Roman"/>
           <w:color w:val="000000"/>
         </w:rPr>
-        <w:lastRenderedPageBreak/>
         <w:t>Se crea una única sesión activa usando una clase de servicios que implementa el patrón Singleton.</w:t>
       </w:r>
     </w:p>
@@ -10154,37 +10147,9 @@
           <w:sz w:val="30"/>
           <w:szCs w:val="30"/>
         </w:rPr>
-        <w:t xml:space="preserve">2.3 </w:t>
-      </w:r>
-      <w:proofErr w:type="spellStart"/>
-      <w:r>
-        <w:rPr>
-          <w:rFonts w:ascii="Times New Roman" w:eastAsia="Times New Roman" w:hAnsi="Times New Roman" w:cs="Times New Roman"/>
-          <w:sz w:val="30"/>
-          <w:szCs w:val="30"/>
-        </w:rPr>
-        <w:t>LogIn</w:t>
-      </w:r>
-      <w:proofErr w:type="spellEnd"/>
-      <w:r>
-        <w:rPr>
-          <w:rFonts w:ascii="Times New Roman" w:eastAsia="Times New Roman" w:hAnsi="Times New Roman" w:cs="Times New Roman"/>
-          <w:sz w:val="30"/>
-          <w:szCs w:val="30"/>
-        </w:rPr>
-        <w:t xml:space="preserve"> – CU001 </w:t>
-      </w:r>
-      <w:proofErr w:type="spellStart"/>
-      <w:r>
-        <w:rPr>
-          <w:rFonts w:ascii="Times New Roman" w:eastAsia="Times New Roman" w:hAnsi="Times New Roman" w:cs="Times New Roman"/>
-          <w:sz w:val="30"/>
-          <w:szCs w:val="30"/>
-        </w:rPr>
-        <w:t>LogIn</w:t>
+        <w:t>2.3 LogIn – CU001 LogIn</w:t>
       </w:r>
       <w:bookmarkEnd w:id="23"/>
-      <w:proofErr w:type="spellEnd"/>
     </w:p>
     <w:p>
       <w:pPr>
@@ -10210,14 +10175,7 @@
         <w:rPr>
           <w:rFonts w:ascii="Times New Roman" w:eastAsia="Times New Roman" w:hAnsi="Times New Roman" w:cs="Times New Roman"/>
         </w:rPr>
-        <w:t xml:space="preserve"> Diagrama </w:t>
-      </w:r>
-      <w:proofErr w:type="spellStart"/>
-      <w:r>
-        <w:rPr>
-          <w:rFonts w:ascii="Times New Roman" w:eastAsia="Times New Roman" w:hAnsi="Times New Roman" w:cs="Times New Roman"/>
-        </w:rPr>
-        <w:t>LogI</w:t>
+        <w:t xml:space="preserve"> Diagrama LogI</w:t>
       </w:r>
       <w:r>
         <w:rPr>
@@ -10226,7 +10184,6 @@
         <w:t>n</w:t>
       </w:r>
       <w:bookmarkEnd w:id="24"/>
-      <w:proofErr w:type="spellEnd"/>
     </w:p>
     <w:p>
       <w:pPr>
@@ -10369,17 +10326,8 @@
                 <w:rFonts w:ascii="Times New Roman" w:eastAsia="Times New Roman" w:hAnsi="Times New Roman" w:cs="Times New Roman"/>
                 <w:color w:val="000000"/>
               </w:rPr>
-              <w:t xml:space="preserve">CU 001 – </w:t>
-            </w:r>
-            <w:proofErr w:type="spellStart"/>
-            <w:r>
-              <w:rPr>
-                <w:rFonts w:ascii="Times New Roman" w:eastAsia="Times New Roman" w:hAnsi="Times New Roman" w:cs="Times New Roman"/>
-                <w:color w:val="000000"/>
-              </w:rPr>
-              <w:t>LogIn</w:t>
-            </w:r>
-            <w:proofErr w:type="spellEnd"/>
+              <w:t>CU 001 – LogIn</w:t>
+            </w:r>
             <w:r>
               <w:rPr>
                 <w:rFonts w:ascii="Times New Roman" w:eastAsia="Times New Roman" w:hAnsi="Times New Roman" w:cs="Times New Roman"/>
@@ -10534,6 +10482,7 @@
                 <w:bCs/>
                 <w:color w:val="000000"/>
               </w:rPr>
+              <w:lastRenderedPageBreak/>
               <w:t xml:space="preserve">ACTOR PRINCIPAL: </w:t>
             </w:r>
             <w:r>
@@ -10794,27 +10743,7 @@
                 <w:sz w:val="22"/>
                 <w:szCs w:val="22"/>
               </w:rPr>
-              <w:t>El usuario ingresa al sistema y se le presenta la pantalla principal del mismo “</w:t>
-            </w:r>
-            <w:proofErr w:type="spellStart"/>
-            <w:r>
-              <w:rPr>
-                <w:rFonts w:ascii="Times New Roman" w:eastAsia="Times New Roman" w:hAnsi="Times New Roman" w:cs="Times New Roman"/>
-                <w:color w:val="000000"/>
-                <w:sz w:val="22"/>
-                <w:szCs w:val="22"/>
-              </w:rPr>
-              <w:t>LogIn</w:t>
-            </w:r>
-            <w:proofErr w:type="spellEnd"/>
-            <w:r>
-              <w:rPr>
-                <w:rFonts w:ascii="Times New Roman" w:eastAsia="Times New Roman" w:hAnsi="Times New Roman" w:cs="Times New Roman"/>
-                <w:color w:val="000000"/>
-                <w:sz w:val="22"/>
-                <w:szCs w:val="22"/>
-              </w:rPr>
-              <w:t>”.</w:t>
+              <w:t>El usuario ingresa al sistema y se le presenta la pantalla principal del mismo “LogIn”.</w:t>
             </w:r>
           </w:p>
           <w:p>
@@ -11079,7 +11008,6 @@
                 <w:bCs/>
                 <w:color w:val="000000"/>
               </w:rPr>
-              <w:lastRenderedPageBreak/>
               <w:t>FLUJOS ALTERNATIVO: </w:t>
             </w:r>
           </w:p>
@@ -11409,23 +11337,7 @@
                 <w:rFonts w:ascii="Times New Roman" w:eastAsia="Times New Roman" w:hAnsi="Times New Roman" w:cs="Times New Roman"/>
                 <w:color w:val="000000"/>
               </w:rPr>
-              <w:t xml:space="preserve">El usuario queda autenticado en el sistema e inicia su sesión, se registran los permisos </w:t>
-            </w:r>
-            <w:proofErr w:type="gramStart"/>
-            <w:r>
-              <w:rPr>
-                <w:rFonts w:ascii="Times New Roman" w:eastAsia="Times New Roman" w:hAnsi="Times New Roman" w:cs="Times New Roman"/>
-                <w:color w:val="000000"/>
-              </w:rPr>
-              <w:t>del mismo</w:t>
-            </w:r>
-            <w:proofErr w:type="gramEnd"/>
-            <w:r>
-              <w:rPr>
-                <w:rFonts w:ascii="Times New Roman" w:eastAsia="Times New Roman" w:hAnsi="Times New Roman" w:cs="Times New Roman"/>
-                <w:color w:val="000000"/>
-              </w:rPr>
-              <w:t>.</w:t>
+              <w:t>El usuario queda autenticado en el sistema e inicia su sesión, se registran los permisos del mismo.</w:t>
             </w:r>
           </w:p>
         </w:tc>
@@ -12221,7 +12133,6 @@
                 <w:bCs/>
                 <w:color w:val="000000"/>
               </w:rPr>
-              <w:lastRenderedPageBreak/>
               <w:t xml:space="preserve">PRECONDICIONES: </w:t>
             </w:r>
             <w:r>
@@ -12268,6 +12179,7 @@
                 <w:bCs/>
                 <w:color w:val="000000"/>
               </w:rPr>
+              <w:lastRenderedPageBreak/>
               <w:t xml:space="preserve">PUNTOS DE EXTENSIÓN: </w:t>
             </w:r>
             <w:r>
@@ -13402,7 +13314,6 @@
           <w:sz w:val="30"/>
           <w:szCs w:val="30"/>
         </w:rPr>
-        <w:lastRenderedPageBreak/>
         <w:t>3.</w:t>
       </w:r>
       <w:r>
@@ -13576,6 +13487,7 @@
                 <w:bCs/>
                 <w:color w:val="000000"/>
               </w:rPr>
+              <w:lastRenderedPageBreak/>
               <w:t>ESTADO:</w:t>
             </w:r>
             <w:r>
@@ -14901,7 +14813,6 @@
                 <w:bCs/>
                 <w:color w:val="000000"/>
               </w:rPr>
-              <w:lastRenderedPageBreak/>
               <w:t xml:space="preserve">PRECONDICIONES: </w:t>
             </w:r>
             <w:r>
@@ -14981,6 +14892,7 @@
                 <w:bCs/>
                 <w:color w:val="000000"/>
               </w:rPr>
+              <w:lastRenderedPageBreak/>
               <w:t xml:space="preserve">PUNTOS DE EXTENSIÓN: </w:t>
             </w:r>
             <w:r>
@@ -16031,7 +15943,6 @@
                 <w:bCs/>
                 <w:color w:val="000000"/>
               </w:rPr>
-              <w:lastRenderedPageBreak/>
               <w:t xml:space="preserve">PUNTOS DE EXTENSIÓN: </w:t>
             </w:r>
             <w:r>
@@ -16078,6 +15989,7 @@
                 <w:bCs/>
                 <w:color w:val="000000"/>
               </w:rPr>
+              <w:lastRenderedPageBreak/>
               <w:t>CONDICIÓN:</w:t>
             </w:r>
           </w:p>
@@ -16913,21 +16825,7 @@
         <w:rPr>
           <w:rFonts w:ascii="Times New Roman" w:hAnsi="Times New Roman" w:cs="Times New Roman"/>
         </w:rPr>
-        <w:t xml:space="preserve">La utilización de la bitácora nos permite llevar un registro de las acciones realizadas dentro del sistema por parte de un usuario </w:t>
-      </w:r>
-      <w:proofErr w:type="gramStart"/>
-      <w:r>
-        <w:rPr>
-          <w:rFonts w:ascii="Times New Roman" w:hAnsi="Times New Roman" w:cs="Times New Roman"/>
-        </w:rPr>
-        <w:t>del mismo</w:t>
-      </w:r>
-      <w:proofErr w:type="gramEnd"/>
-      <w:r>
-        <w:rPr>
-          <w:rFonts w:ascii="Times New Roman" w:hAnsi="Times New Roman" w:cs="Times New Roman"/>
-        </w:rPr>
-        <w:t>. Cada evento registrado en la bitácora va a tener la fecha y hora en la que se realizó, el correo electrónico del usuario de quien la llevo a cabo, la actividad y la información asociada.</w:t>
+        <w:t>La utilización de la bitácora nos permite llevar un registro de las acciones realizadas dentro del sistema por parte de un usuario del mismo. Cada evento registrado en la bitácora va a tener la fecha y hora en la que se realizó, el correo electrónico del usuario de quien la llevo a cabo, la actividad y la información asociada.</w:t>
       </w:r>
     </w:p>
     <w:p>
@@ -16999,21 +16897,7 @@
         <w:rPr>
           <w:rFonts w:ascii="Times New Roman" w:hAnsi="Times New Roman" w:cs="Times New Roman"/>
         </w:rPr>
-        <w:t>Información asociada: Leyenda del hecho (Ej: El usuario “x</w:t>
-      </w:r>
-      <w:proofErr w:type="gramStart"/>
-      <w:r>
-        <w:rPr>
-          <w:rFonts w:ascii="Times New Roman" w:hAnsi="Times New Roman" w:cs="Times New Roman"/>
-        </w:rPr>
-        <w:t>”….</w:t>
-      </w:r>
-      <w:proofErr w:type="gramEnd"/>
-      <w:r>
-        <w:rPr>
-          <w:rFonts w:ascii="Times New Roman" w:hAnsi="Times New Roman" w:cs="Times New Roman"/>
-        </w:rPr>
-        <w:t>. tal actividad)</w:t>
+        <w:t>Información asociada: Leyenda del hecho (Ej: El usuario “x”….. tal actividad)</w:t>
       </w:r>
     </w:p>
     <w:p>
@@ -17694,21 +17578,7 @@
         <w:rPr>
           <w:rFonts w:ascii="Times New Roman" w:hAnsi="Times New Roman" w:cs="Times New Roman"/>
         </w:rPr>
-        <w:t xml:space="preserve">Al momento de registrar un usuario en el sistema y completar la contraseña de este mismo, en la base de datos el campo que contiene la contraseña no será visible para la persona. Ej: Si la contraseña es Hola123, en la base de datos se </w:t>
-      </w:r>
-      <w:proofErr w:type="spellStart"/>
-      <w:r>
-        <w:rPr>
-          <w:rFonts w:ascii="Times New Roman" w:hAnsi="Times New Roman" w:cs="Times New Roman"/>
-        </w:rPr>
-        <w:t>vera</w:t>
-      </w:r>
-      <w:proofErr w:type="spellEnd"/>
-      <w:r>
-        <w:rPr>
-          <w:rFonts w:ascii="Times New Roman" w:hAnsi="Times New Roman" w:cs="Times New Roman"/>
-        </w:rPr>
-        <w:t xml:space="preserve"> de la siguiente manera: (Imagen ilustrativa de ejemplo)</w:t>
+        <w:t>Al momento de registrar un usuario en el sistema y completar la contraseña de este mismo, en la base de datos el campo que contiene la contraseña no será visible para la persona. Ej: Si la contraseña es Hola123, en la base de datos se vera de la siguiente manera: (Imagen ilustrativa de ejemplo)</w:t>
       </w:r>
     </w:p>
     <w:p>
@@ -18648,7 +18518,6 @@
                 <w:bCs/>
                 <w:color w:val="000000"/>
               </w:rPr>
-              <w:lastRenderedPageBreak/>
               <w:t xml:space="preserve">PRECONDICIONES: </w:t>
             </w:r>
           </w:p>
@@ -18664,6 +18533,7 @@
                 <w:rFonts w:ascii="Times New Roman" w:eastAsia="Times New Roman" w:hAnsi="Times New Roman" w:cs="Times New Roman"/>
                 <w:color w:val="000000"/>
               </w:rPr>
+              <w:lastRenderedPageBreak/>
               <w:t>.</w:t>
             </w:r>
             <w:r>
@@ -18755,6 +18625,7 @@
                 <w:bCs/>
                 <w:color w:val="000000"/>
               </w:rPr>
+              <w:lastRenderedPageBreak/>
               <w:t xml:space="preserve">PUNTOS DE EXTENSIÓN: </w:t>
             </w:r>
             <w:r>
@@ -19895,7 +19766,6 @@
                 <w:bCs/>
                 <w:color w:val="000000"/>
               </w:rPr>
-              <w:lastRenderedPageBreak/>
               <w:t xml:space="preserve">ACTOR PRINCIPAL: </w:t>
             </w:r>
             <w:r>
@@ -19949,6 +19819,7 @@
                 <w:bCs/>
                 <w:color w:val="000000"/>
               </w:rPr>
+              <w:lastRenderedPageBreak/>
               <w:t xml:space="preserve">ACTORES SECUNDARIOS: </w:t>
             </w:r>
             <w:r>
@@ -21103,7 +20974,6 @@
                 <w:bCs/>
                 <w:color w:val="000000"/>
               </w:rPr>
-              <w:lastRenderedPageBreak/>
               <w:t xml:space="preserve">DESCRIPCIÓN: </w:t>
             </w:r>
             <w:r>
@@ -21164,6 +21034,7 @@
                 <w:bCs/>
                 <w:color w:val="000000"/>
               </w:rPr>
+              <w:lastRenderedPageBreak/>
               <w:t xml:space="preserve">ACTOR PRINCIPAL: </w:t>
             </w:r>
             <w:r>
@@ -23324,6 +23195,7 @@
         <w:rPr>
           <w:rFonts w:ascii="Times New Roman" w:eastAsia="Times New Roman" w:hAnsi="Times New Roman" w:cs="Times New Roman"/>
           <w:color w:val="000000"/>
+          <w:lang w:val="en-US"/>
         </w:rPr>
       </w:pPr>
       <w:r>
@@ -23332,13 +23204,37 @@
           <w:b/>
           <w:bCs/>
           <w:color w:val="000000"/>
-        </w:rPr>
-        <w:t>Ruta recomendada para backup:</w:t>
-      </w:r>
-      <w:r>
-        <w:rPr>
-          <w:rFonts w:ascii="Times New Roman" w:eastAsia="Times New Roman" w:hAnsi="Times New Roman" w:cs="Times New Roman"/>
+          <w:lang w:val="en-US"/>
+        </w:rPr>
+        <w:t xml:space="preserve">Ruta </w:t>
+      </w:r>
+      <w:proofErr w:type="spellStart"/>
+      <w:r>
+        <w:rPr>
+          <w:rFonts w:ascii="Times New Roman" w:eastAsia="Times New Roman" w:hAnsi="Times New Roman" w:cs="Times New Roman"/>
+          <w:b/>
+          <w:bCs/>
           <w:color w:val="000000"/>
+          <w:lang w:val="en-US"/>
+        </w:rPr>
+        <w:t>recomendada</w:t>
+      </w:r>
+      <w:proofErr w:type="spellEnd"/>
+      <w:r>
+        <w:rPr>
+          <w:rFonts w:ascii="Times New Roman" w:eastAsia="Times New Roman" w:hAnsi="Times New Roman" w:cs="Times New Roman"/>
+          <w:b/>
+          <w:bCs/>
+          <w:color w:val="000000"/>
+          <w:lang w:val="en-US"/>
+        </w:rPr>
+        <w:t xml:space="preserve"> para backup:</w:t>
+      </w:r>
+      <w:r>
+        <w:rPr>
+          <w:rFonts w:ascii="Times New Roman" w:eastAsia="Times New Roman" w:hAnsi="Times New Roman" w:cs="Times New Roman"/>
+          <w:color w:val="000000"/>
+          <w:lang w:val="en-US"/>
         </w:rPr>
         <w:t xml:space="preserve"> </w:t>
       </w:r>
@@ -23346,6 +23242,7 @@
         <w:rPr>
           <w:rFonts w:ascii="Times New Roman" w:eastAsia="Times New Roman" w:hAnsi="Times New Roman" w:cs="Times New Roman"/>
           <w:color w:val="0066FF"/>
+          <w:lang w:val="en-US"/>
         </w:rPr>
         <w:t>C:\Program Files\Microsoft SQL Server\MSSQL15.SQLEXPRESS\MSSQL\Backup\</w:t>
       </w:r>
@@ -23354,12 +23251,19 @@
         <w:rPr>
           <w:rFonts w:ascii="Times New Roman" w:eastAsia="Times New Roman" w:hAnsi="Times New Roman" w:cs="Times New Roman"/>
           <w:color w:val="0066FF"/>
+          <w:lang w:val="en-US"/>
         </w:rPr>
         <w:t>NombreArchivo.bak</w:t>
       </w:r>
       <w:proofErr w:type="spellEnd"/>
     </w:p>
-    <w:p/>
+    <w:p>
+      <w:pPr>
+        <w:rPr>
+          <w:lang w:val="en-US"/>
+        </w:rPr>
+      </w:pPr>
+    </w:p>
     <w:p>
       <w:r>
         <w:rPr>
@@ -23552,7 +23456,6 @@
         <w:t xml:space="preserve"> (abstracta): clase base que define la interfaz común para permisos atómicos y compuestos. Contiene el método </w:t>
       </w:r>
       <w:proofErr w:type="spellStart"/>
-      <w:proofErr w:type="gramStart"/>
       <w:r>
         <w:rPr>
           <w:rStyle w:val="CdigoHTML"/>
@@ -23564,14 +23467,7 @@
         <w:rPr>
           <w:rStyle w:val="CdigoHTML"/>
         </w:rPr>
-        <w:t>(</w:t>
-      </w:r>
-      <w:proofErr w:type="gramEnd"/>
-      <w:r>
-        <w:rPr>
-          <w:rStyle w:val="CdigoHTML"/>
-        </w:rPr>
-        <w:t>)</w:t>
+        <w:t>()</w:t>
       </w:r>
       <w:r>
         <w:t xml:space="preserve"> que recorre recursivamente la jerarquía para verificar si un permiso existe dentro de la estructura.</w:t>
@@ -23592,7 +23488,15 @@
         <w:t>PERMISOATOMICO</w:t>
       </w:r>
       <w:r>
-        <w:t>: hoja del árbol. Representa un permiso funcional específico del sistema (ej: "</w:t>
+        <w:t>: hoja del árbol. Representa un permiso funcional específico del sistema (</w:t>
+      </w:r>
+      <w:proofErr w:type="spellStart"/>
+      <w:r>
+        <w:t>ej</w:t>
+      </w:r>
+      <w:proofErr w:type="spellEnd"/>
+      <w:r>
+        <w:t>: "</w:t>
       </w:r>
       <w:proofErr w:type="spellStart"/>
       <w:r>
@@ -23638,30 +23542,20 @@
         <w:t xml:space="preserve"> y los métodos </w:t>
       </w:r>
       <w:proofErr w:type="spellStart"/>
-      <w:proofErr w:type="gramStart"/>
       <w:r>
         <w:t>AgregarPermiso</w:t>
       </w:r>
       <w:proofErr w:type="spellEnd"/>
       <w:r>
-        <w:t>(</w:t>
-      </w:r>
-      <w:proofErr w:type="gramEnd"/>
-      <w:r>
-        <w:t xml:space="preserve">) y </w:t>
+        <w:t xml:space="preserve">() y </w:t>
       </w:r>
       <w:proofErr w:type="spellStart"/>
-      <w:proofErr w:type="gramStart"/>
       <w:r>
         <w:t>QuitarPermiso</w:t>
       </w:r>
       <w:proofErr w:type="spellEnd"/>
       <w:r>
-        <w:t>(</w:t>
-      </w:r>
-      <w:proofErr w:type="gramEnd"/>
-      <w:r>
-        <w:t>).</w:t>
+        <w:t>().</w:t>
       </w:r>
     </w:p>
     <w:p>
@@ -23716,7 +23610,6 @@
         <w:rPr>
           <w:color w:val="000000"/>
         </w:rPr>
-        <w:lastRenderedPageBreak/>
         <w:t>Solo se pueden crear nuevos roles (PERMISOCOMPOSITE).</w:t>
       </w:r>
     </w:p>
@@ -23735,6 +23628,7 @@
         <w:rPr>
           <w:color w:val="000000"/>
         </w:rPr>
+        <w:lastRenderedPageBreak/>
         <w:t>Un rol puede contener permisos atómicos y otros roles.</w:t>
       </w:r>
     </w:p>
@@ -24090,7 +23984,6 @@
           <w:sz w:val="30"/>
           <w:szCs w:val="30"/>
         </w:rPr>
-        <w:lastRenderedPageBreak/>
         <w:t>8.3 Der</w:t>
       </w:r>
       <w:bookmarkEnd w:id="89"/>
@@ -24166,6 +24059,7 @@
           <w:sz w:val="30"/>
           <w:szCs w:val="30"/>
         </w:rPr>
+        <w:lastRenderedPageBreak/>
         <w:t>8.</w:t>
       </w:r>
       <w:r>
@@ -24326,21 +24220,7 @@
         <w:rPr>
           <w:rFonts w:ascii="Times New Roman" w:eastAsia="Times New Roman" w:hAnsi="Times New Roman" w:cs="Times New Roman"/>
         </w:rPr>
-        <w:t xml:space="preserve">Al revertir un cambio, el sistema no solo restaura el valor del </w:t>
-      </w:r>
-      <w:proofErr w:type="gramStart"/>
-      <w:r>
-        <w:rPr>
-          <w:rFonts w:ascii="Times New Roman" w:eastAsia="Times New Roman" w:hAnsi="Times New Roman" w:cs="Times New Roman"/>
-        </w:rPr>
-        <w:t>campo</w:t>
-      </w:r>
-      <w:proofErr w:type="gramEnd"/>
-      <w:r>
-        <w:rPr>
-          <w:rFonts w:ascii="Times New Roman" w:eastAsia="Times New Roman" w:hAnsi="Times New Roman" w:cs="Times New Roman"/>
-        </w:rPr>
-        <w:t xml:space="preserve"> sino que también recalcula el DVH del producto afectado y el DVV de toda la tabla, manteniendo la integridad de los dígitos verificadores.</w:t>
+        <w:t>Al revertir un cambio, el sistema no solo restaura el valor del campo sino que también recalcula el DVH del producto afectado y el DVV de toda la tabla, manteniendo la integridad de los dígitos verificadores.</w:t>
       </w:r>
     </w:p>
     <w:p>
@@ -24359,6 +24239,7 @@
           <w:sz w:val="30"/>
           <w:szCs w:val="30"/>
         </w:rPr>
+        <w:lastRenderedPageBreak/>
         <w:t>9.2 Diagrama de Clases</w:t>
       </w:r>
       <w:bookmarkEnd w:id="93"/>
@@ -24687,6 +24568,48 @@
       <w:bookmarkEnd w:id="98"/>
     </w:p>
     <w:p>
+      <w:r>
+        <w:rPr>
+          <w:noProof/>
+        </w:rPr>
+        <w:drawing>
+          <wp:inline distT="0" distB="0" distL="0" distR="0" wp14:anchorId="0A152D14" wp14:editId="754ABF15">
+            <wp:extent cx="5400040" cy="2028190"/>
+            <wp:effectExtent l="0" t="0" r="0" b="0"/>
+            <wp:docPr id="1779320493" name="Imagen 1"/>
+            <wp:cNvGraphicFramePr>
+              <a:graphicFrameLocks xmlns:a="http://schemas.openxmlformats.org/drawingml/2006/main" noChangeAspect="1"/>
+            </wp:cNvGraphicFramePr>
+            <a:graphic xmlns:a="http://schemas.openxmlformats.org/drawingml/2006/main">
+              <a:graphicData uri="http://schemas.openxmlformats.org/drawingml/2006/picture">
+                <pic:pic xmlns:pic="http://schemas.openxmlformats.org/drawingml/2006/picture">
+                  <pic:nvPicPr>
+                    <pic:cNvPr id="1779320493" name=""/>
+                    <pic:cNvPicPr/>
+                  </pic:nvPicPr>
+                  <pic:blipFill>
+                    <a:blip r:embed="rId64"/>
+                    <a:stretch>
+                      <a:fillRect/>
+                    </a:stretch>
+                  </pic:blipFill>
+                  <pic:spPr>
+                    <a:xfrm>
+                      <a:off x="0" y="0"/>
+                      <a:ext cx="5400040" cy="2028190"/>
+                    </a:xfrm>
+                    <a:prstGeom prst="rect">
+                      <a:avLst/>
+                    </a:prstGeom>
+                  </pic:spPr>
+                </pic:pic>
+              </a:graphicData>
+            </a:graphic>
+          </wp:inline>
+        </w:drawing>
+      </w:r>
+    </w:p>
+    <w:p>
       <w:pPr>
         <w:pStyle w:val="Ttulo2"/>
         <w:rPr>
@@ -24702,20 +24625,939 @@
           <w:sz w:val="30"/>
           <w:szCs w:val="30"/>
         </w:rPr>
-        <w:t>10.3 Der</w:t>
+        <w:t xml:space="preserve">10.3 </w:t>
       </w:r>
       <w:bookmarkEnd w:id="99"/>
+      <w:r>
+        <w:rPr>
+          <w:rFonts w:ascii="Times New Roman" w:eastAsia="Times New Roman" w:hAnsi="Times New Roman" w:cs="Times New Roman"/>
+          <w:sz w:val="30"/>
+          <w:szCs w:val="30"/>
+        </w:rPr>
+        <w:t>CU009 CAMBIAR IDIOMA</w:t>
+      </w:r>
     </w:p>
     <w:p>
       <w:r>
+        <w:rPr>
+          <w:noProof/>
+        </w:rPr>
+        <w:drawing>
+          <wp:inline distT="0" distB="0" distL="0" distR="0" wp14:anchorId="7D547139" wp14:editId="44F83860">
+            <wp:extent cx="5400040" cy="3782060"/>
+            <wp:effectExtent l="0" t="0" r="0" b="8890"/>
+            <wp:docPr id="1810117146" name="Imagen 1"/>
+            <wp:cNvGraphicFramePr>
+              <a:graphicFrameLocks xmlns:a="http://schemas.openxmlformats.org/drawingml/2006/main" noChangeAspect="1"/>
+            </wp:cNvGraphicFramePr>
+            <a:graphic xmlns:a="http://schemas.openxmlformats.org/drawingml/2006/main">
+              <a:graphicData uri="http://schemas.openxmlformats.org/drawingml/2006/picture">
+                <pic:pic xmlns:pic="http://schemas.openxmlformats.org/drawingml/2006/picture">
+                  <pic:nvPicPr>
+                    <pic:cNvPr id="1810117146" name=""/>
+                    <pic:cNvPicPr/>
+                  </pic:nvPicPr>
+                  <pic:blipFill>
+                    <a:blip r:embed="rId65"/>
+                    <a:stretch>
+                      <a:fillRect/>
+                    </a:stretch>
+                  </pic:blipFill>
+                  <pic:spPr>
+                    <a:xfrm>
+                      <a:off x="0" y="0"/>
+                      <a:ext cx="5400040" cy="3782060"/>
+                    </a:xfrm>
+                    <a:prstGeom prst="rect">
+                      <a:avLst/>
+                    </a:prstGeom>
+                  </pic:spPr>
+                </pic:pic>
+              </a:graphicData>
+            </a:graphic>
+          </wp:inline>
+        </w:drawing>
+      </w:r>
+    </w:p>
+    <w:p>
+      <w:pPr>
+        <w:pStyle w:val="Ttulo2"/>
+        <w:rPr>
+          <w:rFonts w:ascii="Times New Roman" w:eastAsia="Times New Roman" w:hAnsi="Times New Roman" w:cs="Times New Roman"/>
+          <w:sz w:val="30"/>
+          <w:szCs w:val="30"/>
+        </w:rPr>
+      </w:pPr>
+      <w:r>
+        <w:rPr>
+          <w:rFonts w:ascii="Times New Roman" w:eastAsia="Times New Roman" w:hAnsi="Times New Roman" w:cs="Times New Roman"/>
+          <w:sz w:val="30"/>
+          <w:szCs w:val="30"/>
+        </w:rPr>
+        <w:t>10.</w:t>
+      </w:r>
+      <w:r>
+        <w:rPr>
+          <w:rFonts w:ascii="Times New Roman" w:eastAsia="Times New Roman" w:hAnsi="Times New Roman" w:cs="Times New Roman"/>
+          <w:sz w:val="30"/>
+          <w:szCs w:val="30"/>
+        </w:rPr>
+        <w:t>4</w:t>
+      </w:r>
+      <w:r>
+        <w:rPr>
+          <w:rFonts w:ascii="Times New Roman" w:eastAsia="Times New Roman" w:hAnsi="Times New Roman" w:cs="Times New Roman"/>
+          <w:sz w:val="30"/>
+          <w:szCs w:val="30"/>
+        </w:rPr>
+        <w:t xml:space="preserve"> </w:t>
+      </w:r>
+      <w:r>
+        <w:rPr>
+          <w:rFonts w:ascii="Times New Roman" w:eastAsia="Times New Roman" w:hAnsi="Times New Roman" w:cs="Times New Roman"/>
+          <w:sz w:val="30"/>
+          <w:szCs w:val="30"/>
+        </w:rPr>
+        <w:t>Especificación caso de uso</w:t>
+      </w:r>
+    </w:p>
+    <w:tbl>
+      <w:tblPr>
+        <w:tblW w:w="8505" w:type="dxa"/>
+        <w:tblLayout w:type="fixed"/>
+        <w:tblLook w:val="0400" w:firstRow="0" w:lastRow="0" w:firstColumn="0" w:lastColumn="0" w:noHBand="0" w:noVBand="1"/>
+      </w:tblPr>
+      <w:tblGrid>
+        <w:gridCol w:w="8505"/>
+      </w:tblGrid>
+      <w:tr>
+        <w:trPr>
+          <w:trHeight w:val="371"/>
+        </w:trPr>
+        <w:tc>
+          <w:tcPr>
+            <w:tcW w:w="8500" w:type="dxa"/>
+            <w:tcBorders>
+              <w:top w:val="single" w:sz="8" w:space="0" w:color="000000"/>
+              <w:left w:val="single" w:sz="4" w:space="0" w:color="000000"/>
+              <w:bottom w:val="single" w:sz="4" w:space="0" w:color="000000"/>
+              <w:right w:val="single" w:sz="4" w:space="0" w:color="000000"/>
+            </w:tcBorders>
+            <w:tcMar>
+              <w:top w:w="14" w:type="dxa"/>
+              <w:left w:w="115" w:type="dxa"/>
+              <w:bottom w:w="0" w:type="dxa"/>
+              <w:right w:w="115" w:type="dxa"/>
+            </w:tcMar>
+            <w:hideMark/>
+          </w:tcPr>
+          <w:p>
+            <w:pPr>
+              <w:spacing w:line="240" w:lineRule="auto"/>
+              <w:rPr>
+                <w:rFonts w:asciiTheme="majorBidi" w:hAnsiTheme="majorBidi" w:cstheme="majorBidi"/>
+              </w:rPr>
+            </w:pPr>
+            <w:r>
+              <w:rPr>
+                <w:rFonts w:asciiTheme="majorBidi" w:hAnsiTheme="majorBidi" w:cstheme="majorBidi"/>
+                <w:b/>
+                <w:bCs/>
+              </w:rPr>
+              <w:t>CU 009 – Cambiar Idioma</w:t>
+            </w:r>
+          </w:p>
+        </w:tc>
+      </w:tr>
+      <w:tr>
+        <w:trPr>
+          <w:trHeight w:val="371"/>
+        </w:trPr>
+        <w:tc>
+          <w:tcPr>
+            <w:tcW w:w="8500" w:type="dxa"/>
+            <w:tcBorders>
+              <w:top w:val="single" w:sz="4" w:space="0" w:color="000000"/>
+              <w:left w:val="single" w:sz="4" w:space="0" w:color="000000"/>
+              <w:bottom w:val="single" w:sz="8" w:space="0" w:color="000000"/>
+              <w:right w:val="single" w:sz="4" w:space="0" w:color="000000"/>
+            </w:tcBorders>
+            <w:tcMar>
+              <w:top w:w="14" w:type="dxa"/>
+              <w:left w:w="115" w:type="dxa"/>
+              <w:bottom w:w="0" w:type="dxa"/>
+              <w:right w:w="115" w:type="dxa"/>
+            </w:tcMar>
+            <w:hideMark/>
+          </w:tcPr>
+          <w:p>
+            <w:pPr>
+              <w:spacing w:line="240" w:lineRule="auto"/>
+              <w:rPr>
+                <w:rFonts w:asciiTheme="majorBidi" w:hAnsiTheme="majorBidi" w:cstheme="majorBidi"/>
+              </w:rPr>
+            </w:pPr>
+            <w:r>
+              <w:rPr>
+                <w:rFonts w:asciiTheme="majorBidi" w:hAnsiTheme="majorBidi" w:cstheme="majorBidi"/>
+                <w:b/>
+                <w:bCs/>
+              </w:rPr>
+              <w:t>ESTADO:</w:t>
+            </w:r>
+            <w:r>
+              <w:rPr>
+                <w:rFonts w:asciiTheme="majorBidi" w:hAnsiTheme="majorBidi" w:cstheme="majorBidi"/>
+              </w:rPr>
+              <w:t xml:space="preserve">  En proceso</w:t>
+            </w:r>
+          </w:p>
+        </w:tc>
+      </w:tr>
+      <w:tr>
+        <w:trPr>
+          <w:trHeight w:val="373"/>
+        </w:trPr>
+        <w:tc>
+          <w:tcPr>
+            <w:tcW w:w="8500" w:type="dxa"/>
+            <w:tcBorders>
+              <w:top w:val="single" w:sz="8" w:space="0" w:color="000000"/>
+              <w:left w:val="single" w:sz="4" w:space="0" w:color="000000"/>
+              <w:bottom w:val="single" w:sz="8" w:space="0" w:color="000000"/>
+              <w:right w:val="single" w:sz="4" w:space="0" w:color="000000"/>
+            </w:tcBorders>
+            <w:tcMar>
+              <w:top w:w="14" w:type="dxa"/>
+              <w:left w:w="115" w:type="dxa"/>
+              <w:bottom w:w="0" w:type="dxa"/>
+              <w:right w:w="115" w:type="dxa"/>
+            </w:tcMar>
+            <w:hideMark/>
+          </w:tcPr>
+          <w:p>
+            <w:pPr>
+              <w:spacing w:line="240" w:lineRule="auto"/>
+              <w:rPr>
+                <w:rFonts w:asciiTheme="majorBidi" w:hAnsiTheme="majorBidi" w:cstheme="majorBidi"/>
+              </w:rPr>
+            </w:pPr>
+            <w:r>
+              <w:rPr>
+                <w:rFonts w:asciiTheme="majorBidi" w:hAnsiTheme="majorBidi" w:cstheme="majorBidi"/>
+                <w:b/>
+                <w:bCs/>
+              </w:rPr>
+              <w:lastRenderedPageBreak/>
+              <w:t>DESCRIPCIÓN:</w:t>
+            </w:r>
+            <w:r>
+              <w:rPr>
+                <w:rFonts w:asciiTheme="majorBidi" w:hAnsiTheme="majorBidi" w:cstheme="majorBidi"/>
+              </w:rPr>
+              <w:t xml:space="preserve"> El caso de uso permite al usuario cambiar el idioma de la interfaz del sistema en tiempo real desde el menú principal.</w:t>
+            </w:r>
+          </w:p>
+        </w:tc>
+      </w:tr>
+      <w:tr>
+        <w:trPr>
+          <w:trHeight w:val="370"/>
+        </w:trPr>
+        <w:tc>
+          <w:tcPr>
+            <w:tcW w:w="8500" w:type="dxa"/>
+            <w:tcBorders>
+              <w:top w:val="single" w:sz="8" w:space="0" w:color="000000"/>
+              <w:left w:val="single" w:sz="4" w:space="0" w:color="000000"/>
+              <w:bottom w:val="single" w:sz="8" w:space="0" w:color="000000"/>
+              <w:right w:val="single" w:sz="4" w:space="0" w:color="000000"/>
+            </w:tcBorders>
+            <w:tcMar>
+              <w:top w:w="14" w:type="dxa"/>
+              <w:left w:w="115" w:type="dxa"/>
+              <w:bottom w:w="0" w:type="dxa"/>
+              <w:right w:w="115" w:type="dxa"/>
+            </w:tcMar>
+            <w:hideMark/>
+          </w:tcPr>
+          <w:p>
+            <w:pPr>
+              <w:spacing w:line="240" w:lineRule="auto"/>
+              <w:rPr>
+                <w:rFonts w:asciiTheme="majorBidi" w:hAnsiTheme="majorBidi" w:cstheme="majorBidi"/>
+              </w:rPr>
+            </w:pPr>
+            <w:r>
+              <w:rPr>
+                <w:rFonts w:asciiTheme="majorBidi" w:hAnsiTheme="majorBidi" w:cstheme="majorBidi"/>
+                <w:b/>
+                <w:bCs/>
+              </w:rPr>
+              <w:t>ACTOR PRINCIPAL:</w:t>
+            </w:r>
+            <w:r>
+              <w:rPr>
+                <w:rFonts w:asciiTheme="majorBidi" w:hAnsiTheme="majorBidi" w:cstheme="majorBidi"/>
+              </w:rPr>
+              <w:t xml:space="preserve"> Usuario (cualquier rol)</w:t>
+            </w:r>
+          </w:p>
+        </w:tc>
+      </w:tr>
+      <w:tr>
+        <w:trPr>
+          <w:trHeight w:val="367"/>
+        </w:trPr>
+        <w:tc>
+          <w:tcPr>
+            <w:tcW w:w="8500" w:type="dxa"/>
+            <w:tcBorders>
+              <w:top w:val="single" w:sz="8" w:space="0" w:color="000000"/>
+              <w:left w:val="single" w:sz="4" w:space="0" w:color="000000"/>
+              <w:bottom w:val="single" w:sz="4" w:space="0" w:color="000000"/>
+              <w:right w:val="single" w:sz="4" w:space="0" w:color="000000"/>
+            </w:tcBorders>
+            <w:tcMar>
+              <w:top w:w="14" w:type="dxa"/>
+              <w:left w:w="115" w:type="dxa"/>
+              <w:bottom w:w="0" w:type="dxa"/>
+              <w:right w:w="115" w:type="dxa"/>
+            </w:tcMar>
+            <w:hideMark/>
+          </w:tcPr>
+          <w:p>
+            <w:pPr>
+              <w:spacing w:line="240" w:lineRule="auto"/>
+              <w:rPr>
+                <w:rFonts w:asciiTheme="majorBidi" w:hAnsiTheme="majorBidi" w:cstheme="majorBidi"/>
+              </w:rPr>
+            </w:pPr>
+            <w:r>
+              <w:rPr>
+                <w:rFonts w:asciiTheme="majorBidi" w:hAnsiTheme="majorBidi" w:cstheme="majorBidi"/>
+                <w:b/>
+                <w:bCs/>
+              </w:rPr>
+              <w:t>ACTORES SECUNDARIOS:</w:t>
+            </w:r>
+            <w:r>
+              <w:rPr>
+                <w:rFonts w:asciiTheme="majorBidi" w:hAnsiTheme="majorBidi" w:cstheme="majorBidi"/>
+              </w:rPr>
+              <w:t xml:space="preserve"> —</w:t>
+            </w:r>
+          </w:p>
+        </w:tc>
+      </w:tr>
+      <w:tr>
+        <w:trPr>
+          <w:trHeight w:val="338"/>
+        </w:trPr>
+        <w:tc>
+          <w:tcPr>
+            <w:tcW w:w="8500" w:type="dxa"/>
+            <w:tcBorders>
+              <w:top w:val="single" w:sz="4" w:space="0" w:color="000000"/>
+              <w:left w:val="single" w:sz="4" w:space="0" w:color="000000"/>
+              <w:bottom w:val="single" w:sz="8" w:space="0" w:color="000000"/>
+              <w:right w:val="single" w:sz="4" w:space="0" w:color="000000"/>
+            </w:tcBorders>
+            <w:tcMar>
+              <w:top w:w="14" w:type="dxa"/>
+              <w:left w:w="115" w:type="dxa"/>
+              <w:bottom w:w="0" w:type="dxa"/>
+              <w:right w:w="115" w:type="dxa"/>
+            </w:tcMar>
+            <w:hideMark/>
+          </w:tcPr>
+          <w:p>
+            <w:pPr>
+              <w:spacing w:line="240" w:lineRule="auto"/>
+              <w:rPr>
+                <w:rFonts w:asciiTheme="majorBidi" w:hAnsiTheme="majorBidi" w:cstheme="majorBidi"/>
+                <w:b/>
+                <w:bCs/>
+              </w:rPr>
+            </w:pPr>
+            <w:r>
+              <w:rPr>
+                <w:rFonts w:asciiTheme="majorBidi" w:hAnsiTheme="majorBidi" w:cstheme="majorBidi"/>
+                <w:b/>
+                <w:bCs/>
+              </w:rPr>
+              <w:t>PRECONDICIONES:</w:t>
+            </w:r>
+          </w:p>
+          <w:p>
+            <w:pPr>
+              <w:numPr>
+                <w:ilvl w:val="0"/>
+                <w:numId w:val="30"/>
+              </w:numPr>
+              <w:spacing w:line="240" w:lineRule="auto"/>
+              <w:rPr>
+                <w:rFonts w:asciiTheme="majorBidi" w:hAnsiTheme="majorBidi" w:cstheme="majorBidi"/>
+                <w:lang w:val="es-ES"/>
+              </w:rPr>
+            </w:pPr>
+            <w:r>
+              <w:rPr>
+                <w:rFonts w:asciiTheme="majorBidi" w:hAnsiTheme="majorBidi" w:cstheme="majorBidi"/>
+                <w:lang w:val="es-ES"/>
+              </w:rPr>
+              <w:t xml:space="preserve">El usuario debió haberse </w:t>
+            </w:r>
+            <w:proofErr w:type="spellStart"/>
+            <w:r>
+              <w:rPr>
+                <w:rFonts w:asciiTheme="majorBidi" w:hAnsiTheme="majorBidi" w:cstheme="majorBidi"/>
+                <w:lang w:val="es-ES"/>
+              </w:rPr>
+              <w:t>logueado</w:t>
+            </w:r>
+            <w:proofErr w:type="spellEnd"/>
+            <w:r>
+              <w:rPr>
+                <w:rFonts w:asciiTheme="majorBidi" w:hAnsiTheme="majorBidi" w:cstheme="majorBidi"/>
+                <w:lang w:val="es-ES"/>
+              </w:rPr>
+              <w:t xml:space="preserve"> con éxito previamente en el sistema. </w:t>
+            </w:r>
+          </w:p>
+          <w:p>
+            <w:pPr>
+              <w:numPr>
+                <w:ilvl w:val="0"/>
+                <w:numId w:val="30"/>
+              </w:numPr>
+              <w:spacing w:line="240" w:lineRule="auto"/>
+              <w:rPr>
+                <w:rFonts w:asciiTheme="majorBidi" w:hAnsiTheme="majorBidi" w:cstheme="majorBidi"/>
+              </w:rPr>
+            </w:pPr>
+            <w:r>
+              <w:rPr>
+                <w:rFonts w:asciiTheme="majorBidi" w:hAnsiTheme="majorBidi" w:cstheme="majorBidi"/>
+                <w:lang w:val="es-ES"/>
+              </w:rPr>
+              <w:t>Debe existir al menos un idioma disponible además del idioma actual.</w:t>
+            </w:r>
+          </w:p>
+        </w:tc>
+      </w:tr>
+      <w:tr>
+        <w:trPr>
+          <w:trHeight w:val="426"/>
+        </w:trPr>
+        <w:tc>
+          <w:tcPr>
+            <w:tcW w:w="8500" w:type="dxa"/>
+            <w:tcBorders>
+              <w:top w:val="single" w:sz="8" w:space="0" w:color="000000"/>
+              <w:left w:val="single" w:sz="4" w:space="0" w:color="000000"/>
+              <w:bottom w:val="single" w:sz="8" w:space="0" w:color="000000"/>
+              <w:right w:val="single" w:sz="4" w:space="0" w:color="000000"/>
+            </w:tcBorders>
+            <w:tcMar>
+              <w:top w:w="14" w:type="dxa"/>
+              <w:left w:w="115" w:type="dxa"/>
+              <w:bottom w:w="0" w:type="dxa"/>
+              <w:right w:w="115" w:type="dxa"/>
+            </w:tcMar>
+            <w:hideMark/>
+          </w:tcPr>
+          <w:p>
+            <w:pPr>
+              <w:spacing w:line="240" w:lineRule="auto"/>
+              <w:rPr>
+                <w:rFonts w:asciiTheme="majorBidi" w:hAnsiTheme="majorBidi" w:cstheme="majorBidi"/>
+              </w:rPr>
+            </w:pPr>
+            <w:r>
+              <w:rPr>
+                <w:rFonts w:asciiTheme="majorBidi" w:hAnsiTheme="majorBidi" w:cstheme="majorBidi"/>
+                <w:lang w:val="es-ES"/>
+              </w:rPr>
+              <w:t xml:space="preserve"> </w:t>
+            </w:r>
+            <w:r>
+              <w:rPr>
+                <w:rFonts w:asciiTheme="majorBidi" w:hAnsiTheme="majorBidi" w:cstheme="majorBidi"/>
+                <w:b/>
+                <w:bCs/>
+                <w:lang w:val="es-ES"/>
+              </w:rPr>
+              <w:t>PUNTOS DE EXTENSIÓN:</w:t>
+            </w:r>
+            <w:r>
+              <w:rPr>
+                <w:rFonts w:asciiTheme="majorBidi" w:hAnsiTheme="majorBidi" w:cstheme="majorBidi"/>
+                <w:lang w:val="es-ES"/>
+              </w:rPr>
+              <w:t xml:space="preserve"> —</w:t>
+            </w:r>
+          </w:p>
+        </w:tc>
+      </w:tr>
+      <w:tr>
+        <w:trPr>
+          <w:trHeight w:val="317"/>
+        </w:trPr>
+        <w:tc>
+          <w:tcPr>
+            <w:tcW w:w="8500" w:type="dxa"/>
+            <w:tcBorders>
+              <w:top w:val="single" w:sz="8" w:space="0" w:color="000000"/>
+              <w:left w:val="single" w:sz="4" w:space="0" w:color="000000"/>
+              <w:bottom w:val="single" w:sz="8" w:space="0" w:color="000000"/>
+              <w:right w:val="single" w:sz="4" w:space="0" w:color="000000"/>
+            </w:tcBorders>
+            <w:tcMar>
+              <w:top w:w="14" w:type="dxa"/>
+              <w:left w:w="115" w:type="dxa"/>
+              <w:bottom w:w="0" w:type="dxa"/>
+              <w:right w:w="115" w:type="dxa"/>
+            </w:tcMar>
+            <w:hideMark/>
+          </w:tcPr>
+          <w:p>
+            <w:pPr>
+              <w:spacing w:line="240" w:lineRule="auto"/>
+              <w:rPr>
+                <w:rFonts w:asciiTheme="majorBidi" w:hAnsiTheme="majorBidi" w:cstheme="majorBidi"/>
+              </w:rPr>
+            </w:pPr>
+            <w:r>
+              <w:rPr>
+                <w:rFonts w:asciiTheme="majorBidi" w:hAnsiTheme="majorBidi" w:cstheme="majorBidi"/>
+                <w:b/>
+                <w:bCs/>
+                <w:lang w:val="es-ES"/>
+              </w:rPr>
+              <w:t>CONDICIÓN:</w:t>
+            </w:r>
+            <w:r>
+              <w:rPr>
+                <w:rFonts w:asciiTheme="majorBidi" w:hAnsiTheme="majorBidi" w:cstheme="majorBidi"/>
+                <w:lang w:val="es-ES"/>
+              </w:rPr>
+              <w:t xml:space="preserve"> —</w:t>
+            </w:r>
+          </w:p>
+        </w:tc>
+      </w:tr>
+      <w:tr>
+        <w:trPr>
+          <w:trHeight w:val="2830"/>
+        </w:trPr>
+        <w:tc>
+          <w:tcPr>
+            <w:tcW w:w="8500" w:type="dxa"/>
+            <w:tcBorders>
+              <w:top w:val="single" w:sz="8" w:space="0" w:color="000000"/>
+              <w:left w:val="single" w:sz="4" w:space="0" w:color="000000"/>
+              <w:bottom w:val="single" w:sz="8" w:space="0" w:color="000000"/>
+              <w:right w:val="single" w:sz="4" w:space="0" w:color="000000"/>
+            </w:tcBorders>
+            <w:tcMar>
+              <w:top w:w="14" w:type="dxa"/>
+              <w:left w:w="115" w:type="dxa"/>
+              <w:bottom w:w="0" w:type="dxa"/>
+              <w:right w:w="115" w:type="dxa"/>
+            </w:tcMar>
+            <w:hideMark/>
+          </w:tcPr>
+          <w:p>
+            <w:pPr>
+              <w:spacing w:line="240" w:lineRule="auto"/>
+              <w:rPr>
+                <w:rFonts w:asciiTheme="majorBidi" w:hAnsiTheme="majorBidi" w:cstheme="majorBidi"/>
+                <w:b/>
+                <w:bCs/>
+              </w:rPr>
+            </w:pPr>
+            <w:r>
+              <w:rPr>
+                <w:rFonts w:asciiTheme="majorBidi" w:hAnsiTheme="majorBidi" w:cstheme="majorBidi"/>
+                <w:b/>
+                <w:bCs/>
+              </w:rPr>
+              <w:t>ESCENARIO PRINCIPAL:</w:t>
+            </w:r>
+          </w:p>
+          <w:p>
+            <w:pPr>
+              <w:numPr>
+                <w:ilvl w:val="0"/>
+                <w:numId w:val="31"/>
+              </w:numPr>
+              <w:spacing w:line="240" w:lineRule="auto"/>
+              <w:rPr>
+                <w:rFonts w:asciiTheme="majorBidi" w:hAnsiTheme="majorBidi" w:cstheme="majorBidi"/>
+              </w:rPr>
+            </w:pPr>
+            <w:r>
+              <w:rPr>
+                <w:rFonts w:asciiTheme="majorBidi" w:hAnsiTheme="majorBidi" w:cstheme="majorBidi"/>
+              </w:rPr>
+              <w:t>El usuario visualiza el combo de idiomas disponibles en el menú principal.</w:t>
+            </w:r>
+          </w:p>
+          <w:p>
+            <w:pPr>
+              <w:numPr>
+                <w:ilvl w:val="0"/>
+                <w:numId w:val="31"/>
+              </w:numPr>
+              <w:spacing w:line="240" w:lineRule="auto"/>
+              <w:rPr>
+                <w:rFonts w:asciiTheme="majorBidi" w:hAnsiTheme="majorBidi" w:cstheme="majorBidi"/>
+              </w:rPr>
+            </w:pPr>
+            <w:r>
+              <w:rPr>
+                <w:rFonts w:asciiTheme="majorBidi" w:hAnsiTheme="majorBidi" w:cstheme="majorBidi"/>
+              </w:rPr>
+              <w:t>El sistema muestra los idiomas habilitados en el sistema.</w:t>
+            </w:r>
+          </w:p>
+          <w:p>
+            <w:pPr>
+              <w:numPr>
+                <w:ilvl w:val="0"/>
+                <w:numId w:val="31"/>
+              </w:numPr>
+              <w:spacing w:line="240" w:lineRule="auto"/>
+              <w:rPr>
+                <w:rFonts w:asciiTheme="majorBidi" w:hAnsiTheme="majorBidi" w:cstheme="majorBidi"/>
+              </w:rPr>
+            </w:pPr>
+            <w:r>
+              <w:rPr>
+                <w:rFonts w:asciiTheme="majorBidi" w:hAnsiTheme="majorBidi" w:cstheme="majorBidi"/>
+              </w:rPr>
+              <w:t>El usuario selecciona un idioma del combo.</w:t>
+            </w:r>
+          </w:p>
+          <w:p>
+            <w:pPr>
+              <w:numPr>
+                <w:ilvl w:val="0"/>
+                <w:numId w:val="31"/>
+              </w:numPr>
+              <w:spacing w:line="240" w:lineRule="auto"/>
+              <w:rPr>
+                <w:rFonts w:asciiTheme="majorBidi" w:hAnsiTheme="majorBidi" w:cstheme="majorBidi"/>
+              </w:rPr>
+            </w:pPr>
+            <w:r>
+              <w:rPr>
+                <w:rFonts w:asciiTheme="majorBidi" w:hAnsiTheme="majorBidi" w:cstheme="majorBidi"/>
+              </w:rPr>
+              <w:t>El sistema carga las traducciones correspondientes al idioma seleccionado desde la base de datos.</w:t>
+            </w:r>
+          </w:p>
+          <w:p>
+            <w:pPr>
+              <w:numPr>
+                <w:ilvl w:val="0"/>
+                <w:numId w:val="31"/>
+              </w:numPr>
+              <w:spacing w:line="240" w:lineRule="auto"/>
+              <w:rPr>
+                <w:rFonts w:asciiTheme="majorBidi" w:hAnsiTheme="majorBidi" w:cstheme="majorBidi"/>
+              </w:rPr>
+            </w:pPr>
+            <w:r>
+              <w:rPr>
+                <w:rFonts w:asciiTheme="majorBidi" w:hAnsiTheme="majorBidi" w:cstheme="majorBidi"/>
+              </w:rPr>
+              <w:t>El sistema actualiza en tiempo real el texto de todos los formularios abiertos al idioma seleccionado.</w:t>
+            </w:r>
+          </w:p>
+          <w:p>
+            <w:pPr>
+              <w:numPr>
+                <w:ilvl w:val="0"/>
+                <w:numId w:val="31"/>
+              </w:numPr>
+              <w:spacing w:line="240" w:lineRule="auto"/>
+              <w:rPr>
+                <w:rFonts w:asciiTheme="majorBidi" w:hAnsiTheme="majorBidi" w:cstheme="majorBidi"/>
+              </w:rPr>
+            </w:pPr>
+            <w:r>
+              <w:rPr>
+                <w:rFonts w:asciiTheme="majorBidi" w:hAnsiTheme="majorBidi" w:cstheme="majorBidi"/>
+              </w:rPr>
+              <w:t>El sistema guarda la preferencia de idioma del usuario en la base de datos.</w:t>
+            </w:r>
+          </w:p>
+          <w:p>
+            <w:pPr>
+              <w:numPr>
+                <w:ilvl w:val="0"/>
+                <w:numId w:val="31"/>
+              </w:numPr>
+              <w:spacing w:line="240" w:lineRule="auto"/>
+              <w:rPr>
+                <w:rFonts w:asciiTheme="majorBidi" w:hAnsiTheme="majorBidi" w:cstheme="majorBidi"/>
+              </w:rPr>
+            </w:pPr>
+            <w:r>
+              <w:rPr>
+                <w:rFonts w:asciiTheme="majorBidi" w:hAnsiTheme="majorBidi" w:cstheme="majorBidi"/>
+              </w:rPr>
+              <w:t>El sistema muestra la interfaz completamente traducida al idioma seleccionado.</w:t>
+            </w:r>
+          </w:p>
+        </w:tc>
+      </w:tr>
+      <w:tr>
+        <w:trPr>
+          <w:trHeight w:val="869"/>
+        </w:trPr>
+        <w:tc>
+          <w:tcPr>
+            <w:tcW w:w="8500" w:type="dxa"/>
+            <w:tcBorders>
+              <w:top w:val="single" w:sz="8" w:space="0" w:color="000000"/>
+              <w:left w:val="single" w:sz="4" w:space="0" w:color="000000"/>
+              <w:bottom w:val="single" w:sz="8" w:space="0" w:color="000000"/>
+              <w:right w:val="single" w:sz="4" w:space="0" w:color="000000"/>
+            </w:tcBorders>
+            <w:tcMar>
+              <w:top w:w="14" w:type="dxa"/>
+              <w:left w:w="115" w:type="dxa"/>
+              <w:bottom w:w="0" w:type="dxa"/>
+              <w:right w:w="115" w:type="dxa"/>
+            </w:tcMar>
+          </w:tcPr>
+          <w:p>
+            <w:pPr>
+              <w:spacing w:line="240" w:lineRule="auto"/>
+              <w:rPr>
+                <w:rFonts w:asciiTheme="majorBidi" w:hAnsiTheme="majorBidi" w:cstheme="majorBidi"/>
+                <w:b/>
+                <w:bCs/>
+                <w:lang w:val="es-ES"/>
+              </w:rPr>
+            </w:pPr>
+            <w:r>
+              <w:rPr>
+                <w:rFonts w:asciiTheme="majorBidi" w:hAnsiTheme="majorBidi" w:cstheme="majorBidi"/>
+                <w:b/>
+                <w:bCs/>
+                <w:lang w:val="es-ES"/>
+              </w:rPr>
+              <w:t>FLUJOS ALTERNATIVOS:</w:t>
+            </w:r>
+          </w:p>
+          <w:p>
+            <w:pPr>
+              <w:spacing w:line="240" w:lineRule="auto"/>
+              <w:rPr>
+                <w:rFonts w:asciiTheme="majorBidi" w:hAnsiTheme="majorBidi" w:cstheme="majorBidi"/>
+                <w:b/>
+                <w:bCs/>
+                <w:lang w:val="es-ES"/>
+              </w:rPr>
+            </w:pPr>
+            <w:r>
+              <w:rPr>
+                <w:rFonts w:asciiTheme="majorBidi" w:hAnsiTheme="majorBidi" w:cstheme="majorBidi"/>
+                <w:b/>
+                <w:bCs/>
+                <w:lang w:val="es-ES"/>
+              </w:rPr>
+              <w:t xml:space="preserve">FA1 — Traducción incompleta </w:t>
+            </w:r>
+          </w:p>
+          <w:p>
+            <w:pPr>
+              <w:spacing w:line="240" w:lineRule="auto"/>
+              <w:rPr>
+                <w:rFonts w:asciiTheme="majorBidi" w:hAnsiTheme="majorBidi" w:cstheme="majorBidi"/>
+                <w:lang w:val="es-ES"/>
+              </w:rPr>
+            </w:pPr>
+            <w:r>
+              <w:rPr>
+                <w:rFonts w:asciiTheme="majorBidi" w:hAnsiTheme="majorBidi" w:cstheme="majorBidi"/>
+                <w:lang w:val="es-ES"/>
+              </w:rPr>
+              <w:t>4.1 El sistema no encuentra traducción para algún control en el idioma seleccionado.</w:t>
+            </w:r>
+            <w:r>
+              <w:rPr>
+                <w:rFonts w:asciiTheme="majorBidi" w:hAnsiTheme="majorBidi" w:cstheme="majorBidi"/>
+                <w:lang w:val="es-ES"/>
+              </w:rPr>
+              <w:br/>
+            </w:r>
+            <w:r>
+              <w:rPr>
+                <w:rFonts w:asciiTheme="majorBidi" w:hAnsiTheme="majorBidi" w:cstheme="majorBidi"/>
+                <w:lang w:val="es-ES"/>
+              </w:rPr>
+              <w:t xml:space="preserve">4.2 El sistema muestra el nombre del control entre corchetes como </w:t>
+            </w:r>
+            <w:proofErr w:type="spellStart"/>
+            <w:r>
+              <w:rPr>
+                <w:rFonts w:asciiTheme="majorBidi" w:hAnsiTheme="majorBidi" w:cstheme="majorBidi"/>
+                <w:lang w:val="es-ES"/>
+              </w:rPr>
+              <w:t>fallback</w:t>
+            </w:r>
+            <w:proofErr w:type="spellEnd"/>
+            <w:r>
+              <w:rPr>
+                <w:rFonts w:asciiTheme="majorBidi" w:hAnsiTheme="majorBidi" w:cstheme="majorBidi"/>
+                <w:lang w:val="es-ES"/>
+              </w:rPr>
+              <w:t xml:space="preserve">. </w:t>
+            </w:r>
+            <w:r>
+              <w:rPr>
+                <w:rFonts w:asciiTheme="majorBidi" w:hAnsiTheme="majorBidi" w:cstheme="majorBidi"/>
+                <w:lang w:val="es-ES"/>
+              </w:rPr>
+              <w:br/>
+            </w:r>
+            <w:r>
+              <w:rPr>
+                <w:rFonts w:asciiTheme="majorBidi" w:hAnsiTheme="majorBidi" w:cstheme="majorBidi"/>
+                <w:lang w:val="es-ES"/>
+              </w:rPr>
+              <w:t>4.3 Continúa en el punto 5 del Escenario Principal.</w:t>
+            </w:r>
+          </w:p>
+          <w:p>
+            <w:pPr>
+              <w:spacing w:line="240" w:lineRule="auto"/>
+              <w:rPr>
+                <w:rFonts w:asciiTheme="majorBidi" w:hAnsiTheme="majorBidi" w:cstheme="majorBidi"/>
+                <w:b/>
+                <w:bCs/>
+                <w:lang w:val="es-ES"/>
+              </w:rPr>
+            </w:pPr>
+            <w:r>
+              <w:rPr>
+                <w:rFonts w:asciiTheme="majorBidi" w:hAnsiTheme="majorBidi" w:cstheme="majorBidi"/>
+                <w:b/>
+                <w:bCs/>
+                <w:lang w:val="es-ES"/>
+              </w:rPr>
+              <w:t xml:space="preserve">FA2 — Idioma sin traducciones completas </w:t>
+            </w:r>
+          </w:p>
+          <w:p>
+            <w:pPr>
+              <w:spacing w:line="240" w:lineRule="auto"/>
+              <w:rPr>
+                <w:rFonts w:asciiTheme="majorBidi" w:hAnsiTheme="majorBidi" w:cstheme="majorBidi"/>
+              </w:rPr>
+            </w:pPr>
+            <w:r>
+              <w:rPr>
+                <w:rFonts w:asciiTheme="majorBidi" w:hAnsiTheme="majorBidi" w:cstheme="majorBidi"/>
+                <w:lang w:val="es-ES"/>
+              </w:rPr>
+              <w:t xml:space="preserve">4.1 El sistema utiliza el texto en español entre corchetes como </w:t>
+            </w:r>
+            <w:proofErr w:type="spellStart"/>
+            <w:r>
+              <w:rPr>
+                <w:rFonts w:asciiTheme="majorBidi" w:hAnsiTheme="majorBidi" w:cstheme="majorBidi"/>
+                <w:lang w:val="es-ES"/>
+              </w:rPr>
+              <w:t>fallback</w:t>
+            </w:r>
+            <w:proofErr w:type="spellEnd"/>
+            <w:r>
+              <w:rPr>
+                <w:rFonts w:asciiTheme="majorBidi" w:hAnsiTheme="majorBidi" w:cstheme="majorBidi"/>
+                <w:lang w:val="es-ES"/>
+              </w:rPr>
+              <w:t xml:space="preserve"> según el COALESCE definido en la base de datos.</w:t>
+            </w:r>
+            <w:r>
+              <w:rPr>
+                <w:rFonts w:asciiTheme="majorBidi" w:hAnsiTheme="majorBidi" w:cstheme="majorBidi"/>
+                <w:lang w:val="es-ES"/>
+              </w:rPr>
+              <w:br/>
+            </w:r>
+            <w:r>
+              <w:rPr>
+                <w:rFonts w:asciiTheme="majorBidi" w:hAnsiTheme="majorBidi" w:cstheme="majorBidi"/>
+                <w:lang w:val="es-ES"/>
+              </w:rPr>
+              <w:t>4.2 Continúa en el punto 5 del Escenario Principal.</w:t>
+            </w:r>
+          </w:p>
+        </w:tc>
+      </w:tr>
+      <w:tr>
+        <w:trPr>
+          <w:trHeight w:val="715"/>
+        </w:trPr>
+        <w:tc>
+          <w:tcPr>
+            <w:tcW w:w="8500" w:type="dxa"/>
+            <w:tcBorders>
+              <w:top w:val="single" w:sz="8" w:space="0" w:color="000000"/>
+              <w:left w:val="single" w:sz="4" w:space="0" w:color="000000"/>
+              <w:bottom w:val="single" w:sz="4" w:space="0" w:color="000000"/>
+              <w:right w:val="single" w:sz="4" w:space="0" w:color="000000"/>
+            </w:tcBorders>
+            <w:tcMar>
+              <w:top w:w="14" w:type="dxa"/>
+              <w:left w:w="115" w:type="dxa"/>
+              <w:bottom w:w="0" w:type="dxa"/>
+              <w:right w:w="115" w:type="dxa"/>
+            </w:tcMar>
+            <w:hideMark/>
+          </w:tcPr>
+          <w:p>
+            <w:pPr>
+              <w:spacing w:line="240" w:lineRule="auto"/>
+              <w:rPr>
+                <w:rFonts w:asciiTheme="majorBidi" w:hAnsiTheme="majorBidi" w:cstheme="majorBidi"/>
+              </w:rPr>
+            </w:pPr>
+            <w:r>
+              <w:rPr>
+                <w:rFonts w:asciiTheme="majorBidi" w:hAnsiTheme="majorBidi" w:cstheme="majorBidi"/>
+                <w:b/>
+                <w:bCs/>
+              </w:rPr>
+              <w:lastRenderedPageBreak/>
+              <w:t xml:space="preserve">POSTCONDICIONES: </w:t>
+            </w:r>
+            <w:r>
+              <w:rPr>
+                <w:rFonts w:asciiTheme="majorBidi" w:hAnsiTheme="majorBidi" w:cstheme="majorBidi"/>
+              </w:rPr>
+              <w:t>El usuario visualiza y opera la interfaz del sistema en el idioma seleccionado. La preferencia queda persistida para su próxima sesión.</w:t>
+            </w:r>
+          </w:p>
+        </w:tc>
+      </w:tr>
+    </w:tbl>
+    <w:p/>
+    <w:p>
+      <w:pPr>
         <w:rPr>
           <w:rFonts w:ascii="Times New Roman" w:eastAsia="Times New Roman" w:hAnsi="Times New Roman" w:cs="Times New Roman"/>
           <w:color w:val="0F4761"/>
           <w:sz w:val="30"/>
           <w:szCs w:val="30"/>
         </w:rPr>
-        <w:t>10.</w:t>
-      </w:r>
+      </w:pPr>
       <w:r>
         <w:rPr>
           <w:rFonts w:ascii="Times New Roman" w:eastAsia="Times New Roman" w:hAnsi="Times New Roman" w:cs="Times New Roman"/>
@@ -24723,7 +25565,7 @@
           <w:sz w:val="30"/>
           <w:szCs w:val="30"/>
         </w:rPr>
-        <w:t>5</w:t>
+        <w:t>10.</w:t>
       </w:r>
       <w:r>
         <w:rPr>
@@ -24732,7 +25574,7 @@
           <w:sz w:val="30"/>
           <w:szCs w:val="30"/>
         </w:rPr>
-        <w:t xml:space="preserve"> Pantallas </w:t>
+        <w:t>5</w:t>
       </w:r>
       <w:r>
         <w:rPr>
@@ -24741,38 +25583,362 @@
           <w:sz w:val="30"/>
           <w:szCs w:val="30"/>
         </w:rPr>
-        <w:t>UI</w:t>
-      </w:r>
-      <w:r>
-        <w:rPr>
-          <w:rFonts w:ascii="Times New Roman" w:eastAsia="Times New Roman" w:hAnsi="Times New Roman" w:cs="Times New Roman"/>
-        </w:rPr>
-        <w:br/>
-      </w:r>
-      <w:r>
-        <w:t>10.</w:t>
-      </w:r>
-      <w:r>
-        <w:t>5</w:t>
-      </w:r>
-      <w:r>
-        <w:t xml:space="preserve">.1 </w:t>
+        <w:t xml:space="preserve"> </w:t>
+      </w:r>
+      <w:r>
+        <w:rPr>
+          <w:rFonts w:ascii="Times New Roman" w:eastAsia="Times New Roman" w:hAnsi="Times New Roman" w:cs="Times New Roman"/>
+          <w:color w:val="0F4761"/>
+          <w:sz w:val="30"/>
+          <w:szCs w:val="30"/>
+        </w:rPr>
+        <w:t>Diagrama de Secuencias del sistema</w:t>
       </w:r>
     </w:p>
     <w:p>
-      <w:r>
-        <w:t xml:space="preserve">10.5.2 </w:t>
+      <w:pPr>
+        <w:rPr>
+          <w:rFonts w:ascii="Times New Roman" w:eastAsia="Times New Roman" w:hAnsi="Times New Roman" w:cs="Times New Roman"/>
+          <w:color w:val="0F4761"/>
+          <w:sz w:val="30"/>
+          <w:szCs w:val="30"/>
+        </w:rPr>
+      </w:pPr>
+      <w:r>
+        <w:rPr>
+          <w:noProof/>
+        </w:rPr>
+        <w:drawing>
+          <wp:inline distT="0" distB="0" distL="0" distR="0" wp14:anchorId="43C14E9F" wp14:editId="17A8C58C">
+            <wp:extent cx="5400040" cy="6316980"/>
+            <wp:effectExtent l="0" t="0" r="0" b="7620"/>
+            <wp:docPr id="197516205" name="Imagen 1"/>
+            <wp:cNvGraphicFramePr>
+              <a:graphicFrameLocks xmlns:a="http://schemas.openxmlformats.org/drawingml/2006/main" noChangeAspect="1"/>
+            </wp:cNvGraphicFramePr>
+            <a:graphic xmlns:a="http://schemas.openxmlformats.org/drawingml/2006/main">
+              <a:graphicData uri="http://schemas.openxmlformats.org/drawingml/2006/picture">
+                <pic:pic xmlns:pic="http://schemas.openxmlformats.org/drawingml/2006/picture">
+                  <pic:nvPicPr>
+                    <pic:cNvPr id="197516205" name=""/>
+                    <pic:cNvPicPr/>
+                  </pic:nvPicPr>
+                  <pic:blipFill>
+                    <a:blip r:embed="rId66"/>
+                    <a:stretch>
+                      <a:fillRect/>
+                    </a:stretch>
+                  </pic:blipFill>
+                  <pic:spPr>
+                    <a:xfrm>
+                      <a:off x="0" y="0"/>
+                      <a:ext cx="5400040" cy="6316980"/>
+                    </a:xfrm>
+                    <a:prstGeom prst="rect">
+                      <a:avLst/>
+                    </a:prstGeom>
+                  </pic:spPr>
+                </pic:pic>
+              </a:graphicData>
+            </a:graphic>
+          </wp:inline>
+        </w:drawing>
       </w:r>
     </w:p>
     <w:p>
-      <w:r>
-        <w:t xml:space="preserve">10.5.3 </w:t>
+      <w:pPr>
+        <w:rPr>
+          <w:rFonts w:ascii="Times New Roman" w:eastAsia="Times New Roman" w:hAnsi="Times New Roman" w:cs="Times New Roman"/>
+          <w:color w:val="0F4761"/>
+          <w:sz w:val="30"/>
+          <w:szCs w:val="30"/>
+        </w:rPr>
+      </w:pPr>
+      <w:r>
+        <w:rPr>
+          <w:rFonts w:ascii="Times New Roman" w:eastAsia="Times New Roman" w:hAnsi="Times New Roman" w:cs="Times New Roman"/>
+          <w:color w:val="0F4761"/>
+          <w:sz w:val="30"/>
+          <w:szCs w:val="30"/>
+        </w:rPr>
+        <w:lastRenderedPageBreak/>
+        <w:t>10.</w:t>
+      </w:r>
+      <w:r>
+        <w:rPr>
+          <w:rFonts w:ascii="Times New Roman" w:eastAsia="Times New Roman" w:hAnsi="Times New Roman" w:cs="Times New Roman"/>
+          <w:color w:val="0F4761"/>
+          <w:sz w:val="30"/>
+          <w:szCs w:val="30"/>
+        </w:rPr>
+        <w:t>6</w:t>
+      </w:r>
+      <w:r>
+        <w:rPr>
+          <w:rFonts w:ascii="Times New Roman" w:eastAsia="Times New Roman" w:hAnsi="Times New Roman" w:cs="Times New Roman"/>
+          <w:color w:val="0F4761"/>
+          <w:sz w:val="30"/>
+          <w:szCs w:val="30"/>
+        </w:rPr>
+        <w:t xml:space="preserve"> </w:t>
+      </w:r>
+      <w:r>
+        <w:rPr>
+          <w:rFonts w:ascii="Times New Roman" w:eastAsia="Times New Roman" w:hAnsi="Times New Roman" w:cs="Times New Roman"/>
+          <w:color w:val="0F4761"/>
+          <w:sz w:val="30"/>
+          <w:szCs w:val="30"/>
+        </w:rPr>
+        <w:t>DER</w:t>
+      </w:r>
+    </w:p>
+    <w:p>
+      <w:pPr>
+        <w:rPr>
+          <w:noProof/>
+        </w:rPr>
+      </w:pPr>
+    </w:p>
+    <w:p>
+      <w:pPr>
+        <w:rPr>
+          <w:rFonts w:ascii="Times New Roman" w:eastAsia="Times New Roman" w:hAnsi="Times New Roman" w:cs="Times New Roman"/>
+        </w:rPr>
+      </w:pPr>
+      <w:r>
+        <w:rPr>
+          <w:noProof/>
+        </w:rPr>
+        <w:drawing>
+          <wp:inline distT="0" distB="0" distL="0" distR="0" wp14:anchorId="102C4C9F" wp14:editId="34318784">
+            <wp:extent cx="5990590" cy="3352800"/>
+            <wp:effectExtent l="0" t="0" r="0" b="0"/>
+            <wp:docPr id="1975260429" name="Imagen 1"/>
+            <wp:cNvGraphicFramePr>
+              <a:graphicFrameLocks xmlns:a="http://schemas.openxmlformats.org/drawingml/2006/main" noChangeAspect="1"/>
+            </wp:cNvGraphicFramePr>
+            <a:graphic xmlns:a="http://schemas.openxmlformats.org/drawingml/2006/main">
+              <a:graphicData uri="http://schemas.openxmlformats.org/drawingml/2006/picture">
+                <pic:pic xmlns:pic="http://schemas.openxmlformats.org/drawingml/2006/picture">
+                  <pic:nvPicPr>
+                    <pic:cNvPr id="0" name="Picture 1"/>
+                    <pic:cNvPicPr>
+                      <a:picLocks noChangeAspect="1" noChangeArrowheads="1"/>
+                    </pic:cNvPicPr>
+                  </pic:nvPicPr>
+                  <pic:blipFill rotWithShape="1">
+                    <a:blip r:embed="rId67">
+                      <a:extLst>
+                        <a:ext uri="{28A0092B-C50C-407E-A947-70E740481C1C}">
+                          <a14:useLocalDpi xmlns:a14="http://schemas.microsoft.com/office/drawing/2010/main" val="0"/>
+                        </a:ext>
+                      </a:extLst>
+                    </a:blip>
+                    <a:srcRect b="8331"/>
+                    <a:stretch>
+                      <a:fillRect/>
+                    </a:stretch>
+                  </pic:blipFill>
+                  <pic:spPr bwMode="auto">
+                    <a:xfrm>
+                      <a:off x="0" y="0"/>
+                      <a:ext cx="5991866" cy="3353514"/>
+                    </a:xfrm>
+                    <a:prstGeom prst="rect">
+                      <a:avLst/>
+                    </a:prstGeom>
+                    <a:noFill/>
+                    <a:ln>
+                      <a:noFill/>
+                    </a:ln>
+                    <a:extLst>
+                      <a:ext uri="{53640926-AAD7-44D8-BBD7-CCE9431645EC}">
+                        <a14:shadowObscured xmlns:a14="http://schemas.microsoft.com/office/drawing/2010/main"/>
+                      </a:ext>
+                    </a:extLst>
+                  </pic:spPr>
+                </pic:pic>
+              </a:graphicData>
+            </a:graphic>
+          </wp:inline>
+        </w:drawing>
+      </w:r>
+    </w:p>
+    <w:p>
+      <w:pPr>
+        <w:rPr>
+          <w:rFonts w:ascii="Times New Roman" w:eastAsia="Times New Roman" w:hAnsi="Times New Roman" w:cs="Times New Roman"/>
+          <w:color w:val="0F4761"/>
+          <w:sz w:val="30"/>
+          <w:szCs w:val="30"/>
+        </w:rPr>
+      </w:pPr>
+      <w:r>
+        <w:rPr>
+          <w:rFonts w:ascii="Times New Roman" w:eastAsia="Times New Roman" w:hAnsi="Times New Roman" w:cs="Times New Roman"/>
+          <w:color w:val="0F4761"/>
+          <w:sz w:val="30"/>
+          <w:szCs w:val="30"/>
+        </w:rPr>
+        <w:t>10.</w:t>
+      </w:r>
+      <w:r>
+        <w:rPr>
+          <w:rFonts w:ascii="Times New Roman" w:eastAsia="Times New Roman" w:hAnsi="Times New Roman" w:cs="Times New Roman"/>
+          <w:color w:val="0F4761"/>
+          <w:sz w:val="30"/>
+          <w:szCs w:val="30"/>
+        </w:rPr>
+        <w:t>6</w:t>
+      </w:r>
+      <w:r>
+        <w:rPr>
+          <w:rFonts w:ascii="Times New Roman" w:eastAsia="Times New Roman" w:hAnsi="Times New Roman" w:cs="Times New Roman"/>
+          <w:color w:val="0F4761"/>
+          <w:sz w:val="30"/>
+          <w:szCs w:val="30"/>
+        </w:rPr>
+        <w:t xml:space="preserve"> </w:t>
+      </w:r>
+      <w:r>
+        <w:rPr>
+          <w:rFonts w:ascii="Times New Roman" w:eastAsia="Times New Roman" w:hAnsi="Times New Roman" w:cs="Times New Roman"/>
+          <w:color w:val="0F4761"/>
+          <w:sz w:val="30"/>
+          <w:szCs w:val="30"/>
+        </w:rPr>
+        <w:t>Pantallas UI</w:t>
+      </w:r>
+    </w:p>
+    <w:p>
+      <w:r>
+        <w:t xml:space="preserve">El menú con el </w:t>
+      </w:r>
+      <w:proofErr w:type="spellStart"/>
+      <w:r>
+        <w:t>comboBox</w:t>
+      </w:r>
+      <w:proofErr w:type="spellEnd"/>
+      <w:r>
+        <w:t xml:space="preserve"> para cambiar idioma</w:t>
+      </w:r>
+    </w:p>
+    <w:p>
+      <w:pPr>
+        <w:rPr>
+          <w:rFonts w:ascii="Times New Roman" w:eastAsia="Times New Roman" w:hAnsi="Times New Roman" w:cs="Times New Roman"/>
+          <w:color w:val="0F4761"/>
+          <w:sz w:val="30"/>
+          <w:szCs w:val="30"/>
+        </w:rPr>
+      </w:pPr>
+      <w:r>
+        <w:rPr>
+          <w:noProof/>
+        </w:rPr>
+        <w:lastRenderedPageBreak/>
+        <w:drawing>
+          <wp:inline distT="0" distB="0" distL="0" distR="0" wp14:anchorId="6AF44FBE" wp14:editId="5937C3EF">
+            <wp:extent cx="5400040" cy="3686175"/>
+            <wp:effectExtent l="0" t="0" r="0" b="9525"/>
+            <wp:docPr id="377277214" name="Imagen 1"/>
+            <wp:cNvGraphicFramePr>
+              <a:graphicFrameLocks xmlns:a="http://schemas.openxmlformats.org/drawingml/2006/main" noChangeAspect="1"/>
+            </wp:cNvGraphicFramePr>
+            <a:graphic xmlns:a="http://schemas.openxmlformats.org/drawingml/2006/main">
+              <a:graphicData uri="http://schemas.openxmlformats.org/drawingml/2006/picture">
+                <pic:pic xmlns:pic="http://schemas.openxmlformats.org/drawingml/2006/picture">
+                  <pic:nvPicPr>
+                    <pic:cNvPr id="377277214" name=""/>
+                    <pic:cNvPicPr/>
+                  </pic:nvPicPr>
+                  <pic:blipFill>
+                    <a:blip r:embed="rId68"/>
+                    <a:stretch>
+                      <a:fillRect/>
+                    </a:stretch>
+                  </pic:blipFill>
+                  <pic:spPr>
+                    <a:xfrm>
+                      <a:off x="0" y="0"/>
+                      <a:ext cx="5400040" cy="3686175"/>
+                    </a:xfrm>
+                    <a:prstGeom prst="rect">
+                      <a:avLst/>
+                    </a:prstGeom>
+                  </pic:spPr>
+                </pic:pic>
+              </a:graphicData>
+            </a:graphic>
+          </wp:inline>
+        </w:drawing>
+      </w:r>
+    </w:p>
+    <w:p>
+      <w:pPr>
+        <w:rPr>
+          <w:rFonts w:ascii="Times New Roman" w:eastAsia="Times New Roman" w:hAnsi="Times New Roman" w:cs="Times New Roman"/>
+        </w:rPr>
+      </w:pPr>
+      <w:r>
+        <w:rPr>
+          <w:rFonts w:ascii="Times New Roman" w:eastAsia="Times New Roman" w:hAnsi="Times New Roman" w:cs="Times New Roman"/>
+        </w:rPr>
+        <w:t>ABM de Idioma</w:t>
+      </w:r>
+    </w:p>
+    <w:p>
+      <w:r>
+        <w:rPr>
+          <w:noProof/>
+        </w:rPr>
+        <w:drawing>
+          <wp:inline distT="0" distB="0" distL="0" distR="0" wp14:anchorId="0608475E" wp14:editId="67B2CED6">
+            <wp:extent cx="5400040" cy="2931160"/>
+            <wp:effectExtent l="0" t="0" r="0" b="2540"/>
+            <wp:docPr id="837411457" name="Imagen 1"/>
+            <wp:cNvGraphicFramePr>
+              <a:graphicFrameLocks xmlns:a="http://schemas.openxmlformats.org/drawingml/2006/main" noChangeAspect="1"/>
+            </wp:cNvGraphicFramePr>
+            <a:graphic xmlns:a="http://schemas.openxmlformats.org/drawingml/2006/main">
+              <a:graphicData uri="http://schemas.openxmlformats.org/drawingml/2006/picture">
+                <pic:pic xmlns:pic="http://schemas.openxmlformats.org/drawingml/2006/picture">
+                  <pic:nvPicPr>
+                    <pic:cNvPr id="837411457" name=""/>
+                    <pic:cNvPicPr/>
+                  </pic:nvPicPr>
+                  <pic:blipFill>
+                    <a:blip r:embed="rId69"/>
+                    <a:stretch>
+                      <a:fillRect/>
+                    </a:stretch>
+                  </pic:blipFill>
+                  <pic:spPr>
+                    <a:xfrm>
+                      <a:off x="0" y="0"/>
+                      <a:ext cx="5400040" cy="2931160"/>
+                    </a:xfrm>
+                    <a:prstGeom prst="rect">
+                      <a:avLst/>
+                    </a:prstGeom>
+                  </pic:spPr>
+                </pic:pic>
+              </a:graphicData>
+            </a:graphic>
+          </wp:inline>
+        </w:drawing>
+      </w:r>
+      <w:r>
+        <w:rPr>
+          <w:rFonts w:ascii="Times New Roman" w:eastAsia="Times New Roman" w:hAnsi="Times New Roman" w:cs="Times New Roman"/>
+        </w:rPr>
+        <w:br/>
       </w:r>
     </w:p>
     <w:p/>
     <w:sectPr>
-      <w:headerReference w:type="default" r:id="rId64"/>
-      <w:footerReference w:type="default" r:id="rId65"/>
+      <w:headerReference w:type="default" r:id="rId70"/>
+      <w:footerReference w:type="default" r:id="rId71"/>
       <w:pgSz w:w="11906" w:h="16838"/>
       <w:pgMar w:top="1417" w:right="1701" w:bottom="1417" w:left="1701" w:header="708" w:footer="708" w:gutter="0"/>
       <w:pgNumType w:start="1"/>
@@ -24919,25 +26085,6 @@
 
 <file path=word/header1.xml><?xml version="1.0" encoding="utf-8"?>
 <w:hdr xmlns:wpc="http://schemas.microsoft.com/office/word/2010/wordprocessingCanvas" xmlns:cx="http://schemas.microsoft.com/office/drawing/2014/chartex" xmlns:cx1="http://schemas.microsoft.com/office/drawing/2015/9/8/chartex" xmlns:cx2="http://schemas.microsoft.com/office/drawing/2015/10/21/chartex" xmlns:cx3="http://schemas.microsoft.com/office/drawing/2016/5/9/chartex" xmlns:cx4="http://schemas.microsoft.com/office/drawing/2016/5/10/chartex" xmlns:cx5="http://schemas.microsoft.com/office/drawing/2016/5/11/chartex" xmlns:cx6="http://schemas.microsoft.com/office/drawing/2016/5/12/chartex" xmlns:cx7="http://schemas.microsoft.com/office/drawing/2016/5/13/chartex" xmlns:cx8="http://schemas.microsoft.com/office/drawing/2016/5/14/chartex" xmlns:mc="http://schemas.openxmlformats.org/markup-compatibility/2006" xmlns:aink="http://schemas.microsoft.com/office/drawing/2016/ink" xmlns:am3d="http://schemas.microsoft.com/office/drawing/2017/model3d" xmlns:o="urn:schemas-microsoft-com:office:office" xmlns:oel="http://schemas.microsoft.com/office/2019/extlst" xmlns:r="http://schemas.openxmlformats.org/officeDocument/2006/relationships" xmlns:m="http://schemas.openxmlformats.org/officeDocument/2006/math" xmlns:v="urn:schemas-microsoft-com:vml" xmlns:wp14="http://schemas.microsoft.com/office/word/2010/wordprocessingDrawing" xmlns:wp="http://schemas.openxmlformats.org/drawingml/2006/wordprocessingDrawing" xmlns:w10="urn:schemas-microsoft-com:office:word" xmlns:w="http://schemas.openxmlformats.org/wordprocessingml/2006/main" xmlns:w14="http://schemas.microsoft.com/office/word/2010/wordml" xmlns:w15="http://schemas.microsoft.com/office/word/2012/wordml" xmlns:w16cex="http://schemas.microsoft.com/office/word/2018/wordml/cex" xmlns:w16cid="http://schemas.microsoft.com/office/word/2016/wordml/cid" xmlns:w16="http://schemas.microsoft.com/office/word/2018/wordml" xmlns:w16du="http://schemas.microsoft.com/office/word/2023/wordml/word16du" xmlns:w16sdtdh="http://schemas.microsoft.com/office/word/2020/wordml/sdtdatahash" xmlns:w16sdtfl="http://schemas.microsoft.com/office/word/2024/wordml/sdtformatlock" xmlns:w16se="http://schemas.microsoft.com/office/word/2015/wordml/symex" xmlns:wpg="http://schemas.microsoft.com/office/word/2010/wordprocessingGroup" xmlns:wpi="http://schemas.microsoft.com/office/word/2010/wordprocessingInk" xmlns:wne="http://schemas.microsoft.com/office/word/2006/wordml" xmlns:wps="http://schemas.microsoft.com/office/word/2010/wordprocessingShape" mc:Ignorable="w14 w15 w16se w16cid w16 w16cex w16sdtdh w16sdtfl w16du wp14">
-  <w:p>
-    <w:pPr>
-      <w:pBdr>
-        <w:top w:val="nil"/>
-        <w:left w:val="nil"/>
-        <w:bottom w:val="nil"/>
-        <w:right w:val="nil"/>
-        <w:between w:val="nil"/>
-      </w:pBdr>
-      <w:tabs>
-        <w:tab w:val="center" w:pos="4252"/>
-        <w:tab w:val="right" w:pos="8504"/>
-      </w:tabs>
-      <w:spacing w:after="0" w:line="240" w:lineRule="auto"/>
-      <w:rPr>
-        <w:color w:val="000000"/>
-      </w:rPr>
-    </w:pPr>
-  </w:p>
   <w:tbl>
     <w:tblPr>
       <w:tblStyle w:val="a7"/>
@@ -28123,9 +29270,9 @@
     </w:lvl>
   </w:abstractNum>
   <w:abstractNum w:abstractNumId="21" w15:restartNumberingAfterBreak="0">
-    <w:nsid w:val="4F81444D"/>
+    <w:nsid w:val="4F151ED2"/>
     <w:multiLevelType w:val="multilevel"/>
-    <w:tmpl w:val="2CE4AB62"/>
+    <w:tmpl w:val="3B440B54"/>
     <w:lvl w:ilvl="0">
       <w:start w:val="1"/>
       <w:numFmt w:val="decimal"/>
@@ -28213,122 +29360,9 @@
     </w:lvl>
   </w:abstractNum>
   <w:abstractNum w:abstractNumId="22" w15:restartNumberingAfterBreak="0">
-    <w:nsid w:val="58952764"/>
-    <w:multiLevelType w:val="hybridMultilevel"/>
-    <w:tmpl w:val="A37ECC54"/>
-    <w:lvl w:ilvl="0" w:tplc="2C0A0001">
-      <w:start w:val="1"/>
-      <w:numFmt w:val="bullet"/>
-      <w:lvlText w:val=""/>
-      <w:lvlJc w:val="left"/>
-      <w:pPr>
-        <w:ind w:left="720" w:hanging="360"/>
-      </w:pPr>
-      <w:rPr>
-        <w:rFonts w:ascii="Symbol" w:hAnsi="Symbol" w:hint="default"/>
-      </w:rPr>
-    </w:lvl>
-    <w:lvl w:ilvl="1" w:tplc="2C0A0003" w:tentative="1">
-      <w:start w:val="1"/>
-      <w:numFmt w:val="bullet"/>
-      <w:lvlText w:val="o"/>
-      <w:lvlJc w:val="left"/>
-      <w:pPr>
-        <w:ind w:left="1440" w:hanging="360"/>
-      </w:pPr>
-      <w:rPr>
-        <w:rFonts w:ascii="Courier New" w:hAnsi="Courier New" w:cs="Courier New" w:hint="default"/>
-      </w:rPr>
-    </w:lvl>
-    <w:lvl w:ilvl="2" w:tplc="2C0A0005" w:tentative="1">
-      <w:start w:val="1"/>
-      <w:numFmt w:val="bullet"/>
-      <w:lvlText w:val=""/>
-      <w:lvlJc w:val="left"/>
-      <w:pPr>
-        <w:ind w:left="2160" w:hanging="360"/>
-      </w:pPr>
-      <w:rPr>
-        <w:rFonts w:ascii="Wingdings" w:hAnsi="Wingdings" w:hint="default"/>
-      </w:rPr>
-    </w:lvl>
-    <w:lvl w:ilvl="3" w:tplc="2C0A0001" w:tentative="1">
-      <w:start w:val="1"/>
-      <w:numFmt w:val="bullet"/>
-      <w:lvlText w:val=""/>
-      <w:lvlJc w:val="left"/>
-      <w:pPr>
-        <w:ind w:left="2880" w:hanging="360"/>
-      </w:pPr>
-      <w:rPr>
-        <w:rFonts w:ascii="Symbol" w:hAnsi="Symbol" w:hint="default"/>
-      </w:rPr>
-    </w:lvl>
-    <w:lvl w:ilvl="4" w:tplc="2C0A0003" w:tentative="1">
-      <w:start w:val="1"/>
-      <w:numFmt w:val="bullet"/>
-      <w:lvlText w:val="o"/>
-      <w:lvlJc w:val="left"/>
-      <w:pPr>
-        <w:ind w:left="3600" w:hanging="360"/>
-      </w:pPr>
-      <w:rPr>
-        <w:rFonts w:ascii="Courier New" w:hAnsi="Courier New" w:cs="Courier New" w:hint="default"/>
-      </w:rPr>
-    </w:lvl>
-    <w:lvl w:ilvl="5" w:tplc="2C0A0005" w:tentative="1">
-      <w:start w:val="1"/>
-      <w:numFmt w:val="bullet"/>
-      <w:lvlText w:val=""/>
-      <w:lvlJc w:val="left"/>
-      <w:pPr>
-        <w:ind w:left="4320" w:hanging="360"/>
-      </w:pPr>
-      <w:rPr>
-        <w:rFonts w:ascii="Wingdings" w:hAnsi="Wingdings" w:hint="default"/>
-      </w:rPr>
-    </w:lvl>
-    <w:lvl w:ilvl="6" w:tplc="2C0A0001" w:tentative="1">
-      <w:start w:val="1"/>
-      <w:numFmt w:val="bullet"/>
-      <w:lvlText w:val=""/>
-      <w:lvlJc w:val="left"/>
-      <w:pPr>
-        <w:ind w:left="5040" w:hanging="360"/>
-      </w:pPr>
-      <w:rPr>
-        <w:rFonts w:ascii="Symbol" w:hAnsi="Symbol" w:hint="default"/>
-      </w:rPr>
-    </w:lvl>
-    <w:lvl w:ilvl="7" w:tplc="2C0A0003" w:tentative="1">
-      <w:start w:val="1"/>
-      <w:numFmt w:val="bullet"/>
-      <w:lvlText w:val="o"/>
-      <w:lvlJc w:val="left"/>
-      <w:pPr>
-        <w:ind w:left="5760" w:hanging="360"/>
-      </w:pPr>
-      <w:rPr>
-        <w:rFonts w:ascii="Courier New" w:hAnsi="Courier New" w:cs="Courier New" w:hint="default"/>
-      </w:rPr>
-    </w:lvl>
-    <w:lvl w:ilvl="8" w:tplc="2C0A0005" w:tentative="1">
-      <w:start w:val="1"/>
-      <w:numFmt w:val="bullet"/>
-      <w:lvlText w:val=""/>
-      <w:lvlJc w:val="left"/>
-      <w:pPr>
-        <w:ind w:left="6480" w:hanging="360"/>
-      </w:pPr>
-      <w:rPr>
-        <w:rFonts w:ascii="Wingdings" w:hAnsi="Wingdings" w:hint="default"/>
-      </w:rPr>
-    </w:lvl>
-  </w:abstractNum>
-  <w:abstractNum w:abstractNumId="23" w15:restartNumberingAfterBreak="0">
-    <w:nsid w:val="5B28511A"/>
+    <w:nsid w:val="4F81444D"/>
     <w:multiLevelType w:val="multilevel"/>
-    <w:tmpl w:val="3B440B54"/>
+    <w:tmpl w:val="2CE4AB62"/>
     <w:lvl w:ilvl="0">
       <w:start w:val="1"/>
       <w:numFmt w:val="decimal"/>
@@ -28415,7 +29449,323 @@
       </w:pPr>
     </w:lvl>
   </w:abstractNum>
+  <w:abstractNum w:abstractNumId="23" w15:restartNumberingAfterBreak="0">
+    <w:nsid w:val="53A47C0C"/>
+    <w:multiLevelType w:val="hybridMultilevel"/>
+    <w:tmpl w:val="5310FD84"/>
+    <w:lvl w:ilvl="0" w:tplc="0C0A0001">
+      <w:start w:val="1"/>
+      <w:numFmt w:val="bullet"/>
+      <w:lvlText w:val=""/>
+      <w:lvlJc w:val="left"/>
+      <w:pPr>
+        <w:ind w:left="720" w:hanging="360"/>
+      </w:pPr>
+      <w:rPr>
+        <w:rFonts w:ascii="Symbol" w:hAnsi="Symbol" w:hint="default"/>
+      </w:rPr>
+    </w:lvl>
+    <w:lvl w:ilvl="1" w:tplc="0C0A0003">
+      <w:start w:val="1"/>
+      <w:numFmt w:val="bullet"/>
+      <w:lvlText w:val="o"/>
+      <w:lvlJc w:val="left"/>
+      <w:pPr>
+        <w:ind w:left="1440" w:hanging="360"/>
+      </w:pPr>
+      <w:rPr>
+        <w:rFonts w:ascii="Courier New" w:hAnsi="Courier New" w:cs="Courier New" w:hint="default"/>
+      </w:rPr>
+    </w:lvl>
+    <w:lvl w:ilvl="2" w:tplc="0C0A0005">
+      <w:start w:val="1"/>
+      <w:numFmt w:val="bullet"/>
+      <w:lvlText w:val=""/>
+      <w:lvlJc w:val="left"/>
+      <w:pPr>
+        <w:ind w:left="2160" w:hanging="360"/>
+      </w:pPr>
+      <w:rPr>
+        <w:rFonts w:ascii="Wingdings" w:hAnsi="Wingdings" w:hint="default"/>
+      </w:rPr>
+    </w:lvl>
+    <w:lvl w:ilvl="3" w:tplc="0C0A0001">
+      <w:start w:val="1"/>
+      <w:numFmt w:val="bullet"/>
+      <w:lvlText w:val=""/>
+      <w:lvlJc w:val="left"/>
+      <w:pPr>
+        <w:ind w:left="2880" w:hanging="360"/>
+      </w:pPr>
+      <w:rPr>
+        <w:rFonts w:ascii="Symbol" w:hAnsi="Symbol" w:hint="default"/>
+      </w:rPr>
+    </w:lvl>
+    <w:lvl w:ilvl="4" w:tplc="0C0A0003">
+      <w:start w:val="1"/>
+      <w:numFmt w:val="bullet"/>
+      <w:lvlText w:val="o"/>
+      <w:lvlJc w:val="left"/>
+      <w:pPr>
+        <w:ind w:left="3600" w:hanging="360"/>
+      </w:pPr>
+      <w:rPr>
+        <w:rFonts w:ascii="Courier New" w:hAnsi="Courier New" w:cs="Courier New" w:hint="default"/>
+      </w:rPr>
+    </w:lvl>
+    <w:lvl w:ilvl="5" w:tplc="0C0A0005">
+      <w:start w:val="1"/>
+      <w:numFmt w:val="bullet"/>
+      <w:lvlText w:val=""/>
+      <w:lvlJc w:val="left"/>
+      <w:pPr>
+        <w:ind w:left="4320" w:hanging="360"/>
+      </w:pPr>
+      <w:rPr>
+        <w:rFonts w:ascii="Wingdings" w:hAnsi="Wingdings" w:hint="default"/>
+      </w:rPr>
+    </w:lvl>
+    <w:lvl w:ilvl="6" w:tplc="0C0A0001">
+      <w:start w:val="1"/>
+      <w:numFmt w:val="bullet"/>
+      <w:lvlText w:val=""/>
+      <w:lvlJc w:val="left"/>
+      <w:pPr>
+        <w:ind w:left="5040" w:hanging="360"/>
+      </w:pPr>
+      <w:rPr>
+        <w:rFonts w:ascii="Symbol" w:hAnsi="Symbol" w:hint="default"/>
+      </w:rPr>
+    </w:lvl>
+    <w:lvl w:ilvl="7" w:tplc="0C0A0003">
+      <w:start w:val="1"/>
+      <w:numFmt w:val="bullet"/>
+      <w:lvlText w:val="o"/>
+      <w:lvlJc w:val="left"/>
+      <w:pPr>
+        <w:ind w:left="5760" w:hanging="360"/>
+      </w:pPr>
+      <w:rPr>
+        <w:rFonts w:ascii="Courier New" w:hAnsi="Courier New" w:cs="Courier New" w:hint="default"/>
+      </w:rPr>
+    </w:lvl>
+    <w:lvl w:ilvl="8" w:tplc="0C0A0005">
+      <w:start w:val="1"/>
+      <w:numFmt w:val="bullet"/>
+      <w:lvlText w:val=""/>
+      <w:lvlJc w:val="left"/>
+      <w:pPr>
+        <w:ind w:left="6480" w:hanging="360"/>
+      </w:pPr>
+      <w:rPr>
+        <w:rFonts w:ascii="Wingdings" w:hAnsi="Wingdings" w:hint="default"/>
+      </w:rPr>
+    </w:lvl>
+  </w:abstractNum>
   <w:abstractNum w:abstractNumId="24" w15:restartNumberingAfterBreak="0">
+    <w:nsid w:val="58952764"/>
+    <w:multiLevelType w:val="hybridMultilevel"/>
+    <w:tmpl w:val="A37ECC54"/>
+    <w:lvl w:ilvl="0" w:tplc="2C0A0001">
+      <w:start w:val="1"/>
+      <w:numFmt w:val="bullet"/>
+      <w:lvlText w:val=""/>
+      <w:lvlJc w:val="left"/>
+      <w:pPr>
+        <w:ind w:left="720" w:hanging="360"/>
+      </w:pPr>
+      <w:rPr>
+        <w:rFonts w:ascii="Symbol" w:hAnsi="Symbol" w:hint="default"/>
+      </w:rPr>
+    </w:lvl>
+    <w:lvl w:ilvl="1" w:tplc="2C0A0003" w:tentative="1">
+      <w:start w:val="1"/>
+      <w:numFmt w:val="bullet"/>
+      <w:lvlText w:val="o"/>
+      <w:lvlJc w:val="left"/>
+      <w:pPr>
+        <w:ind w:left="1440" w:hanging="360"/>
+      </w:pPr>
+      <w:rPr>
+        <w:rFonts w:ascii="Courier New" w:hAnsi="Courier New" w:cs="Courier New" w:hint="default"/>
+      </w:rPr>
+    </w:lvl>
+    <w:lvl w:ilvl="2" w:tplc="2C0A0005" w:tentative="1">
+      <w:start w:val="1"/>
+      <w:numFmt w:val="bullet"/>
+      <w:lvlText w:val=""/>
+      <w:lvlJc w:val="left"/>
+      <w:pPr>
+        <w:ind w:left="2160" w:hanging="360"/>
+      </w:pPr>
+      <w:rPr>
+        <w:rFonts w:ascii="Wingdings" w:hAnsi="Wingdings" w:hint="default"/>
+      </w:rPr>
+    </w:lvl>
+    <w:lvl w:ilvl="3" w:tplc="2C0A0001" w:tentative="1">
+      <w:start w:val="1"/>
+      <w:numFmt w:val="bullet"/>
+      <w:lvlText w:val=""/>
+      <w:lvlJc w:val="left"/>
+      <w:pPr>
+        <w:ind w:left="2880" w:hanging="360"/>
+      </w:pPr>
+      <w:rPr>
+        <w:rFonts w:ascii="Symbol" w:hAnsi="Symbol" w:hint="default"/>
+      </w:rPr>
+    </w:lvl>
+    <w:lvl w:ilvl="4" w:tplc="2C0A0003" w:tentative="1">
+      <w:start w:val="1"/>
+      <w:numFmt w:val="bullet"/>
+      <w:lvlText w:val="o"/>
+      <w:lvlJc w:val="left"/>
+      <w:pPr>
+        <w:ind w:left="3600" w:hanging="360"/>
+      </w:pPr>
+      <w:rPr>
+        <w:rFonts w:ascii="Courier New" w:hAnsi="Courier New" w:cs="Courier New" w:hint="default"/>
+      </w:rPr>
+    </w:lvl>
+    <w:lvl w:ilvl="5" w:tplc="2C0A0005" w:tentative="1">
+      <w:start w:val="1"/>
+      <w:numFmt w:val="bullet"/>
+      <w:lvlText w:val=""/>
+      <w:lvlJc w:val="left"/>
+      <w:pPr>
+        <w:ind w:left="4320" w:hanging="360"/>
+      </w:pPr>
+      <w:rPr>
+        <w:rFonts w:ascii="Wingdings" w:hAnsi="Wingdings" w:hint="default"/>
+      </w:rPr>
+    </w:lvl>
+    <w:lvl w:ilvl="6" w:tplc="2C0A0001" w:tentative="1">
+      <w:start w:val="1"/>
+      <w:numFmt w:val="bullet"/>
+      <w:lvlText w:val=""/>
+      <w:lvlJc w:val="left"/>
+      <w:pPr>
+        <w:ind w:left="5040" w:hanging="360"/>
+      </w:pPr>
+      <w:rPr>
+        <w:rFonts w:ascii="Symbol" w:hAnsi="Symbol" w:hint="default"/>
+      </w:rPr>
+    </w:lvl>
+    <w:lvl w:ilvl="7" w:tplc="2C0A0003" w:tentative="1">
+      <w:start w:val="1"/>
+      <w:numFmt w:val="bullet"/>
+      <w:lvlText w:val="o"/>
+      <w:lvlJc w:val="left"/>
+      <w:pPr>
+        <w:ind w:left="5760" w:hanging="360"/>
+      </w:pPr>
+      <w:rPr>
+        <w:rFonts w:ascii="Courier New" w:hAnsi="Courier New" w:cs="Courier New" w:hint="default"/>
+      </w:rPr>
+    </w:lvl>
+    <w:lvl w:ilvl="8" w:tplc="2C0A0005" w:tentative="1">
+      <w:start w:val="1"/>
+      <w:numFmt w:val="bullet"/>
+      <w:lvlText w:val=""/>
+      <w:lvlJc w:val="left"/>
+      <w:pPr>
+        <w:ind w:left="6480" w:hanging="360"/>
+      </w:pPr>
+      <w:rPr>
+        <w:rFonts w:ascii="Wingdings" w:hAnsi="Wingdings" w:hint="default"/>
+      </w:rPr>
+    </w:lvl>
+  </w:abstractNum>
+  <w:abstractNum w:abstractNumId="25" w15:restartNumberingAfterBreak="0">
+    <w:nsid w:val="5B28511A"/>
+    <w:multiLevelType w:val="multilevel"/>
+    <w:tmpl w:val="3B440B54"/>
+    <w:lvl w:ilvl="0">
+      <w:start w:val="1"/>
+      <w:numFmt w:val="decimal"/>
+      <w:lvlText w:val="%1."/>
+      <w:lvlJc w:val="left"/>
+      <w:pPr>
+        <w:ind w:left="720" w:hanging="360"/>
+      </w:pPr>
+      <w:rPr>
+        <w:b/>
+        <w:bCs/>
+      </w:rPr>
+    </w:lvl>
+    <w:lvl w:ilvl="1">
+      <w:start w:val="1"/>
+      <w:numFmt w:val="decimal"/>
+      <w:lvlText w:val="%2."/>
+      <w:lvlJc w:val="left"/>
+      <w:pPr>
+        <w:ind w:left="1440" w:hanging="360"/>
+      </w:pPr>
+    </w:lvl>
+    <w:lvl w:ilvl="2">
+      <w:start w:val="1"/>
+      <w:numFmt w:val="decimal"/>
+      <w:lvlText w:val="%3."/>
+      <w:lvlJc w:val="left"/>
+      <w:pPr>
+        <w:ind w:left="2160" w:hanging="360"/>
+      </w:pPr>
+    </w:lvl>
+    <w:lvl w:ilvl="3">
+      <w:start w:val="1"/>
+      <w:numFmt w:val="decimal"/>
+      <w:lvlText w:val="%4."/>
+      <w:lvlJc w:val="left"/>
+      <w:pPr>
+        <w:ind w:left="2880" w:hanging="360"/>
+      </w:pPr>
+    </w:lvl>
+    <w:lvl w:ilvl="4">
+      <w:start w:val="1"/>
+      <w:numFmt w:val="decimal"/>
+      <w:lvlText w:val="%5."/>
+      <w:lvlJc w:val="left"/>
+      <w:pPr>
+        <w:ind w:left="3600" w:hanging="360"/>
+      </w:pPr>
+    </w:lvl>
+    <w:lvl w:ilvl="5">
+      <w:start w:val="1"/>
+      <w:numFmt w:val="decimal"/>
+      <w:lvlText w:val="%6."/>
+      <w:lvlJc w:val="left"/>
+      <w:pPr>
+        <w:ind w:left="4320" w:hanging="360"/>
+      </w:pPr>
+    </w:lvl>
+    <w:lvl w:ilvl="6">
+      <w:start w:val="1"/>
+      <w:numFmt w:val="decimal"/>
+      <w:lvlText w:val="%7."/>
+      <w:lvlJc w:val="left"/>
+      <w:pPr>
+        <w:ind w:left="5040" w:hanging="360"/>
+      </w:pPr>
+    </w:lvl>
+    <w:lvl w:ilvl="7">
+      <w:start w:val="1"/>
+      <w:numFmt w:val="decimal"/>
+      <w:lvlText w:val="%8."/>
+      <w:lvlJc w:val="left"/>
+      <w:pPr>
+        <w:ind w:left="5760" w:hanging="360"/>
+      </w:pPr>
+    </w:lvl>
+    <w:lvl w:ilvl="8">
+      <w:start w:val="1"/>
+      <w:numFmt w:val="decimal"/>
+      <w:lvlText w:val="%9."/>
+      <w:lvlJc w:val="left"/>
+      <w:pPr>
+        <w:ind w:left="6480" w:hanging="360"/>
+      </w:pPr>
+    </w:lvl>
+  </w:abstractNum>
+  <w:abstractNum w:abstractNumId="26" w15:restartNumberingAfterBreak="0">
     <w:nsid w:val="5BB90A2F"/>
     <w:multiLevelType w:val="multilevel"/>
     <w:tmpl w:val="B4720FD0"/>
@@ -28564,7 +29914,7 @@
       </w:rPr>
     </w:lvl>
   </w:abstractNum>
-  <w:abstractNum w:abstractNumId="25" w15:restartNumberingAfterBreak="0">
+  <w:abstractNum w:abstractNumId="27" w15:restartNumberingAfterBreak="0">
     <w:nsid w:val="62C615B1"/>
     <w:multiLevelType w:val="hybridMultilevel"/>
     <w:tmpl w:val="69AC4796"/>
@@ -28677,7 +30027,7 @@
       </w:rPr>
     </w:lvl>
   </w:abstractNum>
-  <w:abstractNum w:abstractNumId="26" w15:restartNumberingAfterBreak="0">
+  <w:abstractNum w:abstractNumId="28" w15:restartNumberingAfterBreak="0">
     <w:nsid w:val="721D01EF"/>
     <w:multiLevelType w:val="multilevel"/>
     <w:tmpl w:val="AADC35FA"/>
@@ -28790,7 +30140,7 @@
       </w:rPr>
     </w:lvl>
   </w:abstractNum>
-  <w:abstractNum w:abstractNumId="27" w15:restartNumberingAfterBreak="0">
+  <w:abstractNum w:abstractNumId="29" w15:restartNumberingAfterBreak="0">
     <w:nsid w:val="73776D94"/>
     <w:multiLevelType w:val="multilevel"/>
     <w:tmpl w:val="3940D936"/>
@@ -28880,7 +30230,7 @@
       </w:pPr>
     </w:lvl>
   </w:abstractNum>
-  <w:abstractNum w:abstractNumId="28" w15:restartNumberingAfterBreak="0">
+  <w:abstractNum w:abstractNumId="30" w15:restartNumberingAfterBreak="0">
     <w:nsid w:val="7B0825C5"/>
     <w:multiLevelType w:val="multilevel"/>
     <w:tmpl w:val="E62824EC"/>
@@ -29003,7 +30353,7 @@
     <w:abstractNumId w:val="15"/>
   </w:num>
   <w:num w:numId="4" w16cid:durableId="73673050">
-    <w:abstractNumId w:val="26"/>
+    <w:abstractNumId w:val="28"/>
   </w:num>
   <w:num w:numId="5" w16cid:durableId="335158926">
     <w:abstractNumId w:val="1"/>
@@ -29012,13 +30362,13 @@
     <w:abstractNumId w:val="16"/>
   </w:num>
   <w:num w:numId="7" w16cid:durableId="356194859">
-    <w:abstractNumId w:val="27"/>
+    <w:abstractNumId w:val="29"/>
   </w:num>
   <w:num w:numId="8" w16cid:durableId="1683049771">
     <w:abstractNumId w:val="9"/>
   </w:num>
   <w:num w:numId="9" w16cid:durableId="533082093">
-    <w:abstractNumId w:val="23"/>
+    <w:abstractNumId w:val="25"/>
   </w:num>
   <w:num w:numId="10" w16cid:durableId="338847162">
     <w:abstractNumId w:val="18"/>
@@ -29048,16 +30398,16 @@
     <w:abstractNumId w:val="20"/>
   </w:num>
   <w:num w:numId="19" w16cid:durableId="1035933899">
-    <w:abstractNumId w:val="25"/>
+    <w:abstractNumId w:val="27"/>
   </w:num>
   <w:num w:numId="20" w16cid:durableId="795104101">
     <w:abstractNumId w:val="17"/>
   </w:num>
   <w:num w:numId="21" w16cid:durableId="1902398725">
-    <w:abstractNumId w:val="21"/>
+    <w:abstractNumId w:val="22"/>
   </w:num>
   <w:num w:numId="22" w16cid:durableId="2137947010">
-    <w:abstractNumId w:val="28"/>
+    <w:abstractNumId w:val="30"/>
   </w:num>
   <w:num w:numId="23" w16cid:durableId="1079642873">
     <w:abstractNumId w:val="10"/>
@@ -29072,13 +30422,58 @@
     <w:abstractNumId w:val="12"/>
   </w:num>
   <w:num w:numId="27" w16cid:durableId="2128355026">
-    <w:abstractNumId w:val="24"/>
+    <w:abstractNumId w:val="26"/>
   </w:num>
   <w:num w:numId="28" w16cid:durableId="1747919955">
     <w:abstractNumId w:val="13"/>
   </w:num>
   <w:num w:numId="29" w16cid:durableId="1259094555">
-    <w:abstractNumId w:val="22"/>
+    <w:abstractNumId w:val="24"/>
+  </w:num>
+  <w:num w:numId="30" w16cid:durableId="607734423">
+    <w:abstractNumId w:val="23"/>
+    <w:lvlOverride w:ilvl="0"/>
+    <w:lvlOverride w:ilvl="1"/>
+    <w:lvlOverride w:ilvl="2"/>
+    <w:lvlOverride w:ilvl="3"/>
+    <w:lvlOverride w:ilvl="4"/>
+    <w:lvlOverride w:ilvl="5"/>
+    <w:lvlOverride w:ilvl="6"/>
+    <w:lvlOverride w:ilvl="7"/>
+    <w:lvlOverride w:ilvl="8"/>
+  </w:num>
+  <w:num w:numId="31" w16cid:durableId="355739284">
+    <w:abstractNumId w:val="21"/>
+    <w:lvlOverride w:ilvl="0">
+      <w:startOverride w:val="1"/>
+    </w:lvlOverride>
+    <w:lvlOverride w:ilvl="1">
+      <w:startOverride w:val="1"/>
+    </w:lvlOverride>
+    <w:lvlOverride w:ilvl="2">
+      <w:startOverride w:val="1"/>
+    </w:lvlOverride>
+    <w:lvlOverride w:ilvl="3">
+      <w:startOverride w:val="1"/>
+    </w:lvlOverride>
+    <w:lvlOverride w:ilvl="4">
+      <w:startOverride w:val="1"/>
+    </w:lvlOverride>
+    <w:lvlOverride w:ilvl="5">
+      <w:startOverride w:val="1"/>
+    </w:lvlOverride>
+    <w:lvlOverride w:ilvl="6">
+      <w:startOverride w:val="1"/>
+    </w:lvlOverride>
+    <w:lvlOverride w:ilvl="7">
+      <w:startOverride w:val="1"/>
+    </w:lvlOverride>
+    <w:lvlOverride w:ilvl="8">
+      <w:startOverride w:val="1"/>
+    </w:lvlOverride>
+  </w:num>
+  <w:num w:numId="32" w16cid:durableId="1736929792">
+    <w:abstractNumId w:val="23"/>
   </w:num>
 </w:numbering>
 </file>
@@ -29481,7 +30876,7 @@
   <w:style w:type="paragraph" w:default="1" w:styleId="Normal">
     <w:name w:val="Normal"/>
     <w:qFormat/>
-    <w:rsid w:val="007047D8"/>
+    <w:rsid w:val="004916B9"/>
   </w:style>
   <w:style w:type="paragraph" w:styleId="Ttulo1">
     <w:name w:val="heading 1"/>
@@ -29604,7 +30999,6 @@
   <w:style w:type="character" w:default="1" w:styleId="Fuentedeprrafopredeter">
     <w:name w:val="Default Paragraph Font"/>
     <w:uiPriority w:val="1"/>
-    <w:semiHidden/>
     <w:unhideWhenUsed/>
   </w:style>
   <w:style w:type="table" w:default="1" w:styleId="Tablanormal">
@@ -30429,28 +31823,28 @@
 </file>
 
 <file path=customXml/item1.xml><?xml version="1.0" encoding="utf-8"?>
+<b:Sources xmlns:b="http://schemas.openxmlformats.org/officeDocument/2006/bibliography" xmlns="http://schemas.openxmlformats.org/officeDocument/2006/bibliography" SelectedStyle="\APASixthEditionOfficeOnline.xsl" StyleName="APA" Version="6"/>
+</file>
+
+<file path=customXml/item2.xml><?xml version="1.0" encoding="utf-8"?>
 <go:gDocsCustomXmlDataStorage xmlns:go="http://customooxmlschemas.google.com/" xmlns:r="http://schemas.openxmlformats.org/officeDocument/2006/relationships" uri="GoogleDocsCustomDataVersion2">
   <go:docsCustomData xmlns:go="http://customooxmlschemas.google.com/" roundtripDataSignature="AMtx7mg9ViIy0TFX1PbiokUHW0+gEHD0DQ==">CgMxLjAyDmgueXB0b3ptdnN5YWhpMg5oLjMwMTZ1a3NyeWs5OTIOaC41dHdvajgxajFna2EyDmguajh3ZGR4ZWVnZ3R3Mg5oLmJneml2aG00bzdoYzIOaC5qOTJ5aWxicjl6dDcyDmgubjRpdXVhbG9heDc2Mg5oLjFpNzZ2NHk0NXc5OTIOaC5oaHFvaTRybTJzYjEyDmgubGF1ZXZ5aGhzMG5uMg5oLjI5Nmd4eXhiYnYwbTgAciExNlVkVkNiWlZIdUNvcHFuMnNIenVkMWZoTjV5TjIzLW4=</go:docsCustomData>
 </go:gDocsCustomXmlDataStorage>
 </file>
 
-<file path=customXml/item2.xml><?xml version="1.0" encoding="utf-8"?>
-<b:Sources xmlns:b="http://schemas.openxmlformats.org/officeDocument/2006/bibliography" xmlns="http://schemas.openxmlformats.org/officeDocument/2006/bibliography" SelectedStyle="\APASixthEditionOfficeOnline.xsl" StyleName="APA" Version="6"/>
+<file path=customXml/itemProps1.xml><?xml version="1.0" encoding="utf-8"?>
+<ds:datastoreItem xmlns:ds="http://schemas.openxmlformats.org/officeDocument/2006/customXml" ds:itemID="{98C402C2-0B0B-45E1-8B8A-FD895BAD112E}">
+  <ds:schemaRefs>
+    <ds:schemaRef ds:uri="http://schemas.openxmlformats.org/officeDocument/2006/bibliography"/>
+  </ds:schemaRefs>
+</ds:datastoreItem>
 </file>
 
-<file path=customXml/itemProps1.xml><?xml version="1.0" encoding="utf-8"?>
+<file path=customXml/itemProps2.xml><?xml version="1.0" encoding="utf-8"?>
 <ds:datastoreItem xmlns:ds="http://schemas.openxmlformats.org/officeDocument/2006/customXml" ds:itemID="{11111111-1234-1234-1234-123412341234}">
   <ds:schemaRefs>
     <ds:schemaRef ds:uri="http://customooxmlschemas.google.com/"/>
     <ds:schemaRef ds:uri="http://schemas.openxmlformats.org/officeDocument/2006/relationships"/>
   </ds:schemaRefs>
 </ds:datastoreItem>
-</file>
-
-<file path=customXml/itemProps2.xml><?xml version="1.0" encoding="utf-8"?>
-<ds:datastoreItem xmlns:ds="http://schemas.openxmlformats.org/officeDocument/2006/customXml" ds:itemID="{98C402C2-0B0B-45E1-8B8A-FD895BAD112E}">
-  <ds:schemaRefs>
-    <ds:schemaRef ds:uri="http://schemas.openxmlformats.org/officeDocument/2006/bibliography"/>
-  </ds:schemaRefs>
-</ds:datastoreItem>
 </file>
</xml_diff>

<commit_message>
2da Entrega Tp IS
</commit_message>
<xml_diff>
--- a/Documentación/ProyectoIS 2026 CAJAL-FERNANDEZ_2daEntrega.docx
+++ b/Documentación/ProyectoIS 2026 CAJAL-FERNANDEZ_2daEntrega.docx
@@ -7439,8 +7439,17 @@
           <w:rFonts w:ascii="Times New Roman" w:eastAsia="Times New Roman" w:hAnsi="Times New Roman" w:cs="Times New Roman"/>
           <w:color w:val="000000"/>
         </w:rPr>
-        <w:t>Registro/LogIn-Out</w:t>
-      </w:r>
+        <w:t>Registro/</w:t>
+      </w:r>
+      <w:proofErr w:type="spellStart"/>
+      <w:r>
+        <w:rPr>
+          <w:rFonts w:ascii="Times New Roman" w:eastAsia="Times New Roman" w:hAnsi="Times New Roman" w:cs="Times New Roman"/>
+          <w:color w:val="000000"/>
+        </w:rPr>
+        <w:t>LogIn-Out</w:t>
+      </w:r>
+      <w:proofErr w:type="spellEnd"/>
       <w:r>
         <w:rPr>
           <w:rFonts w:ascii="Times New Roman" w:eastAsia="Times New Roman" w:hAnsi="Times New Roman" w:cs="Times New Roman"/>
@@ -7610,12 +7619,28 @@
           <w:rFonts w:ascii="Times New Roman" w:eastAsia="Times New Roman" w:hAnsi="Times New Roman" w:cs="Times New Roman"/>
         </w:rPr>
       </w:pPr>
-      <w:r>
-        <w:rPr>
-          <w:rFonts w:ascii="Times New Roman" w:eastAsia="Times New Roman" w:hAnsi="Times New Roman" w:cs="Times New Roman"/>
-        </w:rPr>
-        <w:t>BackUp y Restore</w:t>
-      </w:r>
+      <w:proofErr w:type="spellStart"/>
+      <w:r>
+        <w:rPr>
+          <w:rFonts w:ascii="Times New Roman" w:eastAsia="Times New Roman" w:hAnsi="Times New Roman" w:cs="Times New Roman"/>
+        </w:rPr>
+        <w:t>BackUp</w:t>
+      </w:r>
+      <w:proofErr w:type="spellEnd"/>
+      <w:r>
+        <w:rPr>
+          <w:rFonts w:ascii="Times New Roman" w:eastAsia="Times New Roman" w:hAnsi="Times New Roman" w:cs="Times New Roman"/>
+        </w:rPr>
+        <w:t xml:space="preserve"> y </w:t>
+      </w:r>
+      <w:proofErr w:type="spellStart"/>
+      <w:r>
+        <w:rPr>
+          <w:rFonts w:ascii="Times New Roman" w:eastAsia="Times New Roman" w:hAnsi="Times New Roman" w:cs="Times New Roman"/>
+        </w:rPr>
+        <w:t>Restore</w:t>
+      </w:r>
+      <w:proofErr w:type="spellEnd"/>
     </w:p>
     <w:p>
       <w:pPr>
@@ -7843,12 +7868,14 @@
                 <w:rFonts w:ascii="Times New Roman" w:hAnsi="Times New Roman" w:cs="Times New Roman"/>
               </w:rPr>
             </w:pPr>
+            <w:proofErr w:type="spellStart"/>
             <w:r>
               <w:rPr>
                 <w:rFonts w:ascii="Times New Roman" w:hAnsi="Times New Roman" w:cs="Times New Roman"/>
               </w:rPr>
               <w:t>Logout</w:t>
             </w:r>
+            <w:proofErr w:type="spellEnd"/>
           </w:p>
         </w:tc>
       </w:tr>
@@ -7962,12 +7989,14 @@
                 <w:rFonts w:ascii="Times New Roman" w:hAnsi="Times New Roman" w:cs="Times New Roman"/>
               </w:rPr>
             </w:pPr>
+            <w:proofErr w:type="spellStart"/>
             <w:r>
               <w:rPr>
                 <w:rFonts w:ascii="Times New Roman" w:hAnsi="Times New Roman" w:cs="Times New Roman"/>
               </w:rPr>
               <w:t>Logout</w:t>
             </w:r>
+            <w:proofErr w:type="spellEnd"/>
           </w:p>
         </w:tc>
       </w:tr>
@@ -8072,12 +8101,14 @@
                 <w:rFonts w:ascii="Times New Roman" w:hAnsi="Times New Roman" w:cs="Times New Roman"/>
               </w:rPr>
             </w:pPr>
+            <w:proofErr w:type="spellStart"/>
             <w:r>
               <w:rPr>
                 <w:rFonts w:ascii="Times New Roman" w:hAnsi="Times New Roman" w:cs="Times New Roman"/>
               </w:rPr>
               <w:t>Logout</w:t>
             </w:r>
+            <w:proofErr w:type="spellEnd"/>
           </w:p>
         </w:tc>
       </w:tr>
@@ -9920,7 +9951,55 @@
           <w:rFonts w:ascii="Times New Roman" w:eastAsia="Times New Roman" w:hAnsi="Times New Roman" w:cs="Times New Roman"/>
           <w:color w:val="000000"/>
         </w:rPr>
-        <w:t>A su vez en la pantalla del LogIn presentamos un botón “mostrar” para que si el usuario quiere revisar la contraseña ingresada antes de presionar el botón LogIn pueda hacerlo. Para ello debemos setear la propiedad PasswordChar del TextBox en donde el usuario ingresa la contraseña como “*” por default.</w:t>
+        <w:t xml:space="preserve">A su vez en la pantalla del </w:t>
+      </w:r>
+      <w:proofErr w:type="spellStart"/>
+      <w:r>
+        <w:rPr>
+          <w:rFonts w:ascii="Times New Roman" w:eastAsia="Times New Roman" w:hAnsi="Times New Roman" w:cs="Times New Roman"/>
+          <w:color w:val="000000"/>
+        </w:rPr>
+        <w:t>LogIn</w:t>
+      </w:r>
+      <w:proofErr w:type="spellEnd"/>
+      <w:r>
+        <w:rPr>
+          <w:rFonts w:ascii="Times New Roman" w:eastAsia="Times New Roman" w:hAnsi="Times New Roman" w:cs="Times New Roman"/>
+          <w:color w:val="000000"/>
+        </w:rPr>
+        <w:t xml:space="preserve"> presentamos un botón “mostrar” para que si el usuario quiere revisar la contraseña ingresada antes de presionar el botón </w:t>
+      </w:r>
+      <w:proofErr w:type="spellStart"/>
+      <w:r>
+        <w:rPr>
+          <w:rFonts w:ascii="Times New Roman" w:eastAsia="Times New Roman" w:hAnsi="Times New Roman" w:cs="Times New Roman"/>
+          <w:color w:val="000000"/>
+        </w:rPr>
+        <w:t>LogIn</w:t>
+      </w:r>
+      <w:proofErr w:type="spellEnd"/>
+      <w:r>
+        <w:rPr>
+          <w:rFonts w:ascii="Times New Roman" w:eastAsia="Times New Roman" w:hAnsi="Times New Roman" w:cs="Times New Roman"/>
+          <w:color w:val="000000"/>
+        </w:rPr>
+        <w:t xml:space="preserve"> pueda hacerlo. Para ello debemos setear la propiedad </w:t>
+      </w:r>
+      <w:proofErr w:type="spellStart"/>
+      <w:r>
+        <w:rPr>
+          <w:rFonts w:ascii="Times New Roman" w:eastAsia="Times New Roman" w:hAnsi="Times New Roman" w:cs="Times New Roman"/>
+          <w:color w:val="000000"/>
+        </w:rPr>
+        <w:t>PasswordChar</w:t>
+      </w:r>
+      <w:proofErr w:type="spellEnd"/>
+      <w:r>
+        <w:rPr>
+          <w:rFonts w:ascii="Times New Roman" w:eastAsia="Times New Roman" w:hAnsi="Times New Roman" w:cs="Times New Roman"/>
+          <w:color w:val="000000"/>
+        </w:rPr>
+        <w:t xml:space="preserve"> del TextBox en donde el usuario ingresa la contraseña como “*” por default.</w:t>
       </w:r>
     </w:p>
     <w:p>
@@ -9991,7 +10070,27 @@
           <w:bCs/>
           <w:color w:val="000000"/>
         </w:rPr>
-        <w:t>Proceso de Log-Out:</w:t>
+        <w:t>Proceso de Log-</w:t>
+      </w:r>
+      <w:proofErr w:type="spellStart"/>
+      <w:r>
+        <w:rPr>
+          <w:rFonts w:ascii="Times New Roman" w:eastAsia="Times New Roman" w:hAnsi="Times New Roman" w:cs="Times New Roman"/>
+          <w:b/>
+          <w:bCs/>
+          <w:color w:val="000000"/>
+        </w:rPr>
+        <w:t>Out</w:t>
+      </w:r>
+      <w:proofErr w:type="spellEnd"/>
+      <w:r>
+        <w:rPr>
+          <w:rFonts w:ascii="Times New Roman" w:eastAsia="Times New Roman" w:hAnsi="Times New Roman" w:cs="Times New Roman"/>
+          <w:b/>
+          <w:bCs/>
+          <w:color w:val="000000"/>
+        </w:rPr>
+        <w:t>:</w:t>
       </w:r>
       <w:r>
         <w:rPr>
@@ -10019,9 +10118,37 @@
           <w:szCs w:val="30"/>
         </w:rPr>
         <w:lastRenderedPageBreak/>
-        <w:t>2.3 LogIn – CU001 LogIn</w:t>
+        <w:t xml:space="preserve">2.3 </w:t>
+      </w:r>
+      <w:proofErr w:type="spellStart"/>
+      <w:r>
+        <w:rPr>
+          <w:rFonts w:ascii="Times New Roman" w:eastAsia="Times New Roman" w:hAnsi="Times New Roman" w:cs="Times New Roman"/>
+          <w:sz w:val="30"/>
+          <w:szCs w:val="30"/>
+        </w:rPr>
+        <w:t>LogIn</w:t>
+      </w:r>
+      <w:proofErr w:type="spellEnd"/>
+      <w:r>
+        <w:rPr>
+          <w:rFonts w:ascii="Times New Roman" w:eastAsia="Times New Roman" w:hAnsi="Times New Roman" w:cs="Times New Roman"/>
+          <w:sz w:val="30"/>
+          <w:szCs w:val="30"/>
+        </w:rPr>
+        <w:t xml:space="preserve"> – CU001 </w:t>
+      </w:r>
+      <w:proofErr w:type="spellStart"/>
+      <w:r>
+        <w:rPr>
+          <w:rFonts w:ascii="Times New Roman" w:eastAsia="Times New Roman" w:hAnsi="Times New Roman" w:cs="Times New Roman"/>
+          <w:sz w:val="30"/>
+          <w:szCs w:val="30"/>
+        </w:rPr>
+        <w:t>LogIn</w:t>
       </w:r>
       <w:bookmarkEnd w:id="23"/>
+      <w:proofErr w:type="spellEnd"/>
     </w:p>
     <w:p>
       <w:pPr>
@@ -10047,7 +10174,14 @@
         <w:rPr>
           <w:rFonts w:ascii="Times New Roman" w:eastAsia="Times New Roman" w:hAnsi="Times New Roman" w:cs="Times New Roman"/>
         </w:rPr>
-        <w:t xml:space="preserve"> Diagrama LogI</w:t>
+        <w:t xml:space="preserve"> Diagrama </w:t>
+      </w:r>
+      <w:proofErr w:type="spellStart"/>
+      <w:r>
+        <w:rPr>
+          <w:rFonts w:ascii="Times New Roman" w:eastAsia="Times New Roman" w:hAnsi="Times New Roman" w:cs="Times New Roman"/>
+        </w:rPr>
+        <w:t>LogI</w:t>
       </w:r>
       <w:r>
         <w:rPr>
@@ -10056,6 +10190,7 @@
         <w:t>n</w:t>
       </w:r>
       <w:bookmarkEnd w:id="24"/>
+      <w:proofErr w:type="spellEnd"/>
     </w:p>
     <w:p>
       <w:pPr>
@@ -10198,8 +10333,17 @@
                 <w:rFonts w:ascii="Times New Roman" w:eastAsia="Times New Roman" w:hAnsi="Times New Roman" w:cs="Times New Roman"/>
                 <w:color w:val="000000"/>
               </w:rPr>
-              <w:t>CU 001 – LogIn</w:t>
-            </w:r>
+              <w:t xml:space="preserve">CU 001 – </w:t>
+            </w:r>
+            <w:proofErr w:type="spellStart"/>
+            <w:r>
+              <w:rPr>
+                <w:rFonts w:ascii="Times New Roman" w:eastAsia="Times New Roman" w:hAnsi="Times New Roman" w:cs="Times New Roman"/>
+                <w:color w:val="000000"/>
+              </w:rPr>
+              <w:t>LogIn</w:t>
+            </w:r>
+            <w:proofErr w:type="spellEnd"/>
             <w:r>
               <w:rPr>
                 <w:rFonts w:ascii="Times New Roman" w:eastAsia="Times New Roman" w:hAnsi="Times New Roman" w:cs="Times New Roman"/>
@@ -10614,7 +10758,27 @@
                 <w:sz w:val="22"/>
                 <w:szCs w:val="22"/>
               </w:rPr>
-              <w:t>El usuario ingresa al sistema y se le presenta la pantalla principal del mismo “LogIn”.</w:t>
+              <w:t>El usuario ingresa al sistema y se le presenta la pantalla principal del mismo “</w:t>
+            </w:r>
+            <w:proofErr w:type="spellStart"/>
+            <w:r>
+              <w:rPr>
+                <w:rFonts w:ascii="Times New Roman" w:eastAsia="Times New Roman" w:hAnsi="Times New Roman" w:cs="Times New Roman"/>
+                <w:color w:val="000000"/>
+                <w:sz w:val="22"/>
+                <w:szCs w:val="22"/>
+              </w:rPr>
+              <w:t>LogIn</w:t>
+            </w:r>
+            <w:proofErr w:type="spellEnd"/>
+            <w:r>
+              <w:rPr>
+                <w:rFonts w:ascii="Times New Roman" w:eastAsia="Times New Roman" w:hAnsi="Times New Roman" w:cs="Times New Roman"/>
+                <w:color w:val="000000"/>
+                <w:sz w:val="22"/>
+                <w:szCs w:val="22"/>
+              </w:rPr>
+              <w:t>”.</w:t>
             </w:r>
           </w:p>
           <w:p>
@@ -17715,7 +17879,21 @@
         <w:rPr>
           <w:rFonts w:ascii="Times New Roman" w:hAnsi="Times New Roman" w:cs="Times New Roman"/>
         </w:rPr>
-        <w:t xml:space="preserve">Con el objetivo de garantizar la seguridad de las contraseñas de los usuarios, en este proyecto se aplica el algoritmo SHA-256, encargado de transformar una cadena de texto en un valor de longitud determinado, denominado "hash". Este es un algoritmo de hashing unidireccional, lo que significa que no es posible desencriptar el hash para obtener la contraseña original. </w:t>
+        <w:t xml:space="preserve">Con el objetivo de garantizar la seguridad de las contraseñas de los usuarios, en este proyecto se aplica el algoritmo SHA-256, encargado de transformar una cadena de texto en un valor de longitud determinado, denominado "hash". Este es un algoritmo de </w:t>
+      </w:r>
+      <w:proofErr w:type="spellStart"/>
+      <w:r>
+        <w:rPr>
+          <w:rFonts w:ascii="Times New Roman" w:hAnsi="Times New Roman" w:cs="Times New Roman"/>
+        </w:rPr>
+        <w:t>hashing</w:t>
+      </w:r>
+      <w:proofErr w:type="spellEnd"/>
+      <w:r>
+        <w:rPr>
+          <w:rFonts w:ascii="Times New Roman" w:hAnsi="Times New Roman" w:cs="Times New Roman"/>
+        </w:rPr>
+        <w:t xml:space="preserve"> unidireccional, lo que significa que no es posible desencriptar el hash para obtener la contraseña original. </w:t>
       </w:r>
     </w:p>
     <w:p>
@@ -17728,7 +17906,35 @@
         <w:rPr>
           <w:rFonts w:ascii="Times New Roman" w:hAnsi="Times New Roman" w:cs="Times New Roman"/>
         </w:rPr>
-        <w:t xml:space="preserve">Tanto para la creación de usuarios como para el logueo en el sistema de estos mismos, se deberá ingresar una clave. Esta clave será hasheada por el algoritmo SHA-256 y será guardada en la base de datos. Un usuario que requiera iniciar sesión deberá ingresar su clave, en la interfaz de Inicio de sesión, el valor que coloque como clave, al seleccionar “Iniciar Sesión” será hasheado y comparado con el valor que se encuentre en la base de datos. Si estos valores coinciden, la sesión es iniciada, en el caso contrario donde no coincidan, se mostrará al usuario un error de contraseña incorrecta. </w:t>
+        <w:t xml:space="preserve">Tanto para la creación de usuarios como para el logueo en el sistema de estos mismos, se deberá ingresar una clave. Esta clave será </w:t>
+      </w:r>
+      <w:proofErr w:type="spellStart"/>
+      <w:r>
+        <w:rPr>
+          <w:rFonts w:ascii="Times New Roman" w:hAnsi="Times New Roman" w:cs="Times New Roman"/>
+        </w:rPr>
+        <w:t>hasheada</w:t>
+      </w:r>
+      <w:proofErr w:type="spellEnd"/>
+      <w:r>
+        <w:rPr>
+          <w:rFonts w:ascii="Times New Roman" w:hAnsi="Times New Roman" w:cs="Times New Roman"/>
+        </w:rPr>
+        <w:t xml:space="preserve"> por el algoritmo SHA-256 y será guardada en la base de datos. Un usuario que requiera iniciar sesión deberá ingresar su clave, en la interfaz de Inicio de sesión, el valor que coloque como clave, al seleccionar “Iniciar Sesión” será </w:t>
+      </w:r>
+      <w:proofErr w:type="spellStart"/>
+      <w:r>
+        <w:rPr>
+          <w:rFonts w:ascii="Times New Roman" w:hAnsi="Times New Roman" w:cs="Times New Roman"/>
+        </w:rPr>
+        <w:t>hasheado</w:t>
+      </w:r>
+      <w:proofErr w:type="spellEnd"/>
+      <w:r>
+        <w:rPr>
+          <w:rFonts w:ascii="Times New Roman" w:hAnsi="Times New Roman" w:cs="Times New Roman"/>
+        </w:rPr>
+        <w:t xml:space="preserve"> y comparado con el valor que se encuentre en la base de datos. Si estos valores coinciden, la sesión es iniciada, en el caso contrario donde no coincidan, se mostrará al usuario un error de contraseña incorrecta. </w:t>
       </w:r>
     </w:p>
     <w:p>
@@ -17750,7 +17956,25 @@
           <w:b/>
           <w:bCs/>
         </w:rPr>
-        <w:t xml:space="preserve">Método de la clase Encriptador: </w:t>
+        <w:t xml:space="preserve">Método de la clase </w:t>
+      </w:r>
+      <w:proofErr w:type="spellStart"/>
+      <w:r>
+        <w:rPr>
+          <w:rFonts w:ascii="Times New Roman" w:hAnsi="Times New Roman" w:cs="Times New Roman"/>
+          <w:b/>
+          <w:bCs/>
+        </w:rPr>
+        <w:t>Encriptador</w:t>
+      </w:r>
+      <w:proofErr w:type="spellEnd"/>
+      <w:r>
+        <w:rPr>
+          <w:rFonts w:ascii="Times New Roman" w:hAnsi="Times New Roman" w:cs="Times New Roman"/>
+          <w:b/>
+          <w:bCs/>
+        </w:rPr>
+        <w:t xml:space="preserve">: </w:t>
       </w:r>
     </w:p>
     <w:p>
@@ -17763,7 +17987,21 @@
         <w:rPr>
           <w:rFonts w:ascii="Times New Roman" w:hAnsi="Times New Roman" w:cs="Times New Roman"/>
         </w:rPr>
-        <w:t xml:space="preserve">Hash (string input): Este método toma una cadena de texto (como una contraseña en texto plano) y la convierte en un hash de 256 bits utilizando el algoritmo SHA-256. </w:t>
+        <w:t>Hash (</w:t>
+      </w:r>
+      <w:proofErr w:type="spellStart"/>
+      <w:r>
+        <w:rPr>
+          <w:rFonts w:ascii="Times New Roman" w:hAnsi="Times New Roman" w:cs="Times New Roman"/>
+        </w:rPr>
+        <w:t>string</w:t>
+      </w:r>
+      <w:proofErr w:type="spellEnd"/>
+      <w:r>
+        <w:rPr>
+          <w:rFonts w:ascii="Times New Roman" w:hAnsi="Times New Roman" w:cs="Times New Roman"/>
+        </w:rPr>
+        <w:t xml:space="preserve"> input): Este método toma una cadena de texto (como una contraseña en texto plano) y la convierte en un hash de 256 bits utilizando el algoritmo SHA-256. </w:t>
       </w:r>
     </w:p>
     <w:p>
@@ -17823,7 +18061,21 @@
         <w:rPr>
           <w:rFonts w:ascii="Times New Roman" w:hAnsi="Times New Roman" w:cs="Times New Roman"/>
         </w:rPr>
-        <w:t>Al momento de registrar un usuario en el sistema y completar la contraseña de este mismo, en la base de datos el campo que contiene la contraseña no será visible para la persona. Ej: Si la contraseña es Hola123, en la base de datos se vera de la siguiente manera: (Imagen ilustrativa de ejemplo)</w:t>
+        <w:t xml:space="preserve">Al momento de registrar un usuario en el sistema y completar la contraseña de este mismo, en la base de datos el campo que contiene la contraseña no será visible para la persona. Ej: Si la contraseña es Hola123, en la base de datos se </w:t>
+      </w:r>
+      <w:proofErr w:type="spellStart"/>
+      <w:r>
+        <w:rPr>
+          <w:rFonts w:ascii="Times New Roman" w:hAnsi="Times New Roman" w:cs="Times New Roman"/>
+        </w:rPr>
+        <w:t>vera</w:t>
+      </w:r>
+      <w:proofErr w:type="spellEnd"/>
+      <w:r>
+        <w:rPr>
+          <w:rFonts w:ascii="Times New Roman" w:hAnsi="Times New Roman" w:cs="Times New Roman"/>
+        </w:rPr>
+        <w:t xml:space="preserve"> de la siguiente manera: (Imagen ilustrativa de ejemplo)</w:t>
       </w:r>
     </w:p>
     <w:p>
@@ -22368,21 +22620,24 @@
     <w:p>
       <w:pPr>
         <w:pStyle w:val="Ttulo2"/>
+      </w:pPr>
+      <w:bookmarkStart w:id="80" w:name="_Toc232013695"/>
+      <w:r>
         <w:rPr>
           <w:rFonts w:ascii="Times New Roman" w:eastAsia="Times New Roman" w:hAnsi="Times New Roman" w:cs="Times New Roman"/>
           <w:sz w:val="30"/>
           <w:szCs w:val="30"/>
         </w:rPr>
-      </w:pPr>
-      <w:bookmarkStart w:id="80" w:name="_Toc232013695"/>
+        <w:lastRenderedPageBreak/>
+        <w:t>6</w:t>
+      </w:r>
       <w:r>
         <w:rPr>
           <w:rFonts w:ascii="Times New Roman" w:eastAsia="Times New Roman" w:hAnsi="Times New Roman" w:cs="Times New Roman"/>
           <w:sz w:val="30"/>
           <w:szCs w:val="30"/>
         </w:rPr>
-        <w:lastRenderedPageBreak/>
-        <w:t>6</w:t>
+        <w:t>.</w:t>
       </w:r>
       <w:r>
         <w:rPr>
@@ -22390,7 +22645,7 @@
           <w:sz w:val="30"/>
           <w:szCs w:val="30"/>
         </w:rPr>
-        <w:t>.</w:t>
+        <w:t>8</w:t>
       </w:r>
       <w:r>
         <w:rPr>
@@ -22398,7 +22653,7 @@
           <w:sz w:val="30"/>
           <w:szCs w:val="30"/>
         </w:rPr>
-        <w:t>8</w:t>
+        <w:t xml:space="preserve"> Pantalla </w:t>
       </w:r>
       <w:r>
         <w:rPr>
@@ -22406,28 +22661,20 @@
           <w:sz w:val="30"/>
           <w:szCs w:val="30"/>
         </w:rPr>
-        <w:t xml:space="preserve"> Pantalla </w:t>
-      </w:r>
+        <w:t>UI</w:t>
+      </w:r>
+      <w:bookmarkEnd w:id="80"/>
       <w:r>
         <w:rPr>
           <w:rFonts w:ascii="Times New Roman" w:eastAsia="Times New Roman" w:hAnsi="Times New Roman" w:cs="Times New Roman"/>
           <w:sz w:val="30"/>
           <w:szCs w:val="30"/>
         </w:rPr>
-        <w:t>UI</w:t>
-      </w:r>
-      <w:bookmarkEnd w:id="80"/>
-    </w:p>
-    <w:p>
-      <w:r>
-        <w:rPr>
-          <w:noProof/>
-        </w:rPr>
         <w:drawing>
-          <wp:inline distT="0" distB="0" distL="0" distR="0" wp14:anchorId="514ED376" wp14:editId="38782696">
-            <wp:extent cx="6187440" cy="2446891"/>
-            <wp:effectExtent l="0" t="0" r="3810" b="0"/>
-            <wp:docPr id="316836253" name="Imagen 1"/>
+          <wp:inline distT="0" distB="0" distL="0" distR="0" wp14:anchorId="50332FA9" wp14:editId="615D724A">
+            <wp:extent cx="5400040" cy="2176780"/>
+            <wp:effectExtent l="0" t="0" r="0" b="0"/>
+            <wp:docPr id="1089161239" name="Imagen 1"/>
             <wp:cNvGraphicFramePr>
               <a:graphicFrameLocks xmlns:a="http://schemas.openxmlformats.org/drawingml/2006/main" noChangeAspect="1"/>
             </wp:cNvGraphicFramePr>
@@ -22435,7 +22682,7 @@
               <a:graphicData uri="http://schemas.openxmlformats.org/drawingml/2006/picture">
                 <pic:pic xmlns:pic="http://schemas.openxmlformats.org/drawingml/2006/picture">
                   <pic:nvPicPr>
-                    <pic:cNvPr id="316836253" name=""/>
+                    <pic:cNvPr id="1089161239" name=""/>
                     <pic:cNvPicPr/>
                   </pic:nvPicPr>
                   <pic:blipFill>
@@ -22447,7 +22694,7 @@
                   <pic:spPr>
                     <a:xfrm>
                       <a:off x="0" y="0"/>
-                      <a:ext cx="6195492" cy="2450075"/>
+                      <a:ext cx="5400040" cy="2176780"/>
                     </a:xfrm>
                     <a:prstGeom prst="rect">
                       <a:avLst/>
@@ -22549,25 +22796,75 @@
         </w:rPr>
         <w:t xml:space="preserve">. El algoritmo realiza una suma ponderada donde cada carácter de cada atributo se multiplica por su posición dentro del valor y por la posición del atributo dentro de la entidad. Esto permite detectar no solo modificaciones en el contenido sino también intercambios de posición entre caracteres o atributos. Los atributos que participan en el cálculo son: </w:t>
       </w:r>
+      <w:proofErr w:type="spellStart"/>
       <w:r>
         <w:rPr>
           <w:rFonts w:ascii="Times New Roman" w:eastAsia="Times New Roman" w:hAnsi="Times New Roman" w:cs="Times New Roman"/>
           <w:color w:val="000000"/>
         </w:rPr>
-        <w:t xml:space="preserve">IdProducto, </w:t>
-      </w:r>
+        <w:t>IdProducto</w:t>
+      </w:r>
+      <w:proofErr w:type="spellEnd"/>
       <w:r>
         <w:rPr>
           <w:rFonts w:ascii="Times New Roman" w:eastAsia="Times New Roman" w:hAnsi="Times New Roman" w:cs="Times New Roman"/>
           <w:color w:val="000000"/>
         </w:rPr>
-        <w:t xml:space="preserve">NombreProducto, PrecioProducto, TipoProducto, </w:t>
-      </w:r>
+        <w:t xml:space="preserve">, </w:t>
+      </w:r>
+      <w:proofErr w:type="spellStart"/>
       <w:r>
         <w:rPr>
           <w:rFonts w:ascii="Times New Roman" w:eastAsia="Times New Roman" w:hAnsi="Times New Roman" w:cs="Times New Roman"/>
           <w:color w:val="000000"/>
         </w:rPr>
+        <w:t>NombreProducto</w:t>
+      </w:r>
+      <w:proofErr w:type="spellEnd"/>
+      <w:r>
+        <w:rPr>
+          <w:rFonts w:ascii="Times New Roman" w:eastAsia="Times New Roman" w:hAnsi="Times New Roman" w:cs="Times New Roman"/>
+          <w:color w:val="000000"/>
+        </w:rPr>
+        <w:t xml:space="preserve">, </w:t>
+      </w:r>
+      <w:proofErr w:type="spellStart"/>
+      <w:r>
+        <w:rPr>
+          <w:rFonts w:ascii="Times New Roman" w:eastAsia="Times New Roman" w:hAnsi="Times New Roman" w:cs="Times New Roman"/>
+          <w:color w:val="000000"/>
+        </w:rPr>
+        <w:t>PrecioProducto</w:t>
+      </w:r>
+      <w:proofErr w:type="spellEnd"/>
+      <w:r>
+        <w:rPr>
+          <w:rFonts w:ascii="Times New Roman" w:eastAsia="Times New Roman" w:hAnsi="Times New Roman" w:cs="Times New Roman"/>
+          <w:color w:val="000000"/>
+        </w:rPr>
+        <w:t xml:space="preserve">, </w:t>
+      </w:r>
+      <w:proofErr w:type="spellStart"/>
+      <w:r>
+        <w:rPr>
+          <w:rFonts w:ascii="Times New Roman" w:eastAsia="Times New Roman" w:hAnsi="Times New Roman" w:cs="Times New Roman"/>
+          <w:color w:val="000000"/>
+        </w:rPr>
+        <w:t>TipoProducto</w:t>
+      </w:r>
+      <w:proofErr w:type="spellEnd"/>
+      <w:r>
+        <w:rPr>
+          <w:rFonts w:ascii="Times New Roman" w:eastAsia="Times New Roman" w:hAnsi="Times New Roman" w:cs="Times New Roman"/>
+          <w:color w:val="000000"/>
+        </w:rPr>
+        <w:t xml:space="preserve">, </w:t>
+      </w:r>
+      <w:r>
+        <w:rPr>
+          <w:rFonts w:ascii="Times New Roman" w:eastAsia="Times New Roman" w:hAnsi="Times New Roman" w:cs="Times New Roman"/>
+          <w:color w:val="000000"/>
+        </w:rPr>
         <w:t>Descripción</w:t>
       </w:r>
       <w:r>
@@ -22575,7 +22872,39 @@
           <w:rFonts w:ascii="Times New Roman" w:eastAsia="Times New Roman" w:hAnsi="Times New Roman" w:cs="Times New Roman"/>
           <w:color w:val="000000"/>
         </w:rPr>
-        <w:t>, Cantidad y CodigoProducto. El resultado de la suma se hashea con SHA-256 y se almacena en la columna DVH de la tabla PRODUCTO.</w:t>
+        <w:t xml:space="preserve">, Cantidad y </w:t>
+      </w:r>
+      <w:proofErr w:type="spellStart"/>
+      <w:r>
+        <w:rPr>
+          <w:rFonts w:ascii="Times New Roman" w:eastAsia="Times New Roman" w:hAnsi="Times New Roman" w:cs="Times New Roman"/>
+          <w:color w:val="000000"/>
+        </w:rPr>
+        <w:t>CodigoProducto</w:t>
+      </w:r>
+      <w:proofErr w:type="spellEnd"/>
+      <w:r>
+        <w:rPr>
+          <w:rFonts w:ascii="Times New Roman" w:eastAsia="Times New Roman" w:hAnsi="Times New Roman" w:cs="Times New Roman"/>
+          <w:color w:val="000000"/>
+        </w:rPr>
+        <w:t xml:space="preserve">. El resultado de la suma se </w:t>
+      </w:r>
+      <w:proofErr w:type="spellStart"/>
+      <w:r>
+        <w:rPr>
+          <w:rFonts w:ascii="Times New Roman" w:eastAsia="Times New Roman" w:hAnsi="Times New Roman" w:cs="Times New Roman"/>
+          <w:color w:val="000000"/>
+        </w:rPr>
+        <w:t>hashea</w:t>
+      </w:r>
+      <w:proofErr w:type="spellEnd"/>
+      <w:r>
+        <w:rPr>
+          <w:rFonts w:ascii="Times New Roman" w:eastAsia="Times New Roman" w:hAnsi="Times New Roman" w:cs="Times New Roman"/>
+          <w:color w:val="000000"/>
+        </w:rPr>
+        <w:t xml:space="preserve"> con SHA-256 y se almacena en la columna DVH de la tabla PRODUCTO.</w:t>
       </w:r>
     </w:p>
     <w:p>
@@ -22597,7 +22926,23 @@
           <w:rFonts w:ascii="Times New Roman" w:eastAsia="Times New Roman" w:hAnsi="Times New Roman" w:cs="Times New Roman"/>
           <w:color w:val="000000"/>
         </w:rPr>
-        <w:t xml:space="preserve">El resultado de la suma se hashea con SHA-256 y se almacena en la tabla DIGITO_VERIFICADOR. </w:t>
+        <w:t xml:space="preserve">El resultado de la suma se </w:t>
+      </w:r>
+      <w:proofErr w:type="spellStart"/>
+      <w:r>
+        <w:rPr>
+          <w:rFonts w:ascii="Times New Roman" w:eastAsia="Times New Roman" w:hAnsi="Times New Roman" w:cs="Times New Roman"/>
+          <w:color w:val="000000"/>
+        </w:rPr>
+        <w:t>hashea</w:t>
+      </w:r>
+      <w:proofErr w:type="spellEnd"/>
+      <w:r>
+        <w:rPr>
+          <w:rFonts w:ascii="Times New Roman" w:eastAsia="Times New Roman" w:hAnsi="Times New Roman" w:cs="Times New Roman"/>
+          <w:color w:val="000000"/>
+        </w:rPr>
+        <w:t xml:space="preserve"> con SHA-256 y se almacena en la tabla DIGITO_VERIFICADOR. </w:t>
       </w:r>
       <w:r>
         <w:rPr>
@@ -22614,20 +22959,11 @@
           <w:color w:val="000000"/>
         </w:rPr>
       </w:pPr>
-    </w:p>
-    <w:p>
-      <w:pPr>
+      <w:r>
         <w:rPr>
           <w:rFonts w:ascii="Times New Roman" w:eastAsia="Times New Roman" w:hAnsi="Times New Roman" w:cs="Times New Roman"/>
           <w:color w:val="000000"/>
         </w:rPr>
-      </w:pPr>
-      <w:r>
-        <w:rPr>
-          <w:rFonts w:ascii="Times New Roman" w:eastAsia="Times New Roman" w:hAnsi="Times New Roman" w:cs="Times New Roman"/>
-          <w:color w:val="000000"/>
-        </w:rPr>
-        <w:lastRenderedPageBreak/>
         <w:t xml:space="preserve">El algoritmo para llevar a cabo esto es: </w:t>
       </w:r>
     </w:p>
@@ -22657,7 +22993,39 @@
           <w:rFonts w:ascii="Times New Roman" w:eastAsia="Times New Roman" w:hAnsi="Times New Roman" w:cs="Times New Roman"/>
           <w:color w:val="000000"/>
         </w:rPr>
-        <w:t xml:space="preserve"> suma += ASCII(c) × posChar × posAtributo → SHA256(suma)</w:t>
+        <w:t xml:space="preserve"> suma += ASCII(c) × </w:t>
+      </w:r>
+      <w:proofErr w:type="spellStart"/>
+      <w:r>
+        <w:rPr>
+          <w:rFonts w:ascii="Times New Roman" w:eastAsia="Times New Roman" w:hAnsi="Times New Roman" w:cs="Times New Roman"/>
+          <w:color w:val="000000"/>
+        </w:rPr>
+        <w:t>posChar</w:t>
+      </w:r>
+      <w:proofErr w:type="spellEnd"/>
+      <w:r>
+        <w:rPr>
+          <w:rFonts w:ascii="Times New Roman" w:eastAsia="Times New Roman" w:hAnsi="Times New Roman" w:cs="Times New Roman"/>
+          <w:color w:val="000000"/>
+        </w:rPr>
+        <w:t xml:space="preserve"> × </w:t>
+      </w:r>
+      <w:proofErr w:type="spellStart"/>
+      <w:r>
+        <w:rPr>
+          <w:rFonts w:ascii="Times New Roman" w:eastAsia="Times New Roman" w:hAnsi="Times New Roman" w:cs="Times New Roman"/>
+          <w:color w:val="000000"/>
+        </w:rPr>
+        <w:t>posAtributo</w:t>
+      </w:r>
+      <w:proofErr w:type="spellEnd"/>
+      <w:r>
+        <w:rPr>
+          <w:rFonts w:ascii="Times New Roman" w:eastAsia="Times New Roman" w:hAnsi="Times New Roman" w:cs="Times New Roman"/>
+          <w:color w:val="000000"/>
+        </w:rPr>
+        <w:t xml:space="preserve"> → SHA256(suma)</w:t>
       </w:r>
     </w:p>
     <w:p>
@@ -22686,7 +23054,39 @@
           <w:rFonts w:ascii="Times New Roman" w:eastAsia="Times New Roman" w:hAnsi="Times New Roman" w:cs="Times New Roman"/>
           <w:color w:val="000000"/>
         </w:rPr>
-        <w:t xml:space="preserve"> suma += ASCII(c) × posChar × posFila → SHA256(suma)</w:t>
+        <w:t xml:space="preserve"> suma += ASCII(c) × </w:t>
+      </w:r>
+      <w:proofErr w:type="spellStart"/>
+      <w:r>
+        <w:rPr>
+          <w:rFonts w:ascii="Times New Roman" w:eastAsia="Times New Roman" w:hAnsi="Times New Roman" w:cs="Times New Roman"/>
+          <w:color w:val="000000"/>
+        </w:rPr>
+        <w:t>posChar</w:t>
+      </w:r>
+      <w:proofErr w:type="spellEnd"/>
+      <w:r>
+        <w:rPr>
+          <w:rFonts w:ascii="Times New Roman" w:eastAsia="Times New Roman" w:hAnsi="Times New Roman" w:cs="Times New Roman"/>
+          <w:color w:val="000000"/>
+        </w:rPr>
+        <w:t xml:space="preserve"> × </w:t>
+      </w:r>
+      <w:proofErr w:type="spellStart"/>
+      <w:r>
+        <w:rPr>
+          <w:rFonts w:ascii="Times New Roman" w:eastAsia="Times New Roman" w:hAnsi="Times New Roman" w:cs="Times New Roman"/>
+          <w:color w:val="000000"/>
+        </w:rPr>
+        <w:t>posFila</w:t>
+      </w:r>
+      <w:proofErr w:type="spellEnd"/>
+      <w:r>
+        <w:rPr>
+          <w:rFonts w:ascii="Times New Roman" w:eastAsia="Times New Roman" w:hAnsi="Times New Roman" w:cs="Times New Roman"/>
+          <w:color w:val="000000"/>
+        </w:rPr>
+        <w:t xml:space="preserve"> → SHA256(suma)</w:t>
       </w:r>
     </w:p>
     <w:p>
@@ -22705,6 +23105,7 @@
           <w:sz w:val="30"/>
           <w:szCs w:val="30"/>
         </w:rPr>
+        <w:lastRenderedPageBreak/>
         <w:t xml:space="preserve">7.2 </w:t>
       </w:r>
       <w:r>
@@ -22729,8 +23130,25 @@
           <w:rFonts w:ascii="Times New Roman" w:eastAsia="Times New Roman" w:hAnsi="Times New Roman" w:cs="Times New Roman"/>
           <w:color w:val="000000"/>
         </w:rPr>
-        <w:t xml:space="preserve">Al iniciar la aplicación, antes de mostrar el login, se verifican ambos </w:t>
-      </w:r>
+        <w:t xml:space="preserve">Al iniciar la aplicación, antes de mostrar el </w:t>
+      </w:r>
+      <w:proofErr w:type="spellStart"/>
+      <w:r>
+        <w:rPr>
+          <w:rFonts w:ascii="Times New Roman" w:eastAsia="Times New Roman" w:hAnsi="Times New Roman" w:cs="Times New Roman"/>
+          <w:color w:val="000000"/>
+        </w:rPr>
+        <w:t>login</w:t>
+      </w:r>
+      <w:proofErr w:type="spellEnd"/>
+      <w:r>
+        <w:rPr>
+          <w:rFonts w:ascii="Times New Roman" w:eastAsia="Times New Roman" w:hAnsi="Times New Roman" w:cs="Times New Roman"/>
+          <w:color w:val="000000"/>
+        </w:rPr>
+        <w:t xml:space="preserve">, se verifican ambos </w:t>
+      </w:r>
+      <w:proofErr w:type="spellStart"/>
       <w:proofErr w:type="gramStart"/>
       <w:r>
         <w:rPr>
@@ -22739,6 +23157,7 @@
         </w:rPr>
         <w:t>dígitos.En</w:t>
       </w:r>
+      <w:proofErr w:type="spellEnd"/>
       <w:proofErr w:type="gramEnd"/>
       <w:r>
         <w:rPr>
@@ -22820,7 +23239,23 @@
           <w:rFonts w:ascii="Times New Roman" w:eastAsia="Times New Roman" w:hAnsi="Times New Roman" w:cs="Times New Roman"/>
           <w:color w:val="000000"/>
         </w:rPr>
-        <w:t xml:space="preserve"> Restaura la base de datos completa desde un archivo .bak generado previamente</w:t>
+        <w:t xml:space="preserve"> Restaura la base de datos completa desde un archivo .</w:t>
+      </w:r>
+      <w:proofErr w:type="spellStart"/>
+      <w:r>
+        <w:rPr>
+          <w:rFonts w:ascii="Times New Roman" w:eastAsia="Times New Roman" w:hAnsi="Times New Roman" w:cs="Times New Roman"/>
+          <w:color w:val="000000"/>
+        </w:rPr>
+        <w:t>bak</w:t>
+      </w:r>
+      <w:proofErr w:type="spellEnd"/>
+      <w:r>
+        <w:rPr>
+          <w:rFonts w:ascii="Times New Roman" w:eastAsia="Times New Roman" w:hAnsi="Times New Roman" w:cs="Times New Roman"/>
+          <w:color w:val="000000"/>
+        </w:rPr>
+        <w:t xml:space="preserve"> generado previamente</w:t>
       </w:r>
       <w:r>
         <w:rPr>
@@ -22999,7 +23434,6 @@
           <w:sz w:val="30"/>
           <w:szCs w:val="30"/>
         </w:rPr>
-        <w:lastRenderedPageBreak/>
         <w:t>7.</w:t>
       </w:r>
       <w:r>
@@ -23091,6 +23525,7 @@
           <w:sz w:val="30"/>
           <w:szCs w:val="30"/>
         </w:rPr>
+        <w:lastRenderedPageBreak/>
         <w:t>7.5 Diagrama Secuencia del Sistema</w:t>
       </w:r>
       <w:r>
@@ -23425,13 +23860,29 @@
           <w:rFonts w:ascii="Times New Roman" w:eastAsia="Times New Roman" w:hAnsi="Times New Roman" w:cs="Times New Roman"/>
           <w:color w:val="000000"/>
         </w:rPr>
-        <w:t xml:space="preserve">El formulario BackUp-Restore permite al </w:t>
-      </w:r>
+        <w:t xml:space="preserve">El formulario </w:t>
+      </w:r>
+      <w:proofErr w:type="spellStart"/>
       <w:r>
         <w:rPr>
           <w:rFonts w:ascii="Times New Roman" w:eastAsia="Times New Roman" w:hAnsi="Times New Roman" w:cs="Times New Roman"/>
           <w:color w:val="000000"/>
         </w:rPr>
+        <w:t>BackUp-Restore</w:t>
+      </w:r>
+      <w:proofErr w:type="spellEnd"/>
+      <w:r>
+        <w:rPr>
+          <w:rFonts w:ascii="Times New Roman" w:eastAsia="Times New Roman" w:hAnsi="Times New Roman" w:cs="Times New Roman"/>
+          <w:color w:val="000000"/>
+        </w:rPr>
+        <w:t xml:space="preserve"> permite al </w:t>
+      </w:r>
+      <w:r>
+        <w:rPr>
+          <w:rFonts w:ascii="Times New Roman" w:eastAsia="Times New Roman" w:hAnsi="Times New Roman" w:cs="Times New Roman"/>
+          <w:color w:val="000000"/>
+        </w:rPr>
         <w:t>usuario</w:t>
       </w:r>
       <w:r>
@@ -23439,7 +23890,87 @@
           <w:rFonts w:ascii="Times New Roman" w:eastAsia="Times New Roman" w:hAnsi="Times New Roman" w:cs="Times New Roman"/>
           <w:color w:val="000000"/>
         </w:rPr>
-        <w:t xml:space="preserve"> realizar cuatro operaciones: Crear BackUp genera un archivo .bak en la ruta especificada usando el SP RealizarBackup. Restaurar Base restaura la base de datos completa desde un archivo .bak usando el SP RealizarRestore. Ver Error DV ejecuta la verificación de integridad y muestra los errores encontrados. Solucionar Errores recalcula todos los DVH y DVV aceptando los datos actuales.</w:t>
+        <w:t xml:space="preserve"> realizar cuatro operaciones: Crear </w:t>
+      </w:r>
+      <w:proofErr w:type="spellStart"/>
+      <w:r>
+        <w:rPr>
+          <w:rFonts w:ascii="Times New Roman" w:eastAsia="Times New Roman" w:hAnsi="Times New Roman" w:cs="Times New Roman"/>
+          <w:color w:val="000000"/>
+        </w:rPr>
+        <w:t>BackUp</w:t>
+      </w:r>
+      <w:proofErr w:type="spellEnd"/>
+      <w:r>
+        <w:rPr>
+          <w:rFonts w:ascii="Times New Roman" w:eastAsia="Times New Roman" w:hAnsi="Times New Roman" w:cs="Times New Roman"/>
+          <w:color w:val="000000"/>
+        </w:rPr>
+        <w:t xml:space="preserve"> genera un archivo .</w:t>
+      </w:r>
+      <w:proofErr w:type="spellStart"/>
+      <w:r>
+        <w:rPr>
+          <w:rFonts w:ascii="Times New Roman" w:eastAsia="Times New Roman" w:hAnsi="Times New Roman" w:cs="Times New Roman"/>
+          <w:color w:val="000000"/>
+        </w:rPr>
+        <w:t>bak</w:t>
+      </w:r>
+      <w:proofErr w:type="spellEnd"/>
+      <w:r>
+        <w:rPr>
+          <w:rFonts w:ascii="Times New Roman" w:eastAsia="Times New Roman" w:hAnsi="Times New Roman" w:cs="Times New Roman"/>
+          <w:color w:val="000000"/>
+        </w:rPr>
+        <w:t xml:space="preserve"> en la ruta especificada usando el SP </w:t>
+      </w:r>
+      <w:proofErr w:type="spellStart"/>
+      <w:r>
+        <w:rPr>
+          <w:rFonts w:ascii="Times New Roman" w:eastAsia="Times New Roman" w:hAnsi="Times New Roman" w:cs="Times New Roman"/>
+          <w:color w:val="000000"/>
+        </w:rPr>
+        <w:t>RealizarBackup</w:t>
+      </w:r>
+      <w:proofErr w:type="spellEnd"/>
+      <w:r>
+        <w:rPr>
+          <w:rFonts w:ascii="Times New Roman" w:eastAsia="Times New Roman" w:hAnsi="Times New Roman" w:cs="Times New Roman"/>
+          <w:color w:val="000000"/>
+        </w:rPr>
+        <w:t>. Restaurar Base restaura la base de datos completa desde un archivo .</w:t>
+      </w:r>
+      <w:proofErr w:type="spellStart"/>
+      <w:r>
+        <w:rPr>
+          <w:rFonts w:ascii="Times New Roman" w:eastAsia="Times New Roman" w:hAnsi="Times New Roman" w:cs="Times New Roman"/>
+          <w:color w:val="000000"/>
+        </w:rPr>
+        <w:t>bak</w:t>
+      </w:r>
+      <w:proofErr w:type="spellEnd"/>
+      <w:r>
+        <w:rPr>
+          <w:rFonts w:ascii="Times New Roman" w:eastAsia="Times New Roman" w:hAnsi="Times New Roman" w:cs="Times New Roman"/>
+          <w:color w:val="000000"/>
+        </w:rPr>
+        <w:t xml:space="preserve"> usando el SP </w:t>
+      </w:r>
+      <w:proofErr w:type="spellStart"/>
+      <w:r>
+        <w:rPr>
+          <w:rFonts w:ascii="Times New Roman" w:eastAsia="Times New Roman" w:hAnsi="Times New Roman" w:cs="Times New Roman"/>
+          <w:color w:val="000000"/>
+        </w:rPr>
+        <w:t>RealizarRestore</w:t>
+      </w:r>
+      <w:proofErr w:type="spellEnd"/>
+      <w:r>
+        <w:rPr>
+          <w:rFonts w:ascii="Times New Roman" w:eastAsia="Times New Roman" w:hAnsi="Times New Roman" w:cs="Times New Roman"/>
+          <w:color w:val="000000"/>
+        </w:rPr>
+        <w:t>. Ver Error DV ejecuta la verificación de integridad y muestra los errores encontrados. Solucionar Errores recalcula todos los DVH y DVV aceptando los datos actuales.</w:t>
       </w:r>
     </w:p>
     <w:p>
@@ -23458,14 +23989,36 @@
           <w:color w:val="000000"/>
           <w:lang w:val="en-US"/>
         </w:rPr>
-        <w:t>Ruta recomendada para backup:</w:t>
-      </w:r>
-      <w:r>
-        <w:rPr>
-          <w:rFonts w:ascii="Times New Roman" w:eastAsia="Times New Roman" w:hAnsi="Times New Roman" w:cs="Times New Roman"/>
+        <w:t xml:space="preserve">Ruta </w:t>
+      </w:r>
+      <w:proofErr w:type="spellStart"/>
+      <w:r>
+        <w:rPr>
+          <w:rFonts w:ascii="Times New Roman" w:eastAsia="Times New Roman" w:hAnsi="Times New Roman" w:cs="Times New Roman"/>
+          <w:b/>
+          <w:bCs/>
           <w:color w:val="000000"/>
           <w:lang w:val="en-US"/>
         </w:rPr>
+        <w:t>recomendada</w:t>
+      </w:r>
+      <w:proofErr w:type="spellEnd"/>
+      <w:r>
+        <w:rPr>
+          <w:rFonts w:ascii="Times New Roman" w:eastAsia="Times New Roman" w:hAnsi="Times New Roman" w:cs="Times New Roman"/>
+          <w:b/>
+          <w:bCs/>
+          <w:color w:val="000000"/>
+          <w:lang w:val="en-US"/>
+        </w:rPr>
+        <w:t xml:space="preserve"> para backup:</w:t>
+      </w:r>
+      <w:r>
+        <w:rPr>
+          <w:rFonts w:ascii="Times New Roman" w:eastAsia="Times New Roman" w:hAnsi="Times New Roman" w:cs="Times New Roman"/>
+          <w:color w:val="000000"/>
+          <w:lang w:val="en-US"/>
+        </w:rPr>
         <w:t xml:space="preserve"> </w:t>
       </w:r>
       <w:r>
@@ -23474,8 +24027,18 @@
           <w:color w:val="0066FF"/>
           <w:lang w:val="en-US"/>
         </w:rPr>
-        <w:t>C:\Program Files\Microsoft SQL Server\MSSQL15.SQLEXPRESS\MSSQL\Backup\NombreArchivo.bak</w:t>
-      </w:r>
+        <w:t>C:\Program Files\Microsoft SQL Server\MSSQL15.SQLEXPRESS\MSSQL\Backup\</w:t>
+      </w:r>
+      <w:proofErr w:type="spellStart"/>
+      <w:r>
+        <w:rPr>
+          <w:rFonts w:ascii="Times New Roman" w:eastAsia="Times New Roman" w:hAnsi="Times New Roman" w:cs="Times New Roman"/>
+          <w:color w:val="0066FF"/>
+          <w:lang w:val="en-US"/>
+        </w:rPr>
+        <w:t>NombreArchivo.bak</w:t>
+      </w:r>
+      <w:proofErr w:type="spellEnd"/>
     </w:p>
     <w:p>
       <w:pPr>
@@ -23620,10 +24183,12 @@
     <w:p/>
     <w:p/>
     <w:p>
+      <w:proofErr w:type="spellStart"/>
       <w:r>
         <w:lastRenderedPageBreak/>
         <w:t>Restore</w:t>
       </w:r>
+      <w:proofErr w:type="spellEnd"/>
     </w:p>
     <w:p>
       <w:r>
@@ -23734,12 +24299,20 @@
       <w:r>
         <w:t xml:space="preserve">lase base que define la interfaz común para permisos atómicos y compuestos. Contiene el método </w:t>
       </w:r>
+      <w:proofErr w:type="spellStart"/>
       <w:proofErr w:type="gramStart"/>
       <w:r>
         <w:rPr>
           <w:rStyle w:val="CdigoHTML"/>
         </w:rPr>
-        <w:t>ContienePermiso(</w:t>
+        <w:t>ContienePermiso</w:t>
+      </w:r>
+      <w:proofErr w:type="spellEnd"/>
+      <w:r>
+        <w:rPr>
+          <w:rStyle w:val="CdigoHTML"/>
+        </w:rPr>
+        <w:t>(</w:t>
       </w:r>
       <w:proofErr w:type="gramEnd"/>
       <w:r>
@@ -23773,7 +24346,23 @@
         <w:t>H</w:t>
       </w:r>
       <w:r>
-        <w:t>oja del árbol. Representa un permiso funcional específico del sistema (ej: "Gestion Usuarios", "Gestion Productos"). No puede tener hijos. Sus instancias están precargadas en la base de datos y no pueden ser creadas desde la interfaz.</w:t>
+        <w:t>oja del árbol. Representa un permiso funcional específico del sistema (ej: "</w:t>
+      </w:r>
+      <w:proofErr w:type="spellStart"/>
+      <w:r>
+        <w:t>Gestion</w:t>
+      </w:r>
+      <w:proofErr w:type="spellEnd"/>
+      <w:r>
+        <w:t xml:space="preserve"> Usuarios", "</w:t>
+      </w:r>
+      <w:proofErr w:type="spellStart"/>
+      <w:r>
+        <w:t>Gestion</w:t>
+      </w:r>
+      <w:proofErr w:type="spellEnd"/>
+      <w:r>
+        <w:t xml:space="preserve"> Productos"). No puede tener hijos. Sus instancias están precargadas en la base de datos y no pueden ser creadas desde la interfaz.</w:t>
       </w:r>
     </w:p>
     <w:p>
@@ -23798,19 +24387,37 @@
         <w:t>N</w:t>
       </w:r>
       <w:r>
-        <w:t xml:space="preserve">odo interno del árbol. Representa un rol que puede contener tanto permisos atómicos como otros roles. Tiene una lista de PermisosIncluidos y los métodos </w:t>
-      </w:r>
+        <w:t xml:space="preserve">odo interno del árbol. Representa un rol que puede contener tanto permisos atómicos como otros roles. Tiene una lista de </w:t>
+      </w:r>
+      <w:proofErr w:type="spellStart"/>
+      <w:r>
+        <w:t>PermisosIncluidos</w:t>
+      </w:r>
+      <w:proofErr w:type="spellEnd"/>
+      <w:r>
+        <w:t xml:space="preserve"> y los métodos </w:t>
+      </w:r>
+      <w:proofErr w:type="spellStart"/>
       <w:proofErr w:type="gramStart"/>
       <w:r>
-        <w:t>AgregarPermiso(</w:t>
+        <w:t>AgregarPermiso</w:t>
+      </w:r>
+      <w:proofErr w:type="spellEnd"/>
+      <w:r>
+        <w:t>(</w:t>
       </w:r>
       <w:proofErr w:type="gramEnd"/>
       <w:r>
         <w:t xml:space="preserve">) y </w:t>
       </w:r>
+      <w:proofErr w:type="spellStart"/>
       <w:proofErr w:type="gramStart"/>
       <w:r>
-        <w:t>QuitarPermiso(</w:t>
+        <w:t>QuitarPermiso</w:t>
+      </w:r>
+      <w:proofErr w:type="spellEnd"/>
+      <w:r>
+        <w:t>(</w:t>
       </w:r>
       <w:proofErr w:type="gramEnd"/>
       <w:r>
@@ -24152,6 +24759,7 @@
         </w:rPr>
         <w:t xml:space="preserve"> </w:t>
       </w:r>
+      <w:proofErr w:type="spellStart"/>
       <w:r>
         <w:rPr>
           <w:rFonts w:ascii="Times New Roman" w:hAnsi="Times New Roman" w:cs="Times New Roman"/>
@@ -24159,6 +24767,7 @@
         </w:rPr>
         <w:t>river</w:t>
       </w:r>
+      <w:proofErr w:type="spellEnd"/>
     </w:p>
     <w:p>
       <w:pPr>
@@ -24200,6 +24809,7 @@
         </w:rPr>
         <w:t xml:space="preserve"> contraseña: </w:t>
       </w:r>
+      <w:proofErr w:type="spellStart"/>
       <w:r>
         <w:rPr>
           <w:rFonts w:ascii="Times New Roman" w:hAnsi="Times New Roman" w:cs="Times New Roman"/>
@@ -24207,6 +24817,7 @@
         </w:rPr>
         <w:t>rojoave</w:t>
       </w:r>
+      <w:proofErr w:type="spellEnd"/>
     </w:p>
     <w:p>
       <w:pPr>
@@ -24756,14 +25367,11 @@
     </w:p>
     <w:p>
       <w:r>
-        <w:rPr>
-          <w:noProof/>
-        </w:rPr>
         <w:drawing>
-          <wp:inline distT="0" distB="0" distL="0" distR="0" wp14:anchorId="3F518287" wp14:editId="7D20C78F">
-            <wp:extent cx="6263640" cy="2933687"/>
-            <wp:effectExtent l="0" t="0" r="3810" b="635"/>
-            <wp:docPr id="1871050" name="Imagen 1"/>
+          <wp:inline distT="0" distB="0" distL="0" distR="0" wp14:anchorId="306330B2" wp14:editId="21381ACA">
+            <wp:extent cx="5400040" cy="2552700"/>
+            <wp:effectExtent l="0" t="0" r="0" b="0"/>
+            <wp:docPr id="1275346248" name="Imagen 1"/>
             <wp:cNvGraphicFramePr>
               <a:graphicFrameLocks xmlns:a="http://schemas.openxmlformats.org/drawingml/2006/main" noChangeAspect="1"/>
             </wp:cNvGraphicFramePr>
@@ -24771,7 +25379,7 @@
               <a:graphicData uri="http://schemas.openxmlformats.org/drawingml/2006/picture">
                 <pic:pic xmlns:pic="http://schemas.openxmlformats.org/drawingml/2006/picture">
                   <pic:nvPicPr>
-                    <pic:cNvPr id="1871050" name=""/>
+                    <pic:cNvPr id="1275346248" name=""/>
                     <pic:cNvPicPr/>
                   </pic:nvPicPr>
                   <pic:blipFill>
@@ -24783,7 +25391,7 @@
                   <pic:spPr>
                     <a:xfrm>
                       <a:off x="0" y="0"/>
-                      <a:ext cx="6272987" cy="2938065"/>
+                      <a:ext cx="5400040" cy="2552700"/>
                     </a:xfrm>
                     <a:prstGeom prst="rect">
                       <a:avLst/>
@@ -24797,6 +25405,45 @@
       </w:r>
     </w:p>
     <w:p>
+      <w:r>
+        <w:drawing>
+          <wp:inline distT="0" distB="0" distL="0" distR="0" wp14:anchorId="67F6CEB9" wp14:editId="7987C52E">
+            <wp:extent cx="5400040" cy="2538095"/>
+            <wp:effectExtent l="0" t="0" r="0" b="0"/>
+            <wp:docPr id="1898714057" name="Imagen 1"/>
+            <wp:cNvGraphicFramePr>
+              <a:graphicFrameLocks xmlns:a="http://schemas.openxmlformats.org/drawingml/2006/main" noChangeAspect="1"/>
+            </wp:cNvGraphicFramePr>
+            <a:graphic xmlns:a="http://schemas.openxmlformats.org/drawingml/2006/main">
+              <a:graphicData uri="http://schemas.openxmlformats.org/drawingml/2006/picture">
+                <pic:pic xmlns:pic="http://schemas.openxmlformats.org/drawingml/2006/picture">
+                  <pic:nvPicPr>
+                    <pic:cNvPr id="1898714057" name=""/>
+                    <pic:cNvPicPr/>
+                  </pic:nvPicPr>
+                  <pic:blipFill>
+                    <a:blip r:embed="rId66"/>
+                    <a:stretch>
+                      <a:fillRect/>
+                    </a:stretch>
+                  </pic:blipFill>
+                  <pic:spPr>
+                    <a:xfrm>
+                      <a:off x="0" y="0"/>
+                      <a:ext cx="5400040" cy="2538095"/>
+                    </a:xfrm>
+                    <a:prstGeom prst="rect">
+                      <a:avLst/>
+                    </a:prstGeom>
+                  </pic:spPr>
+                </pic:pic>
+              </a:graphicData>
+            </a:graphic>
+          </wp:inline>
+        </w:drawing>
+      </w:r>
+    </w:p>
+    <w:p>
       <w:pPr>
         <w:pStyle w:val="Ttulo1"/>
         <w:rPr>
@@ -24855,7 +25502,14 @@
         <w:rPr>
           <w:rFonts w:ascii="Times New Roman" w:eastAsia="Times New Roman" w:hAnsi="Times New Roman" w:cs="Times New Roman"/>
         </w:rPr>
-        <w:t>Utilizando el patrón Observer, cada componente visual que contenga leyendas o títulos se suscribirá a los cambios de idioma garantizando que, al realizar una modificación, todas las interfaces se actualicen automáticamente sin necesidad de reiniciar la aplicación o recargar formularios. Esto mejora significativamente la usabilidad y accesibilidad del sistema, especialmente en entornos donde interactúan usuarios con diferentes lenguas.</w:t>
+        <w:t xml:space="preserve">Utilizando el patrón Observer, cada componente visual que contenga leyendas o títulos se suscribirá a los cambios de idioma garantizando que, al realizar una modificación, </w:t>
+      </w:r>
+      <w:r>
+        <w:rPr>
+          <w:rFonts w:ascii="Times New Roman" w:eastAsia="Times New Roman" w:hAnsi="Times New Roman" w:cs="Times New Roman"/>
+        </w:rPr>
+        <w:lastRenderedPageBreak/>
+        <w:t>todas las interfaces se actualicen automáticamente sin necesidad de reiniciar la aplicación o recargar formularios. Esto mejora significativamente la usabilidad y accesibilidad del sistema, especialmente en entornos donde interactúan usuarios con diferentes lenguas.</w:t>
       </w:r>
     </w:p>
     <w:p>
@@ -24887,7 +25541,6 @@
           <w:sz w:val="30"/>
           <w:szCs w:val="30"/>
         </w:rPr>
-        <w:lastRenderedPageBreak/>
         <w:t xml:space="preserve">10.2 </w:t>
       </w:r>
       <w:r>
@@ -24937,7 +25590,7 @@
                     </pic:cNvPicPr>
                   </pic:nvPicPr>
                   <pic:blipFill>
-                    <a:blip r:embed="rId66">
+                    <a:blip r:embed="rId67">
                       <a:extLst>
                         <a:ext uri="{28A0092B-C50C-407E-A947-70E740481C1C}">
                           <a14:useLocalDpi xmlns:a14="http://schemas.microsoft.com/office/drawing/2010/main" val="0"/>
@@ -24985,6 +25638,7 @@
           <w:sz w:val="30"/>
           <w:szCs w:val="30"/>
         </w:rPr>
+        <w:lastRenderedPageBreak/>
         <w:t xml:space="preserve">10.3 </w:t>
       </w:r>
       <w:r>
@@ -25037,7 +25691,7 @@
                     </pic:cNvPicPr>
                   </pic:nvPicPr>
                   <pic:blipFill>
-                    <a:blip r:embed="rId67">
+                    <a:blip r:embed="rId68">
                       <a:extLst>
                         <a:ext uri="{28A0092B-C50C-407E-A947-70E740481C1C}">
                           <a14:useLocalDpi xmlns:a14="http://schemas.microsoft.com/office/drawing/2010/main" val="0"/>
@@ -25085,7 +25739,6 @@
           <w:sz w:val="30"/>
           <w:szCs w:val="30"/>
         </w:rPr>
-        <w:lastRenderedPageBreak/>
         <w:t>10.</w:t>
       </w:r>
       <w:r>
@@ -25187,7 +25840,7 @@
                     </pic:cNvPicPr>
                   </pic:nvPicPr>
                   <pic:blipFill>
-                    <a:blip r:embed="rId68">
+                    <a:blip r:embed="rId69">
                       <a:extLst>
                         <a:ext uri="{28A0092B-C50C-407E-A947-70E740481C1C}">
                           <a14:useLocalDpi xmlns:a14="http://schemas.microsoft.com/office/drawing/2010/main" val="0"/>
@@ -25234,7 +25887,7 @@
         </w:trPr>
         <w:tc>
           <w:tcPr>
-            <w:tcW w:w="8500" w:type="dxa"/>
+            <w:tcW w:w="8505" w:type="dxa"/>
             <w:tcBorders>
               <w:top w:val="single" w:sz="8" w:space="0" w:color="000000"/>
               <w:left w:val="single" w:sz="4" w:space="0" w:color="000000"/>
@@ -25279,7 +25932,7 @@
         </w:trPr>
         <w:tc>
           <w:tcPr>
-            <w:tcW w:w="8500" w:type="dxa"/>
+            <w:tcW w:w="8505" w:type="dxa"/>
             <w:tcBorders>
               <w:top w:val="single" w:sz="4" w:space="0" w:color="000000"/>
               <w:left w:val="single" w:sz="4" w:space="0" w:color="000000"/>
@@ -25324,7 +25977,7 @@
         </w:trPr>
         <w:tc>
           <w:tcPr>
-            <w:tcW w:w="8500" w:type="dxa"/>
+            <w:tcW w:w="8505" w:type="dxa"/>
             <w:tcBorders>
               <w:top w:val="single" w:sz="8" w:space="0" w:color="000000"/>
               <w:left w:val="single" w:sz="4" w:space="0" w:color="000000"/>
@@ -25352,6 +26005,7 @@
                 <w:b/>
                 <w:bCs/>
               </w:rPr>
+              <w:lastRenderedPageBreak/>
               <w:t>DESCRIPCIÓN:</w:t>
             </w:r>
             <w:r>
@@ -25369,7 +26023,7 @@
         </w:trPr>
         <w:tc>
           <w:tcPr>
-            <w:tcW w:w="8500" w:type="dxa"/>
+            <w:tcW w:w="8505" w:type="dxa"/>
             <w:tcBorders>
               <w:top w:val="single" w:sz="8" w:space="0" w:color="000000"/>
               <w:left w:val="single" w:sz="4" w:space="0" w:color="000000"/>
@@ -25414,7 +26068,7 @@
         </w:trPr>
         <w:tc>
           <w:tcPr>
-            <w:tcW w:w="8500" w:type="dxa"/>
+            <w:tcW w:w="8505" w:type="dxa"/>
             <w:tcBorders>
               <w:top w:val="single" w:sz="8" w:space="0" w:color="000000"/>
               <w:left w:val="single" w:sz="4" w:space="0" w:color="000000"/>
@@ -25459,7 +26113,7 @@
         </w:trPr>
         <w:tc>
           <w:tcPr>
-            <w:tcW w:w="8500" w:type="dxa"/>
+            <w:tcW w:w="8505" w:type="dxa"/>
             <w:tcBorders>
               <w:top w:val="single" w:sz="4" w:space="0" w:color="000000"/>
               <w:left w:val="single" w:sz="4" w:space="0" w:color="000000"/>
@@ -25494,39 +26148,48 @@
           </w:p>
           <w:p>
             <w:pPr>
-              <w:numPr>
-                <w:ilvl w:val="0"/>
-                <w:numId w:val="30"/>
-              </w:numPr>
               <w:spacing w:line="240" w:lineRule="auto"/>
               <w:rPr>
                 <w:rFonts w:asciiTheme="majorBidi" w:hAnsiTheme="majorBidi" w:cstheme="majorBidi"/>
-                <w:lang w:val="es-ES"/>
               </w:rPr>
             </w:pPr>
             <w:r>
               <w:rPr>
                 <w:rFonts w:asciiTheme="majorBidi" w:hAnsiTheme="majorBidi" w:cstheme="majorBidi"/>
-                <w:lang w:val="es-ES"/>
+                <w:b/>
+                <w:bCs/>
+              </w:rPr>
+              <w:t xml:space="preserve">. </w:t>
+            </w:r>
+            <w:r>
+              <w:rPr>
+                <w:rFonts w:asciiTheme="majorBidi" w:hAnsiTheme="majorBidi" w:cstheme="majorBidi"/>
               </w:rPr>
               <w:t xml:space="preserve">El usuario debió haberse logueado con éxito previamente en el sistema. </w:t>
             </w:r>
-          </w:p>
-          <w:p>
-            <w:pPr>
-              <w:numPr>
-                <w:ilvl w:val="0"/>
-                <w:numId w:val="30"/>
-              </w:numPr>
-              <w:spacing w:line="240" w:lineRule="auto"/>
+            <w:r>
               <w:rPr>
                 <w:rFonts w:asciiTheme="majorBidi" w:hAnsiTheme="majorBidi" w:cstheme="majorBidi"/>
               </w:rPr>
-            </w:pPr>
+              <w:br/>
+            </w:r>
             <w:r>
               <w:rPr>
                 <w:rFonts w:asciiTheme="majorBidi" w:hAnsiTheme="majorBidi" w:cstheme="majorBidi"/>
-                <w:lang w:val="es-ES"/>
+                <w:b/>
+                <w:bCs/>
+              </w:rPr>
+              <w:t>.</w:t>
+            </w:r>
+            <w:r>
+              <w:rPr>
+                <w:rFonts w:asciiTheme="majorBidi" w:hAnsiTheme="majorBidi" w:cstheme="majorBidi"/>
+              </w:rPr>
+              <w:t xml:space="preserve"> </w:t>
+            </w:r>
+            <w:r>
+              <w:rPr>
+                <w:rFonts w:asciiTheme="majorBidi" w:hAnsiTheme="majorBidi" w:cstheme="majorBidi"/>
               </w:rPr>
               <w:t>Debe existir al menos un idioma disponible además del idioma actual.</w:t>
             </w:r>
@@ -25539,7 +26202,7 @@
         </w:trPr>
         <w:tc>
           <w:tcPr>
-            <w:tcW w:w="8500" w:type="dxa"/>
+            <w:tcW w:w="8505" w:type="dxa"/>
             <w:tcBorders>
               <w:top w:val="single" w:sz="8" w:space="0" w:color="000000"/>
               <w:left w:val="single" w:sz="4" w:space="0" w:color="000000"/>
@@ -25577,13 +26240,6 @@
               </w:rPr>
               <w:t>PUNTOS DE EXTENSIÓN:</w:t>
             </w:r>
-            <w:r>
-              <w:rPr>
-                <w:rFonts w:asciiTheme="majorBidi" w:hAnsiTheme="majorBidi" w:cstheme="majorBidi"/>
-                <w:lang w:val="es-ES"/>
-              </w:rPr>
-              <w:t xml:space="preserve"> —</w:t>
-            </w:r>
           </w:p>
         </w:tc>
       </w:tr>
@@ -25593,7 +26249,7 @@
         </w:trPr>
         <w:tc>
           <w:tcPr>
-            <w:tcW w:w="8500" w:type="dxa"/>
+            <w:tcW w:w="8505" w:type="dxa"/>
             <w:tcBorders>
               <w:top w:val="single" w:sz="8" w:space="0" w:color="000000"/>
               <w:left w:val="single" w:sz="4" w:space="0" w:color="000000"/>
@@ -25629,7 +26285,7 @@
                 <w:rFonts w:asciiTheme="majorBidi" w:hAnsiTheme="majorBidi" w:cstheme="majorBidi"/>
                 <w:lang w:val="es-ES"/>
               </w:rPr>
-              <w:t xml:space="preserve"> —</w:t>
+              <w:t xml:space="preserve"> </w:t>
             </w:r>
           </w:p>
         </w:tc>
@@ -25640,7 +26296,7 @@
         </w:trPr>
         <w:tc>
           <w:tcPr>
-            <w:tcW w:w="8500" w:type="dxa"/>
+            <w:tcW w:w="8505" w:type="dxa"/>
             <w:tcBorders>
               <w:top w:val="single" w:sz="8" w:space="0" w:color="000000"/>
               <w:left w:val="single" w:sz="4" w:space="0" w:color="000000"/>
@@ -25677,16 +26333,20 @@
             <w:pPr>
               <w:numPr>
                 <w:ilvl w:val="0"/>
-                <w:numId w:val="31"/>
+                <w:numId w:val="35"/>
               </w:numPr>
-              <w:spacing w:line="240" w:lineRule="auto"/>
+              <w:spacing w:after="0" w:line="240" w:lineRule="auto"/>
               <w:rPr>
                 <w:rFonts w:asciiTheme="majorBidi" w:hAnsiTheme="majorBidi" w:cstheme="majorBidi"/>
+                <w:b/>
+                <w:bCs/>
               </w:rPr>
             </w:pPr>
             <w:r>
               <w:rPr>
                 <w:rFonts w:asciiTheme="majorBidi" w:hAnsiTheme="majorBidi" w:cstheme="majorBidi"/>
+                <w:b/>
+                <w:bCs/>
               </w:rPr>
               <w:t>El usuario visualiza el combo de idiomas disponibles en el menú principal.</w:t>
             </w:r>
@@ -25695,16 +26355,20 @@
             <w:pPr>
               <w:numPr>
                 <w:ilvl w:val="0"/>
-                <w:numId w:val="31"/>
+                <w:numId w:val="35"/>
               </w:numPr>
-              <w:spacing w:line="240" w:lineRule="auto"/>
+              <w:spacing w:after="0" w:line="240" w:lineRule="auto"/>
               <w:rPr>
                 <w:rFonts w:asciiTheme="majorBidi" w:hAnsiTheme="majorBidi" w:cstheme="majorBidi"/>
+                <w:b/>
+                <w:bCs/>
               </w:rPr>
             </w:pPr>
             <w:r>
               <w:rPr>
                 <w:rFonts w:asciiTheme="majorBidi" w:hAnsiTheme="majorBidi" w:cstheme="majorBidi"/>
+                <w:b/>
+                <w:bCs/>
               </w:rPr>
               <w:t>El sistema muestra los idiomas habilitados en el sistema.</w:t>
             </w:r>
@@ -25713,16 +26377,20 @@
             <w:pPr>
               <w:numPr>
                 <w:ilvl w:val="0"/>
-                <w:numId w:val="31"/>
+                <w:numId w:val="35"/>
               </w:numPr>
-              <w:spacing w:line="240" w:lineRule="auto"/>
+              <w:spacing w:after="0" w:line="240" w:lineRule="auto"/>
               <w:rPr>
                 <w:rFonts w:asciiTheme="majorBidi" w:hAnsiTheme="majorBidi" w:cstheme="majorBidi"/>
+                <w:b/>
+                <w:bCs/>
               </w:rPr>
             </w:pPr>
             <w:r>
               <w:rPr>
                 <w:rFonts w:asciiTheme="majorBidi" w:hAnsiTheme="majorBidi" w:cstheme="majorBidi"/>
+                <w:b/>
+                <w:bCs/>
               </w:rPr>
               <w:t>El usuario selecciona un idioma del combo.</w:t>
             </w:r>
@@ -25731,16 +26399,20 @@
             <w:pPr>
               <w:numPr>
                 <w:ilvl w:val="0"/>
-                <w:numId w:val="31"/>
+                <w:numId w:val="35"/>
               </w:numPr>
-              <w:spacing w:line="240" w:lineRule="auto"/>
+              <w:spacing w:after="0" w:line="240" w:lineRule="auto"/>
               <w:rPr>
                 <w:rFonts w:asciiTheme="majorBidi" w:hAnsiTheme="majorBidi" w:cstheme="majorBidi"/>
+                <w:b/>
+                <w:bCs/>
               </w:rPr>
             </w:pPr>
             <w:r>
               <w:rPr>
                 <w:rFonts w:asciiTheme="majorBidi" w:hAnsiTheme="majorBidi" w:cstheme="majorBidi"/>
+                <w:b/>
+                <w:bCs/>
               </w:rPr>
               <w:t>El sistema carga las traducciones correspondientes al idioma seleccionado desde la base de datos.</w:t>
             </w:r>
@@ -25749,16 +26421,20 @@
             <w:pPr>
               <w:numPr>
                 <w:ilvl w:val="0"/>
-                <w:numId w:val="31"/>
+                <w:numId w:val="35"/>
               </w:numPr>
-              <w:spacing w:line="240" w:lineRule="auto"/>
+              <w:spacing w:after="0" w:line="240" w:lineRule="auto"/>
               <w:rPr>
                 <w:rFonts w:asciiTheme="majorBidi" w:hAnsiTheme="majorBidi" w:cstheme="majorBidi"/>
+                <w:b/>
+                <w:bCs/>
               </w:rPr>
             </w:pPr>
             <w:r>
               <w:rPr>
                 <w:rFonts w:asciiTheme="majorBidi" w:hAnsiTheme="majorBidi" w:cstheme="majorBidi"/>
+                <w:b/>
+                <w:bCs/>
               </w:rPr>
               <w:t>El sistema actualiza en tiempo real el texto de todos los formularios abiertos al idioma seleccionado.</w:t>
             </w:r>
@@ -25767,18 +26443,21 @@
             <w:pPr>
               <w:numPr>
                 <w:ilvl w:val="0"/>
-                <w:numId w:val="31"/>
+                <w:numId w:val="35"/>
               </w:numPr>
-              <w:spacing w:line="240" w:lineRule="auto"/>
+              <w:spacing w:after="0" w:line="240" w:lineRule="auto"/>
               <w:rPr>
                 <w:rFonts w:asciiTheme="majorBidi" w:hAnsiTheme="majorBidi" w:cstheme="majorBidi"/>
+                <w:b/>
+                <w:bCs/>
               </w:rPr>
             </w:pPr>
             <w:r>
               <w:rPr>
                 <w:rFonts w:asciiTheme="majorBidi" w:hAnsiTheme="majorBidi" w:cstheme="majorBidi"/>
-              </w:rPr>
-              <w:lastRenderedPageBreak/>
+                <w:b/>
+                <w:bCs/>
+              </w:rPr>
               <w:t>El sistema guarda la preferencia de idioma del usuario en la base de datos.</w:t>
             </w:r>
           </w:p>
@@ -25786,9 +26465,9 @@
             <w:pPr>
               <w:numPr>
                 <w:ilvl w:val="0"/>
-                <w:numId w:val="31"/>
+                <w:numId w:val="35"/>
               </w:numPr>
-              <w:spacing w:line="240" w:lineRule="auto"/>
+              <w:spacing w:after="0" w:line="240" w:lineRule="auto"/>
               <w:rPr>
                 <w:rFonts w:asciiTheme="majorBidi" w:hAnsiTheme="majorBidi" w:cstheme="majorBidi"/>
               </w:rPr>
@@ -25796,6 +26475,8 @@
             <w:r>
               <w:rPr>
                 <w:rFonts w:asciiTheme="majorBidi" w:hAnsiTheme="majorBidi" w:cstheme="majorBidi"/>
+                <w:b/>
+                <w:bCs/>
               </w:rPr>
               <w:t>El sistema muestra la interfaz completamente traducida al idioma seleccionado.</w:t>
             </w:r>
@@ -25808,7 +26489,7 @@
         </w:trPr>
         <w:tc>
           <w:tcPr>
-            <w:tcW w:w="8500" w:type="dxa"/>
+            <w:tcW w:w="8505" w:type="dxa"/>
             <w:tcBorders>
               <w:top w:val="single" w:sz="8" w:space="0" w:color="000000"/>
               <w:left w:val="single" w:sz="4" w:space="0" w:color="000000"/>
@@ -25861,12 +26542,101 @@
               </w:rPr>
               <w:t xml:space="preserve">FA1 — Traducción incompleta </w:t>
             </w:r>
+            <w:r>
+              <w:rPr>
+                <w:rFonts w:asciiTheme="majorBidi" w:hAnsiTheme="majorBidi" w:cstheme="majorBidi"/>
+                <w:b/>
+                <w:bCs/>
+                <w:lang w:val="es-ES"/>
+              </w:rPr>
+              <w:br/>
+            </w:r>
+            <w:r>
+              <w:rPr>
+                <w:rFonts w:asciiTheme="majorBidi" w:hAnsiTheme="majorBidi" w:cstheme="majorBidi"/>
+                <w:b/>
+                <w:bCs/>
+                <w:lang w:val="es-ES"/>
+              </w:rPr>
+              <w:t>4.1</w:t>
+            </w:r>
+            <w:r>
+              <w:rPr>
+                <w:rFonts w:asciiTheme="majorBidi" w:hAnsiTheme="majorBidi" w:cstheme="majorBidi"/>
+                <w:lang w:val="es-ES"/>
+              </w:rPr>
+              <w:t xml:space="preserve"> El sistema no encuentra traducción para algún control en el idioma seleccionado.</w:t>
+            </w:r>
+            <w:r>
+              <w:rPr>
+                <w:rFonts w:asciiTheme="majorBidi" w:hAnsiTheme="majorBidi" w:cstheme="majorBidi"/>
+                <w:lang w:val="es-ES"/>
+              </w:rPr>
+              <w:br/>
+            </w:r>
+            <w:r>
+              <w:rPr>
+                <w:rFonts w:asciiTheme="majorBidi" w:hAnsiTheme="majorBidi" w:cstheme="majorBidi"/>
+                <w:b/>
+                <w:bCs/>
+                <w:lang w:val="es-ES"/>
+              </w:rPr>
+              <w:t>4.2</w:t>
+            </w:r>
+            <w:r>
+              <w:rPr>
+                <w:rFonts w:asciiTheme="majorBidi" w:hAnsiTheme="majorBidi" w:cstheme="majorBidi"/>
+                <w:lang w:val="es-ES"/>
+              </w:rPr>
+              <w:t xml:space="preserve"> El sistema muestra el nombre del control entre corchetes como </w:t>
+            </w:r>
+            <w:proofErr w:type="spellStart"/>
+            <w:r>
+              <w:rPr>
+                <w:rFonts w:asciiTheme="majorBidi" w:hAnsiTheme="majorBidi" w:cstheme="majorBidi"/>
+                <w:lang w:val="es-ES"/>
+              </w:rPr>
+              <w:t>fallback</w:t>
+            </w:r>
+            <w:proofErr w:type="spellEnd"/>
+            <w:r>
+              <w:rPr>
+                <w:rFonts w:asciiTheme="majorBidi" w:hAnsiTheme="majorBidi" w:cstheme="majorBidi"/>
+                <w:lang w:val="es-ES"/>
+              </w:rPr>
+              <w:t xml:space="preserve">. </w:t>
+            </w:r>
+            <w:r>
+              <w:rPr>
+                <w:rFonts w:asciiTheme="majorBidi" w:hAnsiTheme="majorBidi" w:cstheme="majorBidi"/>
+                <w:lang w:val="es-ES"/>
+              </w:rPr>
+              <w:br/>
+            </w:r>
+            <w:r>
+              <w:rPr>
+                <w:rFonts w:asciiTheme="majorBidi" w:hAnsiTheme="majorBidi" w:cstheme="majorBidi"/>
+                <w:b/>
+                <w:bCs/>
+                <w:lang w:val="es-ES"/>
+              </w:rPr>
+              <w:t>4.3</w:t>
+            </w:r>
+            <w:r>
+              <w:rPr>
+                <w:rFonts w:asciiTheme="majorBidi" w:hAnsiTheme="majorBidi" w:cstheme="majorBidi"/>
+                <w:lang w:val="es-ES"/>
+              </w:rPr>
+              <w:t xml:space="preserve"> Continúa en el punto 5 del Escenario Principal.</w:t>
+            </w:r>
           </w:p>
           <w:p>
             <w:pPr>
               <w:spacing w:line="240" w:lineRule="auto"/>
               <w:rPr>
                 <w:rFonts w:asciiTheme="majorBidi" w:hAnsiTheme="majorBidi" w:cstheme="majorBidi"/>
+                <w:b/>
+                <w:bCs/>
                 <w:lang w:val="es-ES"/>
               </w:rPr>
             </w:pPr>
@@ -25877,21 +26647,7 @@
                 <w:bCs/>
                 <w:lang w:val="es-ES"/>
               </w:rPr>
-              <w:t>4.1</w:t>
-            </w:r>
-            <w:r>
-              <w:rPr>
-                <w:rFonts w:asciiTheme="majorBidi" w:hAnsiTheme="majorBidi" w:cstheme="majorBidi"/>
-                <w:lang w:val="es-ES"/>
-              </w:rPr>
-              <w:t xml:space="preserve"> El sistema no encuentra traducción para algún control en el idioma seleccionado.</w:t>
-            </w:r>
-            <w:r>
-              <w:rPr>
-                <w:rFonts w:asciiTheme="majorBidi" w:hAnsiTheme="majorBidi" w:cstheme="majorBidi"/>
-                <w:lang w:val="es-ES"/>
-              </w:rPr>
-              <w:br/>
+              <w:t xml:space="preserve">FA2 — Idioma sin traducciones completas </w:t>
             </w:r>
             <w:r>
               <w:rPr>
@@ -25900,20 +26656,6 @@
                 <w:bCs/>
                 <w:lang w:val="es-ES"/>
               </w:rPr>
-              <w:t>4.2</w:t>
-            </w:r>
-            <w:r>
-              <w:rPr>
-                <w:rFonts w:asciiTheme="majorBidi" w:hAnsiTheme="majorBidi" w:cstheme="majorBidi"/>
-                <w:lang w:val="es-ES"/>
-              </w:rPr>
-              <w:t xml:space="preserve"> El sistema muestra el nombre del control entre corchetes como fallback. </w:t>
-            </w:r>
-            <w:r>
-              <w:rPr>
-                <w:rFonts w:asciiTheme="majorBidi" w:hAnsiTheme="majorBidi" w:cstheme="majorBidi"/>
-                <w:lang w:val="es-ES"/>
-              </w:rPr>
               <w:br/>
             </w:r>
             <w:r>
@@ -25923,58 +26665,30 @@
                 <w:bCs/>
                 <w:lang w:val="es-ES"/>
               </w:rPr>
-              <w:t>4.3</w:t>
+              <w:t>4.1</w:t>
             </w:r>
             <w:r>
               <w:rPr>
                 <w:rFonts w:asciiTheme="majorBidi" w:hAnsiTheme="majorBidi" w:cstheme="majorBidi"/>
                 <w:lang w:val="es-ES"/>
               </w:rPr>
-              <w:t xml:space="preserve"> Continúa en el punto 5 del Escenario Principal.</w:t>
-            </w:r>
-          </w:p>
-          <w:p>
-            <w:pPr>
-              <w:spacing w:line="240" w:lineRule="auto"/>
-              <w:rPr>
-                <w:rFonts w:asciiTheme="majorBidi" w:hAnsiTheme="majorBidi" w:cstheme="majorBidi"/>
-                <w:b/>
-                <w:bCs/>
-                <w:lang w:val="es-ES"/>
-              </w:rPr>
-            </w:pPr>
-            <w:r>
-              <w:rPr>
-                <w:rFonts w:asciiTheme="majorBidi" w:hAnsiTheme="majorBidi" w:cstheme="majorBidi"/>
-                <w:b/>
-                <w:bCs/>
-                <w:lang w:val="es-ES"/>
-              </w:rPr>
-              <w:t xml:space="preserve">FA2 — Idioma sin traducciones completas </w:t>
-            </w:r>
-          </w:p>
-          <w:p>
-            <w:pPr>
-              <w:spacing w:line="240" w:lineRule="auto"/>
-              <w:rPr>
-                <w:rFonts w:asciiTheme="majorBidi" w:hAnsiTheme="majorBidi" w:cstheme="majorBidi"/>
-              </w:rPr>
-            </w:pPr>
-            <w:r>
-              <w:rPr>
-                <w:rFonts w:asciiTheme="majorBidi" w:hAnsiTheme="majorBidi" w:cstheme="majorBidi"/>
-                <w:b/>
-                <w:bCs/>
-                <w:lang w:val="es-ES"/>
-              </w:rPr>
-              <w:t>4.1</w:t>
-            </w:r>
+              <w:t xml:space="preserve"> El sistema utiliza el texto en español entre corchetes como </w:t>
+            </w:r>
+            <w:proofErr w:type="spellStart"/>
             <w:r>
               <w:rPr>
                 <w:rFonts w:asciiTheme="majorBidi" w:hAnsiTheme="majorBidi" w:cstheme="majorBidi"/>
                 <w:lang w:val="es-ES"/>
               </w:rPr>
-              <w:t xml:space="preserve"> El sistema utiliza el texto en español entre corchetes como fallback según el COALESCE definido en la base de datos.</w:t>
+              <w:t>fallback</w:t>
+            </w:r>
+            <w:proofErr w:type="spellEnd"/>
+            <w:r>
+              <w:rPr>
+                <w:rFonts w:asciiTheme="majorBidi" w:hAnsiTheme="majorBidi" w:cstheme="majorBidi"/>
+                <w:lang w:val="es-ES"/>
+              </w:rPr>
+              <w:t xml:space="preserve"> según el COALESCE definido en la base de datos.</w:t>
             </w:r>
             <w:r>
               <w:rPr>
@@ -26008,7 +26722,7 @@
         </w:trPr>
         <w:tc>
           <w:tcPr>
-            <w:tcW w:w="8500" w:type="dxa"/>
+            <w:tcW w:w="8505" w:type="dxa"/>
             <w:tcBorders>
               <w:top w:val="single" w:sz="8" w:space="0" w:color="000000"/>
               <w:left w:val="single" w:sz="4" w:space="0" w:color="000000"/>
@@ -26049,11 +26763,6 @@
       </w:tr>
     </w:tbl>
     <w:p/>
-    <w:p>
-      <w:r>
-        <w:br w:type="page"/>
-      </w:r>
-    </w:p>
     <w:p>
       <w:pPr>
         <w:pStyle w:val="Ttulo3"/>
@@ -26128,7 +26837,7 @@
                     </pic:cNvPicPr>
                   </pic:nvPicPr>
                   <pic:blipFill>
-                    <a:blip r:embed="rId69">
+                    <a:blip r:embed="rId70">
                       <a:extLst>
                         <a:ext uri="{28A0092B-C50C-407E-A947-70E740481C1C}">
                           <a14:useLocalDpi xmlns:a14="http://schemas.microsoft.com/office/drawing/2010/main" val="0"/>
@@ -26265,7 +26974,7 @@
                     <pic:cNvPicPr/>
                   </pic:nvPicPr>
                   <pic:blipFill rotWithShape="1">
-                    <a:blip r:embed="rId70"/>
+                    <a:blip r:embed="rId71"/>
                     <a:srcRect l="1976" t="4755" r="3481" b="3463"/>
                     <a:stretch>
                       <a:fillRect/>
@@ -26329,7 +27038,7 @@
                     <pic:cNvPicPr/>
                   </pic:nvPicPr>
                   <pic:blipFill rotWithShape="1">
-                    <a:blip r:embed="rId71"/>
+                    <a:blip r:embed="rId72"/>
                     <a:srcRect l="565" t="1820" r="1223" b="1993"/>
                     <a:stretch>
                       <a:fillRect/>
@@ -26367,8 +27076,8 @@
     </w:p>
     <w:p/>
     <w:sectPr>
-      <w:headerReference w:type="default" r:id="rId72"/>
-      <w:footerReference w:type="default" r:id="rId73"/>
+      <w:headerReference w:type="default" r:id="rId73"/>
+      <w:footerReference w:type="default" r:id="rId74"/>
       <w:pgSz w:w="11906" w:h="16838"/>
       <w:pgMar w:top="1417" w:right="1701" w:bottom="1417" w:left="1701" w:header="708" w:footer="708" w:gutter="0"/>
       <w:pgNumType w:start="1"/>
@@ -29274,9 +29983,9 @@
     </w:lvl>
   </w:abstractNum>
   <w:abstractNum w:abstractNumId="17" w15:restartNumberingAfterBreak="0">
-    <w:nsid w:val="3EA04283"/>
+    <w:nsid w:val="3CCE6074"/>
     <w:multiLevelType w:val="multilevel"/>
-    <w:tmpl w:val="C840C568"/>
+    <w:tmpl w:val="2190F670"/>
     <w:lvl w:ilvl="0">
       <w:start w:val="1"/>
       <w:numFmt w:val="decimal"/>
@@ -29364,122 +30073,9 @@
     </w:lvl>
   </w:abstractNum>
   <w:abstractNum w:abstractNumId="18" w15:restartNumberingAfterBreak="0">
-    <w:nsid w:val="44972425"/>
+    <w:nsid w:val="3EA04283"/>
     <w:multiLevelType w:val="multilevel"/>
-    <w:tmpl w:val="A69C4584"/>
-    <w:lvl w:ilvl="0">
-      <w:start w:val="1"/>
-      <w:numFmt w:val="decimal"/>
-      <w:lvlText w:val="%1"/>
-      <w:lvlJc w:val="left"/>
-      <w:pPr>
-        <w:ind w:left="384" w:hanging="384"/>
-      </w:pPr>
-      <w:rPr>
-        <w:rFonts w:hint="default"/>
-      </w:rPr>
-    </w:lvl>
-    <w:lvl w:ilvl="1">
-      <w:start w:val="4"/>
-      <w:numFmt w:val="decimal"/>
-      <w:lvlText w:val="%1.%2"/>
-      <w:lvlJc w:val="left"/>
-      <w:pPr>
-        <w:ind w:left="720" w:hanging="720"/>
-      </w:pPr>
-      <w:rPr>
-        <w:rFonts w:hint="default"/>
-      </w:rPr>
-    </w:lvl>
-    <w:lvl w:ilvl="2">
-      <w:start w:val="1"/>
-      <w:numFmt w:val="decimal"/>
-      <w:lvlText w:val="%1.%2.%3"/>
-      <w:lvlJc w:val="left"/>
-      <w:pPr>
-        <w:ind w:left="720" w:hanging="720"/>
-      </w:pPr>
-      <w:rPr>
-        <w:rFonts w:hint="default"/>
-      </w:rPr>
-    </w:lvl>
-    <w:lvl w:ilvl="3">
-      <w:start w:val="1"/>
-      <w:numFmt w:val="decimal"/>
-      <w:lvlText w:val="%1.%2.%3.%4"/>
-      <w:lvlJc w:val="left"/>
-      <w:pPr>
-        <w:ind w:left="1080" w:hanging="1080"/>
-      </w:pPr>
-      <w:rPr>
-        <w:rFonts w:hint="default"/>
-      </w:rPr>
-    </w:lvl>
-    <w:lvl w:ilvl="4">
-      <w:start w:val="1"/>
-      <w:numFmt w:val="decimal"/>
-      <w:lvlText w:val="%1.%2.%3.%4.%5"/>
-      <w:lvlJc w:val="left"/>
-      <w:pPr>
-        <w:ind w:left="1080" w:hanging="1080"/>
-      </w:pPr>
-      <w:rPr>
-        <w:rFonts w:hint="default"/>
-      </w:rPr>
-    </w:lvl>
-    <w:lvl w:ilvl="5">
-      <w:start w:val="1"/>
-      <w:numFmt w:val="decimal"/>
-      <w:lvlText w:val="%1.%2.%3.%4.%5.%6"/>
-      <w:lvlJc w:val="left"/>
-      <w:pPr>
-        <w:ind w:left="1440" w:hanging="1440"/>
-      </w:pPr>
-      <w:rPr>
-        <w:rFonts w:hint="default"/>
-      </w:rPr>
-    </w:lvl>
-    <w:lvl w:ilvl="6">
-      <w:start w:val="1"/>
-      <w:numFmt w:val="decimal"/>
-      <w:lvlText w:val="%1.%2.%3.%4.%5.%6.%7"/>
-      <w:lvlJc w:val="left"/>
-      <w:pPr>
-        <w:ind w:left="1800" w:hanging="1800"/>
-      </w:pPr>
-      <w:rPr>
-        <w:rFonts w:hint="default"/>
-      </w:rPr>
-    </w:lvl>
-    <w:lvl w:ilvl="7">
-      <w:start w:val="1"/>
-      <w:numFmt w:val="decimal"/>
-      <w:lvlText w:val="%1.%2.%3.%4.%5.%6.%7.%8"/>
-      <w:lvlJc w:val="left"/>
-      <w:pPr>
-        <w:ind w:left="1800" w:hanging="1800"/>
-      </w:pPr>
-      <w:rPr>
-        <w:rFonts w:hint="default"/>
-      </w:rPr>
-    </w:lvl>
-    <w:lvl w:ilvl="8">
-      <w:start w:val="1"/>
-      <w:numFmt w:val="decimal"/>
-      <w:lvlText w:val="%1.%2.%3.%4.%5.%6.%7.%8.%9"/>
-      <w:lvlJc w:val="left"/>
-      <w:pPr>
-        <w:ind w:left="2160" w:hanging="2160"/>
-      </w:pPr>
-      <w:rPr>
-        <w:rFonts w:hint="default"/>
-      </w:rPr>
-    </w:lvl>
-  </w:abstractNum>
-  <w:abstractNum w:abstractNumId="19" w15:restartNumberingAfterBreak="0">
-    <w:nsid w:val="465A2690"/>
-    <w:multiLevelType w:val="multilevel"/>
-    <w:tmpl w:val="2CE4AB62"/>
+    <w:tmpl w:val="C840C568"/>
     <w:lvl w:ilvl="0">
       <w:start w:val="1"/>
       <w:numFmt w:val="decimal"/>
@@ -29566,236 +30162,123 @@
       </w:pPr>
     </w:lvl>
   </w:abstractNum>
-  <w:abstractNum w:abstractNumId="20" w15:restartNumberingAfterBreak="0">
-    <w:nsid w:val="471667BB"/>
+  <w:abstractNum w:abstractNumId="19" w15:restartNumberingAfterBreak="0">
+    <w:nsid w:val="44972425"/>
     <w:multiLevelType w:val="multilevel"/>
-    <w:tmpl w:val="944A6AA8"/>
+    <w:tmpl w:val="A69C4584"/>
     <w:lvl w:ilvl="0">
       <w:start w:val="1"/>
-      <w:numFmt w:val="bullet"/>
-      <w:lvlText w:val="-"/>
+      <w:numFmt w:val="decimal"/>
+      <w:lvlText w:val="%1"/>
       <w:lvlJc w:val="left"/>
       <w:pPr>
-        <w:ind w:left="720" w:hanging="360"/>
+        <w:ind w:left="384" w:hanging="384"/>
       </w:pPr>
       <w:rPr>
-        <w:rFonts w:ascii="Aptos" w:eastAsia="Aptos" w:hAnsi="Aptos" w:cs="Aptos"/>
+        <w:rFonts w:hint="default"/>
       </w:rPr>
     </w:lvl>
     <w:lvl w:ilvl="1">
-      <w:start w:val="1"/>
-      <w:numFmt w:val="bullet"/>
-      <w:lvlText w:val="o"/>
+      <w:start w:val="4"/>
+      <w:numFmt w:val="decimal"/>
+      <w:lvlText w:val="%1.%2"/>
       <w:lvlJc w:val="left"/>
       <w:pPr>
-        <w:ind w:left="1440" w:hanging="360"/>
+        <w:ind w:left="720" w:hanging="720"/>
       </w:pPr>
       <w:rPr>
-        <w:rFonts w:ascii="Courier New" w:eastAsia="Courier New" w:hAnsi="Courier New" w:cs="Courier New"/>
+        <w:rFonts w:hint="default"/>
       </w:rPr>
     </w:lvl>
     <w:lvl w:ilvl="2">
       <w:start w:val="1"/>
-      <w:numFmt w:val="bullet"/>
-      <w:lvlText w:val="▪"/>
+      <w:numFmt w:val="decimal"/>
+      <w:lvlText w:val="%1.%2.%3"/>
       <w:lvlJc w:val="left"/>
       <w:pPr>
-        <w:ind w:left="2160" w:hanging="360"/>
+        <w:ind w:left="720" w:hanging="720"/>
       </w:pPr>
       <w:rPr>
-        <w:rFonts w:ascii="Noto Sans Symbols" w:eastAsia="Noto Sans Symbols" w:hAnsi="Noto Sans Symbols" w:cs="Noto Sans Symbols"/>
+        <w:rFonts w:hint="default"/>
       </w:rPr>
     </w:lvl>
     <w:lvl w:ilvl="3">
       <w:start w:val="1"/>
-      <w:numFmt w:val="bullet"/>
-      <w:lvlText w:val="●"/>
+      <w:numFmt w:val="decimal"/>
+      <w:lvlText w:val="%1.%2.%3.%4"/>
       <w:lvlJc w:val="left"/>
       <w:pPr>
-        <w:ind w:left="2880" w:hanging="360"/>
+        <w:ind w:left="1080" w:hanging="1080"/>
       </w:pPr>
       <w:rPr>
-        <w:rFonts w:ascii="Noto Sans Symbols" w:eastAsia="Noto Sans Symbols" w:hAnsi="Noto Sans Symbols" w:cs="Noto Sans Symbols"/>
+        <w:rFonts w:hint="default"/>
       </w:rPr>
     </w:lvl>
     <w:lvl w:ilvl="4">
       <w:start w:val="1"/>
-      <w:numFmt w:val="bullet"/>
-      <w:lvlText w:val="o"/>
+      <w:numFmt w:val="decimal"/>
+      <w:lvlText w:val="%1.%2.%3.%4.%5"/>
       <w:lvlJc w:val="left"/>
       <w:pPr>
-        <w:ind w:left="3600" w:hanging="360"/>
+        <w:ind w:left="1080" w:hanging="1080"/>
       </w:pPr>
       <w:rPr>
-        <w:rFonts w:ascii="Courier New" w:eastAsia="Courier New" w:hAnsi="Courier New" w:cs="Courier New"/>
+        <w:rFonts w:hint="default"/>
       </w:rPr>
     </w:lvl>
     <w:lvl w:ilvl="5">
       <w:start w:val="1"/>
-      <w:numFmt w:val="bullet"/>
-      <w:lvlText w:val="▪"/>
+      <w:numFmt w:val="decimal"/>
+      <w:lvlText w:val="%1.%2.%3.%4.%5.%6"/>
       <w:lvlJc w:val="left"/>
       <w:pPr>
-        <w:ind w:left="4320" w:hanging="360"/>
+        <w:ind w:left="1440" w:hanging="1440"/>
       </w:pPr>
       <w:rPr>
-        <w:rFonts w:ascii="Noto Sans Symbols" w:eastAsia="Noto Sans Symbols" w:hAnsi="Noto Sans Symbols" w:cs="Noto Sans Symbols"/>
+        <w:rFonts w:hint="default"/>
       </w:rPr>
     </w:lvl>
     <w:lvl w:ilvl="6">
       <w:start w:val="1"/>
-      <w:numFmt w:val="bullet"/>
-      <w:lvlText w:val="●"/>
+      <w:numFmt w:val="decimal"/>
+      <w:lvlText w:val="%1.%2.%3.%4.%5.%6.%7"/>
       <w:lvlJc w:val="left"/>
       <w:pPr>
-        <w:ind w:left="5040" w:hanging="360"/>
+        <w:ind w:left="1800" w:hanging="1800"/>
       </w:pPr>
       <w:rPr>
-        <w:rFonts w:ascii="Noto Sans Symbols" w:eastAsia="Noto Sans Symbols" w:hAnsi="Noto Sans Symbols" w:cs="Noto Sans Symbols"/>
+        <w:rFonts w:hint="default"/>
       </w:rPr>
     </w:lvl>
     <w:lvl w:ilvl="7">
       <w:start w:val="1"/>
-      <w:numFmt w:val="bullet"/>
-      <w:lvlText w:val="o"/>
+      <w:numFmt w:val="decimal"/>
+      <w:lvlText w:val="%1.%2.%3.%4.%5.%6.%7.%8"/>
       <w:lvlJc w:val="left"/>
       <w:pPr>
-        <w:ind w:left="5760" w:hanging="360"/>
+        <w:ind w:left="1800" w:hanging="1800"/>
       </w:pPr>
       <w:rPr>
-        <w:rFonts w:ascii="Courier New" w:eastAsia="Courier New" w:hAnsi="Courier New" w:cs="Courier New"/>
+        <w:rFonts w:hint="default"/>
       </w:rPr>
     </w:lvl>
     <w:lvl w:ilvl="8">
       <w:start w:val="1"/>
-      <w:numFmt w:val="bullet"/>
-      <w:lvlText w:val="▪"/>
+      <w:numFmt w:val="decimal"/>
+      <w:lvlText w:val="%1.%2.%3.%4.%5.%6.%7.%8.%9"/>
       <w:lvlJc w:val="left"/>
       <w:pPr>
-        <w:ind w:left="6480" w:hanging="360"/>
+        <w:ind w:left="2160" w:hanging="2160"/>
       </w:pPr>
       <w:rPr>
-        <w:rFonts w:ascii="Noto Sans Symbols" w:eastAsia="Noto Sans Symbols" w:hAnsi="Noto Sans Symbols" w:cs="Noto Sans Symbols"/>
+        <w:rFonts w:hint="default"/>
       </w:rPr>
     </w:lvl>
   </w:abstractNum>
-  <w:abstractNum w:abstractNumId="21" w15:restartNumberingAfterBreak="0">
-    <w:nsid w:val="4C201EA1"/>
-    <w:multiLevelType w:val="hybridMultilevel"/>
-    <w:tmpl w:val="8AA2DAD6"/>
-    <w:lvl w:ilvl="0" w:tplc="2C0A0001">
-      <w:start w:val="1"/>
-      <w:numFmt w:val="bullet"/>
-      <w:lvlText w:val=""/>
-      <w:lvlJc w:val="left"/>
-      <w:pPr>
-        <w:ind w:left="720" w:hanging="360"/>
-      </w:pPr>
-      <w:rPr>
-        <w:rFonts w:ascii="Symbol" w:hAnsi="Symbol" w:hint="default"/>
-      </w:rPr>
-    </w:lvl>
-    <w:lvl w:ilvl="1" w:tplc="2C0A0003">
-      <w:start w:val="1"/>
-      <w:numFmt w:val="bullet"/>
-      <w:lvlText w:val="o"/>
-      <w:lvlJc w:val="left"/>
-      <w:pPr>
-        <w:ind w:left="1440" w:hanging="360"/>
-      </w:pPr>
-      <w:rPr>
-        <w:rFonts w:ascii="Courier New" w:hAnsi="Courier New" w:cs="Courier New" w:hint="default"/>
-      </w:rPr>
-    </w:lvl>
-    <w:lvl w:ilvl="2" w:tplc="2C0A0005" w:tentative="1">
-      <w:start w:val="1"/>
-      <w:numFmt w:val="bullet"/>
-      <w:lvlText w:val=""/>
-      <w:lvlJc w:val="left"/>
-      <w:pPr>
-        <w:ind w:left="2160" w:hanging="360"/>
-      </w:pPr>
-      <w:rPr>
-        <w:rFonts w:ascii="Wingdings" w:hAnsi="Wingdings" w:hint="default"/>
-      </w:rPr>
-    </w:lvl>
-    <w:lvl w:ilvl="3" w:tplc="2C0A0001" w:tentative="1">
-      <w:start w:val="1"/>
-      <w:numFmt w:val="bullet"/>
-      <w:lvlText w:val=""/>
-      <w:lvlJc w:val="left"/>
-      <w:pPr>
-        <w:ind w:left="2880" w:hanging="360"/>
-      </w:pPr>
-      <w:rPr>
-        <w:rFonts w:ascii="Symbol" w:hAnsi="Symbol" w:hint="default"/>
-      </w:rPr>
-    </w:lvl>
-    <w:lvl w:ilvl="4" w:tplc="2C0A0003" w:tentative="1">
-      <w:start w:val="1"/>
-      <w:numFmt w:val="bullet"/>
-      <w:lvlText w:val="o"/>
-      <w:lvlJc w:val="left"/>
-      <w:pPr>
-        <w:ind w:left="3600" w:hanging="360"/>
-      </w:pPr>
-      <w:rPr>
-        <w:rFonts w:ascii="Courier New" w:hAnsi="Courier New" w:cs="Courier New" w:hint="default"/>
-      </w:rPr>
-    </w:lvl>
-    <w:lvl w:ilvl="5" w:tplc="2C0A0005" w:tentative="1">
-      <w:start w:val="1"/>
-      <w:numFmt w:val="bullet"/>
-      <w:lvlText w:val=""/>
-      <w:lvlJc w:val="left"/>
-      <w:pPr>
-        <w:ind w:left="4320" w:hanging="360"/>
-      </w:pPr>
-      <w:rPr>
-        <w:rFonts w:ascii="Wingdings" w:hAnsi="Wingdings" w:hint="default"/>
-      </w:rPr>
-    </w:lvl>
-    <w:lvl w:ilvl="6" w:tplc="2C0A0001" w:tentative="1">
-      <w:start w:val="1"/>
-      <w:numFmt w:val="bullet"/>
-      <w:lvlText w:val=""/>
-      <w:lvlJc w:val="left"/>
-      <w:pPr>
-        <w:ind w:left="5040" w:hanging="360"/>
-      </w:pPr>
-      <w:rPr>
-        <w:rFonts w:ascii="Symbol" w:hAnsi="Symbol" w:hint="default"/>
-      </w:rPr>
-    </w:lvl>
-    <w:lvl w:ilvl="7" w:tplc="2C0A0003" w:tentative="1">
-      <w:start w:val="1"/>
-      <w:numFmt w:val="bullet"/>
-      <w:lvlText w:val="o"/>
-      <w:lvlJc w:val="left"/>
-      <w:pPr>
-        <w:ind w:left="5760" w:hanging="360"/>
-      </w:pPr>
-      <w:rPr>
-        <w:rFonts w:ascii="Courier New" w:hAnsi="Courier New" w:cs="Courier New" w:hint="default"/>
-      </w:rPr>
-    </w:lvl>
-    <w:lvl w:ilvl="8" w:tplc="2C0A0005" w:tentative="1">
-      <w:start w:val="1"/>
-      <w:numFmt w:val="bullet"/>
-      <w:lvlText w:val=""/>
-      <w:lvlJc w:val="left"/>
-      <w:pPr>
-        <w:ind w:left="6480" w:hanging="360"/>
-      </w:pPr>
-      <w:rPr>
-        <w:rFonts w:ascii="Wingdings" w:hAnsi="Wingdings" w:hint="default"/>
-      </w:rPr>
-    </w:lvl>
-  </w:abstractNum>
-  <w:abstractNum w:abstractNumId="22" w15:restartNumberingAfterBreak="0">
-    <w:nsid w:val="4F151ED2"/>
+  <w:abstractNum w:abstractNumId="20" w15:restartNumberingAfterBreak="0">
+    <w:nsid w:val="465A2690"/>
     <w:multiLevelType w:val="multilevel"/>
-    <w:tmpl w:val="3B440B54"/>
+    <w:tmpl w:val="2CE4AB62"/>
     <w:lvl w:ilvl="0">
       <w:start w:val="1"/>
       <w:numFmt w:val="decimal"/>
@@ -29882,10 +30365,123 @@
       </w:pPr>
     </w:lvl>
   </w:abstractNum>
-  <w:abstractNum w:abstractNumId="23" w15:restartNumberingAfterBreak="0">
-    <w:nsid w:val="4F81444D"/>
+  <w:abstractNum w:abstractNumId="21" w15:restartNumberingAfterBreak="0">
+    <w:nsid w:val="471667BB"/>
     <w:multiLevelType w:val="multilevel"/>
-    <w:tmpl w:val="2CE4AB62"/>
+    <w:tmpl w:val="944A6AA8"/>
+    <w:lvl w:ilvl="0">
+      <w:start w:val="1"/>
+      <w:numFmt w:val="bullet"/>
+      <w:lvlText w:val="-"/>
+      <w:lvlJc w:val="left"/>
+      <w:pPr>
+        <w:ind w:left="720" w:hanging="360"/>
+      </w:pPr>
+      <w:rPr>
+        <w:rFonts w:ascii="Aptos" w:eastAsia="Aptos" w:hAnsi="Aptos" w:cs="Aptos"/>
+      </w:rPr>
+    </w:lvl>
+    <w:lvl w:ilvl="1">
+      <w:start w:val="1"/>
+      <w:numFmt w:val="bullet"/>
+      <w:lvlText w:val="o"/>
+      <w:lvlJc w:val="left"/>
+      <w:pPr>
+        <w:ind w:left="1440" w:hanging="360"/>
+      </w:pPr>
+      <w:rPr>
+        <w:rFonts w:ascii="Courier New" w:eastAsia="Courier New" w:hAnsi="Courier New" w:cs="Courier New"/>
+      </w:rPr>
+    </w:lvl>
+    <w:lvl w:ilvl="2">
+      <w:start w:val="1"/>
+      <w:numFmt w:val="bullet"/>
+      <w:lvlText w:val="▪"/>
+      <w:lvlJc w:val="left"/>
+      <w:pPr>
+        <w:ind w:left="2160" w:hanging="360"/>
+      </w:pPr>
+      <w:rPr>
+        <w:rFonts w:ascii="Noto Sans Symbols" w:eastAsia="Noto Sans Symbols" w:hAnsi="Noto Sans Symbols" w:cs="Noto Sans Symbols"/>
+      </w:rPr>
+    </w:lvl>
+    <w:lvl w:ilvl="3">
+      <w:start w:val="1"/>
+      <w:numFmt w:val="bullet"/>
+      <w:lvlText w:val="●"/>
+      <w:lvlJc w:val="left"/>
+      <w:pPr>
+        <w:ind w:left="2880" w:hanging="360"/>
+      </w:pPr>
+      <w:rPr>
+        <w:rFonts w:ascii="Noto Sans Symbols" w:eastAsia="Noto Sans Symbols" w:hAnsi="Noto Sans Symbols" w:cs="Noto Sans Symbols"/>
+      </w:rPr>
+    </w:lvl>
+    <w:lvl w:ilvl="4">
+      <w:start w:val="1"/>
+      <w:numFmt w:val="bullet"/>
+      <w:lvlText w:val="o"/>
+      <w:lvlJc w:val="left"/>
+      <w:pPr>
+        <w:ind w:left="3600" w:hanging="360"/>
+      </w:pPr>
+      <w:rPr>
+        <w:rFonts w:ascii="Courier New" w:eastAsia="Courier New" w:hAnsi="Courier New" w:cs="Courier New"/>
+      </w:rPr>
+    </w:lvl>
+    <w:lvl w:ilvl="5">
+      <w:start w:val="1"/>
+      <w:numFmt w:val="bullet"/>
+      <w:lvlText w:val="▪"/>
+      <w:lvlJc w:val="left"/>
+      <w:pPr>
+        <w:ind w:left="4320" w:hanging="360"/>
+      </w:pPr>
+      <w:rPr>
+        <w:rFonts w:ascii="Noto Sans Symbols" w:eastAsia="Noto Sans Symbols" w:hAnsi="Noto Sans Symbols" w:cs="Noto Sans Symbols"/>
+      </w:rPr>
+    </w:lvl>
+    <w:lvl w:ilvl="6">
+      <w:start w:val="1"/>
+      <w:numFmt w:val="bullet"/>
+      <w:lvlText w:val="●"/>
+      <w:lvlJc w:val="left"/>
+      <w:pPr>
+        <w:ind w:left="5040" w:hanging="360"/>
+      </w:pPr>
+      <w:rPr>
+        <w:rFonts w:ascii="Noto Sans Symbols" w:eastAsia="Noto Sans Symbols" w:hAnsi="Noto Sans Symbols" w:cs="Noto Sans Symbols"/>
+      </w:rPr>
+    </w:lvl>
+    <w:lvl w:ilvl="7">
+      <w:start w:val="1"/>
+      <w:numFmt w:val="bullet"/>
+      <w:lvlText w:val="o"/>
+      <w:lvlJc w:val="left"/>
+      <w:pPr>
+        <w:ind w:left="5760" w:hanging="360"/>
+      </w:pPr>
+      <w:rPr>
+        <w:rFonts w:ascii="Courier New" w:eastAsia="Courier New" w:hAnsi="Courier New" w:cs="Courier New"/>
+      </w:rPr>
+    </w:lvl>
+    <w:lvl w:ilvl="8">
+      <w:start w:val="1"/>
+      <w:numFmt w:val="bullet"/>
+      <w:lvlText w:val="▪"/>
+      <w:lvlJc w:val="left"/>
+      <w:pPr>
+        <w:ind w:left="6480" w:hanging="360"/>
+      </w:pPr>
+      <w:rPr>
+        <w:rFonts w:ascii="Noto Sans Symbols" w:eastAsia="Noto Sans Symbols" w:hAnsi="Noto Sans Symbols" w:cs="Noto Sans Symbols"/>
+      </w:rPr>
+    </w:lvl>
+  </w:abstractNum>
+  <w:abstractNum w:abstractNumId="22" w15:restartNumberingAfterBreak="0">
+    <w:nsid w:val="494B1241"/>
+    <w:multiLevelType w:val="multilevel"/>
+    <w:tmpl w:val="2190F670"/>
     <w:lvl w:ilvl="0">
       <w:start w:val="1"/>
       <w:numFmt w:val="decimal"/>
@@ -29972,123 +30568,10 @@
       </w:pPr>
     </w:lvl>
   </w:abstractNum>
-  <w:abstractNum w:abstractNumId="24" w15:restartNumberingAfterBreak="0">
-    <w:nsid w:val="53A47C0C"/>
+  <w:abstractNum w:abstractNumId="23" w15:restartNumberingAfterBreak="0">
+    <w:nsid w:val="4C201EA1"/>
     <w:multiLevelType w:val="hybridMultilevel"/>
-    <w:tmpl w:val="5310FD84"/>
-    <w:lvl w:ilvl="0" w:tplc="0C0A0001">
-      <w:start w:val="1"/>
-      <w:numFmt w:val="bullet"/>
-      <w:lvlText w:val=""/>
-      <w:lvlJc w:val="left"/>
-      <w:pPr>
-        <w:ind w:left="720" w:hanging="360"/>
-      </w:pPr>
-      <w:rPr>
-        <w:rFonts w:ascii="Symbol" w:hAnsi="Symbol" w:hint="default"/>
-      </w:rPr>
-    </w:lvl>
-    <w:lvl w:ilvl="1" w:tplc="0C0A0003">
-      <w:start w:val="1"/>
-      <w:numFmt w:val="bullet"/>
-      <w:lvlText w:val="o"/>
-      <w:lvlJc w:val="left"/>
-      <w:pPr>
-        <w:ind w:left="1440" w:hanging="360"/>
-      </w:pPr>
-      <w:rPr>
-        <w:rFonts w:ascii="Courier New" w:hAnsi="Courier New" w:cs="Courier New" w:hint="default"/>
-      </w:rPr>
-    </w:lvl>
-    <w:lvl w:ilvl="2" w:tplc="0C0A0005">
-      <w:start w:val="1"/>
-      <w:numFmt w:val="bullet"/>
-      <w:lvlText w:val=""/>
-      <w:lvlJc w:val="left"/>
-      <w:pPr>
-        <w:ind w:left="2160" w:hanging="360"/>
-      </w:pPr>
-      <w:rPr>
-        <w:rFonts w:ascii="Wingdings" w:hAnsi="Wingdings" w:hint="default"/>
-      </w:rPr>
-    </w:lvl>
-    <w:lvl w:ilvl="3" w:tplc="0C0A0001">
-      <w:start w:val="1"/>
-      <w:numFmt w:val="bullet"/>
-      <w:lvlText w:val=""/>
-      <w:lvlJc w:val="left"/>
-      <w:pPr>
-        <w:ind w:left="2880" w:hanging="360"/>
-      </w:pPr>
-      <w:rPr>
-        <w:rFonts w:ascii="Symbol" w:hAnsi="Symbol" w:hint="default"/>
-      </w:rPr>
-    </w:lvl>
-    <w:lvl w:ilvl="4" w:tplc="0C0A0003">
-      <w:start w:val="1"/>
-      <w:numFmt w:val="bullet"/>
-      <w:lvlText w:val="o"/>
-      <w:lvlJc w:val="left"/>
-      <w:pPr>
-        <w:ind w:left="3600" w:hanging="360"/>
-      </w:pPr>
-      <w:rPr>
-        <w:rFonts w:ascii="Courier New" w:hAnsi="Courier New" w:cs="Courier New" w:hint="default"/>
-      </w:rPr>
-    </w:lvl>
-    <w:lvl w:ilvl="5" w:tplc="0C0A0005">
-      <w:start w:val="1"/>
-      <w:numFmt w:val="bullet"/>
-      <w:lvlText w:val=""/>
-      <w:lvlJc w:val="left"/>
-      <w:pPr>
-        <w:ind w:left="4320" w:hanging="360"/>
-      </w:pPr>
-      <w:rPr>
-        <w:rFonts w:ascii="Wingdings" w:hAnsi="Wingdings" w:hint="default"/>
-      </w:rPr>
-    </w:lvl>
-    <w:lvl w:ilvl="6" w:tplc="0C0A0001">
-      <w:start w:val="1"/>
-      <w:numFmt w:val="bullet"/>
-      <w:lvlText w:val=""/>
-      <w:lvlJc w:val="left"/>
-      <w:pPr>
-        <w:ind w:left="5040" w:hanging="360"/>
-      </w:pPr>
-      <w:rPr>
-        <w:rFonts w:ascii="Symbol" w:hAnsi="Symbol" w:hint="default"/>
-      </w:rPr>
-    </w:lvl>
-    <w:lvl w:ilvl="7" w:tplc="0C0A0003">
-      <w:start w:val="1"/>
-      <w:numFmt w:val="bullet"/>
-      <w:lvlText w:val="o"/>
-      <w:lvlJc w:val="left"/>
-      <w:pPr>
-        <w:ind w:left="5760" w:hanging="360"/>
-      </w:pPr>
-      <w:rPr>
-        <w:rFonts w:ascii="Courier New" w:hAnsi="Courier New" w:cs="Courier New" w:hint="default"/>
-      </w:rPr>
-    </w:lvl>
-    <w:lvl w:ilvl="8" w:tplc="0C0A0005">
-      <w:start w:val="1"/>
-      <w:numFmt w:val="bullet"/>
-      <w:lvlText w:val=""/>
-      <w:lvlJc w:val="left"/>
-      <w:pPr>
-        <w:ind w:left="6480" w:hanging="360"/>
-      </w:pPr>
-      <w:rPr>
-        <w:rFonts w:ascii="Wingdings" w:hAnsi="Wingdings" w:hint="default"/>
-      </w:rPr>
-    </w:lvl>
-  </w:abstractNum>
-  <w:abstractNum w:abstractNumId="25" w15:restartNumberingAfterBreak="0">
-    <w:nsid w:val="58952764"/>
-    <w:multiLevelType w:val="hybridMultilevel"/>
-    <w:tmpl w:val="A37ECC54"/>
+    <w:tmpl w:val="8AA2DAD6"/>
     <w:lvl w:ilvl="0" w:tplc="2C0A0001">
       <w:start w:val="1"/>
       <w:numFmt w:val="bullet"/>
@@ -30101,7 +30584,7 @@
         <w:rFonts w:ascii="Symbol" w:hAnsi="Symbol" w:hint="default"/>
       </w:rPr>
     </w:lvl>
-    <w:lvl w:ilvl="1" w:tplc="2C0A0003" w:tentative="1">
+    <w:lvl w:ilvl="1" w:tplc="2C0A0003">
       <w:start w:val="1"/>
       <w:numFmt w:val="bullet"/>
       <w:lvlText w:val="o"/>
@@ -30198,8 +30681,8 @@
       </w:rPr>
     </w:lvl>
   </w:abstractNum>
-  <w:abstractNum w:abstractNumId="26" w15:restartNumberingAfterBreak="0">
-    <w:nsid w:val="5B28511A"/>
+  <w:abstractNum w:abstractNumId="24" w15:restartNumberingAfterBreak="0">
+    <w:nsid w:val="4F151ED2"/>
     <w:multiLevelType w:val="multilevel"/>
     <w:tmpl w:val="3B440B54"/>
     <w:lvl w:ilvl="0">
@@ -30288,7 +30771,413 @@
       </w:pPr>
     </w:lvl>
   </w:abstractNum>
+  <w:abstractNum w:abstractNumId="25" w15:restartNumberingAfterBreak="0">
+    <w:nsid w:val="4F81444D"/>
+    <w:multiLevelType w:val="multilevel"/>
+    <w:tmpl w:val="2CE4AB62"/>
+    <w:lvl w:ilvl="0">
+      <w:start w:val="1"/>
+      <w:numFmt w:val="decimal"/>
+      <w:lvlText w:val="%1."/>
+      <w:lvlJc w:val="left"/>
+      <w:pPr>
+        <w:ind w:left="720" w:hanging="360"/>
+      </w:pPr>
+      <w:rPr>
+        <w:b/>
+        <w:bCs/>
+      </w:rPr>
+    </w:lvl>
+    <w:lvl w:ilvl="1">
+      <w:start w:val="1"/>
+      <w:numFmt w:val="decimal"/>
+      <w:lvlText w:val="%2."/>
+      <w:lvlJc w:val="left"/>
+      <w:pPr>
+        <w:ind w:left="1440" w:hanging="360"/>
+      </w:pPr>
+    </w:lvl>
+    <w:lvl w:ilvl="2">
+      <w:start w:val="1"/>
+      <w:numFmt w:val="decimal"/>
+      <w:lvlText w:val="%3."/>
+      <w:lvlJc w:val="left"/>
+      <w:pPr>
+        <w:ind w:left="2160" w:hanging="360"/>
+      </w:pPr>
+    </w:lvl>
+    <w:lvl w:ilvl="3">
+      <w:start w:val="1"/>
+      <w:numFmt w:val="decimal"/>
+      <w:lvlText w:val="%4."/>
+      <w:lvlJc w:val="left"/>
+      <w:pPr>
+        <w:ind w:left="2880" w:hanging="360"/>
+      </w:pPr>
+    </w:lvl>
+    <w:lvl w:ilvl="4">
+      <w:start w:val="1"/>
+      <w:numFmt w:val="decimal"/>
+      <w:lvlText w:val="%5."/>
+      <w:lvlJc w:val="left"/>
+      <w:pPr>
+        <w:ind w:left="3600" w:hanging="360"/>
+      </w:pPr>
+    </w:lvl>
+    <w:lvl w:ilvl="5">
+      <w:start w:val="1"/>
+      <w:numFmt w:val="decimal"/>
+      <w:lvlText w:val="%6."/>
+      <w:lvlJc w:val="left"/>
+      <w:pPr>
+        <w:ind w:left="4320" w:hanging="360"/>
+      </w:pPr>
+    </w:lvl>
+    <w:lvl w:ilvl="6">
+      <w:start w:val="1"/>
+      <w:numFmt w:val="decimal"/>
+      <w:lvlText w:val="%7."/>
+      <w:lvlJc w:val="left"/>
+      <w:pPr>
+        <w:ind w:left="5040" w:hanging="360"/>
+      </w:pPr>
+    </w:lvl>
+    <w:lvl w:ilvl="7">
+      <w:start w:val="1"/>
+      <w:numFmt w:val="decimal"/>
+      <w:lvlText w:val="%8."/>
+      <w:lvlJc w:val="left"/>
+      <w:pPr>
+        <w:ind w:left="5760" w:hanging="360"/>
+      </w:pPr>
+    </w:lvl>
+    <w:lvl w:ilvl="8">
+      <w:start w:val="1"/>
+      <w:numFmt w:val="decimal"/>
+      <w:lvlText w:val="%9."/>
+      <w:lvlJc w:val="left"/>
+      <w:pPr>
+        <w:ind w:left="6480" w:hanging="360"/>
+      </w:pPr>
+    </w:lvl>
+  </w:abstractNum>
+  <w:abstractNum w:abstractNumId="26" w15:restartNumberingAfterBreak="0">
+    <w:nsid w:val="53A47C0C"/>
+    <w:multiLevelType w:val="hybridMultilevel"/>
+    <w:tmpl w:val="5310FD84"/>
+    <w:lvl w:ilvl="0" w:tplc="0C0A0001">
+      <w:start w:val="1"/>
+      <w:numFmt w:val="bullet"/>
+      <w:lvlText w:val=""/>
+      <w:lvlJc w:val="left"/>
+      <w:pPr>
+        <w:ind w:left="720" w:hanging="360"/>
+      </w:pPr>
+      <w:rPr>
+        <w:rFonts w:ascii="Symbol" w:hAnsi="Symbol" w:hint="default"/>
+      </w:rPr>
+    </w:lvl>
+    <w:lvl w:ilvl="1" w:tplc="0C0A0003">
+      <w:start w:val="1"/>
+      <w:numFmt w:val="bullet"/>
+      <w:lvlText w:val="o"/>
+      <w:lvlJc w:val="left"/>
+      <w:pPr>
+        <w:ind w:left="1440" w:hanging="360"/>
+      </w:pPr>
+      <w:rPr>
+        <w:rFonts w:ascii="Courier New" w:hAnsi="Courier New" w:cs="Courier New" w:hint="default"/>
+      </w:rPr>
+    </w:lvl>
+    <w:lvl w:ilvl="2" w:tplc="0C0A0005">
+      <w:start w:val="1"/>
+      <w:numFmt w:val="bullet"/>
+      <w:lvlText w:val=""/>
+      <w:lvlJc w:val="left"/>
+      <w:pPr>
+        <w:ind w:left="2160" w:hanging="360"/>
+      </w:pPr>
+      <w:rPr>
+        <w:rFonts w:ascii="Wingdings" w:hAnsi="Wingdings" w:hint="default"/>
+      </w:rPr>
+    </w:lvl>
+    <w:lvl w:ilvl="3" w:tplc="0C0A0001">
+      <w:start w:val="1"/>
+      <w:numFmt w:val="bullet"/>
+      <w:lvlText w:val=""/>
+      <w:lvlJc w:val="left"/>
+      <w:pPr>
+        <w:ind w:left="2880" w:hanging="360"/>
+      </w:pPr>
+      <w:rPr>
+        <w:rFonts w:ascii="Symbol" w:hAnsi="Symbol" w:hint="default"/>
+      </w:rPr>
+    </w:lvl>
+    <w:lvl w:ilvl="4" w:tplc="0C0A0003">
+      <w:start w:val="1"/>
+      <w:numFmt w:val="bullet"/>
+      <w:lvlText w:val="o"/>
+      <w:lvlJc w:val="left"/>
+      <w:pPr>
+        <w:ind w:left="3600" w:hanging="360"/>
+      </w:pPr>
+      <w:rPr>
+        <w:rFonts w:ascii="Courier New" w:hAnsi="Courier New" w:cs="Courier New" w:hint="default"/>
+      </w:rPr>
+    </w:lvl>
+    <w:lvl w:ilvl="5" w:tplc="0C0A0005">
+      <w:start w:val="1"/>
+      <w:numFmt w:val="bullet"/>
+      <w:lvlText w:val=""/>
+      <w:lvlJc w:val="left"/>
+      <w:pPr>
+        <w:ind w:left="4320" w:hanging="360"/>
+      </w:pPr>
+      <w:rPr>
+        <w:rFonts w:ascii="Wingdings" w:hAnsi="Wingdings" w:hint="default"/>
+      </w:rPr>
+    </w:lvl>
+    <w:lvl w:ilvl="6" w:tplc="0C0A0001">
+      <w:start w:val="1"/>
+      <w:numFmt w:val="bullet"/>
+      <w:lvlText w:val=""/>
+      <w:lvlJc w:val="left"/>
+      <w:pPr>
+        <w:ind w:left="5040" w:hanging="360"/>
+      </w:pPr>
+      <w:rPr>
+        <w:rFonts w:ascii="Symbol" w:hAnsi="Symbol" w:hint="default"/>
+      </w:rPr>
+    </w:lvl>
+    <w:lvl w:ilvl="7" w:tplc="0C0A0003">
+      <w:start w:val="1"/>
+      <w:numFmt w:val="bullet"/>
+      <w:lvlText w:val="o"/>
+      <w:lvlJc w:val="left"/>
+      <w:pPr>
+        <w:ind w:left="5760" w:hanging="360"/>
+      </w:pPr>
+      <w:rPr>
+        <w:rFonts w:ascii="Courier New" w:hAnsi="Courier New" w:cs="Courier New" w:hint="default"/>
+      </w:rPr>
+    </w:lvl>
+    <w:lvl w:ilvl="8" w:tplc="0C0A0005">
+      <w:start w:val="1"/>
+      <w:numFmt w:val="bullet"/>
+      <w:lvlText w:val=""/>
+      <w:lvlJc w:val="left"/>
+      <w:pPr>
+        <w:ind w:left="6480" w:hanging="360"/>
+      </w:pPr>
+      <w:rPr>
+        <w:rFonts w:ascii="Wingdings" w:hAnsi="Wingdings" w:hint="default"/>
+      </w:rPr>
+    </w:lvl>
+  </w:abstractNum>
   <w:abstractNum w:abstractNumId="27" w15:restartNumberingAfterBreak="0">
+    <w:nsid w:val="58952764"/>
+    <w:multiLevelType w:val="hybridMultilevel"/>
+    <w:tmpl w:val="A37ECC54"/>
+    <w:lvl w:ilvl="0" w:tplc="2C0A0001">
+      <w:start w:val="1"/>
+      <w:numFmt w:val="bullet"/>
+      <w:lvlText w:val=""/>
+      <w:lvlJc w:val="left"/>
+      <w:pPr>
+        <w:ind w:left="720" w:hanging="360"/>
+      </w:pPr>
+      <w:rPr>
+        <w:rFonts w:ascii="Symbol" w:hAnsi="Symbol" w:hint="default"/>
+      </w:rPr>
+    </w:lvl>
+    <w:lvl w:ilvl="1" w:tplc="2C0A0003" w:tentative="1">
+      <w:start w:val="1"/>
+      <w:numFmt w:val="bullet"/>
+      <w:lvlText w:val="o"/>
+      <w:lvlJc w:val="left"/>
+      <w:pPr>
+        <w:ind w:left="1440" w:hanging="360"/>
+      </w:pPr>
+      <w:rPr>
+        <w:rFonts w:ascii="Courier New" w:hAnsi="Courier New" w:cs="Courier New" w:hint="default"/>
+      </w:rPr>
+    </w:lvl>
+    <w:lvl w:ilvl="2" w:tplc="2C0A0005" w:tentative="1">
+      <w:start w:val="1"/>
+      <w:numFmt w:val="bullet"/>
+      <w:lvlText w:val=""/>
+      <w:lvlJc w:val="left"/>
+      <w:pPr>
+        <w:ind w:left="2160" w:hanging="360"/>
+      </w:pPr>
+      <w:rPr>
+        <w:rFonts w:ascii="Wingdings" w:hAnsi="Wingdings" w:hint="default"/>
+      </w:rPr>
+    </w:lvl>
+    <w:lvl w:ilvl="3" w:tplc="2C0A0001" w:tentative="1">
+      <w:start w:val="1"/>
+      <w:numFmt w:val="bullet"/>
+      <w:lvlText w:val=""/>
+      <w:lvlJc w:val="left"/>
+      <w:pPr>
+        <w:ind w:left="2880" w:hanging="360"/>
+      </w:pPr>
+      <w:rPr>
+        <w:rFonts w:ascii="Symbol" w:hAnsi="Symbol" w:hint="default"/>
+      </w:rPr>
+    </w:lvl>
+    <w:lvl w:ilvl="4" w:tplc="2C0A0003" w:tentative="1">
+      <w:start w:val="1"/>
+      <w:numFmt w:val="bullet"/>
+      <w:lvlText w:val="o"/>
+      <w:lvlJc w:val="left"/>
+      <w:pPr>
+        <w:ind w:left="3600" w:hanging="360"/>
+      </w:pPr>
+      <w:rPr>
+        <w:rFonts w:ascii="Courier New" w:hAnsi="Courier New" w:cs="Courier New" w:hint="default"/>
+      </w:rPr>
+    </w:lvl>
+    <w:lvl w:ilvl="5" w:tplc="2C0A0005" w:tentative="1">
+      <w:start w:val="1"/>
+      <w:numFmt w:val="bullet"/>
+      <w:lvlText w:val=""/>
+      <w:lvlJc w:val="left"/>
+      <w:pPr>
+        <w:ind w:left="4320" w:hanging="360"/>
+      </w:pPr>
+      <w:rPr>
+        <w:rFonts w:ascii="Wingdings" w:hAnsi="Wingdings" w:hint="default"/>
+      </w:rPr>
+    </w:lvl>
+    <w:lvl w:ilvl="6" w:tplc="2C0A0001" w:tentative="1">
+      <w:start w:val="1"/>
+      <w:numFmt w:val="bullet"/>
+      <w:lvlText w:val=""/>
+      <w:lvlJc w:val="left"/>
+      <w:pPr>
+        <w:ind w:left="5040" w:hanging="360"/>
+      </w:pPr>
+      <w:rPr>
+        <w:rFonts w:ascii="Symbol" w:hAnsi="Symbol" w:hint="default"/>
+      </w:rPr>
+    </w:lvl>
+    <w:lvl w:ilvl="7" w:tplc="2C0A0003" w:tentative="1">
+      <w:start w:val="1"/>
+      <w:numFmt w:val="bullet"/>
+      <w:lvlText w:val="o"/>
+      <w:lvlJc w:val="left"/>
+      <w:pPr>
+        <w:ind w:left="5760" w:hanging="360"/>
+      </w:pPr>
+      <w:rPr>
+        <w:rFonts w:ascii="Courier New" w:hAnsi="Courier New" w:cs="Courier New" w:hint="default"/>
+      </w:rPr>
+    </w:lvl>
+    <w:lvl w:ilvl="8" w:tplc="2C0A0005" w:tentative="1">
+      <w:start w:val="1"/>
+      <w:numFmt w:val="bullet"/>
+      <w:lvlText w:val=""/>
+      <w:lvlJc w:val="left"/>
+      <w:pPr>
+        <w:ind w:left="6480" w:hanging="360"/>
+      </w:pPr>
+      <w:rPr>
+        <w:rFonts w:ascii="Wingdings" w:hAnsi="Wingdings" w:hint="default"/>
+      </w:rPr>
+    </w:lvl>
+  </w:abstractNum>
+  <w:abstractNum w:abstractNumId="28" w15:restartNumberingAfterBreak="0">
+    <w:nsid w:val="5B28511A"/>
+    <w:multiLevelType w:val="multilevel"/>
+    <w:tmpl w:val="3B440B54"/>
+    <w:lvl w:ilvl="0">
+      <w:start w:val="1"/>
+      <w:numFmt w:val="decimal"/>
+      <w:lvlText w:val="%1."/>
+      <w:lvlJc w:val="left"/>
+      <w:pPr>
+        <w:ind w:left="720" w:hanging="360"/>
+      </w:pPr>
+      <w:rPr>
+        <w:b/>
+        <w:bCs/>
+      </w:rPr>
+    </w:lvl>
+    <w:lvl w:ilvl="1">
+      <w:start w:val="1"/>
+      <w:numFmt w:val="decimal"/>
+      <w:lvlText w:val="%2."/>
+      <w:lvlJc w:val="left"/>
+      <w:pPr>
+        <w:ind w:left="1440" w:hanging="360"/>
+      </w:pPr>
+    </w:lvl>
+    <w:lvl w:ilvl="2">
+      <w:start w:val="1"/>
+      <w:numFmt w:val="decimal"/>
+      <w:lvlText w:val="%3."/>
+      <w:lvlJc w:val="left"/>
+      <w:pPr>
+        <w:ind w:left="2160" w:hanging="360"/>
+      </w:pPr>
+    </w:lvl>
+    <w:lvl w:ilvl="3">
+      <w:start w:val="1"/>
+      <w:numFmt w:val="decimal"/>
+      <w:lvlText w:val="%4."/>
+      <w:lvlJc w:val="left"/>
+      <w:pPr>
+        <w:ind w:left="2880" w:hanging="360"/>
+      </w:pPr>
+    </w:lvl>
+    <w:lvl w:ilvl="4">
+      <w:start w:val="1"/>
+      <w:numFmt w:val="decimal"/>
+      <w:lvlText w:val="%5."/>
+      <w:lvlJc w:val="left"/>
+      <w:pPr>
+        <w:ind w:left="3600" w:hanging="360"/>
+      </w:pPr>
+    </w:lvl>
+    <w:lvl w:ilvl="5">
+      <w:start w:val="1"/>
+      <w:numFmt w:val="decimal"/>
+      <w:lvlText w:val="%6."/>
+      <w:lvlJc w:val="left"/>
+      <w:pPr>
+        <w:ind w:left="4320" w:hanging="360"/>
+      </w:pPr>
+    </w:lvl>
+    <w:lvl w:ilvl="6">
+      <w:start w:val="1"/>
+      <w:numFmt w:val="decimal"/>
+      <w:lvlText w:val="%7."/>
+      <w:lvlJc w:val="left"/>
+      <w:pPr>
+        <w:ind w:left="5040" w:hanging="360"/>
+      </w:pPr>
+    </w:lvl>
+    <w:lvl w:ilvl="7">
+      <w:start w:val="1"/>
+      <w:numFmt w:val="decimal"/>
+      <w:lvlText w:val="%8."/>
+      <w:lvlJc w:val="left"/>
+      <w:pPr>
+        <w:ind w:left="5760" w:hanging="360"/>
+      </w:pPr>
+    </w:lvl>
+    <w:lvl w:ilvl="8">
+      <w:start w:val="1"/>
+      <w:numFmt w:val="decimal"/>
+      <w:lvlText w:val="%9."/>
+      <w:lvlJc w:val="left"/>
+      <w:pPr>
+        <w:ind w:left="6480" w:hanging="360"/>
+      </w:pPr>
+    </w:lvl>
+  </w:abstractNum>
+  <w:abstractNum w:abstractNumId="29" w15:restartNumberingAfterBreak="0">
     <w:nsid w:val="5BB90A2F"/>
     <w:multiLevelType w:val="multilevel"/>
     <w:tmpl w:val="B4720FD0"/>
@@ -30437,7 +31326,7 @@
       </w:rPr>
     </w:lvl>
   </w:abstractNum>
-  <w:abstractNum w:abstractNumId="28" w15:restartNumberingAfterBreak="0">
+  <w:abstractNum w:abstractNumId="30" w15:restartNumberingAfterBreak="0">
     <w:nsid w:val="62C615B1"/>
     <w:multiLevelType w:val="hybridMultilevel"/>
     <w:tmpl w:val="ED1619AC"/>
@@ -30550,7 +31439,7 @@
       </w:rPr>
     </w:lvl>
   </w:abstractNum>
-  <w:abstractNum w:abstractNumId="29" w15:restartNumberingAfterBreak="0">
+  <w:abstractNum w:abstractNumId="31" w15:restartNumberingAfterBreak="0">
     <w:nsid w:val="721D01EF"/>
     <w:multiLevelType w:val="multilevel"/>
     <w:tmpl w:val="AADC35FA"/>
@@ -30663,7 +31552,7 @@
       </w:rPr>
     </w:lvl>
   </w:abstractNum>
-  <w:abstractNum w:abstractNumId="30" w15:restartNumberingAfterBreak="0">
+  <w:abstractNum w:abstractNumId="32" w15:restartNumberingAfterBreak="0">
     <w:nsid w:val="73776D94"/>
     <w:multiLevelType w:val="multilevel"/>
     <w:tmpl w:val="3940D936"/>
@@ -30753,7 +31642,7 @@
       </w:pPr>
     </w:lvl>
   </w:abstractNum>
-  <w:abstractNum w:abstractNumId="31" w15:restartNumberingAfterBreak="0">
+  <w:abstractNum w:abstractNumId="33" w15:restartNumberingAfterBreak="0">
     <w:nsid w:val="7B0825C5"/>
     <w:multiLevelType w:val="multilevel"/>
     <w:tmpl w:val="E62824EC"/>
@@ -30867,7 +31756,7 @@
     </w:lvl>
   </w:abstractNum>
   <w:num w:numId="1" w16cid:durableId="1003820479">
-    <w:abstractNumId w:val="20"/>
+    <w:abstractNumId w:val="21"/>
   </w:num>
   <w:num w:numId="2" w16cid:durableId="959841925">
     <w:abstractNumId w:val="2"/>
@@ -30876,25 +31765,25 @@
     <w:abstractNumId w:val="16"/>
   </w:num>
   <w:num w:numId="4" w16cid:durableId="73673050">
-    <w:abstractNumId w:val="29"/>
+    <w:abstractNumId w:val="31"/>
   </w:num>
   <w:num w:numId="5" w16cid:durableId="335158926">
     <w:abstractNumId w:val="1"/>
   </w:num>
   <w:num w:numId="6" w16cid:durableId="22680917">
-    <w:abstractNumId w:val="17"/>
+    <w:abstractNumId w:val="18"/>
   </w:num>
   <w:num w:numId="7" w16cid:durableId="356194859">
-    <w:abstractNumId w:val="30"/>
+    <w:abstractNumId w:val="32"/>
   </w:num>
   <w:num w:numId="8" w16cid:durableId="1683049771">
     <w:abstractNumId w:val="10"/>
   </w:num>
   <w:num w:numId="9" w16cid:durableId="533082093">
-    <w:abstractNumId w:val="26"/>
+    <w:abstractNumId w:val="28"/>
   </w:num>
   <w:num w:numId="10" w16cid:durableId="338847162">
-    <w:abstractNumId w:val="19"/>
+    <w:abstractNumId w:val="20"/>
   </w:num>
   <w:num w:numId="11" w16cid:durableId="735468304">
     <w:abstractNumId w:val="3"/>
@@ -30918,19 +31807,19 @@
     <w:abstractNumId w:val="6"/>
   </w:num>
   <w:num w:numId="18" w16cid:durableId="44764715">
-    <w:abstractNumId w:val="21"/>
+    <w:abstractNumId w:val="23"/>
   </w:num>
   <w:num w:numId="19" w16cid:durableId="1035933899">
-    <w:abstractNumId w:val="28"/>
+    <w:abstractNumId w:val="30"/>
   </w:num>
   <w:num w:numId="20" w16cid:durableId="795104101">
-    <w:abstractNumId w:val="18"/>
+    <w:abstractNumId w:val="19"/>
   </w:num>
   <w:num w:numId="21" w16cid:durableId="1902398725">
-    <w:abstractNumId w:val="23"/>
+    <w:abstractNumId w:val="25"/>
   </w:num>
   <w:num w:numId="22" w16cid:durableId="2137947010">
-    <w:abstractNumId w:val="31"/>
+    <w:abstractNumId w:val="33"/>
   </w:num>
   <w:num w:numId="23" w16cid:durableId="1079642873">
     <w:abstractNumId w:val="11"/>
@@ -30945,19 +31834,19 @@
     <w:abstractNumId w:val="13"/>
   </w:num>
   <w:num w:numId="27" w16cid:durableId="2128355026">
-    <w:abstractNumId w:val="27"/>
+    <w:abstractNumId w:val="29"/>
   </w:num>
   <w:num w:numId="28" w16cid:durableId="1747919955">
     <w:abstractNumId w:val="14"/>
   </w:num>
   <w:num w:numId="29" w16cid:durableId="1259094555">
-    <w:abstractNumId w:val="25"/>
+    <w:abstractNumId w:val="27"/>
   </w:num>
   <w:num w:numId="30" w16cid:durableId="607734423">
-    <w:abstractNumId w:val="24"/>
+    <w:abstractNumId w:val="26"/>
   </w:num>
   <w:num w:numId="31" w16cid:durableId="355739284">
-    <w:abstractNumId w:val="22"/>
+    <w:abstractNumId w:val="24"/>
     <w:lvlOverride w:ilvl="0">
       <w:startOverride w:val="1"/>
     </w:lvlOverride>
@@ -30987,10 +31876,16 @@
     </w:lvlOverride>
   </w:num>
   <w:num w:numId="32" w16cid:durableId="1736929792">
-    <w:abstractNumId w:val="24"/>
+    <w:abstractNumId w:val="26"/>
   </w:num>
   <w:num w:numId="33" w16cid:durableId="1938907612">
     <w:abstractNumId w:val="8"/>
+  </w:num>
+  <w:num w:numId="34" w16cid:durableId="1887450338">
+    <w:abstractNumId w:val="22"/>
+  </w:num>
+  <w:num w:numId="35" w16cid:durableId="438069884">
+    <w:abstractNumId w:val="17"/>
   </w:num>
 </w:numbering>
 </file>
@@ -31393,7 +32288,7 @@
   <w:style w:type="paragraph" w:default="1" w:styleId="Normal">
     <w:name w:val="Normal"/>
     <w:qFormat/>
-    <w:rsid w:val="004916B9"/>
+    <w:rsid w:val="00F363F3"/>
   </w:style>
   <w:style w:type="paragraph" w:styleId="Ttulo1">
     <w:name w:val="heading 1"/>

</xml_diff>

<commit_message>
Correciones hechas por Nicolas Profe 2daEntregaIS
</commit_message>
<xml_diff>
--- a/Documentación/ProyectoIS 2026 CAJAL-FERNANDEZ_2daEntrega.docx
+++ b/Documentación/ProyectoIS 2026 CAJAL-FERNANDEZ_2daEntrega.docx
@@ -7315,9 +7315,437 @@
         </w:rPr>
         <w:br w:type="page"/>
       </w:r>
+      <w:r>
+        <w:rPr>
+          <w:rFonts w:ascii="Times New Roman" w:eastAsia="Times New Roman" w:hAnsi="Times New Roman" w:cs="Times New Roman"/>
+          <w:color w:val="4F81BD" w:themeColor="accent1"/>
+          <w:sz w:val="32"/>
+          <w:szCs w:val="32"/>
+        </w:rPr>
+        <w:lastRenderedPageBreak/>
+        <w:t xml:space="preserve">Historial de Revisiones </w:t>
+      </w:r>
+    </w:p>
+    <w:tbl>
+      <w:tblPr>
+        <w:tblStyle w:val="Tablaconcuadrcula"/>
+        <w:tblW w:w="0" w:type="auto"/>
+        <w:tblLook w:val="04A0" w:firstRow="1" w:lastRow="0" w:firstColumn="1" w:lastColumn="0" w:noHBand="0" w:noVBand="1"/>
+      </w:tblPr>
+      <w:tblGrid>
+        <w:gridCol w:w="2124"/>
+        <w:gridCol w:w="2164"/>
+        <w:gridCol w:w="2513"/>
+        <w:gridCol w:w="1693"/>
+      </w:tblGrid>
+      <w:tr>
+        <w:tc>
+          <w:tcPr>
+            <w:tcW w:w="2124" w:type="dxa"/>
+          </w:tcPr>
+          <w:p>
+            <w:pPr>
+              <w:jc w:val="center"/>
+              <w:rPr>
+                <w:rFonts w:ascii="Times New Roman" w:eastAsia="Times New Roman" w:hAnsi="Times New Roman" w:cs="Times New Roman"/>
+                <w:b/>
+                <w:bCs/>
+                <w:sz w:val="32"/>
+                <w:szCs w:val="32"/>
+              </w:rPr>
+            </w:pPr>
+            <w:r>
+              <w:rPr>
+                <w:rFonts w:ascii="Times New Roman" w:eastAsia="Times New Roman" w:hAnsi="Times New Roman" w:cs="Times New Roman"/>
+                <w:b/>
+                <w:bCs/>
+                <w:sz w:val="32"/>
+                <w:szCs w:val="32"/>
+              </w:rPr>
+              <w:t>Entrega N°</w:t>
+            </w:r>
+          </w:p>
+        </w:tc>
+        <w:tc>
+          <w:tcPr>
+            <w:tcW w:w="2164" w:type="dxa"/>
+          </w:tcPr>
+          <w:p>
+            <w:pPr>
+              <w:jc w:val="center"/>
+              <w:rPr>
+                <w:rFonts w:ascii="Times New Roman" w:eastAsia="Times New Roman" w:hAnsi="Times New Roman" w:cs="Times New Roman"/>
+                <w:b/>
+                <w:bCs/>
+                <w:sz w:val="32"/>
+                <w:szCs w:val="32"/>
+              </w:rPr>
+            </w:pPr>
+            <w:r>
+              <w:rPr>
+                <w:rFonts w:ascii="Times New Roman" w:eastAsia="Times New Roman" w:hAnsi="Times New Roman" w:cs="Times New Roman"/>
+                <w:b/>
+                <w:bCs/>
+                <w:sz w:val="32"/>
+                <w:szCs w:val="32"/>
+              </w:rPr>
+              <w:t>Profesor</w:t>
+            </w:r>
+          </w:p>
+        </w:tc>
+        <w:tc>
+          <w:tcPr>
+            <w:tcW w:w="2513" w:type="dxa"/>
+          </w:tcPr>
+          <w:p>
+            <w:pPr>
+              <w:jc w:val="center"/>
+              <w:rPr>
+                <w:rFonts w:ascii="Times New Roman" w:eastAsia="Times New Roman" w:hAnsi="Times New Roman" w:cs="Times New Roman"/>
+                <w:b/>
+                <w:bCs/>
+                <w:sz w:val="32"/>
+                <w:szCs w:val="32"/>
+              </w:rPr>
+            </w:pPr>
+            <w:r>
+              <w:rPr>
+                <w:rFonts w:ascii="Times New Roman" w:eastAsia="Times New Roman" w:hAnsi="Times New Roman" w:cs="Times New Roman"/>
+                <w:b/>
+                <w:bCs/>
+                <w:sz w:val="32"/>
+                <w:szCs w:val="32"/>
+              </w:rPr>
+              <w:t>Observaciones</w:t>
+            </w:r>
+          </w:p>
+        </w:tc>
+        <w:tc>
+          <w:tcPr>
+            <w:tcW w:w="1693" w:type="dxa"/>
+          </w:tcPr>
+          <w:p>
+            <w:pPr>
+              <w:jc w:val="center"/>
+              <w:rPr>
+                <w:rFonts w:ascii="Times New Roman" w:eastAsia="Times New Roman" w:hAnsi="Times New Roman" w:cs="Times New Roman"/>
+                <w:b/>
+                <w:bCs/>
+                <w:sz w:val="32"/>
+                <w:szCs w:val="32"/>
+              </w:rPr>
+            </w:pPr>
+            <w:r>
+              <w:rPr>
+                <w:rFonts w:ascii="Times New Roman" w:eastAsia="Times New Roman" w:hAnsi="Times New Roman" w:cs="Times New Roman"/>
+                <w:b/>
+                <w:bCs/>
+                <w:sz w:val="32"/>
+                <w:szCs w:val="32"/>
+              </w:rPr>
+              <w:t>Nota</w:t>
+            </w:r>
+          </w:p>
+        </w:tc>
+      </w:tr>
+      <w:tr>
+        <w:tc>
+          <w:tcPr>
+            <w:tcW w:w="2124" w:type="dxa"/>
+          </w:tcPr>
+          <w:p>
+            <w:pPr>
+              <w:jc w:val="center"/>
+              <w:rPr>
+                <w:rFonts w:ascii="Times New Roman" w:eastAsia="Times New Roman" w:hAnsi="Times New Roman" w:cs="Times New Roman"/>
+                <w:b/>
+                <w:bCs/>
+              </w:rPr>
+            </w:pPr>
+            <w:r>
+              <w:rPr>
+                <w:rFonts w:ascii="Times New Roman" w:eastAsia="Times New Roman" w:hAnsi="Times New Roman" w:cs="Times New Roman"/>
+                <w:b/>
+                <w:bCs/>
+              </w:rPr>
+              <w:t>1</w:t>
+            </w:r>
+          </w:p>
+        </w:tc>
+        <w:tc>
+          <w:tcPr>
+            <w:tcW w:w="2164" w:type="dxa"/>
+          </w:tcPr>
+          <w:p>
+            <w:pPr>
+              <w:jc w:val="center"/>
+              <w:rPr>
+                <w:rFonts w:ascii="Times New Roman" w:eastAsia="Times New Roman" w:hAnsi="Times New Roman" w:cs="Times New Roman"/>
+              </w:rPr>
+            </w:pPr>
+            <w:r>
+              <w:rPr>
+                <w:rFonts w:ascii="Times New Roman" w:eastAsia="Times New Roman" w:hAnsi="Times New Roman" w:cs="Times New Roman"/>
+              </w:rPr>
+              <w:t>Juan Ignacio Silva</w:t>
+            </w:r>
+          </w:p>
+        </w:tc>
+        <w:tc>
+          <w:tcPr>
+            <w:tcW w:w="2513" w:type="dxa"/>
+          </w:tcPr>
+          <w:p>
+            <w:pPr>
+              <w:rPr>
+                <w:rFonts w:ascii="Times New Roman" w:eastAsia="Times New Roman" w:hAnsi="Times New Roman" w:cs="Times New Roman"/>
+              </w:rPr>
+            </w:pPr>
+            <w:r>
+              <w:rPr>
+                <w:rFonts w:ascii="Times New Roman" w:eastAsia="Times New Roman" w:hAnsi="Times New Roman" w:cs="Times New Roman"/>
+              </w:rPr>
+              <w:t xml:space="preserve">. </w:t>
+            </w:r>
+            <w:r>
+              <w:rPr>
+                <w:rFonts w:ascii="Times New Roman" w:eastAsia="Times New Roman" w:hAnsi="Times New Roman" w:cs="Times New Roman"/>
+              </w:rPr>
+              <w:t>Unicidad en Correo electrónico a la hora de Registrar Usuario nuevo</w:t>
+            </w:r>
+          </w:p>
+          <w:p>
+            <w:pPr>
+              <w:rPr>
+                <w:rFonts w:ascii="Times New Roman" w:eastAsia="Times New Roman" w:hAnsi="Times New Roman" w:cs="Times New Roman"/>
+              </w:rPr>
+            </w:pPr>
+            <w:r>
+              <w:rPr>
+                <w:rFonts w:ascii="Times New Roman" w:eastAsia="Times New Roman" w:hAnsi="Times New Roman" w:cs="Times New Roman"/>
+              </w:rPr>
+              <w:t xml:space="preserve">. DSS: Pensarlos como “Usuario-Sistema” </w:t>
+            </w:r>
+          </w:p>
+        </w:tc>
+        <w:tc>
+          <w:tcPr>
+            <w:tcW w:w="1693" w:type="dxa"/>
+          </w:tcPr>
+          <w:p>
+            <w:pPr>
+              <w:jc w:val="center"/>
+              <w:rPr>
+                <w:rFonts w:ascii="Times New Roman" w:eastAsia="Times New Roman" w:hAnsi="Times New Roman" w:cs="Times New Roman"/>
+              </w:rPr>
+            </w:pPr>
+            <w:r>
+              <w:rPr>
+                <w:rFonts w:ascii="Times New Roman" w:eastAsia="Times New Roman" w:hAnsi="Times New Roman" w:cs="Times New Roman"/>
+              </w:rPr>
+              <w:t>8</w:t>
+            </w:r>
+          </w:p>
+        </w:tc>
+      </w:tr>
+      <w:tr>
+        <w:tc>
+          <w:tcPr>
+            <w:tcW w:w="2124" w:type="dxa"/>
+          </w:tcPr>
+          <w:p>
+            <w:pPr>
+              <w:jc w:val="center"/>
+              <w:rPr>
+                <w:rFonts w:ascii="Times New Roman" w:eastAsia="Times New Roman" w:hAnsi="Times New Roman" w:cs="Times New Roman"/>
+                <w:b/>
+                <w:bCs/>
+              </w:rPr>
+            </w:pPr>
+            <w:r>
+              <w:rPr>
+                <w:rFonts w:ascii="Times New Roman" w:eastAsia="Times New Roman" w:hAnsi="Times New Roman" w:cs="Times New Roman"/>
+                <w:b/>
+                <w:bCs/>
+              </w:rPr>
+              <w:t>2</w:t>
+            </w:r>
+          </w:p>
+        </w:tc>
+        <w:tc>
+          <w:tcPr>
+            <w:tcW w:w="2164" w:type="dxa"/>
+          </w:tcPr>
+          <w:p>
+            <w:pPr>
+              <w:jc w:val="center"/>
+              <w:rPr>
+                <w:rFonts w:ascii="Times New Roman" w:eastAsia="Times New Roman" w:hAnsi="Times New Roman" w:cs="Times New Roman"/>
+              </w:rPr>
+            </w:pPr>
+            <w:r>
+              <w:rPr>
+                <w:rFonts w:ascii="Times New Roman" w:eastAsia="Times New Roman" w:hAnsi="Times New Roman" w:cs="Times New Roman"/>
+              </w:rPr>
+              <w:t>Nicolas Esposito</w:t>
+            </w:r>
+          </w:p>
+        </w:tc>
+        <w:tc>
+          <w:tcPr>
+            <w:tcW w:w="2513" w:type="dxa"/>
+          </w:tcPr>
+          <w:p>
+            <w:pPr>
+              <w:jc w:val="center"/>
+              <w:rPr>
+                <w:rFonts w:ascii="Times New Roman" w:eastAsia="Times New Roman" w:hAnsi="Times New Roman" w:cs="Times New Roman"/>
+              </w:rPr>
+            </w:pPr>
+            <w:r>
+              <w:rPr>
+                <w:rFonts w:ascii="Times New Roman" w:eastAsia="Times New Roman" w:hAnsi="Times New Roman" w:cs="Times New Roman"/>
+              </w:rPr>
+              <w:t>. Permisos: No mostrar permisos repetidos “visual”</w:t>
+            </w:r>
+          </w:p>
+          <w:p>
+            <w:pPr>
+              <w:jc w:val="center"/>
+              <w:rPr>
+                <w:rFonts w:ascii="Times New Roman" w:eastAsia="Times New Roman" w:hAnsi="Times New Roman" w:cs="Times New Roman"/>
+              </w:rPr>
+            </w:pPr>
+            <w:r>
+              <w:rPr>
+                <w:rFonts w:ascii="Times New Roman" w:eastAsia="Times New Roman" w:hAnsi="Times New Roman" w:cs="Times New Roman"/>
+              </w:rPr>
+              <w:t>. Control de Cambios: Revertir totalidad de un objeto, no solo de campo</w:t>
+            </w:r>
+          </w:p>
+        </w:tc>
+        <w:tc>
+          <w:tcPr>
+            <w:tcW w:w="1693" w:type="dxa"/>
+          </w:tcPr>
+          <w:p>
+            <w:pPr>
+              <w:jc w:val="center"/>
+              <w:rPr>
+                <w:rFonts w:ascii="Times New Roman" w:eastAsia="Times New Roman" w:hAnsi="Times New Roman" w:cs="Times New Roman"/>
+              </w:rPr>
+            </w:pPr>
+            <w:r>
+              <w:rPr>
+                <w:rFonts w:ascii="Times New Roman" w:eastAsia="Times New Roman" w:hAnsi="Times New Roman" w:cs="Times New Roman"/>
+              </w:rPr>
+              <w:t>8</w:t>
+            </w:r>
+          </w:p>
+        </w:tc>
+      </w:tr>
+      <w:tr>
+        <w:tc>
+          <w:tcPr>
+            <w:tcW w:w="2124" w:type="dxa"/>
+          </w:tcPr>
+          <w:p>
+            <w:pPr>
+              <w:jc w:val="center"/>
+              <w:rPr>
+                <w:rFonts w:ascii="Times New Roman" w:eastAsia="Times New Roman" w:hAnsi="Times New Roman" w:cs="Times New Roman"/>
+                <w:b/>
+                <w:bCs/>
+              </w:rPr>
+            </w:pPr>
+            <w:r>
+              <w:rPr>
+                <w:rFonts w:ascii="Times New Roman" w:eastAsia="Times New Roman" w:hAnsi="Times New Roman" w:cs="Times New Roman"/>
+                <w:b/>
+                <w:bCs/>
+              </w:rPr>
+              <w:t>3</w:t>
+            </w:r>
+          </w:p>
+        </w:tc>
+        <w:tc>
+          <w:tcPr>
+            <w:tcW w:w="2164" w:type="dxa"/>
+          </w:tcPr>
+          <w:p>
+            <w:pPr>
+              <w:jc w:val="center"/>
+              <w:rPr>
+                <w:rFonts w:ascii="Times New Roman" w:eastAsia="Times New Roman" w:hAnsi="Times New Roman" w:cs="Times New Roman"/>
+              </w:rPr>
+            </w:pPr>
+          </w:p>
+        </w:tc>
+        <w:tc>
+          <w:tcPr>
+            <w:tcW w:w="2513" w:type="dxa"/>
+          </w:tcPr>
+          <w:p>
+            <w:pPr>
+              <w:jc w:val="center"/>
+              <w:rPr>
+                <w:rFonts w:ascii="Times New Roman" w:eastAsia="Times New Roman" w:hAnsi="Times New Roman" w:cs="Times New Roman"/>
+              </w:rPr>
+            </w:pPr>
+          </w:p>
+        </w:tc>
+        <w:tc>
+          <w:tcPr>
+            <w:tcW w:w="1693" w:type="dxa"/>
+          </w:tcPr>
+          <w:p>
+            <w:pPr>
+              <w:jc w:val="center"/>
+              <w:rPr>
+                <w:rFonts w:ascii="Times New Roman" w:eastAsia="Times New Roman" w:hAnsi="Times New Roman" w:cs="Times New Roman"/>
+              </w:rPr>
+            </w:pPr>
+          </w:p>
+        </w:tc>
+      </w:tr>
+    </w:tbl>
+    <w:p>
+      <w:pPr>
+        <w:rPr>
+          <w:rFonts w:ascii="Times New Roman" w:eastAsia="Times New Roman" w:hAnsi="Times New Roman" w:cs="Times New Roman"/>
+          <w:sz w:val="32"/>
+          <w:szCs w:val="32"/>
+        </w:rPr>
+      </w:pPr>
+      <w:r>
+        <w:rPr>
+          <w:rFonts w:ascii="Times New Roman" w:eastAsia="Times New Roman" w:hAnsi="Times New Roman" w:cs="Times New Roman"/>
+          <w:sz w:val="32"/>
+          <w:szCs w:val="32"/>
+        </w:rPr>
+        <w:br w:type="page"/>
+      </w:r>
     </w:p>
     <w:p>
       <w:pPr>
+        <w:rPr>
+          <w:rFonts w:ascii="Times New Roman" w:eastAsia="Times New Roman" w:hAnsi="Times New Roman" w:cs="Times New Roman"/>
+          <w:sz w:val="32"/>
+          <w:szCs w:val="32"/>
+        </w:rPr>
+      </w:pPr>
+    </w:p>
+    <w:p>
+      <w:pPr>
+        <w:rPr>
+          <w:rFonts w:ascii="Times New Roman" w:eastAsia="Times New Roman" w:hAnsi="Times New Roman" w:cs="Times New Roman"/>
+          <w:sz w:val="32"/>
+          <w:szCs w:val="32"/>
+        </w:rPr>
+      </w:pPr>
+    </w:p>
+    <w:p>
+      <w:pPr>
         <w:pStyle w:val="Ttulo1"/>
         <w:rPr>
           <w:rFonts w:ascii="Times New Roman" w:eastAsia="Times New Roman" w:hAnsi="Times New Roman" w:cs="Times New Roman"/>
@@ -7328,7 +7756,6 @@
         <w:rPr>
           <w:rFonts w:ascii="Times New Roman" w:eastAsia="Times New Roman" w:hAnsi="Times New Roman" w:cs="Times New Roman"/>
         </w:rPr>
-        <w:lastRenderedPageBreak/>
         <w:t>1. ARQUITECTURA BASE</w:t>
       </w:r>
       <w:bookmarkEnd w:id="0"/>
@@ -8062,6 +8489,7 @@
               <w:rPr>
                 <w:rFonts w:ascii="Times New Roman" w:hAnsi="Times New Roman" w:cs="Times New Roman"/>
               </w:rPr>
+              <w:lastRenderedPageBreak/>
               <w:t>Administración</w:t>
             </w:r>
           </w:p>
@@ -8109,7 +8537,6 @@
           <w:sz w:val="30"/>
           <w:szCs w:val="30"/>
         </w:rPr>
-        <w:lastRenderedPageBreak/>
         <w:t>1.</w:t>
       </w:r>
       <w:r>
@@ -8438,6 +8865,7 @@
           <w:bCs/>
           <w:color w:val="000000"/>
         </w:rPr>
+        <w:lastRenderedPageBreak/>
         <w:t>UI (Capa de interfaz):</w:t>
       </w:r>
       <w:r>
@@ -8509,7 +8937,6 @@
         <w:rPr>
           <w:rFonts w:ascii="Times New Roman" w:eastAsia="Times New Roman" w:hAnsi="Times New Roman" w:cs="Times New Roman"/>
         </w:rPr>
-        <w:lastRenderedPageBreak/>
         <w:t>1.</w:t>
       </w:r>
       <w:r>
@@ -8774,7 +9201,6 @@
           <w:rFonts w:ascii="Times New Roman" w:hAnsi="Times New Roman" w:cs="Times New Roman"/>
           <w:noProof/>
         </w:rPr>
-        <w:lastRenderedPageBreak/>
         <w:drawing>
           <wp:anchor distT="0" distB="0" distL="114300" distR="114300" simplePos="0" relativeHeight="251658240" behindDoc="0" locked="0" layoutInCell="1" allowOverlap="1" wp14:anchorId="15D309E7" wp14:editId="10A0DBF9">
             <wp:simplePos x="0" y="0"/>
@@ -8955,7 +9381,6 @@
           <w:sz w:val="30"/>
           <w:szCs w:val="30"/>
         </w:rPr>
-        <w:lastRenderedPageBreak/>
         <w:t>1.</w:t>
       </w:r>
       <w:r>
@@ -9093,6 +9518,7 @@
         <w:rPr>
           <w:rFonts w:ascii="Times New Roman" w:eastAsia="Times New Roman" w:hAnsi="Times New Roman" w:cs="Times New Roman"/>
         </w:rPr>
+        <w:lastRenderedPageBreak/>
         <w:t>1.</w:t>
       </w:r>
       <w:r>
@@ -9121,10 +9547,10 @@
           <w:noProof/>
         </w:rPr>
         <w:drawing>
-          <wp:inline distT="0" distB="0" distL="0" distR="0" wp14:anchorId="5E64566F" wp14:editId="659C8D1F">
-            <wp:extent cx="5400040" cy="4095750"/>
+          <wp:inline distT="0" distB="0" distL="0" distR="0" wp14:anchorId="1FAF102C" wp14:editId="2023C059">
+            <wp:extent cx="6362700" cy="4825895"/>
             <wp:effectExtent l="0" t="0" r="0" b="0"/>
-            <wp:docPr id="987496219" name="Imagen 1"/>
+            <wp:docPr id="1058039279" name="Imagen 1"/>
             <wp:cNvGraphicFramePr>
               <a:graphicFrameLocks xmlns:a="http://schemas.openxmlformats.org/drawingml/2006/main" noChangeAspect="1"/>
             </wp:cNvGraphicFramePr>
@@ -9153,7 +9579,7 @@
                   <pic:spPr bwMode="auto">
                     <a:xfrm>
                       <a:off x="0" y="0"/>
-                      <a:ext cx="5400040" cy="4095750"/>
+                      <a:ext cx="6365942" cy="4828354"/>
                     </a:xfrm>
                     <a:prstGeom prst="rect">
                       <a:avLst/>
@@ -9211,10 +9637,10 @@
           <w:noProof/>
         </w:rPr>
         <w:drawing>
-          <wp:inline distT="0" distB="0" distL="0" distR="0" wp14:anchorId="4949D6D4" wp14:editId="61C78B70">
-            <wp:extent cx="5400040" cy="4726940"/>
+          <wp:inline distT="0" distB="0" distL="0" distR="0" wp14:anchorId="72573949" wp14:editId="7BFBCAAF">
+            <wp:extent cx="6057900" cy="5302800"/>
             <wp:effectExtent l="0" t="0" r="0" b="0"/>
-            <wp:docPr id="1410590180" name="Imagen 2"/>
+            <wp:docPr id="1290806978" name="Imagen 2"/>
             <wp:cNvGraphicFramePr>
               <a:graphicFrameLocks xmlns:a="http://schemas.openxmlformats.org/drawingml/2006/main" noChangeAspect="1"/>
             </wp:cNvGraphicFramePr>
@@ -9243,7 +9669,7 @@
                   <pic:spPr bwMode="auto">
                     <a:xfrm>
                       <a:off x="0" y="0"/>
-                      <a:ext cx="5400040" cy="4726940"/>
+                      <a:ext cx="6059665" cy="5304345"/>
                     </a:xfrm>
                     <a:prstGeom prst="rect">
                       <a:avLst/>
@@ -11192,23 +11618,7 @@
                 <w:rFonts w:ascii="Times New Roman" w:eastAsia="Times New Roman" w:hAnsi="Times New Roman" w:cs="Times New Roman"/>
                 <w:color w:val="000000"/>
               </w:rPr>
-              <w:t xml:space="preserve">El usuario queda autenticado en el sistema e inicia su sesión, se registran los permisos </w:t>
-            </w:r>
-            <w:proofErr w:type="gramStart"/>
-            <w:r>
-              <w:rPr>
-                <w:rFonts w:ascii="Times New Roman" w:eastAsia="Times New Roman" w:hAnsi="Times New Roman" w:cs="Times New Roman"/>
-                <w:color w:val="000000"/>
-              </w:rPr>
-              <w:t>del mismo</w:t>
-            </w:r>
-            <w:proofErr w:type="gramEnd"/>
-            <w:r>
-              <w:rPr>
-                <w:rFonts w:ascii="Times New Roman" w:eastAsia="Times New Roman" w:hAnsi="Times New Roman" w:cs="Times New Roman"/>
-                <w:color w:val="000000"/>
-              </w:rPr>
-              <w:t>.</w:t>
+              <w:t>El usuario queda autenticado en el sistema e inicia su sesión, se registran los permisos del mismo.</w:t>
             </w:r>
           </w:p>
         </w:tc>
@@ -24327,10 +24737,10 @@
     <w:p>
       <w:r>
         <w:drawing>
-          <wp:inline distT="0" distB="0" distL="0" distR="0" wp14:anchorId="220E4034" wp14:editId="6100C452">
-            <wp:extent cx="5400040" cy="2739390"/>
-            <wp:effectExtent l="0" t="0" r="0" b="3810"/>
-            <wp:docPr id="656771410" name="Imagen 1"/>
+          <wp:inline distT="0" distB="0" distL="0" distR="0" wp14:anchorId="137A5C20" wp14:editId="5F0CB956">
+            <wp:extent cx="6172186" cy="3147060"/>
+            <wp:effectExtent l="0" t="0" r="635" b="0"/>
+            <wp:docPr id="259351419" name="Imagen 1"/>
             <wp:cNvGraphicFramePr>
               <a:graphicFrameLocks xmlns:a="http://schemas.openxmlformats.org/drawingml/2006/main" noChangeAspect="1"/>
             </wp:cNvGraphicFramePr>
@@ -24338,7 +24748,7 @@
               <a:graphicData uri="http://schemas.openxmlformats.org/drawingml/2006/picture">
                 <pic:pic xmlns:pic="http://schemas.openxmlformats.org/drawingml/2006/picture">
                   <pic:nvPicPr>
-                    <pic:cNvPr id="656771410" name=""/>
+                    <pic:cNvPr id="259351419" name=""/>
                     <pic:cNvPicPr/>
                   </pic:nvPicPr>
                   <pic:blipFill>
@@ -24350,7 +24760,7 @@
                   <pic:spPr>
                     <a:xfrm>
                       <a:off x="0" y="0"/>
-                      <a:ext cx="5400040" cy="2739390"/>
+                      <a:ext cx="6185897" cy="3154051"/>
                     </a:xfrm>
                     <a:prstGeom prst="rect">
                       <a:avLst/>
@@ -28184,6 +28594,119 @@
     </w:lvl>
   </w:abstractNum>
   <w:abstractNum w:abstractNumId="7" w15:restartNumberingAfterBreak="0">
+    <w:nsid w:val="244528EB"/>
+    <w:multiLevelType w:val="hybridMultilevel"/>
+    <w:tmpl w:val="3586C5FE"/>
+    <w:lvl w:ilvl="0" w:tplc="D232626C">
+      <w:start w:val="1"/>
+      <w:numFmt w:val="bullet"/>
+      <w:lvlText w:val="-"/>
+      <w:lvlJc w:val="left"/>
+      <w:pPr>
+        <w:ind w:left="720" w:hanging="360"/>
+      </w:pPr>
+      <w:rPr>
+        <w:rFonts w:ascii="Times New Roman" w:eastAsia="Times New Roman" w:hAnsi="Times New Roman" w:cs="Times New Roman" w:hint="default"/>
+      </w:rPr>
+    </w:lvl>
+    <w:lvl w:ilvl="1" w:tplc="2C0A0003" w:tentative="1">
+      <w:start w:val="1"/>
+      <w:numFmt w:val="bullet"/>
+      <w:lvlText w:val="o"/>
+      <w:lvlJc w:val="left"/>
+      <w:pPr>
+        <w:ind w:left="1440" w:hanging="360"/>
+      </w:pPr>
+      <w:rPr>
+        <w:rFonts w:ascii="Courier New" w:hAnsi="Courier New" w:cs="Courier New" w:hint="default"/>
+      </w:rPr>
+    </w:lvl>
+    <w:lvl w:ilvl="2" w:tplc="2C0A0005" w:tentative="1">
+      <w:start w:val="1"/>
+      <w:numFmt w:val="bullet"/>
+      <w:lvlText w:val=""/>
+      <w:lvlJc w:val="left"/>
+      <w:pPr>
+        <w:ind w:left="2160" w:hanging="360"/>
+      </w:pPr>
+      <w:rPr>
+        <w:rFonts w:ascii="Wingdings" w:hAnsi="Wingdings" w:hint="default"/>
+      </w:rPr>
+    </w:lvl>
+    <w:lvl w:ilvl="3" w:tplc="2C0A0001" w:tentative="1">
+      <w:start w:val="1"/>
+      <w:numFmt w:val="bullet"/>
+      <w:lvlText w:val=""/>
+      <w:lvlJc w:val="left"/>
+      <w:pPr>
+        <w:ind w:left="2880" w:hanging="360"/>
+      </w:pPr>
+      <w:rPr>
+        <w:rFonts w:ascii="Symbol" w:hAnsi="Symbol" w:hint="default"/>
+      </w:rPr>
+    </w:lvl>
+    <w:lvl w:ilvl="4" w:tplc="2C0A0003" w:tentative="1">
+      <w:start w:val="1"/>
+      <w:numFmt w:val="bullet"/>
+      <w:lvlText w:val="o"/>
+      <w:lvlJc w:val="left"/>
+      <w:pPr>
+        <w:ind w:left="3600" w:hanging="360"/>
+      </w:pPr>
+      <w:rPr>
+        <w:rFonts w:ascii="Courier New" w:hAnsi="Courier New" w:cs="Courier New" w:hint="default"/>
+      </w:rPr>
+    </w:lvl>
+    <w:lvl w:ilvl="5" w:tplc="2C0A0005" w:tentative="1">
+      <w:start w:val="1"/>
+      <w:numFmt w:val="bullet"/>
+      <w:lvlText w:val=""/>
+      <w:lvlJc w:val="left"/>
+      <w:pPr>
+        <w:ind w:left="4320" w:hanging="360"/>
+      </w:pPr>
+      <w:rPr>
+        <w:rFonts w:ascii="Wingdings" w:hAnsi="Wingdings" w:hint="default"/>
+      </w:rPr>
+    </w:lvl>
+    <w:lvl w:ilvl="6" w:tplc="2C0A0001" w:tentative="1">
+      <w:start w:val="1"/>
+      <w:numFmt w:val="bullet"/>
+      <w:lvlText w:val=""/>
+      <w:lvlJc w:val="left"/>
+      <w:pPr>
+        <w:ind w:left="5040" w:hanging="360"/>
+      </w:pPr>
+      <w:rPr>
+        <w:rFonts w:ascii="Symbol" w:hAnsi="Symbol" w:hint="default"/>
+      </w:rPr>
+    </w:lvl>
+    <w:lvl w:ilvl="7" w:tplc="2C0A0003" w:tentative="1">
+      <w:start w:val="1"/>
+      <w:numFmt w:val="bullet"/>
+      <w:lvlText w:val="o"/>
+      <w:lvlJc w:val="left"/>
+      <w:pPr>
+        <w:ind w:left="5760" w:hanging="360"/>
+      </w:pPr>
+      <w:rPr>
+        <w:rFonts w:ascii="Courier New" w:hAnsi="Courier New" w:cs="Courier New" w:hint="default"/>
+      </w:rPr>
+    </w:lvl>
+    <w:lvl w:ilvl="8" w:tplc="2C0A0005" w:tentative="1">
+      <w:start w:val="1"/>
+      <w:numFmt w:val="bullet"/>
+      <w:lvlText w:val=""/>
+      <w:lvlJc w:val="left"/>
+      <w:pPr>
+        <w:ind w:left="6480" w:hanging="360"/>
+      </w:pPr>
+      <w:rPr>
+        <w:rFonts w:ascii="Wingdings" w:hAnsi="Wingdings" w:hint="default"/>
+      </w:rPr>
+    </w:lvl>
+  </w:abstractNum>
+  <w:abstractNum w:abstractNumId="8" w15:restartNumberingAfterBreak="0">
     <w:nsid w:val="24C84FF2"/>
     <w:multiLevelType w:val="multilevel"/>
     <w:tmpl w:val="72E41FFE"/>
@@ -28296,7 +28819,7 @@
       </w:rPr>
     </w:lvl>
   </w:abstractNum>
-  <w:abstractNum w:abstractNumId="8" w15:restartNumberingAfterBreak="0">
+  <w:abstractNum w:abstractNumId="9" w15:restartNumberingAfterBreak="0">
     <w:nsid w:val="26E7340D"/>
     <w:multiLevelType w:val="hybridMultilevel"/>
     <w:tmpl w:val="6CD6EF7E"/>
@@ -28385,7 +28908,7 @@
       </w:pPr>
     </w:lvl>
   </w:abstractNum>
-  <w:abstractNum w:abstractNumId="9" w15:restartNumberingAfterBreak="0">
+  <w:abstractNum w:abstractNumId="10" w15:restartNumberingAfterBreak="0">
     <w:nsid w:val="273F489B"/>
     <w:multiLevelType w:val="multilevel"/>
     <w:tmpl w:val="44FCE85C"/>
@@ -28498,7 +29021,7 @@
       </w:rPr>
     </w:lvl>
   </w:abstractNum>
-  <w:abstractNum w:abstractNumId="10" w15:restartNumberingAfterBreak="0">
+  <w:abstractNum w:abstractNumId="11" w15:restartNumberingAfterBreak="0">
     <w:nsid w:val="292B085E"/>
     <w:multiLevelType w:val="multilevel"/>
     <w:tmpl w:val="72A22ADA"/>
@@ -28588,7 +29111,7 @@
       </w:pPr>
     </w:lvl>
   </w:abstractNum>
-  <w:abstractNum w:abstractNumId="11" w15:restartNumberingAfterBreak="0">
+  <w:abstractNum w:abstractNumId="12" w15:restartNumberingAfterBreak="0">
     <w:nsid w:val="29E44E31"/>
     <w:multiLevelType w:val="multilevel"/>
     <w:tmpl w:val="C32E3EB2"/>
@@ -28701,7 +29224,7 @@
       </w:rPr>
     </w:lvl>
   </w:abstractNum>
-  <w:abstractNum w:abstractNumId="12" w15:restartNumberingAfterBreak="0">
+  <w:abstractNum w:abstractNumId="13" w15:restartNumberingAfterBreak="0">
     <w:nsid w:val="2A025459"/>
     <w:multiLevelType w:val="multilevel"/>
     <w:tmpl w:val="B178B5FE"/>
@@ -28816,7 +29339,7 @@
       </w:rPr>
     </w:lvl>
   </w:abstractNum>
-  <w:abstractNum w:abstractNumId="13" w15:restartNumberingAfterBreak="0">
+  <w:abstractNum w:abstractNumId="14" w15:restartNumberingAfterBreak="0">
     <w:nsid w:val="2AA95BD7"/>
     <w:multiLevelType w:val="multilevel"/>
     <w:tmpl w:val="049291B0"/>
@@ -28965,7 +29488,96 @@
       </w:rPr>
     </w:lvl>
   </w:abstractNum>
-  <w:abstractNum w:abstractNumId="14" w15:restartNumberingAfterBreak="0">
+  <w:abstractNum w:abstractNumId="15" w15:restartNumberingAfterBreak="0">
+    <w:nsid w:val="2BBC0829"/>
+    <w:multiLevelType w:val="hybridMultilevel"/>
+    <w:tmpl w:val="5B1235F0"/>
+    <w:lvl w:ilvl="0" w:tplc="9F0AC8C2">
+      <w:start w:val="1"/>
+      <w:numFmt w:val="decimal"/>
+      <w:lvlText w:val="%1-"/>
+      <w:lvlJc w:val="left"/>
+      <w:pPr>
+        <w:ind w:left="720" w:hanging="360"/>
+      </w:pPr>
+      <w:rPr>
+        <w:rFonts w:hint="default"/>
+      </w:rPr>
+    </w:lvl>
+    <w:lvl w:ilvl="1" w:tplc="2C0A0019" w:tentative="1">
+      <w:start w:val="1"/>
+      <w:numFmt w:val="lowerLetter"/>
+      <w:lvlText w:val="%2."/>
+      <w:lvlJc w:val="left"/>
+      <w:pPr>
+        <w:ind w:left="1440" w:hanging="360"/>
+      </w:pPr>
+    </w:lvl>
+    <w:lvl w:ilvl="2" w:tplc="2C0A001B" w:tentative="1">
+      <w:start w:val="1"/>
+      <w:numFmt w:val="lowerRoman"/>
+      <w:lvlText w:val="%3."/>
+      <w:lvlJc w:val="right"/>
+      <w:pPr>
+        <w:ind w:left="2160" w:hanging="180"/>
+      </w:pPr>
+    </w:lvl>
+    <w:lvl w:ilvl="3" w:tplc="2C0A000F" w:tentative="1">
+      <w:start w:val="1"/>
+      <w:numFmt w:val="decimal"/>
+      <w:lvlText w:val="%4."/>
+      <w:lvlJc w:val="left"/>
+      <w:pPr>
+        <w:ind w:left="2880" w:hanging="360"/>
+      </w:pPr>
+    </w:lvl>
+    <w:lvl w:ilvl="4" w:tplc="2C0A0019" w:tentative="1">
+      <w:start w:val="1"/>
+      <w:numFmt w:val="lowerLetter"/>
+      <w:lvlText w:val="%5."/>
+      <w:lvlJc w:val="left"/>
+      <w:pPr>
+        <w:ind w:left="3600" w:hanging="360"/>
+      </w:pPr>
+    </w:lvl>
+    <w:lvl w:ilvl="5" w:tplc="2C0A001B" w:tentative="1">
+      <w:start w:val="1"/>
+      <w:numFmt w:val="lowerRoman"/>
+      <w:lvlText w:val="%6."/>
+      <w:lvlJc w:val="right"/>
+      <w:pPr>
+        <w:ind w:left="4320" w:hanging="180"/>
+      </w:pPr>
+    </w:lvl>
+    <w:lvl w:ilvl="6" w:tplc="2C0A000F" w:tentative="1">
+      <w:start w:val="1"/>
+      <w:numFmt w:val="decimal"/>
+      <w:lvlText w:val="%7."/>
+      <w:lvlJc w:val="left"/>
+      <w:pPr>
+        <w:ind w:left="5040" w:hanging="360"/>
+      </w:pPr>
+    </w:lvl>
+    <w:lvl w:ilvl="7" w:tplc="2C0A0019" w:tentative="1">
+      <w:start w:val="1"/>
+      <w:numFmt w:val="lowerLetter"/>
+      <w:lvlText w:val="%8."/>
+      <w:lvlJc w:val="left"/>
+      <w:pPr>
+        <w:ind w:left="5760" w:hanging="360"/>
+      </w:pPr>
+    </w:lvl>
+    <w:lvl w:ilvl="8" w:tplc="2C0A001B" w:tentative="1">
+      <w:start w:val="1"/>
+      <w:numFmt w:val="lowerRoman"/>
+      <w:lvlText w:val="%9."/>
+      <w:lvlJc w:val="right"/>
+      <w:pPr>
+        <w:ind w:left="6480" w:hanging="180"/>
+      </w:pPr>
+    </w:lvl>
+  </w:abstractNum>
+  <w:abstractNum w:abstractNumId="16" w15:restartNumberingAfterBreak="0">
     <w:nsid w:val="3499200A"/>
     <w:multiLevelType w:val="hybridMultilevel"/>
     <w:tmpl w:val="C3E4A142"/>
@@ -29078,7 +29690,7 @@
       </w:rPr>
     </w:lvl>
   </w:abstractNum>
-  <w:abstractNum w:abstractNumId="15" w15:restartNumberingAfterBreak="0">
+  <w:abstractNum w:abstractNumId="17" w15:restartNumberingAfterBreak="0">
     <w:nsid w:val="39C509A6"/>
     <w:multiLevelType w:val="multilevel"/>
     <w:tmpl w:val="5F608204"/>
@@ -29172,7 +29784,7 @@
       </w:pPr>
     </w:lvl>
   </w:abstractNum>
-  <w:abstractNum w:abstractNumId="16" w15:restartNumberingAfterBreak="0">
+  <w:abstractNum w:abstractNumId="18" w15:restartNumberingAfterBreak="0">
     <w:nsid w:val="39F35BF8"/>
     <w:multiLevelType w:val="multilevel"/>
     <w:tmpl w:val="2190F670"/>
@@ -29262,7 +29874,7 @@
       </w:pPr>
     </w:lvl>
   </w:abstractNum>
-  <w:abstractNum w:abstractNumId="17" w15:restartNumberingAfterBreak="0">
+  <w:abstractNum w:abstractNumId="19" w15:restartNumberingAfterBreak="0">
     <w:nsid w:val="3CCE6074"/>
     <w:multiLevelType w:val="multilevel"/>
     <w:tmpl w:val="2190F670"/>
@@ -29352,7 +29964,7 @@
       </w:pPr>
     </w:lvl>
   </w:abstractNum>
-  <w:abstractNum w:abstractNumId="18" w15:restartNumberingAfterBreak="0">
+  <w:abstractNum w:abstractNumId="20" w15:restartNumberingAfterBreak="0">
     <w:nsid w:val="3EA04283"/>
     <w:multiLevelType w:val="multilevel"/>
     <w:tmpl w:val="C840C568"/>
@@ -29442,7 +30054,7 @@
       </w:pPr>
     </w:lvl>
   </w:abstractNum>
-  <w:abstractNum w:abstractNumId="19" w15:restartNumberingAfterBreak="0">
+  <w:abstractNum w:abstractNumId="21" w15:restartNumberingAfterBreak="0">
     <w:nsid w:val="44972425"/>
     <w:multiLevelType w:val="multilevel"/>
     <w:tmpl w:val="A69C4584"/>
@@ -29555,7 +30167,7 @@
       </w:rPr>
     </w:lvl>
   </w:abstractNum>
-  <w:abstractNum w:abstractNumId="20" w15:restartNumberingAfterBreak="0">
+  <w:abstractNum w:abstractNumId="22" w15:restartNumberingAfterBreak="0">
     <w:nsid w:val="465A2690"/>
     <w:multiLevelType w:val="multilevel"/>
     <w:tmpl w:val="2CE4AB62"/>
@@ -29645,7 +30257,7 @@
       </w:pPr>
     </w:lvl>
   </w:abstractNum>
-  <w:abstractNum w:abstractNumId="21" w15:restartNumberingAfterBreak="0">
+  <w:abstractNum w:abstractNumId="23" w15:restartNumberingAfterBreak="0">
     <w:nsid w:val="471667BB"/>
     <w:multiLevelType w:val="multilevel"/>
     <w:tmpl w:val="944A6AA8"/>
@@ -29758,7 +30370,7 @@
       </w:rPr>
     </w:lvl>
   </w:abstractNum>
-  <w:abstractNum w:abstractNumId="22" w15:restartNumberingAfterBreak="0">
+  <w:abstractNum w:abstractNumId="24" w15:restartNumberingAfterBreak="0">
     <w:nsid w:val="494B1241"/>
     <w:multiLevelType w:val="multilevel"/>
     <w:tmpl w:val="2190F670"/>
@@ -29848,7 +30460,7 @@
       </w:pPr>
     </w:lvl>
   </w:abstractNum>
-  <w:abstractNum w:abstractNumId="23" w15:restartNumberingAfterBreak="0">
+  <w:abstractNum w:abstractNumId="25" w15:restartNumberingAfterBreak="0">
     <w:nsid w:val="4C201EA1"/>
     <w:multiLevelType w:val="hybridMultilevel"/>
     <w:tmpl w:val="8AA2DAD6"/>
@@ -29961,7 +30573,7 @@
       </w:rPr>
     </w:lvl>
   </w:abstractNum>
-  <w:abstractNum w:abstractNumId="24" w15:restartNumberingAfterBreak="0">
+  <w:abstractNum w:abstractNumId="26" w15:restartNumberingAfterBreak="0">
     <w:nsid w:val="4F151ED2"/>
     <w:multiLevelType w:val="multilevel"/>
     <w:tmpl w:val="3B440B54"/>
@@ -30051,7 +30663,7 @@
       </w:pPr>
     </w:lvl>
   </w:abstractNum>
-  <w:abstractNum w:abstractNumId="25" w15:restartNumberingAfterBreak="0">
+  <w:abstractNum w:abstractNumId="27" w15:restartNumberingAfterBreak="0">
     <w:nsid w:val="4F81444D"/>
     <w:multiLevelType w:val="multilevel"/>
     <w:tmpl w:val="2CE4AB62"/>
@@ -30141,7 +30753,7 @@
       </w:pPr>
     </w:lvl>
   </w:abstractNum>
-  <w:abstractNum w:abstractNumId="26" w15:restartNumberingAfterBreak="0">
+  <w:abstractNum w:abstractNumId="28" w15:restartNumberingAfterBreak="0">
     <w:nsid w:val="53A47C0C"/>
     <w:multiLevelType w:val="hybridMultilevel"/>
     <w:tmpl w:val="5310FD84"/>
@@ -30254,7 +30866,7 @@
       </w:rPr>
     </w:lvl>
   </w:abstractNum>
-  <w:abstractNum w:abstractNumId="27" w15:restartNumberingAfterBreak="0">
+  <w:abstractNum w:abstractNumId="29" w15:restartNumberingAfterBreak="0">
     <w:nsid w:val="58952764"/>
     <w:multiLevelType w:val="hybridMultilevel"/>
     <w:tmpl w:val="A37ECC54"/>
@@ -30367,7 +30979,7 @@
       </w:rPr>
     </w:lvl>
   </w:abstractNum>
-  <w:abstractNum w:abstractNumId="28" w15:restartNumberingAfterBreak="0">
+  <w:abstractNum w:abstractNumId="30" w15:restartNumberingAfterBreak="0">
     <w:nsid w:val="5B28511A"/>
     <w:multiLevelType w:val="multilevel"/>
     <w:tmpl w:val="3B440B54"/>
@@ -30457,7 +31069,7 @@
       </w:pPr>
     </w:lvl>
   </w:abstractNum>
-  <w:abstractNum w:abstractNumId="29" w15:restartNumberingAfterBreak="0">
+  <w:abstractNum w:abstractNumId="31" w15:restartNumberingAfterBreak="0">
     <w:nsid w:val="5BB90A2F"/>
     <w:multiLevelType w:val="multilevel"/>
     <w:tmpl w:val="B4720FD0"/>
@@ -30606,7 +31218,7 @@
       </w:rPr>
     </w:lvl>
   </w:abstractNum>
-  <w:abstractNum w:abstractNumId="30" w15:restartNumberingAfterBreak="0">
+  <w:abstractNum w:abstractNumId="32" w15:restartNumberingAfterBreak="0">
     <w:nsid w:val="62C615B1"/>
     <w:multiLevelType w:val="hybridMultilevel"/>
     <w:tmpl w:val="ED1619AC"/>
@@ -30719,7 +31331,7 @@
       </w:rPr>
     </w:lvl>
   </w:abstractNum>
-  <w:abstractNum w:abstractNumId="31" w15:restartNumberingAfterBreak="0">
+  <w:abstractNum w:abstractNumId="33" w15:restartNumberingAfterBreak="0">
     <w:nsid w:val="721D01EF"/>
     <w:multiLevelType w:val="multilevel"/>
     <w:tmpl w:val="AADC35FA"/>
@@ -30832,7 +31444,7 @@
       </w:rPr>
     </w:lvl>
   </w:abstractNum>
-  <w:abstractNum w:abstractNumId="32" w15:restartNumberingAfterBreak="0">
+  <w:abstractNum w:abstractNumId="34" w15:restartNumberingAfterBreak="0">
     <w:nsid w:val="73776D94"/>
     <w:multiLevelType w:val="multilevel"/>
     <w:tmpl w:val="3940D936"/>
@@ -30922,7 +31534,7 @@
       </w:pPr>
     </w:lvl>
   </w:abstractNum>
-  <w:abstractNum w:abstractNumId="33" w15:restartNumberingAfterBreak="0">
+  <w:abstractNum w:abstractNumId="35" w15:restartNumberingAfterBreak="0">
     <w:nsid w:val="7B0825C5"/>
     <w:multiLevelType w:val="multilevel"/>
     <w:tmpl w:val="E62824EC"/>
@@ -31036,43 +31648,43 @@
     </w:lvl>
   </w:abstractNum>
   <w:num w:numId="1" w16cid:durableId="1003820479">
-    <w:abstractNumId w:val="21"/>
+    <w:abstractNumId w:val="23"/>
   </w:num>
   <w:num w:numId="2" w16cid:durableId="959841925">
     <w:abstractNumId w:val="2"/>
   </w:num>
   <w:num w:numId="3" w16cid:durableId="1279489412">
-    <w:abstractNumId w:val="16"/>
+    <w:abstractNumId w:val="18"/>
   </w:num>
   <w:num w:numId="4" w16cid:durableId="73673050">
-    <w:abstractNumId w:val="31"/>
+    <w:abstractNumId w:val="33"/>
   </w:num>
   <w:num w:numId="5" w16cid:durableId="335158926">
     <w:abstractNumId w:val="1"/>
   </w:num>
   <w:num w:numId="6" w16cid:durableId="22680917">
-    <w:abstractNumId w:val="18"/>
+    <w:abstractNumId w:val="20"/>
   </w:num>
   <w:num w:numId="7" w16cid:durableId="356194859">
-    <w:abstractNumId w:val="32"/>
+    <w:abstractNumId w:val="34"/>
   </w:num>
   <w:num w:numId="8" w16cid:durableId="1683049771">
-    <w:abstractNumId w:val="10"/>
+    <w:abstractNumId w:val="11"/>
   </w:num>
   <w:num w:numId="9" w16cid:durableId="533082093">
-    <w:abstractNumId w:val="28"/>
+    <w:abstractNumId w:val="30"/>
   </w:num>
   <w:num w:numId="10" w16cid:durableId="338847162">
-    <w:abstractNumId w:val="20"/>
+    <w:abstractNumId w:val="22"/>
   </w:num>
   <w:num w:numId="11" w16cid:durableId="735468304">
     <w:abstractNumId w:val="3"/>
   </w:num>
   <w:num w:numId="12" w16cid:durableId="1651904012">
-    <w:abstractNumId w:val="15"/>
+    <w:abstractNumId w:val="17"/>
   </w:num>
   <w:num w:numId="13" w16cid:durableId="1435318471">
-    <w:abstractNumId w:val="7"/>
+    <w:abstractNumId w:val="8"/>
   </w:num>
   <w:num w:numId="14" w16cid:durableId="538128944">
     <w:abstractNumId w:val="4"/>
@@ -31081,52 +31693,52 @@
     <w:abstractNumId w:val="5"/>
   </w:num>
   <w:num w:numId="16" w16cid:durableId="1311444191">
-    <w:abstractNumId w:val="9"/>
+    <w:abstractNumId w:val="10"/>
   </w:num>
   <w:num w:numId="17" w16cid:durableId="428624901">
     <w:abstractNumId w:val="6"/>
   </w:num>
   <w:num w:numId="18" w16cid:durableId="44764715">
-    <w:abstractNumId w:val="23"/>
+    <w:abstractNumId w:val="25"/>
   </w:num>
   <w:num w:numId="19" w16cid:durableId="1035933899">
-    <w:abstractNumId w:val="30"/>
+    <w:abstractNumId w:val="32"/>
   </w:num>
   <w:num w:numId="20" w16cid:durableId="795104101">
-    <w:abstractNumId w:val="19"/>
+    <w:abstractNumId w:val="21"/>
   </w:num>
   <w:num w:numId="21" w16cid:durableId="1902398725">
-    <w:abstractNumId w:val="25"/>
+    <w:abstractNumId w:val="27"/>
   </w:num>
   <w:num w:numId="22" w16cid:durableId="2137947010">
-    <w:abstractNumId w:val="33"/>
+    <w:abstractNumId w:val="35"/>
   </w:num>
   <w:num w:numId="23" w16cid:durableId="1079642873">
-    <w:abstractNumId w:val="11"/>
+    <w:abstractNumId w:val="12"/>
   </w:num>
   <w:num w:numId="24" w16cid:durableId="895315625">
-    <w:abstractNumId w:val="12"/>
+    <w:abstractNumId w:val="13"/>
   </w:num>
   <w:num w:numId="25" w16cid:durableId="549073225">
     <w:abstractNumId w:val="0"/>
   </w:num>
   <w:num w:numId="26" w16cid:durableId="1063716301">
-    <w:abstractNumId w:val="13"/>
+    <w:abstractNumId w:val="14"/>
   </w:num>
   <w:num w:numId="27" w16cid:durableId="2128355026">
+    <w:abstractNumId w:val="31"/>
+  </w:num>
+  <w:num w:numId="28" w16cid:durableId="1747919955">
+    <w:abstractNumId w:val="16"/>
+  </w:num>
+  <w:num w:numId="29" w16cid:durableId="1259094555">
     <w:abstractNumId w:val="29"/>
   </w:num>
-  <w:num w:numId="28" w16cid:durableId="1747919955">
-    <w:abstractNumId w:val="14"/>
-  </w:num>
-  <w:num w:numId="29" w16cid:durableId="1259094555">
-    <w:abstractNumId w:val="27"/>
-  </w:num>
   <w:num w:numId="30" w16cid:durableId="607734423">
-    <w:abstractNumId w:val="26"/>
+    <w:abstractNumId w:val="28"/>
   </w:num>
   <w:num w:numId="31" w16cid:durableId="355739284">
-    <w:abstractNumId w:val="24"/>
+    <w:abstractNumId w:val="26"/>
     <w:lvlOverride w:ilvl="0">
       <w:startOverride w:val="1"/>
     </w:lvlOverride>
@@ -31156,16 +31768,22 @@
     </w:lvlOverride>
   </w:num>
   <w:num w:numId="32" w16cid:durableId="1736929792">
-    <w:abstractNumId w:val="26"/>
+    <w:abstractNumId w:val="28"/>
   </w:num>
   <w:num w:numId="33" w16cid:durableId="1938907612">
-    <w:abstractNumId w:val="8"/>
+    <w:abstractNumId w:val="9"/>
   </w:num>
   <w:num w:numId="34" w16cid:durableId="1887450338">
-    <w:abstractNumId w:val="22"/>
+    <w:abstractNumId w:val="24"/>
   </w:num>
   <w:num w:numId="35" w16cid:durableId="438069884">
-    <w:abstractNumId w:val="17"/>
+    <w:abstractNumId w:val="19"/>
+  </w:num>
+  <w:num w:numId="36" w16cid:durableId="807404005">
+    <w:abstractNumId w:val="15"/>
+  </w:num>
+  <w:num w:numId="37" w16cid:durableId="976031250">
+    <w:abstractNumId w:val="7"/>
   </w:num>
 </w:numbering>
 </file>

</xml_diff>